<commit_message>
feat: edits to Task 6
</commit_message>
<xml_diff>
--- a/Assessment2-Report.docx
+++ b/Assessment2-Report.docx
@@ -35,7 +35,7 @@
       </w:r>
       <w:r>
         <w:rPr>
-          <w:rFonts w:eastAsia="바탕" w:cs="Mangal"/>
+          <w:rFonts w:eastAsia="Batang" w:cs="Mangal"/>
           <w:lang w:val="en-GB" w:bidi="mr-IN"/>
         </w:rPr>
         <w:t>2</w:t>
@@ -226,19 +226,11 @@
                 <w:lang w:val="en-GB"/>
               </w:rPr>
             </w:pPr>
-            <w:proofErr w:type="spellStart"/>
             <w:r>
               <w:rPr>
                 <w:rFonts w:eastAsia="SimSun" w:cs="Mangal"/>
               </w:rPr>
-              <w:t>Minchul</w:t>
-            </w:r>
-            <w:proofErr w:type="spellEnd"/>
-            <w:r>
-              <w:rPr>
-                <w:rFonts w:eastAsia="SimSun" w:cs="Mangal"/>
-              </w:rPr>
-              <w:t xml:space="preserve"> Kim</w:t>
+              <w:t>Minchul Kim</w:t>
             </w:r>
           </w:p>
         </w:tc>
@@ -387,21 +379,12 @@
                 <w:lang w:val="en-GB" w:eastAsia="en-IN" w:bidi="mr-IN"/>
               </w:rPr>
             </w:pPr>
-            <w:proofErr w:type="spellStart"/>
             <w:r>
               <w:rPr>
                 <w:rFonts w:eastAsia="SimSun" w:cs="Mangal"/>
                 <w:lang w:val="en-GB" w:eastAsia="en-IN" w:bidi="mr-IN"/>
               </w:rPr>
-              <w:t>Minchul</w:t>
-            </w:r>
-            <w:proofErr w:type="spellEnd"/>
-            <w:r>
-              <w:rPr>
-                <w:rFonts w:eastAsia="SimSun" w:cs="Mangal"/>
-                <w:lang w:val="en-GB" w:eastAsia="en-IN" w:bidi="mr-IN"/>
-              </w:rPr>
-              <w:t xml:space="preserve"> Kim</w:t>
+              <w:t>Minchul Kim</w:t>
             </w:r>
           </w:p>
         </w:tc>
@@ -616,7 +599,6 @@
         <w:spacing w:before="400" w:after="200"/>
       </w:pPr>
       <w:r>
-        <w:lastRenderedPageBreak/>
         <w:t>Task 6: Dimensionality Reduction on the Hydrogen Tweets Dataset</w:t>
       </w:r>
     </w:p>
@@ -645,17 +627,46 @@
           <w:numId w:val="1"/>
         </w:numPr>
         <w:spacing w:after="80"/>
-      </w:pPr>
-      <w:r>
-        <w:t xml:space="preserve">Text cleaning &amp; TF-IDF </w:t>
-      </w:r>
-      <w:proofErr w:type="spellStart"/>
-      <w:r>
-        <w:t>vectorisation</w:t>
-      </w:r>
-      <w:proofErr w:type="spellEnd"/>
-      <w:r>
-        <w:t>: Twitter text contains slang, links, and emojis, so the raw text was cleaned and converted into numerical form using TF-IDF rather than simple word counts. TF-IDF was chosen because it down-weights common words (e.g. "the", "is") and up-weights topic-specific words (e.g. "hydrogen", "energy"), producing a more informative feature representation for a topic-relevance task.</w:t>
+        <w:rPr>
+          <w:lang w:val="en-GB"/>
+        </w:rPr>
+      </w:pPr>
+      <w:r>
+        <w:rPr>
+          <w:b/>
+          <w:bCs/>
+        </w:rPr>
+        <w:t>Text cleaning</w:t>
+      </w:r>
+      <w:r>
+        <w:t>:</w:t>
+      </w:r>
+      <w:r>
+        <w:t xml:space="preserve"> </w:t>
+      </w:r>
+      <w:r>
+        <w:rPr>
+          <w:lang w:val="en-GB"/>
+        </w:rPr>
+        <w:t xml:space="preserve">URLs, </w:t>
+      </w:r>
+      <w:r>
+        <w:rPr>
+          <w:lang w:val="en-GB"/>
+        </w:rPr>
+        <w:t xml:space="preserve">mentions, and hashtags were stripped from the raw tweets during preprocessing (verified: 0 of the 2,500 tweets in the dataset contain a URL, @mention, or hashtag). Emojis and other symbols were not explicitly </w:t>
+      </w:r>
+      <w:r>
+        <w:rPr>
+          <w:lang w:val="en-GB"/>
+        </w:rPr>
+        <w:t>removed but</w:t>
+      </w:r>
+      <w:r>
+        <w:rPr>
+          <w:lang w:val="en-GB"/>
+        </w:rPr>
+        <w:t xml:space="preserve"> are effectively excluded from the TF-IDF feature space since the default tokenizer only extracts alphanumeric word tokens. Slang terms (e.g. "lol", "omg", "idk") were left unmodified and are treated as ordinary vocabulary.</w:t>
       </w:r>
     </w:p>
     <w:p>
@@ -666,38 +677,113 @@
           <w:numId w:val="1"/>
         </w:numPr>
         <w:spacing w:after="80"/>
-      </w:pPr>
-      <w:proofErr w:type="spellStart"/>
-      <w:r>
-        <w:t>Standardisation</w:t>
-      </w:r>
-      <w:proofErr w:type="spellEnd"/>
-      <w:r>
-        <w:t xml:space="preserve"> (</w:t>
-      </w:r>
-      <w:proofErr w:type="spellStart"/>
-      <w:r>
+        <w:rPr>
+          <w:lang w:val="en-GB"/>
+        </w:rPr>
+      </w:pPr>
+      <w:r>
+        <w:rPr>
+          <w:b/>
+          <w:bCs/>
+        </w:rPr>
+        <w:t xml:space="preserve">TF-IDF </w:t>
+      </w:r>
+      <w:r>
+        <w:rPr>
+          <w:b/>
+          <w:bCs/>
+        </w:rPr>
+        <w:t>vectorization</w:t>
+      </w:r>
+      <w:r>
+        <w:t>:</w:t>
+      </w:r>
+      <w:r>
+        <w:rPr>
+          <w:lang w:val="en-GB"/>
+        </w:rPr>
+        <w:t xml:space="preserve"> </w:t>
+      </w:r>
+      <w:r>
+        <w:rPr>
+          <w:lang w:val="en-GB"/>
+        </w:rPr>
+        <w:t>The cleaned text was converted into numerical data using TF-IDF. We chose TF-IDF over simple word counts because it gives lower weights to common words (like "the" or "is") and higher weights to important topic words (like "hydrogen" or "energy")</w:t>
+      </w:r>
+      <w:r>
+        <w:t>.</w:t>
+      </w:r>
+    </w:p>
+    <w:p>
+      <w:pPr>
+        <w:pStyle w:val="ListParagraph"/>
+        <w:numPr>
+          <w:ilvl w:val="0"/>
+          <w:numId w:val="1"/>
+        </w:numPr>
+        <w:spacing w:after="80"/>
+        <w:rPr>
+          <w:lang w:val="en-GB"/>
+        </w:rPr>
+      </w:pPr>
+      <w:r>
+        <w:rPr>
+          <w:b/>
+          <w:bCs/>
+        </w:rPr>
+        <w:t>Standardization</w:t>
+      </w:r>
+      <w:r>
+        <w:rPr>
+          <w:b/>
+          <w:bCs/>
+        </w:rPr>
+        <w:t xml:space="preserve"> </w:t>
+      </w:r>
+      <w:r>
+        <w:t>(</w:t>
+      </w:r>
+      <w:r>
+        <w:rPr>
+          <w:i/>
+          <w:iCs/>
+        </w:rPr>
         <w:t>StandardScaler</w:t>
       </w:r>
-      <w:proofErr w:type="spellEnd"/>
-      <w:r>
-        <w:t xml:space="preserve">): The resulting TF-IDF feature matrix (2,500 tweets × 8,968 terms) was </w:t>
-      </w:r>
-      <w:proofErr w:type="spellStart"/>
-      <w:r>
-        <w:t>standardised</w:t>
-      </w:r>
-      <w:proofErr w:type="spellEnd"/>
-      <w:r>
-        <w:t xml:space="preserve"> to zero mean and unit variance. PCA identifies directions of maximum variance, so without </w:t>
-      </w:r>
-      <w:proofErr w:type="spellStart"/>
-      <w:r>
-        <w:t>standardisation</w:t>
-      </w:r>
-      <w:proofErr w:type="spellEnd"/>
-      <w:r>
-        <w:t>, any single high-magnitude term could dominate the principal components purely due to scale rather than true importance.</w:t>
+      <w:r>
+        <w:t>)</w:t>
+      </w:r>
+      <w:r>
+        <w:t xml:space="preserve">: </w:t>
+      </w:r>
+      <w:r>
+        <w:rPr>
+          <w:lang w:val="en-GB"/>
+        </w:rPr>
+        <w:t xml:space="preserve">PCA finds directions where the data varies the most. If one word has much larger numbers than others, PCA will focus only on that word. Using </w:t>
+      </w:r>
+      <w:r>
+        <w:rPr>
+          <w:lang w:val="en-GB"/>
+        </w:rPr>
+        <w:t xml:space="preserve">the </w:t>
+      </w:r>
+      <w:r>
+        <w:rPr>
+          <w:i/>
+          <w:iCs/>
+          <w:lang w:val="en-GB"/>
+        </w:rPr>
+        <w:t>StandardScaler</w:t>
+      </w:r>
+      <w:r>
+        <w:rPr>
+          <w:lang w:val="en-GB"/>
+        </w:rPr>
+        <w:t xml:space="preserve"> sets the mean to 0 and variance to 1, ensuring every word has a fair influence on the results</w:t>
+      </w:r>
+      <w:r>
+        <w:t>.</w:t>
       </w:r>
     </w:p>
     <w:p>
@@ -707,37 +793,29 @@
       <w:r>
         <w:t xml:space="preserve">During our evaluation, we discussed the trade-off between </w:t>
       </w:r>
-      <w:proofErr w:type="spellStart"/>
-      <w:r>
-        <w:t>standardisation</w:t>
-      </w:r>
-      <w:proofErr w:type="spellEnd"/>
+      <w:r>
+        <w:t>standardization</w:t>
+      </w:r>
       <w:r>
         <w:t xml:space="preserve"> and maintaining data sparsity. While </w:t>
       </w:r>
-      <w:proofErr w:type="spellStart"/>
-      <w:r>
-        <w:t>standardising</w:t>
-      </w:r>
-      <w:proofErr w:type="spellEnd"/>
-      <w:r>
-        <w:t xml:space="preserve"> the TF-IDF matrix to zero mean and unit variance breaks its original sparse </w:t>
-      </w:r>
-      <w:proofErr w:type="gramStart"/>
-      <w:r>
-        <w:t>structure—</w:t>
-      </w:r>
-      <w:proofErr w:type="gramEnd"/>
-      <w:r>
-        <w:t xml:space="preserve">increasing memory </w:t>
-      </w:r>
-      <w:proofErr w:type="gramStart"/>
-      <w:r>
-        <w:t>overhead—</w:t>
-      </w:r>
-      <w:proofErr w:type="gramEnd"/>
-      <w:r>
-        <w:t>we deemed it essential because PCA is scale-sensitive; without it, terms with inherently higher frequencies would disproportionately skew the principal components.</w:t>
+      <w:r>
+        <w:t>standardizing</w:t>
+      </w:r>
+      <w:r>
+        <w:t xml:space="preserve"> the TF-IDF matrix to zero mean and unit variance breaks its original sparse structure—increasing memory overhead—we </w:t>
+      </w:r>
+      <w:r>
+        <w:t xml:space="preserve">think </w:t>
+      </w:r>
+      <w:r>
+        <w:t>it</w:t>
+      </w:r>
+      <w:r>
+        <w:t xml:space="preserve"> is</w:t>
+      </w:r>
+      <w:r>
+        <w:t xml:space="preserve"> essential because PCA is scale-sensitive; without it, terms with inherently higher frequencies would disproportionately skew the principal components.</w:t>
       </w:r>
     </w:p>
     <w:p>
@@ -751,7 +829,17 @@
         <w:t>We</w:t>
       </w:r>
       <w:r>
-        <w:t xml:space="preserve"> opted to work directly with the provided tfidf_features.csv rather than building Boolean vectors from Module 3, since TF-IDF weighting is strictly more informative than a binary presence/absence encoding for this task — it preserves term-frequency information within each tweet in addition to term rarity across the corpus, which the Boolean representation discards entirely.</w:t>
+        <w:t xml:space="preserve"> opted to work directly with the provided </w:t>
+      </w:r>
+      <w:r>
+        <w:rPr>
+          <w:i/>
+          <w:iCs/>
+        </w:rPr>
+        <w:t>tfidf_features.csv</w:t>
+      </w:r>
+      <w:r>
+        <w:t xml:space="preserve"> rather than building Boolean vectors from Module 3, since TF-IDF weighting is strictly more informative than a binary presence/absence encoding for this task — it preserves term-frequency information within each tweet in addition to term rarity across the corpus, which the Boolean representation discards entirely.</w:t>
       </w:r>
     </w:p>
     <w:p>
@@ -779,21 +867,11 @@
       <w:r>
         <w:t xml:space="preserve">Dimensions tested: 2, 10, 50, 100, 250, 500, 750, 1000 (using a 500-tweet subsample of the </w:t>
       </w:r>
-      <w:proofErr w:type="spellStart"/>
-      <w:r>
-        <w:t>standardised</w:t>
-      </w:r>
-      <w:proofErr w:type="spellEnd"/>
-      <w:r>
-        <w:t xml:space="preserve"> TF-IDF matrix for computational efficiency). For each dimensionality, pairwise Euclidean distances between all sample pairs were computed and </w:t>
-      </w:r>
-      <w:proofErr w:type="gramStart"/>
-      <w:r>
-        <w:t>averaged</w:t>
-      </w:r>
-      <w:proofErr w:type="gramEnd"/>
-      <w:r>
-        <w:t>.</w:t>
+      <w:r>
+        <w:t>standardized</w:t>
+      </w:r>
+      <w:r>
+        <w:t xml:space="preserve"> TF-IDF matrix for computational efficiency). For each dimensionality, pairwise Euclidean distances between all sample pairs were computed and averaged.</w:t>
       </w:r>
     </w:p>
     <w:p>
@@ -804,9 +882,6 @@
           <w:szCs w:val="24"/>
         </w:rPr>
       </w:pPr>
-      <w:r>
-        <w:br w:type="page"/>
-      </w:r>
     </w:p>
     <w:p>
       <w:pPr>
@@ -814,14 +889,11 @@
         <w:spacing w:before="200" w:after="100"/>
       </w:pPr>
       <w:r>
-        <w:lastRenderedPageBreak/>
         <w:t xml:space="preserve">6.2.2 </w:t>
       </w:r>
-      <w:proofErr w:type="spellStart"/>
-      <w:r>
-        <w:t>Visualisation</w:t>
-      </w:r>
-      <w:proofErr w:type="spellEnd"/>
+      <w:r>
+        <w:t>Visualization</w:t>
+      </w:r>
     </w:p>
     <w:p>
       <w:pPr>
@@ -830,13 +902,16 @@
       </w:pPr>
       <w:r>
         <w:rPr>
-          <w:noProof/>
+          <w:i/>
+          <w:iCs/>
+          <w:sz w:val="18"/>
+          <w:szCs w:val="18"/>
         </w:rPr>
         <w:drawing>
-          <wp:inline distT="0" distB="0" distL="0" distR="0" wp14:anchorId="21B4147B" wp14:editId="3DD2DD2D">
-            <wp:extent cx="5260022" cy="2905658"/>
-            <wp:effectExtent l="0" t="0" r="0" b="9525"/>
-            <wp:docPr id="476116370" name="Picture 1"/>
+          <wp:inline distT="0" distB="0" distL="0" distR="0" wp14:anchorId="1D236290" wp14:editId="7188F438">
+            <wp:extent cx="13230225" cy="4667250"/>
+            <wp:effectExtent l="0" t="0" r="9525" b="0"/>
+            <wp:docPr id="551720170" name="Picture 1"/>
             <wp:cNvGraphicFramePr>
               <a:graphicFrameLocks xmlns:a="http://schemas.openxmlformats.org/drawingml/2006/main" noChangeAspect="1"/>
             </wp:cNvGraphicFramePr>
@@ -844,36 +919,23 @@
               <a:graphicData uri="http://schemas.openxmlformats.org/drawingml/2006/picture">
                 <pic:pic xmlns:pic="http://schemas.openxmlformats.org/drawingml/2006/picture">
                   <pic:nvPicPr>
-                    <pic:cNvPr id="0" name="Picture 1"/>
-                    <pic:cNvPicPr>
-                      <a:picLocks noChangeAspect="1" noChangeArrowheads="1"/>
-                    </pic:cNvPicPr>
+                    <pic:cNvPr id="551720170" name=""/>
+                    <pic:cNvPicPr/>
                   </pic:nvPicPr>
                   <pic:blipFill>
-                    <a:blip r:embed="rId6">
-                      <a:extLst>
-                        <a:ext uri="{28A0092B-C50C-407E-A947-70E740481C1C}">
-                          <a14:useLocalDpi xmlns:a14="http://schemas.microsoft.com/office/drawing/2010/main" val="0"/>
-                        </a:ext>
-                      </a:extLst>
-                    </a:blip>
-                    <a:srcRect/>
+                    <a:blip r:embed="rId6"/>
                     <a:stretch>
                       <a:fillRect/>
                     </a:stretch>
                   </pic:blipFill>
-                  <pic:spPr bwMode="auto">
+                  <pic:spPr>
                     <a:xfrm>
                       <a:off x="0" y="0"/>
-                      <a:ext cx="5266236" cy="2909091"/>
+                      <a:ext cx="13230225" cy="4667250"/>
                     </a:xfrm>
                     <a:prstGeom prst="rect">
                       <a:avLst/>
                     </a:prstGeom>
-                    <a:noFill/>
-                    <a:ln>
-                      <a:noFill/>
-                    </a:ln>
                   </pic:spPr>
                 </pic:pic>
               </a:graphicData>
@@ -902,44 +964,119 @@
     </w:p>
     <w:p>
       <w:pPr>
-        <w:spacing w:after="150"/>
-      </w:pPr>
-      <w:r>
-        <w:t xml:space="preserve">As dimensionality increases from 2 to 1,000, the average pairwise Euclidean distance between tweet vectors grows rapidly, while the relative gap between the nearest and farthest points shrinks. In high-dimensional space, almost all points end up at a similar distance from one another, which makes distance-based methods such as K-Means or KNN struggle to identify meaningful groupings — this is precisely why dimensionality reduction is a necessary step before clustering or </w:t>
-      </w:r>
-      <w:proofErr w:type="spellStart"/>
-      <w:r>
-        <w:t>visualising</w:t>
-      </w:r>
-      <w:proofErr w:type="spellEnd"/>
-      <w:r>
-        <w:t xml:space="preserve"> this dataset.</w:t>
-      </w:r>
-    </w:p>
-    <w:p>
-      <w:pPr>
-        <w:spacing w:after="150"/>
-      </w:pPr>
-      <w:r>
-        <w:t>Looking at the curve in Figure 6.1, the average distance shoots up quickly between 2 and 500 dimensions (from almost 0 to around 22). After that, the line starts to level off and grows much more slowly, showing that adding more dimensions beyond this point doesn't add much separation between the points.</w:t>
-      </w:r>
-      <w:r>
+        <w:pStyle w:val="ListParagraph"/>
+        <w:numPr>
+          <w:ilvl w:val="0"/>
+          <w:numId w:val="2"/>
+        </w:numPr>
         <w:rPr>
-          <w:rFonts w:hint="eastAsia"/>
+          <w:lang w:val="en-GB"/>
+        </w:rPr>
+      </w:pPr>
+      <w:r>
+        <w:rPr>
+          <w:b/>
+          <w:bCs/>
+          <w:lang w:val="en-GB"/>
+        </w:rPr>
+        <w:t>Observation:</w:t>
+      </w:r>
+      <w:r>
+        <w:rPr>
+          <w:b/>
+          <w:bCs/>
+          <w:lang w:val="en-GB"/>
         </w:rPr>
         <w:t xml:space="preserve"> </w:t>
       </w:r>
-    </w:p>
-    <w:p>
-      <w:pPr>
+      <w:r>
         <w:rPr>
-          <w:color w:val="2E74B5"/>
-          <w:sz w:val="26"/>
-          <w:szCs w:val="26"/>
+          <w:lang w:val="en-GB"/>
         </w:rPr>
-      </w:pPr>
-      <w:r>
-        <w:br w:type="page"/>
+        <w:t>When we increase the number of dimensions from 2 up to 1,000, the average Euclidean distance between tweet vectors grows steadily (left panel). More importantly, the coefficient of variation (CV = std/mean) of pairwise distances drops sharply — from roughly 15.8 at 2 dimensions to roughly 0.7 at 1,000 dimensions (right panel).</w:t>
+      </w:r>
+    </w:p>
+    <w:p>
+      <w:pPr>
+        <w:rPr>
+          <w:lang w:val="en-GB"/>
+        </w:rPr>
+      </w:pPr>
+    </w:p>
+    <w:p>
+      <w:pPr>
+        <w:pStyle w:val="ListParagraph"/>
+        <w:numPr>
+          <w:ilvl w:val="0"/>
+          <w:numId w:val="2"/>
+        </w:numPr>
+        <w:rPr>
+          <w:lang w:val="en-GB"/>
+        </w:rPr>
+      </w:pPr>
+      <w:r>
+        <w:rPr>
+          <w:b/>
+          <w:bCs/>
+          <w:lang w:val="en-GB"/>
+        </w:rPr>
+        <w:t>Finding / Interpretation:</w:t>
+      </w:r>
+      <w:r>
+        <w:rPr>
+          <w:b/>
+          <w:bCs/>
+          <w:lang w:val="en-GB"/>
+        </w:rPr>
+        <w:t xml:space="preserve"> </w:t>
+      </w:r>
+      <w:r>
+        <w:rPr>
+          <w:lang w:val="en-GB"/>
+        </w:rPr>
+        <w:t xml:space="preserve">A shrinking CV means the </w:t>
+      </w:r>
+      <w:r>
+        <w:rPr>
+          <w:i/>
+          <w:iCs/>
+          <w:lang w:val="en-GB"/>
+        </w:rPr>
+        <w:t>spread</w:t>
+      </w:r>
+      <w:r>
+        <w:rPr>
+          <w:lang w:val="en-GB"/>
+        </w:rPr>
+        <w:t xml:space="preserve"> of distances is shrinking relative to their </w:t>
+      </w:r>
+      <w:r>
+        <w:rPr>
+          <w:i/>
+          <w:iCs/>
+          <w:lang w:val="en-GB"/>
+        </w:rPr>
+        <w:t>average</w:t>
+      </w:r>
+      <w:r>
+        <w:rPr>
+          <w:lang w:val="en-GB"/>
+        </w:rPr>
+        <w:t xml:space="preserve">: as dimensionality grows, the gap between the nearest and farthest points becomes small compared to the typical distance, so almost every pair of points ends up looking roughly equidistant. This is the real signature of the curse of dimensionality — not that points get farther apart, but that the </w:t>
+      </w:r>
+      <w:r>
+        <w:rPr>
+          <w:i/>
+          <w:iCs/>
+          <w:lang w:val="en-GB"/>
+        </w:rPr>
+        <w:t>contrast</w:t>
+      </w:r>
+      <w:r>
+        <w:rPr>
+          <w:lang w:val="en-GB"/>
+        </w:rPr>
+        <w:t xml:space="preserve"> between near and far points vanishes. This breaks the core assumption behind distance-based methods like K-Means or KNN (that "closer" is meaningfully different from "farther"), which is why dimensionality reduction is necessary before applying such methods to this dataset.</w:t>
       </w:r>
     </w:p>
     <w:p>
@@ -948,7 +1085,6 @@
         <w:spacing w:before="300" w:after="150"/>
       </w:pPr>
       <w:r>
-        <w:lastRenderedPageBreak/>
         <w:t>6.3 Dimensionality Reduction using PCA</w:t>
       </w:r>
     </w:p>
@@ -966,21 +1102,18 @@
         <w:spacing w:after="150"/>
       </w:pPr>
       <w:r>
-        <w:t xml:space="preserve">Method used: PCA </w:t>
-      </w:r>
-      <w:proofErr w:type="gramStart"/>
-      <w:r>
-        <w:t>was fit</w:t>
-      </w:r>
-      <w:proofErr w:type="gramEnd"/>
-      <w:r>
-        <w:t xml:space="preserve"> on the full </w:t>
-      </w:r>
-      <w:proofErr w:type="spellStart"/>
-      <w:r>
-        <w:t>standardised</w:t>
-      </w:r>
-      <w:proofErr w:type="spellEnd"/>
+        <w:rPr>
+          <w:b/>
+          <w:bCs/>
+        </w:rPr>
+        <w:t>Method</w:t>
+      </w:r>
+      <w:r>
+        <w:t xml:space="preserve">: PCA was fit on the full </w:t>
+      </w:r>
+      <w:r>
+        <w:t>standardized</w:t>
+      </w:r>
       <w:r>
         <w:t xml:space="preserve"> TF-IDF matrix (up to 1,000 components), and the cumulative explained variance curve was inspected against an 80% variance threshold — a common heuristic for retaining "most" of the information while discarding noise.</w:t>
       </w:r>
@@ -989,16 +1122,34 @@
       <w:pPr>
         <w:spacing w:after="300"/>
         <w:jc w:val="center"/>
-      </w:pPr>
-      <w:r>
         <w:rPr>
-          <w:noProof/>
+          <w:i/>
+          <w:iCs/>
+          <w:sz w:val="18"/>
+          <w:szCs w:val="18"/>
         </w:rPr>
+      </w:pPr>
+      <w:r>
+        <w:rPr>
+          <w:i/>
+          <w:iCs/>
+          <w:sz w:val="18"/>
+          <w:szCs w:val="18"/>
+        </w:rPr>
+        <w:t>Figure 6.2: Cumulative explained variance vs. number of principal components.</w:t>
+      </w:r>
+    </w:p>
+    <w:p>
+      <w:pPr>
+        <w:spacing w:after="300"/>
+        <w:jc w:val="center"/>
+      </w:pPr>
+      <w:r>
         <w:drawing>
-          <wp:inline distT="0" distB="0" distL="0" distR="0" wp14:anchorId="5A575D54" wp14:editId="5ABDC8CF">
-            <wp:extent cx="5731510" cy="3193415"/>
-            <wp:effectExtent l="0" t="0" r="2540" b="6985"/>
-            <wp:docPr id="268520996" name="Picture 2"/>
+          <wp:inline distT="0" distB="0" distL="0" distR="0" wp14:anchorId="763414C0" wp14:editId="470CFFC3">
+            <wp:extent cx="8172450" cy="4514850"/>
+            <wp:effectExtent l="0" t="0" r="0" b="0"/>
+            <wp:docPr id="1688119734" name="Picture 1"/>
             <wp:cNvGraphicFramePr>
               <a:graphicFrameLocks xmlns:a="http://schemas.openxmlformats.org/drawingml/2006/main" noChangeAspect="1"/>
             </wp:cNvGraphicFramePr>
@@ -1006,36 +1157,23 @@
               <a:graphicData uri="http://schemas.openxmlformats.org/drawingml/2006/picture">
                 <pic:pic xmlns:pic="http://schemas.openxmlformats.org/drawingml/2006/picture">
                   <pic:nvPicPr>
-                    <pic:cNvPr id="0" name="Picture 3"/>
-                    <pic:cNvPicPr>
-                      <a:picLocks noChangeAspect="1" noChangeArrowheads="1"/>
-                    </pic:cNvPicPr>
+                    <pic:cNvPr id="1688119734" name=""/>
+                    <pic:cNvPicPr/>
                   </pic:nvPicPr>
                   <pic:blipFill>
-                    <a:blip r:embed="rId7">
-                      <a:extLst>
-                        <a:ext uri="{28A0092B-C50C-407E-A947-70E740481C1C}">
-                          <a14:useLocalDpi xmlns:a14="http://schemas.microsoft.com/office/drawing/2010/main" val="0"/>
-                        </a:ext>
-                      </a:extLst>
-                    </a:blip>
-                    <a:srcRect/>
+                    <a:blip r:embed="rId7"/>
                     <a:stretch>
                       <a:fillRect/>
                     </a:stretch>
                   </pic:blipFill>
-                  <pic:spPr bwMode="auto">
+                  <pic:spPr>
                     <a:xfrm>
                       <a:off x="0" y="0"/>
-                      <a:ext cx="5731510" cy="3193415"/>
+                      <a:ext cx="8172450" cy="4514850"/>
                     </a:xfrm>
                     <a:prstGeom prst="rect">
                       <a:avLst/>
                     </a:prstGeom>
-                    <a:noFill/>
-                    <a:ln>
-                      <a:noFill/>
-                    </a:ln>
                   </pic:spPr>
                 </pic:pic>
               </a:graphicData>
@@ -1043,30 +1181,163 @@
           </wp:inline>
         </w:drawing>
       </w:r>
+    </w:p>
+    <w:p>
+      <w:pPr>
+        <w:pStyle w:val="ListParagraph"/>
+        <w:numPr>
+          <w:ilvl w:val="0"/>
+          <w:numId w:val="3"/>
+        </w:numPr>
+        <w:rPr>
+          <w:lang w:val="en-GB"/>
+        </w:rPr>
+      </w:pPr>
+      <w:r>
+        <w:rPr>
+          <w:b/>
+          <w:bCs/>
+          <w:lang w:val="en-GB"/>
+        </w:rPr>
+        <w:t>Determining Optimal Components:</w:t>
+      </w:r>
+      <w:r>
+        <w:rPr>
+          <w:b/>
+          <w:bCs/>
+          <w:lang w:val="en-GB"/>
+        </w:rPr>
+        <w:t xml:space="preserve"> </w:t>
+      </w:r>
+      <w:r>
+        <w:rPr>
+          <w:lang w:val="en-GB"/>
+        </w:rPr>
+        <w:t xml:space="preserve">We plotted the Cumulative Explained Variance curve (Scree Plot) and looked for the point where the curve explains about </w:t>
+      </w:r>
       <w:r>
         <w:rPr>
           <w:i/>
           <w:iCs/>
-          <w:sz w:val="18"/>
-          <w:szCs w:val="18"/>
+          <w:lang w:val="en-GB"/>
         </w:rPr>
-        <w:t>Figure 6.2: Cumulative explained variance vs. number of principal components.</w:t>
-      </w:r>
-    </w:p>
-    <w:p>
-      <w:pPr>
-        <w:spacing w:after="150"/>
-      </w:pPr>
-      <w:r>
-        <w:t xml:space="preserve">Result: as shown in Figure 6.2, the 80% cumulative-variance threshold (dashed line) is not reached at all — even with the full 1,000 components tested, cumulative explained variance reaches only about 68%. This signals that the standard 80%-variance heuristic does not apply well to this dataset: variance is extremely spread out across components (each of the top 5 individually explains under 0.25% of variance, see Section 6.3.2), so no small or even moderately large handful of components captures 80% of the signal. Keeping the top 50 components was instead chosen as a pragmatic balance: it cuts down on the noisy, </w:t>
-      </w:r>
-      <w:proofErr w:type="gramStart"/>
-      <w:r>
-        <w:t>rarely-used</w:t>
-      </w:r>
-      <w:proofErr w:type="gramEnd"/>
-      <w:r>
-        <w:t xml:space="preserve"> terms in the tail while keeping the data compact enough for t-SNE to run efficiently in Section 6.4.</w:t>
+        <w:t>80%</w:t>
+      </w:r>
+      <w:r>
+        <w:rPr>
+          <w:lang w:val="en-GB"/>
+        </w:rPr>
+        <w:t xml:space="preserve"> of the total variance. Because the TF-IDF feature space is very sparse and high-dimensional, this crossover point occurs much later than it would for typical dense datasets — approximately 1,326 components are needed to reach </w:t>
+      </w:r>
+      <w:r>
+        <w:rPr>
+          <w:i/>
+          <w:iCs/>
+          <w:lang w:val="en-GB"/>
+        </w:rPr>
+        <w:t>80%</w:t>
+      </w:r>
+      <w:r>
+        <w:rPr>
+          <w:lang w:val="en-GB"/>
+        </w:rPr>
+        <w:t xml:space="preserve"> cumulative variance (verified separately with an exact full-rank fit up to ~</w:t>
+      </w:r>
+      <w:r>
+        <w:rPr>
+          <w:i/>
+          <w:iCs/>
+          <w:lang w:val="en-GB"/>
+        </w:rPr>
+        <w:t>2,</w:t>
+      </w:r>
+      <w:r>
+        <w:rPr>
+          <w:i/>
+          <w:iCs/>
+          <w:lang w:val="en-GB"/>
+        </w:rPr>
+        <w:t>500</w:t>
+      </w:r>
+      <w:r>
+        <w:rPr>
+          <w:lang w:val="en-GB"/>
+        </w:rPr>
+        <w:t xml:space="preserve"> components, which crosses 80% at ~</w:t>
+      </w:r>
+      <w:r>
+        <w:rPr>
+          <w:i/>
+          <w:iCs/>
+          <w:lang w:val="en-GB"/>
+        </w:rPr>
+        <w:t>1,308</w:t>
+      </w:r>
+      <w:r>
+        <w:rPr>
+          <w:lang w:val="en-GB"/>
+        </w:rPr>
+        <w:t xml:space="preserve"> components — the small difference is expected approximation error from the randomized SVD solver used here for tractability).</w:t>
+      </w:r>
+    </w:p>
+    <w:p>
+      <w:pPr>
+        <w:pStyle w:val="ListParagraph"/>
+        <w:numPr>
+          <w:ilvl w:val="0"/>
+          <w:numId w:val="3"/>
+        </w:numPr>
+        <w:rPr>
+          <w:lang w:val="en-GB"/>
+        </w:rPr>
+      </w:pPr>
+      <w:r>
+        <w:rPr>
+          <w:b/>
+          <w:bCs/>
+          <w:lang w:val="en-GB"/>
+        </w:rPr>
+        <w:t>Top 5 Components Analysis:</w:t>
+      </w:r>
+      <w:r>
+        <w:rPr>
+          <w:b/>
+          <w:bCs/>
+          <w:lang w:val="en-GB"/>
+        </w:rPr>
+        <w:t xml:space="preserve"> </w:t>
+      </w:r>
+      <w:r>
+        <w:rPr>
+          <w:lang w:val="en-GB"/>
+        </w:rPr>
+        <w:t xml:space="preserve">The top 5 principal components together explain only about </w:t>
+      </w:r>
+      <w:r>
+        <w:rPr>
+          <w:i/>
+          <w:iCs/>
+          <w:lang w:val="en-GB"/>
+        </w:rPr>
+        <w:t>1%</w:t>
+      </w:r>
+      <w:r>
+        <w:rPr>
+          <w:lang w:val="en-GB"/>
+        </w:rPr>
+        <w:t xml:space="preserve"> of the total variance. This happens because text data is very sparse and contains thousands of unique words. No single topic or word dominates the entire dataset, so variance is spread thinly across many components, and </w:t>
+      </w:r>
+      <w:r>
+        <w:rPr>
+          <w:lang w:val="en-GB"/>
+        </w:rPr>
+        <w:t>many</w:t>
+      </w:r>
+      <w:r>
+        <w:rPr>
+          <w:lang w:val="en-GB"/>
+        </w:rPr>
+        <w:t xml:space="preserve"> components is needed to retain most of the information — a direct illustration of why dimensionality reduction for sparse text data is more difficult than for dense, structured data.</w:t>
       </w:r>
     </w:p>
     <w:p>
@@ -1077,9 +1348,6 @@
           <w:szCs w:val="24"/>
         </w:rPr>
       </w:pPr>
-      <w:r>
-        <w:br w:type="page"/>
-      </w:r>
     </w:p>
     <w:p>
       <w:pPr>
@@ -1087,7 +1355,6 @@
         <w:spacing w:before="200" w:after="100"/>
       </w:pPr>
       <w:r>
-        <w:lastRenderedPageBreak/>
         <w:t>6.3.2 Total Explained Variance of Top 5 Components</w:t>
       </w:r>
     </w:p>
@@ -1374,7 +1641,17 @@
         <w:spacing w:after="150"/>
       </w:pPr>
       <w:r>
-        <w:t>The top 5 principal components together explain only about 1.04% of total variance. This is characteristic of sparse, high-dimensional text data: with 8,968 unique terms and no single dominant topic or vocabulary cluster, information is spread thinly across a very large number of components rather than concentrated in a few, meaning a much larger number of components (dozens to hundreds) would be needed to capture the majority of the signal.</w:t>
+        <w:t xml:space="preserve">The top 5 principal components together explain only about </w:t>
+      </w:r>
+      <w:r>
+        <w:rPr>
+          <w:i/>
+          <w:iCs/>
+        </w:rPr>
+        <w:t>1.04%</w:t>
+      </w:r>
+      <w:r>
+        <w:t xml:space="preserve"> of total variance. This is characteristic of sparse, high-dimensional text data: with 8,968 unique terms and no single dominant topic or vocabulary cluster, information is spread thinly across a very large number of components rather than concentrated in a few, meaning a much larger number of components (dozens to hundreds) would be needed to capture the majority of the signal.</w:t>
       </w:r>
     </w:p>
     <w:p>
@@ -1393,11 +1670,9 @@
       <w:r>
         <w:t xml:space="preserve">Before running t-SNE, the </w:t>
       </w:r>
-      <w:proofErr w:type="spellStart"/>
-      <w:r>
-        <w:t>standardised</w:t>
-      </w:r>
-      <w:proofErr w:type="spellEnd"/>
+      <w:r>
+        <w:t>standardized</w:t>
+      </w:r>
       <w:r>
         <w:t xml:space="preserve"> TF-IDF matrix was first reduced to 50 dimensions using PCA, to suppress noise and reduce the computational cost of t-SNE (which scales poorly with the number of input features).</w:t>
       </w:r>
@@ -1583,7 +1858,27 @@
         <w:spacing w:after="150"/>
       </w:pPr>
       <w:r>
-        <w:t>Perplexity value selected: 30.</w:t>
+        <w:t xml:space="preserve">Optimal </w:t>
+      </w:r>
+      <w:r>
+        <w:t xml:space="preserve">Perplexity value selected: </w:t>
+      </w:r>
+      <w:r>
+        <w:rPr>
+          <w:i/>
+          <w:iCs/>
+        </w:rPr>
+        <w:t>2</w:t>
+      </w:r>
+      <w:r>
+        <w:rPr>
+          <w:i/>
+          <w:iCs/>
+        </w:rPr>
+        <w:t>0</w:t>
+      </w:r>
+      <w:r>
+        <w:t>.</w:t>
       </w:r>
     </w:p>
     <w:p>
@@ -1591,7 +1886,24 @@
         <w:spacing w:after="150"/>
       </w:pPr>
       <w:r>
-        <w:t>This value was chosen after testing a range between 10 and 50: perplexity = 30 produced a low KL divergence together with visually balanced, stable clusters, without fragmenting the data into many small, spurious groupings that lower perplexity values tended to produce.</w:t>
+        <w:t xml:space="preserve">This value was chosen after testing a range between 10 and 50: perplexity = </w:t>
+      </w:r>
+      <w:r>
+        <w:rPr>
+          <w:i/>
+          <w:iCs/>
+        </w:rPr>
+        <w:t>2</w:t>
+      </w:r>
+      <w:r>
+        <w:rPr>
+          <w:i/>
+          <w:iCs/>
+        </w:rPr>
+        <w:t>0</w:t>
+      </w:r>
+      <w:r>
+        <w:t xml:space="preserve"> produced a low KL divergence together with visually balanced, stable clusters, without fragmenting the data into many small, spurious groupings that lower perplexity values tended to produce.</w:t>
       </w:r>
     </w:p>
     <w:p>
@@ -1599,27 +1911,25 @@
         <w:spacing w:after="150"/>
       </w:pPr>
       <w:r>
-        <w:t xml:space="preserve">KL divergence decreases consistently as the number of t-SNE output dimensions increases from 1 to 3 (2.98 → 1.92 → 1.77), indicating that 3 components preserve the original high-dimensional </w:t>
-      </w:r>
-      <w:proofErr w:type="spellStart"/>
-      <w:r>
-        <w:t>neighbourhood</w:t>
-      </w:r>
-      <w:proofErr w:type="spellEnd"/>
+        <w:t>KL divergence decreases consistently as the number of t-SNE output dimensions increases from 1 to 3 (</w:t>
+      </w:r>
+      <w:r>
+        <w:t>3.01</w:t>
+      </w:r>
+      <w:r>
+        <w:t xml:space="preserve"> → 1.9</w:t>
+      </w:r>
+      <w:r>
+        <w:t>3</w:t>
+      </w:r>
+      <w:r>
+        <w:t xml:space="preserve"> → 1.77), indicating that 3 components preserve the original high-dimensional </w:t>
+      </w:r>
+      <w:r>
+        <w:t>neighborhood</w:t>
+      </w:r>
       <w:r>
         <w:t xml:space="preserve"> structure more faithfully than 1 or 2 components.</w:t>
-      </w:r>
-    </w:p>
-    <w:p>
-      <w:pPr>
-        <w:rPr>
-          <w:color w:val="2E74B5"/>
-          <w:sz w:val="26"/>
-          <w:szCs w:val="26"/>
-        </w:rPr>
-      </w:pPr>
-      <w:r>
-        <w:br w:type="page"/>
       </w:r>
     </w:p>
     <w:p>
@@ -1628,14 +1938,11 @@
         <w:spacing w:before="300" w:after="150"/>
       </w:pPr>
       <w:r>
-        <w:lastRenderedPageBreak/>
         <w:t xml:space="preserve">6.5 Comparative </w:t>
       </w:r>
-      <w:proofErr w:type="spellStart"/>
-      <w:r>
-        <w:t>Visualisation</w:t>
-      </w:r>
-      <w:proofErr w:type="spellEnd"/>
+      <w:r>
+        <w:t>Visualization</w:t>
+      </w:r>
       <w:r>
         <w:t>: PCA vs. t-SNE</w:t>
       </w:r>
@@ -1644,16 +1951,34 @@
       <w:pPr>
         <w:spacing w:after="300"/>
         <w:jc w:val="center"/>
-      </w:pPr>
-      <w:r>
         <w:rPr>
-          <w:noProof/>
+          <w:i/>
+          <w:iCs/>
+          <w:sz w:val="18"/>
+          <w:szCs w:val="18"/>
         </w:rPr>
+      </w:pPr>
+      <w:r>
+        <w:rPr>
+          <w:i/>
+          <w:iCs/>
+          <w:sz w:val="18"/>
+          <w:szCs w:val="18"/>
+        </w:rPr>
+        <w:t>Figure 6.3: PCA (left) vs. t-SNE (right) — top 3 components, coloured by relevance label (0 = Irrelevant, 1 = Relevant).</w:t>
+      </w:r>
+    </w:p>
+    <w:p>
+      <w:pPr>
+        <w:spacing w:after="300"/>
+        <w:jc w:val="center"/>
+      </w:pPr>
+      <w:r>
         <w:drawing>
-          <wp:inline distT="0" distB="0" distL="0" distR="0" wp14:anchorId="356A8CE1" wp14:editId="44F0B32F">
-            <wp:extent cx="5731510" cy="2487295"/>
-            <wp:effectExtent l="0" t="0" r="2540" b="8255"/>
-            <wp:docPr id="873783072" name="Picture 3"/>
+          <wp:inline distT="0" distB="0" distL="0" distR="0" wp14:anchorId="68B07422" wp14:editId="54642819">
+            <wp:extent cx="10868025" cy="4705350"/>
+            <wp:effectExtent l="0" t="0" r="9525" b="0"/>
+            <wp:docPr id="512099991" name="Picture 1"/>
             <wp:cNvGraphicFramePr>
               <a:graphicFrameLocks xmlns:a="http://schemas.openxmlformats.org/drawingml/2006/main" noChangeAspect="1"/>
             </wp:cNvGraphicFramePr>
@@ -1661,36 +1986,23 @@
               <a:graphicData uri="http://schemas.openxmlformats.org/drawingml/2006/picture">
                 <pic:pic xmlns:pic="http://schemas.openxmlformats.org/drawingml/2006/picture">
                   <pic:nvPicPr>
-                    <pic:cNvPr id="0" name="Picture 5"/>
-                    <pic:cNvPicPr>
-                      <a:picLocks noChangeAspect="1" noChangeArrowheads="1"/>
-                    </pic:cNvPicPr>
+                    <pic:cNvPr id="512099991" name=""/>
+                    <pic:cNvPicPr/>
                   </pic:nvPicPr>
                   <pic:blipFill>
-                    <a:blip r:embed="rId8">
-                      <a:extLst>
-                        <a:ext uri="{28A0092B-C50C-407E-A947-70E740481C1C}">
-                          <a14:useLocalDpi xmlns:a14="http://schemas.microsoft.com/office/drawing/2010/main" val="0"/>
-                        </a:ext>
-                      </a:extLst>
-                    </a:blip>
-                    <a:srcRect/>
+                    <a:blip r:embed="rId8"/>
                     <a:stretch>
                       <a:fillRect/>
                     </a:stretch>
                   </pic:blipFill>
-                  <pic:spPr bwMode="auto">
+                  <pic:spPr>
                     <a:xfrm>
                       <a:off x="0" y="0"/>
-                      <a:ext cx="5731510" cy="2487295"/>
+                      <a:ext cx="10868025" cy="4705350"/>
                     </a:xfrm>
                     <a:prstGeom prst="rect">
                       <a:avLst/>
                     </a:prstGeom>
-                    <a:noFill/>
-                    <a:ln>
-                      <a:noFill/>
-                    </a:ln>
                   </pic:spPr>
                 </pic:pic>
               </a:graphicData>
@@ -1698,55 +2010,6 @@
           </wp:inline>
         </w:drawing>
       </w:r>
-      <w:r>
-        <w:rPr>
-          <w:i/>
-          <w:iCs/>
-          <w:sz w:val="18"/>
-          <w:szCs w:val="18"/>
-        </w:rPr>
-        <w:t>Figure 6.3: PCA (left) vs. t-SNE (</w:t>
-      </w:r>
-      <w:proofErr w:type="gramStart"/>
-      <w:r>
-        <w:rPr>
-          <w:i/>
-          <w:iCs/>
-          <w:sz w:val="18"/>
-          <w:szCs w:val="18"/>
-        </w:rPr>
-        <w:t>right) —</w:t>
-      </w:r>
-      <w:proofErr w:type="gramEnd"/>
-      <w:r>
-        <w:rPr>
-          <w:i/>
-          <w:iCs/>
-          <w:sz w:val="18"/>
-          <w:szCs w:val="18"/>
-        </w:rPr>
-        <w:t xml:space="preserve"> top 3 components, </w:t>
-      </w:r>
-      <w:proofErr w:type="spellStart"/>
-      <w:r>
-        <w:rPr>
-          <w:i/>
-          <w:iCs/>
-          <w:sz w:val="18"/>
-          <w:szCs w:val="18"/>
-        </w:rPr>
-        <w:t>coloured</w:t>
-      </w:r>
-      <w:proofErr w:type="spellEnd"/>
-      <w:r>
-        <w:rPr>
-          <w:i/>
-          <w:iCs/>
-          <w:sz w:val="18"/>
-          <w:szCs w:val="18"/>
-        </w:rPr>
-        <w:t xml:space="preserve"> by relevance label (0 = Irrelevant, 1 = Relevant).</w:t>
-      </w:r>
     </w:p>
     <w:p>
       <w:pPr>
@@ -1756,21 +2019,79 @@
       <w:r>
         <w:t>Comparison</w:t>
       </w:r>
-    </w:p>
-    <w:p>
-      <w:pPr>
+      <w:r>
+        <w:t xml:space="preserve"> of Plots</w:t>
+      </w:r>
+    </w:p>
+    <w:p>
+      <w:pPr>
+        <w:pStyle w:val="ListParagraph"/>
+        <w:numPr>
+          <w:ilvl w:val="0"/>
+          <w:numId w:val="4"/>
+        </w:numPr>
         <w:spacing w:after="150"/>
-      </w:pPr>
-      <w:r>
-        <w:t xml:space="preserve">The PCA 3D plot shows one large, crowded cloud </w:t>
-      </w:r>
-      <w:proofErr w:type="spellStart"/>
-      <w:r>
-        <w:t>centred</w:t>
-      </w:r>
-      <w:proofErr w:type="spellEnd"/>
-      <w:r>
-        <w:t xml:space="preserve"> in the middle, with Relevant and Irrelevant tweets heavily overlapping and no visually separable groups. The t-SNE 3D plot, in contrast, shows clearer local groupings, with similar tweets forming tighter local clusters and noticeably better visual separation between the two classes.</w:t>
+        <w:rPr>
+          <w:lang w:val="en-GB"/>
+        </w:rPr>
+      </w:pPr>
+      <w:r>
+        <w:rPr>
+          <w:b/>
+          <w:bCs/>
+        </w:rPr>
+        <w:t>PCA</w:t>
+      </w:r>
+      <w:r>
+        <w:t>:</w:t>
+      </w:r>
+      <w:r>
+        <w:t xml:space="preserve"> </w:t>
+      </w:r>
+      <w:r>
+        <w:rPr>
+          <w:lang w:val="en-GB"/>
+        </w:rPr>
+        <w:t>The 3D plot shows one big, crowded cloud centered in the middle. The "Relevant" and "Irrelevant" tweets overlap heavily, making it hard to see separate groups.</w:t>
+      </w:r>
+    </w:p>
+    <w:p>
+      <w:pPr>
+        <w:pStyle w:val="ListParagraph"/>
+        <w:numPr>
+          <w:ilvl w:val="0"/>
+          <w:numId w:val="4"/>
+        </w:numPr>
+        <w:spacing w:after="150"/>
+        <w:rPr>
+          <w:lang w:val="en-GB"/>
+        </w:rPr>
+      </w:pPr>
+      <w:r>
+        <w:rPr>
+          <w:b/>
+          <w:bCs/>
+        </w:rPr>
+        <w:t>t-SNE</w:t>
+      </w:r>
+      <w:r>
+        <w:t>:</w:t>
+      </w:r>
+      <w:r>
+        <w:rPr>
+          <w:rFonts w:ascii="Consolas" w:eastAsia="Times New Roman" w:hAnsi="Consolas" w:cs="Times New Roman"/>
+          <w:color w:val="BBBEBF"/>
+          <w:sz w:val="21"/>
+          <w:szCs w:val="21"/>
+          <w:lang w:val="en-GB" w:eastAsia="en-GB"/>
+        </w:rPr>
+        <w:t xml:space="preserve"> </w:t>
+      </w:r>
+      <w:r>
+        <w:rPr>
+          <w:lang w:val="en-GB"/>
+        </w:rPr>
+        <w:t>The 3D plot shows clearer groupings. Similar tweets group together in local clusters, showing better separation between relevant and irrelevant posts.</w:t>
       </w:r>
     </w:p>
     <w:p>
@@ -1790,9 +2111,28 @@
           <w:numId w:val="1"/>
         </w:numPr>
         <w:spacing w:after="80"/>
-      </w:pPr>
-      <w:r>
-        <w:t>PCA: very fast and preserves the global (linear) structure of the data, but because it only captures linear combinations of features, it fails to cleanly separate the more complex, non-linear structure present in text topics.</w:t>
+        <w:rPr>
+          <w:lang w:val="en-GB"/>
+        </w:rPr>
+      </w:pPr>
+      <w:r>
+        <w:rPr>
+          <w:b/>
+          <w:bCs/>
+        </w:rPr>
+        <w:t>PCA</w:t>
+      </w:r>
+      <w:r>
+        <w:t xml:space="preserve">: </w:t>
+      </w:r>
+      <w:r>
+        <w:rPr>
+          <w:lang w:val="en-GB"/>
+        </w:rPr>
+        <w:t>It is very fast and keeps the overall global shape of the data, but because it is strictly linear, it fails to separate complex text topics cleanly</w:t>
+      </w:r>
+      <w:r>
+        <w:t>.</w:t>
       </w:r>
     </w:p>
     <w:p>
@@ -1803,33 +2143,25 @@
           <w:numId w:val="1"/>
         </w:numPr>
         <w:spacing w:after="80"/>
-      </w:pPr>
-      <w:r>
-        <w:t xml:space="preserve">t-SNE: effective at revealing non-linear, local </w:t>
-      </w:r>
-      <w:proofErr w:type="spellStart"/>
-      <w:r>
-        <w:t>neighbourhood</w:t>
-      </w:r>
-      <w:proofErr w:type="spellEnd"/>
-      <w:r>
-        <w:t xml:space="preserve"> structure and produces visually clearer clusters, but it is computationally slower, sensitive to the perplexity hyperparameter, and distances between separate clusters in the t-SNE embedding do not correspond to meaningful real-world distances (only local </w:t>
-      </w:r>
-      <w:proofErr w:type="spellStart"/>
-      <w:r>
-        <w:t>neighbourhood</w:t>
-      </w:r>
-      <w:proofErr w:type="spellEnd"/>
-      <w:r>
-        <w:t xml:space="preserve"> relationships are preserved).</w:t>
-      </w:r>
-    </w:p>
-    <w:p>
-      <w:r>
-        <w:t>This is visible in Figure 6.3: the PCA plot compresses almost all points into a tight cluster near the origin, with only a couple of outliers separating out — a sign that the first three linear components capture very little of the class-relevant structure, consistent with the low explained variance reported in Section 6.3.2. The t-SNE plot spreads the same tweets into a broader, more textured 3D cloud, but Relevant (red) and Irrelevant (blue) points remain substantially intermixed throughout, with no clearly separated sub-clusters by class. This indicates that, even after non-linear dimensionality reduction, topic relevance is not a dominant axis of variation in the raw TF-IDF feature space for this dataset — the vocabulary differences between relevant and irrelevant hydrogen tweets are more subtle than a 3-component projection can capture, which is consistent with BERT-based classification (Task 9) outperforming simpler linear methods on this same underlying text.</w:t>
-      </w:r>
-      <w:r>
-        <w:br w:type="page"/>
+        <w:rPr>
+          <w:lang w:val="en-GB"/>
+        </w:rPr>
+      </w:pPr>
+      <w:r>
+        <w:rPr>
+          <w:b/>
+          <w:bCs/>
+        </w:rPr>
+        <w:t>t-SNE</w:t>
+      </w:r>
+      <w:r>
+        <w:t xml:space="preserve">: </w:t>
+      </w:r>
+      <w:r>
+        <w:rPr>
+          <w:lang w:val="en-GB"/>
+        </w:rPr>
+        <w:t>It is great at finding non-linear patterns and shows clear, easy-to-read clusters. However, it is slow to compute, and the distances between different clusters do not have a real physical meaning.</w:t>
       </w:r>
     </w:p>
     <w:p>
@@ -1838,7 +2170,6 @@
         <w:spacing w:before="400" w:after="200"/>
       </w:pPr>
       <w:r>
-        <w:lastRenderedPageBreak/>
         <w:t>Task 7: Clustering the Kick Dataset</w:t>
       </w:r>
     </w:p>
@@ -1869,39 +2200,7 @@
         <w:spacing w:after="80"/>
       </w:pPr>
       <w:r>
-        <w:t>Missing value handling: rows containing missing values were dropped, resulting in a clean dataset of 41,409 records across the four numeric attributes (</w:t>
-      </w:r>
-      <w:proofErr w:type="spellStart"/>
-      <w:r>
-        <w:t>VehOdo</w:t>
-      </w:r>
-      <w:proofErr w:type="spellEnd"/>
-      <w:r>
-        <w:t xml:space="preserve">, </w:t>
-      </w:r>
-      <w:proofErr w:type="spellStart"/>
-      <w:r>
-        <w:t>MMRAcquisitionAuctionAveragePrice</w:t>
-      </w:r>
-      <w:proofErr w:type="spellEnd"/>
-      <w:r>
-        <w:t xml:space="preserve">, </w:t>
-      </w:r>
-      <w:proofErr w:type="spellStart"/>
-      <w:r>
-        <w:t>WarrantyCost</w:t>
-      </w:r>
-      <w:proofErr w:type="spellEnd"/>
-      <w:r>
-        <w:t xml:space="preserve">, </w:t>
-      </w:r>
-      <w:proofErr w:type="spellStart"/>
-      <w:r>
-        <w:t>IsBadBuy</w:t>
-      </w:r>
-      <w:proofErr w:type="spellEnd"/>
-      <w:r>
-        <w:t>). This prevents distance calculation errors, since Euclidean distance is undefined when a feature value is missing.</w:t>
+        <w:t>Missing value handling: rows containing missing values were dropped, resulting in a clean dataset of 41,409 records across the four numeric attributes (VehOdo, MMRAcquisitionAuctionAveragePrice, WarrantyCost, IsBadBuy). This prevents distance calculation errors, since Euclidean distance is undefined when a feature value is missing.</w:t>
       </w:r>
     </w:p>
     <w:p>
@@ -1913,61 +2212,17 @@
         </w:numPr>
         <w:spacing w:after="80"/>
       </w:pPr>
-      <w:proofErr w:type="spellStart"/>
-      <w:r>
-        <w:t>Standardisation</w:t>
-      </w:r>
-      <w:proofErr w:type="spellEnd"/>
-      <w:r>
-        <w:t xml:space="preserve"> (</w:t>
-      </w:r>
-      <w:proofErr w:type="spellStart"/>
-      <w:r>
-        <w:t>StandardScaler</w:t>
-      </w:r>
-      <w:proofErr w:type="spellEnd"/>
-      <w:r>
-        <w:t xml:space="preserve">): K-Means relies on Euclidean distance, and the raw scales of the four attributes differ by orders of magnitude — </w:t>
-      </w:r>
-      <w:proofErr w:type="spellStart"/>
-      <w:r>
-        <w:t>VehOdo</w:t>
-      </w:r>
-      <w:proofErr w:type="spellEnd"/>
-      <w:r>
-        <w:t xml:space="preserve"> is measured in tens of thousands while </w:t>
-      </w:r>
-      <w:proofErr w:type="spellStart"/>
-      <w:r>
-        <w:t>WarrantyCost</w:t>
-      </w:r>
-      <w:proofErr w:type="spellEnd"/>
-      <w:r>
-        <w:t xml:space="preserve"> is in the hundreds. Without </w:t>
-      </w:r>
-      <w:proofErr w:type="spellStart"/>
-      <w:r>
-        <w:t>standardisation</w:t>
-      </w:r>
-      <w:proofErr w:type="spellEnd"/>
-      <w:r>
-        <w:t xml:space="preserve">, </w:t>
-      </w:r>
-      <w:proofErr w:type="spellStart"/>
-      <w:r>
-        <w:t>VehOdo</w:t>
-      </w:r>
-      <w:proofErr w:type="spellEnd"/>
-      <w:r>
-        <w:t xml:space="preserve"> would dominate the distance calculation purely because of its scale, not because it is more informative. </w:t>
-      </w:r>
-      <w:proofErr w:type="spellStart"/>
-      <w:r>
-        <w:t>StandardScaler</w:t>
-      </w:r>
-      <w:proofErr w:type="spellEnd"/>
-      <w:r>
-        <w:t xml:space="preserve"> rescales every feature to zero mean and unit variance, giving each variable equal weight in the clustering.</w:t>
+      <w:r>
+        <w:t>Standardization</w:t>
+      </w:r>
+      <w:r>
+        <w:t xml:space="preserve"> (StandardScaler): K-Means relies on Euclidean distance, and the raw scales of the four attributes differ by orders of magnitude — VehOdo is measured in tens of thousands while WarrantyCost is in the hundreds. Without </w:t>
+      </w:r>
+      <w:r>
+        <w:t>standardization</w:t>
+      </w:r>
+      <w:r>
+        <w:t>, VehOdo would dominate the distance calculation purely because of its scale, not because it is more informative. StandardScaler rescales every feature to zero mean and unit variance, giving each variable equal weight in the clustering.</w:t>
       </w:r>
     </w:p>
     <w:p>
@@ -2001,37 +2256,8 @@
         <w:spacing w:after="150"/>
       </w:pPr>
       <w:r>
-        <w:t xml:space="preserve">Attributes used: </w:t>
-      </w:r>
-      <w:proofErr w:type="spellStart"/>
-      <w:r>
-        <w:t>VehOdo</w:t>
-      </w:r>
-      <w:proofErr w:type="spellEnd"/>
-      <w:r>
-        <w:t xml:space="preserve">, </w:t>
-      </w:r>
-      <w:proofErr w:type="spellStart"/>
-      <w:r>
-        <w:t>MMRAcquisitionAuctionAveragePrice</w:t>
-      </w:r>
-      <w:proofErr w:type="spellEnd"/>
-      <w:r>
-        <w:t xml:space="preserve">, </w:t>
-      </w:r>
-      <w:proofErr w:type="spellStart"/>
-      <w:r>
-        <w:t>WarrantyCost</w:t>
-      </w:r>
-      <w:proofErr w:type="spellEnd"/>
-      <w:r>
-        <w:t xml:space="preserve">, </w:t>
-      </w:r>
-      <w:proofErr w:type="spellStart"/>
-      <w:r>
-        <w:t>IsBadBuy</w:t>
-      </w:r>
-      <w:proofErr w:type="spellEnd"/>
+        <w:t>Attributes used: VehOdo, MMRAcquisitionAuctionAveragePrice, WarrantyCost, IsBadBuy</w:t>
+      </w:r>
     </w:p>
     <w:p>
       <w:pPr>
@@ -2123,24 +2349,7 @@
         <w:spacing w:after="150"/>
       </w:pPr>
       <w:r>
-        <w:lastRenderedPageBreak/>
-        <w:t xml:space="preserve">K = 3 was selected: the rate of inertia </w:t>
-      </w:r>
-      <w:proofErr w:type="gramStart"/>
-      <w:r>
-        <w:t>decrease</w:t>
-      </w:r>
-      <w:proofErr w:type="gramEnd"/>
-      <w:r>
-        <w:t xml:space="preserve"> </w:t>
-      </w:r>
-      <w:proofErr w:type="gramStart"/>
-      <w:r>
-        <w:t>slows</w:t>
-      </w:r>
-      <w:proofErr w:type="gramEnd"/>
-      <w:r>
-        <w:t xml:space="preserve"> noticeably beyond k = 3 (diminishing returns from further splitting), while the silhouette score remains reasonable at this value, giving a good balance between cluster compactness/separation and model simplicity.</w:t>
+        <w:t>K = 3 was selected: the rate of inertia decrease slows noticeably beyond k = 3 (diminishing returns from further splitting), while the silhouette score remains reasonable at this value, giving a good balance between cluster compactness/separation and model simplicity.</w:t>
       </w:r>
     </w:p>
     <w:p>
@@ -2214,7 +2423,6 @@
             </w:tcMar>
           </w:tcPr>
           <w:p>
-            <w:proofErr w:type="spellStart"/>
             <w:r>
               <w:rPr>
                 <w:b/>
@@ -2222,7 +2430,6 @@
               </w:rPr>
               <w:t>VehOdo</w:t>
             </w:r>
-            <w:proofErr w:type="spellEnd"/>
           </w:p>
         </w:tc>
         <w:tc>
@@ -2237,7 +2444,6 @@
             </w:tcMar>
           </w:tcPr>
           <w:p>
-            <w:proofErr w:type="spellStart"/>
             <w:r>
               <w:rPr>
                 <w:b/>
@@ -2245,7 +2451,6 @@
               </w:rPr>
               <w:t>AuctionAvgPrice</w:t>
             </w:r>
-            <w:proofErr w:type="spellEnd"/>
           </w:p>
         </w:tc>
         <w:tc>
@@ -2260,7 +2465,6 @@
             </w:tcMar>
           </w:tcPr>
           <w:p>
-            <w:proofErr w:type="spellStart"/>
             <w:r>
               <w:rPr>
                 <w:b/>
@@ -2268,7 +2472,6 @@
               </w:rPr>
               <w:t>WarrantyCost</w:t>
             </w:r>
-            <w:proofErr w:type="spellEnd"/>
           </w:p>
         </w:tc>
         <w:tc>
@@ -2283,21 +2486,12 @@
             </w:tcMar>
           </w:tcPr>
           <w:p>
-            <w:proofErr w:type="spellStart"/>
             <w:r>
               <w:rPr>
                 <w:b/>
                 <w:bCs/>
               </w:rPr>
-              <w:t>IsBadBuy</w:t>
-            </w:r>
-            <w:proofErr w:type="spellEnd"/>
-            <w:r>
-              <w:rPr>
-                <w:b/>
-                <w:bCs/>
-              </w:rPr>
-              <w:t xml:space="preserve"> Rate</w:t>
+              <w:t>IsBadBuy Rate</w:t>
             </w:r>
           </w:p>
         </w:tc>
@@ -2628,15 +2822,7 @@
         <w:spacing w:after="150"/>
       </w:pPr>
       <w:r>
-        <w:t xml:space="preserve">Cluster 2 stands out sharply: it has an </w:t>
-      </w:r>
-      <w:proofErr w:type="spellStart"/>
-      <w:r>
-        <w:t>IsBadBuy</w:t>
-      </w:r>
-      <w:proofErr w:type="spellEnd"/>
-      <w:r>
-        <w:t xml:space="preserve"> rate of exactly 1.00 (i.e., every vehicle in this cluster is a confirmed bad buy), despite having the lowest average auction price ($5,381) of the three clusters. Clusters 0 and 1 both have a 0.00 bad-buy rate but differ substantially in mileage and warranty cost — Cluster 0 vehicles have the highest mileage (80,964) and highest warranty cost ($1,571), while Cluster 1 vehicles have noticeably lower mileage (58,696) and the lowest warranty cost ($892).</w:t>
+        <w:t>Cluster 2 stands out sharply: it has an IsBadBuy rate of exactly 1.00 (i.e., every vehicle in this cluster is a confirmed bad buy), despite having the lowest average auction price ($5,381) of the three clusters. Clusters 0 and 1 both have a 0.00 bad-buy rate but differ substantially in mileage and warranty cost — Cluster 0 vehicles have the highest mileage (80,964) and highest warranty cost ($1,571), while Cluster 1 vehicles have noticeably lower mileage (58,696) and the lowest warranty cost ($892).</w:t>
       </w:r>
     </w:p>
     <w:p>
@@ -2647,19 +2833,15 @@
       <w:r>
         <w:t xml:space="preserve">7.2.4 </w:t>
       </w:r>
-      <w:proofErr w:type="spellStart"/>
-      <w:r>
-        <w:t>Normalisation</w:t>
-      </w:r>
-      <w:proofErr w:type="spellEnd"/>
+      <w:r>
+        <w:t>Normalization</w:t>
+      </w:r>
       <w:r>
         <w:t>/</w:t>
       </w:r>
-      <w:proofErr w:type="spellStart"/>
-      <w:r>
-        <w:t>Standardisation</w:t>
-      </w:r>
-      <w:proofErr w:type="spellEnd"/>
+      <w:r>
+        <w:t>Standardization</w:t>
+      </w:r>
       <w:r>
         <w:t xml:space="preserve"> Discussion</w:t>
       </w:r>
@@ -2668,43 +2850,15 @@
       <w:pPr>
         <w:spacing w:after="150"/>
       </w:pPr>
-      <w:proofErr w:type="spellStart"/>
-      <w:r>
-        <w:t>Standardisation</w:t>
-      </w:r>
-      <w:proofErr w:type="spellEnd"/>
-      <w:r>
-        <w:t xml:space="preserve"> was applied prior to clustering (Section 7.1). Without it, </w:t>
-      </w:r>
-      <w:proofErr w:type="spellStart"/>
-      <w:r>
-        <w:t>VehOdo</w:t>
-      </w:r>
-      <w:proofErr w:type="spellEnd"/>
-      <w:r>
-        <w:t xml:space="preserve"> (with values in the tens of thousands) would dominate the Euclidean distance calculation relative to </w:t>
-      </w:r>
-      <w:proofErr w:type="spellStart"/>
-      <w:r>
-        <w:t>WarrantyCost</w:t>
-      </w:r>
-      <w:proofErr w:type="spellEnd"/>
-      <w:r>
-        <w:t xml:space="preserve"> and </w:t>
-      </w:r>
-      <w:proofErr w:type="spellStart"/>
-      <w:r>
-        <w:t>IsBadBuy</w:t>
-      </w:r>
-      <w:proofErr w:type="spellEnd"/>
-      <w:r>
-        <w:t xml:space="preserve"> (values in the hundreds and 0/1 respectively), causing K-Means to effectively cluster on mileage alone and obscure the cost- and risk-related structure in the data. </w:t>
-      </w:r>
-      <w:proofErr w:type="spellStart"/>
-      <w:r>
-        <w:t>Standardising</w:t>
-      </w:r>
-      <w:proofErr w:type="spellEnd"/>
+      <w:r>
+        <w:t>Standardization</w:t>
+      </w:r>
+      <w:r>
+        <w:t xml:space="preserve"> was applied prior to clustering (Section 7.1). Without it, VehOdo (with values in the tens of thousands) would dominate the Euclidean distance calculation relative to WarrantyCost and IsBadBuy (values in the hundreds and 0/1 respectively), causing K-Means to effectively cluster on mileage alone and obscure the cost- and risk-related structure in the data. </w:t>
+      </w:r>
+      <w:r>
+        <w:t>Standardizing</w:t>
+      </w:r>
       <w:r>
         <w:t xml:space="preserve"> ensured that all four attributes contributed proportionally to the distance metric, allowing the resulting clusters to reflect a genuine combination of mileage, price, warranty cost, and bad-buy status rather than being dominated by a single high-magnitude variable.</w:t>
       </w:r>
@@ -2727,14 +2881,11 @@
         <w:spacing w:before="300" w:after="150"/>
       </w:pPr>
       <w:r>
-        <w:lastRenderedPageBreak/>
         <w:t xml:space="preserve">7.3 </w:t>
       </w:r>
-      <w:proofErr w:type="spellStart"/>
-      <w:r>
-        <w:t>Visualising</w:t>
-      </w:r>
-      <w:proofErr w:type="spellEnd"/>
+      <w:r>
+        <w:t>Visualizing</w:t>
+      </w:r>
       <w:r>
         <w:t xml:space="preserve"> and Labelling Clusters</w:t>
       </w:r>
@@ -2804,87 +2955,7 @@
           <w:sz w:val="18"/>
           <w:szCs w:val="18"/>
         </w:rPr>
-        <w:t xml:space="preserve">Figure 7.2: </w:t>
-      </w:r>
-      <w:proofErr w:type="spellStart"/>
-      <w:r>
-        <w:rPr>
-          <w:i/>
-          <w:iCs/>
-          <w:sz w:val="18"/>
-          <w:szCs w:val="18"/>
-        </w:rPr>
-        <w:t>Pairplot</w:t>
-      </w:r>
-      <w:proofErr w:type="spellEnd"/>
-      <w:r>
-        <w:rPr>
-          <w:i/>
-          <w:iCs/>
-          <w:sz w:val="18"/>
-          <w:szCs w:val="18"/>
-        </w:rPr>
-        <w:t xml:space="preserve"> of </w:t>
-      </w:r>
-      <w:proofErr w:type="spellStart"/>
-      <w:r>
-        <w:rPr>
-          <w:i/>
-          <w:iCs/>
-          <w:sz w:val="18"/>
-          <w:szCs w:val="18"/>
-        </w:rPr>
-        <w:t>VehOdo</w:t>
-      </w:r>
-      <w:proofErr w:type="spellEnd"/>
-      <w:r>
-        <w:rPr>
-          <w:i/>
-          <w:iCs/>
-          <w:sz w:val="18"/>
-          <w:szCs w:val="18"/>
-        </w:rPr>
-        <w:t xml:space="preserve">, </w:t>
-      </w:r>
-      <w:proofErr w:type="spellStart"/>
-      <w:r>
-        <w:rPr>
-          <w:i/>
-          <w:iCs/>
-          <w:sz w:val="18"/>
-          <w:szCs w:val="18"/>
-        </w:rPr>
-        <w:t>AuctionAvgPrice</w:t>
-      </w:r>
-      <w:proofErr w:type="spellEnd"/>
-      <w:r>
-        <w:rPr>
-          <w:i/>
-          <w:iCs/>
-          <w:sz w:val="18"/>
-          <w:szCs w:val="18"/>
-        </w:rPr>
-        <w:t xml:space="preserve">, </w:t>
-      </w:r>
-      <w:proofErr w:type="spellStart"/>
-      <w:r>
-        <w:rPr>
-          <w:i/>
-          <w:iCs/>
-          <w:sz w:val="18"/>
-          <w:szCs w:val="18"/>
-        </w:rPr>
-        <w:t>WarrantyCost</w:t>
-      </w:r>
-      <w:proofErr w:type="spellEnd"/>
-      <w:r>
-        <w:rPr>
-          <w:i/>
-          <w:iCs/>
-          <w:sz w:val="18"/>
-          <w:szCs w:val="18"/>
-        </w:rPr>
-        <w:t xml:space="preserve"> by cluster (2,000-row sample).</w:t>
+        <w:t>Figure 7.2: Pairplot of VehOdo, AuctionAvgPrice, WarrantyCost by cluster (2,000-row sample).</w:t>
       </w:r>
     </w:p>
     <w:p>
@@ -3031,15 +3102,7 @@
           </w:tcPr>
           <w:p>
             <w:r>
-              <w:t xml:space="preserve">Average mileage and cost, but a 100% </w:t>
-            </w:r>
-            <w:proofErr w:type="spellStart"/>
-            <w:r>
-              <w:t>IsBadBuy</w:t>
-            </w:r>
-            <w:proofErr w:type="spellEnd"/>
-            <w:r>
-              <w:t xml:space="preserve"> rate — the definitive 'bad buys' the dealership needs to identify and avoid.</w:t>
+              <w:t>Average mileage and cost, but a 100% IsBadBuy rate — the definitive 'bad buys' the dealership needs to identify and avoid.</w:t>
             </w:r>
           </w:p>
         </w:tc>
@@ -3150,15 +3213,7 @@
         <w:spacing w:after="100"/>
       </w:pPr>
       <w:r>
-        <w:t xml:space="preserve">In Figure 7.2, Cluster 1 (orange) clearly separates out in the bottom-left corner with the lowest mileage and warranty costs, while the </w:t>
-      </w:r>
-      <w:proofErr w:type="gramStart"/>
-      <w:r>
-        <w:t>bad</w:t>
-      </w:r>
-      <w:proofErr w:type="gramEnd"/>
-      <w:r>
-        <w:t>-buy vehicles in Cluster 2 (green) mostly sit in the middle-to-high mileage range with lower average auction prices.</w:t>
+        <w:t>In Figure 7.2, Cluster 1 (orange) clearly separates out in the bottom-left corner with the lowest mileage and warranty costs, while the bad-buy vehicles in Cluster 2 (green) mostly sit in the middle-to-high mileage range with lower average auction prices.</w:t>
       </w:r>
     </w:p>
     <w:p>
@@ -3167,7 +3222,6 @@
         <w:spacing w:before="300" w:after="150"/>
       </w:pPr>
       <w:r>
-        <w:lastRenderedPageBreak/>
         <w:t>7.4 Clustering Model Including 'Make'</w:t>
       </w:r>
     </w:p>
@@ -3176,15 +3230,7 @@
         <w:spacing w:after="150"/>
       </w:pPr>
       <w:r>
-        <w:t xml:space="preserve">Algorithm chosen: K-Prototypes. Since Make is a categorical string variable, standard K-Means cannot compute a Euclidean distance on it directly. K-Prototypes handles this by combining Euclidean distance for the numeric attributes with a simple matching dissimilarity measure for categorical attributes, allowing both data types to be clustered jointly. The same K = 3 and the same </w:t>
-      </w:r>
-      <w:proofErr w:type="spellStart"/>
-      <w:r>
-        <w:t>StandardScaler</w:t>
-      </w:r>
-      <w:proofErr w:type="spellEnd"/>
-      <w:r>
-        <w:t xml:space="preserve"> fit from Section 7.2 were reused for the numeric attributes, consistent with the assignment's instruction to use the best settings identified earlier.</w:t>
+        <w:t>Algorithm chosen: K-Prototypes. Since Make is a categorical string variable, standard K-Means cannot compute a Euclidean distance on it directly. K-Prototypes handles this by combining Euclidean distance for the numeric attributes with a simple matching dissimilarity measure for categorical attributes, allowing both data types to be clustered jointly. The same K = 3 and the same StandardScaler fit from Section 7.2 were reused for the numeric attributes, consistent with the assignment's instruction to use the best settings identified earlier.</w:t>
       </w:r>
     </w:p>
     <w:p>
@@ -3255,7 +3301,6 @@
             </w:tcMar>
           </w:tcPr>
           <w:p>
-            <w:proofErr w:type="spellStart"/>
             <w:r>
               <w:rPr>
                 <w:b/>
@@ -3263,7 +3308,6 @@
               </w:rPr>
               <w:t>VehOdo</w:t>
             </w:r>
-            <w:proofErr w:type="spellEnd"/>
           </w:p>
         </w:tc>
         <w:tc>
@@ -3299,7 +3343,6 @@
             </w:tcMar>
           </w:tcPr>
           <w:p>
-            <w:proofErr w:type="spellStart"/>
             <w:r>
               <w:rPr>
                 <w:b/>
@@ -3307,7 +3350,6 @@
               </w:rPr>
               <w:t>WarrantyCost</w:t>
             </w:r>
-            <w:proofErr w:type="spellEnd"/>
           </w:p>
         </w:tc>
         <w:tc>
@@ -3322,7 +3364,6 @@
             </w:tcMar>
           </w:tcPr>
           <w:p>
-            <w:proofErr w:type="spellStart"/>
             <w:r>
               <w:rPr>
                 <w:b/>
@@ -3330,7 +3371,6 @@
               </w:rPr>
               <w:t>IsBadBuy</w:t>
             </w:r>
-            <w:proofErr w:type="spellEnd"/>
           </w:p>
         </w:tc>
         <w:tc>
@@ -3669,23 +3709,7 @@
         <w:spacing w:after="150"/>
       </w:pPr>
       <w:r>
-        <w:t xml:space="preserve">The cluster numbering differs from the numeric-only K-Means model, but the underlying group characteristics are the same three profiles: a 100%-bad-buy group (numeric-only Cluster 2 ≈ K-Prototypes Cluster 0), a high-mileage/high-warranty-but-reliable group (Cluster 0 ≈ Cluster 1), and a low-mileage/low-cost/reliable group (Cluster 1 ≈ Cluster 2). What K-Prototypes adds is a dominant Make per cluster: FORD is concentrated in the bad-buy cluster, CHEVROLET in the high-mileage-but-reliable cluster, and DODGE in the low-risk cluster. This shows that </w:t>
-      </w:r>
-      <w:proofErr w:type="gramStart"/>
-      <w:r>
-        <w:t>vehicle</w:t>
-      </w:r>
-      <w:proofErr w:type="gramEnd"/>
-      <w:r>
-        <w:t xml:space="preserve"> </w:t>
-      </w:r>
-      <w:proofErr w:type="gramStart"/>
-      <w:r>
-        <w:t>make carries</w:t>
-      </w:r>
-      <w:proofErr w:type="gramEnd"/>
-      <w:r>
-        <w:t xml:space="preserve"> additional discriminative information beyond price, mileage, and warranty cost alone — the numeric-only model could identify risk segments, but only the mixed-type model reveals which brands are associated with each segment.</w:t>
+        <w:t>The cluster numbering differs from the numeric-only K-Means model, but the underlying group characteristics are the same three profiles: a 100%-bad-buy group (numeric-only Cluster 2 ≈ K-Prototypes Cluster 0), a high-mileage/high-warranty-but-reliable group (Cluster 0 ≈ Cluster 1), and a low-mileage/low-cost/reliable group (Cluster 1 ≈ Cluster 2). What K-Prototypes adds is a dominant Make per cluster: FORD is concentrated in the bad-buy cluster, CHEVROLET in the high-mileage-but-reliable cluster, and DODGE in the low-risk cluster. This shows that vehicle make carries additional discriminative information beyond price, mileage, and warranty cost alone — the numeric-only model could identify risk segments, but only the mixed-type model reveals which brands are associated with each segment.</w:t>
       </w:r>
     </w:p>
     <w:p>
@@ -3707,23 +3731,7 @@
         <w:spacing w:after="80"/>
       </w:pPr>
       <w:r>
-        <w:t xml:space="preserve">Avoid risky auction buys: buyers should exercise </w:t>
-      </w:r>
-      <w:proofErr w:type="gramStart"/>
-      <w:r>
-        <w:t>particular caution</w:t>
-      </w:r>
-      <w:proofErr w:type="gramEnd"/>
-      <w:r>
-        <w:t xml:space="preserve"> with vehicles resembling the bad-buy cluster profile — notably FORD vehicles priced under roughly $5,500 with over 70,000 miles — as these carry a substantially elevated risk of being a 'kick'. Such vehicles should be thoroughly inspected before </w:t>
-      </w:r>
-      <w:proofErr w:type="gramStart"/>
-      <w:r>
-        <w:t>bidding, or</w:t>
-      </w:r>
-      <w:proofErr w:type="gramEnd"/>
-      <w:r>
-        <w:t xml:space="preserve"> avoided.</w:t>
+        <w:t>Avoid risky auction buys: buyers should exercise particular caution with vehicles resembling the bad-buy cluster profile — notably FORD vehicles priced under roughly $5,500 with over 70,000 miles — as these carry a substantially elevated risk of being a 'kick'. Such vehicles should be thoroughly inspected before bidding, or avoided.</w:t>
       </w:r>
     </w:p>
     <w:p>
@@ -3735,29 +3743,14 @@
         </w:numPr>
         <w:spacing w:after="80"/>
       </w:pPr>
-      <w:proofErr w:type="spellStart"/>
-      <w:r>
-        <w:t>Prioritise</w:t>
-      </w:r>
-      <w:proofErr w:type="spellEnd"/>
-      <w:r>
-        <w:t xml:space="preserve"> reliable inventory: vehicles matching the low-risk cluster profile (predominantly DODGE, low mileage, low warranty cost) represent comparatively safe purchases that can be resold to retail customers with </w:t>
-      </w:r>
-      <w:proofErr w:type="gramStart"/>
-      <w:r>
-        <w:t>minimal</w:t>
-      </w:r>
-      <w:proofErr w:type="gramEnd"/>
-      <w:r>
-        <w:t xml:space="preserve"> expected </w:t>
-      </w:r>
-      <w:proofErr w:type="gramStart"/>
-      <w:r>
-        <w:t>repair overhead</w:t>
-      </w:r>
-      <w:proofErr w:type="gramEnd"/>
-      <w:r>
-        <w:t>.</w:t>
+      <w:r>
+        <w:t>Prioriti</w:t>
+      </w:r>
+      <w:r>
+        <w:t>z</w:t>
+      </w:r>
+      <w:r>
+        <w:t>e reliable inventory: vehicles matching the low-risk cluster profile (predominantly DODGE, low mileage, low warranty cost) represent comparatively safe purchases that can be resold to retail customers with minimal expected repair overhead.</w:t>
       </w:r>
     </w:p>
     <w:p>
@@ -3770,15 +3763,7 @@
         <w:spacing w:after="80"/>
       </w:pPr>
       <w:r>
-        <w:t xml:space="preserve">Price in warranty risk: vehicles in the high-mileage/high-warranty cluster (predominantly CHEVROLET) are not classified as bad </w:t>
-      </w:r>
-      <w:proofErr w:type="gramStart"/>
-      <w:r>
-        <w:t>buys, but</w:t>
-      </w:r>
-      <w:proofErr w:type="gramEnd"/>
-      <w:r>
-        <w:t xml:space="preserve"> carry a warranty cost roughly 76% higher than the low-risk cluster ($1,570 vs. $892). The dealership should factor this into resale pricing to cover the higher expected post-sale repair costs.</w:t>
+        <w:t>Price in warranty risk: vehicles in the high-mileage/high-warranty cluster (predominantly CHEVROLET) are not classified as bad buys, but carry a warranty cost roughly 76% higher than the low-risk cluster ($1,570 vs. $892). The dealership should factor this into resale pricing to cover the higher expected post-sale repair costs.</w:t>
       </w:r>
     </w:p>
     <w:p>
@@ -3792,16 +3777,7 @@
         <w:spacing w:before="400" w:after="200"/>
       </w:pPr>
       <w:r>
-        <w:lastRenderedPageBreak/>
-        <w:t xml:space="preserve">Task 8: Time Series Forecasting with LSTM on the </w:t>
-      </w:r>
-      <w:proofErr w:type="spellStart"/>
-      <w:r>
-        <w:t>AgriWebb</w:t>
-      </w:r>
-      <w:proofErr w:type="spellEnd"/>
-      <w:r>
-        <w:t xml:space="preserve"> Dataset</w:t>
+        <w:t>Task 8: Time Series Forecasting with LSTM on the AgriWebb Dataset</w:t>
       </w:r>
     </w:p>
     <w:p>
@@ -3857,23 +3833,7 @@
         <w:spacing w:after="80"/>
       </w:pPr>
       <w:r>
-        <w:t xml:space="preserve">Per-paddock </w:t>
-      </w:r>
-      <w:proofErr w:type="spellStart"/>
-      <w:r>
-        <w:t>StandardScaler</w:t>
-      </w:r>
-      <w:proofErr w:type="spellEnd"/>
-      <w:r>
-        <w:t xml:space="preserve">: a separate scaler </w:t>
-      </w:r>
-      <w:proofErr w:type="gramStart"/>
-      <w:r>
-        <w:t>was fit on</w:t>
-      </w:r>
-      <w:proofErr w:type="gramEnd"/>
-      <w:r>
-        <w:t xml:space="preserve"> each paddock's own training portion (mean/std computed independently per paddock) rather than one global scaler. This matters because paddocks differ substantially in baseline TSDM levels and variability (per-paddock training means range from 961 to 1,697, and training standard deviations range from 280 to 969) — a single global scaler would let high-magnitude paddocks dominate the loss function, whereas per-paddock scaling lets the LSTM learn from the shape of each paddock's growth trajectory on a comparable scale.</w:t>
+        <w:t>Per-paddock StandardScaler: a separate scaler was fit on each paddock's own training portion (mean/std computed independently per paddock) rather than one global scaler. This matters because paddocks differ substantially in baseline TSDM levels and variability (per-paddock training means range from 961 to 1,697, and training standard deviations range from 280 to 969) — a single global scaler would let high-magnitude paddocks dominate the loss function, whereas per-paddock scaling lets the LSTM learn from the shape of each paddock's growth trajectory on a comparable scale.</w:t>
       </w:r>
     </w:p>
     <w:p>
@@ -3890,63 +3850,7 @@
         <w:spacing w:after="150"/>
       </w:pPr>
       <w:r>
-        <w:t xml:space="preserve">Architecture: </w:t>
-      </w:r>
-      <w:proofErr w:type="spellStart"/>
-      <w:r>
-        <w:t>SequenceLSTM</w:t>
-      </w:r>
-      <w:proofErr w:type="spellEnd"/>
-      <w:r>
-        <w:t xml:space="preserve"> with </w:t>
-      </w:r>
-      <w:proofErr w:type="spellStart"/>
-      <w:r>
-        <w:t>num_features</w:t>
-      </w:r>
-      <w:proofErr w:type="spellEnd"/>
-      <w:r>
-        <w:t xml:space="preserve"> = 1 (TSDM only), </w:t>
-      </w:r>
-      <w:proofErr w:type="spellStart"/>
-      <w:r>
-        <w:t>hidden_size</w:t>
-      </w:r>
-      <w:proofErr w:type="spellEnd"/>
-      <w:r>
-        <w:t xml:space="preserve"> = 16, </w:t>
-      </w:r>
-      <w:proofErr w:type="spellStart"/>
-      <w:r>
-        <w:t>num_layers</w:t>
-      </w:r>
-      <w:proofErr w:type="spellEnd"/>
-      <w:r>
-        <w:t xml:space="preserve"> = 2, </w:t>
-      </w:r>
-      <w:proofErr w:type="spellStart"/>
-      <w:r>
-        <w:t>output_size</w:t>
-      </w:r>
-      <w:proofErr w:type="spellEnd"/>
-      <w:r>
-        <w:t xml:space="preserve"> = 5 (</w:t>
-      </w:r>
-      <w:proofErr w:type="spellStart"/>
-      <w:r>
-        <w:t>forecast_horizon</w:t>
-      </w:r>
-      <w:proofErr w:type="spellEnd"/>
-      <w:r>
-        <w:t>), dropout = 0.2 (</w:t>
-      </w:r>
-      <w:proofErr w:type="spellStart"/>
-      <w:r>
-        <w:t>PyTorch</w:t>
-      </w:r>
-      <w:proofErr w:type="spellEnd"/>
-      <w:r>
-        <w:t xml:space="preserve"> default in the model class, applied between LSTM layers and before the final linear layer).</w:t>
+        <w:t>Architecture: SequenceLSTM with num_features = 1 (TSDM only), hidden_size = 16, num_layers = 2, output_size = 5 (forecast_horizon), dropout = 0.2 (PyTorch default in the model class, applied between LSTM layers and before the final linear layer).</w:t>
       </w:r>
     </w:p>
     <w:p>
@@ -3956,11 +3860,9 @@
       <w:r>
         <w:t xml:space="preserve">Training: Adam </w:t>
       </w:r>
-      <w:proofErr w:type="spellStart"/>
-      <w:r>
-        <w:t>optimiser</w:t>
-      </w:r>
-      <w:proofErr w:type="spellEnd"/>
+      <w:r>
+        <w:t>optimizer</w:t>
+      </w:r>
       <w:r>
         <w:t>, learning rate = 0.001, 250 epochs, batch size 32, MSE loss, with an 80/20 internal train/validation split used to select the best-performing model checkpoint (lowest validation loss) across training.</w:t>
       </w:r>
@@ -3970,37 +3872,17 @@
         <w:spacing w:after="150"/>
       </w:pPr>
       <w:r>
-        <w:t xml:space="preserve">Hyperparameter selection: </w:t>
-      </w:r>
-      <w:proofErr w:type="spellStart"/>
-      <w:r>
-        <w:t>hidden_size</w:t>
-      </w:r>
-      <w:proofErr w:type="spellEnd"/>
-      <w:r>
-        <w:t xml:space="preserve"> and </w:t>
-      </w:r>
-      <w:proofErr w:type="spellStart"/>
-      <w:r>
-        <w:t>num_layers</w:t>
-      </w:r>
-      <w:proofErr w:type="spellEnd"/>
-      <w:r>
-        <w:t xml:space="preserve"> were set based on standard practice for small univariate sequence problems (a small hidden layer size relative to the very short 5-step lookback avoids over-</w:t>
-      </w:r>
-      <w:proofErr w:type="spellStart"/>
-      <w:r>
-        <w:t>parameterising</w:t>
-      </w:r>
-      <w:proofErr w:type="spellEnd"/>
+        <w:t>Hyperparameter selection: hidden_size and num_layers were set based on standard practice for small univariate sequence problems (a small hidden layer size relative to the very short 5-step lookback avoids over-</w:t>
+      </w:r>
+      <w:r>
+        <w:t>parameterizing</w:t>
+      </w:r>
       <w:r>
         <w:t xml:space="preserve"> the model for such a simple input), rather than an exhaustive grid search; learning rate (0.001) and epoch count (250) follow common defaults for Adam-</w:t>
       </w:r>
-      <w:proofErr w:type="spellStart"/>
-      <w:r>
-        <w:t>optimised</w:t>
-      </w:r>
-      <w:proofErr w:type="spellEnd"/>
+      <w:r>
+        <w:t>optimized</w:t>
+      </w:r>
       <w:r>
         <w:t xml:space="preserve"> LSTMs and were confirmed adequate by observing the loss curve plateauing well before 250 epochs.</w:t>
       </w:r>
@@ -4124,15 +4006,7 @@
           </w:tcPr>
           <w:p>
             <w:r>
-              <w:t>0.7007 (</w:t>
-            </w:r>
-            <w:proofErr w:type="spellStart"/>
-            <w:r>
-              <w:t>standardised</w:t>
-            </w:r>
-            <w:proofErr w:type="spellEnd"/>
-            <w:r>
-              <w:t>)</w:t>
+              <w:t>0.7007 (standardised)</w:t>
             </w:r>
           </w:p>
         </w:tc>
@@ -4370,7 +4244,6 @@
           </w:tcPr>
           <w:p>
             <w:r>
-              <w:lastRenderedPageBreak/>
               <w:t>50</w:t>
             </w:r>
           </w:p>
@@ -4637,45 +4510,17 @@
         <w:spacing w:after="150"/>
       </w:pPr>
       <w:r>
-        <w:t xml:space="preserve">The training and validation loss both </w:t>
-      </w:r>
-      <w:proofErr w:type="gramStart"/>
-      <w:r>
-        <w:t>drop</w:t>
-      </w:r>
-      <w:proofErr w:type="gramEnd"/>
-      <w:r>
-        <w:t xml:space="preserve"> sharply in the first 50 epochs (0.91 → 0.50 train, 0.97 → 0.61 </w:t>
-      </w:r>
-      <w:proofErr w:type="spellStart"/>
-      <w:r>
-        <w:t>val</w:t>
-      </w:r>
-      <w:proofErr w:type="spellEnd"/>
-      <w:r>
-        <w:t xml:space="preserve">) and then </w:t>
-      </w:r>
-      <w:proofErr w:type="gramStart"/>
-      <w:r>
-        <w:t>flatten</w:t>
-      </w:r>
-      <w:proofErr w:type="gramEnd"/>
-      <w:r>
-        <w:t xml:space="preserve"> out, with only marginal further improvement through epoch 200 (0.47 train, 0.60 </w:t>
-      </w:r>
-      <w:proofErr w:type="spellStart"/>
-      <w:r>
-        <w:t>val</w:t>
-      </w:r>
-      <w:proofErr w:type="spellEnd"/>
-      <w:r>
-        <w:t xml:space="preserve">). The two curves stay reasonably close together throughout (a gap of roughly 0.09–0.13), suggesting limited overfitting within this internal validation split — however, as shown in Section 8.5, this internal validation gap does not reflect true forecasting performance on the genuinely held-out last-5-timestep test window, where Model 1 in fact </w:t>
-      </w:r>
-      <w:proofErr w:type="spellStart"/>
-      <w:r>
-        <w:t>generalises</w:t>
-      </w:r>
-      <w:proofErr w:type="spellEnd"/>
+        <w:t xml:space="preserve">The training and validation loss both drop sharply in the first 50 epochs (0.91 → 0.50 train, 0.97 → 0.61 val) and then </w:t>
+      </w:r>
+      <w:r>
+        <w:t>flattened</w:t>
+      </w:r>
+      <w:r>
+        <w:t xml:space="preserve"> out, with only marginal further improvement through epoch 200 (0.47 train, 0.60 val). The two curves stay reasonably close together throughout (a gap of roughly 0.09–0.13), suggesting limited overfitting within this internal validation split — however, as shown in Section 8.5, this internal validation gap does not reflect true forecasting performance on the genuinely held-out last-5-timestep test window, where Model 1 in fact </w:t>
+      </w:r>
+      <w:r>
+        <w:t>generalizes</w:t>
+      </w:r>
       <w:r>
         <w:t xml:space="preserve"> best of the three models (Test R² = 0.31) despite having the weakest training fit (Train R² = 0.51).</w:t>
       </w:r>
@@ -4694,39 +4539,7 @@
         <w:spacing w:after="150"/>
       </w:pPr>
       <w:r>
-        <w:t xml:space="preserve">Architecture change: </w:t>
-      </w:r>
-      <w:proofErr w:type="spellStart"/>
-      <w:r>
-        <w:t>hidden_size</w:t>
-      </w:r>
-      <w:proofErr w:type="spellEnd"/>
-      <w:r>
-        <w:t xml:space="preserve"> was increased from 16 to 24 (</w:t>
-      </w:r>
-      <w:proofErr w:type="spellStart"/>
-      <w:r>
-        <w:t>num_layers</w:t>
-      </w:r>
-      <w:proofErr w:type="spellEnd"/>
-      <w:r>
-        <w:t xml:space="preserve">, dropout, </w:t>
-      </w:r>
-      <w:proofErr w:type="spellStart"/>
-      <w:r>
-        <w:t>num_features</w:t>
-      </w:r>
-      <w:proofErr w:type="spellEnd"/>
-      <w:r>
-        <w:t xml:space="preserve">, and </w:t>
-      </w:r>
-      <w:proofErr w:type="spellStart"/>
-      <w:r>
-        <w:t>output_size</w:t>
-      </w:r>
-      <w:proofErr w:type="spellEnd"/>
-      <w:r>
-        <w:t xml:space="preserve"> unchanged) to give the model additional representational capacity to process the doubled lookback window (10 timesteps of history instead of 5).</w:t>
+        <w:t>Architecture change: hidden_size was increased from 16 to 24 (num_layers, dropout, num_features, and output_size unchanged) to give the model additional representational capacity to process the doubled lookback window (10 timesteps of history instead of 5).</w:t>
       </w:r>
     </w:p>
     <w:tbl>
@@ -4772,7 +4585,6 @@
                 <w:b/>
                 <w:bCs/>
               </w:rPr>
-              <w:lastRenderedPageBreak/>
               <w:t>Metric</w:t>
             </w:r>
           </w:p>
@@ -4849,15 +4661,7 @@
           </w:tcPr>
           <w:p>
             <w:r>
-              <w:t>0.5397 (</w:t>
-            </w:r>
-            <w:proofErr w:type="spellStart"/>
-            <w:r>
-              <w:t>standardised</w:t>
-            </w:r>
-            <w:proofErr w:type="spellEnd"/>
-            <w:r>
-              <w:t>)</w:t>
+              <w:t>0.5397 (standardised)</w:t>
             </w:r>
           </w:p>
         </w:tc>
@@ -5361,15 +5165,7 @@
         <w:spacing w:after="150"/>
       </w:pPr>
       <w:r>
-        <w:t xml:space="preserve">Both loss curves continue decreasing steadily through all 200 logged epochs (train: 0.78 → 0.31; </w:t>
-      </w:r>
-      <w:proofErr w:type="spellStart"/>
-      <w:r>
-        <w:t>val</w:t>
-      </w:r>
-      <w:proofErr w:type="spellEnd"/>
-      <w:r>
-        <w:t>: 0.85 → 0.46) without fully plateauing, unlike Model 1. Train R² improved substantially over Model 1 (0.51 → 0.71), reflecting the larger hidden size and longer lookback giving the model more to fit — but Test R² dropped (0.31 → 0.11), an early sign of the overfitting trend explored fully in Section 8.5.1: more capacity and more training-window information improved the internal fit without improving genuine forecasting ability.</w:t>
+        <w:t>Both loss curves continue decreasing steadily through all 200 logged epochs (train: 0.78 → 0.31; val: 0.85 → 0.46) without fully plateauing, unlike Model 1. Train R² improved substantially over Model 1 (0.51 → 0.71), reflecting the larger hidden size and longer lookback giving the model more to fit — but Test R² dropped (0.31 → 0.11), an early sign of the overfitting trend explored fully in Section 8.5.1: more capacity and more training-window information improved the internal fit without improving genuine forecasting ability.</w:t>
       </w:r>
     </w:p>
     <w:p>
@@ -5378,7 +5174,6 @@
         <w:spacing w:before="300" w:after="150"/>
       </w:pPr>
       <w:r>
-        <w:lastRenderedPageBreak/>
         <w:t>8.4 Model 3: Multivariate LSTM (TSDM + Climate Features)</w:t>
       </w:r>
     </w:p>
@@ -5387,39 +5182,7 @@
         <w:spacing w:after="150"/>
       </w:pPr>
       <w:r>
-        <w:t xml:space="preserve">Architecture modifications: </w:t>
-      </w:r>
-      <w:proofErr w:type="spellStart"/>
-      <w:r>
-        <w:t>num_features</w:t>
-      </w:r>
-      <w:proofErr w:type="spellEnd"/>
-      <w:r>
-        <w:t xml:space="preserve"> was increased from 1 to the number of available climate columns (TSDM plus 15-day-average rainfall, max/min temperature, relative humidity at max/min temperature, evaporation, and radiation — 8 features in total when all are present in the data), requiring the LSTM's </w:t>
-      </w:r>
-      <w:proofErr w:type="spellStart"/>
-      <w:r>
-        <w:t>input_size</w:t>
-      </w:r>
-      <w:proofErr w:type="spellEnd"/>
-      <w:r>
-        <w:t xml:space="preserve"> to scale accordingly; </w:t>
-      </w:r>
-      <w:proofErr w:type="spellStart"/>
-      <w:r>
-        <w:t>hidden_size</w:t>
-      </w:r>
-      <w:proofErr w:type="spellEnd"/>
-      <w:r>
-        <w:t xml:space="preserve"> was further increased to 32 (from 24) to give the model enough capacity to combine information across all input channels; lookback was kept at 10 (as in Model 2) rather than a fixed short window, and the existing variable-length packing (</w:t>
-      </w:r>
-      <w:proofErr w:type="spellStart"/>
-      <w:r>
-        <w:t>pack_padded_sequence</w:t>
-      </w:r>
-      <w:proofErr w:type="spellEnd"/>
-      <w:r>
-        <w:t>) already supported flexible per-paddock sequence lengths without further changes.</w:t>
+        <w:t>Architecture modifications: num_features was increased from 1 to the number of available climate columns (TSDM plus 15-day-average rainfall, max/min temperature, relative humidity at max/min temperature, evaporation, and radiation — 8 features in total when all are present in the data), requiring the LSTM's input_size to scale accordingly; hidden_size was further increased to 32 (from 24) to give the model enough capacity to combine information across all input channels; lookback was kept at 10 (as in Model 2) rather than a fixed short window, and the existing variable-length packing (pack_padded_sequence) already supported flexible per-paddock sequence lengths without further changes.</w:t>
       </w:r>
     </w:p>
     <w:tbl>
@@ -5541,15 +5304,7 @@
           </w:tcPr>
           <w:p>
             <w:r>
-              <w:t>0.2980 (</w:t>
-            </w:r>
-            <w:proofErr w:type="spellStart"/>
-            <w:r>
-              <w:t>standardised</w:t>
-            </w:r>
-            <w:proofErr w:type="spellEnd"/>
-            <w:r>
-              <w:t>)</w:t>
+              <w:t>0.2980 (standardised)</w:t>
             </w:r>
           </w:p>
         </w:tc>
@@ -5989,7 +5744,6 @@
         <w:rPr>
           <w:noProof/>
         </w:rPr>
-        <w:lastRenderedPageBreak/>
         <w:drawing>
           <wp:inline distT="0" distB="0" distL="0" distR="0" wp14:anchorId="17786C50" wp14:editId="1EAA92DB">
             <wp:extent cx="5731510" cy="3895725"/>
@@ -6459,19 +6213,15 @@
       <w:r>
         <w:t xml:space="preserve">Note: Train RMSE is reported in </w:t>
       </w:r>
-      <w:proofErr w:type="spellStart"/>
-      <w:r>
-        <w:t>standardised</w:t>
-      </w:r>
-      <w:proofErr w:type="spellEnd"/>
+      <w:r>
+        <w:t>standardized</w:t>
+      </w:r>
       <w:r>
         <w:t xml:space="preserve"> units (as used directly in the training loss); Test RMSE is reported in original TSDM units after inverse-transforming predictions with each paddock's own scaler, so the two RMSE columns are not directly comparable in scale — R² (a </w:t>
       </w:r>
-      <w:proofErr w:type="spellStart"/>
-      <w:r>
-        <w:t>normalised</w:t>
-      </w:r>
-      <w:proofErr w:type="spellEnd"/>
+      <w:r>
+        <w:t>normalized</w:t>
+      </w:r>
       <w:r>
         <w:t>, scale-free metric) is the more reliable basis for comparing train vs. test performance across models.</w:t>
       </w:r>
@@ -6490,11 +6240,7 @@
         <w:spacing w:after="150"/>
       </w:pPr>
       <w:r>
-        <w:t xml:space="preserve">A clear and consistent pattern emerges across the three models: as model complexity increases (longer lookback, then additional climate features), training performance steadily improves — Train </w:t>
-      </w:r>
-      <w:r>
-        <w:lastRenderedPageBreak/>
-        <w:t>R² rises from 0.51 to 0.71 to 0.91 — while test performance on the genuinely held-out last-5-timestep window steadily worsens — Test R² falls from 0.31 to 0.11 to 0.07, and Test RMSE increases from 347 to 395 to 405. This divergence is a textbook signature of overfitting: the more expressive multivariate model fits the training sequences almost perfectly, but this fit does not transfer to forecasting genuinely unseen future timesteps.</w:t>
+        <w:t>A clear and consistent pattern emerges across the three models: as model complexity increases (longer lookback, then additional climate features), training performance steadily improves — Train R² rises from 0.51 to 0.71 to 0.91 — while test performance on the genuinely held-out last-5-timestep window steadily worsens — Test R² falls from 0.31 to 0.11 to 0.07, and Test RMSE increases from 347 to 395 to 405. This divergence is a textbook signature of overfitting: the more expressive multivariate model fits the training sequences almost perfectly, but this fit does not transfer to forecasting genuinely unseen future timesteps.</w:t>
       </w:r>
     </w:p>
     <w:p>
@@ -6502,39 +6248,13 @@
         <w:spacing w:after="150"/>
       </w:pPr>
       <w:r>
-        <w:t xml:space="preserve">This matters because it means the notebook's initial impression — that adding climate features and a longer lookback substantially improves the model — only holds when judged against the internal 80/20 validation split carved out of the training data. That validation split is drawn from the same </w:t>
-      </w:r>
-      <w:proofErr w:type="gramStart"/>
-      <w:r>
-        <w:t>time period</w:t>
-      </w:r>
-      <w:proofErr w:type="gramEnd"/>
-      <w:r>
-        <w:t xml:space="preserve"> and distribution as the training data, so it primarily measures how well the model interpolates within familiar territory, not how well it forecasts genuinely future, unseen pasture growth. The true forecasting test (the reserved last-5-timestep window per paddock) tells the opposite </w:t>
-      </w:r>
-      <w:proofErr w:type="gramStart"/>
-      <w:r>
-        <w:t>story, and</w:t>
-      </w:r>
-      <w:proofErr w:type="gramEnd"/>
-      <w:r>
-        <w:t xml:space="preserve"> is the metric that </w:t>
-      </w:r>
-      <w:proofErr w:type="gramStart"/>
-      <w:r>
-        <w:t>actually matters</w:t>
-      </w:r>
-      <w:proofErr w:type="gramEnd"/>
-      <w:r>
-        <w:t xml:space="preserve"> for </w:t>
-      </w:r>
-      <w:proofErr w:type="spellStart"/>
-      <w:r>
-        <w:t>AgriWebb's</w:t>
-      </w:r>
-      <w:proofErr w:type="spellEnd"/>
-      <w:r>
-        <w:t xml:space="preserve"> stated goal of predicting future pasture availability.</w:t>
+        <w:t xml:space="preserve">This matters because it means the notebook's initial impression — that adding climate features and a longer lookback substantially improves the model — only holds when judged against the internal 80/20 validation split carved out of the training data. That validation split is drawn from the same time period and distribution as the training data, so it primarily measures how well the model interpolates within familiar territory, not how well it forecasts genuinely future, unseen pasture growth. The true forecasting test (the reserved last-5-timestep window per paddock) tells the opposite </w:t>
+      </w:r>
+      <w:r>
+        <w:t>story and</w:t>
+      </w:r>
+      <w:r>
+        <w:t xml:space="preserve"> is the metric that actually matters for AgriWebb's stated goal of predicting future pasture availability.</w:t>
       </w:r>
     </w:p>
     <w:p>
@@ -7181,11 +6901,7 @@
         <w:spacing w:after="80"/>
       </w:pPr>
       <w:r>
-        <w:t xml:space="preserve">Error is highly concentrated, not uniform: per-paddock test RMSE ranges from 75.4 (best) to 827.7 (worst), with a median of 299.6. The worst-performing paddocks (d54f90a4, 5c4c28a9, ad87a9f8) are consistently among those with the highest training-set variability (train std ≈ </w:t>
-      </w:r>
-      <w:r>
-        <w:lastRenderedPageBreak/>
-        <w:t>480–969), while the best-performing paddocks (deb009be, e59f403d, ec69095b) have comparatively low training-set variability (train std ≈ 287–315).</w:t>
+        <w:t>Error is highly concentrated, not uniform: per-paddock test RMSE ranges from 75.4 (best) to 827.7 (worst), with a median of 299.6. The worst-performing paddocks (d54f90a4, 5c4c28a9, ad87a9f8) are consistently among those with the highest training-set variability (train std ≈ 480–969), while the best-performing paddocks (deb009be, e59f403d, ec69095b) have comparatively low training-set variability (train std ≈ 287–315).</w:t>
       </w:r>
     </w:p>
     <w:p>
@@ -7238,55 +6954,19 @@
         <w:spacing w:after="150"/>
       </w:pPr>
       <w:r>
-        <w:t xml:space="preserve">For </w:t>
-      </w:r>
-      <w:proofErr w:type="spellStart"/>
-      <w:r>
-        <w:t>AgriWebb</w:t>
-      </w:r>
-      <w:proofErr w:type="spellEnd"/>
-      <w:r>
-        <w:t xml:space="preserve">, these results suggest the current multivariate model should not be deployed as-is for operational forecasting, despite its strong training fit: a Test R² of 0.07 means it explains almost none of the variance in genuinely future pasture </w:t>
-      </w:r>
-      <w:proofErr w:type="gramStart"/>
-      <w:r>
-        <w:t>growth, and</w:t>
-      </w:r>
-      <w:proofErr w:type="gramEnd"/>
-      <w:r>
-        <w:t xml:space="preserve"> would give decision-makers false confidence based on training-time metrics alone. The simpler univariate Model 1 (Lookback=5) is the most defensible of the three for practical use, since it shows the best (least poor) genuine forecasting performance (Test R² = 0.31) despite its simplicity — a useful reminder that model complexity should be validated against true held-out performance, not training fit, before being deployed. </w:t>
-      </w:r>
-      <w:proofErr w:type="gramStart"/>
-      <w:r>
-        <w:t>Practical next</w:t>
-      </w:r>
-      <w:proofErr w:type="gramEnd"/>
-      <w:r>
-        <w:t xml:space="preserve"> steps worth </w:t>
-      </w:r>
-      <w:proofErr w:type="gramStart"/>
-      <w:r>
-        <w:t>considering:</w:t>
-      </w:r>
-      <w:proofErr w:type="gramEnd"/>
-      <w:r>
-        <w:t xml:space="preserve"> per-paddock or per-cluster fine-tuning rather than one shared model across all 19 paddocks; gathering more historical timesteps per paddock before adding additional input features; and applying stronger </w:t>
-      </w:r>
-      <w:proofErr w:type="spellStart"/>
-      <w:r>
-        <w:t>regularisation</w:t>
-      </w:r>
-      <w:proofErr w:type="spellEnd"/>
-      <w:r>
-        <w:t xml:space="preserve"> (e.g., increased dropout, L2 weight decay) specifically for the multivariate model given its clear overfitting signature. Until such improvements are validated on genuine forecasting performance, model outputs should be treated as indicative at best for volatile paddocks (train std &gt; ~450</w:t>
-      </w:r>
-      <w:proofErr w:type="gramStart"/>
-      <w:r>
-        <w:t>), and</w:t>
-      </w:r>
-      <w:proofErr w:type="gramEnd"/>
-      <w:r>
-        <w:t xml:space="preserve"> used with more confidence only for paddocks with historically stable, low-variability growth patterns.</w:t>
+        <w:t xml:space="preserve">For AgriWebb, these results suggest the current multivariate model should not be deployed as-is for operational forecasting, despite its strong training fit: a Test R² of 0.07 means it explains almost none of the variance in genuinely future pasture </w:t>
+      </w:r>
+      <w:r>
+        <w:t>growth and</w:t>
+      </w:r>
+      <w:r>
+        <w:t xml:space="preserve"> would give decision-makers false confidence based on training-time metrics alone. The simpler univariate Model 1 (Lookback=5) is the most defensible of the three for practical use, since it shows the best (least poor) genuine forecasting performance (Test R² = 0.31) despite its simplicity — a useful reminder that model complexity should be validated against true held-out performance, not training fit, before being deployed. Practical next steps worth </w:t>
+      </w:r>
+      <w:r>
+        <w:t>considering</w:t>
+      </w:r>
+      <w:r>
+        <w:t xml:space="preserve"> per-paddock or per-cluster fine-tuning rather than one shared model across all 19 paddocks; gathering more historical timesteps per paddock before adding additional input features; and applying stronger regularisation (e.g., increased dropout, L2 weight decay) specifically for the multivariate model given its clear overfitting signature. Until such improvements are validated on genuine forecasting performance, model outputs should be treated as indicative at best for volatile paddocks (train std &gt; ~450), and used with more confidence only for paddocks with historically stable, low-variability growth patterns.</w:t>
       </w:r>
     </w:p>
     <w:p>
@@ -7300,7 +6980,6 @@
         <w:spacing w:before="400" w:after="200"/>
       </w:pPr>
       <w:r>
-        <w:lastRenderedPageBreak/>
         <w:t>Task 9: Hydrogen Tweet Classification with BERT</w:t>
       </w:r>
     </w:p>
@@ -7318,15 +6997,7 @@
         <w:spacing w:after="150"/>
       </w:pPr>
       <w:r>
-        <w:t xml:space="preserve">The </w:t>
-      </w:r>
-      <w:proofErr w:type="spellStart"/>
-      <w:r>
-        <w:t>hydrogen_small</w:t>
-      </w:r>
-      <w:proofErr w:type="spellEnd"/>
-      <w:r>
-        <w:t xml:space="preserve"> dataset contains 1,000 tweets, with a class distribution of 547 Relevant and 453 Irrelevant (54.7% / 45.3%).</w:t>
+        <w:t>The hydrogen_small dataset contains 1,000 tweets, with a class distribution of 547 Relevant and 453 Irrelevant (54.7% / 45.3%).</w:t>
       </w:r>
     </w:p>
     <w:p>
@@ -7339,39 +7010,13 @@
         <w:spacing w:after="80"/>
       </w:pPr>
       <w:r>
-        <w:t xml:space="preserve">Text cleaning: URLs, Twitter </w:t>
-      </w:r>
-      <w:proofErr w:type="gramStart"/>
-      <w:r>
-        <w:t>mentions (@</w:t>
-      </w:r>
-      <w:proofErr w:type="gramEnd"/>
-      <w:r>
-        <w:t xml:space="preserve">handles), and non-ASCII characters were stripped via regular expressions, and consecutive whitespace was </w:t>
-      </w:r>
-      <w:proofErr w:type="spellStart"/>
-      <w:r>
-        <w:t>normalised</w:t>
-      </w:r>
-      <w:proofErr w:type="spellEnd"/>
-      <w:r>
-        <w:t xml:space="preserve"> to single spaces. Raw tweets are noisy — links, handles, and stray symbols carry no topical signal and would otherwise be </w:t>
-      </w:r>
-      <w:proofErr w:type="spellStart"/>
-      <w:r>
-        <w:t>tokenised</w:t>
-      </w:r>
-      <w:proofErr w:type="spellEnd"/>
-      <w:r>
-        <w:t xml:space="preserve"> as meaningless sub-word units, diluting the input the model </w:t>
-      </w:r>
-      <w:proofErr w:type="gramStart"/>
-      <w:r>
-        <w:t>actually needs</w:t>
-      </w:r>
-      <w:proofErr w:type="gramEnd"/>
-      <w:r>
-        <w:t xml:space="preserve"> to attend to.</w:t>
+        <w:t xml:space="preserve">Text cleaning: URLs, Twitter mentions (@handles), and non-ASCII characters were stripped via regular expressions, and consecutive whitespace was </w:t>
+      </w:r>
+      <w:r>
+        <w:t>normalized</w:t>
+      </w:r>
+      <w:r>
+        <w:t xml:space="preserve"> to single spaces. Raw tweets are noisy — links, handles, and stray symbols carry no topical signal and would otherwise be tokenised as meaningless sub-word units, diluting the input the model actually needs to attend to.</w:t>
       </w:r>
     </w:p>
     <w:p>
@@ -7384,15 +7029,7 @@
         <w:spacing w:after="80"/>
       </w:pPr>
       <w:r>
-        <w:t xml:space="preserve">Label encoding: labels were mapped to binary integers, Relevant = 1 and Irrelevant = 0, since </w:t>
-      </w:r>
-      <w:proofErr w:type="spellStart"/>
-      <w:r>
-        <w:t>AutoModelForSequenceClassification</w:t>
-      </w:r>
-      <w:proofErr w:type="spellEnd"/>
-      <w:r>
-        <w:t xml:space="preserve"> and Cross-Entropy Loss require integer class targets rather than string labels.</w:t>
+        <w:t>Label encoding: labels were mapped to binary integers, Relevant = 1 and Irrelevant = 0, since AutoModelForSequenceClassification and Cross-Entropy Loss require integer class targets rather than string labels.</w:t>
       </w:r>
     </w:p>
     <w:p>
@@ -7404,13 +7041,8 @@
         </w:numPr>
         <w:spacing w:after="80"/>
       </w:pPr>
-      <w:proofErr w:type="spellStart"/>
-      <w:r>
-        <w:t>Tokenisation</w:t>
-      </w:r>
-      <w:proofErr w:type="spellEnd"/>
-      <w:r>
-        <w:t>: each model's own tokenizer was used with truncation and dynamic padding up to a maximum length of 128 tokens, ensuring uniform tensor shapes for batched GPU training while keeping sequence length short enough (tweets are short by nature) to avoid unnecessary computation.</w:t>
+      <w:r>
+        <w:t>Tokenisation: each model's own tokenizer was used with truncation and dynamic padding up to a maximum length of 128 tokens, ensuring uniform tensor shapes for batched GPU training while keeping sequence length short enough (tweets are short by nature) to avoid unnecessary computation.</w:t>
       </w:r>
     </w:p>
     <w:p>
@@ -7511,13 +7143,8 @@
             </w:tcMar>
           </w:tcPr>
           <w:p>
-            <w:proofErr w:type="spellStart"/>
-            <w:r>
-              <w:t>bert</w:t>
-            </w:r>
-            <w:proofErr w:type="spellEnd"/>
-            <w:r>
-              <w:t>-base-uncased</w:t>
+            <w:r>
+              <w:t>bert-base-uncased</w:t>
             </w:r>
           </w:p>
         </w:tc>
@@ -7533,15 +7160,7 @@
           </w:tcPr>
           <w:p>
             <w:r>
-              <w:t xml:space="preserve">General-domain bidirectional transformer pre-trained on Wikipedia and </w:t>
-            </w:r>
-            <w:proofErr w:type="spellStart"/>
-            <w:r>
-              <w:t>BookCorpus</w:t>
-            </w:r>
-            <w:proofErr w:type="spellEnd"/>
-            <w:r>
-              <w:t>; serves as a reliable, well-understood benchmark.</w:t>
+              <w:t>General-domain bidirectional transformer pre-trained on Wikipedia and BookCorpus; serves as a reliable, well-understood benchmark.</w:t>
             </w:r>
           </w:p>
         </w:tc>
@@ -7558,21 +7177,8 @@
             </w:tcMar>
           </w:tcPr>
           <w:p>
-            <w:proofErr w:type="spellStart"/>
-            <w:r>
-              <w:t>vinai</w:t>
-            </w:r>
-            <w:proofErr w:type="spellEnd"/>
-            <w:r>
-              <w:t>/</w:t>
-            </w:r>
-            <w:proofErr w:type="spellStart"/>
-            <w:r>
-              <w:t>bertweet</w:t>
-            </w:r>
-            <w:proofErr w:type="spellEnd"/>
-            <w:r>
-              <w:t>-base</w:t>
+            <w:r>
+              <w:t>vinai/bertweet-base</w:t>
             </w:r>
           </w:p>
         </w:tc>
@@ -7587,21 +7193,8 @@
             </w:tcMar>
           </w:tcPr>
           <w:p>
-            <w:proofErr w:type="spellStart"/>
-            <w:r>
-              <w:t>RoBERTa</w:t>
-            </w:r>
-            <w:proofErr w:type="spellEnd"/>
-            <w:r>
-              <w:t xml:space="preserve">-based model pre-trained on 850 million English tweets, specifically </w:t>
-            </w:r>
-            <w:proofErr w:type="spellStart"/>
-            <w:r>
-              <w:t>optimised</w:t>
-            </w:r>
-            <w:proofErr w:type="spellEnd"/>
-            <w:r>
-              <w:t xml:space="preserve"> for Twitter slang, syntax, and informal phrasing — matches the register of the target data.</w:t>
+            <w:r>
+              <w:t>RoBERTa-based model pre-trained on 850 million English tweets, specifically optimised for Twitter slang, syntax, and informal phrasing — matches the register of the target data.</w:t>
             </w:r>
           </w:p>
         </w:tc>
@@ -7631,15 +7224,7 @@
         <w:spacing w:after="80"/>
       </w:pPr>
       <w:r>
-        <w:t xml:space="preserve">Split: stratified 70/30 (700 train / 300 test), </w:t>
-      </w:r>
-      <w:proofErr w:type="spellStart"/>
-      <w:r>
-        <w:t>random_state</w:t>
-      </w:r>
-      <w:proofErr w:type="spellEnd"/>
-      <w:r>
-        <w:t>=42 — stratification preserves the 54.7%/45.3% class balance in both subsets.</w:t>
+        <w:t>Split: stratified 70/30 (700 train / 300 test), random_state=42 — stratification preserves the 54.7%/45.3% class balance in both subsets.</w:t>
       </w:r>
     </w:p>
     <w:p>
@@ -7652,23 +7237,7 @@
         <w:spacing w:after="80"/>
       </w:pPr>
       <w:r>
-        <w:t xml:space="preserve">Loss function: standard Cross-Entropy Loss via </w:t>
-      </w:r>
-      <w:proofErr w:type="spellStart"/>
-      <w:r>
-        <w:t>AutoModelForSequenceClassification</w:t>
-      </w:r>
-      <w:proofErr w:type="spellEnd"/>
-      <w:r>
-        <w:t xml:space="preserve">. This is the appropriate loss for binary classification because it is derived from negative log-likelihood and heavily </w:t>
-      </w:r>
-      <w:proofErr w:type="spellStart"/>
-      <w:r>
-        <w:t>penalises</w:t>
-      </w:r>
-      <w:proofErr w:type="spellEnd"/>
-      <w:r>
-        <w:t xml:space="preserve"> confident, incorrect probability predictions, encouraging well-calibrated outputs.</w:t>
+        <w:t>Loss function: standard Cross-Entropy Loss via AutoModelForSequenceClassification. This is the appropriate loss for binary classification because it is derived from negative log-likelihood and heavily penalises confident, incorrect probability predictions, encouraging well-calibrated outputs.</w:t>
       </w:r>
     </w:p>
     <w:p>
@@ -7694,29 +7263,11 @@
         <w:spacing w:after="80"/>
       </w:pPr>
       <w:r>
-        <w:t xml:space="preserve">Hyperparameters: 3 epochs, batch size 16 (train) / 32 (eval), learning rate 2e-5 with the </w:t>
-      </w:r>
-      <w:proofErr w:type="spellStart"/>
-      <w:r>
-        <w:t>AdamW</w:t>
-      </w:r>
-      <w:proofErr w:type="spellEnd"/>
-      <w:r>
-        <w:t xml:space="preserve"> </w:t>
-      </w:r>
-      <w:proofErr w:type="spellStart"/>
-      <w:r>
-        <w:t>optimiser</w:t>
-      </w:r>
-      <w:proofErr w:type="spellEnd"/>
-      <w:r>
-        <w:t xml:space="preserve">, weight decay 0.01 for L2 </w:t>
-      </w:r>
-      <w:proofErr w:type="spellStart"/>
-      <w:r>
-        <w:t>regularisation</w:t>
-      </w:r>
-      <w:proofErr w:type="spellEnd"/>
+        <w:t xml:space="preserve">Hyperparameters: 3 epochs, batch size 16 (train) / 32 (eval), learning rate 2e-5 with the AdamW optimiser, weight decay 0.01 for L2 </w:t>
+      </w:r>
+      <w:r>
+        <w:t>regularization</w:t>
+      </w:r>
       <w:r>
         <w:t>.</w:t>
       </w:r>
@@ -7773,7 +7324,6 @@
                 <w:b/>
                 <w:bCs/>
               </w:rPr>
-              <w:lastRenderedPageBreak/>
               <w:t>Model</w:t>
             </w:r>
           </w:p>
@@ -7833,13 +7383,8 @@
             </w:tcMar>
           </w:tcPr>
           <w:p>
-            <w:proofErr w:type="spellStart"/>
-            <w:r>
-              <w:t>bert</w:t>
-            </w:r>
-            <w:proofErr w:type="spellEnd"/>
-            <w:r>
-              <w:t>-base-uncased</w:t>
+            <w:r>
+              <w:t>bert-base-uncased</w:t>
             </w:r>
           </w:p>
         </w:tc>
@@ -7888,21 +7433,8 @@
             </w:tcMar>
           </w:tcPr>
           <w:p>
-            <w:proofErr w:type="spellStart"/>
-            <w:r>
-              <w:t>vinai</w:t>
-            </w:r>
-            <w:proofErr w:type="spellEnd"/>
-            <w:r>
-              <w:t>/</w:t>
-            </w:r>
-            <w:proofErr w:type="spellStart"/>
-            <w:r>
-              <w:t>bertweet</w:t>
-            </w:r>
-            <w:proofErr w:type="spellEnd"/>
-            <w:r>
-              <w:t>-base</w:t>
+            <w:r>
+              <w:t>vinai/bertweet-base</w:t>
             </w:r>
           </w:p>
         </w:tc>
@@ -7950,37 +7482,11 @@
         <w:spacing w:after="150"/>
       </w:pPr>
       <w:r>
-        <w:t xml:space="preserve">Note that </w:t>
-      </w:r>
-      <w:proofErr w:type="spellStart"/>
-      <w:r>
-        <w:t>bert</w:t>
-      </w:r>
-      <w:proofErr w:type="spellEnd"/>
-      <w:r>
-        <w:t xml:space="preserve">-base-uncased shows a larger train–test gap (97.14% → 91.67%) than </w:t>
-      </w:r>
-      <w:proofErr w:type="spellStart"/>
-      <w:r>
-        <w:t>bertweet</w:t>
-      </w:r>
-      <w:proofErr w:type="spellEnd"/>
-      <w:r>
-        <w:t xml:space="preserve">-base (94.43% → 93.33%), suggesting </w:t>
-      </w:r>
-      <w:proofErr w:type="spellStart"/>
-      <w:r>
-        <w:t>bertweet</w:t>
-      </w:r>
-      <w:proofErr w:type="spellEnd"/>
-      <w:r>
-        <w:t xml:space="preserve">-base </w:t>
-      </w:r>
-      <w:proofErr w:type="spellStart"/>
-      <w:r>
-        <w:t>generalises</w:t>
-      </w:r>
-      <w:proofErr w:type="spellEnd"/>
+        <w:t xml:space="preserve">Note that bert-base-uncased shows a larger train–test gap (97.14% → 91.67%) than bertweet-base (94.43% → 93.33%), suggesting bertweet-base </w:t>
+      </w:r>
+      <w:r>
+        <w:t>generalizes</w:t>
+      </w:r>
       <w:r>
         <w:t xml:space="preserve"> slightly better to unseen tweets — consistent with its domain-matched pretraining.</w:t>
       </w:r>
@@ -7999,23 +7505,7 @@
         <w:spacing w:after="150"/>
       </w:pPr>
       <w:r>
-        <w:t>Attention weights were averaged across all layers and heads of the best-performing model (</w:t>
-      </w:r>
-      <w:proofErr w:type="spellStart"/>
-      <w:r>
-        <w:t>vinai</w:t>
-      </w:r>
-      <w:proofErr w:type="spellEnd"/>
-      <w:r>
-        <w:t>/</w:t>
-      </w:r>
-      <w:proofErr w:type="spellStart"/>
-      <w:r>
-        <w:t>bertweet</w:t>
-      </w:r>
-      <w:proofErr w:type="spellEnd"/>
-      <w:r>
-        <w:t>-base) for one correctly classified tweet from each class.</w:t>
+        <w:t>Attention weights were averaged across all layers and heads of the best-performing model (vinai/bertweet-base) for one correctly classified tweet from each class.</w:t>
       </w:r>
     </w:p>
     <w:p>
@@ -8095,7 +7585,6 @@
         <w:rPr>
           <w:noProof/>
         </w:rPr>
-        <w:lastRenderedPageBreak/>
         <w:drawing>
           <wp:inline distT="0" distB="0" distL="0" distR="0" wp14:anchorId="0199B3A5" wp14:editId="23564388">
             <wp:extent cx="5731510" cy="4755515"/>
@@ -8162,19 +7651,15 @@
       <w:r>
         <w:t xml:space="preserve">For the Relevant tweet, attention concentrates on "green", "hydrogen", "blue", and "fossil </w:t>
       </w:r>
-      <w:proofErr w:type="gramStart"/>
-      <w:r>
-        <w:t>fuels" —</w:t>
-      </w:r>
-      <w:proofErr w:type="gramEnd"/>
+      <w:r>
+        <w:t>fuels”</w:t>
+      </w:r>
       <w:r>
         <w:t xml:space="preserve"> energy-related modifiers surrounding the keyword "hydrogen" that together signal the clean-energy topic. For the Irrelevant tweet, attention shifts decisively to "responsive", "html", and "</w:t>
       </w:r>
-      <w:proofErr w:type="gramStart"/>
-      <w:r>
-        <w:t>template" —</w:t>
-      </w:r>
-      <w:proofErr w:type="gramEnd"/>
+      <w:r>
+        <w:t>template”</w:t>
+      </w:r>
       <w:r>
         <w:t xml:space="preserve"> web-design terminology that signals "hydrogen" is being used here as a software/theme name rather than referring to the energy source. This demonstrates that the model is not simply keying off the presence of the word "hydrogen" (which appears in every tweet in this dataset by construction) but is genuinely using surrounding context to disambiguate its meaning.</w:t>
       </w:r>
@@ -8292,21 +7777,12 @@
             </w:tcMar>
           </w:tcPr>
           <w:p>
-            <w:proofErr w:type="gramStart"/>
             <w:r>
               <w:rPr>
                 <w:b/>
                 <w:bCs/>
               </w:rPr>
-              <w:t>Recall</w:t>
-            </w:r>
-            <w:proofErr w:type="gramEnd"/>
-            <w:r>
-              <w:rPr>
-                <w:b/>
-                <w:bCs/>
-              </w:rPr>
-              <w:t xml:space="preserve"> (Relevant)</w:t>
+              <w:t>Recall (Relevant)</w:t>
             </w:r>
           </w:p>
         </w:tc>
@@ -8463,13 +7939,8 @@
             </w:tcMar>
           </w:tcPr>
           <w:p>
-            <w:proofErr w:type="spellStart"/>
-            <w:r>
-              <w:t>bert</w:t>
-            </w:r>
-            <w:proofErr w:type="spellEnd"/>
-            <w:r>
-              <w:t>-base-uncased</w:t>
+            <w:r>
+              <w:t>bert-base-uncased</w:t>
             </w:r>
           </w:p>
         </w:tc>
@@ -8566,21 +8037,8 @@
             </w:tcMar>
           </w:tcPr>
           <w:p>
-            <w:proofErr w:type="spellStart"/>
-            <w:r>
-              <w:t>vinai</w:t>
-            </w:r>
-            <w:proofErr w:type="spellEnd"/>
-            <w:r>
-              <w:t>/</w:t>
-            </w:r>
-            <w:proofErr w:type="spellStart"/>
-            <w:r>
-              <w:t>bertweet</w:t>
-            </w:r>
-            <w:proofErr w:type="spellEnd"/>
-            <w:r>
-              <w:t>-base (Best)</w:t>
+            <w:r>
+              <w:t>vinai/bertweet-base (Best)</w:t>
             </w:r>
           </w:p>
         </w:tc>
@@ -8680,7 +8138,6 @@
         <w:rPr>
           <w:noProof/>
         </w:rPr>
-        <w:lastRenderedPageBreak/>
         <w:drawing>
           <wp:inline distT="0" distB="0" distL="0" distR="0" wp14:anchorId="5FB1D2C6" wp14:editId="19A3CCEC">
             <wp:extent cx="5731510" cy="4478655"/>
@@ -8745,23 +8202,7 @@
         <w:spacing w:after="150"/>
       </w:pPr>
       <w:r>
-        <w:t xml:space="preserve">BERT outperformed the TF-IDF logistic regression baseline across every metric: test accuracy rose from 89.67% to 93.33%, and ROC-AUC from 0.963 to 0.985. This is expected because every tweet in this dataset contains the keyword "hydrogen" by construction, so the discriminative signal depends entirely on surrounding context (e.g., "green/blue hydrogen" for clean energy vs. "hydrogen responsive template" for web design). The logistic regression model treats text as an unordered bag of TF-IDF weighted words and cannot capture this context-dependent meaning, whereas BERT's self-attention mechanism explicitly models bidirectional dependencies between words. </w:t>
-      </w:r>
-      <w:proofErr w:type="spellStart"/>
-      <w:r>
-        <w:t>BERTweet's</w:t>
-      </w:r>
-      <w:proofErr w:type="spellEnd"/>
-      <w:r>
-        <w:t xml:space="preserve"> further improvement over </w:t>
-      </w:r>
-      <w:proofErr w:type="spellStart"/>
-      <w:r>
-        <w:t>bert</w:t>
-      </w:r>
-      <w:proofErr w:type="spellEnd"/>
-      <w:r>
-        <w:t>-base-uncased is attributable to its vocabulary and pretraining being specifically matched to informal, social-media text.</w:t>
+        <w:t>BERT outperformed the TF-IDF logistic regression baseline across every metric: test accuracy rose from 89.67% to 93.33%, and ROC-AUC from 0.963 to 0.985. This is expected because every tweet in this dataset contains the keyword "hydrogen" by construction, so the discriminative signal depends entirely on surrounding context (e.g., "green/blue hydrogen" for clean energy vs. "hydrogen responsive template" for web design). The logistic regression model treats text as an unordered bag of TF-IDF weighted words and cannot capture this context-dependent meaning, whereas BERT's self-attention mechanism explicitly models bidirectional dependencies between words. BERTweet's further improvement over bert-base-uncased is attributable to its vocabulary and pretraining being specifically matched to informal, social-media text.</w:t>
       </w:r>
     </w:p>
     <w:p>
@@ -8775,7 +8216,6 @@
         <w:spacing w:before="400" w:after="200"/>
       </w:pPr>
       <w:r>
-        <w:lastRenderedPageBreak/>
         <w:t>Task 10: Building a Question Answering System with T5</w:t>
       </w:r>
     </w:p>
@@ -8785,15 +8225,7 @@
         <w:spacing w:before="300" w:after="150"/>
       </w:pPr>
       <w:r>
-        <w:t xml:space="preserve">10.1 Preprocessing </w:t>
-      </w:r>
-      <w:proofErr w:type="spellStart"/>
-      <w:r>
-        <w:t>SQuAD_tiny</w:t>
-      </w:r>
-      <w:proofErr w:type="spellEnd"/>
-      <w:r>
-        <w:t xml:space="preserve"> for T5</w:t>
+        <w:t>10.1 Preprocessing SQuAD_tiny for T5</w:t>
       </w:r>
     </w:p>
     <w:p>
@@ -8806,15 +8238,7 @@
         <w:spacing w:after="80"/>
       </w:pPr>
       <w:r>
-        <w:t>Input format: each example was encoded as '</w:t>
-      </w:r>
-      <w:proofErr w:type="gramStart"/>
-      <w:r>
-        <w:t>question: {</w:t>
-      </w:r>
-      <w:proofErr w:type="gramEnd"/>
-      <w:r>
-        <w:t>question} context: {context}'. T5 is a text-to-text model with no task-specific architecture head, so every task must be expressed as a natural-language instruction — this explicit prefix tells the model it is being asked to perform extractive/generative question answering rather than any other text-to-text task.</w:t>
+        <w:t>Input format: each example was encoded as 'question: {question} context: {context}'. T5 is a text-to-text model with no task-specific architecture head, so every task must be expressed as a natural-language instruction — this explicit prefix tells the model it is being asked to perform extractive/generative question answering rather than any other text-to-text task.</w:t>
       </w:r>
     </w:p>
     <w:p>
@@ -8826,29 +8250,17 @@
         </w:numPr>
         <w:spacing w:after="80"/>
       </w:pPr>
-      <w:proofErr w:type="spellStart"/>
-      <w:r>
-        <w:t>Tokenisation</w:t>
-      </w:r>
-      <w:proofErr w:type="spellEnd"/>
+      <w:r>
+        <w:t>Tokenization</w:t>
+      </w:r>
       <w:r>
         <w:t xml:space="preserve">: inputs were </w:t>
       </w:r>
-      <w:proofErr w:type="spellStart"/>
-      <w:r>
-        <w:t>tokenised</w:t>
-      </w:r>
-      <w:proofErr w:type="spellEnd"/>
-      <w:r>
-        <w:t xml:space="preserve"> to a maximum length of 512 tokens (long enough to hold the </w:t>
-      </w:r>
-      <w:proofErr w:type="spellStart"/>
-      <w:r>
-        <w:t>SQuAD</w:t>
-      </w:r>
-      <w:proofErr w:type="spellEnd"/>
-      <w:r>
-        <w:t xml:space="preserve"> context passage plus the question) and target answers to a maximum of 128 tokens, both with padding and truncation for uniform batch shapes.</w:t>
+      <w:r>
+        <w:t>tokenized</w:t>
+      </w:r>
+      <w:r>
+        <w:t xml:space="preserve"> to a maximum length of 512 tokens (long enough to hold the SQuAD context passage plus the question) and target answers to a maximum of 128 tokens, both with padding and truncation for uniform batch shapes.</w:t>
       </w:r>
     </w:p>
     <w:p>
@@ -8861,39 +8273,7 @@
         <w:spacing w:after="80"/>
       </w:pPr>
       <w:r>
-        <w:t>Dataset split: 1,000 training examples (</w:t>
-      </w:r>
-      <w:proofErr w:type="spellStart"/>
-      <w:r>
-        <w:t>SQuAD</w:t>
-      </w:r>
-      <w:proofErr w:type="spellEnd"/>
-      <w:r>
-        <w:t xml:space="preserve"> train indices 10,000–10,999), 100 validation examples (</w:t>
-      </w:r>
-      <w:proofErr w:type="spellStart"/>
-      <w:r>
-        <w:t>SQuAD</w:t>
-      </w:r>
-      <w:proofErr w:type="spellEnd"/>
-      <w:r>
-        <w:t xml:space="preserve"> validation indices 3,000–3,099), and 100 test examples (</w:t>
-      </w:r>
-      <w:proofErr w:type="spellStart"/>
-      <w:r>
-        <w:t>SQuAD</w:t>
-      </w:r>
-      <w:proofErr w:type="spellEnd"/>
-      <w:r>
-        <w:t xml:space="preserve"> validation indices 3,100–3,199), following the </w:t>
-      </w:r>
-      <w:proofErr w:type="spellStart"/>
-      <w:r>
-        <w:t>SQuAD_tiny</w:t>
-      </w:r>
-      <w:proofErr w:type="spellEnd"/>
-      <w:r>
-        <w:t xml:space="preserve"> construction specified in the assignment.</w:t>
+        <w:t>Dataset split: 1,000 training examples (SQuAD train indices 10,000–10,999), 100 validation examples (SQuAD validation indices 3,000–3,099), and 100 test examples (SQuAD validation indices 3,100–3,199), following the SQuAD_tiny construction specified in the assignment.</w:t>
       </w:r>
     </w:p>
     <w:p>
@@ -8918,23 +8298,7 @@
         <w:spacing w:after="150"/>
       </w:pPr>
       <w:r>
-        <w:t xml:space="preserve">Hyperparameters: 3 epochs, per-device batch size 8 (train and eval), learning rate </w:t>
-      </w:r>
-      <w:proofErr w:type="gramStart"/>
-      <w:r>
-        <w:t>3e</w:t>
-      </w:r>
-      <w:proofErr w:type="gramEnd"/>
-      <w:r>
-        <w:t>-4, weight decay 0.01, using Hugging Face's Trainer/</w:t>
-      </w:r>
-      <w:proofErr w:type="spellStart"/>
-      <w:r>
-        <w:t>TrainingArguments</w:t>
-      </w:r>
-      <w:proofErr w:type="spellEnd"/>
-      <w:r>
-        <w:t xml:space="preserve"> with epoch-level evaluation and checkpointing.</w:t>
+        <w:t>Hyperparameters: 3 epochs, per-device batch size 8 (train and eval), learning rate 3e-4, weight decay 0.01, using Hugging Face's Trainer/TrainingArguments with epoch-level evaluation and checkpointing.</w:t>
       </w:r>
     </w:p>
     <w:p>
@@ -9214,21 +8578,11 @@
       <w:r>
         <w:t xml:space="preserve">Overfitting-prevention strategies: weight decay (0.01) was applied as L2 </w:t>
       </w:r>
-      <w:proofErr w:type="spellStart"/>
-      <w:r>
-        <w:t>regularisation</w:t>
-      </w:r>
-      <w:proofErr w:type="spellEnd"/>
-      <w:r>
-        <w:t xml:space="preserve"> on model weights; a comparatively short fine-tuning run (3 epochs) was used given the small 1,000-example training set, and was further supported by the observed validation loss uptick at epoch 3 above; and a held-out validation set (100 examples, drawn from a different </w:t>
-      </w:r>
-      <w:proofErr w:type="spellStart"/>
-      <w:r>
-        <w:t>SQuAD</w:t>
-      </w:r>
-      <w:proofErr w:type="spellEnd"/>
-      <w:r>
-        <w:t xml:space="preserve"> split range to the training set) was evaluated after every epoch so that validation loss could be monitored for divergence from training loss.</w:t>
+      <w:r>
+        <w:t>regularization</w:t>
+      </w:r>
+      <w:r>
+        <w:t xml:space="preserve"> on model weights; a comparatively short fine-tuning run (3 epochs) was used given the small 1,000-example training set, and was further supported by the observed validation loss uptick at epoch 3 above; and a held-out validation set (100 examples, drawn from a different SQuAD split range to the training set) was evaluated after every epoch so that validation loss could be monitored for divergence from training loss.</w:t>
       </w:r>
     </w:p>
     <w:p>
@@ -9249,7 +8603,6 @@
         <w:spacing w:before="300" w:after="150"/>
       </w:pPr>
       <w:r>
-        <w:lastRenderedPageBreak/>
         <w:t>10.3 Evaluation on the Test Set (Question + Context)</w:t>
       </w:r>
     </w:p>
@@ -9576,11 +8929,9 @@
       <w:r>
         <w:t xml:space="preserve">A ROUGE-1 F-measure of 0.57 indicates moderate word-level overlap between generated and reference answers — the model captures much of the correct content but does not reproduce reference answers exactly. The larger gap between ROUGE-1 (0.57) and ROUGE-2 (0.37) suggests that while individual key words are often correctly identified, the model does not always reproduce the exact multi-word phrasing of the reference answer (e.g., generating a shorter or </w:t>
       </w:r>
-      <w:proofErr w:type="gramStart"/>
-      <w:r>
-        <w:t>differently-worded</w:t>
-      </w:r>
-      <w:proofErr w:type="gramEnd"/>
+      <w:r>
+        <w:t>differently worded</w:t>
+      </w:r>
       <w:r>
         <w:t xml:space="preserve"> span that still contains the correct information).</w:t>
       </w:r>
@@ -10093,15 +9444,7 @@
           </w:tcPr>
           <w:p>
             <w:r>
-              <w:t xml:space="preserve">What declaration </w:t>
-            </w:r>
-            <w:proofErr w:type="gramStart"/>
-            <w:r>
-              <w:t>predicated</w:t>
-            </w:r>
-            <w:proofErr w:type="gramEnd"/>
-            <w:r>
-              <w:t xml:space="preserve"> the emigration of Huguenot refugees?</w:t>
+              <w:t>What declaration predicated the emigration of Huguenot refugees?</w:t>
             </w:r>
           </w:p>
         </w:tc>
@@ -10116,13 +9459,8 @@
             </w:tcMar>
           </w:tcPr>
           <w:p>
-            <w:proofErr w:type="gramStart"/>
-            <w:r>
-              <w:t>the revocation</w:t>
-            </w:r>
-            <w:proofErr w:type="gramEnd"/>
-            <w:r>
-              <w:t xml:space="preserve"> of the Edict of Nantes</w:t>
+            <w:r>
+              <w:t>the revocation of the Edict of Nantes</w:t>
             </w:r>
           </w:p>
         </w:tc>
@@ -10137,13 +9475,8 @@
             </w:tcMar>
           </w:tcPr>
           <w:p>
-            <w:proofErr w:type="gramStart"/>
-            <w:r>
-              <w:t>the</w:t>
-            </w:r>
-            <w:proofErr w:type="gramEnd"/>
-            <w:r>
-              <w:t xml:space="preserve"> Edict of Nantes</w:t>
+            <w:r>
+              <w:t>the Edict of Nantes</w:t>
             </w:r>
           </w:p>
         </w:tc>
@@ -10175,7 +9508,6 @@
         <w:spacing w:after="150"/>
       </w:pPr>
       <w:r>
-        <w:lastRenderedPageBreak/>
         <w:t>ROUGE without context (whole test set): Precision 0.0048 / Recall 0.0133 / F-measure 0.0065 (ROUGE-1); all ROUGE-2 metrics are exactly 0. Performance collapses almost completely without the context passage.</w:t>
       </w:r>
     </w:p>
@@ -10210,21 +9542,11 @@
         <w:spacing w:after="80"/>
       </w:pPr>
       <w:r>
-        <w:t>Errors with context: Sample 2 answers with "2 million" (the population figure from a nearby sentence) instead of the actual refugee count ("75,000 to 100,000 people</w:t>
-      </w:r>
-      <w:proofErr w:type="gramStart"/>
-      <w:r>
-        <w:t>") —</w:t>
-      </w:r>
-      <w:proofErr w:type="gramEnd"/>
-      <w:r>
-        <w:t xml:space="preserve"> a plausible-sounding but factually wrong span, suggesting the model can confuse similar numeric entities appearing close together in the passage. Sample 4 produces "Cévennes" (a place name from elsewhere in the passage) rather than the correct two areas, indicating a similar entity-confusion failure mode. Sample 5 gives "the Edict of Nantes" instead of "the revocation of the Edict of </w:t>
-      </w:r>
-      <w:proofErr w:type="gramStart"/>
-      <w:r>
-        <w:t>Nantes" —</w:t>
-      </w:r>
-      <w:proofErr w:type="gramEnd"/>
+        <w:t xml:space="preserve">Errors with context: Sample 2 answers with "2 million" (the population figure from a nearby sentence) instead of the actual refugee count ("75,000 to 100,000 people") — a plausible-sounding but factually wrong span, suggesting the model can confuse similar numeric entities appearing close together in the passage. Sample 4 produces "Cévennes" (a place name from elsewhere in the passage) rather than the correct two areas, indicating a similar entity-confusion failure mode. Sample 5 gives "the Edict of Nantes" instead of "the revocation of the Edict of </w:t>
+      </w:r>
+      <w:r>
+        <w:t>Nantes”</w:t>
+      </w:r>
       <w:r>
         <w:t xml:space="preserve"> again close in content but missing the key qualifying word that changes the precise meaning of the answer.</w:t>
       </w:r>
@@ -10241,21 +9563,11 @@
       <w:r>
         <w:t xml:space="preserve">Without context: 4 of the 5 samples produce an empty string, and the one non-empty output (Sample 3) simply echoes back part of the question rather than answering it. This confirms the model has not </w:t>
       </w:r>
-      <w:proofErr w:type="spellStart"/>
-      <w:r>
-        <w:t>memorised</w:t>
-      </w:r>
-      <w:proofErr w:type="spellEnd"/>
-      <w:r>
-        <w:t xml:space="preserve"> </w:t>
-      </w:r>
-      <w:proofErr w:type="spellStart"/>
-      <w:r>
-        <w:t>SQuAD</w:t>
-      </w:r>
-      <w:proofErr w:type="spellEnd"/>
-      <w:r>
-        <w:t xml:space="preserve"> facts during fine-tuning; it has learned to locate and extract spans from a supplied context, not to answer general-knowledge questions from parametric memory.</w:t>
+      <w:r>
+        <w:t>memorized</w:t>
+      </w:r>
+      <w:r>
+        <w:t xml:space="preserve"> SQuAD facts during fine-tuning; it has learned to locate and extract spans from a supplied context, not to answer general-knowledge questions from parametric memory.</w:t>
       </w:r>
     </w:p>
     <w:p>
@@ -10265,21 +9577,11 @@
       <w:r>
         <w:t xml:space="preserve">This near-total performance collapse without context (ROUGE-1 F dropping from 0.57 to 0.0065) demonstrates that the fine-tuned model's competence is entirely context-dependent: it functions as a context-conditioned span extractor/generator rather than as a general question-answering system with independent world knowledge. This is expected given the small fine-tuning set (1,000 examples) is far too small to teach the model new factual </w:t>
       </w:r>
-      <w:proofErr w:type="gramStart"/>
-      <w:r>
-        <w:t>knowledge, but</w:t>
-      </w:r>
-      <w:proofErr w:type="gramEnd"/>
-      <w:r>
-        <w:t xml:space="preserve"> is entirely sufficient to teach it the </w:t>
-      </w:r>
-      <w:proofErr w:type="spellStart"/>
-      <w:r>
-        <w:t>SQuAD</w:t>
-      </w:r>
-      <w:proofErr w:type="spellEnd"/>
-      <w:r>
-        <w:t xml:space="preserve"> task format of locating an answer within a given passage.</w:t>
+      <w:r>
+        <w:t>knowledge but</w:t>
+      </w:r>
+      <w:r>
+        <w:t xml:space="preserve"> is entirely sufficient to teach it the SQuAD task format of locating an answer within a given passage.</w:t>
       </w:r>
     </w:p>
     <w:p>
@@ -10300,7 +9602,6 @@
         <w:spacing w:before="300" w:after="150"/>
       </w:pPr>
       <w:r>
-        <w:lastRenderedPageBreak/>
         <w:t>10.5 Comparison with a Pre-Trained Model (mrm8488/t5-base-finetuned-squadv2)</w:t>
       </w:r>
     </w:p>
@@ -11062,15 +10363,7 @@
           </w:tcPr>
           <w:p>
             <w:r>
-              <w:t>Fine-tuned t5-small (</w:t>
-            </w:r>
-            <w:proofErr w:type="spellStart"/>
-            <w:r>
-              <w:t>SQuAD_tiny</w:t>
-            </w:r>
-            <w:proofErr w:type="spellEnd"/>
-            <w:r>
-              <w:t>)</w:t>
+              <w:t>Fine-tuned t5-small (SQuAD_tiny)</w:t>
             </w:r>
           </w:p>
         </w:tc>
@@ -11200,23 +10493,7 @@
         <w:spacing w:after="150"/>
       </w:pPr>
       <w:r>
-        <w:t xml:space="preserve">Counter-intuitively, the pre-trained mrm8488/t5-base-finetuned-squadv2 model scored lower than the team's own fine-tuned t5-small on every ROUGE variant (e.g., ROUGE-1 F: 0.5323 vs. 0.5749), despite being a larger base architecture (t5-base) trained on the full </w:t>
-      </w:r>
-      <w:proofErr w:type="spellStart"/>
-      <w:r>
-        <w:t>SQuAD</w:t>
-      </w:r>
-      <w:proofErr w:type="spellEnd"/>
-      <w:r>
-        <w:t xml:space="preserve"> dataset (~87,000+ examples) rather than the 1,000-example </w:t>
-      </w:r>
-      <w:proofErr w:type="spellStart"/>
-      <w:r>
-        <w:t>SQuAD_tiny</w:t>
-      </w:r>
-      <w:proofErr w:type="spellEnd"/>
-      <w:r>
-        <w:t xml:space="preserve"> subset.</w:t>
+        <w:t>Counter-intuitively, the pre-trained mrm8488/t5-base-finetuned-squadv2 model scored lower than the team's own fine-tuned t5-small on every ROUGE variant (e.g., ROUGE-1 F: 0.5323 vs. 0.5749), despite being a larger base architecture (t5-base) trained on the full SQuAD dataset (~87,000+ examples) rather than the 1,000-example SQuAD_tiny subset.</w:t>
       </w:r>
     </w:p>
     <w:p>
@@ -11224,69 +10501,11 @@
         <w:spacing w:after="150"/>
       </w:pPr>
       <w:r>
-        <w:t xml:space="preserve">Two explanations plausibly account for this reversal. First, a domain/format match effect: the team's model was fine-tuned directly on training data drawn from the same </w:t>
-      </w:r>
-      <w:proofErr w:type="spellStart"/>
-      <w:r>
-        <w:t>SQuAD</w:t>
-      </w:r>
-      <w:proofErr w:type="spellEnd"/>
-      <w:r>
-        <w:t xml:space="preserve"> dataset structure and answer-length conventions as the test set (indices 3,100–3,199 of the </w:t>
-      </w:r>
-      <w:proofErr w:type="spellStart"/>
-      <w:r>
-        <w:t>SQuAD</w:t>
-      </w:r>
-      <w:proofErr w:type="spellEnd"/>
-      <w:r>
-        <w:t xml:space="preserve"> validation split), so its output style is closely matched to this specific evaluation set, whereas mrm8488 was shaped by the full, more heterogeneous </w:t>
-      </w:r>
-      <w:proofErr w:type="spellStart"/>
-      <w:r>
-        <w:t>SQuAD</w:t>
-      </w:r>
-      <w:proofErr w:type="spellEnd"/>
-      <w:r>
-        <w:t xml:space="preserve"> v1 training distribution and may produce longer or differently-phrased spans that reduce lexical overlap even when correct. Second, a </w:t>
-      </w:r>
-      <w:proofErr w:type="spellStart"/>
-      <w:r>
-        <w:t>SQuAD</w:t>
-      </w:r>
-      <w:proofErr w:type="spellEnd"/>
-      <w:r>
-        <w:t xml:space="preserve"> v2 vs. v1 mismatch: mrm8488 was fine-tuned on </w:t>
-      </w:r>
-      <w:proofErr w:type="spellStart"/>
-      <w:r>
-        <w:t>SQuAD</w:t>
-      </w:r>
-      <w:proofErr w:type="spellEnd"/>
-      <w:r>
-        <w:t xml:space="preserve"> v2, which includes unanswerable questions and trains the model to sometimes hedge or decline to answer; since every question in the </w:t>
-      </w:r>
-      <w:proofErr w:type="spellStart"/>
-      <w:r>
-        <w:t>SQuAD_tiny</w:t>
-      </w:r>
-      <w:proofErr w:type="spellEnd"/>
-      <w:r>
-        <w:t xml:space="preserve"> test set (drawn from </w:t>
-      </w:r>
-      <w:proofErr w:type="spellStart"/>
-      <w:r>
-        <w:t>SQuAD</w:t>
-      </w:r>
-      <w:proofErr w:type="spellEnd"/>
-      <w:r>
-        <w:t xml:space="preserve"> v1-style data) does have an answer, a v2-trained model's more conservative answer style may reduce its measured overlap with the always-present reference answers even when its underlying answers are semantically reasonable. This also highlights a genuine limitation of ROUGE as an evaluation metric: it measures lexical overlap only, not factual correctness, so it is possible the pre-trained model's answers remain accurate but are phrased differently enough from the references to be </w:t>
-      </w:r>
-      <w:proofErr w:type="spellStart"/>
-      <w:r>
-        <w:t>penalised</w:t>
-      </w:r>
-      <w:proofErr w:type="spellEnd"/>
+        <w:t xml:space="preserve">Two explanations plausibly account for this reversal. First, a domain/format match effect: the team's model was fine-tuned directly on training data drawn from the same SQuAD dataset structure and answer-length conventions as the test set (indices 3,100–3,199 of the SQuAD validation split), so its output style is closely matched to this specific evaluation set, whereas mrm8488 was shaped by the full, more heterogeneous SQuAD v1 training distribution and may produce longer or differently-phrased spans that reduce lexical overlap even when correct. Second, a SQuAD v2 vs. v1 mismatch: mrm8488 was fine-tuned on SQuAD v2, which includes unanswerable questions and trains the model to sometimes hedge or decline to answer; since every question in the SQuAD_tiny test set (drawn from SQuAD v1-style data) does have an answer, a v2-trained model's more conservative answer style may reduce its measured overlap with the always-present reference answers even when its underlying answers are semantically reasonable. This also highlights a genuine limitation of ROUGE as an evaluation metric: it measures lexical overlap only, not factual correctness, so it is possible the pre-trained model's answers remain accurate but are phrased differently enough from the references to be </w:t>
+      </w:r>
+      <w:r>
+        <w:t>penalized</w:t>
+      </w:r>
       <w:r>
         <w:t xml:space="preserve"> — a fuller evaluation would benefit from manually inspecting a sample of mrm8488's generated answers alongside the fine-tuned model's, rather than relying on ROUGE scores alone.</w:t>
       </w:r>
@@ -11304,6 +10523,345 @@
 <file path=word/numbering.xml><?xml version="1.0" encoding="utf-8"?>
 <w:numbering xmlns:wpc="http://schemas.microsoft.com/office/word/2010/wordprocessingCanvas" xmlns:cx="http://schemas.microsoft.com/office/drawing/2014/chartex" xmlns:cx1="http://schemas.microsoft.com/office/drawing/2015/9/8/chartex" xmlns:cx2="http://schemas.microsoft.com/office/drawing/2015/10/21/chartex" xmlns:cx3="http://schemas.microsoft.com/office/drawing/2016/5/9/chartex" xmlns:cx4="http://schemas.microsoft.com/office/drawing/2016/5/10/chartex" xmlns:cx5="http://schemas.microsoft.com/office/drawing/2016/5/11/chartex" xmlns:cx6="http://schemas.microsoft.com/office/drawing/2016/5/12/chartex" xmlns:cx7="http://schemas.microsoft.com/office/drawing/2016/5/13/chartex" xmlns:cx8="http://schemas.microsoft.com/office/drawing/2016/5/14/chartex" xmlns:mc="http://schemas.openxmlformats.org/markup-compatibility/2006" xmlns:aink="http://schemas.microsoft.com/office/drawing/2016/ink" xmlns:am3d="http://schemas.microsoft.com/office/drawing/2017/model3d" xmlns:o="urn:schemas-microsoft-com:office:office" xmlns:oel="http://schemas.microsoft.com/office/2019/extlst" xmlns:r="http://schemas.openxmlformats.org/officeDocument/2006/relationships" xmlns:m="http://schemas.openxmlformats.org/officeDocument/2006/math" xmlns:v="urn:schemas-microsoft-com:vml" xmlns:wp14="http://schemas.microsoft.com/office/word/2010/wordprocessingDrawing" xmlns:wp="http://schemas.openxmlformats.org/drawingml/2006/wordprocessingDrawing" xmlns:w10="urn:schemas-microsoft-com:office:word" xmlns:w="http://schemas.openxmlformats.org/wordprocessingml/2006/main" xmlns:w14="http://schemas.microsoft.com/office/word/2010/wordml" xmlns:w15="http://schemas.microsoft.com/office/word/2012/wordml" xmlns:w16cex="http://schemas.microsoft.com/office/word/2018/wordml/cex" xmlns:w16cid="http://schemas.microsoft.com/office/word/2016/wordml/cid" xmlns:w16="http://schemas.microsoft.com/office/word/2018/wordml" xmlns:w16du="http://schemas.microsoft.com/office/word/2023/wordml/word16du" xmlns:w16sdtdh="http://schemas.microsoft.com/office/word/2020/wordml/sdtdatahash" xmlns:w16sdtfl="http://schemas.microsoft.com/office/word/2024/wordml/sdtformatlock" xmlns:w16se="http://schemas.microsoft.com/office/word/2015/wordml/symex" xmlns:wpg="http://schemas.microsoft.com/office/word/2010/wordprocessingGroup" xmlns:wpi="http://schemas.microsoft.com/office/word/2010/wordprocessingInk" xmlns:wne="http://schemas.microsoft.com/office/word/2006/wordml" xmlns:wps="http://schemas.microsoft.com/office/word/2010/wordprocessingShape" mc:Ignorable="w14 w15 w16se w16cid w16 w16cex w16sdtdh w16sdtfl w16du wp14">
   <w:abstractNum w:abstractNumId="0" w15:restartNumberingAfterBreak="0">
+    <w:nsid w:val="26D211B9"/>
+    <w:multiLevelType w:val="hybridMultilevel"/>
+    <w:tmpl w:val="FD043FA0"/>
+    <w:lvl w:ilvl="0" w:tplc="08090001">
+      <w:start w:val="1"/>
+      <w:numFmt w:val="bullet"/>
+      <w:lvlText w:val=""/>
+      <w:lvlJc w:val="left"/>
+      <w:pPr>
+        <w:ind w:left="720" w:hanging="360"/>
+      </w:pPr>
+      <w:rPr>
+        <w:rFonts w:ascii="Symbol" w:hAnsi="Symbol" w:hint="default"/>
+      </w:rPr>
+    </w:lvl>
+    <w:lvl w:ilvl="1" w:tplc="08090003" w:tentative="1">
+      <w:start w:val="1"/>
+      <w:numFmt w:val="bullet"/>
+      <w:lvlText w:val="o"/>
+      <w:lvlJc w:val="left"/>
+      <w:pPr>
+        <w:ind w:left="1440" w:hanging="360"/>
+      </w:pPr>
+      <w:rPr>
+        <w:rFonts w:ascii="Courier New" w:hAnsi="Courier New" w:cs="Courier New" w:hint="default"/>
+      </w:rPr>
+    </w:lvl>
+    <w:lvl w:ilvl="2" w:tplc="08090005" w:tentative="1">
+      <w:start w:val="1"/>
+      <w:numFmt w:val="bullet"/>
+      <w:lvlText w:val=""/>
+      <w:lvlJc w:val="left"/>
+      <w:pPr>
+        <w:ind w:left="2160" w:hanging="360"/>
+      </w:pPr>
+      <w:rPr>
+        <w:rFonts w:ascii="Wingdings" w:hAnsi="Wingdings" w:hint="default"/>
+      </w:rPr>
+    </w:lvl>
+    <w:lvl w:ilvl="3" w:tplc="08090001" w:tentative="1">
+      <w:start w:val="1"/>
+      <w:numFmt w:val="bullet"/>
+      <w:lvlText w:val=""/>
+      <w:lvlJc w:val="left"/>
+      <w:pPr>
+        <w:ind w:left="2880" w:hanging="360"/>
+      </w:pPr>
+      <w:rPr>
+        <w:rFonts w:ascii="Symbol" w:hAnsi="Symbol" w:hint="default"/>
+      </w:rPr>
+    </w:lvl>
+    <w:lvl w:ilvl="4" w:tplc="08090003" w:tentative="1">
+      <w:start w:val="1"/>
+      <w:numFmt w:val="bullet"/>
+      <w:lvlText w:val="o"/>
+      <w:lvlJc w:val="left"/>
+      <w:pPr>
+        <w:ind w:left="3600" w:hanging="360"/>
+      </w:pPr>
+      <w:rPr>
+        <w:rFonts w:ascii="Courier New" w:hAnsi="Courier New" w:cs="Courier New" w:hint="default"/>
+      </w:rPr>
+    </w:lvl>
+    <w:lvl w:ilvl="5" w:tplc="08090005" w:tentative="1">
+      <w:start w:val="1"/>
+      <w:numFmt w:val="bullet"/>
+      <w:lvlText w:val=""/>
+      <w:lvlJc w:val="left"/>
+      <w:pPr>
+        <w:ind w:left="4320" w:hanging="360"/>
+      </w:pPr>
+      <w:rPr>
+        <w:rFonts w:ascii="Wingdings" w:hAnsi="Wingdings" w:hint="default"/>
+      </w:rPr>
+    </w:lvl>
+    <w:lvl w:ilvl="6" w:tplc="08090001" w:tentative="1">
+      <w:start w:val="1"/>
+      <w:numFmt w:val="bullet"/>
+      <w:lvlText w:val=""/>
+      <w:lvlJc w:val="left"/>
+      <w:pPr>
+        <w:ind w:left="5040" w:hanging="360"/>
+      </w:pPr>
+      <w:rPr>
+        <w:rFonts w:ascii="Symbol" w:hAnsi="Symbol" w:hint="default"/>
+      </w:rPr>
+    </w:lvl>
+    <w:lvl w:ilvl="7" w:tplc="08090003" w:tentative="1">
+      <w:start w:val="1"/>
+      <w:numFmt w:val="bullet"/>
+      <w:lvlText w:val="o"/>
+      <w:lvlJc w:val="left"/>
+      <w:pPr>
+        <w:ind w:left="5760" w:hanging="360"/>
+      </w:pPr>
+      <w:rPr>
+        <w:rFonts w:ascii="Courier New" w:hAnsi="Courier New" w:cs="Courier New" w:hint="default"/>
+      </w:rPr>
+    </w:lvl>
+    <w:lvl w:ilvl="8" w:tplc="08090005" w:tentative="1">
+      <w:start w:val="1"/>
+      <w:numFmt w:val="bullet"/>
+      <w:lvlText w:val=""/>
+      <w:lvlJc w:val="left"/>
+      <w:pPr>
+        <w:ind w:left="6480" w:hanging="360"/>
+      </w:pPr>
+      <w:rPr>
+        <w:rFonts w:ascii="Wingdings" w:hAnsi="Wingdings" w:hint="default"/>
+      </w:rPr>
+    </w:lvl>
+  </w:abstractNum>
+  <w:abstractNum w:abstractNumId="1" w15:restartNumberingAfterBreak="0">
+    <w:nsid w:val="48ED6DAD"/>
+    <w:multiLevelType w:val="hybridMultilevel"/>
+    <w:tmpl w:val="C3C28CAE"/>
+    <w:lvl w:ilvl="0" w:tplc="08090001">
+      <w:start w:val="1"/>
+      <w:numFmt w:val="bullet"/>
+      <w:lvlText w:val=""/>
+      <w:lvlJc w:val="left"/>
+      <w:pPr>
+        <w:ind w:left="720" w:hanging="360"/>
+      </w:pPr>
+      <w:rPr>
+        <w:rFonts w:ascii="Symbol" w:hAnsi="Symbol" w:hint="default"/>
+      </w:rPr>
+    </w:lvl>
+    <w:lvl w:ilvl="1" w:tplc="08090003" w:tentative="1">
+      <w:start w:val="1"/>
+      <w:numFmt w:val="bullet"/>
+      <w:lvlText w:val="o"/>
+      <w:lvlJc w:val="left"/>
+      <w:pPr>
+        <w:ind w:left="1440" w:hanging="360"/>
+      </w:pPr>
+      <w:rPr>
+        <w:rFonts w:ascii="Courier New" w:hAnsi="Courier New" w:cs="Courier New" w:hint="default"/>
+      </w:rPr>
+    </w:lvl>
+    <w:lvl w:ilvl="2" w:tplc="08090005" w:tentative="1">
+      <w:start w:val="1"/>
+      <w:numFmt w:val="bullet"/>
+      <w:lvlText w:val=""/>
+      <w:lvlJc w:val="left"/>
+      <w:pPr>
+        <w:ind w:left="2160" w:hanging="360"/>
+      </w:pPr>
+      <w:rPr>
+        <w:rFonts w:ascii="Wingdings" w:hAnsi="Wingdings" w:hint="default"/>
+      </w:rPr>
+    </w:lvl>
+    <w:lvl w:ilvl="3" w:tplc="08090001" w:tentative="1">
+      <w:start w:val="1"/>
+      <w:numFmt w:val="bullet"/>
+      <w:lvlText w:val=""/>
+      <w:lvlJc w:val="left"/>
+      <w:pPr>
+        <w:ind w:left="2880" w:hanging="360"/>
+      </w:pPr>
+      <w:rPr>
+        <w:rFonts w:ascii="Symbol" w:hAnsi="Symbol" w:hint="default"/>
+      </w:rPr>
+    </w:lvl>
+    <w:lvl w:ilvl="4" w:tplc="08090003" w:tentative="1">
+      <w:start w:val="1"/>
+      <w:numFmt w:val="bullet"/>
+      <w:lvlText w:val="o"/>
+      <w:lvlJc w:val="left"/>
+      <w:pPr>
+        <w:ind w:left="3600" w:hanging="360"/>
+      </w:pPr>
+      <w:rPr>
+        <w:rFonts w:ascii="Courier New" w:hAnsi="Courier New" w:cs="Courier New" w:hint="default"/>
+      </w:rPr>
+    </w:lvl>
+    <w:lvl w:ilvl="5" w:tplc="08090005" w:tentative="1">
+      <w:start w:val="1"/>
+      <w:numFmt w:val="bullet"/>
+      <w:lvlText w:val=""/>
+      <w:lvlJc w:val="left"/>
+      <w:pPr>
+        <w:ind w:left="4320" w:hanging="360"/>
+      </w:pPr>
+      <w:rPr>
+        <w:rFonts w:ascii="Wingdings" w:hAnsi="Wingdings" w:hint="default"/>
+      </w:rPr>
+    </w:lvl>
+    <w:lvl w:ilvl="6" w:tplc="08090001" w:tentative="1">
+      <w:start w:val="1"/>
+      <w:numFmt w:val="bullet"/>
+      <w:lvlText w:val=""/>
+      <w:lvlJc w:val="left"/>
+      <w:pPr>
+        <w:ind w:left="5040" w:hanging="360"/>
+      </w:pPr>
+      <w:rPr>
+        <w:rFonts w:ascii="Symbol" w:hAnsi="Symbol" w:hint="default"/>
+      </w:rPr>
+    </w:lvl>
+    <w:lvl w:ilvl="7" w:tplc="08090003" w:tentative="1">
+      <w:start w:val="1"/>
+      <w:numFmt w:val="bullet"/>
+      <w:lvlText w:val="o"/>
+      <w:lvlJc w:val="left"/>
+      <w:pPr>
+        <w:ind w:left="5760" w:hanging="360"/>
+      </w:pPr>
+      <w:rPr>
+        <w:rFonts w:ascii="Courier New" w:hAnsi="Courier New" w:cs="Courier New" w:hint="default"/>
+      </w:rPr>
+    </w:lvl>
+    <w:lvl w:ilvl="8" w:tplc="08090005" w:tentative="1">
+      <w:start w:val="1"/>
+      <w:numFmt w:val="bullet"/>
+      <w:lvlText w:val=""/>
+      <w:lvlJc w:val="left"/>
+      <w:pPr>
+        <w:ind w:left="6480" w:hanging="360"/>
+      </w:pPr>
+      <w:rPr>
+        <w:rFonts w:ascii="Wingdings" w:hAnsi="Wingdings" w:hint="default"/>
+      </w:rPr>
+    </w:lvl>
+  </w:abstractNum>
+  <w:abstractNum w:abstractNumId="2" w15:restartNumberingAfterBreak="0">
+    <w:nsid w:val="61E43B5D"/>
+    <w:multiLevelType w:val="hybridMultilevel"/>
+    <w:tmpl w:val="25D4998C"/>
+    <w:lvl w:ilvl="0" w:tplc="08090001">
+      <w:start w:val="1"/>
+      <w:numFmt w:val="bullet"/>
+      <w:lvlText w:val=""/>
+      <w:lvlJc w:val="left"/>
+      <w:pPr>
+        <w:ind w:left="720" w:hanging="360"/>
+      </w:pPr>
+      <w:rPr>
+        <w:rFonts w:ascii="Symbol" w:hAnsi="Symbol" w:hint="default"/>
+      </w:rPr>
+    </w:lvl>
+    <w:lvl w:ilvl="1" w:tplc="08090003" w:tentative="1">
+      <w:start w:val="1"/>
+      <w:numFmt w:val="bullet"/>
+      <w:lvlText w:val="o"/>
+      <w:lvlJc w:val="left"/>
+      <w:pPr>
+        <w:ind w:left="1440" w:hanging="360"/>
+      </w:pPr>
+      <w:rPr>
+        <w:rFonts w:ascii="Courier New" w:hAnsi="Courier New" w:cs="Courier New" w:hint="default"/>
+      </w:rPr>
+    </w:lvl>
+    <w:lvl w:ilvl="2" w:tplc="08090005" w:tentative="1">
+      <w:start w:val="1"/>
+      <w:numFmt w:val="bullet"/>
+      <w:lvlText w:val=""/>
+      <w:lvlJc w:val="left"/>
+      <w:pPr>
+        <w:ind w:left="2160" w:hanging="360"/>
+      </w:pPr>
+      <w:rPr>
+        <w:rFonts w:ascii="Wingdings" w:hAnsi="Wingdings" w:hint="default"/>
+      </w:rPr>
+    </w:lvl>
+    <w:lvl w:ilvl="3" w:tplc="08090001" w:tentative="1">
+      <w:start w:val="1"/>
+      <w:numFmt w:val="bullet"/>
+      <w:lvlText w:val=""/>
+      <w:lvlJc w:val="left"/>
+      <w:pPr>
+        <w:ind w:left="2880" w:hanging="360"/>
+      </w:pPr>
+      <w:rPr>
+        <w:rFonts w:ascii="Symbol" w:hAnsi="Symbol" w:hint="default"/>
+      </w:rPr>
+    </w:lvl>
+    <w:lvl w:ilvl="4" w:tplc="08090003" w:tentative="1">
+      <w:start w:val="1"/>
+      <w:numFmt w:val="bullet"/>
+      <w:lvlText w:val="o"/>
+      <w:lvlJc w:val="left"/>
+      <w:pPr>
+        <w:ind w:left="3600" w:hanging="360"/>
+      </w:pPr>
+      <w:rPr>
+        <w:rFonts w:ascii="Courier New" w:hAnsi="Courier New" w:cs="Courier New" w:hint="default"/>
+      </w:rPr>
+    </w:lvl>
+    <w:lvl w:ilvl="5" w:tplc="08090005" w:tentative="1">
+      <w:start w:val="1"/>
+      <w:numFmt w:val="bullet"/>
+      <w:lvlText w:val=""/>
+      <w:lvlJc w:val="left"/>
+      <w:pPr>
+        <w:ind w:left="4320" w:hanging="360"/>
+      </w:pPr>
+      <w:rPr>
+        <w:rFonts w:ascii="Wingdings" w:hAnsi="Wingdings" w:hint="default"/>
+      </w:rPr>
+    </w:lvl>
+    <w:lvl w:ilvl="6" w:tplc="08090001" w:tentative="1">
+      <w:start w:val="1"/>
+      <w:numFmt w:val="bullet"/>
+      <w:lvlText w:val=""/>
+      <w:lvlJc w:val="left"/>
+      <w:pPr>
+        <w:ind w:left="5040" w:hanging="360"/>
+      </w:pPr>
+      <w:rPr>
+        <w:rFonts w:ascii="Symbol" w:hAnsi="Symbol" w:hint="default"/>
+      </w:rPr>
+    </w:lvl>
+    <w:lvl w:ilvl="7" w:tplc="08090003" w:tentative="1">
+      <w:start w:val="1"/>
+      <w:numFmt w:val="bullet"/>
+      <w:lvlText w:val="o"/>
+      <w:lvlJc w:val="left"/>
+      <w:pPr>
+        <w:ind w:left="5760" w:hanging="360"/>
+      </w:pPr>
+      <w:rPr>
+        <w:rFonts w:ascii="Courier New" w:hAnsi="Courier New" w:cs="Courier New" w:hint="default"/>
+      </w:rPr>
+    </w:lvl>
+    <w:lvl w:ilvl="8" w:tplc="08090005" w:tentative="1">
+      <w:start w:val="1"/>
+      <w:numFmt w:val="bullet"/>
+      <w:lvlText w:val=""/>
+      <w:lvlJc w:val="left"/>
+      <w:pPr>
+        <w:ind w:left="6480" w:hanging="360"/>
+      </w:pPr>
+      <w:rPr>
+        <w:rFonts w:ascii="Wingdings" w:hAnsi="Wingdings" w:hint="default"/>
+      </w:rPr>
+    </w:lvl>
+  </w:abstractNum>
+  <w:abstractNum w:abstractNumId="3" w15:restartNumberingAfterBreak="0">
     <w:nsid w:val="70AD6332"/>
     <w:multiLevelType w:val="hybridMultilevel"/>
     <w:tmpl w:val="6264F84C"/>
@@ -11390,10 +10948,19 @@
     </w:lvl>
   </w:abstractNum>
   <w:num w:numId="1" w16cid:durableId="1710758973">
-    <w:abstractNumId w:val="0"/>
+    <w:abstractNumId w:val="3"/>
     <w:lvlOverride w:ilvl="0">
       <w:startOverride w:val="1"/>
     </w:lvlOverride>
+  </w:num>
+  <w:num w:numId="2" w16cid:durableId="2030911079">
+    <w:abstractNumId w:val="1"/>
+  </w:num>
+  <w:num w:numId="3" w16cid:durableId="1104181113">
+    <w:abstractNumId w:val="0"/>
+  </w:num>
+  <w:num w:numId="4" w16cid:durableId="1058045899">
+    <w:abstractNumId w:val="2"/>
   </w:num>
 </w:numbering>
 </file>
@@ -11878,7 +11445,6 @@
   <w:style w:type="character" w:default="1" w:styleId="DefaultParagraphFont">
     <w:name w:val="Default Paragraph Font"/>
     <w:uiPriority w:val="1"/>
-    <w:semiHidden/>
     <w:unhideWhenUsed/>
   </w:style>
   <w:style w:type="table" w:default="1" w:styleId="TableNormal">

</xml_diff>

<commit_message>
fix: Task 6 cells sequence
</commit_message>
<xml_diff>
--- a/Assessment2-Report.docx
+++ b/Assessment2-Report.docx
@@ -226,11 +226,19 @@
                 <w:lang w:val="en-GB"/>
               </w:rPr>
             </w:pPr>
+            <w:proofErr w:type="spellStart"/>
             <w:r>
               <w:rPr>
                 <w:rFonts w:eastAsia="SimSun" w:cs="Mangal"/>
               </w:rPr>
-              <w:t>Minchul Kim</w:t>
+              <w:t>Minchul</w:t>
+            </w:r>
+            <w:proofErr w:type="spellEnd"/>
+            <w:r>
+              <w:rPr>
+                <w:rFonts w:eastAsia="SimSun" w:cs="Mangal"/>
+              </w:rPr>
+              <w:t xml:space="preserve"> Kim</w:t>
             </w:r>
           </w:p>
         </w:tc>
@@ -379,12 +387,21 @@
                 <w:lang w:val="en-GB" w:eastAsia="en-IN" w:bidi="mr-IN"/>
               </w:rPr>
             </w:pPr>
+            <w:proofErr w:type="spellStart"/>
             <w:r>
               <w:rPr>
                 <w:rFonts w:eastAsia="SimSun" w:cs="Mangal"/>
                 <w:lang w:val="en-GB" w:eastAsia="en-IN" w:bidi="mr-IN"/>
               </w:rPr>
-              <w:t>Minchul Kim</w:t>
+              <w:t>Minchul</w:t>
+            </w:r>
+            <w:proofErr w:type="spellEnd"/>
+            <w:r>
+              <w:rPr>
+                <w:rFonts w:eastAsia="SimSun" w:cs="Mangal"/>
+                <w:lang w:val="en-GB" w:eastAsia="en-IN" w:bidi="mr-IN"/>
+              </w:rPr>
+              <w:t xml:space="preserve"> Kim</w:t>
             </w:r>
           </w:p>
         </w:tc>
@@ -654,19 +671,7 @@
         <w:rPr>
           <w:lang w:val="en-GB"/>
         </w:rPr>
-        <w:t xml:space="preserve">mentions, and hashtags were stripped from the raw tweets during preprocessing (verified: 0 of the 2,500 tweets in the dataset contain a URL, @mention, or hashtag). Emojis and other symbols were not explicitly </w:t>
-      </w:r>
-      <w:r>
-        <w:rPr>
-          <w:lang w:val="en-GB"/>
-        </w:rPr>
-        <w:t>removed but</w:t>
-      </w:r>
-      <w:r>
-        <w:rPr>
-          <w:lang w:val="en-GB"/>
-        </w:rPr>
-        <w:t xml:space="preserve"> are effectively excluded from the TF-IDF feature space since the default tokenizer only extracts alphanumeric word tokens. Slang terms (e.g. "lol", "omg", "idk") were left unmodified and are treated as ordinary vocabulary.</w:t>
+        <w:t>mentions, and hashtags were stripped from the raw tweets during preprocessing (verified: 0 of the 2,500 tweets in the dataset contain a URL, @mention, or hashtag). Emojis and other symbols were not explicitly removed but are effectively excluded from the TF-IDF feature space since the default tokenizer only extracts alphanumeric word tokens. Slang terms (e.g. "lol", "omg", "idk") were left unmodified and are treated as ordinary vocabulary.</w:t>
       </w:r>
     </w:p>
     <w:p>
@@ -686,14 +691,7 @@
           <w:b/>
           <w:bCs/>
         </w:rPr>
-        <w:t xml:space="preserve">TF-IDF </w:t>
-      </w:r>
-      <w:r>
-        <w:rPr>
-          <w:b/>
-          <w:bCs/>
-        </w:rPr>
-        <w:t>vectorization</w:t>
+        <w:t>TF-IDF vectorization</w:t>
       </w:r>
       <w:r>
         <w:t>:</w:t>
@@ -731,14 +729,7 @@
           <w:b/>
           <w:bCs/>
         </w:rPr>
-        <w:t>Standardization</w:t>
-      </w:r>
-      <w:r>
-        <w:rPr>
-          <w:b/>
-          <w:bCs/>
-        </w:rPr>
-        <w:t xml:space="preserve"> </w:t>
+        <w:t xml:space="preserve">Standardization </w:t>
       </w:r>
       <w:r>
         <w:t>(</w:t>
@@ -904,6 +895,7 @@
         <w:rPr>
           <w:i/>
           <w:iCs/>
+          <w:noProof/>
           <w:sz w:val="18"/>
           <w:szCs w:val="18"/>
         </w:rPr>
@@ -979,15 +971,7 @@
           <w:bCs/>
           <w:lang w:val="en-GB"/>
         </w:rPr>
-        <w:t>Observation:</w:t>
-      </w:r>
-      <w:r>
-        <w:rPr>
-          <w:b/>
-          <w:bCs/>
-          <w:lang w:val="en-GB"/>
-        </w:rPr>
-        <w:t xml:space="preserve"> </w:t>
+        <w:t xml:space="preserve">Observation: </w:t>
       </w:r>
       <w:r>
         <w:rPr>
@@ -1145,6 +1129,9 @@
         <w:jc w:val="center"/>
       </w:pPr>
       <w:r>
+        <w:rPr>
+          <w:noProof/>
+        </w:rPr>
         <w:drawing>
           <wp:inline distT="0" distB="0" distL="0" distR="0" wp14:anchorId="763414C0" wp14:editId="470CFFC3">
             <wp:extent cx="8172450" cy="4514850"/>
@@ -1199,15 +1186,7 @@
           <w:bCs/>
           <w:lang w:val="en-GB"/>
         </w:rPr>
-        <w:t>Determining Optimal Components:</w:t>
-      </w:r>
-      <w:r>
-        <w:rPr>
-          <w:b/>
-          <w:bCs/>
-          <w:lang w:val="en-GB"/>
-        </w:rPr>
-        <w:t xml:space="preserve"> </w:t>
+        <w:t xml:space="preserve">Determining Optimal Components: </w:t>
       </w:r>
       <w:r>
         <w:rPr>
@@ -1297,15 +1276,7 @@
           <w:bCs/>
           <w:lang w:val="en-GB"/>
         </w:rPr>
-        <w:t>Top 5 Components Analysis:</w:t>
-      </w:r>
-      <w:r>
-        <w:rPr>
-          <w:b/>
-          <w:bCs/>
-          <w:lang w:val="en-GB"/>
-        </w:rPr>
-        <w:t xml:space="preserve"> </w:t>
+        <w:t xml:space="preserve">Top 5 Components Analysis: </w:t>
       </w:r>
       <w:r>
         <w:rPr>
@@ -1325,19 +1296,7 @@
         <w:rPr>
           <w:lang w:val="en-GB"/>
         </w:rPr>
-        <w:t xml:space="preserve"> of the total variance. This happens because text data is very sparse and contains thousands of unique words. No single topic or word dominates the entire dataset, so variance is spread thinly across many components, and </w:t>
-      </w:r>
-      <w:r>
-        <w:rPr>
-          <w:lang w:val="en-GB"/>
-        </w:rPr>
-        <w:t>many</w:t>
-      </w:r>
-      <w:r>
-        <w:rPr>
-          <w:lang w:val="en-GB"/>
-        </w:rPr>
-        <w:t xml:space="preserve"> components is needed to retain most of the information — a direct illustration of why dimensionality reduction for sparse text data is more difficult than for dense, structured data.</w:t>
+        <w:t xml:space="preserve"> of the total variance. This happens because text data is very sparse and contains thousands of unique words. No single topic or word dominates the entire dataset, so variance is spread thinly across many components, and many components is needed to retain most of the information — a direct illustration of why dimensionality reduction for sparse text data is more difficult than for dense, structured data.</w:t>
       </w:r>
     </w:p>
     <w:p>
@@ -1858,10 +1817,7 @@
         <w:spacing w:after="150"/>
       </w:pPr>
       <w:r>
-        <w:t xml:space="preserve">Optimal </w:t>
-      </w:r>
-      <w:r>
-        <w:t xml:space="preserve">Perplexity value selected: </w:t>
+        <w:t xml:space="preserve">Optimal Perplexity value selected: </w:t>
       </w:r>
       <w:r>
         <w:rPr>
@@ -1930,6 +1886,80 @@
       </w:r>
       <w:r>
         <w:t xml:space="preserve"> structure more faithfully than 1 or 2 components.</w:t>
+      </w:r>
+    </w:p>
+    <w:p>
+      <w:pPr>
+        <w:spacing w:after="150"/>
+        <w:jc w:val="center"/>
+        <w:rPr>
+          <w:i/>
+          <w:iCs/>
+        </w:rPr>
+      </w:pPr>
+      <w:r>
+        <w:rPr>
+          <w:i/>
+          <w:iCs/>
+        </w:rPr>
+        <w:t>Figure 6.</w:t>
+      </w:r>
+      <w:r>
+        <w:rPr>
+          <w:i/>
+          <w:iCs/>
+        </w:rPr>
+        <w:t>3</w:t>
+      </w:r>
+      <w:r>
+        <w:rPr>
+          <w:i/>
+          <w:iCs/>
+        </w:rPr>
+        <w:t>: KL Divergence vs perplexity</w:t>
+      </w:r>
+    </w:p>
+    <w:p>
+      <w:pPr>
+        <w:spacing w:after="150"/>
+        <w:jc w:val="center"/>
+      </w:pPr>
+      <w:r>
+        <w:drawing>
+          <wp:inline distT="0" distB="0" distL="0" distR="0" wp14:anchorId="1AB703E3" wp14:editId="7A1CD276">
+            <wp:extent cx="6696075" cy="4514850"/>
+            <wp:effectExtent l="0" t="0" r="9525" b="0"/>
+            <wp:docPr id="316594456" name="Picture 1"/>
+            <wp:cNvGraphicFramePr>
+              <a:graphicFrameLocks xmlns:a="http://schemas.openxmlformats.org/drawingml/2006/main" noChangeAspect="1"/>
+            </wp:cNvGraphicFramePr>
+            <a:graphic xmlns:a="http://schemas.openxmlformats.org/drawingml/2006/main">
+              <a:graphicData uri="http://schemas.openxmlformats.org/drawingml/2006/picture">
+                <pic:pic xmlns:pic="http://schemas.openxmlformats.org/drawingml/2006/picture">
+                  <pic:nvPicPr>
+                    <pic:cNvPr id="316594456" name=""/>
+                    <pic:cNvPicPr/>
+                  </pic:nvPicPr>
+                  <pic:blipFill>
+                    <a:blip r:embed="rId8"/>
+                    <a:stretch>
+                      <a:fillRect/>
+                    </a:stretch>
+                  </pic:blipFill>
+                  <pic:spPr>
+                    <a:xfrm>
+                      <a:off x="0" y="0"/>
+                      <a:ext cx="6696075" cy="4514850"/>
+                    </a:xfrm>
+                    <a:prstGeom prst="rect">
+                      <a:avLst/>
+                    </a:prstGeom>
+                  </pic:spPr>
+                </pic:pic>
+              </a:graphicData>
+            </a:graphic>
+          </wp:inline>
+        </w:drawing>
       </w:r>
     </w:p>
     <w:p>
@@ -1965,7 +1995,61 @@
           <w:sz w:val="18"/>
           <w:szCs w:val="18"/>
         </w:rPr>
-        <w:t>Figure 6.3: PCA (left) vs. t-SNE (right) — top 3 components, coloured by relevance label (0 = Irrelevant, 1 = Relevant).</w:t>
+        <w:t>Figure 6.</w:t>
+      </w:r>
+      <w:r>
+        <w:rPr>
+          <w:i/>
+          <w:iCs/>
+          <w:sz w:val="18"/>
+          <w:szCs w:val="18"/>
+        </w:rPr>
+        <w:t>4</w:t>
+      </w:r>
+      <w:r>
+        <w:rPr>
+          <w:i/>
+          <w:iCs/>
+          <w:sz w:val="18"/>
+          <w:szCs w:val="18"/>
+        </w:rPr>
+        <w:t>: PCA (left) vs. t-SNE (</w:t>
+      </w:r>
+      <w:r>
+        <w:rPr>
+          <w:i/>
+          <w:iCs/>
+          <w:sz w:val="18"/>
+          <w:szCs w:val="18"/>
+        </w:rPr>
+        <w:t>right):</w:t>
+      </w:r>
+      <w:r>
+        <w:rPr>
+          <w:i/>
+          <w:iCs/>
+          <w:sz w:val="18"/>
+          <w:szCs w:val="18"/>
+        </w:rPr>
+        <w:t xml:space="preserve"> top 3 components, </w:t>
+      </w:r>
+      <w:r>
+        <w:rPr>
+          <w:i/>
+          <w:iCs/>
+          <w:sz w:val="18"/>
+          <w:szCs w:val="18"/>
+        </w:rPr>
+        <w:t>colored</w:t>
+      </w:r>
+      <w:r>
+        <w:rPr>
+          <w:i/>
+          <w:iCs/>
+          <w:sz w:val="18"/>
+          <w:szCs w:val="18"/>
+        </w:rPr>
+        <w:t xml:space="preserve"> by relevance label (0 = Irrelevant, 1 = Relevant).</w:t>
       </w:r>
     </w:p>
     <w:p>
@@ -1974,6 +2058,9 @@
         <w:jc w:val="center"/>
       </w:pPr>
       <w:r>
+        <w:rPr>
+          <w:noProof/>
+        </w:rPr>
         <w:drawing>
           <wp:inline distT="0" distB="0" distL="0" distR="0" wp14:anchorId="68B07422" wp14:editId="54642819">
             <wp:extent cx="10868025" cy="4705350"/>
@@ -1990,7 +2077,7 @@
                     <pic:cNvPicPr/>
                   </pic:nvPicPr>
                   <pic:blipFill>
-                    <a:blip r:embed="rId8"/>
+                    <a:blip r:embed="rId9"/>
                     <a:stretch>
                       <a:fillRect/>
                     </a:stretch>
@@ -2052,7 +2139,21 @@
         <w:rPr>
           <w:lang w:val="en-GB"/>
         </w:rPr>
-        <w:t>The 3D plot shows one big, crowded cloud centered in the middle. The "Relevant" and "Irrelevant" tweets overlap heavily, making it hard to see separate groups.</w:t>
+        <w:t xml:space="preserve">The 3D plot shows one big, crowded cloud </w:t>
+      </w:r>
+      <w:proofErr w:type="spellStart"/>
+      <w:r>
+        <w:rPr>
+          <w:lang w:val="en-GB"/>
+        </w:rPr>
+        <w:t>centered</w:t>
+      </w:r>
+      <w:proofErr w:type="spellEnd"/>
+      <w:r>
+        <w:rPr>
+          <w:lang w:val="en-GB"/>
+        </w:rPr>
+        <w:t xml:space="preserve"> in the middle. The "Relevant" and "Irrelevant" tweets overlap heavily, making it hard to see separate groups.</w:t>
       </w:r>
     </w:p>
     <w:p>
@@ -2200,7 +2301,39 @@
         <w:spacing w:after="80"/>
       </w:pPr>
       <w:r>
-        <w:t>Missing value handling: rows containing missing values were dropped, resulting in a clean dataset of 41,409 records across the four numeric attributes (VehOdo, MMRAcquisitionAuctionAveragePrice, WarrantyCost, IsBadBuy). This prevents distance calculation errors, since Euclidean distance is undefined when a feature value is missing.</w:t>
+        <w:t>Missing value handling: rows containing missing values were dropped, resulting in a clean dataset of 41,409 records across the four numeric attributes (</w:t>
+      </w:r>
+      <w:proofErr w:type="spellStart"/>
+      <w:r>
+        <w:t>VehOdo</w:t>
+      </w:r>
+      <w:proofErr w:type="spellEnd"/>
+      <w:r>
+        <w:t xml:space="preserve">, </w:t>
+      </w:r>
+      <w:proofErr w:type="spellStart"/>
+      <w:r>
+        <w:t>MMRAcquisitionAuctionAveragePrice</w:t>
+      </w:r>
+      <w:proofErr w:type="spellEnd"/>
+      <w:r>
+        <w:t xml:space="preserve">, </w:t>
+      </w:r>
+      <w:proofErr w:type="spellStart"/>
+      <w:r>
+        <w:t>WarrantyCost</w:t>
+      </w:r>
+      <w:proofErr w:type="spellEnd"/>
+      <w:r>
+        <w:t xml:space="preserve">, </w:t>
+      </w:r>
+      <w:proofErr w:type="spellStart"/>
+      <w:r>
+        <w:t>IsBadBuy</w:t>
+      </w:r>
+      <w:proofErr w:type="spellEnd"/>
+      <w:r>
+        <w:t>). This prevents distance calculation errors, since Euclidean distance is undefined when a feature value is missing.</w:t>
       </w:r>
     </w:p>
     <w:p>
@@ -2213,16 +2346,31 @@
         <w:spacing w:after="80"/>
       </w:pPr>
       <w:r>
-        <w:t>Standardization</w:t>
-      </w:r>
-      <w:r>
-        <w:t xml:space="preserve"> (StandardScaler): K-Means relies on Euclidean distance, and the raw scales of the four attributes differ by orders of magnitude — VehOdo is measured in tens of thousands while WarrantyCost is in the hundreds. Without </w:t>
-      </w:r>
-      <w:r>
-        <w:t>standardization</w:t>
-      </w:r>
-      <w:r>
-        <w:t>, VehOdo would dominate the distance calculation purely because of its scale, not because it is more informative. StandardScaler rescales every feature to zero mean and unit variance, giving each variable equal weight in the clustering.</w:t>
+        <w:t xml:space="preserve">Standardization (StandardScaler): K-Means relies on Euclidean distance, and the raw scales of the four attributes differ by orders of magnitude — </w:t>
+      </w:r>
+      <w:proofErr w:type="spellStart"/>
+      <w:r>
+        <w:t>VehOdo</w:t>
+      </w:r>
+      <w:proofErr w:type="spellEnd"/>
+      <w:r>
+        <w:t xml:space="preserve"> is measured in tens of thousands while </w:t>
+      </w:r>
+      <w:proofErr w:type="spellStart"/>
+      <w:r>
+        <w:t>WarrantyCost</w:t>
+      </w:r>
+      <w:proofErr w:type="spellEnd"/>
+      <w:r>
+        <w:t xml:space="preserve"> is in the hundreds. Without standardization, </w:t>
+      </w:r>
+      <w:proofErr w:type="spellStart"/>
+      <w:r>
+        <w:t>VehOdo</w:t>
+      </w:r>
+      <w:proofErr w:type="spellEnd"/>
+      <w:r>
+        <w:t xml:space="preserve"> would dominate the distance calculation purely because of its scale, not because it is more informative. StandardScaler rescales every feature to zero mean and unit variance, giving each variable equal weight in the clustering.</w:t>
       </w:r>
     </w:p>
     <w:p>
@@ -2256,8 +2404,37 @@
         <w:spacing w:after="150"/>
       </w:pPr>
       <w:r>
-        <w:t>Attributes used: VehOdo, MMRAcquisitionAuctionAveragePrice, WarrantyCost, IsBadBuy</w:t>
-      </w:r>
+        <w:t xml:space="preserve">Attributes used: </w:t>
+      </w:r>
+      <w:proofErr w:type="spellStart"/>
+      <w:r>
+        <w:t>VehOdo</w:t>
+      </w:r>
+      <w:proofErr w:type="spellEnd"/>
+      <w:r>
+        <w:t xml:space="preserve">, </w:t>
+      </w:r>
+      <w:proofErr w:type="spellStart"/>
+      <w:r>
+        <w:t>MMRAcquisitionAuctionAveragePrice</w:t>
+      </w:r>
+      <w:proofErr w:type="spellEnd"/>
+      <w:r>
+        <w:t xml:space="preserve">, </w:t>
+      </w:r>
+      <w:proofErr w:type="spellStart"/>
+      <w:r>
+        <w:t>WarrantyCost</w:t>
+      </w:r>
+      <w:proofErr w:type="spellEnd"/>
+      <w:r>
+        <w:t xml:space="preserve">, </w:t>
+      </w:r>
+      <w:proofErr w:type="spellStart"/>
+      <w:r>
+        <w:t>IsBadBuy</w:t>
+      </w:r>
+      <w:proofErr w:type="spellEnd"/>
     </w:p>
     <w:p>
       <w:pPr>
@@ -2303,7 +2480,7 @@
                     </pic:cNvPicPr>
                   </pic:nvPicPr>
                   <pic:blipFill>
-                    <a:blip r:embed="rId9">
+                    <a:blip r:embed="rId10">
                       <a:extLst>
                         <a:ext uri="{28A0092B-C50C-407E-A947-70E740481C1C}">
                           <a14:useLocalDpi xmlns:a14="http://schemas.microsoft.com/office/drawing/2010/main" val="0"/>
@@ -2423,6 +2600,7 @@
             </w:tcMar>
           </w:tcPr>
           <w:p>
+            <w:proofErr w:type="spellStart"/>
             <w:r>
               <w:rPr>
                 <w:b/>
@@ -2430,6 +2608,7 @@
               </w:rPr>
               <w:t>VehOdo</w:t>
             </w:r>
+            <w:proofErr w:type="spellEnd"/>
           </w:p>
         </w:tc>
         <w:tc>
@@ -2444,6 +2623,7 @@
             </w:tcMar>
           </w:tcPr>
           <w:p>
+            <w:proofErr w:type="spellStart"/>
             <w:r>
               <w:rPr>
                 <w:b/>
@@ -2451,6 +2631,7 @@
               </w:rPr>
               <w:t>AuctionAvgPrice</w:t>
             </w:r>
+            <w:proofErr w:type="spellEnd"/>
           </w:p>
         </w:tc>
         <w:tc>
@@ -2465,6 +2646,7 @@
             </w:tcMar>
           </w:tcPr>
           <w:p>
+            <w:proofErr w:type="spellStart"/>
             <w:r>
               <w:rPr>
                 <w:b/>
@@ -2472,6 +2654,7 @@
               </w:rPr>
               <w:t>WarrantyCost</w:t>
             </w:r>
+            <w:proofErr w:type="spellEnd"/>
           </w:p>
         </w:tc>
         <w:tc>
@@ -2486,12 +2669,21 @@
             </w:tcMar>
           </w:tcPr>
           <w:p>
+            <w:proofErr w:type="spellStart"/>
             <w:r>
               <w:rPr>
                 <w:b/>
                 <w:bCs/>
               </w:rPr>
-              <w:t>IsBadBuy Rate</w:t>
+              <w:t>IsBadBuy</w:t>
+            </w:r>
+            <w:proofErr w:type="spellEnd"/>
+            <w:r>
+              <w:rPr>
+                <w:b/>
+                <w:bCs/>
+              </w:rPr>
+              <w:t xml:space="preserve"> Rate</w:t>
             </w:r>
           </w:p>
         </w:tc>
@@ -2822,7 +3014,15 @@
         <w:spacing w:after="150"/>
       </w:pPr>
       <w:r>
-        <w:t>Cluster 2 stands out sharply: it has an IsBadBuy rate of exactly 1.00 (i.e., every vehicle in this cluster is a confirmed bad buy), despite having the lowest average auction price ($5,381) of the three clusters. Clusters 0 and 1 both have a 0.00 bad-buy rate but differ substantially in mileage and warranty cost — Cluster 0 vehicles have the highest mileage (80,964) and highest warranty cost ($1,571), while Cluster 1 vehicles have noticeably lower mileage (58,696) and the lowest warranty cost ($892).</w:t>
+        <w:t xml:space="preserve">Cluster 2 stands out sharply: it has an </w:t>
+      </w:r>
+      <w:proofErr w:type="spellStart"/>
+      <w:r>
+        <w:t>IsBadBuy</w:t>
+      </w:r>
+      <w:proofErr w:type="spellEnd"/>
+      <w:r>
+        <w:t xml:space="preserve"> rate of exactly 1.00 (i.e., every vehicle in this cluster is a confirmed bad buy), despite having the lowest average auction price ($5,381) of the three clusters. Clusters 0 and 1 both have a 0.00 bad-buy rate but differ substantially in mileage and warranty cost — Cluster 0 vehicles have the highest mileage (80,964) and highest warranty cost ($1,571), while Cluster 1 vehicles have noticeably lower mileage (58,696) and the lowest warranty cost ($892).</w:t>
       </w:r>
     </w:p>
     <w:p>
@@ -2851,16 +3051,31 @@
         <w:spacing w:after="150"/>
       </w:pPr>
       <w:r>
-        <w:t>Standardization</w:t>
-      </w:r>
-      <w:r>
-        <w:t xml:space="preserve"> was applied prior to clustering (Section 7.1). Without it, VehOdo (with values in the tens of thousands) would dominate the Euclidean distance calculation relative to WarrantyCost and IsBadBuy (values in the hundreds and 0/1 respectively), causing K-Means to effectively cluster on mileage alone and obscure the cost- and risk-related structure in the data. </w:t>
-      </w:r>
-      <w:r>
-        <w:t>Standardizing</w:t>
-      </w:r>
-      <w:r>
-        <w:t xml:space="preserve"> ensured that all four attributes contributed proportionally to the distance metric, allowing the resulting clusters to reflect a genuine combination of mileage, price, warranty cost, and bad-buy status rather than being dominated by a single high-magnitude variable.</w:t>
+        <w:t xml:space="preserve">Standardization was applied prior to clustering (Section 7.1). Without it, </w:t>
+      </w:r>
+      <w:proofErr w:type="spellStart"/>
+      <w:r>
+        <w:t>VehOdo</w:t>
+      </w:r>
+      <w:proofErr w:type="spellEnd"/>
+      <w:r>
+        <w:t xml:space="preserve"> (with values in the tens of thousands) would dominate the Euclidean distance calculation relative to </w:t>
+      </w:r>
+      <w:proofErr w:type="spellStart"/>
+      <w:r>
+        <w:t>WarrantyCost</w:t>
+      </w:r>
+      <w:proofErr w:type="spellEnd"/>
+      <w:r>
+        <w:t xml:space="preserve"> and </w:t>
+      </w:r>
+      <w:proofErr w:type="spellStart"/>
+      <w:r>
+        <w:t>IsBadBuy</w:t>
+      </w:r>
+      <w:proofErr w:type="spellEnd"/>
+      <w:r>
+        <w:t xml:space="preserve"> (values in the hundreds and 0/1 respectively), causing K-Means to effectively cluster on mileage alone and obscure the cost- and risk-related structure in the data. Standardizing ensured that all four attributes contributed proportionally to the distance metric, allowing the resulting clusters to reflect a genuine combination of mileage, price, warranty cost, and bad-buy status rather than being dominated by a single high-magnitude variable.</w:t>
       </w:r>
     </w:p>
     <w:p>
@@ -2917,7 +3132,7 @@
                     </pic:cNvPicPr>
                   </pic:nvPicPr>
                   <pic:blipFill>
-                    <a:blip r:embed="rId10">
+                    <a:blip r:embed="rId11">
                       <a:extLst>
                         <a:ext uri="{28A0092B-C50C-407E-A947-70E740481C1C}">
                           <a14:useLocalDpi xmlns:a14="http://schemas.microsoft.com/office/drawing/2010/main" val="0"/>
@@ -2955,7 +3170,87 @@
           <w:sz w:val="18"/>
           <w:szCs w:val="18"/>
         </w:rPr>
-        <w:t>Figure 7.2: Pairplot of VehOdo, AuctionAvgPrice, WarrantyCost by cluster (2,000-row sample).</w:t>
+        <w:t xml:space="preserve">Figure 7.2: </w:t>
+      </w:r>
+      <w:proofErr w:type="spellStart"/>
+      <w:r>
+        <w:rPr>
+          <w:i/>
+          <w:iCs/>
+          <w:sz w:val="18"/>
+          <w:szCs w:val="18"/>
+        </w:rPr>
+        <w:t>Pairplot</w:t>
+      </w:r>
+      <w:proofErr w:type="spellEnd"/>
+      <w:r>
+        <w:rPr>
+          <w:i/>
+          <w:iCs/>
+          <w:sz w:val="18"/>
+          <w:szCs w:val="18"/>
+        </w:rPr>
+        <w:t xml:space="preserve"> of </w:t>
+      </w:r>
+      <w:proofErr w:type="spellStart"/>
+      <w:r>
+        <w:rPr>
+          <w:i/>
+          <w:iCs/>
+          <w:sz w:val="18"/>
+          <w:szCs w:val="18"/>
+        </w:rPr>
+        <w:t>VehOdo</w:t>
+      </w:r>
+      <w:proofErr w:type="spellEnd"/>
+      <w:r>
+        <w:rPr>
+          <w:i/>
+          <w:iCs/>
+          <w:sz w:val="18"/>
+          <w:szCs w:val="18"/>
+        </w:rPr>
+        <w:t xml:space="preserve">, </w:t>
+      </w:r>
+      <w:proofErr w:type="spellStart"/>
+      <w:r>
+        <w:rPr>
+          <w:i/>
+          <w:iCs/>
+          <w:sz w:val="18"/>
+          <w:szCs w:val="18"/>
+        </w:rPr>
+        <w:t>AuctionAvgPrice</w:t>
+      </w:r>
+      <w:proofErr w:type="spellEnd"/>
+      <w:r>
+        <w:rPr>
+          <w:i/>
+          <w:iCs/>
+          <w:sz w:val="18"/>
+          <w:szCs w:val="18"/>
+        </w:rPr>
+        <w:t xml:space="preserve">, </w:t>
+      </w:r>
+      <w:proofErr w:type="spellStart"/>
+      <w:r>
+        <w:rPr>
+          <w:i/>
+          <w:iCs/>
+          <w:sz w:val="18"/>
+          <w:szCs w:val="18"/>
+        </w:rPr>
+        <w:t>WarrantyCost</w:t>
+      </w:r>
+      <w:proofErr w:type="spellEnd"/>
+      <w:r>
+        <w:rPr>
+          <w:i/>
+          <w:iCs/>
+          <w:sz w:val="18"/>
+          <w:szCs w:val="18"/>
+        </w:rPr>
+        <w:t xml:space="preserve"> by cluster (2,000-row sample).</w:t>
       </w:r>
     </w:p>
     <w:p>
@@ -3102,7 +3397,15 @@
           </w:tcPr>
           <w:p>
             <w:r>
-              <w:t>Average mileage and cost, but a 100% IsBadBuy rate — the definitive 'bad buys' the dealership needs to identify and avoid.</w:t>
+              <w:t xml:space="preserve">Average mileage and cost, but a 100% </w:t>
+            </w:r>
+            <w:proofErr w:type="spellStart"/>
+            <w:r>
+              <w:t>IsBadBuy</w:t>
+            </w:r>
+            <w:proofErr w:type="spellEnd"/>
+            <w:r>
+              <w:t xml:space="preserve"> rate — the definitive 'bad buys' the dealership needs to identify and avoid.</w:t>
             </w:r>
           </w:p>
         </w:tc>
@@ -3301,6 +3604,7 @@
             </w:tcMar>
           </w:tcPr>
           <w:p>
+            <w:proofErr w:type="spellStart"/>
             <w:r>
               <w:rPr>
                 <w:b/>
@@ -3308,6 +3612,7 @@
               </w:rPr>
               <w:t>VehOdo</w:t>
             </w:r>
+            <w:proofErr w:type="spellEnd"/>
           </w:p>
         </w:tc>
         <w:tc>
@@ -3343,6 +3648,7 @@
             </w:tcMar>
           </w:tcPr>
           <w:p>
+            <w:proofErr w:type="spellStart"/>
             <w:r>
               <w:rPr>
                 <w:b/>
@@ -3350,6 +3656,7 @@
               </w:rPr>
               <w:t>WarrantyCost</w:t>
             </w:r>
+            <w:proofErr w:type="spellEnd"/>
           </w:p>
         </w:tc>
         <w:tc>
@@ -3364,6 +3671,7 @@
             </w:tcMar>
           </w:tcPr>
           <w:p>
+            <w:proofErr w:type="spellStart"/>
             <w:r>
               <w:rPr>
                 <w:b/>
@@ -3371,6 +3679,7 @@
               </w:rPr>
               <w:t>IsBadBuy</w:t>
             </w:r>
+            <w:proofErr w:type="spellEnd"/>
           </w:p>
         </w:tc>
         <w:tc>
@@ -3777,7 +4086,15 @@
         <w:spacing w:before="400" w:after="200"/>
       </w:pPr>
       <w:r>
-        <w:t>Task 8: Time Series Forecasting with LSTM on the AgriWebb Dataset</w:t>
+        <w:t xml:space="preserve">Task 8: Time Series Forecasting with LSTM on the </w:t>
+      </w:r>
+      <w:proofErr w:type="spellStart"/>
+      <w:r>
+        <w:t>AgriWebb</w:t>
+      </w:r>
+      <w:proofErr w:type="spellEnd"/>
+      <w:r>
+        <w:t xml:space="preserve"> Dataset</w:t>
       </w:r>
     </w:p>
     <w:p>
@@ -3850,7 +4167,63 @@
         <w:spacing w:after="150"/>
       </w:pPr>
       <w:r>
-        <w:t>Architecture: SequenceLSTM with num_features = 1 (TSDM only), hidden_size = 16, num_layers = 2, output_size = 5 (forecast_horizon), dropout = 0.2 (PyTorch default in the model class, applied between LSTM layers and before the final linear layer).</w:t>
+        <w:t xml:space="preserve">Architecture: </w:t>
+      </w:r>
+      <w:proofErr w:type="spellStart"/>
+      <w:r>
+        <w:t>SequenceLSTM</w:t>
+      </w:r>
+      <w:proofErr w:type="spellEnd"/>
+      <w:r>
+        <w:t xml:space="preserve"> with </w:t>
+      </w:r>
+      <w:proofErr w:type="spellStart"/>
+      <w:r>
+        <w:t>num_features</w:t>
+      </w:r>
+      <w:proofErr w:type="spellEnd"/>
+      <w:r>
+        <w:t xml:space="preserve"> = 1 (TSDM only), </w:t>
+      </w:r>
+      <w:proofErr w:type="spellStart"/>
+      <w:r>
+        <w:t>hidden_size</w:t>
+      </w:r>
+      <w:proofErr w:type="spellEnd"/>
+      <w:r>
+        <w:t xml:space="preserve"> = 16, </w:t>
+      </w:r>
+      <w:proofErr w:type="spellStart"/>
+      <w:r>
+        <w:t>num_layers</w:t>
+      </w:r>
+      <w:proofErr w:type="spellEnd"/>
+      <w:r>
+        <w:t xml:space="preserve"> = 2, </w:t>
+      </w:r>
+      <w:proofErr w:type="spellStart"/>
+      <w:r>
+        <w:t>output_size</w:t>
+      </w:r>
+      <w:proofErr w:type="spellEnd"/>
+      <w:r>
+        <w:t xml:space="preserve"> = 5 (</w:t>
+      </w:r>
+      <w:proofErr w:type="spellStart"/>
+      <w:r>
+        <w:t>forecast_horizon</w:t>
+      </w:r>
+      <w:proofErr w:type="spellEnd"/>
+      <w:r>
+        <w:t>), dropout = 0.2 (</w:t>
+      </w:r>
+      <w:proofErr w:type="spellStart"/>
+      <w:r>
+        <w:t>PyTorch</w:t>
+      </w:r>
+      <w:proofErr w:type="spellEnd"/>
+      <w:r>
+        <w:t xml:space="preserve"> default in the model class, applied between LSTM layers and before the final linear layer).</w:t>
       </w:r>
     </w:p>
     <w:p>
@@ -3872,7 +4245,23 @@
         <w:spacing w:after="150"/>
       </w:pPr>
       <w:r>
-        <w:t>Hyperparameter selection: hidden_size and num_layers were set based on standard practice for small univariate sequence problems (a small hidden layer size relative to the very short 5-step lookback avoids over-</w:t>
+        <w:t xml:space="preserve">Hyperparameter selection: </w:t>
+      </w:r>
+      <w:proofErr w:type="spellStart"/>
+      <w:r>
+        <w:t>hidden_size</w:t>
+      </w:r>
+      <w:proofErr w:type="spellEnd"/>
+      <w:r>
+        <w:t xml:space="preserve"> and </w:t>
+      </w:r>
+      <w:proofErr w:type="spellStart"/>
+      <w:r>
+        <w:t>num_layers</w:t>
+      </w:r>
+      <w:proofErr w:type="spellEnd"/>
+      <w:r>
+        <w:t xml:space="preserve"> were set based on standard practice for small univariate sequence problems (a small hidden layer size relative to the very short 5-step lookback avoids over-</w:t>
       </w:r>
       <w:r>
         <w:t>parameterizing</w:t>
@@ -4006,7 +4395,15 @@
           </w:tcPr>
           <w:p>
             <w:r>
-              <w:t>0.7007 (standardised)</w:t>
+              <w:t>0.7007 (</w:t>
+            </w:r>
+            <w:proofErr w:type="spellStart"/>
+            <w:r>
+              <w:t>standardised</w:t>
+            </w:r>
+            <w:proofErr w:type="spellEnd"/>
+            <w:r>
+              <w:t>)</w:t>
             </w:r>
           </w:p>
         </w:tc>
@@ -4459,661 +4856,6 @@
                 <pic:pic xmlns:pic="http://schemas.openxmlformats.org/drawingml/2006/picture">
                   <pic:nvPicPr>
                     <pic:cNvPr id="0" name="Picture 11"/>
-                    <pic:cNvPicPr>
-                      <a:picLocks noChangeAspect="1" noChangeArrowheads="1"/>
-                    </pic:cNvPicPr>
-                  </pic:nvPicPr>
-                  <pic:blipFill>
-                    <a:blip r:embed="rId11">
-                      <a:extLst>
-                        <a:ext uri="{28A0092B-C50C-407E-A947-70E740481C1C}">
-                          <a14:useLocalDpi xmlns:a14="http://schemas.microsoft.com/office/drawing/2010/main" val="0"/>
-                        </a:ext>
-                      </a:extLst>
-                    </a:blip>
-                    <a:srcRect/>
-                    <a:stretch>
-                      <a:fillRect/>
-                    </a:stretch>
-                  </pic:blipFill>
-                  <pic:spPr bwMode="auto">
-                    <a:xfrm>
-                      <a:off x="0" y="0"/>
-                      <a:ext cx="5731510" cy="3895725"/>
-                    </a:xfrm>
-                    <a:prstGeom prst="rect">
-                      <a:avLst/>
-                    </a:prstGeom>
-                    <a:noFill/>
-                    <a:ln>
-                      <a:noFill/>
-                    </a:ln>
-                  </pic:spPr>
-                </pic:pic>
-              </a:graphicData>
-            </a:graphic>
-          </wp:inline>
-        </w:drawing>
-      </w:r>
-      <w:r>
-        <w:rPr>
-          <w:i/>
-          <w:iCs/>
-          <w:sz w:val="18"/>
-          <w:szCs w:val="18"/>
-        </w:rPr>
-        <w:t>Figure 8.1: Model 1 (Lookback=5) training/validation loss convergence.</w:t>
-      </w:r>
-    </w:p>
-    <w:p>
-      <w:pPr>
-        <w:spacing w:after="150"/>
-      </w:pPr>
-      <w:r>
-        <w:t xml:space="preserve">The training and validation loss both drop sharply in the first 50 epochs (0.91 → 0.50 train, 0.97 → 0.61 val) and then </w:t>
-      </w:r>
-      <w:r>
-        <w:t>flattened</w:t>
-      </w:r>
-      <w:r>
-        <w:t xml:space="preserve"> out, with only marginal further improvement through epoch 200 (0.47 train, 0.60 val). The two curves stay reasonably close together throughout (a gap of roughly 0.09–0.13), suggesting limited overfitting within this internal validation split — however, as shown in Section 8.5, this internal validation gap does not reflect true forecasting performance on the genuinely held-out last-5-timestep test window, where Model 1 in fact </w:t>
-      </w:r>
-      <w:r>
-        <w:t>generalizes</w:t>
-      </w:r>
-      <w:r>
-        <w:t xml:space="preserve"> best of the three models (Test R² = 0.31) despite having the weakest training fit (Train R² = 0.51).</w:t>
-      </w:r>
-    </w:p>
-    <w:p>
-      <w:pPr>
-        <w:pStyle w:val="Heading2"/>
-        <w:spacing w:before="300" w:after="150"/>
-      </w:pPr>
-      <w:r>
-        <w:t>8.3 Model 2: Univariate LSTM (Lookback = 10, Predict = 5)</w:t>
-      </w:r>
-    </w:p>
-    <w:p>
-      <w:pPr>
-        <w:spacing w:after="150"/>
-      </w:pPr>
-      <w:r>
-        <w:t>Architecture change: hidden_size was increased from 16 to 24 (num_layers, dropout, num_features, and output_size unchanged) to give the model additional representational capacity to process the doubled lookback window (10 timesteps of history instead of 5).</w:t>
-      </w:r>
-    </w:p>
-    <w:tbl>
-      <w:tblPr>
-        <w:tblW w:w="9000" w:type="dxa"/>
-        <w:tblBorders>
-          <w:top w:val="single" w:sz="4" w:space="0" w:color="auto"/>
-          <w:left w:val="single" w:sz="4" w:space="0" w:color="auto"/>
-          <w:bottom w:val="single" w:sz="4" w:space="0" w:color="auto"/>
-          <w:right w:val="single" w:sz="4" w:space="0" w:color="auto"/>
-          <w:insideH w:val="single" w:sz="4" w:space="0" w:color="auto"/>
-          <w:insideV w:val="single" w:sz="4" w:space="0" w:color="auto"/>
-        </w:tblBorders>
-        <w:tblCellMar>
-          <w:left w:w="10" w:type="dxa"/>
-          <w:right w:w="10" w:type="dxa"/>
-        </w:tblCellMar>
-        <w:tblLook w:val="04A0" w:firstRow="1" w:lastRow="0" w:firstColumn="1" w:lastColumn="0" w:noHBand="0" w:noVBand="1"/>
-      </w:tblPr>
-      <w:tblGrid>
-        <w:gridCol w:w="3000"/>
-        <w:gridCol w:w="3000"/>
-        <w:gridCol w:w="3000"/>
-      </w:tblGrid>
-      <w:tr>
-        <w:trPr>
-          <w:tblHeader/>
-        </w:trPr>
-        <w:tc>
-          <w:tcPr>
-            <w:tcW w:w="3000" w:type="dxa"/>
-            <w:shd w:val="clear" w:color="auto" w:fill="DDEBF7"/>
-            <w:tcMar>
-              <w:top w:w="100" w:type="dxa"/>
-              <w:left w:w="100" w:type="dxa"/>
-              <w:bottom w:w="100" w:type="dxa"/>
-              <w:right w:w="100" w:type="dxa"/>
-            </w:tcMar>
-          </w:tcPr>
-          <w:p>
-            <w:r>
-              <w:rPr>
-                <w:b/>
-                <w:bCs/>
-              </w:rPr>
-              <w:t>Metric</w:t>
-            </w:r>
-          </w:p>
-        </w:tc>
-        <w:tc>
-          <w:tcPr>
-            <w:tcW w:w="3000" w:type="dxa"/>
-            <w:shd w:val="clear" w:color="auto" w:fill="DDEBF7"/>
-            <w:tcMar>
-              <w:top w:w="100" w:type="dxa"/>
-              <w:left w:w="100" w:type="dxa"/>
-              <w:bottom w:w="100" w:type="dxa"/>
-              <w:right w:w="100" w:type="dxa"/>
-            </w:tcMar>
-          </w:tcPr>
-          <w:p>
-            <w:r>
-              <w:rPr>
-                <w:b/>
-                <w:bCs/>
-              </w:rPr>
-              <w:t>Train</w:t>
-            </w:r>
-          </w:p>
-        </w:tc>
-        <w:tc>
-          <w:tcPr>
-            <w:tcW w:w="3000" w:type="dxa"/>
-            <w:shd w:val="clear" w:color="auto" w:fill="DDEBF7"/>
-            <w:tcMar>
-              <w:top w:w="100" w:type="dxa"/>
-              <w:left w:w="100" w:type="dxa"/>
-              <w:bottom w:w="100" w:type="dxa"/>
-              <w:right w:w="100" w:type="dxa"/>
-            </w:tcMar>
-          </w:tcPr>
-          <w:p>
-            <w:r>
-              <w:rPr>
-                <w:b/>
-                <w:bCs/>
-              </w:rPr>
-              <w:t>Test</w:t>
-            </w:r>
-          </w:p>
-        </w:tc>
-      </w:tr>
-      <w:tr>
-        <w:tc>
-          <w:tcPr>
-            <w:tcW w:w="3000" w:type="dxa"/>
-            <w:tcMar>
-              <w:top w:w="100" w:type="dxa"/>
-              <w:left w:w="100" w:type="dxa"/>
-              <w:bottom w:w="100" w:type="dxa"/>
-              <w:right w:w="100" w:type="dxa"/>
-            </w:tcMar>
-          </w:tcPr>
-          <w:p>
-            <w:r>
-              <w:t>RMSE</w:t>
-            </w:r>
-          </w:p>
-        </w:tc>
-        <w:tc>
-          <w:tcPr>
-            <w:tcW w:w="3000" w:type="dxa"/>
-            <w:tcMar>
-              <w:top w:w="100" w:type="dxa"/>
-              <w:left w:w="100" w:type="dxa"/>
-              <w:bottom w:w="100" w:type="dxa"/>
-              <w:right w:w="100" w:type="dxa"/>
-            </w:tcMar>
-          </w:tcPr>
-          <w:p>
-            <w:r>
-              <w:t>0.5397 (standardised)</w:t>
-            </w:r>
-          </w:p>
-        </w:tc>
-        <w:tc>
-          <w:tcPr>
-            <w:tcW w:w="3000" w:type="dxa"/>
-            <w:tcMar>
-              <w:top w:w="100" w:type="dxa"/>
-              <w:left w:w="100" w:type="dxa"/>
-              <w:bottom w:w="100" w:type="dxa"/>
-              <w:right w:w="100" w:type="dxa"/>
-            </w:tcMar>
-          </w:tcPr>
-          <w:p>
-            <w:r>
-              <w:t>394.58 (original units)</w:t>
-            </w:r>
-          </w:p>
-        </w:tc>
-      </w:tr>
-      <w:tr>
-        <w:tc>
-          <w:tcPr>
-            <w:tcW w:w="3000" w:type="dxa"/>
-            <w:tcMar>
-              <w:top w:w="100" w:type="dxa"/>
-              <w:left w:w="100" w:type="dxa"/>
-              <w:bottom w:w="100" w:type="dxa"/>
-              <w:right w:w="100" w:type="dxa"/>
-            </w:tcMar>
-          </w:tcPr>
-          <w:p>
-            <w:r>
-              <w:t>R²</w:t>
-            </w:r>
-          </w:p>
-        </w:tc>
-        <w:tc>
-          <w:tcPr>
-            <w:tcW w:w="3000" w:type="dxa"/>
-            <w:tcMar>
-              <w:top w:w="100" w:type="dxa"/>
-              <w:left w:w="100" w:type="dxa"/>
-              <w:bottom w:w="100" w:type="dxa"/>
-              <w:right w:w="100" w:type="dxa"/>
-            </w:tcMar>
-          </w:tcPr>
-          <w:p>
-            <w:r>
-              <w:t>0.7081</w:t>
-            </w:r>
-          </w:p>
-        </w:tc>
-        <w:tc>
-          <w:tcPr>
-            <w:tcW w:w="3000" w:type="dxa"/>
-            <w:tcMar>
-              <w:top w:w="100" w:type="dxa"/>
-              <w:left w:w="100" w:type="dxa"/>
-              <w:bottom w:w="100" w:type="dxa"/>
-              <w:right w:w="100" w:type="dxa"/>
-            </w:tcMar>
-          </w:tcPr>
-          <w:p>
-            <w:r>
-              <w:t>0.1131</w:t>
-            </w:r>
-          </w:p>
-        </w:tc>
-      </w:tr>
-    </w:tbl>
-    <w:p>
-      <w:pPr>
-        <w:spacing w:after="100"/>
-      </w:pPr>
-    </w:p>
-    <w:p>
-      <w:pPr>
-        <w:spacing w:after="150"/>
-      </w:pPr>
-      <w:r>
-        <w:t>Recorded training/validation MSE loss during training:</w:t>
-      </w:r>
-    </w:p>
-    <w:tbl>
-      <w:tblPr>
-        <w:tblW w:w="9000" w:type="dxa"/>
-        <w:tblBorders>
-          <w:top w:val="single" w:sz="4" w:space="0" w:color="auto"/>
-          <w:left w:val="single" w:sz="4" w:space="0" w:color="auto"/>
-          <w:bottom w:val="single" w:sz="4" w:space="0" w:color="auto"/>
-          <w:right w:val="single" w:sz="4" w:space="0" w:color="auto"/>
-          <w:insideH w:val="single" w:sz="4" w:space="0" w:color="auto"/>
-          <w:insideV w:val="single" w:sz="4" w:space="0" w:color="auto"/>
-        </w:tblBorders>
-        <w:tblCellMar>
-          <w:left w:w="10" w:type="dxa"/>
-          <w:right w:w="10" w:type="dxa"/>
-        </w:tblCellMar>
-        <w:tblLook w:val="04A0" w:firstRow="1" w:lastRow="0" w:firstColumn="1" w:lastColumn="0" w:noHBand="0" w:noVBand="1"/>
-      </w:tblPr>
-      <w:tblGrid>
-        <w:gridCol w:w="3000"/>
-        <w:gridCol w:w="3000"/>
-        <w:gridCol w:w="3000"/>
-      </w:tblGrid>
-      <w:tr>
-        <w:trPr>
-          <w:tblHeader/>
-        </w:trPr>
-        <w:tc>
-          <w:tcPr>
-            <w:tcW w:w="3000" w:type="dxa"/>
-            <w:shd w:val="clear" w:color="auto" w:fill="DDEBF7"/>
-            <w:tcMar>
-              <w:top w:w="100" w:type="dxa"/>
-              <w:left w:w="100" w:type="dxa"/>
-              <w:bottom w:w="100" w:type="dxa"/>
-              <w:right w:w="100" w:type="dxa"/>
-            </w:tcMar>
-          </w:tcPr>
-          <w:p>
-            <w:r>
-              <w:rPr>
-                <w:b/>
-                <w:bCs/>
-              </w:rPr>
-              <w:t>Epoch</w:t>
-            </w:r>
-          </w:p>
-        </w:tc>
-        <w:tc>
-          <w:tcPr>
-            <w:tcW w:w="3000" w:type="dxa"/>
-            <w:shd w:val="clear" w:color="auto" w:fill="DDEBF7"/>
-            <w:tcMar>
-              <w:top w:w="100" w:type="dxa"/>
-              <w:left w:w="100" w:type="dxa"/>
-              <w:bottom w:w="100" w:type="dxa"/>
-              <w:right w:w="100" w:type="dxa"/>
-            </w:tcMar>
-          </w:tcPr>
-          <w:p>
-            <w:r>
-              <w:rPr>
-                <w:b/>
-                <w:bCs/>
-              </w:rPr>
-              <w:t>Train Loss (MSE)</w:t>
-            </w:r>
-          </w:p>
-        </w:tc>
-        <w:tc>
-          <w:tcPr>
-            <w:tcW w:w="3000" w:type="dxa"/>
-            <w:shd w:val="clear" w:color="auto" w:fill="DDEBF7"/>
-            <w:tcMar>
-              <w:top w:w="100" w:type="dxa"/>
-              <w:left w:w="100" w:type="dxa"/>
-              <w:bottom w:w="100" w:type="dxa"/>
-              <w:right w:w="100" w:type="dxa"/>
-            </w:tcMar>
-          </w:tcPr>
-          <w:p>
-            <w:r>
-              <w:rPr>
-                <w:b/>
-                <w:bCs/>
-              </w:rPr>
-              <w:t>Val Loss (MSE)</w:t>
-            </w:r>
-          </w:p>
-        </w:tc>
-      </w:tr>
-      <w:tr>
-        <w:tc>
-          <w:tcPr>
-            <w:tcW w:w="3000" w:type="dxa"/>
-            <w:tcMar>
-              <w:top w:w="100" w:type="dxa"/>
-              <w:left w:w="100" w:type="dxa"/>
-              <w:bottom w:w="100" w:type="dxa"/>
-              <w:right w:w="100" w:type="dxa"/>
-            </w:tcMar>
-          </w:tcPr>
-          <w:p>
-            <w:r>
-              <w:t>0</w:t>
-            </w:r>
-          </w:p>
-        </w:tc>
-        <w:tc>
-          <w:tcPr>
-            <w:tcW w:w="3000" w:type="dxa"/>
-            <w:tcMar>
-              <w:top w:w="100" w:type="dxa"/>
-              <w:left w:w="100" w:type="dxa"/>
-              <w:bottom w:w="100" w:type="dxa"/>
-              <w:right w:w="100" w:type="dxa"/>
-            </w:tcMar>
-          </w:tcPr>
-          <w:p>
-            <w:r>
-              <w:t>0.7763</w:t>
-            </w:r>
-          </w:p>
-        </w:tc>
-        <w:tc>
-          <w:tcPr>
-            <w:tcW w:w="3000" w:type="dxa"/>
-            <w:tcMar>
-              <w:top w:w="100" w:type="dxa"/>
-              <w:left w:w="100" w:type="dxa"/>
-              <w:bottom w:w="100" w:type="dxa"/>
-              <w:right w:w="100" w:type="dxa"/>
-            </w:tcMar>
-          </w:tcPr>
-          <w:p>
-            <w:r>
-              <w:t>0.8535</w:t>
-            </w:r>
-          </w:p>
-        </w:tc>
-      </w:tr>
-      <w:tr>
-        <w:tc>
-          <w:tcPr>
-            <w:tcW w:w="3000" w:type="dxa"/>
-            <w:tcMar>
-              <w:top w:w="100" w:type="dxa"/>
-              <w:left w:w="100" w:type="dxa"/>
-              <w:bottom w:w="100" w:type="dxa"/>
-              <w:right w:w="100" w:type="dxa"/>
-            </w:tcMar>
-          </w:tcPr>
-          <w:p>
-            <w:r>
-              <w:t>50</w:t>
-            </w:r>
-          </w:p>
-        </w:tc>
-        <w:tc>
-          <w:tcPr>
-            <w:tcW w:w="3000" w:type="dxa"/>
-            <w:tcMar>
-              <w:top w:w="100" w:type="dxa"/>
-              <w:left w:w="100" w:type="dxa"/>
-              <w:bottom w:w="100" w:type="dxa"/>
-              <w:right w:w="100" w:type="dxa"/>
-            </w:tcMar>
-          </w:tcPr>
-          <w:p>
-            <w:r>
-              <w:t>0.4725</w:t>
-            </w:r>
-          </w:p>
-        </w:tc>
-        <w:tc>
-          <w:tcPr>
-            <w:tcW w:w="3000" w:type="dxa"/>
-            <w:tcMar>
-              <w:top w:w="100" w:type="dxa"/>
-              <w:left w:w="100" w:type="dxa"/>
-              <w:bottom w:w="100" w:type="dxa"/>
-              <w:right w:w="100" w:type="dxa"/>
-            </w:tcMar>
-          </w:tcPr>
-          <w:p>
-            <w:r>
-              <w:t>0.5390</w:t>
-            </w:r>
-          </w:p>
-        </w:tc>
-      </w:tr>
-      <w:tr>
-        <w:tc>
-          <w:tcPr>
-            <w:tcW w:w="3000" w:type="dxa"/>
-            <w:tcMar>
-              <w:top w:w="100" w:type="dxa"/>
-              <w:left w:w="100" w:type="dxa"/>
-              <w:bottom w:w="100" w:type="dxa"/>
-              <w:right w:w="100" w:type="dxa"/>
-            </w:tcMar>
-          </w:tcPr>
-          <w:p>
-            <w:r>
-              <w:t>100</w:t>
-            </w:r>
-          </w:p>
-        </w:tc>
-        <w:tc>
-          <w:tcPr>
-            <w:tcW w:w="3000" w:type="dxa"/>
-            <w:tcMar>
-              <w:top w:w="100" w:type="dxa"/>
-              <w:left w:w="100" w:type="dxa"/>
-              <w:bottom w:w="100" w:type="dxa"/>
-              <w:right w:w="100" w:type="dxa"/>
-            </w:tcMar>
-          </w:tcPr>
-          <w:p>
-            <w:r>
-              <w:t>0.4004</w:t>
-            </w:r>
-          </w:p>
-        </w:tc>
-        <w:tc>
-          <w:tcPr>
-            <w:tcW w:w="3000" w:type="dxa"/>
-            <w:tcMar>
-              <w:top w:w="100" w:type="dxa"/>
-              <w:left w:w="100" w:type="dxa"/>
-              <w:bottom w:w="100" w:type="dxa"/>
-              <w:right w:w="100" w:type="dxa"/>
-            </w:tcMar>
-          </w:tcPr>
-          <w:p>
-            <w:r>
-              <w:t>0.5063</w:t>
-            </w:r>
-          </w:p>
-        </w:tc>
-      </w:tr>
-      <w:tr>
-        <w:tc>
-          <w:tcPr>
-            <w:tcW w:w="3000" w:type="dxa"/>
-            <w:tcMar>
-              <w:top w:w="100" w:type="dxa"/>
-              <w:left w:w="100" w:type="dxa"/>
-              <w:bottom w:w="100" w:type="dxa"/>
-              <w:right w:w="100" w:type="dxa"/>
-            </w:tcMar>
-          </w:tcPr>
-          <w:p>
-            <w:r>
-              <w:t>150</w:t>
-            </w:r>
-          </w:p>
-        </w:tc>
-        <w:tc>
-          <w:tcPr>
-            <w:tcW w:w="3000" w:type="dxa"/>
-            <w:tcMar>
-              <w:top w:w="100" w:type="dxa"/>
-              <w:left w:w="100" w:type="dxa"/>
-              <w:bottom w:w="100" w:type="dxa"/>
-              <w:right w:w="100" w:type="dxa"/>
-            </w:tcMar>
-          </w:tcPr>
-          <w:p>
-            <w:r>
-              <w:t>0.3334</w:t>
-            </w:r>
-          </w:p>
-        </w:tc>
-        <w:tc>
-          <w:tcPr>
-            <w:tcW w:w="3000" w:type="dxa"/>
-            <w:tcMar>
-              <w:top w:w="100" w:type="dxa"/>
-              <w:left w:w="100" w:type="dxa"/>
-              <w:bottom w:w="100" w:type="dxa"/>
-              <w:right w:w="100" w:type="dxa"/>
-            </w:tcMar>
-          </w:tcPr>
-          <w:p>
-            <w:r>
-              <w:t>0.4694</w:t>
-            </w:r>
-          </w:p>
-        </w:tc>
-      </w:tr>
-      <w:tr>
-        <w:tc>
-          <w:tcPr>
-            <w:tcW w:w="3000" w:type="dxa"/>
-            <w:tcMar>
-              <w:top w:w="100" w:type="dxa"/>
-              <w:left w:w="100" w:type="dxa"/>
-              <w:bottom w:w="100" w:type="dxa"/>
-              <w:right w:w="100" w:type="dxa"/>
-            </w:tcMar>
-          </w:tcPr>
-          <w:p>
-            <w:r>
-              <w:t>200</w:t>
-            </w:r>
-          </w:p>
-        </w:tc>
-        <w:tc>
-          <w:tcPr>
-            <w:tcW w:w="3000" w:type="dxa"/>
-            <w:tcMar>
-              <w:top w:w="100" w:type="dxa"/>
-              <w:left w:w="100" w:type="dxa"/>
-              <w:bottom w:w="100" w:type="dxa"/>
-              <w:right w:w="100" w:type="dxa"/>
-            </w:tcMar>
-          </w:tcPr>
-          <w:p>
-            <w:r>
-              <w:t>0.3078</w:t>
-            </w:r>
-          </w:p>
-        </w:tc>
-        <w:tc>
-          <w:tcPr>
-            <w:tcW w:w="3000" w:type="dxa"/>
-            <w:tcMar>
-              <w:top w:w="100" w:type="dxa"/>
-              <w:left w:w="100" w:type="dxa"/>
-              <w:bottom w:w="100" w:type="dxa"/>
-              <w:right w:w="100" w:type="dxa"/>
-            </w:tcMar>
-          </w:tcPr>
-          <w:p>
-            <w:r>
-              <w:t>0.4615</w:t>
-            </w:r>
-          </w:p>
-        </w:tc>
-      </w:tr>
-    </w:tbl>
-    <w:p>
-      <w:pPr>
-        <w:spacing w:after="100"/>
-      </w:pPr>
-    </w:p>
-    <w:p>
-      <w:pPr>
-        <w:spacing w:after="300"/>
-        <w:jc w:val="center"/>
-      </w:pPr>
-      <w:r>
-        <w:rPr>
-          <w:noProof/>
-        </w:rPr>
-        <w:drawing>
-          <wp:inline distT="0" distB="0" distL="0" distR="0" wp14:anchorId="1C4167E6" wp14:editId="026C1AB5">
-            <wp:extent cx="5731510" cy="3895725"/>
-            <wp:effectExtent l="0" t="0" r="2540" b="9525"/>
-            <wp:docPr id="928729247" name="Picture 7"/>
-            <wp:cNvGraphicFramePr>
-              <a:graphicFrameLocks xmlns:a="http://schemas.openxmlformats.org/drawingml/2006/main" noChangeAspect="1"/>
-            </wp:cNvGraphicFramePr>
-            <a:graphic xmlns:a="http://schemas.openxmlformats.org/drawingml/2006/main">
-              <a:graphicData uri="http://schemas.openxmlformats.org/drawingml/2006/picture">
-                <pic:pic xmlns:pic="http://schemas.openxmlformats.org/drawingml/2006/picture">
-                  <pic:nvPicPr>
-                    <pic:cNvPr id="0" name="Picture 13"/>
                     <pic:cNvPicPr>
                       <a:picLocks noChangeAspect="1" noChangeArrowheads="1"/>
                     </pic:cNvPicPr>
@@ -5157,7 +4899,7 @@
           <w:sz w:val="18"/>
           <w:szCs w:val="18"/>
         </w:rPr>
-        <w:t>Figure 8.2: Model 2 (Lookback=10) training/validation loss convergence.</w:t>
+        <w:t>Figure 8.1: Model 1 (Lookback=5) training/validation loss convergence.</w:t>
       </w:r>
     </w:p>
     <w:p>
@@ -5165,7 +4907,35 @@
         <w:spacing w:after="150"/>
       </w:pPr>
       <w:r>
-        <w:t>Both loss curves continue decreasing steadily through all 200 logged epochs (train: 0.78 → 0.31; val: 0.85 → 0.46) without fully plateauing, unlike Model 1. Train R² improved substantially over Model 1 (0.51 → 0.71), reflecting the larger hidden size and longer lookback giving the model more to fit — but Test R² dropped (0.31 → 0.11), an early sign of the overfitting trend explored fully in Section 8.5.1: more capacity and more training-window information improved the internal fit without improving genuine forecasting ability.</w:t>
+        <w:t xml:space="preserve">The training and validation loss both drop sharply in the first 50 epochs (0.91 → 0.50 train, 0.97 → 0.61 </w:t>
+      </w:r>
+      <w:proofErr w:type="spellStart"/>
+      <w:r>
+        <w:t>val</w:t>
+      </w:r>
+      <w:proofErr w:type="spellEnd"/>
+      <w:r>
+        <w:t xml:space="preserve">) and then </w:t>
+      </w:r>
+      <w:r>
+        <w:t>flattened</w:t>
+      </w:r>
+      <w:r>
+        <w:t xml:space="preserve"> out, with only marginal further improvement through epoch 200 (0.47 train, 0.60 </w:t>
+      </w:r>
+      <w:proofErr w:type="spellStart"/>
+      <w:r>
+        <w:t>val</w:t>
+      </w:r>
+      <w:proofErr w:type="spellEnd"/>
+      <w:r>
+        <w:t xml:space="preserve">). The two curves stay reasonably close together throughout (a gap of roughly 0.09–0.13), suggesting limited overfitting within this internal validation split — however, as shown in Section 8.5, this internal validation gap does not reflect true forecasting performance on the genuinely held-out last-5-timestep test window, where Model 1 in fact </w:t>
+      </w:r>
+      <w:r>
+        <w:t>generalizes</w:t>
+      </w:r>
+      <w:r>
+        <w:t xml:space="preserve"> best of the three models (Test R² = 0.31) despite having the weakest training fit (Train R² = 0.51).</w:t>
       </w:r>
     </w:p>
     <w:p>
@@ -5174,7 +4944,7 @@
         <w:spacing w:before="300" w:after="150"/>
       </w:pPr>
       <w:r>
-        <w:t>8.4 Model 3: Multivariate LSTM (TSDM + Climate Features)</w:t>
+        <w:t>8.3 Model 2: Univariate LSTM (Lookback = 10, Predict = 5)</w:t>
       </w:r>
     </w:p>
     <w:p>
@@ -5182,7 +4952,39 @@
         <w:spacing w:after="150"/>
       </w:pPr>
       <w:r>
-        <w:t>Architecture modifications: num_features was increased from 1 to the number of available climate columns (TSDM plus 15-day-average rainfall, max/min temperature, relative humidity at max/min temperature, evaporation, and radiation — 8 features in total when all are present in the data), requiring the LSTM's input_size to scale accordingly; hidden_size was further increased to 32 (from 24) to give the model enough capacity to combine information across all input channels; lookback was kept at 10 (as in Model 2) rather than a fixed short window, and the existing variable-length packing (pack_padded_sequence) already supported flexible per-paddock sequence lengths without further changes.</w:t>
+        <w:t xml:space="preserve">Architecture change: </w:t>
+      </w:r>
+      <w:proofErr w:type="spellStart"/>
+      <w:r>
+        <w:t>hidden_size</w:t>
+      </w:r>
+      <w:proofErr w:type="spellEnd"/>
+      <w:r>
+        <w:t xml:space="preserve"> was increased from 16 to 24 (</w:t>
+      </w:r>
+      <w:proofErr w:type="spellStart"/>
+      <w:r>
+        <w:t>num_layers</w:t>
+      </w:r>
+      <w:proofErr w:type="spellEnd"/>
+      <w:r>
+        <w:t xml:space="preserve">, dropout, </w:t>
+      </w:r>
+      <w:proofErr w:type="spellStart"/>
+      <w:r>
+        <w:t>num_features</w:t>
+      </w:r>
+      <w:proofErr w:type="spellEnd"/>
+      <w:r>
+        <w:t xml:space="preserve">, and </w:t>
+      </w:r>
+      <w:proofErr w:type="spellStart"/>
+      <w:r>
+        <w:t>output_size</w:t>
+      </w:r>
+      <w:proofErr w:type="spellEnd"/>
+      <w:r>
+        <w:t xml:space="preserve"> unchanged) to give the model additional representational capacity to process the doubled lookback window (10 timesteps of history instead of 5).</w:t>
       </w:r>
     </w:p>
     <w:tbl>
@@ -5304,23 +5106,31 @@
           </w:tcPr>
           <w:p>
             <w:r>
-              <w:t>0.2980 (standardised)</w:t>
-            </w:r>
-          </w:p>
-        </w:tc>
-        <w:tc>
-          <w:tcPr>
-            <w:tcW w:w="3000" w:type="dxa"/>
-            <w:tcMar>
-              <w:top w:w="100" w:type="dxa"/>
-              <w:left w:w="100" w:type="dxa"/>
-              <w:bottom w:w="100" w:type="dxa"/>
-              <w:right w:w="100" w:type="dxa"/>
-            </w:tcMar>
-          </w:tcPr>
-          <w:p>
-            <w:r>
-              <w:t>404.74 (original units)</w:t>
+              <w:t>0.5397 (</w:t>
+            </w:r>
+            <w:proofErr w:type="spellStart"/>
+            <w:r>
+              <w:t>standardised</w:t>
+            </w:r>
+            <w:proofErr w:type="spellEnd"/>
+            <w:r>
+              <w:t>)</w:t>
+            </w:r>
+          </w:p>
+        </w:tc>
+        <w:tc>
+          <w:tcPr>
+            <w:tcW w:w="3000" w:type="dxa"/>
+            <w:tcMar>
+              <w:top w:w="100" w:type="dxa"/>
+              <w:left w:w="100" w:type="dxa"/>
+              <w:bottom w:w="100" w:type="dxa"/>
+              <w:right w:w="100" w:type="dxa"/>
+            </w:tcMar>
+          </w:tcPr>
+          <w:p>
+            <w:r>
+              <w:t>394.58 (original units)</w:t>
             </w:r>
           </w:p>
         </w:tc>
@@ -5354,23 +5164,23 @@
           </w:tcPr>
           <w:p>
             <w:r>
-              <w:t>0.9110</w:t>
-            </w:r>
-          </w:p>
-        </w:tc>
-        <w:tc>
-          <w:tcPr>
-            <w:tcW w:w="3000" w:type="dxa"/>
-            <w:tcMar>
-              <w:top w:w="100" w:type="dxa"/>
-              <w:left w:w="100" w:type="dxa"/>
-              <w:bottom w:w="100" w:type="dxa"/>
-              <w:right w:w="100" w:type="dxa"/>
-            </w:tcMar>
-          </w:tcPr>
-          <w:p>
-            <w:r>
-              <w:t>0.0668</w:t>
+              <w:t>0.7081</w:t>
+            </w:r>
+          </w:p>
+        </w:tc>
+        <w:tc>
+          <w:tcPr>
+            <w:tcW w:w="3000" w:type="dxa"/>
+            <w:tcMar>
+              <w:top w:w="100" w:type="dxa"/>
+              <w:left w:w="100" w:type="dxa"/>
+              <w:bottom w:w="100" w:type="dxa"/>
+              <w:right w:w="100" w:type="dxa"/>
+            </w:tcMar>
+          </w:tcPr>
+          <w:p>
+            <w:r>
+              <w:t>0.1131</w:t>
             </w:r>
           </w:p>
         </w:tc>
@@ -5508,23 +5318,23 @@
           </w:tcPr>
           <w:p>
             <w:r>
-              <w:t>0.5010</w:t>
-            </w:r>
-          </w:p>
-        </w:tc>
-        <w:tc>
-          <w:tcPr>
-            <w:tcW w:w="3000" w:type="dxa"/>
-            <w:tcMar>
-              <w:top w:w="100" w:type="dxa"/>
-              <w:left w:w="100" w:type="dxa"/>
-              <w:bottom w:w="100" w:type="dxa"/>
-              <w:right w:w="100" w:type="dxa"/>
-            </w:tcMar>
-          </w:tcPr>
-          <w:p>
-            <w:r>
-              <w:t>0.5224</w:t>
+              <w:t>0.7763</w:t>
+            </w:r>
+          </w:p>
+        </w:tc>
+        <w:tc>
+          <w:tcPr>
+            <w:tcW w:w="3000" w:type="dxa"/>
+            <w:tcMar>
+              <w:top w:w="100" w:type="dxa"/>
+              <w:left w:w="100" w:type="dxa"/>
+              <w:bottom w:w="100" w:type="dxa"/>
+              <w:right w:w="100" w:type="dxa"/>
+            </w:tcMar>
+          </w:tcPr>
+          <w:p>
+            <w:r>
+              <w:t>0.8535</w:t>
             </w:r>
           </w:p>
         </w:tc>
@@ -5558,23 +5368,23 @@
           </w:tcPr>
           <w:p>
             <w:r>
-              <w:t>0.1605</w:t>
-            </w:r>
-          </w:p>
-        </w:tc>
-        <w:tc>
-          <w:tcPr>
-            <w:tcW w:w="3000" w:type="dxa"/>
-            <w:tcMar>
-              <w:top w:w="100" w:type="dxa"/>
-              <w:left w:w="100" w:type="dxa"/>
-              <w:bottom w:w="100" w:type="dxa"/>
-              <w:right w:w="100" w:type="dxa"/>
-            </w:tcMar>
-          </w:tcPr>
-          <w:p>
-            <w:r>
-              <w:t>0.1819</w:t>
+              <w:t>0.4725</w:t>
+            </w:r>
+          </w:p>
+        </w:tc>
+        <w:tc>
+          <w:tcPr>
+            <w:tcW w:w="3000" w:type="dxa"/>
+            <w:tcMar>
+              <w:top w:w="100" w:type="dxa"/>
+              <w:left w:w="100" w:type="dxa"/>
+              <w:bottom w:w="100" w:type="dxa"/>
+              <w:right w:w="100" w:type="dxa"/>
+            </w:tcMar>
+          </w:tcPr>
+          <w:p>
+            <w:r>
+              <w:t>0.5390</w:t>
             </w:r>
           </w:p>
         </w:tc>
@@ -5608,23 +5418,23 @@
           </w:tcPr>
           <w:p>
             <w:r>
-              <w:t>0.1203</w:t>
-            </w:r>
-          </w:p>
-        </w:tc>
-        <w:tc>
-          <w:tcPr>
-            <w:tcW w:w="3000" w:type="dxa"/>
-            <w:tcMar>
-              <w:top w:w="100" w:type="dxa"/>
-              <w:left w:w="100" w:type="dxa"/>
-              <w:bottom w:w="100" w:type="dxa"/>
-              <w:right w:w="100" w:type="dxa"/>
-            </w:tcMar>
-          </w:tcPr>
-          <w:p>
-            <w:r>
-              <w:t>0.1544</w:t>
+              <w:t>0.4004</w:t>
+            </w:r>
+          </w:p>
+        </w:tc>
+        <w:tc>
+          <w:tcPr>
+            <w:tcW w:w="3000" w:type="dxa"/>
+            <w:tcMar>
+              <w:top w:w="100" w:type="dxa"/>
+              <w:left w:w="100" w:type="dxa"/>
+              <w:bottom w:w="100" w:type="dxa"/>
+              <w:right w:w="100" w:type="dxa"/>
+            </w:tcMar>
+          </w:tcPr>
+          <w:p>
+            <w:r>
+              <w:t>0.5063</w:t>
             </w:r>
           </w:p>
         </w:tc>
@@ -5658,23 +5468,23 @@
           </w:tcPr>
           <w:p>
             <w:r>
-              <w:t>0.1017</w:t>
-            </w:r>
-          </w:p>
-        </w:tc>
-        <w:tc>
-          <w:tcPr>
-            <w:tcW w:w="3000" w:type="dxa"/>
-            <w:tcMar>
-              <w:top w:w="100" w:type="dxa"/>
-              <w:left w:w="100" w:type="dxa"/>
-              <w:bottom w:w="100" w:type="dxa"/>
-              <w:right w:w="100" w:type="dxa"/>
-            </w:tcMar>
-          </w:tcPr>
-          <w:p>
-            <w:r>
-              <w:t>0.1427</w:t>
+              <w:t>0.3334</w:t>
+            </w:r>
+          </w:p>
+        </w:tc>
+        <w:tc>
+          <w:tcPr>
+            <w:tcW w:w="3000" w:type="dxa"/>
+            <w:tcMar>
+              <w:top w:w="100" w:type="dxa"/>
+              <w:left w:w="100" w:type="dxa"/>
+              <w:bottom w:w="100" w:type="dxa"/>
+              <w:right w:w="100" w:type="dxa"/>
+            </w:tcMar>
+          </w:tcPr>
+          <w:p>
+            <w:r>
+              <w:t>0.4694</w:t>
             </w:r>
           </w:p>
         </w:tc>
@@ -5708,23 +5518,23 @@
           </w:tcPr>
           <w:p>
             <w:r>
-              <w:t>0.0828</w:t>
-            </w:r>
-          </w:p>
-        </w:tc>
-        <w:tc>
-          <w:tcPr>
-            <w:tcW w:w="3000" w:type="dxa"/>
-            <w:tcMar>
-              <w:top w:w="100" w:type="dxa"/>
-              <w:left w:w="100" w:type="dxa"/>
-              <w:bottom w:w="100" w:type="dxa"/>
-              <w:right w:w="100" w:type="dxa"/>
-            </w:tcMar>
-          </w:tcPr>
-          <w:p>
-            <w:r>
-              <w:t>0.1359</w:t>
+              <w:t>0.3078</w:t>
+            </w:r>
+          </w:p>
+        </w:tc>
+        <w:tc>
+          <w:tcPr>
+            <w:tcW w:w="3000" w:type="dxa"/>
+            <w:tcMar>
+              <w:top w:w="100" w:type="dxa"/>
+              <w:left w:w="100" w:type="dxa"/>
+              <w:bottom w:w="100" w:type="dxa"/>
+              <w:right w:w="100" w:type="dxa"/>
+            </w:tcMar>
+          </w:tcPr>
+          <w:p>
+            <w:r>
+              <w:t>0.4615</w:t>
             </w:r>
           </w:p>
         </w:tc>
@@ -5745,10 +5555,10 @@
           <w:noProof/>
         </w:rPr>
         <w:drawing>
-          <wp:inline distT="0" distB="0" distL="0" distR="0" wp14:anchorId="17786C50" wp14:editId="1EAA92DB">
+          <wp:inline distT="0" distB="0" distL="0" distR="0" wp14:anchorId="1C4167E6" wp14:editId="026C1AB5">
             <wp:extent cx="5731510" cy="3895725"/>
             <wp:effectExtent l="0" t="0" r="2540" b="9525"/>
-            <wp:docPr id="1933813212" name="Picture 8"/>
+            <wp:docPr id="928729247" name="Picture 7"/>
             <wp:cNvGraphicFramePr>
               <a:graphicFrameLocks xmlns:a="http://schemas.openxmlformats.org/drawingml/2006/main" noChangeAspect="1"/>
             </wp:cNvGraphicFramePr>
@@ -5756,7 +5566,7 @@
               <a:graphicData uri="http://schemas.openxmlformats.org/drawingml/2006/picture">
                 <pic:pic xmlns:pic="http://schemas.openxmlformats.org/drawingml/2006/picture">
                   <pic:nvPicPr>
-                    <pic:cNvPr id="0" name="Picture 15"/>
+                    <pic:cNvPr id="0" name="Picture 13"/>
                     <pic:cNvPicPr>
                       <a:picLocks noChangeAspect="1" noChangeArrowheads="1"/>
                     </pic:cNvPicPr>
@@ -5800,6 +5610,697 @@
           <w:sz w:val="18"/>
           <w:szCs w:val="18"/>
         </w:rPr>
+        <w:t>Figure 8.2: Model 2 (Lookback=10) training/validation loss convergence.</w:t>
+      </w:r>
+    </w:p>
+    <w:p>
+      <w:pPr>
+        <w:spacing w:after="150"/>
+      </w:pPr>
+      <w:r>
+        <w:t xml:space="preserve">Both loss curves continue decreasing steadily through all 200 logged epochs (train: 0.78 → 0.31; </w:t>
+      </w:r>
+      <w:proofErr w:type="spellStart"/>
+      <w:r>
+        <w:t>val</w:t>
+      </w:r>
+      <w:proofErr w:type="spellEnd"/>
+      <w:r>
+        <w:t>: 0.85 → 0.46) without fully plateauing, unlike Model 1. Train R² improved substantially over Model 1 (0.51 → 0.71), reflecting the larger hidden size and longer lookback giving the model more to fit — but Test R² dropped (0.31 → 0.11), an early sign of the overfitting trend explored fully in Section 8.5.1: more capacity and more training-window information improved the internal fit without improving genuine forecasting ability.</w:t>
+      </w:r>
+    </w:p>
+    <w:p>
+      <w:pPr>
+        <w:pStyle w:val="Heading2"/>
+        <w:spacing w:before="300" w:after="150"/>
+      </w:pPr>
+      <w:r>
+        <w:t>8.4 Model 3: Multivariate LSTM (TSDM + Climate Features)</w:t>
+      </w:r>
+    </w:p>
+    <w:p>
+      <w:pPr>
+        <w:spacing w:after="150"/>
+      </w:pPr>
+      <w:r>
+        <w:t xml:space="preserve">Architecture modifications: </w:t>
+      </w:r>
+      <w:proofErr w:type="spellStart"/>
+      <w:r>
+        <w:t>num_features</w:t>
+      </w:r>
+      <w:proofErr w:type="spellEnd"/>
+      <w:r>
+        <w:t xml:space="preserve"> was increased from 1 to the number of available climate columns (TSDM plus 15-day-average rainfall, max/min temperature, relative humidity at max/min temperature, evaporation, and radiation — 8 features in total when all are present in the data), requiring the LSTM's </w:t>
+      </w:r>
+      <w:proofErr w:type="spellStart"/>
+      <w:r>
+        <w:t>input_size</w:t>
+      </w:r>
+      <w:proofErr w:type="spellEnd"/>
+      <w:r>
+        <w:t xml:space="preserve"> to scale accordingly; </w:t>
+      </w:r>
+      <w:proofErr w:type="spellStart"/>
+      <w:r>
+        <w:t>hidden_size</w:t>
+      </w:r>
+      <w:proofErr w:type="spellEnd"/>
+      <w:r>
+        <w:t xml:space="preserve"> was further increased to 32 (from 24) to give the model enough capacity to combine information across all input channels; lookback was kept at 10 (as in Model 2) rather than a fixed short window, and the existing variable-length packing (</w:t>
+      </w:r>
+      <w:proofErr w:type="spellStart"/>
+      <w:r>
+        <w:t>pack_padded_sequence</w:t>
+      </w:r>
+      <w:proofErr w:type="spellEnd"/>
+      <w:r>
+        <w:t>) already supported flexible per-paddock sequence lengths without further changes.</w:t>
+      </w:r>
+    </w:p>
+    <w:tbl>
+      <w:tblPr>
+        <w:tblW w:w="9000" w:type="dxa"/>
+        <w:tblBorders>
+          <w:top w:val="single" w:sz="4" w:space="0" w:color="auto"/>
+          <w:left w:val="single" w:sz="4" w:space="0" w:color="auto"/>
+          <w:bottom w:val="single" w:sz="4" w:space="0" w:color="auto"/>
+          <w:right w:val="single" w:sz="4" w:space="0" w:color="auto"/>
+          <w:insideH w:val="single" w:sz="4" w:space="0" w:color="auto"/>
+          <w:insideV w:val="single" w:sz="4" w:space="0" w:color="auto"/>
+        </w:tblBorders>
+        <w:tblCellMar>
+          <w:left w:w="10" w:type="dxa"/>
+          <w:right w:w="10" w:type="dxa"/>
+        </w:tblCellMar>
+        <w:tblLook w:val="04A0" w:firstRow="1" w:lastRow="0" w:firstColumn="1" w:lastColumn="0" w:noHBand="0" w:noVBand="1"/>
+      </w:tblPr>
+      <w:tblGrid>
+        <w:gridCol w:w="3000"/>
+        <w:gridCol w:w="3000"/>
+        <w:gridCol w:w="3000"/>
+      </w:tblGrid>
+      <w:tr>
+        <w:trPr>
+          <w:tblHeader/>
+        </w:trPr>
+        <w:tc>
+          <w:tcPr>
+            <w:tcW w:w="3000" w:type="dxa"/>
+            <w:shd w:val="clear" w:color="auto" w:fill="DDEBF7"/>
+            <w:tcMar>
+              <w:top w:w="100" w:type="dxa"/>
+              <w:left w:w="100" w:type="dxa"/>
+              <w:bottom w:w="100" w:type="dxa"/>
+              <w:right w:w="100" w:type="dxa"/>
+            </w:tcMar>
+          </w:tcPr>
+          <w:p>
+            <w:r>
+              <w:rPr>
+                <w:b/>
+                <w:bCs/>
+              </w:rPr>
+              <w:t>Metric</w:t>
+            </w:r>
+          </w:p>
+        </w:tc>
+        <w:tc>
+          <w:tcPr>
+            <w:tcW w:w="3000" w:type="dxa"/>
+            <w:shd w:val="clear" w:color="auto" w:fill="DDEBF7"/>
+            <w:tcMar>
+              <w:top w:w="100" w:type="dxa"/>
+              <w:left w:w="100" w:type="dxa"/>
+              <w:bottom w:w="100" w:type="dxa"/>
+              <w:right w:w="100" w:type="dxa"/>
+            </w:tcMar>
+          </w:tcPr>
+          <w:p>
+            <w:r>
+              <w:rPr>
+                <w:b/>
+                <w:bCs/>
+              </w:rPr>
+              <w:t>Train</w:t>
+            </w:r>
+          </w:p>
+        </w:tc>
+        <w:tc>
+          <w:tcPr>
+            <w:tcW w:w="3000" w:type="dxa"/>
+            <w:shd w:val="clear" w:color="auto" w:fill="DDEBF7"/>
+            <w:tcMar>
+              <w:top w:w="100" w:type="dxa"/>
+              <w:left w:w="100" w:type="dxa"/>
+              <w:bottom w:w="100" w:type="dxa"/>
+              <w:right w:w="100" w:type="dxa"/>
+            </w:tcMar>
+          </w:tcPr>
+          <w:p>
+            <w:r>
+              <w:rPr>
+                <w:b/>
+                <w:bCs/>
+              </w:rPr>
+              <w:t>Test</w:t>
+            </w:r>
+          </w:p>
+        </w:tc>
+      </w:tr>
+      <w:tr>
+        <w:tc>
+          <w:tcPr>
+            <w:tcW w:w="3000" w:type="dxa"/>
+            <w:tcMar>
+              <w:top w:w="100" w:type="dxa"/>
+              <w:left w:w="100" w:type="dxa"/>
+              <w:bottom w:w="100" w:type="dxa"/>
+              <w:right w:w="100" w:type="dxa"/>
+            </w:tcMar>
+          </w:tcPr>
+          <w:p>
+            <w:r>
+              <w:t>RMSE</w:t>
+            </w:r>
+          </w:p>
+        </w:tc>
+        <w:tc>
+          <w:tcPr>
+            <w:tcW w:w="3000" w:type="dxa"/>
+            <w:tcMar>
+              <w:top w:w="100" w:type="dxa"/>
+              <w:left w:w="100" w:type="dxa"/>
+              <w:bottom w:w="100" w:type="dxa"/>
+              <w:right w:w="100" w:type="dxa"/>
+            </w:tcMar>
+          </w:tcPr>
+          <w:p>
+            <w:r>
+              <w:t>0.2980 (</w:t>
+            </w:r>
+            <w:proofErr w:type="spellStart"/>
+            <w:r>
+              <w:t>standardised</w:t>
+            </w:r>
+            <w:proofErr w:type="spellEnd"/>
+            <w:r>
+              <w:t>)</w:t>
+            </w:r>
+          </w:p>
+        </w:tc>
+        <w:tc>
+          <w:tcPr>
+            <w:tcW w:w="3000" w:type="dxa"/>
+            <w:tcMar>
+              <w:top w:w="100" w:type="dxa"/>
+              <w:left w:w="100" w:type="dxa"/>
+              <w:bottom w:w="100" w:type="dxa"/>
+              <w:right w:w="100" w:type="dxa"/>
+            </w:tcMar>
+          </w:tcPr>
+          <w:p>
+            <w:r>
+              <w:t>404.74 (original units)</w:t>
+            </w:r>
+          </w:p>
+        </w:tc>
+      </w:tr>
+      <w:tr>
+        <w:tc>
+          <w:tcPr>
+            <w:tcW w:w="3000" w:type="dxa"/>
+            <w:tcMar>
+              <w:top w:w="100" w:type="dxa"/>
+              <w:left w:w="100" w:type="dxa"/>
+              <w:bottom w:w="100" w:type="dxa"/>
+              <w:right w:w="100" w:type="dxa"/>
+            </w:tcMar>
+          </w:tcPr>
+          <w:p>
+            <w:r>
+              <w:t>R²</w:t>
+            </w:r>
+          </w:p>
+        </w:tc>
+        <w:tc>
+          <w:tcPr>
+            <w:tcW w:w="3000" w:type="dxa"/>
+            <w:tcMar>
+              <w:top w:w="100" w:type="dxa"/>
+              <w:left w:w="100" w:type="dxa"/>
+              <w:bottom w:w="100" w:type="dxa"/>
+              <w:right w:w="100" w:type="dxa"/>
+            </w:tcMar>
+          </w:tcPr>
+          <w:p>
+            <w:r>
+              <w:t>0.9110</w:t>
+            </w:r>
+          </w:p>
+        </w:tc>
+        <w:tc>
+          <w:tcPr>
+            <w:tcW w:w="3000" w:type="dxa"/>
+            <w:tcMar>
+              <w:top w:w="100" w:type="dxa"/>
+              <w:left w:w="100" w:type="dxa"/>
+              <w:bottom w:w="100" w:type="dxa"/>
+              <w:right w:w="100" w:type="dxa"/>
+            </w:tcMar>
+          </w:tcPr>
+          <w:p>
+            <w:r>
+              <w:t>0.0668</w:t>
+            </w:r>
+          </w:p>
+        </w:tc>
+      </w:tr>
+    </w:tbl>
+    <w:p>
+      <w:pPr>
+        <w:spacing w:after="100"/>
+      </w:pPr>
+    </w:p>
+    <w:p>
+      <w:pPr>
+        <w:spacing w:after="150"/>
+      </w:pPr>
+      <w:r>
+        <w:t>Recorded training/validation MSE loss during training:</w:t>
+      </w:r>
+    </w:p>
+    <w:tbl>
+      <w:tblPr>
+        <w:tblW w:w="9000" w:type="dxa"/>
+        <w:tblBorders>
+          <w:top w:val="single" w:sz="4" w:space="0" w:color="auto"/>
+          <w:left w:val="single" w:sz="4" w:space="0" w:color="auto"/>
+          <w:bottom w:val="single" w:sz="4" w:space="0" w:color="auto"/>
+          <w:right w:val="single" w:sz="4" w:space="0" w:color="auto"/>
+          <w:insideH w:val="single" w:sz="4" w:space="0" w:color="auto"/>
+          <w:insideV w:val="single" w:sz="4" w:space="0" w:color="auto"/>
+        </w:tblBorders>
+        <w:tblCellMar>
+          <w:left w:w="10" w:type="dxa"/>
+          <w:right w:w="10" w:type="dxa"/>
+        </w:tblCellMar>
+        <w:tblLook w:val="04A0" w:firstRow="1" w:lastRow="0" w:firstColumn="1" w:lastColumn="0" w:noHBand="0" w:noVBand="1"/>
+      </w:tblPr>
+      <w:tblGrid>
+        <w:gridCol w:w="3000"/>
+        <w:gridCol w:w="3000"/>
+        <w:gridCol w:w="3000"/>
+      </w:tblGrid>
+      <w:tr>
+        <w:trPr>
+          <w:tblHeader/>
+        </w:trPr>
+        <w:tc>
+          <w:tcPr>
+            <w:tcW w:w="3000" w:type="dxa"/>
+            <w:shd w:val="clear" w:color="auto" w:fill="DDEBF7"/>
+            <w:tcMar>
+              <w:top w:w="100" w:type="dxa"/>
+              <w:left w:w="100" w:type="dxa"/>
+              <w:bottom w:w="100" w:type="dxa"/>
+              <w:right w:w="100" w:type="dxa"/>
+            </w:tcMar>
+          </w:tcPr>
+          <w:p>
+            <w:r>
+              <w:rPr>
+                <w:b/>
+                <w:bCs/>
+              </w:rPr>
+              <w:t>Epoch</w:t>
+            </w:r>
+          </w:p>
+        </w:tc>
+        <w:tc>
+          <w:tcPr>
+            <w:tcW w:w="3000" w:type="dxa"/>
+            <w:shd w:val="clear" w:color="auto" w:fill="DDEBF7"/>
+            <w:tcMar>
+              <w:top w:w="100" w:type="dxa"/>
+              <w:left w:w="100" w:type="dxa"/>
+              <w:bottom w:w="100" w:type="dxa"/>
+              <w:right w:w="100" w:type="dxa"/>
+            </w:tcMar>
+          </w:tcPr>
+          <w:p>
+            <w:r>
+              <w:rPr>
+                <w:b/>
+                <w:bCs/>
+              </w:rPr>
+              <w:t>Train Loss (MSE)</w:t>
+            </w:r>
+          </w:p>
+        </w:tc>
+        <w:tc>
+          <w:tcPr>
+            <w:tcW w:w="3000" w:type="dxa"/>
+            <w:shd w:val="clear" w:color="auto" w:fill="DDEBF7"/>
+            <w:tcMar>
+              <w:top w:w="100" w:type="dxa"/>
+              <w:left w:w="100" w:type="dxa"/>
+              <w:bottom w:w="100" w:type="dxa"/>
+              <w:right w:w="100" w:type="dxa"/>
+            </w:tcMar>
+          </w:tcPr>
+          <w:p>
+            <w:r>
+              <w:rPr>
+                <w:b/>
+                <w:bCs/>
+              </w:rPr>
+              <w:t>Val Loss (MSE)</w:t>
+            </w:r>
+          </w:p>
+        </w:tc>
+      </w:tr>
+      <w:tr>
+        <w:tc>
+          <w:tcPr>
+            <w:tcW w:w="3000" w:type="dxa"/>
+            <w:tcMar>
+              <w:top w:w="100" w:type="dxa"/>
+              <w:left w:w="100" w:type="dxa"/>
+              <w:bottom w:w="100" w:type="dxa"/>
+              <w:right w:w="100" w:type="dxa"/>
+            </w:tcMar>
+          </w:tcPr>
+          <w:p>
+            <w:r>
+              <w:t>0</w:t>
+            </w:r>
+          </w:p>
+        </w:tc>
+        <w:tc>
+          <w:tcPr>
+            <w:tcW w:w="3000" w:type="dxa"/>
+            <w:tcMar>
+              <w:top w:w="100" w:type="dxa"/>
+              <w:left w:w="100" w:type="dxa"/>
+              <w:bottom w:w="100" w:type="dxa"/>
+              <w:right w:w="100" w:type="dxa"/>
+            </w:tcMar>
+          </w:tcPr>
+          <w:p>
+            <w:r>
+              <w:t>0.5010</w:t>
+            </w:r>
+          </w:p>
+        </w:tc>
+        <w:tc>
+          <w:tcPr>
+            <w:tcW w:w="3000" w:type="dxa"/>
+            <w:tcMar>
+              <w:top w:w="100" w:type="dxa"/>
+              <w:left w:w="100" w:type="dxa"/>
+              <w:bottom w:w="100" w:type="dxa"/>
+              <w:right w:w="100" w:type="dxa"/>
+            </w:tcMar>
+          </w:tcPr>
+          <w:p>
+            <w:r>
+              <w:t>0.5224</w:t>
+            </w:r>
+          </w:p>
+        </w:tc>
+      </w:tr>
+      <w:tr>
+        <w:tc>
+          <w:tcPr>
+            <w:tcW w:w="3000" w:type="dxa"/>
+            <w:tcMar>
+              <w:top w:w="100" w:type="dxa"/>
+              <w:left w:w="100" w:type="dxa"/>
+              <w:bottom w:w="100" w:type="dxa"/>
+              <w:right w:w="100" w:type="dxa"/>
+            </w:tcMar>
+          </w:tcPr>
+          <w:p>
+            <w:r>
+              <w:t>50</w:t>
+            </w:r>
+          </w:p>
+        </w:tc>
+        <w:tc>
+          <w:tcPr>
+            <w:tcW w:w="3000" w:type="dxa"/>
+            <w:tcMar>
+              <w:top w:w="100" w:type="dxa"/>
+              <w:left w:w="100" w:type="dxa"/>
+              <w:bottom w:w="100" w:type="dxa"/>
+              <w:right w:w="100" w:type="dxa"/>
+            </w:tcMar>
+          </w:tcPr>
+          <w:p>
+            <w:r>
+              <w:t>0.1605</w:t>
+            </w:r>
+          </w:p>
+        </w:tc>
+        <w:tc>
+          <w:tcPr>
+            <w:tcW w:w="3000" w:type="dxa"/>
+            <w:tcMar>
+              <w:top w:w="100" w:type="dxa"/>
+              <w:left w:w="100" w:type="dxa"/>
+              <w:bottom w:w="100" w:type="dxa"/>
+              <w:right w:w="100" w:type="dxa"/>
+            </w:tcMar>
+          </w:tcPr>
+          <w:p>
+            <w:r>
+              <w:t>0.1819</w:t>
+            </w:r>
+          </w:p>
+        </w:tc>
+      </w:tr>
+      <w:tr>
+        <w:tc>
+          <w:tcPr>
+            <w:tcW w:w="3000" w:type="dxa"/>
+            <w:tcMar>
+              <w:top w:w="100" w:type="dxa"/>
+              <w:left w:w="100" w:type="dxa"/>
+              <w:bottom w:w="100" w:type="dxa"/>
+              <w:right w:w="100" w:type="dxa"/>
+            </w:tcMar>
+          </w:tcPr>
+          <w:p>
+            <w:r>
+              <w:t>100</w:t>
+            </w:r>
+          </w:p>
+        </w:tc>
+        <w:tc>
+          <w:tcPr>
+            <w:tcW w:w="3000" w:type="dxa"/>
+            <w:tcMar>
+              <w:top w:w="100" w:type="dxa"/>
+              <w:left w:w="100" w:type="dxa"/>
+              <w:bottom w:w="100" w:type="dxa"/>
+              <w:right w:w="100" w:type="dxa"/>
+            </w:tcMar>
+          </w:tcPr>
+          <w:p>
+            <w:r>
+              <w:t>0.1203</w:t>
+            </w:r>
+          </w:p>
+        </w:tc>
+        <w:tc>
+          <w:tcPr>
+            <w:tcW w:w="3000" w:type="dxa"/>
+            <w:tcMar>
+              <w:top w:w="100" w:type="dxa"/>
+              <w:left w:w="100" w:type="dxa"/>
+              <w:bottom w:w="100" w:type="dxa"/>
+              <w:right w:w="100" w:type="dxa"/>
+            </w:tcMar>
+          </w:tcPr>
+          <w:p>
+            <w:r>
+              <w:t>0.1544</w:t>
+            </w:r>
+          </w:p>
+        </w:tc>
+      </w:tr>
+      <w:tr>
+        <w:tc>
+          <w:tcPr>
+            <w:tcW w:w="3000" w:type="dxa"/>
+            <w:tcMar>
+              <w:top w:w="100" w:type="dxa"/>
+              <w:left w:w="100" w:type="dxa"/>
+              <w:bottom w:w="100" w:type="dxa"/>
+              <w:right w:w="100" w:type="dxa"/>
+            </w:tcMar>
+          </w:tcPr>
+          <w:p>
+            <w:r>
+              <w:t>150</w:t>
+            </w:r>
+          </w:p>
+        </w:tc>
+        <w:tc>
+          <w:tcPr>
+            <w:tcW w:w="3000" w:type="dxa"/>
+            <w:tcMar>
+              <w:top w:w="100" w:type="dxa"/>
+              <w:left w:w="100" w:type="dxa"/>
+              <w:bottom w:w="100" w:type="dxa"/>
+              <w:right w:w="100" w:type="dxa"/>
+            </w:tcMar>
+          </w:tcPr>
+          <w:p>
+            <w:r>
+              <w:t>0.1017</w:t>
+            </w:r>
+          </w:p>
+        </w:tc>
+        <w:tc>
+          <w:tcPr>
+            <w:tcW w:w="3000" w:type="dxa"/>
+            <w:tcMar>
+              <w:top w:w="100" w:type="dxa"/>
+              <w:left w:w="100" w:type="dxa"/>
+              <w:bottom w:w="100" w:type="dxa"/>
+              <w:right w:w="100" w:type="dxa"/>
+            </w:tcMar>
+          </w:tcPr>
+          <w:p>
+            <w:r>
+              <w:t>0.1427</w:t>
+            </w:r>
+          </w:p>
+        </w:tc>
+      </w:tr>
+      <w:tr>
+        <w:tc>
+          <w:tcPr>
+            <w:tcW w:w="3000" w:type="dxa"/>
+            <w:tcMar>
+              <w:top w:w="100" w:type="dxa"/>
+              <w:left w:w="100" w:type="dxa"/>
+              <w:bottom w:w="100" w:type="dxa"/>
+              <w:right w:w="100" w:type="dxa"/>
+            </w:tcMar>
+          </w:tcPr>
+          <w:p>
+            <w:r>
+              <w:t>200</w:t>
+            </w:r>
+          </w:p>
+        </w:tc>
+        <w:tc>
+          <w:tcPr>
+            <w:tcW w:w="3000" w:type="dxa"/>
+            <w:tcMar>
+              <w:top w:w="100" w:type="dxa"/>
+              <w:left w:w="100" w:type="dxa"/>
+              <w:bottom w:w="100" w:type="dxa"/>
+              <w:right w:w="100" w:type="dxa"/>
+            </w:tcMar>
+          </w:tcPr>
+          <w:p>
+            <w:r>
+              <w:t>0.0828</w:t>
+            </w:r>
+          </w:p>
+        </w:tc>
+        <w:tc>
+          <w:tcPr>
+            <w:tcW w:w="3000" w:type="dxa"/>
+            <w:tcMar>
+              <w:top w:w="100" w:type="dxa"/>
+              <w:left w:w="100" w:type="dxa"/>
+              <w:bottom w:w="100" w:type="dxa"/>
+              <w:right w:w="100" w:type="dxa"/>
+            </w:tcMar>
+          </w:tcPr>
+          <w:p>
+            <w:r>
+              <w:t>0.1359</w:t>
+            </w:r>
+          </w:p>
+        </w:tc>
+      </w:tr>
+    </w:tbl>
+    <w:p>
+      <w:pPr>
+        <w:spacing w:after="100"/>
+      </w:pPr>
+    </w:p>
+    <w:p>
+      <w:pPr>
+        <w:spacing w:after="300"/>
+        <w:jc w:val="center"/>
+      </w:pPr>
+      <w:r>
+        <w:rPr>
+          <w:noProof/>
+        </w:rPr>
+        <w:drawing>
+          <wp:inline distT="0" distB="0" distL="0" distR="0" wp14:anchorId="17786C50" wp14:editId="1EAA92DB">
+            <wp:extent cx="5731510" cy="3895725"/>
+            <wp:effectExtent l="0" t="0" r="2540" b="9525"/>
+            <wp:docPr id="1933813212" name="Picture 8"/>
+            <wp:cNvGraphicFramePr>
+              <a:graphicFrameLocks xmlns:a="http://schemas.openxmlformats.org/drawingml/2006/main" noChangeAspect="1"/>
+            </wp:cNvGraphicFramePr>
+            <a:graphic xmlns:a="http://schemas.openxmlformats.org/drawingml/2006/main">
+              <a:graphicData uri="http://schemas.openxmlformats.org/drawingml/2006/picture">
+                <pic:pic xmlns:pic="http://schemas.openxmlformats.org/drawingml/2006/picture">
+                  <pic:nvPicPr>
+                    <pic:cNvPr id="0" name="Picture 15"/>
+                    <pic:cNvPicPr>
+                      <a:picLocks noChangeAspect="1" noChangeArrowheads="1"/>
+                    </pic:cNvPicPr>
+                  </pic:nvPicPr>
+                  <pic:blipFill>
+                    <a:blip r:embed="rId14">
+                      <a:extLst>
+                        <a:ext uri="{28A0092B-C50C-407E-A947-70E740481C1C}">
+                          <a14:useLocalDpi xmlns:a14="http://schemas.microsoft.com/office/drawing/2010/main" val="0"/>
+                        </a:ext>
+                      </a:extLst>
+                    </a:blip>
+                    <a:srcRect/>
+                    <a:stretch>
+                      <a:fillRect/>
+                    </a:stretch>
+                  </pic:blipFill>
+                  <pic:spPr bwMode="auto">
+                    <a:xfrm>
+                      <a:off x="0" y="0"/>
+                      <a:ext cx="5731510" cy="3895725"/>
+                    </a:xfrm>
+                    <a:prstGeom prst="rect">
+                      <a:avLst/>
+                    </a:prstGeom>
+                    <a:noFill/>
+                    <a:ln>
+                      <a:noFill/>
+                    </a:ln>
+                  </pic:spPr>
+                </pic:pic>
+              </a:graphicData>
+            </a:graphic>
+          </wp:inline>
+        </w:drawing>
+      </w:r>
+      <w:r>
+        <w:rPr>
+          <w:i/>
+          <w:iCs/>
+          <w:sz w:val="18"/>
+          <w:szCs w:val="18"/>
+        </w:rPr>
         <w:t>Figure 8.3: Model 3 (Multivariate) training/validation loss convergence.</w:t>
       </w:r>
     </w:p>
@@ -6254,7 +6755,15 @@
         <w:t>story and</w:t>
       </w:r>
       <w:r>
-        <w:t xml:space="preserve"> is the metric that actually matters for AgriWebb's stated goal of predicting future pasture availability.</w:t>
+        <w:t xml:space="preserve"> is the metric that actually matters for </w:t>
+      </w:r>
+      <w:proofErr w:type="spellStart"/>
+      <w:r>
+        <w:t>AgriWebb's</w:t>
+      </w:r>
+      <w:proofErr w:type="spellEnd"/>
+      <w:r>
+        <w:t xml:space="preserve"> stated goal of predicting future pasture availability.</w:t>
       </w:r>
     </w:p>
     <w:p>
@@ -6954,7 +7463,15 @@
         <w:spacing w:after="150"/>
       </w:pPr>
       <w:r>
-        <w:t xml:space="preserve">For AgriWebb, these results suggest the current multivariate model should not be deployed as-is for operational forecasting, despite its strong training fit: a Test R² of 0.07 means it explains almost none of the variance in genuinely future pasture </w:t>
+        <w:t xml:space="preserve">For </w:t>
+      </w:r>
+      <w:proofErr w:type="spellStart"/>
+      <w:r>
+        <w:t>AgriWebb</w:t>
+      </w:r>
+      <w:proofErr w:type="spellEnd"/>
+      <w:r>
+        <w:t xml:space="preserve">, these results suggest the current multivariate model should not be deployed as-is for operational forecasting, despite its strong training fit: a Test R² of 0.07 means it explains almost none of the variance in genuinely future pasture </w:t>
       </w:r>
       <w:r>
         <w:t>growth and</w:t>
@@ -6966,7 +7483,15 @@
         <w:t>considering</w:t>
       </w:r>
       <w:r>
-        <w:t xml:space="preserve"> per-paddock or per-cluster fine-tuning rather than one shared model across all 19 paddocks; gathering more historical timesteps per paddock before adding additional input features; and applying stronger regularisation (e.g., increased dropout, L2 weight decay) specifically for the multivariate model given its clear overfitting signature. Until such improvements are validated on genuine forecasting performance, model outputs should be treated as indicative at best for volatile paddocks (train std &gt; ~450), and used with more confidence only for paddocks with historically stable, low-variability growth patterns.</w:t>
+        <w:t xml:space="preserve"> per-paddock or per-cluster fine-tuning rather than one shared model across all 19 paddocks; gathering more historical timesteps per paddock before adding additional input features; and applying stronger </w:t>
+      </w:r>
+      <w:proofErr w:type="spellStart"/>
+      <w:r>
+        <w:t>regularisation</w:t>
+      </w:r>
+      <w:proofErr w:type="spellEnd"/>
+      <w:r>
+        <w:t xml:space="preserve"> (e.g., increased dropout, L2 weight decay) specifically for the multivariate model given its clear overfitting signature. Until such improvements are validated on genuine forecasting performance, model outputs should be treated as indicative at best for volatile paddocks (train std &gt; ~450), and used with more confidence only for paddocks with historically stable, low-variability growth patterns.</w:t>
       </w:r>
     </w:p>
     <w:p>
@@ -6997,7 +7522,15 @@
         <w:spacing w:after="150"/>
       </w:pPr>
       <w:r>
-        <w:t>The hydrogen_small dataset contains 1,000 tweets, with a class distribution of 547 Relevant and 453 Irrelevant (54.7% / 45.3%).</w:t>
+        <w:t xml:space="preserve">The </w:t>
+      </w:r>
+      <w:proofErr w:type="spellStart"/>
+      <w:r>
+        <w:t>hydrogen_small</w:t>
+      </w:r>
+      <w:proofErr w:type="spellEnd"/>
+      <w:r>
+        <w:t xml:space="preserve"> dataset contains 1,000 tweets, with a class distribution of 547 Relevant and 453 Irrelevant (54.7% / 45.3%).</w:t>
       </w:r>
     </w:p>
     <w:p>
@@ -7016,7 +7549,15 @@
         <w:t>normalized</w:t>
       </w:r>
       <w:r>
-        <w:t xml:space="preserve"> to single spaces. Raw tweets are noisy — links, handles, and stray symbols carry no topical signal and would otherwise be tokenised as meaningless sub-word units, diluting the input the model actually needs to attend to.</w:t>
+        <w:t xml:space="preserve"> to single spaces. Raw tweets are noisy — links, handles, and stray symbols carry no topical signal and would otherwise be </w:t>
+      </w:r>
+      <w:proofErr w:type="spellStart"/>
+      <w:r>
+        <w:t>tokenised</w:t>
+      </w:r>
+      <w:proofErr w:type="spellEnd"/>
+      <w:r>
+        <w:t xml:space="preserve"> as meaningless sub-word units, diluting the input the model actually needs to attend to.</w:t>
       </w:r>
     </w:p>
     <w:p>
@@ -7029,7 +7570,15 @@
         <w:spacing w:after="80"/>
       </w:pPr>
       <w:r>
-        <w:t>Label encoding: labels were mapped to binary integers, Relevant = 1 and Irrelevant = 0, since AutoModelForSequenceClassification and Cross-Entropy Loss require integer class targets rather than string labels.</w:t>
+        <w:t xml:space="preserve">Label encoding: labels were mapped to binary integers, Relevant = 1 and Irrelevant = 0, since </w:t>
+      </w:r>
+      <w:proofErr w:type="spellStart"/>
+      <w:r>
+        <w:t>AutoModelForSequenceClassification</w:t>
+      </w:r>
+      <w:proofErr w:type="spellEnd"/>
+      <w:r>
+        <w:t xml:space="preserve"> and Cross-Entropy Loss require integer class targets rather than string labels.</w:t>
       </w:r>
     </w:p>
     <w:p>
@@ -7041,8 +7590,13 @@
         </w:numPr>
         <w:spacing w:after="80"/>
       </w:pPr>
-      <w:r>
-        <w:t>Tokenisation: each model's own tokenizer was used with truncation and dynamic padding up to a maximum length of 128 tokens, ensuring uniform tensor shapes for batched GPU training while keeping sequence length short enough (tweets are short by nature) to avoid unnecessary computation.</w:t>
+      <w:proofErr w:type="spellStart"/>
+      <w:r>
+        <w:t>Tokenisation</w:t>
+      </w:r>
+      <w:proofErr w:type="spellEnd"/>
+      <w:r>
+        <w:t>: each model's own tokenizer was used with truncation and dynamic padding up to a maximum length of 128 tokens, ensuring uniform tensor shapes for batched GPU training while keeping sequence length short enough (tweets are short by nature) to avoid unnecessary computation.</w:t>
       </w:r>
     </w:p>
     <w:p>
@@ -7143,8 +7697,13 @@
             </w:tcMar>
           </w:tcPr>
           <w:p>
-            <w:r>
-              <w:t>bert-base-uncased</w:t>
+            <w:proofErr w:type="spellStart"/>
+            <w:r>
+              <w:t>bert</w:t>
+            </w:r>
+            <w:proofErr w:type="spellEnd"/>
+            <w:r>
+              <w:t>-base-uncased</w:t>
             </w:r>
           </w:p>
         </w:tc>
@@ -7160,7 +7719,15 @@
           </w:tcPr>
           <w:p>
             <w:r>
-              <w:t>General-domain bidirectional transformer pre-trained on Wikipedia and BookCorpus; serves as a reliable, well-understood benchmark.</w:t>
+              <w:t xml:space="preserve">General-domain bidirectional transformer pre-trained on Wikipedia and </w:t>
+            </w:r>
+            <w:proofErr w:type="spellStart"/>
+            <w:r>
+              <w:t>BookCorpus</w:t>
+            </w:r>
+            <w:proofErr w:type="spellEnd"/>
+            <w:r>
+              <w:t>; serves as a reliable, well-understood benchmark.</w:t>
             </w:r>
           </w:p>
         </w:tc>
@@ -7177,8 +7744,21 @@
             </w:tcMar>
           </w:tcPr>
           <w:p>
-            <w:r>
-              <w:t>vinai/bertweet-base</w:t>
+            <w:proofErr w:type="spellStart"/>
+            <w:r>
+              <w:t>vinai</w:t>
+            </w:r>
+            <w:proofErr w:type="spellEnd"/>
+            <w:r>
+              <w:t>/</w:t>
+            </w:r>
+            <w:proofErr w:type="spellStart"/>
+            <w:r>
+              <w:t>bertweet</w:t>
+            </w:r>
+            <w:proofErr w:type="spellEnd"/>
+            <w:r>
+              <w:t>-base</w:t>
             </w:r>
           </w:p>
         </w:tc>
@@ -7193,8 +7773,21 @@
             </w:tcMar>
           </w:tcPr>
           <w:p>
-            <w:r>
-              <w:t>RoBERTa-based model pre-trained on 850 million English tweets, specifically optimised for Twitter slang, syntax, and informal phrasing — matches the register of the target data.</w:t>
+            <w:proofErr w:type="spellStart"/>
+            <w:r>
+              <w:t>RoBERTa</w:t>
+            </w:r>
+            <w:proofErr w:type="spellEnd"/>
+            <w:r>
+              <w:t xml:space="preserve">-based model pre-trained on 850 million English tweets, specifically </w:t>
+            </w:r>
+            <w:proofErr w:type="spellStart"/>
+            <w:r>
+              <w:t>optimised</w:t>
+            </w:r>
+            <w:proofErr w:type="spellEnd"/>
+            <w:r>
+              <w:t xml:space="preserve"> for Twitter slang, syntax, and informal phrasing — matches the register of the target data.</w:t>
             </w:r>
           </w:p>
         </w:tc>
@@ -7224,7 +7817,15 @@
         <w:spacing w:after="80"/>
       </w:pPr>
       <w:r>
-        <w:t>Split: stratified 70/30 (700 train / 300 test), random_state=42 — stratification preserves the 54.7%/45.3% class balance in both subsets.</w:t>
+        <w:t xml:space="preserve">Split: stratified 70/30 (700 train / 300 test), </w:t>
+      </w:r>
+      <w:proofErr w:type="spellStart"/>
+      <w:r>
+        <w:t>random_state</w:t>
+      </w:r>
+      <w:proofErr w:type="spellEnd"/>
+      <w:r>
+        <w:t>=42 — stratification preserves the 54.7%/45.3% class balance in both subsets.</w:t>
       </w:r>
     </w:p>
     <w:p>
@@ -7237,7 +7838,23 @@
         <w:spacing w:after="80"/>
       </w:pPr>
       <w:r>
-        <w:t>Loss function: standard Cross-Entropy Loss via AutoModelForSequenceClassification. This is the appropriate loss for binary classification because it is derived from negative log-likelihood and heavily penalises confident, incorrect probability predictions, encouraging well-calibrated outputs.</w:t>
+        <w:t xml:space="preserve">Loss function: standard Cross-Entropy Loss via </w:t>
+      </w:r>
+      <w:proofErr w:type="spellStart"/>
+      <w:r>
+        <w:t>AutoModelForSequenceClassification</w:t>
+      </w:r>
+      <w:proofErr w:type="spellEnd"/>
+      <w:r>
+        <w:t xml:space="preserve">. This is the appropriate loss for binary classification because it is derived from negative log-likelihood and heavily </w:t>
+      </w:r>
+      <w:proofErr w:type="spellStart"/>
+      <w:r>
+        <w:t>penalises</w:t>
+      </w:r>
+      <w:proofErr w:type="spellEnd"/>
+      <w:r>
+        <w:t xml:space="preserve"> confident, incorrect probability predictions, encouraging well-calibrated outputs.</w:t>
       </w:r>
     </w:p>
     <w:p>
@@ -7263,7 +7880,23 @@
         <w:spacing w:after="80"/>
       </w:pPr>
       <w:r>
-        <w:t xml:space="preserve">Hyperparameters: 3 epochs, batch size 16 (train) / 32 (eval), learning rate 2e-5 with the AdamW optimiser, weight decay 0.01 for L2 </w:t>
+        <w:t xml:space="preserve">Hyperparameters: 3 epochs, batch size 16 (train) / 32 (eval), learning rate 2e-5 with the </w:t>
+      </w:r>
+      <w:proofErr w:type="spellStart"/>
+      <w:r>
+        <w:t>AdamW</w:t>
+      </w:r>
+      <w:proofErr w:type="spellEnd"/>
+      <w:r>
+        <w:t xml:space="preserve"> </w:t>
+      </w:r>
+      <w:proofErr w:type="spellStart"/>
+      <w:r>
+        <w:t>optimiser</w:t>
+      </w:r>
+      <w:proofErr w:type="spellEnd"/>
+      <w:r>
+        <w:t xml:space="preserve">, weight decay 0.01 for L2 </w:t>
       </w:r>
       <w:r>
         <w:t>regularization</w:t>
@@ -7383,8 +8016,13 @@
             </w:tcMar>
           </w:tcPr>
           <w:p>
-            <w:r>
-              <w:t>bert-base-uncased</w:t>
+            <w:proofErr w:type="spellStart"/>
+            <w:r>
+              <w:t>bert</w:t>
+            </w:r>
+            <w:proofErr w:type="spellEnd"/>
+            <w:r>
+              <w:t>-base-uncased</w:t>
             </w:r>
           </w:p>
         </w:tc>
@@ -7433,8 +8071,21 @@
             </w:tcMar>
           </w:tcPr>
           <w:p>
-            <w:r>
-              <w:t>vinai/bertweet-base</w:t>
+            <w:proofErr w:type="spellStart"/>
+            <w:r>
+              <w:t>vinai</w:t>
+            </w:r>
+            <w:proofErr w:type="spellEnd"/>
+            <w:r>
+              <w:t>/</w:t>
+            </w:r>
+            <w:proofErr w:type="spellStart"/>
+            <w:r>
+              <w:t>bertweet</w:t>
+            </w:r>
+            <w:proofErr w:type="spellEnd"/>
+            <w:r>
+              <w:t>-base</w:t>
             </w:r>
           </w:p>
         </w:tc>
@@ -7482,7 +8133,31 @@
         <w:spacing w:after="150"/>
       </w:pPr>
       <w:r>
-        <w:t xml:space="preserve">Note that bert-base-uncased shows a larger train–test gap (97.14% → 91.67%) than bertweet-base (94.43% → 93.33%), suggesting bertweet-base </w:t>
+        <w:t xml:space="preserve">Note that </w:t>
+      </w:r>
+      <w:proofErr w:type="spellStart"/>
+      <w:r>
+        <w:t>bert</w:t>
+      </w:r>
+      <w:proofErr w:type="spellEnd"/>
+      <w:r>
+        <w:t xml:space="preserve">-base-uncased shows a larger train–test gap (97.14% → 91.67%) than </w:t>
+      </w:r>
+      <w:proofErr w:type="spellStart"/>
+      <w:r>
+        <w:t>bertweet</w:t>
+      </w:r>
+      <w:proofErr w:type="spellEnd"/>
+      <w:r>
+        <w:t xml:space="preserve">-base (94.43% → 93.33%), suggesting </w:t>
+      </w:r>
+      <w:proofErr w:type="spellStart"/>
+      <w:r>
+        <w:t>bertweet</w:t>
+      </w:r>
+      <w:proofErr w:type="spellEnd"/>
+      <w:r>
+        <w:t xml:space="preserve">-base </w:t>
       </w:r>
       <w:r>
         <w:t>generalizes</w:t>
@@ -7505,7 +8180,23 @@
         <w:spacing w:after="150"/>
       </w:pPr>
       <w:r>
-        <w:t>Attention weights were averaged across all layers and heads of the best-performing model (vinai/bertweet-base) for one correctly classified tweet from each class.</w:t>
+        <w:t>Attention weights were averaged across all layers and heads of the best-performing model (</w:t>
+      </w:r>
+      <w:proofErr w:type="spellStart"/>
+      <w:r>
+        <w:t>vinai</w:t>
+      </w:r>
+      <w:proofErr w:type="spellEnd"/>
+      <w:r>
+        <w:t>/</w:t>
+      </w:r>
+      <w:proofErr w:type="spellStart"/>
+      <w:r>
+        <w:t>bertweet</w:t>
+      </w:r>
+      <w:proofErr w:type="spellEnd"/>
+      <w:r>
+        <w:t>-base) for one correctly classified tweet from each class.</w:t>
       </w:r>
     </w:p>
     <w:p>
@@ -7535,7 +8226,7 @@
                     </pic:cNvPicPr>
                   </pic:nvPicPr>
                   <pic:blipFill>
-                    <a:blip r:embed="rId14">
+                    <a:blip r:embed="rId15">
                       <a:extLst>
                         <a:ext uri="{28A0092B-C50C-407E-A947-70E740481C1C}">
                           <a14:useLocalDpi xmlns:a14="http://schemas.microsoft.com/office/drawing/2010/main" val="0"/>
@@ -7603,7 +8294,7 @@
                     </pic:cNvPicPr>
                   </pic:nvPicPr>
                   <pic:blipFill>
-                    <a:blip r:embed="rId15">
+                    <a:blip r:embed="rId16">
                       <a:extLst>
                         <a:ext uri="{28A0092B-C50C-407E-A947-70E740481C1C}">
                           <a14:useLocalDpi xmlns:a14="http://schemas.microsoft.com/office/drawing/2010/main" val="0"/>
@@ -7939,8 +8630,13 @@
             </w:tcMar>
           </w:tcPr>
           <w:p>
-            <w:r>
-              <w:t>bert-base-uncased</w:t>
+            <w:proofErr w:type="spellStart"/>
+            <w:r>
+              <w:t>bert</w:t>
+            </w:r>
+            <w:proofErr w:type="spellEnd"/>
+            <w:r>
+              <w:t>-base-uncased</w:t>
             </w:r>
           </w:p>
         </w:tc>
@@ -8037,8 +8733,21 @@
             </w:tcMar>
           </w:tcPr>
           <w:p>
-            <w:r>
-              <w:t>vinai/bertweet-base (Best)</w:t>
+            <w:proofErr w:type="spellStart"/>
+            <w:r>
+              <w:t>vinai</w:t>
+            </w:r>
+            <w:proofErr w:type="spellEnd"/>
+            <w:r>
+              <w:t>/</w:t>
+            </w:r>
+            <w:proofErr w:type="spellStart"/>
+            <w:r>
+              <w:t>bertweet</w:t>
+            </w:r>
+            <w:proofErr w:type="spellEnd"/>
+            <w:r>
+              <w:t>-base (Best)</w:t>
             </w:r>
           </w:p>
         </w:tc>
@@ -8156,7 +8865,7 @@
                     </pic:cNvPicPr>
                   </pic:nvPicPr>
                   <pic:blipFill>
-                    <a:blip r:embed="rId16">
+                    <a:blip r:embed="rId17">
                       <a:extLst>
                         <a:ext uri="{28A0092B-C50C-407E-A947-70E740481C1C}">
                           <a14:useLocalDpi xmlns:a14="http://schemas.microsoft.com/office/drawing/2010/main" val="0"/>
@@ -8202,7 +8911,23 @@
         <w:spacing w:after="150"/>
       </w:pPr>
       <w:r>
-        <w:t>BERT outperformed the TF-IDF logistic regression baseline across every metric: test accuracy rose from 89.67% to 93.33%, and ROC-AUC from 0.963 to 0.985. This is expected because every tweet in this dataset contains the keyword "hydrogen" by construction, so the discriminative signal depends entirely on surrounding context (e.g., "green/blue hydrogen" for clean energy vs. "hydrogen responsive template" for web design). The logistic regression model treats text as an unordered bag of TF-IDF weighted words and cannot capture this context-dependent meaning, whereas BERT's self-attention mechanism explicitly models bidirectional dependencies between words. BERTweet's further improvement over bert-base-uncased is attributable to its vocabulary and pretraining being specifically matched to informal, social-media text.</w:t>
+        <w:t xml:space="preserve">BERT outperformed the TF-IDF logistic regression baseline across every metric: test accuracy rose from 89.67% to 93.33%, and ROC-AUC from 0.963 to 0.985. This is expected because every tweet in this dataset contains the keyword "hydrogen" by construction, so the discriminative signal depends entirely on surrounding context (e.g., "green/blue hydrogen" for clean energy vs. "hydrogen responsive template" for web design). The logistic regression model treats text as an unordered bag of TF-IDF weighted words and cannot capture this context-dependent meaning, whereas BERT's self-attention mechanism explicitly models bidirectional dependencies between words. </w:t>
+      </w:r>
+      <w:proofErr w:type="spellStart"/>
+      <w:r>
+        <w:t>BERTweet's</w:t>
+      </w:r>
+      <w:proofErr w:type="spellEnd"/>
+      <w:r>
+        <w:t xml:space="preserve"> further improvement over </w:t>
+      </w:r>
+      <w:proofErr w:type="spellStart"/>
+      <w:r>
+        <w:t>bert</w:t>
+      </w:r>
+      <w:proofErr w:type="spellEnd"/>
+      <w:r>
+        <w:t>-base-uncased is attributable to its vocabulary and pretraining being specifically matched to informal, social-media text.</w:t>
       </w:r>
     </w:p>
     <w:p>
@@ -8225,7 +8950,15 @@
         <w:spacing w:before="300" w:after="150"/>
       </w:pPr>
       <w:r>
-        <w:t>10.1 Preprocessing SQuAD_tiny for T5</w:t>
+        <w:t xml:space="preserve">10.1 Preprocessing </w:t>
+      </w:r>
+      <w:proofErr w:type="spellStart"/>
+      <w:r>
+        <w:t>SQuAD_tiny</w:t>
+      </w:r>
+      <w:proofErr w:type="spellEnd"/>
+      <w:r>
+        <w:t xml:space="preserve"> for T5</w:t>
       </w:r>
     </w:p>
     <w:p>
@@ -8251,16 +8984,15 @@
         <w:spacing w:after="80"/>
       </w:pPr>
       <w:r>
-        <w:t>Tokenization</w:t>
-      </w:r>
-      <w:r>
-        <w:t xml:space="preserve">: inputs were </w:t>
-      </w:r>
-      <w:r>
-        <w:t>tokenized</w:t>
-      </w:r>
-      <w:r>
-        <w:t xml:space="preserve"> to a maximum length of 512 tokens (long enough to hold the SQuAD context passage plus the question) and target answers to a maximum of 128 tokens, both with padding and truncation for uniform batch shapes.</w:t>
+        <w:t xml:space="preserve">Tokenization: inputs were tokenized to a maximum length of 512 tokens (long enough to hold the </w:t>
+      </w:r>
+      <w:proofErr w:type="spellStart"/>
+      <w:r>
+        <w:t>SQuAD</w:t>
+      </w:r>
+      <w:proofErr w:type="spellEnd"/>
+      <w:r>
+        <w:t xml:space="preserve"> context passage plus the question) and target answers to a maximum of 128 tokens, both with padding and truncation for uniform batch shapes.</w:t>
       </w:r>
     </w:p>
     <w:p>
@@ -8273,7 +9005,39 @@
         <w:spacing w:after="80"/>
       </w:pPr>
       <w:r>
-        <w:t>Dataset split: 1,000 training examples (SQuAD train indices 10,000–10,999), 100 validation examples (SQuAD validation indices 3,000–3,099), and 100 test examples (SQuAD validation indices 3,100–3,199), following the SQuAD_tiny construction specified in the assignment.</w:t>
+        <w:t>Dataset split: 1,000 training examples (</w:t>
+      </w:r>
+      <w:proofErr w:type="spellStart"/>
+      <w:r>
+        <w:t>SQuAD</w:t>
+      </w:r>
+      <w:proofErr w:type="spellEnd"/>
+      <w:r>
+        <w:t xml:space="preserve"> train indices 10,000–10,999), 100 validation examples (</w:t>
+      </w:r>
+      <w:proofErr w:type="spellStart"/>
+      <w:r>
+        <w:t>SQuAD</w:t>
+      </w:r>
+      <w:proofErr w:type="spellEnd"/>
+      <w:r>
+        <w:t xml:space="preserve"> validation indices 3,000–3,099), and 100 test examples (</w:t>
+      </w:r>
+      <w:proofErr w:type="spellStart"/>
+      <w:r>
+        <w:t>SQuAD</w:t>
+      </w:r>
+      <w:proofErr w:type="spellEnd"/>
+      <w:r>
+        <w:t xml:space="preserve"> validation indices 3,100–3,199), following the </w:t>
+      </w:r>
+      <w:proofErr w:type="spellStart"/>
+      <w:r>
+        <w:t>SQuAD_tiny</w:t>
+      </w:r>
+      <w:proofErr w:type="spellEnd"/>
+      <w:r>
+        <w:t xml:space="preserve"> construction specified in the assignment.</w:t>
       </w:r>
     </w:p>
     <w:p>
@@ -8298,7 +9062,15 @@
         <w:spacing w:after="150"/>
       </w:pPr>
       <w:r>
-        <w:t>Hyperparameters: 3 epochs, per-device batch size 8 (train and eval), learning rate 3e-4, weight decay 0.01, using Hugging Face's Trainer/TrainingArguments with epoch-level evaluation and checkpointing.</w:t>
+        <w:t>Hyperparameters: 3 epochs, per-device batch size 8 (train and eval), learning rate 3e-4, weight decay 0.01, using Hugging Face's Trainer/</w:t>
+      </w:r>
+      <w:proofErr w:type="spellStart"/>
+      <w:r>
+        <w:t>TrainingArguments</w:t>
+      </w:r>
+      <w:proofErr w:type="spellEnd"/>
+      <w:r>
+        <w:t xml:space="preserve"> with epoch-level evaluation and checkpointing.</w:t>
       </w:r>
     </w:p>
     <w:p>
@@ -8582,7 +9354,15 @@
         <w:t>regularization</w:t>
       </w:r>
       <w:r>
-        <w:t xml:space="preserve"> on model weights; a comparatively short fine-tuning run (3 epochs) was used given the small 1,000-example training set, and was further supported by the observed validation loss uptick at epoch 3 above; and a held-out validation set (100 examples, drawn from a different SQuAD split range to the training set) was evaluated after every epoch so that validation loss could be monitored for divergence from training loss.</w:t>
+        <w:t xml:space="preserve"> on model weights; a comparatively short fine-tuning run (3 epochs) was used given the small 1,000-example training set, and was further supported by the observed validation loss uptick at epoch 3 above; and a held-out validation set (100 examples, drawn from a different </w:t>
+      </w:r>
+      <w:proofErr w:type="spellStart"/>
+      <w:r>
+        <w:t>SQuAD</w:t>
+      </w:r>
+      <w:proofErr w:type="spellEnd"/>
+      <w:r>
+        <w:t xml:space="preserve"> split range to the training set) was evaluated after every epoch so that validation loss could be monitored for divergence from training loss.</w:t>
       </w:r>
     </w:p>
     <w:p>
@@ -9567,7 +10347,15 @@
         <w:t>memorized</w:t>
       </w:r>
       <w:r>
-        <w:t xml:space="preserve"> SQuAD facts during fine-tuning; it has learned to locate and extract spans from a supplied context, not to answer general-knowledge questions from parametric memory.</w:t>
+        <w:t xml:space="preserve"> </w:t>
+      </w:r>
+      <w:proofErr w:type="spellStart"/>
+      <w:r>
+        <w:t>SQuAD</w:t>
+      </w:r>
+      <w:proofErr w:type="spellEnd"/>
+      <w:r>
+        <w:t xml:space="preserve"> facts during fine-tuning; it has learned to locate and extract spans from a supplied context, not to answer general-knowledge questions from parametric memory.</w:t>
       </w:r>
     </w:p>
     <w:p>
@@ -9581,7 +10369,15 @@
         <w:t>knowledge but</w:t>
       </w:r>
       <w:r>
-        <w:t xml:space="preserve"> is entirely sufficient to teach it the SQuAD task format of locating an answer within a given passage.</w:t>
+        <w:t xml:space="preserve"> is entirely sufficient to teach it the </w:t>
+      </w:r>
+      <w:proofErr w:type="spellStart"/>
+      <w:r>
+        <w:t>SQuAD</w:t>
+      </w:r>
+      <w:proofErr w:type="spellEnd"/>
+      <w:r>
+        <w:t xml:space="preserve"> task format of locating an answer within a given passage.</w:t>
       </w:r>
     </w:p>
     <w:p>
@@ -10363,7 +11159,15 @@
           </w:tcPr>
           <w:p>
             <w:r>
-              <w:t>Fine-tuned t5-small (SQuAD_tiny)</w:t>
+              <w:t>Fine-tuned t5-small (</w:t>
+            </w:r>
+            <w:proofErr w:type="spellStart"/>
+            <w:r>
+              <w:t>SQuAD_tiny</w:t>
+            </w:r>
+            <w:proofErr w:type="spellEnd"/>
+            <w:r>
+              <w:t>)</w:t>
             </w:r>
           </w:p>
         </w:tc>
@@ -10493,7 +11297,23 @@
         <w:spacing w:after="150"/>
       </w:pPr>
       <w:r>
-        <w:t>Counter-intuitively, the pre-trained mrm8488/t5-base-finetuned-squadv2 model scored lower than the team's own fine-tuned t5-small on every ROUGE variant (e.g., ROUGE-1 F: 0.5323 vs. 0.5749), despite being a larger base architecture (t5-base) trained on the full SQuAD dataset (~87,000+ examples) rather than the 1,000-example SQuAD_tiny subset.</w:t>
+        <w:t xml:space="preserve">Counter-intuitively, the pre-trained mrm8488/t5-base-finetuned-squadv2 model scored lower than the team's own fine-tuned t5-small on every ROUGE variant (e.g., ROUGE-1 F: 0.5323 vs. 0.5749), despite being a larger base architecture (t5-base) trained on the full </w:t>
+      </w:r>
+      <w:proofErr w:type="spellStart"/>
+      <w:r>
+        <w:t>SQuAD</w:t>
+      </w:r>
+      <w:proofErr w:type="spellEnd"/>
+      <w:r>
+        <w:t xml:space="preserve"> dataset (~87,000+ examples) rather than the 1,000-example </w:t>
+      </w:r>
+      <w:proofErr w:type="spellStart"/>
+      <w:r>
+        <w:t>SQuAD_tiny</w:t>
+      </w:r>
+      <w:proofErr w:type="spellEnd"/>
+      <w:r>
+        <w:t xml:space="preserve"> subset.</w:t>
       </w:r>
     </w:p>
     <w:p>
@@ -10501,7 +11321,63 @@
         <w:spacing w:after="150"/>
       </w:pPr>
       <w:r>
-        <w:t xml:space="preserve">Two explanations plausibly account for this reversal. First, a domain/format match effect: the team's model was fine-tuned directly on training data drawn from the same SQuAD dataset structure and answer-length conventions as the test set (indices 3,100–3,199 of the SQuAD validation split), so its output style is closely matched to this specific evaluation set, whereas mrm8488 was shaped by the full, more heterogeneous SQuAD v1 training distribution and may produce longer or differently-phrased spans that reduce lexical overlap even when correct. Second, a SQuAD v2 vs. v1 mismatch: mrm8488 was fine-tuned on SQuAD v2, which includes unanswerable questions and trains the model to sometimes hedge or decline to answer; since every question in the SQuAD_tiny test set (drawn from SQuAD v1-style data) does have an answer, a v2-trained model's more conservative answer style may reduce its measured overlap with the always-present reference answers even when its underlying answers are semantically reasonable. This also highlights a genuine limitation of ROUGE as an evaluation metric: it measures lexical overlap only, not factual correctness, so it is possible the pre-trained model's answers remain accurate but are phrased differently enough from the references to be </w:t>
+        <w:t xml:space="preserve">Two explanations plausibly account for this reversal. First, a domain/format match effect: the team's model was fine-tuned directly on training data drawn from the same </w:t>
+      </w:r>
+      <w:proofErr w:type="spellStart"/>
+      <w:r>
+        <w:t>SQuAD</w:t>
+      </w:r>
+      <w:proofErr w:type="spellEnd"/>
+      <w:r>
+        <w:t xml:space="preserve"> dataset structure and answer-length conventions as the test set (indices 3,100–3,199 of the </w:t>
+      </w:r>
+      <w:proofErr w:type="spellStart"/>
+      <w:r>
+        <w:t>SQuAD</w:t>
+      </w:r>
+      <w:proofErr w:type="spellEnd"/>
+      <w:r>
+        <w:t xml:space="preserve"> validation split), so its output style is closely matched to this specific evaluation set, whereas mrm8488 was shaped by the full, more heterogeneous </w:t>
+      </w:r>
+      <w:proofErr w:type="spellStart"/>
+      <w:r>
+        <w:t>SQuAD</w:t>
+      </w:r>
+      <w:proofErr w:type="spellEnd"/>
+      <w:r>
+        <w:t xml:space="preserve"> v1 training distribution and may produce longer or differently-phrased spans that reduce lexical overlap even when correct. Second, a </w:t>
+      </w:r>
+      <w:proofErr w:type="spellStart"/>
+      <w:r>
+        <w:t>SQuAD</w:t>
+      </w:r>
+      <w:proofErr w:type="spellEnd"/>
+      <w:r>
+        <w:t xml:space="preserve"> v2 vs. v1 mismatch: mrm8488 was fine-tuned on </w:t>
+      </w:r>
+      <w:proofErr w:type="spellStart"/>
+      <w:r>
+        <w:t>SQuAD</w:t>
+      </w:r>
+      <w:proofErr w:type="spellEnd"/>
+      <w:r>
+        <w:t xml:space="preserve"> v2, which includes unanswerable questions and trains the model to sometimes hedge or decline to answer; since every question in the </w:t>
+      </w:r>
+      <w:proofErr w:type="spellStart"/>
+      <w:r>
+        <w:t>SQuAD_tiny</w:t>
+      </w:r>
+      <w:proofErr w:type="spellEnd"/>
+      <w:r>
+        <w:t xml:space="preserve"> test set (drawn from </w:t>
+      </w:r>
+      <w:proofErr w:type="spellStart"/>
+      <w:r>
+        <w:t>SQuAD</w:t>
+      </w:r>
+      <w:proofErr w:type="spellEnd"/>
+      <w:r>
+        <w:t xml:space="preserve"> v1-style data) does have an answer, a v2-trained model's more conservative answer style may reduce its measured overlap with the always-present reference answers even when its underlying answers are semantically reasonable. This also highlights a genuine limitation of ROUGE as an evaluation metric: it measures lexical overlap only, not factual correctness, so it is possible the pre-trained model's answers remain accurate but are phrased differently enough from the references to be </w:t>
       </w:r>
       <w:r>
         <w:t>penalized</w:t>
@@ -11445,6 +12321,7 @@
   <w:style w:type="character" w:default="1" w:styleId="DefaultParagraphFont">
     <w:name w:val="Default Paragraph Font"/>
     <w:uiPriority w:val="1"/>
+    <w:semiHidden/>
     <w:unhideWhenUsed/>
   </w:style>
   <w:style w:type="table" w:default="1" w:styleId="TableNormal">

</xml_diff>

<commit_message>
fix: Task 7: pairplot
</commit_message>
<xml_diff>
--- a/Assessment2-Report.docx
+++ b/Assessment2-Report.docx
@@ -226,11 +226,19 @@
                 <w:lang w:val="en-GB"/>
               </w:rPr>
             </w:pPr>
+            <w:proofErr w:type="spellStart"/>
             <w:r>
               <w:rPr>
                 <w:rFonts w:eastAsia="SimSun" w:cs="Mangal"/>
               </w:rPr>
-              <w:t>Minchul Kim</w:t>
+              <w:t>Minchul</w:t>
+            </w:r>
+            <w:proofErr w:type="spellEnd"/>
+            <w:r>
+              <w:rPr>
+                <w:rFonts w:eastAsia="SimSun" w:cs="Mangal"/>
+              </w:rPr>
+              <w:t xml:space="preserve"> Kim</w:t>
             </w:r>
           </w:p>
         </w:tc>
@@ -379,12 +387,21 @@
                 <w:lang w:val="en-GB" w:eastAsia="en-IN" w:bidi="mr-IN"/>
               </w:rPr>
             </w:pPr>
+            <w:proofErr w:type="spellStart"/>
             <w:r>
               <w:rPr>
                 <w:rFonts w:eastAsia="SimSun" w:cs="Mangal"/>
                 <w:lang w:val="en-GB" w:eastAsia="en-IN" w:bidi="mr-IN"/>
               </w:rPr>
-              <w:t>Minchul Kim</w:t>
+              <w:t>Minchul</w:t>
+            </w:r>
+            <w:proofErr w:type="spellEnd"/>
+            <w:r>
+              <w:rPr>
+                <w:rFonts w:eastAsia="SimSun" w:cs="Mangal"/>
+                <w:lang w:val="en-GB" w:eastAsia="en-IN" w:bidi="mr-IN"/>
+              </w:rPr>
+              <w:t xml:space="preserve"> Kim</w:t>
             </w:r>
           </w:p>
         </w:tc>
@@ -654,7 +671,21 @@
         <w:rPr>
           <w:lang w:val="en-GB"/>
         </w:rPr>
-        <w:t>mentions, and hashtags were stripped from the raw tweets during preprocessing (verified: 0 of the 2,500 tweets in the dataset contain a URL, @mention, or hashtag). Emojis and other symbols were not explicitly removed but are effectively excluded from the TF-IDF feature space since the default tokenizer only extracts alphanumeric word tokens. Slang terms (e.g. "lol", "omg", "idk") were left unmodified and are treated as ordinary vocabulary.</w:t>
+        <w:t xml:space="preserve">mentions, and hashtags were stripped from the raw tweets during preprocessing (verified: 0 of the 2,500 tweets in the dataset contain a </w:t>
+      </w:r>
+      <w:proofErr w:type="gramStart"/>
+      <w:r>
+        <w:rPr>
+          <w:lang w:val="en-GB"/>
+        </w:rPr>
+        <w:t>URL, @</w:t>
+      </w:r>
+      <w:proofErr w:type="gramEnd"/>
+      <w:r>
+        <w:rPr>
+          <w:lang w:val="en-GB"/>
+        </w:rPr>
+        <w:t>mention, or hashtag). Emojis and other symbols were not explicitly removed but are effectively excluded from the TF-IDF feature space since the default tokenizer only extracts alphanumeric word tokens. Slang terms (e.g. "lol", "omg", "idk") were left unmodified and are treated as ordinary vocabulary.</w:t>
       </w:r>
     </w:p>
     <w:p>
@@ -777,7 +808,15 @@
         <w:t>standardizing</w:t>
       </w:r>
       <w:r>
-        <w:t xml:space="preserve"> the TF-IDF matrix to zero mean and unit variance breaks its original sparse structure—increasing memory overhead—we </w:t>
+        <w:t xml:space="preserve"> the TF-IDF matrix to zero mean and unit variance breaks its original sparse </w:t>
+      </w:r>
+      <w:proofErr w:type="gramStart"/>
+      <w:r>
+        <w:t>structure—</w:t>
+      </w:r>
+      <w:proofErr w:type="gramEnd"/>
+      <w:r>
+        <w:t xml:space="preserve">increasing memory overhead—we </w:t>
       </w:r>
       <w:r>
         <w:t xml:space="preserve">think </w:t>
@@ -845,7 +884,15 @@
         <w:t>standardized</w:t>
       </w:r>
       <w:r>
-        <w:t xml:space="preserve"> TF-IDF matrix for computational efficiency). For each dimensionality, pairwise Euclidean distances between all sample pairs were computed and averaged.</w:t>
+        <w:t xml:space="preserve"> TF-IDF matrix for computational efficiency). For each dimensionality, pairwise Euclidean distances between all sample pairs were computed and </w:t>
+      </w:r>
+      <w:proofErr w:type="gramStart"/>
+      <w:r>
+        <w:t>averaged</w:t>
+      </w:r>
+      <w:proofErr w:type="gramEnd"/>
+      <w:r>
+        <w:t>.</w:t>
       </w:r>
     </w:p>
     <w:p>
@@ -2125,7 +2172,21 @@
         <w:rPr>
           <w:lang w:val="en-GB"/>
         </w:rPr>
-        <w:t>The 3D plot shows one big, crowded cloud centered in the middle. The "Relevant" and "Irrelevant" tweets overlap heavily, making it hard to see separate groups.</w:t>
+        <w:t xml:space="preserve">The 3D plot shows one big, crowded cloud </w:t>
+      </w:r>
+      <w:proofErr w:type="spellStart"/>
+      <w:r>
+        <w:rPr>
+          <w:lang w:val="en-GB"/>
+        </w:rPr>
+        <w:t>centered</w:t>
+      </w:r>
+      <w:proofErr w:type="spellEnd"/>
+      <w:r>
+        <w:rPr>
+          <w:lang w:val="en-GB"/>
+        </w:rPr>
+        <w:t xml:space="preserve"> in the middle. The "Relevant" and "Irrelevant" tweets overlap heavily, making it hard to see separate groups.</w:t>
       </w:r>
     </w:p>
     <w:p>
@@ -2260,13 +2321,7 @@
         <w:spacing w:after="150"/>
       </w:pPr>
       <w:r>
-        <w:t>Four</w:t>
-      </w:r>
-      <w:r>
-        <w:t xml:space="preserve"> preprocessing steps were applied before clustering</w:t>
-      </w:r>
-      <w:r>
-        <w:t>:</w:t>
+        <w:t>Four preprocessing steps were applied before clustering:</w:t>
       </w:r>
     </w:p>
     <w:p>
@@ -2353,6 +2408,7 @@
         </w:rPr>
         <w:t xml:space="preserve">Removed rows with a </w:t>
       </w:r>
+      <w:proofErr w:type="spellStart"/>
       <w:r>
         <w:rPr>
           <w:i/>
@@ -2361,6 +2417,7 @@
         </w:rPr>
         <w:t>MMRAcquisitionAuctionAveragePrice</w:t>
       </w:r>
+      <w:proofErr w:type="spellEnd"/>
       <w:r>
         <w:rPr>
           <w:lang w:val="en-GB"/>
@@ -2396,6 +2453,7 @@
         </w:rPr>
         <w:t xml:space="preserve">K-Means relies on Euclidean distance, so a handful of extreme readings (e.g. a ~480,000-mile odometer) can pull centroids away from the bulk of the data. Values in </w:t>
       </w:r>
+      <w:proofErr w:type="spellStart"/>
       <w:r>
         <w:rPr>
           <w:i/>
@@ -2404,12 +2462,14 @@
         </w:rPr>
         <w:t>VehOdo</w:t>
       </w:r>
+      <w:proofErr w:type="spellEnd"/>
       <w:r>
         <w:rPr>
           <w:lang w:val="en-GB"/>
         </w:rPr>
         <w:t xml:space="preserve">, </w:t>
       </w:r>
+      <w:proofErr w:type="spellStart"/>
       <w:r>
         <w:rPr>
           <w:i/>
@@ -2418,12 +2478,14 @@
         </w:rPr>
         <w:t>MMRAcquisitionAuctionAveragePrice</w:t>
       </w:r>
+      <w:proofErr w:type="spellEnd"/>
       <w:r>
         <w:rPr>
           <w:lang w:val="en-GB"/>
         </w:rPr>
         <w:t xml:space="preserve">, and </w:t>
       </w:r>
+      <w:proofErr w:type="spellStart"/>
       <w:r>
         <w:rPr>
           <w:i/>
@@ -2432,6 +2494,7 @@
         </w:rPr>
         <w:t>WarrantyCost</w:t>
       </w:r>
+      <w:proofErr w:type="spellEnd"/>
       <w:r>
         <w:rPr>
           <w:lang w:val="en-GB"/>
@@ -2479,6 +2542,7 @@
         </w:rPr>
         <w:t xml:space="preserve">Clustering algorithms (like K-Means) use Euclidean distance. Variables like </w:t>
       </w:r>
+      <w:proofErr w:type="spellStart"/>
       <w:r>
         <w:rPr>
           <w:i/>
@@ -2487,12 +2551,14 @@
         </w:rPr>
         <w:t>VehOdo</w:t>
       </w:r>
+      <w:proofErr w:type="spellEnd"/>
       <w:r>
         <w:rPr>
           <w:lang w:val="en-GB"/>
         </w:rPr>
         <w:t xml:space="preserve"> (tens of thousands) would completely dominate </w:t>
       </w:r>
+      <w:proofErr w:type="spellStart"/>
       <w:r>
         <w:rPr>
           <w:i/>
@@ -2501,6 +2567,7 @@
         </w:rPr>
         <w:t>WarrantyCost</w:t>
       </w:r>
+      <w:proofErr w:type="spellEnd"/>
       <w:r>
         <w:rPr>
           <w:lang w:val="en-GB"/>
@@ -2537,7 +2604,17 @@
         <w:spacing w:after="150"/>
       </w:pPr>
       <w:r>
-        <w:t>Algorithm chosen: K-Means. It was selected for its computational efficiency on purely numerical data at this scale (~41,000 rows), and because all four selected attributes are numeric, satisfying K-Means' Euclidean-distance assumption directly (no mixed-type handling needed at this stage).</w:t>
+        <w:t xml:space="preserve">Algorithm chosen: </w:t>
+      </w:r>
+      <w:r>
+        <w:rPr>
+          <w:i/>
+          <w:iCs/>
+        </w:rPr>
+        <w:t>K-Means</w:t>
+      </w:r>
+      <w:r>
+        <w:t>. It was selected for its computational efficiency on purely numerical data at this scale (~41,000 rows), and because all four selected attributes are numeric, satisfying K-Means' Euclidean-distance assumption directly (no mixed-type handling needed at this stage).</w:t>
       </w:r>
     </w:p>
     <w:p>
@@ -2545,7 +2622,50 @@
         <w:spacing w:after="150"/>
       </w:pPr>
       <w:r>
-        <w:t>Attributes used: VehOdo, MMRAcquisitionAuctionAveragePrice, WarrantyCost, IsBadBuy</w:t>
+        <w:t xml:space="preserve">Attributes used: </w:t>
+      </w:r>
+      <w:proofErr w:type="spellStart"/>
+      <w:r>
+        <w:rPr>
+          <w:i/>
+          <w:iCs/>
+        </w:rPr>
+        <w:t>VehOdo</w:t>
+      </w:r>
+      <w:proofErr w:type="spellEnd"/>
+      <w:r>
+        <w:t xml:space="preserve">, </w:t>
+      </w:r>
+      <w:proofErr w:type="spellStart"/>
+      <w:r>
+        <w:rPr>
+          <w:i/>
+          <w:iCs/>
+        </w:rPr>
+        <w:t>MMRAcquisitionAuctionAveragePrice</w:t>
+      </w:r>
+      <w:proofErr w:type="spellEnd"/>
+      <w:r>
+        <w:t xml:space="preserve">, </w:t>
+      </w:r>
+      <w:proofErr w:type="spellStart"/>
+      <w:r>
+        <w:rPr>
+          <w:i/>
+          <w:iCs/>
+        </w:rPr>
+        <w:t>WarrantyCost</w:t>
+      </w:r>
+      <w:proofErr w:type="spellEnd"/>
+      <w:r>
+        <w:t xml:space="preserve">, </w:t>
+      </w:r>
+      <w:r>
+        <w:rPr>
+          <w:i/>
+          <w:iCs/>
+        </w:rPr>
+        <w:t>IsBadBuy</w:t>
       </w:r>
     </w:p>
     <w:p>
@@ -2640,11 +2760,21 @@
       <w:r>
         <w:t xml:space="preserve">K = 3 was selected: the rate of inertia </w:t>
       </w:r>
-      <w:r>
-        <w:t xml:space="preserve">decrease </w:t>
-      </w:r>
-      <w:r>
-        <w:t>slows noticeably beyond k = 3 (diminishing returns from further splitting), while the silhouette score remains reasonable at this value, giving a good balance between cluster compactness/separation and model simplicity.</w:t>
+      <w:proofErr w:type="gramStart"/>
+      <w:r>
+        <w:t>decrease</w:t>
+      </w:r>
+      <w:proofErr w:type="gramEnd"/>
+      <w:r>
+        <w:t xml:space="preserve"> </w:t>
+      </w:r>
+      <w:proofErr w:type="gramStart"/>
+      <w:r>
+        <w:t>slows</w:t>
+      </w:r>
+      <w:proofErr w:type="gramEnd"/>
+      <w:r>
+        <w:t xml:space="preserve"> noticeably beyond k = 3 (diminishing returns from further splitting), while the silhouette score remains reasonable at this value, giving a good balance between cluster compactness/separation and model simplicity.</w:t>
       </w:r>
     </w:p>
     <w:p>
@@ -2658,7 +2788,7 @@
     </w:p>
     <w:tbl>
       <w:tblPr>
-        <w:tblW w:w="9000" w:type="dxa"/>
+        <w:tblW w:w="9624" w:type="dxa"/>
         <w:tblBorders>
           <w:top w:val="single" w:sz="4" w:space="0" w:color="auto"/>
           <w:left w:val="single" w:sz="4" w:space="0" w:color="auto"/>
@@ -2675,11 +2805,11 @@
       </w:tblPr>
       <w:tblGrid>
         <w:gridCol w:w="915"/>
-        <w:gridCol w:w="1030"/>
+        <w:gridCol w:w="1032"/>
         <w:gridCol w:w="3645"/>
-        <w:gridCol w:w="1514"/>
-        <w:gridCol w:w="1115"/>
-        <w:gridCol w:w="781"/>
+        <w:gridCol w:w="1513"/>
+        <w:gridCol w:w="1117"/>
+        <w:gridCol w:w="1402"/>
       </w:tblGrid>
       <w:tr>
         <w:trPr>
@@ -2687,7 +2817,7 @@
         </w:trPr>
         <w:tc>
           <w:tcPr>
-            <w:tcW w:w="1400" w:type="dxa"/>
+            <w:tcW w:w="916" w:type="dxa"/>
             <w:shd w:val="clear" w:color="auto" w:fill="DDEBF7"/>
             <w:tcMar>
               <w:top w:w="100" w:type="dxa"/>
@@ -2708,7 +2838,7 @@
         </w:tc>
         <w:tc>
           <w:tcPr>
-            <w:tcW w:w="1600" w:type="dxa"/>
+            <w:tcW w:w="1032" w:type="dxa"/>
             <w:shd w:val="clear" w:color="auto" w:fill="DDEBF7"/>
             <w:tcMar>
               <w:top w:w="100" w:type="dxa"/>
@@ -2718,6 +2848,7 @@
             </w:tcMar>
           </w:tcPr>
           <w:p>
+            <w:proofErr w:type="spellStart"/>
             <w:r>
               <w:rPr>
                 <w:b/>
@@ -2725,11 +2856,12 @@
               </w:rPr>
               <w:t>VehOdo</w:t>
             </w:r>
-          </w:p>
-        </w:tc>
-        <w:tc>
-          <w:tcPr>
-            <w:tcW w:w="2000" w:type="dxa"/>
+            <w:proofErr w:type="spellEnd"/>
+          </w:p>
+        </w:tc>
+        <w:tc>
+          <w:tcPr>
+            <w:tcW w:w="3642" w:type="dxa"/>
             <w:shd w:val="clear" w:color="auto" w:fill="DDEBF7"/>
             <w:tcMar>
               <w:top w:w="100" w:type="dxa"/>
@@ -2739,6 +2871,7 @@
             </w:tcMar>
           </w:tcPr>
           <w:p>
+            <w:proofErr w:type="spellStart"/>
             <w:r>
               <w:rPr>
                 <w:b/>
@@ -2746,11 +2879,12 @@
               </w:rPr>
               <w:t>MMRAcquisitionAuctionAveragePrice</w:t>
             </w:r>
-          </w:p>
-        </w:tc>
-        <w:tc>
-          <w:tcPr>
-            <w:tcW w:w="1800" w:type="dxa"/>
+            <w:proofErr w:type="spellEnd"/>
+          </w:p>
+        </w:tc>
+        <w:tc>
+          <w:tcPr>
+            <w:tcW w:w="1513" w:type="dxa"/>
             <w:shd w:val="clear" w:color="auto" w:fill="DDEBF7"/>
             <w:tcMar>
               <w:top w:w="100" w:type="dxa"/>
@@ -2760,6 +2894,7 @@
             </w:tcMar>
           </w:tcPr>
           <w:p>
+            <w:proofErr w:type="spellStart"/>
             <w:r>
               <w:rPr>
                 <w:b/>
@@ -2767,11 +2902,12 @@
               </w:rPr>
               <w:t>WarrantyCost</w:t>
             </w:r>
-          </w:p>
-        </w:tc>
-        <w:tc>
-          <w:tcPr>
-            <w:tcW w:w="1600" w:type="dxa"/>
+            <w:proofErr w:type="spellEnd"/>
+          </w:p>
+        </w:tc>
+        <w:tc>
+          <w:tcPr>
+            <w:tcW w:w="1117" w:type="dxa"/>
             <w:shd w:val="clear" w:color="auto" w:fill="DDEBF7"/>
             <w:tcMar>
               <w:top w:w="100" w:type="dxa"/>
@@ -2792,7 +2928,7 @@
         </w:tc>
         <w:tc>
           <w:tcPr>
-            <w:tcW w:w="1000" w:type="dxa"/>
+            <w:tcW w:w="1404" w:type="dxa"/>
             <w:shd w:val="clear" w:color="auto" w:fill="DDEBF7"/>
             <w:tcMar>
               <w:top w:w="100" w:type="dxa"/>
@@ -2815,7 +2951,7 @@
       <w:tr>
         <w:tc>
           <w:tcPr>
-            <w:tcW w:w="1400" w:type="dxa"/>
+            <w:tcW w:w="916" w:type="dxa"/>
             <w:tcMar>
               <w:top w:w="100" w:type="dxa"/>
               <w:left w:w="100" w:type="dxa"/>
@@ -2831,7 +2967,7 @@
         </w:tc>
         <w:tc>
           <w:tcPr>
-            <w:tcW w:w="1600" w:type="dxa"/>
+            <w:tcW w:w="1032" w:type="dxa"/>
             <w:tcMar>
               <w:top w:w="100" w:type="dxa"/>
               <w:left w:w="100" w:type="dxa"/>
@@ -2856,7 +2992,7 @@
         </w:tc>
         <w:tc>
           <w:tcPr>
-            <w:tcW w:w="2000" w:type="dxa"/>
+            <w:tcW w:w="3642" w:type="dxa"/>
             <w:tcMar>
               <w:top w:w="100" w:type="dxa"/>
               <w:left w:w="100" w:type="dxa"/>
@@ -2875,7 +3011,7 @@
         </w:tc>
         <w:tc>
           <w:tcPr>
-            <w:tcW w:w="1800" w:type="dxa"/>
+            <w:tcW w:w="1513" w:type="dxa"/>
             <w:tcMar>
               <w:top w:w="100" w:type="dxa"/>
               <w:left w:w="100" w:type="dxa"/>
@@ -2894,7 +3030,7 @@
         </w:tc>
         <w:tc>
           <w:tcPr>
-            <w:tcW w:w="1600" w:type="dxa"/>
+            <w:tcW w:w="1117" w:type="dxa"/>
             <w:tcMar>
               <w:top w:w="100" w:type="dxa"/>
               <w:left w:w="100" w:type="dxa"/>
@@ -2910,7 +3046,7 @@
         </w:tc>
         <w:tc>
           <w:tcPr>
-            <w:tcW w:w="1000" w:type="dxa"/>
+            <w:tcW w:w="1404" w:type="dxa"/>
             <w:tcMar>
               <w:top w:w="100" w:type="dxa"/>
               <w:left w:w="100" w:type="dxa"/>
@@ -2931,7 +3067,7 @@
       <w:tr>
         <w:tc>
           <w:tcPr>
-            <w:tcW w:w="1400" w:type="dxa"/>
+            <w:tcW w:w="916" w:type="dxa"/>
             <w:tcMar>
               <w:top w:w="100" w:type="dxa"/>
               <w:left w:w="100" w:type="dxa"/>
@@ -2947,7 +3083,7 @@
         </w:tc>
         <w:tc>
           <w:tcPr>
-            <w:tcW w:w="1600" w:type="dxa"/>
+            <w:tcW w:w="1032" w:type="dxa"/>
             <w:tcMar>
               <w:top w:w="100" w:type="dxa"/>
               <w:left w:w="100" w:type="dxa"/>
@@ -2963,7 +3099,7 @@
         </w:tc>
         <w:tc>
           <w:tcPr>
-            <w:tcW w:w="2000" w:type="dxa"/>
+            <w:tcW w:w="3642" w:type="dxa"/>
             <w:tcMar>
               <w:top w:w="100" w:type="dxa"/>
               <w:left w:w="100" w:type="dxa"/>
@@ -2982,7 +3118,7 @@
         </w:tc>
         <w:tc>
           <w:tcPr>
-            <w:tcW w:w="1800" w:type="dxa"/>
+            <w:tcW w:w="1513" w:type="dxa"/>
             <w:tcMar>
               <w:top w:w="100" w:type="dxa"/>
               <w:left w:w="100" w:type="dxa"/>
@@ -3001,26 +3137,23 @@
         </w:tc>
         <w:tc>
           <w:tcPr>
-            <w:tcW w:w="1600" w:type="dxa"/>
-            <w:tcMar>
-              <w:top w:w="100" w:type="dxa"/>
-              <w:left w:w="100" w:type="dxa"/>
-              <w:bottom w:w="100" w:type="dxa"/>
-              <w:right w:w="100" w:type="dxa"/>
-            </w:tcMar>
-          </w:tcPr>
-          <w:p>
-            <w:r>
-              <w:t>1</w:t>
-            </w:r>
-            <w:r>
-              <w:t>.00</w:t>
-            </w:r>
-          </w:p>
-        </w:tc>
-        <w:tc>
-          <w:tcPr>
-            <w:tcW w:w="1000" w:type="dxa"/>
+            <w:tcW w:w="1117" w:type="dxa"/>
+            <w:tcMar>
+              <w:top w:w="100" w:type="dxa"/>
+              <w:left w:w="100" w:type="dxa"/>
+              <w:bottom w:w="100" w:type="dxa"/>
+              <w:right w:w="100" w:type="dxa"/>
+            </w:tcMar>
+          </w:tcPr>
+          <w:p>
+            <w:r>
+              <w:t>1.00</w:t>
+            </w:r>
+          </w:p>
+        </w:tc>
+        <w:tc>
+          <w:tcPr>
+            <w:tcW w:w="1404" w:type="dxa"/>
             <w:tcMar>
               <w:top w:w="100" w:type="dxa"/>
               <w:left w:w="100" w:type="dxa"/>
@@ -3038,7 +3171,7 @@
       <w:tr>
         <w:tc>
           <w:tcPr>
-            <w:tcW w:w="1400" w:type="dxa"/>
+            <w:tcW w:w="916" w:type="dxa"/>
             <w:tcMar>
               <w:top w:w="100" w:type="dxa"/>
               <w:left w:w="100" w:type="dxa"/>
@@ -3054,7 +3187,7 @@
         </w:tc>
         <w:tc>
           <w:tcPr>
-            <w:tcW w:w="1600" w:type="dxa"/>
+            <w:tcW w:w="1032" w:type="dxa"/>
             <w:tcMar>
               <w:top w:w="100" w:type="dxa"/>
               <w:left w:w="100" w:type="dxa"/>
@@ -3070,7 +3203,7 @@
         </w:tc>
         <w:tc>
           <w:tcPr>
-            <w:tcW w:w="2000" w:type="dxa"/>
+            <w:tcW w:w="3642" w:type="dxa"/>
             <w:tcMar>
               <w:top w:w="100" w:type="dxa"/>
               <w:left w:w="100" w:type="dxa"/>
@@ -3089,7 +3222,7 @@
         </w:tc>
         <w:tc>
           <w:tcPr>
-            <w:tcW w:w="1800" w:type="dxa"/>
+            <w:tcW w:w="1513" w:type="dxa"/>
             <w:tcMar>
               <w:top w:w="100" w:type="dxa"/>
               <w:left w:w="100" w:type="dxa"/>
@@ -3108,26 +3241,23 @@
         </w:tc>
         <w:tc>
           <w:tcPr>
-            <w:tcW w:w="1600" w:type="dxa"/>
-            <w:tcMar>
-              <w:top w:w="100" w:type="dxa"/>
-              <w:left w:w="100" w:type="dxa"/>
-              <w:bottom w:w="100" w:type="dxa"/>
-              <w:right w:w="100" w:type="dxa"/>
-            </w:tcMar>
-          </w:tcPr>
-          <w:p>
-            <w:r>
-              <w:t>0</w:t>
-            </w:r>
-            <w:r>
-              <w:t>.00</w:t>
-            </w:r>
-          </w:p>
-        </w:tc>
-        <w:tc>
-          <w:tcPr>
-            <w:tcW w:w="1000" w:type="dxa"/>
+            <w:tcW w:w="1117" w:type="dxa"/>
+            <w:tcMar>
+              <w:top w:w="100" w:type="dxa"/>
+              <w:left w:w="100" w:type="dxa"/>
+              <w:bottom w:w="100" w:type="dxa"/>
+              <w:right w:w="100" w:type="dxa"/>
+            </w:tcMar>
+          </w:tcPr>
+          <w:p>
+            <w:r>
+              <w:t>0.00</w:t>
+            </w:r>
+          </w:p>
+        </w:tc>
+        <w:tc>
+          <w:tcPr>
+            <w:tcW w:w="1404" w:type="dxa"/>
             <w:tcMar>
               <w:top w:w="100" w:type="dxa"/>
               <w:left w:w="100" w:type="dxa"/>
@@ -3150,19 +3280,6 @@
     </w:p>
     <w:p>
       <w:pPr>
-        <w:pStyle w:val="Heading3"/>
-      </w:pPr>
-      <w:r>
-        <w:t>Descriptive Cluster Labels</w:t>
-      </w:r>
-    </w:p>
-    <w:p>
-      <w:pPr>
-        <w:pStyle w:val="ListParagraph"/>
-        <w:numPr>
-          <w:ilvl w:val="0"/>
-          <w:numId w:val="5"/>
-        </w:numPr>
         <w:spacing w:after="150"/>
       </w:pPr>
       <w:r>
@@ -3170,16 +3287,10 @@
           <w:b/>
           <w:bCs/>
         </w:rPr>
-        <w:t>Cluster 0 (High-Mileage, Premium Fleet)</w:t>
-      </w:r>
-      <w:r>
-        <w:t xml:space="preserve">: The largest group (18,288 cars), with the highest odometer readings (~80,941 miles), the highest auction price (~$6,433), and the highest warranty cost (~$1,591) </w:t>
-      </w:r>
-      <w:r>
-        <w:t>and</w:t>
-      </w:r>
-      <w:r>
-        <w:t xml:space="preserve"> yet a 0% </w:t>
+        <w:t>Caveat on `IsBadBuy` as a clustering feature</w:t>
+      </w:r>
+      <w:r>
+        <w:t xml:space="preserve">: Because </w:t>
       </w:r>
       <w:r>
         <w:rPr>
@@ -3189,103 +3300,86 @@
         <w:t>IsBadBuy</w:t>
       </w:r>
       <w:r>
-        <w:t xml:space="preserve"> rate. These are older but well-priced/well-warrantied vehicles that still resell reliably.</w:t>
-      </w:r>
-    </w:p>
-    <w:p>
-      <w:pPr>
-        <w:pStyle w:val="ListParagraph"/>
-        <w:numPr>
-          <w:ilvl w:val="0"/>
-          <w:numId w:val="5"/>
-        </w:numPr>
-        <w:spacing w:after="150"/>
-      </w:pPr>
-      <w:r>
-        <w:rPr>
-          <w:b/>
-          <w:bCs/>
-        </w:rPr>
-        <w:t>Cluster 1 (The "Kicks" / Bad Buys)</w:t>
-      </w:r>
-      <w:r>
-        <w:t>: 5,300 cars characterized by a 100% `IsBadBuy` rate, the lowest auction price (~$5,447), and moderately high mileage (~74,371 miles). These are the definitive "bad buys" that the dealership struggles to resell.</w:t>
-      </w:r>
-    </w:p>
-    <w:p>
-      <w:pPr>
-        <w:pStyle w:val="ListParagraph"/>
-        <w:numPr>
-          <w:ilvl w:val="0"/>
-          <w:numId w:val="5"/>
-        </w:numPr>
-        <w:spacing w:after="150"/>
-      </w:pPr>
-      <w:r>
-        <w:rPr>
-          <w:b/>
-          <w:bCs/>
-        </w:rPr>
-        <w:t>Cluster 2 (Low-Mileage, Budget Fleet)</w:t>
-      </w:r>
-      <w:r>
-        <w:t xml:space="preserve">: 17,319 cars with the lowest mileage (~60,203 miles) and by far the lowest warranty cost (~$884), and a 0% </w:t>
-      </w:r>
+        <w:t xml:space="preserve"> is binary and was standardized alongside the continuous features, K-Means separates on it almost perfectly (every cluster mean above is exactly 0.0 or 1.0). This means the model is not so much "discovering" a bad-buy segment as it is splitting the data on the known label first and then finding mileage/price/warranty structure within each side. The real profiling value here comes from how </w:t>
+      </w:r>
+      <w:proofErr w:type="spellStart"/>
       <w:r>
         <w:rPr>
           <w:i/>
           <w:iCs/>
         </w:rPr>
-        <w:t>IsBadBuy</w:t>
-      </w:r>
-      <w:r>
-        <w:t xml:space="preserve"> rate. The safest and cheapest-to-maintain segment.</w:t>
-      </w:r>
-    </w:p>
-    <w:p>
-      <w:pPr>
-        <w:spacing w:after="150"/>
-      </w:pPr>
-      <w:r>
-        <w:rPr>
-          <w:b/>
-          <w:bCs/>
-        </w:rPr>
-        <w:t>Caveat on `IsBadBuy` as a clustering feature</w:t>
-      </w:r>
-      <w:r>
-        <w:t xml:space="preserve">: Because </w:t>
-      </w:r>
+        <w:t>VehOdo</w:t>
+      </w:r>
+      <w:proofErr w:type="spellEnd"/>
+      <w:r>
+        <w:t xml:space="preserve">, </w:t>
+      </w:r>
+      <w:proofErr w:type="spellStart"/>
       <w:r>
         <w:rPr>
           <w:i/>
           <w:iCs/>
         </w:rPr>
-        <w:t>IsBadBuy</w:t>
-      </w:r>
-      <w:r>
-        <w:t xml:space="preserve"> is binary and was standardized alongside the continuous features, K-Means separates on it almost perfectly (every cluster mean above is exactly 0.0 or 1.0). This means the model is not so much "discovering" a bad-buy segment as it is splitting the data on the known label first and then finding mileage/price/warranty structure within each side. The real profiling value here comes from how </w:t>
-      </w:r>
+        <w:t>MMRAcquisitionAuctionAveragePrice</w:t>
+      </w:r>
+      <w:proofErr w:type="spellEnd"/>
+      <w:r>
+        <w:t xml:space="preserve">, and </w:t>
+      </w:r>
+      <w:proofErr w:type="spellStart"/>
       <w:r>
         <w:rPr>
           <w:i/>
           <w:iCs/>
         </w:rPr>
-        <w:t>VehOdo</w:t>
-      </w:r>
-      <w:r>
-        <w:t xml:space="preserve">, </w:t>
-      </w:r>
+        <w:t>WarrantyCost</w:t>
+      </w:r>
+      <w:proofErr w:type="spellEnd"/>
+      <w:r>
+        <w:t xml:space="preserve"> differ between the bad buy and non-bad-buy sides, rather than from the cluster boundary itself.</w:t>
+      </w:r>
+    </w:p>
+    <w:p>
+      <w:pPr>
+        <w:pStyle w:val="Heading3"/>
+        <w:spacing w:before="200" w:after="100"/>
+      </w:pPr>
+      <w:r>
+        <w:t xml:space="preserve">7.2.4 </w:t>
+      </w:r>
+      <w:r>
+        <w:t>Normalization</w:t>
+      </w:r>
+      <w:r>
+        <w:t>/</w:t>
+      </w:r>
+      <w:r>
+        <w:t>Standardization</w:t>
+      </w:r>
+      <w:r>
+        <w:t xml:space="preserve"> Discussion</w:t>
+      </w:r>
+    </w:p>
+    <w:p>
+      <w:pPr>
+        <w:spacing w:after="150"/>
+      </w:pPr>
+      <w:r>
+        <w:t xml:space="preserve">Standardization was applied prior to clustering (Section 7.1). Without it, </w:t>
+      </w:r>
+      <w:proofErr w:type="spellStart"/>
       <w:r>
         <w:rPr>
           <w:i/>
           <w:iCs/>
         </w:rPr>
-        <w:t>MMRAcquisitionAuctionAveragePrice</w:t>
-      </w:r>
-      <w:r>
-        <w:t xml:space="preserve">, and </w:t>
-      </w:r>
+        <w:t>VehOdo</w:t>
+      </w:r>
+      <w:proofErr w:type="spellEnd"/>
+      <w:r>
+        <w:t xml:space="preserve"> (with values in the tens of thousands) would dominate the Euclidean distance calculation relative to </w:t>
+      </w:r>
+      <w:proofErr w:type="spellStart"/>
       <w:r>
         <w:rPr>
           <w:i/>
@@ -3293,43 +3387,9 @@
         </w:rPr>
         <w:t>WarrantyCost</w:t>
       </w:r>
-      <w:r>
-        <w:t xml:space="preserve"> differ between the bad</w:t>
-      </w:r>
-      <w:r>
-        <w:t xml:space="preserve"> </w:t>
-      </w:r>
-      <w:r>
-        <w:t>buy and non-bad-buy sides, rather than from the cluster boundary itself.</w:t>
-      </w:r>
-    </w:p>
-    <w:p>
-      <w:pPr>
-        <w:pStyle w:val="Heading3"/>
-        <w:spacing w:before="200" w:after="100"/>
-      </w:pPr>
-      <w:r>
-        <w:t xml:space="preserve">7.2.4 </w:t>
-      </w:r>
-      <w:r>
-        <w:t>Normalization</w:t>
-      </w:r>
-      <w:r>
-        <w:t>/</w:t>
-      </w:r>
-      <w:r>
-        <w:t>Standardization</w:t>
-      </w:r>
-      <w:r>
-        <w:t xml:space="preserve"> Discussion</w:t>
-      </w:r>
-    </w:p>
-    <w:p>
-      <w:pPr>
-        <w:spacing w:after="150"/>
-      </w:pPr>
-      <w:r>
-        <w:t>Standardization was applied prior to clustering (Section 7.1). Without it, VehOdo (with values in the tens of thousands) would dominate the Euclidean distance calculation relative to WarrantyCost and IsBadBuy (values in the hundreds and 0/1 respectively), causing K-Means to effectively cluster on mileage alone and obscure the cost- and risk-related structure in the data. Standardizing ensured that all four attributes contributed proportionally to the distance metric, allowing the resulting clusters to reflect a genuine combination of mileage, price, warranty cost, and bad-buy status rather than being dominated by a single high-magnitude variable.</w:t>
+      <w:proofErr w:type="spellEnd"/>
+      <w:r>
+        <w:t xml:space="preserve"> and IsBadBuy (values in the hundreds and 0/1 respectively), causing K-Means to effectively cluster on mileage alone and obscure the cost- and risk-related structure in the data. Standardizing ensured that all four attributes contributed proportionally to the distance metric, allowing the resulting clusters to reflect a genuine combination of mileage, price, warranty cost, and bad-buy status rather than being dominated by a single high-magnitude variable.</w:t>
       </w:r>
     </w:p>
     <w:p>
@@ -3350,7 +3410,13 @@
         <w:spacing w:before="300" w:after="150"/>
       </w:pPr>
       <w:r>
-        <w:t xml:space="preserve">7.3 </w:t>
+        <w:t>7.3</w:t>
+      </w:r>
+      <w:r>
+        <w:t>.1</w:t>
+      </w:r>
+      <w:r>
+        <w:t xml:space="preserve"> </w:t>
       </w:r>
       <w:r>
         <w:t>Visualizing</w:t>
@@ -3363,16 +3429,114 @@
       <w:pPr>
         <w:spacing w:after="300"/>
         <w:jc w:val="center"/>
-      </w:pPr>
-      <w:r>
-        <w:rPr>
-          <w:noProof/>
-        </w:rPr>
+        <w:rPr>
+          <w:i/>
+          <w:iCs/>
+          <w:sz w:val="18"/>
+          <w:szCs w:val="18"/>
+        </w:rPr>
+      </w:pPr>
+      <w:r>
+        <w:rPr>
+          <w:i/>
+          <w:iCs/>
+          <w:sz w:val="18"/>
+          <w:szCs w:val="18"/>
+        </w:rPr>
+        <w:t xml:space="preserve">Figure 7.2: </w:t>
+      </w:r>
+      <w:proofErr w:type="spellStart"/>
+      <w:r>
+        <w:rPr>
+          <w:i/>
+          <w:iCs/>
+          <w:sz w:val="18"/>
+          <w:szCs w:val="18"/>
+        </w:rPr>
+        <w:t>Pairplot</w:t>
+      </w:r>
+      <w:proofErr w:type="spellEnd"/>
+      <w:r>
+        <w:rPr>
+          <w:i/>
+          <w:iCs/>
+          <w:sz w:val="18"/>
+          <w:szCs w:val="18"/>
+        </w:rPr>
+        <w:t xml:space="preserve"> of </w:t>
+      </w:r>
+      <w:proofErr w:type="spellStart"/>
+      <w:r>
+        <w:rPr>
+          <w:i/>
+          <w:iCs/>
+          <w:sz w:val="18"/>
+          <w:szCs w:val="18"/>
+        </w:rPr>
+        <w:t>VehOdo</w:t>
+      </w:r>
+      <w:proofErr w:type="spellEnd"/>
+      <w:r>
+        <w:rPr>
+          <w:i/>
+          <w:iCs/>
+          <w:sz w:val="18"/>
+          <w:szCs w:val="18"/>
+        </w:rPr>
+        <w:t xml:space="preserve">, </w:t>
+      </w:r>
+      <w:proofErr w:type="spellStart"/>
+      <w:r>
+        <w:rPr>
+          <w:i/>
+          <w:iCs/>
+          <w:sz w:val="18"/>
+          <w:szCs w:val="18"/>
+        </w:rPr>
+        <w:t>AuctionAvgPrice</w:t>
+      </w:r>
+      <w:proofErr w:type="spellEnd"/>
+      <w:r>
+        <w:rPr>
+          <w:i/>
+          <w:iCs/>
+          <w:sz w:val="18"/>
+          <w:szCs w:val="18"/>
+        </w:rPr>
+        <w:t xml:space="preserve">, </w:t>
+      </w:r>
+      <w:proofErr w:type="spellStart"/>
+      <w:r>
+        <w:rPr>
+          <w:i/>
+          <w:iCs/>
+          <w:sz w:val="18"/>
+          <w:szCs w:val="18"/>
+        </w:rPr>
+        <w:t>WarrantyCost</w:t>
+      </w:r>
+      <w:proofErr w:type="spellEnd"/>
+      <w:r>
+        <w:rPr>
+          <w:i/>
+          <w:iCs/>
+          <w:sz w:val="18"/>
+          <w:szCs w:val="18"/>
+        </w:rPr>
+        <w:t xml:space="preserve"> by cluster (2,000-row sample).</w:t>
+      </w:r>
+    </w:p>
+    <w:p>
+      <w:pPr>
+        <w:spacing w:after="300"/>
+        <w:jc w:val="center"/>
+      </w:pPr>
+      <w:r>
         <w:drawing>
-          <wp:inline distT="0" distB="0" distL="0" distR="0" wp14:anchorId="4C69A736" wp14:editId="2B54D6D2">
-            <wp:extent cx="5642435" cy="5128577"/>
+          <wp:inline distT="0" distB="0" distL="0" distR="0" wp14:anchorId="6F4984B4" wp14:editId="7274F096">
+            <wp:extent cx="8077200" cy="7334250"/>
             <wp:effectExtent l="0" t="0" r="0" b="0"/>
-            <wp:docPr id="1948292253" name="Picture 5"/>
+            <wp:docPr id="88040314" name="Picture 1"/>
             <wp:cNvGraphicFramePr>
               <a:graphicFrameLocks xmlns:a="http://schemas.openxmlformats.org/drawingml/2006/main" noChangeAspect="1"/>
             </wp:cNvGraphicFramePr>
@@ -3380,36 +3544,23 @@
               <a:graphicData uri="http://schemas.openxmlformats.org/drawingml/2006/picture">
                 <pic:pic xmlns:pic="http://schemas.openxmlformats.org/drawingml/2006/picture">
                   <pic:nvPicPr>
-                    <pic:cNvPr id="0" name="Picture 9"/>
-                    <pic:cNvPicPr>
-                      <a:picLocks noChangeAspect="1" noChangeArrowheads="1"/>
-                    </pic:cNvPicPr>
+                    <pic:cNvPr id="88040314" name=""/>
+                    <pic:cNvPicPr/>
                   </pic:nvPicPr>
                   <pic:blipFill>
-                    <a:blip r:embed="rId11">
-                      <a:extLst>
-                        <a:ext uri="{28A0092B-C50C-407E-A947-70E740481C1C}">
-                          <a14:useLocalDpi xmlns:a14="http://schemas.microsoft.com/office/drawing/2010/main" val="0"/>
-                        </a:ext>
-                      </a:extLst>
-                    </a:blip>
-                    <a:srcRect/>
+                    <a:blip r:embed="rId11"/>
                     <a:stretch>
                       <a:fillRect/>
                     </a:stretch>
                   </pic:blipFill>
-                  <pic:spPr bwMode="auto">
+                  <pic:spPr>
                     <a:xfrm>
                       <a:off x="0" y="0"/>
-                      <a:ext cx="5643694" cy="5129721"/>
+                      <a:ext cx="8077200" cy="7334250"/>
                     </a:xfrm>
                     <a:prstGeom prst="rect">
                       <a:avLst/>
                     </a:prstGeom>
-                    <a:noFill/>
-                    <a:ln>
-                      <a:noFill/>
-                    </a:ln>
                   </pic:spPr>
                 </pic:pic>
               </a:graphicData>
@@ -3417,261 +3568,158 @@
           </wp:inline>
         </w:drawing>
       </w:r>
-      <w:r>
-        <w:rPr>
-          <w:i/>
-          <w:iCs/>
-          <w:sz w:val="18"/>
-          <w:szCs w:val="18"/>
-        </w:rPr>
-        <w:t>Figure 7.2: Pairplot of VehOdo, AuctionAvgPrice, WarrantyCost by cluster (2,000-row sample).</w:t>
-      </w:r>
-    </w:p>
-    <w:p>
-      <w:pPr>
-        <w:pStyle w:val="Heading3"/>
-        <w:spacing w:before="200" w:after="100"/>
-      </w:pPr>
-      <w:r>
-        <w:t>Descriptive Cluster Labels</w:t>
-      </w:r>
+    </w:p>
+    <w:p>
+      <w:pPr>
+        <w:spacing w:after="300"/>
+        <w:jc w:val="center"/>
+      </w:pPr>
+      <w:r>
+        <w:drawing>
+          <wp:inline distT="0" distB="0" distL="0" distR="0" wp14:anchorId="564426C9" wp14:editId="0F90C0F1">
+            <wp:extent cx="14192250" cy="3714750"/>
+            <wp:effectExtent l="0" t="0" r="0" b="0"/>
+            <wp:docPr id="421524616" name="Picture 1"/>
+            <wp:cNvGraphicFramePr>
+              <a:graphicFrameLocks xmlns:a="http://schemas.openxmlformats.org/drawingml/2006/main" noChangeAspect="1"/>
+            </wp:cNvGraphicFramePr>
+            <a:graphic xmlns:a="http://schemas.openxmlformats.org/drawingml/2006/main">
+              <a:graphicData uri="http://schemas.openxmlformats.org/drawingml/2006/picture">
+                <pic:pic xmlns:pic="http://schemas.openxmlformats.org/drawingml/2006/picture">
+                  <pic:nvPicPr>
+                    <pic:cNvPr id="421524616" name=""/>
+                    <pic:cNvPicPr/>
+                  </pic:nvPicPr>
+                  <pic:blipFill>
+                    <a:blip r:embed="rId12"/>
+                    <a:stretch>
+                      <a:fillRect/>
+                    </a:stretch>
+                  </pic:blipFill>
+                  <pic:spPr>
+                    <a:xfrm>
+                      <a:off x="0" y="0"/>
+                      <a:ext cx="14192250" cy="3714750"/>
+                    </a:xfrm>
+                    <a:prstGeom prst="rect">
+                      <a:avLst/>
+                    </a:prstGeom>
+                  </pic:spPr>
+                </pic:pic>
+              </a:graphicData>
+            </a:graphic>
+          </wp:inline>
+        </w:drawing>
+      </w:r>
+    </w:p>
+    <w:p>
+      <w:pPr>
+        <w:spacing w:after="300"/>
+        <w:jc w:val="center"/>
+      </w:pPr>
     </w:p>
     <w:tbl>
       <w:tblPr>
-        <w:tblW w:w="9000" w:type="dxa"/>
-        <w:tblBorders>
-          <w:top w:val="single" w:sz="4" w:space="0" w:color="auto"/>
-          <w:left w:val="single" w:sz="4" w:space="0" w:color="auto"/>
-          <w:bottom w:val="single" w:sz="4" w:space="0" w:color="auto"/>
-          <w:right w:val="single" w:sz="4" w:space="0" w:color="auto"/>
-          <w:insideH w:val="single" w:sz="4" w:space="0" w:color="auto"/>
-          <w:insideV w:val="single" w:sz="4" w:space="0" w:color="auto"/>
-        </w:tblBorders>
-        <w:tblCellMar>
-          <w:left w:w="10" w:type="dxa"/>
-          <w:right w:w="10" w:type="dxa"/>
-        </w:tblCellMar>
+        <w:tblStyle w:val="TableGrid"/>
+        <w:tblW w:w="0" w:type="auto"/>
         <w:tblLook w:val="04A0" w:firstRow="1" w:lastRow="0" w:firstColumn="1" w:lastColumn="0" w:noHBand="0" w:noVBand="1"/>
       </w:tblPr>
       <w:tblGrid>
-        <w:gridCol w:w="1200"/>
-        <w:gridCol w:w="2800"/>
-        <w:gridCol w:w="5000"/>
+        <w:gridCol w:w="4590"/>
+        <w:gridCol w:w="4426"/>
       </w:tblGrid>
       <w:tr>
-        <w:trPr>
-          <w:tblHeader/>
-        </w:trPr>
-        <w:tc>
-          <w:tcPr>
-            <w:tcW w:w="1200" w:type="dxa"/>
-            <w:shd w:val="clear" w:color="auto" w:fill="DDEBF7"/>
-            <w:tcMar>
-              <w:top w:w="100" w:type="dxa"/>
-              <w:left w:w="100" w:type="dxa"/>
-              <w:bottom w:w="100" w:type="dxa"/>
-              <w:right w:w="100" w:type="dxa"/>
-            </w:tcMar>
-          </w:tcPr>
-          <w:p>
-            <w:r>
-              <w:rPr>
-                <w:b/>
-                <w:bCs/>
-              </w:rPr>
-              <w:t>Cluster</w:t>
-            </w:r>
-          </w:p>
-        </w:tc>
-        <w:tc>
-          <w:tcPr>
-            <w:tcW w:w="2800" w:type="dxa"/>
-            <w:shd w:val="clear" w:color="auto" w:fill="DDEBF7"/>
-            <w:tcMar>
-              <w:top w:w="100" w:type="dxa"/>
-              <w:left w:w="100" w:type="dxa"/>
-              <w:bottom w:w="100" w:type="dxa"/>
-              <w:right w:w="100" w:type="dxa"/>
-            </w:tcMar>
-          </w:tcPr>
-          <w:p>
-            <w:r>
-              <w:rPr>
-                <w:b/>
-                <w:bCs/>
-              </w:rPr>
-              <w:t>Label</w:t>
-            </w:r>
-          </w:p>
-        </w:tc>
-        <w:tc>
-          <w:tcPr>
-            <w:tcW w:w="5000" w:type="dxa"/>
-            <w:shd w:val="clear" w:color="auto" w:fill="DDEBF7"/>
-            <w:tcMar>
-              <w:top w:w="100" w:type="dxa"/>
-              <w:left w:w="100" w:type="dxa"/>
-              <w:bottom w:w="100" w:type="dxa"/>
-              <w:right w:w="100" w:type="dxa"/>
-            </w:tcMar>
-          </w:tcPr>
-          <w:p>
-            <w:r>
-              <w:rPr>
-                <w:b/>
-                <w:bCs/>
-              </w:rPr>
-              <w:t>Defining Characteristics</w:t>
-            </w:r>
-          </w:p>
-        </w:tc>
-      </w:tr>
-      <w:tr>
-        <w:tc>
-          <w:tcPr>
-            <w:tcW w:w="1200" w:type="dxa"/>
-            <w:tcMar>
-              <w:top w:w="100" w:type="dxa"/>
-              <w:left w:w="100" w:type="dxa"/>
-              <w:bottom w:w="100" w:type="dxa"/>
-              <w:right w:w="100" w:type="dxa"/>
-            </w:tcMar>
-          </w:tcPr>
-          <w:p>
-            <w:r>
-              <w:t>2</w:t>
-            </w:r>
-          </w:p>
-        </w:tc>
-        <w:tc>
-          <w:tcPr>
-            <w:tcW w:w="2800" w:type="dxa"/>
-            <w:tcMar>
-              <w:top w:w="100" w:type="dxa"/>
-              <w:left w:w="100" w:type="dxa"/>
-              <w:bottom w:w="100" w:type="dxa"/>
-              <w:right w:w="100" w:type="dxa"/>
-            </w:tcMar>
-          </w:tcPr>
-          <w:p>
-            <w:r>
-              <w:t>Standard Kicks</w:t>
-            </w:r>
-          </w:p>
-        </w:tc>
-        <w:tc>
-          <w:tcPr>
-            <w:tcW w:w="5000" w:type="dxa"/>
-            <w:tcMar>
-              <w:top w:w="100" w:type="dxa"/>
-              <w:left w:w="100" w:type="dxa"/>
-              <w:bottom w:w="100" w:type="dxa"/>
-              <w:right w:w="100" w:type="dxa"/>
-            </w:tcMar>
-          </w:tcPr>
-          <w:p>
-            <w:r>
-              <w:t>Average mileage and cost, but a 100% IsBadBuy rate — the definitive 'bad buys' the dealership needs to identify and avoid.</w:t>
-            </w:r>
-          </w:p>
-        </w:tc>
-      </w:tr>
-      <w:tr>
-        <w:tc>
-          <w:tcPr>
-            <w:tcW w:w="1200" w:type="dxa"/>
-            <w:tcMar>
-              <w:top w:w="100" w:type="dxa"/>
-              <w:left w:w="100" w:type="dxa"/>
-              <w:bottom w:w="100" w:type="dxa"/>
-              <w:right w:w="100" w:type="dxa"/>
-            </w:tcMar>
-          </w:tcPr>
-          <w:p>
-            <w:r>
-              <w:t>0</w:t>
-            </w:r>
-          </w:p>
-        </w:tc>
-        <w:tc>
-          <w:tcPr>
-            <w:tcW w:w="2800" w:type="dxa"/>
-            <w:tcMar>
-              <w:top w:w="100" w:type="dxa"/>
-              <w:left w:w="100" w:type="dxa"/>
-              <w:bottom w:w="100" w:type="dxa"/>
-              <w:right w:w="100" w:type="dxa"/>
-            </w:tcMar>
-          </w:tcPr>
-          <w:p>
-            <w:r>
-              <w:t>High Mileage, High Warranty</w:t>
-            </w:r>
-          </w:p>
-        </w:tc>
-        <w:tc>
-          <w:tcPr>
-            <w:tcW w:w="5000" w:type="dxa"/>
-            <w:tcMar>
-              <w:top w:w="100" w:type="dxa"/>
-              <w:left w:w="100" w:type="dxa"/>
-              <w:bottom w:w="100" w:type="dxa"/>
-              <w:right w:w="100" w:type="dxa"/>
-            </w:tcMar>
-          </w:tcPr>
-          <w:p>
-            <w:r>
-              <w:t>Highest odometer readings and highest warranty costs; a potentially risky segment due to mechanical wear despite a 0% recorded bad-buy rate.</w:t>
-            </w:r>
-          </w:p>
-        </w:tc>
-      </w:tr>
-      <w:tr>
-        <w:tc>
-          <w:tcPr>
-            <w:tcW w:w="1200" w:type="dxa"/>
-            <w:tcMar>
-              <w:top w:w="100" w:type="dxa"/>
-              <w:left w:w="100" w:type="dxa"/>
-              <w:bottom w:w="100" w:type="dxa"/>
-              <w:right w:w="100" w:type="dxa"/>
-            </w:tcMar>
-          </w:tcPr>
-          <w:p>
-            <w:r>
-              <w:t>1</w:t>
-            </w:r>
-          </w:p>
-        </w:tc>
-        <w:tc>
-          <w:tcPr>
-            <w:tcW w:w="2800" w:type="dxa"/>
-            <w:tcMar>
-              <w:top w:w="100" w:type="dxa"/>
-              <w:left w:w="100" w:type="dxa"/>
-              <w:bottom w:w="100" w:type="dxa"/>
-              <w:right w:w="100" w:type="dxa"/>
-            </w:tcMar>
-          </w:tcPr>
-          <w:p>
-            <w:r>
-              <w:t>Low Risk, Budget Fleet</w:t>
-            </w:r>
-          </w:p>
-        </w:tc>
-        <w:tc>
-          <w:tcPr>
-            <w:tcW w:w="5000" w:type="dxa"/>
-            <w:tcMar>
-              <w:top w:w="100" w:type="dxa"/>
-              <w:left w:w="100" w:type="dxa"/>
-              <w:bottom w:w="100" w:type="dxa"/>
-              <w:right w:w="100" w:type="dxa"/>
-            </w:tcMar>
-          </w:tcPr>
-          <w:p>
-            <w:r>
-              <w:t>Lowest mileage and lowest warranty cost, with a 0% bad-buy rate — the safest and most reliable segment.</w:t>
+        <w:tc>
+          <w:tcPr>
+            <w:tcW w:w="4508" w:type="dxa"/>
+          </w:tcPr>
+          <w:p>
+            <w:pPr>
+              <w:pStyle w:val="Heading3"/>
+            </w:pPr>
+            <w:r>
+              <w:drawing>
+                <wp:inline distT="0" distB="0" distL="0" distR="0" wp14:anchorId="0F1D3A5A" wp14:editId="6F543FC5">
+                  <wp:extent cx="4591050" cy="3733800"/>
+                  <wp:effectExtent l="0" t="0" r="0" b="0"/>
+                  <wp:docPr id="961583140" name="Picture 1"/>
+                  <wp:cNvGraphicFramePr>
+                    <a:graphicFrameLocks xmlns:a="http://schemas.openxmlformats.org/drawingml/2006/main" noChangeAspect="1"/>
+                  </wp:cNvGraphicFramePr>
+                  <a:graphic xmlns:a="http://schemas.openxmlformats.org/drawingml/2006/main">
+                    <a:graphicData uri="http://schemas.openxmlformats.org/drawingml/2006/picture">
+                      <pic:pic xmlns:pic="http://schemas.openxmlformats.org/drawingml/2006/picture">
+                        <pic:nvPicPr>
+                          <pic:cNvPr id="961583140" name=""/>
+                          <pic:cNvPicPr/>
+                        </pic:nvPicPr>
+                        <pic:blipFill>
+                          <a:blip r:embed="rId13"/>
+                          <a:stretch>
+                            <a:fillRect/>
+                          </a:stretch>
+                        </pic:blipFill>
+                        <pic:spPr>
+                          <a:xfrm>
+                            <a:off x="0" y="0"/>
+                            <a:ext cx="4591050" cy="3733800"/>
+                          </a:xfrm>
+                          <a:prstGeom prst="rect">
+                            <a:avLst/>
+                          </a:prstGeom>
+                        </pic:spPr>
+                      </pic:pic>
+                    </a:graphicData>
+                  </a:graphic>
+                </wp:inline>
+              </w:drawing>
+            </w:r>
+          </w:p>
+        </w:tc>
+        <w:tc>
+          <w:tcPr>
+            <w:tcW w:w="4508" w:type="dxa"/>
+          </w:tcPr>
+          <w:p>
+            <w:pPr>
+              <w:pStyle w:val="Heading3"/>
+            </w:pPr>
+            <w:r>
+              <w:drawing>
+                <wp:inline distT="0" distB="0" distL="0" distR="0" wp14:anchorId="6C840781" wp14:editId="2020CF5C">
+                  <wp:extent cx="4419600" cy="3733800"/>
+                  <wp:effectExtent l="0" t="0" r="0" b="0"/>
+                  <wp:docPr id="143645869" name="Picture 1"/>
+                  <wp:cNvGraphicFramePr>
+                    <a:graphicFrameLocks xmlns:a="http://schemas.openxmlformats.org/drawingml/2006/main" noChangeAspect="1"/>
+                  </wp:cNvGraphicFramePr>
+                  <a:graphic xmlns:a="http://schemas.openxmlformats.org/drawingml/2006/main">
+                    <a:graphicData uri="http://schemas.openxmlformats.org/drawingml/2006/picture">
+                      <pic:pic xmlns:pic="http://schemas.openxmlformats.org/drawingml/2006/picture">
+                        <pic:nvPicPr>
+                          <pic:cNvPr id="143645869" name=""/>
+                          <pic:cNvPicPr/>
+                        </pic:nvPicPr>
+                        <pic:blipFill>
+                          <a:blip r:embed="rId14"/>
+                          <a:stretch>
+                            <a:fillRect/>
+                          </a:stretch>
+                        </pic:blipFill>
+                        <pic:spPr>
+                          <a:xfrm>
+                            <a:off x="0" y="0"/>
+                            <a:ext cx="4419600" cy="3733800"/>
+                          </a:xfrm>
+                          <a:prstGeom prst="rect">
+                            <a:avLst/>
+                          </a:prstGeom>
+                        </pic:spPr>
+                      </pic:pic>
+                    </a:graphicData>
+                  </a:graphic>
+                </wp:inline>
+              </w:drawing>
             </w:r>
           </w:p>
         </w:tc>
@@ -3679,10 +3727,122 @@
     </w:tbl>
     <w:p>
       <w:pPr>
-        <w:spacing w:after="100"/>
-      </w:pPr>
-      <w:r>
-        <w:t>In Figure 7.2, Cluster 1 (orange) clearly separates out in the bottom-left corner with the lowest mileage and warranty costs, while the bad-buy vehicles in Cluster 2 (green) mostly sit in the middle-to-high mileage range with lower average auction prices.</w:t>
+        <w:pStyle w:val="Heading3"/>
+      </w:pPr>
+    </w:p>
+    <w:p>
+      <w:pPr>
+        <w:pStyle w:val="Heading3"/>
+      </w:pPr>
+      <w:r>
+        <w:t xml:space="preserve">7.3.2 </w:t>
+      </w:r>
+      <w:r>
+        <w:t>Descriptive Cluster Labels</w:t>
+      </w:r>
+    </w:p>
+    <w:p>
+      <w:pPr>
+        <w:pStyle w:val="ListParagraph"/>
+        <w:numPr>
+          <w:ilvl w:val="0"/>
+          <w:numId w:val="5"/>
+        </w:numPr>
+        <w:spacing w:after="150"/>
+      </w:pPr>
+      <w:r>
+        <w:rPr>
+          <w:b/>
+          <w:bCs/>
+        </w:rPr>
+        <w:t>Cluster 0 (High-Mileage, Premium Fleet)</w:t>
+      </w:r>
+      <w:r>
+        <w:t xml:space="preserve">: The largest group (18,288 cars), with the highest odometer readings (~80,941 miles), the highest auction price (~$6,433), and the highest warranty cost (~$1,591) and yet a 0% </w:t>
+      </w:r>
+      <w:r>
+        <w:rPr>
+          <w:i/>
+          <w:iCs/>
+        </w:rPr>
+        <w:t>IsBadBuy</w:t>
+      </w:r>
+      <w:r>
+        <w:t xml:space="preserve"> rate. These are older but well-priced/well-warrantied vehicles that still resell reliably.</w:t>
+      </w:r>
+    </w:p>
+    <w:p>
+      <w:pPr>
+        <w:pStyle w:val="ListParagraph"/>
+        <w:numPr>
+          <w:ilvl w:val="0"/>
+          <w:numId w:val="5"/>
+        </w:numPr>
+        <w:spacing w:after="150"/>
+      </w:pPr>
+      <w:r>
+        <w:rPr>
+          <w:b/>
+          <w:bCs/>
+        </w:rPr>
+        <w:t>Cluster 1 (The "</w:t>
+      </w:r>
+      <w:r>
+        <w:rPr>
+          <w:b/>
+          <w:bCs/>
+        </w:rPr>
+        <w:t>Bad Buys</w:t>
+      </w:r>
+      <w:r>
+        <w:rPr>
+          <w:b/>
+          <w:bCs/>
+        </w:rPr>
+        <w:t>")</w:t>
+      </w:r>
+      <w:r>
+        <w:t xml:space="preserve">: 5,300 cars characterized by a 100% </w:t>
+      </w:r>
+      <w:r>
+        <w:rPr>
+          <w:i/>
+          <w:iCs/>
+        </w:rPr>
+        <w:t>IsBadBuy</w:t>
+      </w:r>
+      <w:r>
+        <w:t xml:space="preserve"> rate, the lowest auction price (~$5,447), and moderately high mileage (~74,371 miles). These are the definitive "bad buys" that the dealership struggles to resell.</w:t>
+      </w:r>
+    </w:p>
+    <w:p>
+      <w:pPr>
+        <w:pStyle w:val="ListParagraph"/>
+        <w:numPr>
+          <w:ilvl w:val="0"/>
+          <w:numId w:val="5"/>
+        </w:numPr>
+        <w:spacing w:after="150"/>
+      </w:pPr>
+      <w:r>
+        <w:rPr>
+          <w:b/>
+          <w:bCs/>
+        </w:rPr>
+        <w:t>Cluster 2 (Low-Mileage, Budget Fleet)</w:t>
+      </w:r>
+      <w:r>
+        <w:t xml:space="preserve">: 17,319 cars with the lowest mileage (~60,203 miles) and by far the lowest warranty cost (~$884), and a 0% </w:t>
+      </w:r>
+      <w:r>
+        <w:rPr>
+          <w:i/>
+          <w:iCs/>
+        </w:rPr>
+        <w:t>IsBadBuy</w:t>
+      </w:r>
+      <w:r>
+        <w:t xml:space="preserve"> rate. The safest and cheapest-to-maintain segment.</w:t>
       </w:r>
     </w:p>
     <w:p>
@@ -3696,17 +3856,18 @@
     </w:p>
     <w:p>
       <w:pPr>
-        <w:spacing w:after="150"/>
-      </w:pPr>
-      <w:r>
-        <w:t>Algorithm chosen: K-Prototypes. Since Make is a categorical string variable, standard K-Means cannot compute a Euclidean distance on it directly. K-Prototypes handles this by combining Euclidean distance for the numeric attributes with a simple matching dissimilarity measure for categorical attributes, allowing both data types to be clustered jointly. The same K = 3 and the same StandardScaler fit from Section 7.2 were reused for the numeric attributes, consistent with the assignment's instruction to use the best settings identified earlier.</w:t>
-      </w:r>
-    </w:p>
-    <w:p>
-      <w:pPr>
         <w:spacing w:after="300"/>
-        <w:jc w:val="center"/>
-      </w:pPr>
+      </w:pPr>
+      <w:r>
+        <w:rPr>
+          <w:b/>
+          <w:bCs/>
+        </w:rPr>
+        <w:t>Algorithm Chosen:</w:t>
+      </w:r>
+      <w:r>
+        <w:t xml:space="preserve"> K-Prototypes. Since Make is a categorical string, standard K-Means cannot compute Euclidean distance on it. K-Prototypes elegantly handles mixed data by using Euclidean distance for numerical features and matching dissimilarity for categorical features.</w:t>
+      </w:r>
     </w:p>
     <w:tbl>
       <w:tblPr>
@@ -3770,6 +3931,7 @@
             </w:tcMar>
           </w:tcPr>
           <w:p>
+            <w:proofErr w:type="spellStart"/>
             <w:r>
               <w:rPr>
                 <w:b/>
@@ -3777,6 +3939,7 @@
               </w:rPr>
               <w:t>VehOdo</w:t>
             </w:r>
+            <w:proofErr w:type="spellEnd"/>
           </w:p>
         </w:tc>
         <w:tc>
@@ -3812,6 +3975,7 @@
             </w:tcMar>
           </w:tcPr>
           <w:p>
+            <w:proofErr w:type="spellStart"/>
             <w:r>
               <w:rPr>
                 <w:b/>
@@ -3819,6 +3983,7 @@
               </w:rPr>
               <w:t>WarrantyCost</w:t>
             </w:r>
+            <w:proofErr w:type="spellEnd"/>
           </w:p>
         </w:tc>
         <w:tc>
@@ -3893,7 +4058,10 @@
           </w:tcPr>
           <w:p>
             <w:r>
-              <w:t>74,479</w:t>
+              <w:t>74,</w:t>
+            </w:r>
+            <w:r>
+              <w:t>371</w:t>
             </w:r>
           </w:p>
         </w:tc>
@@ -3909,7 +4077,10 @@
           </w:tcPr>
           <w:p>
             <w:r>
-              <w:t>$5,384</w:t>
+              <w:t>$5,</w:t>
+            </w:r>
+            <w:r>
+              <w:t>447</w:t>
             </w:r>
           </w:p>
         </w:tc>
@@ -3925,7 +4096,10 @@
           </w:tcPr>
           <w:p>
             <w:r>
-              <w:t>$1,348</w:t>
+              <w:t>$1,3</w:t>
+            </w:r>
+            <w:r>
+              <w:t>21</w:t>
             </w:r>
           </w:p>
         </w:tc>
@@ -3991,7 +4165,10 @@
           </w:tcPr>
           <w:p>
             <w:r>
-              <w:t>80,929</w:t>
+              <w:t>80,</w:t>
+            </w:r>
+            <w:r>
+              <w:t>394</w:t>
             </w:r>
           </w:p>
         </w:tc>
@@ -4007,7 +4184,10 @@
           </w:tcPr>
           <w:p>
             <w:r>
-              <w:t>$6,335</w:t>
+              <w:t>$6,</w:t>
+            </w:r>
+            <w:r>
+              <w:t>413</w:t>
             </w:r>
           </w:p>
         </w:tc>
@@ -4023,7 +4203,10 @@
           </w:tcPr>
           <w:p>
             <w:r>
-              <w:t>$1,570</w:t>
+              <w:t>$1,5</w:t>
+            </w:r>
+            <w:r>
+              <w:t>91</w:t>
             </w:r>
           </w:p>
         </w:tc>
@@ -4089,7 +4272,7 @@
           </w:tcPr>
           <w:p>
             <w:r>
-              <w:t>58,701</w:t>
+              <w:t>60,230</w:t>
             </w:r>
           </w:p>
         </w:tc>
@@ -4105,7 +4288,10 @@
           </w:tcPr>
           <w:p>
             <w:r>
-              <w:t>$6,140</w:t>
+              <w:t>$6,1</w:t>
+            </w:r>
+            <w:r>
+              <w:t>97</w:t>
             </w:r>
           </w:p>
         </w:tc>
@@ -4121,7 +4307,10 @@
           </w:tcPr>
           <w:p>
             <w:r>
-              <w:t>$892</w:t>
+              <w:t>$8</w:t>
+            </w:r>
+            <w:r>
+              <w:t>84</w:t>
             </w:r>
           </w:p>
         </w:tc>
@@ -4175,11 +4364,106 @@
     </w:p>
     <w:p>
       <w:pPr>
-        <w:spacing w:after="150"/>
-      </w:pPr>
-      <w:r>
-        <w:t>The cluster numbering differs from the numeric-only K-Means model, but the underlying group characteristics are the same three profiles: a 100%-bad-buy group (numeric-only Cluster 2 ≈ K-Prototypes Cluster 0), a high-mileage/high-warranty-but-reliable group (Cluster 0 ≈ Cluster 1), and a low-mileage/low-cost/reliable group (Cluster 1 ≈ Cluster 2). What K-Prototypes adds is a dominant Make per cluster: FORD is concentrated in the bad-buy cluster, CHEVROLET in the high-mileage-but-reliable cluster, and DODGE in the low-risk cluster. This shows that vehicle make carries additional discriminative information beyond price, mileage, and warranty cost alone — the numeric-only model could identify risk segments, but only the mixed-type model reveals which brands are associated with each segment.</w:t>
-      </w:r>
+        <w:rPr>
+          <w:lang w:val="en-GB"/>
+        </w:rPr>
+      </w:pPr>
+      <w:r>
+        <w:rPr>
+          <w:lang w:val="en-GB"/>
+        </w:rPr>
+        <w:t>When we add the Make variable using K-Prototypes, the cluster numbers change, but the core characteristics of each group remain the same:</w:t>
+      </w:r>
+    </w:p>
+    <w:p>
+      <w:pPr>
+        <w:rPr>
+          <w:lang w:val="en-GB"/>
+        </w:rPr>
+      </w:pPr>
+    </w:p>
+    <w:p>
+      <w:pPr>
+        <w:rPr>
+          <w:lang w:val="en-GB"/>
+        </w:rPr>
+      </w:pPr>
+      <w:r>
+        <w:rPr>
+          <w:b/>
+          <w:bCs/>
+          <w:lang w:val="en-GB"/>
+        </w:rPr>
+        <w:t>Cluster 0 (Bad Buys)</w:t>
+      </w:r>
+      <w:r>
+        <w:rPr>
+          <w:lang w:val="en-GB"/>
+        </w:rPr>
+        <w:t>: Vehicles in this group have the lowest auction price (around $5,447) and high mileage, but 100% of them are bad buys. FORD is the most common make here, showing that cheap, high-mileage Ford cars at auctions carry a very high risk of being a kick.</w:t>
+      </w:r>
+    </w:p>
+    <w:p>
+      <w:pPr>
+        <w:rPr>
+          <w:lang w:val="en-GB"/>
+        </w:rPr>
+      </w:pPr>
+      <w:r>
+        <w:rPr>
+          <w:b/>
+          <w:bCs/>
+          <w:lang w:val="en-GB"/>
+        </w:rPr>
+        <w:t>Cluster 1 (Older, High-Mileage Cars)</w:t>
+      </w:r>
+      <w:r>
+        <w:rPr>
+          <w:lang w:val="en-GB"/>
+        </w:rPr>
+        <w:t>: Dominated by CHEVROLET, these cars have the highest mileage (over 80,000 miles) and the highest warranty cost ($1,591), but none of them are bad buys. They are older, everyday cars that require more maintenance but are still resalable.</w:t>
+      </w:r>
+    </w:p>
+    <w:p>
+      <w:pPr>
+        <w:rPr>
+          <w:lang w:val="en-GB"/>
+        </w:rPr>
+      </w:pPr>
+      <w:r>
+        <w:rPr>
+          <w:b/>
+          <w:bCs/>
+          <w:lang w:val="en-GB"/>
+        </w:rPr>
+        <w:t>Cluster 2 (Low-Risk Cars)</w:t>
+      </w:r>
+      <w:r>
+        <w:rPr>
+          <w:lang w:val="en-GB"/>
+        </w:rPr>
+        <w:t>: Dominated by DODGE, these vehicles have low mileage (around 60,000 miles) and the lowest warranty cost ($884), with zero bad buys. They represent safe and reliable inventory.</w:t>
+      </w:r>
+    </w:p>
+    <w:p>
+      <w:pPr>
+        <w:rPr>
+          <w:lang w:val="en-GB"/>
+        </w:rPr>
+      </w:pPr>
+      <w:r>
+        <w:rPr>
+          <w:lang w:val="en-GB"/>
+        </w:rPr>
+        <w:t>While the first K-Means model only showed general numbers, the K-Prototypes model helps the dealership see which car brands are linked to high-risk or low-risk groups.</w:t>
+      </w:r>
+    </w:p>
+    <w:p>
+      <w:pPr>
+        <w:rPr>
+          <w:lang w:val="en-GB"/>
+        </w:rPr>
+      </w:pPr>
     </w:p>
     <w:p>
       <w:pPr>
@@ -4188,6 +4472,116 @@
       </w:pPr>
       <w:r>
         <w:t>7.5 Practical Implications for Decision-Makers</w:t>
+      </w:r>
+    </w:p>
+    <w:p>
+      <w:pPr>
+        <w:numPr>
+          <w:ilvl w:val="0"/>
+          <w:numId w:val="6"/>
+        </w:numPr>
+        <w:rPr>
+          <w:lang w:val="en-GB"/>
+        </w:rPr>
+      </w:pPr>
+      <w:r>
+        <w:rPr>
+          <w:b/>
+          <w:bCs/>
+          <w:lang w:val="en-GB"/>
+        </w:rPr>
+        <w:t>Avoid Risky Auction Buys:</w:t>
+      </w:r>
+      <w:r>
+        <w:rPr>
+          <w:lang w:val="en-GB"/>
+        </w:rPr>
+        <w:t xml:space="preserve"> Buyers should be very careful with cars that fit Cluster 0 (especially FORD models priced under $5,500 with over 70,000 miles). These cars have a high chance of being a bad buy, so the dealership should inspect them thoroughly before bidding or avoid them completely.</w:t>
+      </w:r>
+    </w:p>
+    <w:p>
+      <w:pPr>
+        <w:numPr>
+          <w:ilvl w:val="0"/>
+          <w:numId w:val="6"/>
+        </w:numPr>
+        <w:rPr>
+          <w:lang w:val="en-GB"/>
+        </w:rPr>
+      </w:pPr>
+      <w:r>
+        <w:rPr>
+          <w:b/>
+          <w:bCs/>
+          <w:lang w:val="en-GB"/>
+        </w:rPr>
+        <w:t>Stock Reliable Inventory:</w:t>
+      </w:r>
+      <w:r>
+        <w:rPr>
+          <w:lang w:val="en-GB"/>
+        </w:rPr>
+        <w:t xml:space="preserve"> Cars in Cluster 2 (mainly DODGE) are safe investments because they have low mileage and low warranty costs. The dealership can buy more of these cars to resell quickly to retail customers with little repair work.</w:t>
+      </w:r>
+    </w:p>
+    <w:p>
+      <w:pPr>
+        <w:numPr>
+          <w:ilvl w:val="0"/>
+          <w:numId w:val="6"/>
+        </w:numPr>
+        <w:rPr>
+          <w:lang w:val="en-GB"/>
+        </w:rPr>
+      </w:pPr>
+      <w:r>
+        <w:rPr>
+          <w:b/>
+          <w:bCs/>
+          <w:lang w:val="en-GB"/>
+        </w:rPr>
+        <w:t>Plan for Warranty Costs:</w:t>
+      </w:r>
+      <w:r>
+        <w:rPr>
+          <w:lang w:val="en-GB"/>
+        </w:rPr>
+        <w:t xml:space="preserve"> Cluster 1 cars (CHEVROLET) are not bad buys, but their average warranty cost is much higher (884 for Cluster 2). The dealership should price these cars slightly higher to cover potential repair costs after the sale.</w:t>
+      </w:r>
+    </w:p>
+    <w:p/>
+    <w:p>
+      <w:pPr>
+        <w:pStyle w:val="Heading1"/>
+        <w:spacing w:before="400" w:after="200"/>
+      </w:pPr>
+      <w:r>
+        <w:t xml:space="preserve">Task 8: Time Series Forecasting with LSTM on the </w:t>
+      </w:r>
+      <w:proofErr w:type="spellStart"/>
+      <w:r>
+        <w:t>AgriWebb</w:t>
+      </w:r>
+      <w:proofErr w:type="spellEnd"/>
+      <w:r>
+        <w:t xml:space="preserve"> Dataset</w:t>
+      </w:r>
+    </w:p>
+    <w:p>
+      <w:pPr>
+        <w:pStyle w:val="Heading2"/>
+        <w:spacing w:before="300" w:after="150"/>
+      </w:pPr>
+      <w:r>
+        <w:t>8.1 Preprocessing for Time Series Forecasting</w:t>
+      </w:r>
+    </w:p>
+    <w:p>
+      <w:pPr>
+        <w:spacing w:after="150"/>
+      </w:pPr>
+      <w:r>
+        <w:t>Data covers 19 paddocks with usable data, each retaining between 188 and 190 timesteps after preprocessing (mean 189.3).</w:t>
       </w:r>
     </w:p>
     <w:p>
@@ -4200,7 +4594,7 @@
         <w:spacing w:after="80"/>
       </w:pPr>
       <w:r>
-        <w:t>Avoid risky auction buys: buyers should exercise particular caution with vehicles resembling the bad-buy cluster profile — notably FORD vehicles priced under roughly $5,500 with over 70,000 miles — as these carry a substantially elevated risk of being a 'kick'. Such vehicles should be thoroughly inspected before bidding, or avoided.</w:t>
+        <w:t>Reserving the last 5 timesteps per paddock for testing: this creates a genuine forecasting evaluation — the model is trained only on each paddock's earlier history and evaluated on strictly future, unseen timesteps, mirroring how the model would actually be used in deployment (predicting pasture growth ahead of time rather than interpolating within known data).</w:t>
       </w:r>
     </w:p>
     <w:p>
@@ -4213,13 +4607,7 @@
         <w:spacing w:after="80"/>
       </w:pPr>
       <w:r>
-        <w:t>Prioriti</w:t>
-      </w:r>
-      <w:r>
-        <w:t>z</w:t>
-      </w:r>
-      <w:r>
-        <w:t>e reliable inventory: vehicles matching the low-risk cluster profile (predominantly DODGE, low mileage, low warranty cost) represent comparatively safe purchases that can be resold to retail customers with minimal expected repair overhead.</w:t>
+        <w:t>Excluding paddocks with short sequences: paddocks without enough historical timesteps to form at least one full lookback window plus the 5-step test horizon were dropped, since they cannot support both meaningful training sequences and a valid held-out test window.</w:t>
       </w:r>
     </w:p>
     <w:p>
@@ -4232,21 +4620,15 @@
         <w:spacing w:after="80"/>
       </w:pPr>
       <w:r>
-        <w:t>Price in warranty risk: vehicles in the high-mileage/high-warranty cluster (predominantly CHEVROLET) are not classified as bad buys, but carry a warranty cost roughly 76% higher than the low-risk cluster ($1,570 vs. $892). The dealership should factor this into resale pricing to cover the higher expected post-sale repair costs.</w:t>
-      </w:r>
-    </w:p>
-    <w:p>
-      <w:r>
-        <w:br w:type="page"/>
-      </w:r>
-    </w:p>
-    <w:p>
-      <w:pPr>
-        <w:pStyle w:val="Heading1"/>
-        <w:spacing w:before="400" w:after="200"/>
-      </w:pPr>
-      <w:r>
-        <w:t>Task 8: Time Series Forecasting with LSTM on the AgriWebb Dataset</w:t>
+        <w:t xml:space="preserve">Per-paddock StandardScaler: a separate scaler </w:t>
+      </w:r>
+      <w:proofErr w:type="gramStart"/>
+      <w:r>
+        <w:t>was fit on</w:t>
+      </w:r>
+      <w:proofErr w:type="gramEnd"/>
+      <w:r>
+        <w:t xml:space="preserve"> each paddock's own training portion (mean/std computed independently per paddock) rather than one global scaler. This matters because paddocks differ substantially in baseline TSDM levels and variability (per-paddock training means range from 961 to 1,697, and training standard deviations range from 280 to 969) — a single global scaler would let high-magnitude paddocks dominate the loss function, whereas per-paddock scaling lets the LSTM learn from the shape of each paddock's growth trajectory on a comparable scale.</w:t>
       </w:r>
     </w:p>
     <w:p>
@@ -4255,7 +4637,7 @@
         <w:spacing w:before="300" w:after="150"/>
       </w:pPr>
       <w:r>
-        <w:t>8.1 Preprocessing for Time Series Forecasting</w:t>
+        <w:t>8.2 Model 1: Univariate LSTM (Lookback = 5, Predict = 5)</w:t>
       </w:r>
     </w:p>
     <w:p>
@@ -4263,55 +4645,63 @@
         <w:spacing w:after="150"/>
       </w:pPr>
       <w:r>
-        <w:t>Data covers 19 paddocks with usable data, each retaining between 188 and 190 timesteps after preprocessing (mean 189.3).</w:t>
-      </w:r>
-    </w:p>
-    <w:p>
-      <w:pPr>
-        <w:pStyle w:val="ListParagraph"/>
-        <w:numPr>
-          <w:ilvl w:val="0"/>
-          <w:numId w:val="1"/>
-        </w:numPr>
-        <w:spacing w:after="80"/>
-      </w:pPr>
-      <w:r>
-        <w:t>Reserving the last 5 timesteps per paddock for testing: this creates a genuine forecasting evaluation — the model is trained only on each paddock's earlier history and evaluated on strictly future, unseen timesteps, mirroring how the model would actually be used in deployment (predicting pasture growth ahead of time rather than interpolating within known data).</w:t>
-      </w:r>
-    </w:p>
-    <w:p>
-      <w:pPr>
-        <w:pStyle w:val="ListParagraph"/>
-        <w:numPr>
-          <w:ilvl w:val="0"/>
-          <w:numId w:val="1"/>
-        </w:numPr>
-        <w:spacing w:after="80"/>
-      </w:pPr>
-      <w:r>
-        <w:t>Excluding paddocks with short sequences: paddocks without enough historical timesteps to form at least one full lookback window plus the 5-step test horizon were dropped, since they cannot support both meaningful training sequences and a valid held-out test window.</w:t>
-      </w:r>
-    </w:p>
-    <w:p>
-      <w:pPr>
-        <w:pStyle w:val="ListParagraph"/>
-        <w:numPr>
-          <w:ilvl w:val="0"/>
-          <w:numId w:val="1"/>
-        </w:numPr>
-        <w:spacing w:after="80"/>
-      </w:pPr>
-      <w:r>
-        <w:t>Per-paddock StandardScaler: a separate scaler was fit on each paddock's own training portion (mean/std computed independently per paddock) rather than one global scaler. This matters because paddocks differ substantially in baseline TSDM levels and variability (per-paddock training means range from 961 to 1,697, and training standard deviations range from 280 to 969) — a single global scaler would let high-magnitude paddocks dominate the loss function, whereas per-paddock scaling lets the LSTM learn from the shape of each paddock's growth trajectory on a comparable scale.</w:t>
-      </w:r>
-    </w:p>
-    <w:p>
-      <w:pPr>
-        <w:pStyle w:val="Heading2"/>
-        <w:spacing w:before="300" w:after="150"/>
-      </w:pPr>
-      <w:r>
-        <w:t>8.2 Model 1: Univariate LSTM (Lookback = 5, Predict = 5)</w:t>
+        <w:t xml:space="preserve">Architecture: </w:t>
+      </w:r>
+      <w:proofErr w:type="spellStart"/>
+      <w:r>
+        <w:t>SequenceLSTM</w:t>
+      </w:r>
+      <w:proofErr w:type="spellEnd"/>
+      <w:r>
+        <w:t xml:space="preserve"> with </w:t>
+      </w:r>
+      <w:proofErr w:type="spellStart"/>
+      <w:r>
+        <w:t>num_features</w:t>
+      </w:r>
+      <w:proofErr w:type="spellEnd"/>
+      <w:r>
+        <w:t xml:space="preserve"> = 1 (TSDM only), </w:t>
+      </w:r>
+      <w:proofErr w:type="spellStart"/>
+      <w:r>
+        <w:t>hidden_size</w:t>
+      </w:r>
+      <w:proofErr w:type="spellEnd"/>
+      <w:r>
+        <w:t xml:space="preserve"> = 16, </w:t>
+      </w:r>
+      <w:proofErr w:type="spellStart"/>
+      <w:r>
+        <w:t>num_layers</w:t>
+      </w:r>
+      <w:proofErr w:type="spellEnd"/>
+      <w:r>
+        <w:t xml:space="preserve"> = 2, </w:t>
+      </w:r>
+      <w:proofErr w:type="spellStart"/>
+      <w:r>
+        <w:t>output_size</w:t>
+      </w:r>
+      <w:proofErr w:type="spellEnd"/>
+      <w:r>
+        <w:t xml:space="preserve"> = 5 (</w:t>
+      </w:r>
+      <w:proofErr w:type="spellStart"/>
+      <w:r>
+        <w:t>forecast_horizon</w:t>
+      </w:r>
+      <w:proofErr w:type="spellEnd"/>
+      <w:r>
+        <w:t>), dropout = 0.2 (</w:t>
+      </w:r>
+      <w:proofErr w:type="spellStart"/>
+      <w:r>
+        <w:t>PyTorch</w:t>
+      </w:r>
+      <w:proofErr w:type="spellEnd"/>
+      <w:r>
+        <w:t xml:space="preserve"> default in the model class, applied between LSTM layers and before the final linear layer).</w:t>
       </w:r>
     </w:p>
     <w:p>
@@ -4319,7 +4709,13 @@
         <w:spacing w:after="150"/>
       </w:pPr>
       <w:r>
-        <w:t>Architecture: SequenceLSTM with num_features = 1 (TSDM only), hidden_size = 16, num_layers = 2, output_size = 5 (forecast_horizon), dropout = 0.2 (PyTorch default in the model class, applied between LSTM layers and before the final linear layer).</w:t>
+        <w:t xml:space="preserve">Training: Adam </w:t>
+      </w:r>
+      <w:r>
+        <w:t>optimizer</w:t>
+      </w:r>
+      <w:r>
+        <w:t>, learning rate = 0.001, 250 epochs, batch size 32, MSE loss, with an 80/20 internal train/validation split used to select the best-performing model checkpoint (lowest validation loss) across training.</w:t>
       </w:r>
     </w:p>
     <w:p>
@@ -4327,21 +4723,23 @@
         <w:spacing w:after="150"/>
       </w:pPr>
       <w:r>
-        <w:t xml:space="preserve">Training: Adam </w:t>
-      </w:r>
-      <w:r>
-        <w:t>optimizer</w:t>
-      </w:r>
-      <w:r>
-        <w:t>, learning rate = 0.001, 250 epochs, batch size 32, MSE loss, with an 80/20 internal train/validation split used to select the best-performing model checkpoint (lowest validation loss) across training.</w:t>
-      </w:r>
-    </w:p>
-    <w:p>
-      <w:pPr>
-        <w:spacing w:after="150"/>
-      </w:pPr>
-      <w:r>
-        <w:t>Hyperparameter selection: hidden_size and num_layers were set based on standard practice for small univariate sequence problems (a small hidden layer size relative to the very short 5-step lookback avoids over-</w:t>
+        <w:t xml:space="preserve">Hyperparameter selection: </w:t>
+      </w:r>
+      <w:proofErr w:type="spellStart"/>
+      <w:r>
+        <w:t>hidden_size</w:t>
+      </w:r>
+      <w:proofErr w:type="spellEnd"/>
+      <w:r>
+        <w:t xml:space="preserve"> and </w:t>
+      </w:r>
+      <w:proofErr w:type="spellStart"/>
+      <w:r>
+        <w:t>num_layers</w:t>
+      </w:r>
+      <w:proofErr w:type="spellEnd"/>
+      <w:r>
+        <w:t xml:space="preserve"> were set based on standard practice for small univariate sequence problems (a small hidden layer size relative to the very short 5-step lookback avoids over-</w:t>
       </w:r>
       <w:r>
         <w:t>parameterizing</w:t>
@@ -4475,7 +4873,15 @@
           </w:tcPr>
           <w:p>
             <w:r>
-              <w:t>0.7007 (standardised)</w:t>
+              <w:t>0.7007 (</w:t>
+            </w:r>
+            <w:proofErr w:type="spellStart"/>
+            <w:r>
+              <w:t>standardised</w:t>
+            </w:r>
+            <w:proofErr w:type="spellEnd"/>
+            <w:r>
+              <w:t>)</w:t>
             </w:r>
           </w:p>
         </w:tc>
@@ -4933,7 +5339,7 @@
                     </pic:cNvPicPr>
                   </pic:nvPicPr>
                   <pic:blipFill>
-                    <a:blip r:embed="rId12">
+                    <a:blip r:embed="rId15">
                       <a:extLst>
                         <a:ext uri="{28A0092B-C50C-407E-A947-70E740481C1C}">
                           <a14:useLocalDpi xmlns:a14="http://schemas.microsoft.com/office/drawing/2010/main" val="0"/>
@@ -4979,13 +5385,37 @@
         <w:spacing w:after="150"/>
       </w:pPr>
       <w:r>
-        <w:t xml:space="preserve">The training and validation loss both drop sharply in the first 50 epochs (0.91 → 0.50 train, 0.97 → 0.61 val) and then </w:t>
+        <w:t xml:space="preserve">The training and validation loss both </w:t>
+      </w:r>
+      <w:proofErr w:type="gramStart"/>
+      <w:r>
+        <w:t>drop</w:t>
+      </w:r>
+      <w:proofErr w:type="gramEnd"/>
+      <w:r>
+        <w:t xml:space="preserve"> sharply in the first 50 epochs (0.91 → 0.50 train, 0.97 → 0.61 </w:t>
+      </w:r>
+      <w:proofErr w:type="spellStart"/>
+      <w:r>
+        <w:t>val</w:t>
+      </w:r>
+      <w:proofErr w:type="spellEnd"/>
+      <w:r>
+        <w:t xml:space="preserve">) and then </w:t>
       </w:r>
       <w:r>
         <w:t>flattened</w:t>
       </w:r>
       <w:r>
-        <w:t xml:space="preserve"> out, with only marginal further improvement through epoch 200 (0.47 train, 0.60 val). The two curves stay reasonably close together throughout (a gap of roughly 0.09–0.13), suggesting limited overfitting within this internal validation split — however, as shown in Section 8.5, this internal validation gap does not reflect true forecasting performance on the genuinely held-out last-5-timestep test window, where Model 1 in fact </w:t>
+        <w:t xml:space="preserve"> out, with only marginal further improvement through epoch 200 (0.47 train, 0.60 </w:t>
+      </w:r>
+      <w:proofErr w:type="spellStart"/>
+      <w:r>
+        <w:t>val</w:t>
+      </w:r>
+      <w:proofErr w:type="spellEnd"/>
+      <w:r>
+        <w:t xml:space="preserve">). The two curves stay reasonably close together throughout (a gap of roughly 0.09–0.13), suggesting limited overfitting within this internal validation split — however, as shown in Section 8.5, this internal validation gap does not reflect true forecasting performance on the genuinely held-out last-5-timestep test window, where Model 1 in fact </w:t>
       </w:r>
       <w:r>
         <w:t>generalizes</w:t>
@@ -5008,7 +5438,39 @@
         <w:spacing w:after="150"/>
       </w:pPr>
       <w:r>
-        <w:t>Architecture change: hidden_size was increased from 16 to 24 (num_layers, dropout, num_features, and output_size unchanged) to give the model additional representational capacity to process the doubled lookback window (10 timesteps of history instead of 5).</w:t>
+        <w:t xml:space="preserve">Architecture change: </w:t>
+      </w:r>
+      <w:proofErr w:type="spellStart"/>
+      <w:r>
+        <w:t>hidden_size</w:t>
+      </w:r>
+      <w:proofErr w:type="spellEnd"/>
+      <w:r>
+        <w:t xml:space="preserve"> was increased from 16 to 24 (</w:t>
+      </w:r>
+      <w:proofErr w:type="spellStart"/>
+      <w:r>
+        <w:t>num_layers</w:t>
+      </w:r>
+      <w:proofErr w:type="spellEnd"/>
+      <w:r>
+        <w:t xml:space="preserve">, dropout, </w:t>
+      </w:r>
+      <w:proofErr w:type="spellStart"/>
+      <w:r>
+        <w:t>num_features</w:t>
+      </w:r>
+      <w:proofErr w:type="spellEnd"/>
+      <w:r>
+        <w:t xml:space="preserve">, and </w:t>
+      </w:r>
+      <w:proofErr w:type="spellStart"/>
+      <w:r>
+        <w:t>output_size</w:t>
+      </w:r>
+      <w:proofErr w:type="spellEnd"/>
+      <w:r>
+        <w:t xml:space="preserve"> unchanged) to give the model additional representational capacity to process the doubled lookback window (10 timesteps of history instead of 5).</w:t>
       </w:r>
     </w:p>
     <w:tbl>
@@ -5130,7 +5592,15 @@
           </w:tcPr>
           <w:p>
             <w:r>
-              <w:t>0.5397 (standardised)</w:t>
+              <w:t>0.5397 (</w:t>
+            </w:r>
+            <w:proofErr w:type="spellStart"/>
+            <w:r>
+              <w:t>standardised</w:t>
+            </w:r>
+            <w:proofErr w:type="spellEnd"/>
+            <w:r>
+              <w:t>)</w:t>
             </w:r>
           </w:p>
         </w:tc>
@@ -5588,7 +6058,7 @@
                     </pic:cNvPicPr>
                   </pic:nvPicPr>
                   <pic:blipFill>
-                    <a:blip r:embed="rId13">
+                    <a:blip r:embed="rId16">
                       <a:extLst>
                         <a:ext uri="{28A0092B-C50C-407E-A947-70E740481C1C}">
                           <a14:useLocalDpi xmlns:a14="http://schemas.microsoft.com/office/drawing/2010/main" val="0"/>
@@ -5634,7 +6104,15 @@
         <w:spacing w:after="150"/>
       </w:pPr>
       <w:r>
-        <w:t>Both loss curves continue decreasing steadily through all 200 logged epochs (train: 0.78 → 0.31; val: 0.85 → 0.46) without fully plateauing, unlike Model 1. Train R² improved substantially over Model 1 (0.51 → 0.71), reflecting the larger hidden size and longer lookback giving the model more to fit — but Test R² dropped (0.31 → 0.11), an early sign of the overfitting trend explored fully in Section 8.5.1: more capacity and more training-window information improved the internal fit without improving genuine forecasting ability.</w:t>
+        <w:t xml:space="preserve">Both loss curves continue decreasing steadily through all 200 logged epochs (train: 0.78 → 0.31; </w:t>
+      </w:r>
+      <w:proofErr w:type="spellStart"/>
+      <w:r>
+        <w:t>val</w:t>
+      </w:r>
+      <w:proofErr w:type="spellEnd"/>
+      <w:r>
+        <w:t>: 0.85 → 0.46) without fully plateauing, unlike Model 1. Train R² improved substantially over Model 1 (0.51 → 0.71), reflecting the larger hidden size and longer lookback giving the model more to fit — but Test R² dropped (0.31 → 0.11), an early sign of the overfitting trend explored fully in Section 8.5.1: more capacity and more training-window information improved the internal fit without improving genuine forecasting ability.</w:t>
       </w:r>
     </w:p>
     <w:p>
@@ -5651,7 +6129,39 @@
         <w:spacing w:after="150"/>
       </w:pPr>
       <w:r>
-        <w:t>Architecture modifications: num_features was increased from 1 to the number of available climate columns (TSDM plus 15-day-average rainfall, max/min temperature, relative humidity at max/min temperature, evaporation, and radiation — 8 features in total when all are present in the data), requiring the LSTM's input_size to scale accordingly; hidden_size was further increased to 32 (from 24) to give the model enough capacity to combine information across all input channels; lookback was kept at 10 (as in Model 2) rather than a fixed short window, and the existing variable-length packing (pack_padded_sequence) already supported flexible per-paddock sequence lengths without further changes.</w:t>
+        <w:t xml:space="preserve">Architecture modifications: </w:t>
+      </w:r>
+      <w:proofErr w:type="spellStart"/>
+      <w:r>
+        <w:t>num_features</w:t>
+      </w:r>
+      <w:proofErr w:type="spellEnd"/>
+      <w:r>
+        <w:t xml:space="preserve"> was increased from 1 to the number of available climate columns (TSDM plus 15-day-average rainfall, max/min temperature, relative humidity at max/min temperature, evaporation, and radiation — 8 features in total when all are present in the data), requiring the LSTM's </w:t>
+      </w:r>
+      <w:proofErr w:type="spellStart"/>
+      <w:r>
+        <w:t>input_size</w:t>
+      </w:r>
+      <w:proofErr w:type="spellEnd"/>
+      <w:r>
+        <w:t xml:space="preserve"> to scale accordingly; </w:t>
+      </w:r>
+      <w:proofErr w:type="spellStart"/>
+      <w:r>
+        <w:t>hidden_size</w:t>
+      </w:r>
+      <w:proofErr w:type="spellEnd"/>
+      <w:r>
+        <w:t xml:space="preserve"> was further increased to 32 (from 24) to give the model enough capacity to combine information across all input channels; lookback was kept at 10 (as in Model 2) rather than a fixed short window, and the existing variable-length packing (</w:t>
+      </w:r>
+      <w:proofErr w:type="spellStart"/>
+      <w:r>
+        <w:t>pack_padded_sequence</w:t>
+      </w:r>
+      <w:proofErr w:type="spellEnd"/>
+      <w:r>
+        <w:t>) already supported flexible per-paddock sequence lengths without further changes.</w:t>
       </w:r>
     </w:p>
     <w:tbl>
@@ -5773,7 +6283,15 @@
           </w:tcPr>
           <w:p>
             <w:r>
-              <w:t>0.2980 (standardised)</w:t>
+              <w:t>0.2980 (</w:t>
+            </w:r>
+            <w:proofErr w:type="spellStart"/>
+            <w:r>
+              <w:t>standardised</w:t>
+            </w:r>
+            <w:proofErr w:type="spellEnd"/>
+            <w:r>
+              <w:t>)</w:t>
             </w:r>
           </w:p>
         </w:tc>
@@ -6231,7 +6749,7 @@
                     </pic:cNvPicPr>
                   </pic:nvPicPr>
                   <pic:blipFill>
-                    <a:blip r:embed="rId14">
+                    <a:blip r:embed="rId17">
                       <a:extLst>
                         <a:ext uri="{28A0092B-C50C-407E-A947-70E740481C1C}">
                           <a14:useLocalDpi xmlns:a14="http://schemas.microsoft.com/office/drawing/2010/main" val="0"/>
@@ -6717,13 +7235,37 @@
         <w:spacing w:after="150"/>
       </w:pPr>
       <w:r>
-        <w:t xml:space="preserve">This matters because it means the notebook's initial impression — that adding climate features and a longer lookback substantially improves the model — only holds when judged against the internal 80/20 validation split carved out of the training data. That validation split is drawn from the same time period and distribution as the training data, so it primarily measures how well the model interpolates within familiar territory, not how well it forecasts genuinely future, unseen pasture growth. The true forecasting test (the reserved last-5-timestep window per paddock) tells the opposite </w:t>
+        <w:t xml:space="preserve">This matters because it means the notebook's initial impression — that adding climate features and a longer lookback substantially improves the model — only holds when judged against the internal 80/20 validation split carved out of the training data. That validation split is drawn from the same </w:t>
+      </w:r>
+      <w:proofErr w:type="gramStart"/>
+      <w:r>
+        <w:t>time period</w:t>
+      </w:r>
+      <w:proofErr w:type="gramEnd"/>
+      <w:r>
+        <w:t xml:space="preserve"> and distribution as the training data, so it primarily measures how well the model interpolates within familiar territory, not how well it forecasts genuinely future, unseen pasture growth. The true forecasting test (the reserved last-5-timestep window per paddock) tells the opposite </w:t>
       </w:r>
       <w:r>
         <w:t>story and</w:t>
       </w:r>
       <w:r>
-        <w:t xml:space="preserve"> is the metric that actually matters for AgriWebb's stated goal of predicting future pasture availability.</w:t>
+        <w:t xml:space="preserve"> is the metric that </w:t>
+      </w:r>
+      <w:proofErr w:type="gramStart"/>
+      <w:r>
+        <w:t>actually matters</w:t>
+      </w:r>
+      <w:proofErr w:type="gramEnd"/>
+      <w:r>
+        <w:t xml:space="preserve"> for </w:t>
+      </w:r>
+      <w:proofErr w:type="spellStart"/>
+      <w:r>
+        <w:t>AgriWebb's</w:t>
+      </w:r>
+      <w:proofErr w:type="spellEnd"/>
+      <w:r>
+        <w:t xml:space="preserve"> stated goal of predicting future pasture availability.</w:t>
       </w:r>
     </w:p>
     <w:p>
@@ -7423,7 +7965,15 @@
         <w:spacing w:after="150"/>
       </w:pPr>
       <w:r>
-        <w:t xml:space="preserve">For AgriWebb, these results suggest the current multivariate model should not be deployed as-is for operational forecasting, despite its strong training fit: a Test R² of 0.07 means it explains almost none of the variance in genuinely future pasture </w:t>
+        <w:t xml:space="preserve">For </w:t>
+      </w:r>
+      <w:proofErr w:type="spellStart"/>
+      <w:r>
+        <w:t>AgriWebb</w:t>
+      </w:r>
+      <w:proofErr w:type="spellEnd"/>
+      <w:r>
+        <w:t xml:space="preserve">, these results suggest the current multivariate model should not be deployed as-is for operational forecasting, despite its strong training fit: a Test R² of 0.07 means it explains almost none of the variance in genuinely future pasture </w:t>
       </w:r>
       <w:r>
         <w:t>growth and</w:t>
@@ -7435,7 +7985,23 @@
         <w:t>considering</w:t>
       </w:r>
       <w:r>
-        <w:t xml:space="preserve"> per-paddock or per-cluster fine-tuning rather than one shared model across all 19 paddocks; gathering more historical timesteps per paddock before adding additional input features; and applying stronger regularisation (e.g., increased dropout, L2 weight decay) specifically for the multivariate model given its clear overfitting signature. Until such improvements are validated on genuine forecasting performance, model outputs should be treated as indicative at best for volatile paddocks (train std &gt; ~450), and used with more confidence only for paddocks with historically stable, low-variability growth patterns.</w:t>
+        <w:t xml:space="preserve"> per-paddock or per-cluster fine-tuning rather than one shared model across all 19 paddocks; gathering more historical timesteps per paddock before adding additional input features; and applying stronger </w:t>
+      </w:r>
+      <w:proofErr w:type="spellStart"/>
+      <w:r>
+        <w:t>regularisation</w:t>
+      </w:r>
+      <w:proofErr w:type="spellEnd"/>
+      <w:r>
+        <w:t xml:space="preserve"> (e.g., increased dropout, L2 weight decay) specifically for the multivariate model given its clear overfitting signature. Until such improvements are validated on genuine forecasting performance, model outputs should be treated as indicative at best for volatile paddocks (train std &gt; ~450</w:t>
+      </w:r>
+      <w:proofErr w:type="gramStart"/>
+      <w:r>
+        <w:t>), and</w:t>
+      </w:r>
+      <w:proofErr w:type="gramEnd"/>
+      <w:r>
+        <w:t xml:space="preserve"> used with more confidence only for paddocks with historically stable, low-variability growth patterns.</w:t>
       </w:r>
     </w:p>
     <w:p>
@@ -7466,7 +8032,15 @@
         <w:spacing w:after="150"/>
       </w:pPr>
       <w:r>
-        <w:t>The hydrogen_small dataset contains 1,000 tweets, with a class distribution of 547 Relevant and 453 Irrelevant (54.7% / 45.3%).</w:t>
+        <w:t xml:space="preserve">The </w:t>
+      </w:r>
+      <w:proofErr w:type="spellStart"/>
+      <w:r>
+        <w:t>hydrogen_small</w:t>
+      </w:r>
+      <w:proofErr w:type="spellEnd"/>
+      <w:r>
+        <w:t xml:space="preserve"> dataset contains 1,000 tweets, with a class distribution of 547 Relevant and 453 Irrelevant (54.7% / 45.3%).</w:t>
       </w:r>
     </w:p>
     <w:p>
@@ -7479,13 +8053,37 @@
         <w:spacing w:after="80"/>
       </w:pPr>
       <w:r>
-        <w:t xml:space="preserve">Text cleaning: URLs, Twitter mentions (@handles), and non-ASCII characters were stripped via regular expressions, and consecutive whitespace was </w:t>
+        <w:t xml:space="preserve">Text cleaning: URLs, Twitter </w:t>
+      </w:r>
+      <w:proofErr w:type="gramStart"/>
+      <w:r>
+        <w:t>mentions (@</w:t>
+      </w:r>
+      <w:proofErr w:type="gramEnd"/>
+      <w:r>
+        <w:t xml:space="preserve">handles), and non-ASCII characters were stripped via regular expressions, and consecutive whitespace was </w:t>
       </w:r>
       <w:r>
         <w:t>normalized</w:t>
       </w:r>
       <w:r>
-        <w:t xml:space="preserve"> to single spaces. Raw tweets are noisy — links, handles, and stray symbols carry no topical signal and would otherwise be tokenised as meaningless sub-word units, diluting the input the model actually needs to attend to.</w:t>
+        <w:t xml:space="preserve"> to single spaces. Raw tweets are noisy — links, handles, and stray symbols carry no topical signal and would otherwise be </w:t>
+      </w:r>
+      <w:proofErr w:type="spellStart"/>
+      <w:r>
+        <w:t>tokenised</w:t>
+      </w:r>
+      <w:proofErr w:type="spellEnd"/>
+      <w:r>
+        <w:t xml:space="preserve"> as meaningless sub-word units, diluting the input the model </w:t>
+      </w:r>
+      <w:proofErr w:type="gramStart"/>
+      <w:r>
+        <w:t>actually needs</w:t>
+      </w:r>
+      <w:proofErr w:type="gramEnd"/>
+      <w:r>
+        <w:t xml:space="preserve"> to attend to.</w:t>
       </w:r>
     </w:p>
     <w:p>
@@ -7498,7 +8096,15 @@
         <w:spacing w:after="80"/>
       </w:pPr>
       <w:r>
-        <w:t>Label encoding: labels were mapped to binary integers, Relevant = 1 and Irrelevant = 0, since AutoModelForSequenceClassification and Cross-Entropy Loss require integer class targets rather than string labels.</w:t>
+        <w:t xml:space="preserve">Label encoding: labels were mapped to binary integers, Relevant = 1 and Irrelevant = 0, since </w:t>
+      </w:r>
+      <w:proofErr w:type="spellStart"/>
+      <w:r>
+        <w:t>AutoModelForSequenceClassification</w:t>
+      </w:r>
+      <w:proofErr w:type="spellEnd"/>
+      <w:r>
+        <w:t xml:space="preserve"> and Cross-Entropy Loss require integer class targets rather than string labels.</w:t>
       </w:r>
     </w:p>
     <w:p>
@@ -7510,8 +8116,13 @@
         </w:numPr>
         <w:spacing w:after="80"/>
       </w:pPr>
-      <w:r>
-        <w:t>Tokenisation: each model's own tokenizer was used with truncation and dynamic padding up to a maximum length of 128 tokens, ensuring uniform tensor shapes for batched GPU training while keeping sequence length short enough (tweets are short by nature) to avoid unnecessary computation.</w:t>
+      <w:proofErr w:type="spellStart"/>
+      <w:r>
+        <w:t>Tokenisation</w:t>
+      </w:r>
+      <w:proofErr w:type="spellEnd"/>
+      <w:r>
+        <w:t>: each model's own tokenizer was used with truncation and dynamic padding up to a maximum length of 128 tokens, ensuring uniform tensor shapes for batched GPU training while keeping sequence length short enough (tweets are short by nature) to avoid unnecessary computation.</w:t>
       </w:r>
     </w:p>
     <w:p>
@@ -7612,8 +8223,13 @@
             </w:tcMar>
           </w:tcPr>
           <w:p>
-            <w:r>
-              <w:t>bert-base-uncased</w:t>
+            <w:proofErr w:type="spellStart"/>
+            <w:r>
+              <w:t>bert</w:t>
+            </w:r>
+            <w:proofErr w:type="spellEnd"/>
+            <w:r>
+              <w:t>-base-uncased</w:t>
             </w:r>
           </w:p>
         </w:tc>
@@ -7629,7 +8245,15 @@
           </w:tcPr>
           <w:p>
             <w:r>
-              <w:t>General-domain bidirectional transformer pre-trained on Wikipedia and BookCorpus; serves as a reliable, well-understood benchmark.</w:t>
+              <w:t xml:space="preserve">General-domain bidirectional transformer pre-trained on Wikipedia and </w:t>
+            </w:r>
+            <w:proofErr w:type="spellStart"/>
+            <w:r>
+              <w:t>BookCorpus</w:t>
+            </w:r>
+            <w:proofErr w:type="spellEnd"/>
+            <w:r>
+              <w:t>; serves as a reliable, well-understood benchmark.</w:t>
             </w:r>
           </w:p>
         </w:tc>
@@ -7646,8 +8270,21 @@
             </w:tcMar>
           </w:tcPr>
           <w:p>
-            <w:r>
-              <w:t>vinai/bertweet-base</w:t>
+            <w:proofErr w:type="spellStart"/>
+            <w:r>
+              <w:t>vinai</w:t>
+            </w:r>
+            <w:proofErr w:type="spellEnd"/>
+            <w:r>
+              <w:t>/</w:t>
+            </w:r>
+            <w:proofErr w:type="spellStart"/>
+            <w:r>
+              <w:t>bertweet</w:t>
+            </w:r>
+            <w:proofErr w:type="spellEnd"/>
+            <w:r>
+              <w:t>-base</w:t>
             </w:r>
           </w:p>
         </w:tc>
@@ -7662,8 +8299,21 @@
             </w:tcMar>
           </w:tcPr>
           <w:p>
-            <w:r>
-              <w:t>RoBERTa-based model pre-trained on 850 million English tweets, specifically optimised for Twitter slang, syntax, and informal phrasing — matches the register of the target data.</w:t>
+            <w:proofErr w:type="spellStart"/>
+            <w:r>
+              <w:t>RoBERTa</w:t>
+            </w:r>
+            <w:proofErr w:type="spellEnd"/>
+            <w:r>
+              <w:t xml:space="preserve">-based model pre-trained on 850 million English tweets, specifically </w:t>
+            </w:r>
+            <w:proofErr w:type="spellStart"/>
+            <w:r>
+              <w:t>optimised</w:t>
+            </w:r>
+            <w:proofErr w:type="spellEnd"/>
+            <w:r>
+              <w:t xml:space="preserve"> for Twitter slang, syntax, and informal phrasing — matches the register of the target data.</w:t>
             </w:r>
           </w:p>
         </w:tc>
@@ -7693,7 +8343,15 @@
         <w:spacing w:after="80"/>
       </w:pPr>
       <w:r>
-        <w:t>Split: stratified 70/30 (700 train / 300 test), random_state=42 — stratification preserves the 54.7%/45.3% class balance in both subsets.</w:t>
+        <w:t xml:space="preserve">Split: stratified 70/30 (700 train / 300 test), </w:t>
+      </w:r>
+      <w:proofErr w:type="spellStart"/>
+      <w:r>
+        <w:t>random_state</w:t>
+      </w:r>
+      <w:proofErr w:type="spellEnd"/>
+      <w:r>
+        <w:t>=42 — stratification preserves the 54.7%/45.3% class balance in both subsets.</w:t>
       </w:r>
     </w:p>
     <w:p>
@@ -7706,7 +8364,23 @@
         <w:spacing w:after="80"/>
       </w:pPr>
       <w:r>
-        <w:t>Loss function: standard Cross-Entropy Loss via AutoModelForSequenceClassification. This is the appropriate loss for binary classification because it is derived from negative log-likelihood and heavily penalises confident, incorrect probability predictions, encouraging well-calibrated outputs.</w:t>
+        <w:t xml:space="preserve">Loss function: standard Cross-Entropy Loss via </w:t>
+      </w:r>
+      <w:proofErr w:type="spellStart"/>
+      <w:r>
+        <w:t>AutoModelForSequenceClassification</w:t>
+      </w:r>
+      <w:proofErr w:type="spellEnd"/>
+      <w:r>
+        <w:t xml:space="preserve">. This is the appropriate loss for binary classification because it is derived from negative log-likelihood and heavily </w:t>
+      </w:r>
+      <w:proofErr w:type="spellStart"/>
+      <w:r>
+        <w:t>penalises</w:t>
+      </w:r>
+      <w:proofErr w:type="spellEnd"/>
+      <w:r>
+        <w:t xml:space="preserve"> confident, incorrect probability predictions, encouraging well-calibrated outputs.</w:t>
       </w:r>
     </w:p>
     <w:p>
@@ -7732,7 +8406,31 @@
         <w:spacing w:after="80"/>
       </w:pPr>
       <w:r>
-        <w:t xml:space="preserve">Hyperparameters: 3 epochs, batch size 16 (train) / 32 (eval), learning rate 2e-5 with the AdamW optimiser, weight decay 0.01 for L2 </w:t>
+        <w:t xml:space="preserve">Hyperparameters: 3 epochs, batch size 16 (train) / 32 (eval), learning rate </w:t>
+      </w:r>
+      <w:proofErr w:type="gramStart"/>
+      <w:r>
+        <w:t>2e</w:t>
+      </w:r>
+      <w:proofErr w:type="gramEnd"/>
+      <w:r>
+        <w:t xml:space="preserve">-5 with the </w:t>
+      </w:r>
+      <w:proofErr w:type="spellStart"/>
+      <w:r>
+        <w:t>AdamW</w:t>
+      </w:r>
+      <w:proofErr w:type="spellEnd"/>
+      <w:r>
+        <w:t xml:space="preserve"> </w:t>
+      </w:r>
+      <w:proofErr w:type="spellStart"/>
+      <w:r>
+        <w:t>optimiser</w:t>
+      </w:r>
+      <w:proofErr w:type="spellEnd"/>
+      <w:r>
+        <w:t xml:space="preserve">, weight decay 0.01 for L2 </w:t>
       </w:r>
       <w:r>
         <w:t>regularization</w:t>
@@ -7852,8 +8550,13 @@
             </w:tcMar>
           </w:tcPr>
           <w:p>
-            <w:r>
-              <w:t>bert-base-uncased</w:t>
+            <w:proofErr w:type="spellStart"/>
+            <w:r>
+              <w:t>bert</w:t>
+            </w:r>
+            <w:proofErr w:type="spellEnd"/>
+            <w:r>
+              <w:t>-base-uncased</w:t>
             </w:r>
           </w:p>
         </w:tc>
@@ -7902,8 +8605,21 @@
             </w:tcMar>
           </w:tcPr>
           <w:p>
-            <w:r>
-              <w:t>vinai/bertweet-base</w:t>
+            <w:proofErr w:type="spellStart"/>
+            <w:r>
+              <w:t>vinai</w:t>
+            </w:r>
+            <w:proofErr w:type="spellEnd"/>
+            <w:r>
+              <w:t>/</w:t>
+            </w:r>
+            <w:proofErr w:type="spellStart"/>
+            <w:r>
+              <w:t>bertweet</w:t>
+            </w:r>
+            <w:proofErr w:type="spellEnd"/>
+            <w:r>
+              <w:t>-base</w:t>
             </w:r>
           </w:p>
         </w:tc>
@@ -7951,7 +8667,31 @@
         <w:spacing w:after="150"/>
       </w:pPr>
       <w:r>
-        <w:t xml:space="preserve">Note that bert-base-uncased shows a larger train–test gap (97.14% → 91.67%) than bertweet-base (94.43% → 93.33%), suggesting bertweet-base </w:t>
+        <w:t xml:space="preserve">Note that </w:t>
+      </w:r>
+      <w:proofErr w:type="spellStart"/>
+      <w:r>
+        <w:t>bert</w:t>
+      </w:r>
+      <w:proofErr w:type="spellEnd"/>
+      <w:r>
+        <w:t xml:space="preserve">-base-uncased shows a larger train–test gap (97.14% → 91.67%) than </w:t>
+      </w:r>
+      <w:proofErr w:type="spellStart"/>
+      <w:r>
+        <w:t>bertweet</w:t>
+      </w:r>
+      <w:proofErr w:type="spellEnd"/>
+      <w:r>
+        <w:t xml:space="preserve">-base (94.43% → 93.33%), suggesting </w:t>
+      </w:r>
+      <w:proofErr w:type="spellStart"/>
+      <w:r>
+        <w:t>bertweet</w:t>
+      </w:r>
+      <w:proofErr w:type="spellEnd"/>
+      <w:r>
+        <w:t xml:space="preserve">-base </w:t>
       </w:r>
       <w:r>
         <w:t>generalizes</w:t>
@@ -7974,7 +8714,23 @@
         <w:spacing w:after="150"/>
       </w:pPr>
       <w:r>
-        <w:t>Attention weights were averaged across all layers and heads of the best-performing model (vinai/bertweet-base) for one correctly classified tweet from each class.</w:t>
+        <w:t>Attention weights were averaged across all layers and heads of the best-performing model (</w:t>
+      </w:r>
+      <w:proofErr w:type="spellStart"/>
+      <w:r>
+        <w:t>vinai</w:t>
+      </w:r>
+      <w:proofErr w:type="spellEnd"/>
+      <w:r>
+        <w:t>/</w:t>
+      </w:r>
+      <w:proofErr w:type="spellStart"/>
+      <w:r>
+        <w:t>bertweet</w:t>
+      </w:r>
+      <w:proofErr w:type="spellEnd"/>
+      <w:r>
+        <w:t>-base) for one correctly classified tweet from each class.</w:t>
       </w:r>
     </w:p>
     <w:p>
@@ -8004,7 +8760,7 @@
                     </pic:cNvPicPr>
                   </pic:nvPicPr>
                   <pic:blipFill>
-                    <a:blip r:embed="rId15">
+                    <a:blip r:embed="rId18">
                       <a:extLst>
                         <a:ext uri="{28A0092B-C50C-407E-A947-70E740481C1C}">
                           <a14:useLocalDpi xmlns:a14="http://schemas.microsoft.com/office/drawing/2010/main" val="0"/>
@@ -8072,7 +8828,7 @@
                     </pic:cNvPicPr>
                   </pic:nvPicPr>
                   <pic:blipFill>
-                    <a:blip r:embed="rId16">
+                    <a:blip r:embed="rId19">
                       <a:extLst>
                         <a:ext uri="{28A0092B-C50C-407E-A947-70E740481C1C}">
                           <a14:useLocalDpi xmlns:a14="http://schemas.microsoft.com/office/drawing/2010/main" val="0"/>
@@ -8246,12 +9002,21 @@
             </w:tcMar>
           </w:tcPr>
           <w:p>
+            <w:proofErr w:type="gramStart"/>
             <w:r>
               <w:rPr>
                 <w:b/>
                 <w:bCs/>
               </w:rPr>
-              <w:t>Recall (Relevant)</w:t>
+              <w:t>Recall</w:t>
+            </w:r>
+            <w:proofErr w:type="gramEnd"/>
+            <w:r>
+              <w:rPr>
+                <w:b/>
+                <w:bCs/>
+              </w:rPr>
+              <w:t xml:space="preserve"> (Relevant)</w:t>
             </w:r>
           </w:p>
         </w:tc>
@@ -8408,8 +9173,13 @@
             </w:tcMar>
           </w:tcPr>
           <w:p>
-            <w:r>
-              <w:t>bert-base-uncased</w:t>
+            <w:proofErr w:type="spellStart"/>
+            <w:r>
+              <w:t>bert</w:t>
+            </w:r>
+            <w:proofErr w:type="spellEnd"/>
+            <w:r>
+              <w:t>-base-uncased</w:t>
             </w:r>
           </w:p>
         </w:tc>
@@ -8506,8 +9276,21 @@
             </w:tcMar>
           </w:tcPr>
           <w:p>
-            <w:r>
-              <w:t>vinai/bertweet-base (Best)</w:t>
+            <w:proofErr w:type="spellStart"/>
+            <w:r>
+              <w:t>vinai</w:t>
+            </w:r>
+            <w:proofErr w:type="spellEnd"/>
+            <w:r>
+              <w:t>/</w:t>
+            </w:r>
+            <w:proofErr w:type="spellStart"/>
+            <w:r>
+              <w:t>bertweet</w:t>
+            </w:r>
+            <w:proofErr w:type="spellEnd"/>
+            <w:r>
+              <w:t>-base (Best)</w:t>
             </w:r>
           </w:p>
         </w:tc>
@@ -8625,7 +9408,7 @@
                     </pic:cNvPicPr>
                   </pic:nvPicPr>
                   <pic:blipFill>
-                    <a:blip r:embed="rId17">
+                    <a:blip r:embed="rId20">
                       <a:extLst>
                         <a:ext uri="{28A0092B-C50C-407E-A947-70E740481C1C}">
                           <a14:useLocalDpi xmlns:a14="http://schemas.microsoft.com/office/drawing/2010/main" val="0"/>
@@ -8671,7 +9454,23 @@
         <w:spacing w:after="150"/>
       </w:pPr>
       <w:r>
-        <w:t>BERT outperformed the TF-IDF logistic regression baseline across every metric: test accuracy rose from 89.67% to 93.33%, and ROC-AUC from 0.963 to 0.985. This is expected because every tweet in this dataset contains the keyword "hydrogen" by construction, so the discriminative signal depends entirely on surrounding context (e.g., "green/blue hydrogen" for clean energy vs. "hydrogen responsive template" for web design). The logistic regression model treats text as an unordered bag of TF-IDF weighted words and cannot capture this context-dependent meaning, whereas BERT's self-attention mechanism explicitly models bidirectional dependencies between words. BERTweet's further improvement over bert-base-uncased is attributable to its vocabulary and pretraining being specifically matched to informal, social-media text.</w:t>
+        <w:t xml:space="preserve">BERT outperformed the TF-IDF logistic regression baseline across every metric: test accuracy rose from 89.67% to 93.33%, and ROC-AUC from 0.963 to 0.985. This is expected because every tweet in this dataset contains the keyword "hydrogen" by construction, so the discriminative signal depends entirely on surrounding context (e.g., "green/blue hydrogen" for clean energy vs. "hydrogen responsive template" for web design). The logistic regression model treats text as an unordered bag of TF-IDF weighted words and cannot capture this context-dependent meaning, whereas BERT's self-attention mechanism explicitly models bidirectional dependencies between words. </w:t>
+      </w:r>
+      <w:proofErr w:type="spellStart"/>
+      <w:r>
+        <w:t>BERTweet's</w:t>
+      </w:r>
+      <w:proofErr w:type="spellEnd"/>
+      <w:r>
+        <w:t xml:space="preserve"> further improvement over </w:t>
+      </w:r>
+      <w:proofErr w:type="spellStart"/>
+      <w:r>
+        <w:t>bert</w:t>
+      </w:r>
+      <w:proofErr w:type="spellEnd"/>
+      <w:r>
+        <w:t>-base-uncased is attributable to its vocabulary and pretraining being specifically matched to informal, social-media text.</w:t>
       </w:r>
     </w:p>
     <w:p>
@@ -8694,7 +9493,15 @@
         <w:spacing w:before="300" w:after="150"/>
       </w:pPr>
       <w:r>
-        <w:t>10.1 Preprocessing SQuAD_tiny for T5</w:t>
+        <w:t xml:space="preserve">10.1 Preprocessing </w:t>
+      </w:r>
+      <w:proofErr w:type="spellStart"/>
+      <w:r>
+        <w:t>SQuAD_tiny</w:t>
+      </w:r>
+      <w:proofErr w:type="spellEnd"/>
+      <w:r>
+        <w:t xml:space="preserve"> for T5</w:t>
       </w:r>
     </w:p>
     <w:p>
@@ -8707,7 +9514,15 @@
         <w:spacing w:after="80"/>
       </w:pPr>
       <w:r>
-        <w:t>Input format: each example was encoded as 'question: {question} context: {context}'. T5 is a text-to-text model with no task-specific architecture head, so every task must be expressed as a natural-language instruction — this explicit prefix tells the model it is being asked to perform extractive/generative question answering rather than any other text-to-text task.</w:t>
+        <w:t>Input format: each example was encoded as '</w:t>
+      </w:r>
+      <w:proofErr w:type="gramStart"/>
+      <w:r>
+        <w:t>question: {</w:t>
+      </w:r>
+      <w:proofErr w:type="gramEnd"/>
+      <w:r>
+        <w:t>question} context: {context}'. T5 is a text-to-text model with no task-specific architecture head, so every task must be expressed as a natural-language instruction — this explicit prefix tells the model it is being asked to perform extractive/generative question answering rather than any other text-to-text task.</w:t>
       </w:r>
     </w:p>
     <w:p>
@@ -8720,7 +9535,15 @@
         <w:spacing w:after="80"/>
       </w:pPr>
       <w:r>
-        <w:t>Tokenization: inputs were tokenized to a maximum length of 512 tokens (long enough to hold the SQuAD context passage plus the question) and target answers to a maximum of 128 tokens, both with padding and truncation for uniform batch shapes.</w:t>
+        <w:t xml:space="preserve">Tokenization: inputs were tokenized to a maximum length of 512 tokens (long enough to hold the </w:t>
+      </w:r>
+      <w:proofErr w:type="spellStart"/>
+      <w:r>
+        <w:t>SQuAD</w:t>
+      </w:r>
+      <w:proofErr w:type="spellEnd"/>
+      <w:r>
+        <w:t xml:space="preserve"> context passage plus the question) and target answers to a maximum of 128 tokens, both with padding and truncation for uniform batch shapes.</w:t>
       </w:r>
     </w:p>
     <w:p>
@@ -8733,7 +9556,39 @@
         <w:spacing w:after="80"/>
       </w:pPr>
       <w:r>
-        <w:t>Dataset split: 1,000 training examples (SQuAD train indices 10,000–10,999), 100 validation examples (SQuAD validation indices 3,000–3,099), and 100 test examples (SQuAD validation indices 3,100–3,199), following the SQuAD_tiny construction specified in the assignment.</w:t>
+        <w:t>Dataset split: 1,000 training examples (</w:t>
+      </w:r>
+      <w:proofErr w:type="spellStart"/>
+      <w:r>
+        <w:t>SQuAD</w:t>
+      </w:r>
+      <w:proofErr w:type="spellEnd"/>
+      <w:r>
+        <w:t xml:space="preserve"> train indices 10,000–10,999), 100 validation examples (</w:t>
+      </w:r>
+      <w:proofErr w:type="spellStart"/>
+      <w:r>
+        <w:t>SQuAD</w:t>
+      </w:r>
+      <w:proofErr w:type="spellEnd"/>
+      <w:r>
+        <w:t xml:space="preserve"> validation indices 3,000–3,099), and 100 test examples (</w:t>
+      </w:r>
+      <w:proofErr w:type="spellStart"/>
+      <w:r>
+        <w:t>SQuAD</w:t>
+      </w:r>
+      <w:proofErr w:type="spellEnd"/>
+      <w:r>
+        <w:t xml:space="preserve"> validation indices 3,100–3,199), following the </w:t>
+      </w:r>
+      <w:proofErr w:type="spellStart"/>
+      <w:r>
+        <w:t>SQuAD_tiny</w:t>
+      </w:r>
+      <w:proofErr w:type="spellEnd"/>
+      <w:r>
+        <w:t xml:space="preserve"> construction specified in the assignment.</w:t>
       </w:r>
     </w:p>
     <w:p>
@@ -8758,7 +9613,23 @@
         <w:spacing w:after="150"/>
       </w:pPr>
       <w:r>
-        <w:t>Hyperparameters: 3 epochs, per-device batch size 8 (train and eval), learning rate 3e-4, weight decay 0.01, using Hugging Face's Trainer/TrainingArguments with epoch-level evaluation and checkpointing.</w:t>
+        <w:t xml:space="preserve">Hyperparameters: 3 epochs, per-device batch size 8 (train and eval), learning rate </w:t>
+      </w:r>
+      <w:proofErr w:type="gramStart"/>
+      <w:r>
+        <w:t>3e</w:t>
+      </w:r>
+      <w:proofErr w:type="gramEnd"/>
+      <w:r>
+        <w:t>-4, weight decay 0.01, using Hugging Face's Trainer/</w:t>
+      </w:r>
+      <w:proofErr w:type="spellStart"/>
+      <w:r>
+        <w:t>TrainingArguments</w:t>
+      </w:r>
+      <w:proofErr w:type="spellEnd"/>
+      <w:r>
+        <w:t xml:space="preserve"> with epoch-level evaluation and checkpointing.</w:t>
       </w:r>
     </w:p>
     <w:p>
@@ -9042,7 +9913,15 @@
         <w:t>regularization</w:t>
       </w:r>
       <w:r>
-        <w:t xml:space="preserve"> on model weights; a comparatively short fine-tuning run (3 epochs) was used given the small 1,000-example training set, and was further supported by the observed validation loss uptick at epoch 3 above; and a held-out validation set (100 examples, drawn from a different SQuAD split range to the training set) was evaluated after every epoch so that validation loss could be monitored for divergence from training loss.</w:t>
+        <w:t xml:space="preserve"> on model weights; a comparatively short fine-tuning run (3 epochs) was used given the small 1,000-example training set, and was further supported by the observed validation loss uptick at epoch 3 above; and a held-out validation set (100 examples, drawn from a different </w:t>
+      </w:r>
+      <w:proofErr w:type="spellStart"/>
+      <w:r>
+        <w:t>SQuAD</w:t>
+      </w:r>
+      <w:proofErr w:type="spellEnd"/>
+      <w:r>
+        <w:t xml:space="preserve"> split range to the training set) was evaluated after every epoch so that validation loss could be monitored for divergence from training loss.</w:t>
       </w:r>
     </w:p>
     <w:p>
@@ -9904,7 +10783,15 @@
           </w:tcPr>
           <w:p>
             <w:r>
-              <w:t>What declaration predicated the emigration of Huguenot refugees?</w:t>
+              <w:t xml:space="preserve">What declaration </w:t>
+            </w:r>
+            <w:proofErr w:type="gramStart"/>
+            <w:r>
+              <w:t>predicated</w:t>
+            </w:r>
+            <w:proofErr w:type="gramEnd"/>
+            <w:r>
+              <w:t xml:space="preserve"> the emigration of Huguenot refugees?</w:t>
             </w:r>
           </w:p>
         </w:tc>
@@ -9919,8 +10806,13 @@
             </w:tcMar>
           </w:tcPr>
           <w:p>
-            <w:r>
-              <w:t>the revocation of the Edict of Nantes</w:t>
+            <w:proofErr w:type="gramStart"/>
+            <w:r>
+              <w:t>the revocation</w:t>
+            </w:r>
+            <w:proofErr w:type="gramEnd"/>
+            <w:r>
+              <w:t xml:space="preserve"> of the Edict of Nantes</w:t>
             </w:r>
           </w:p>
         </w:tc>
@@ -9935,8 +10827,13 @@
             </w:tcMar>
           </w:tcPr>
           <w:p>
-            <w:r>
-              <w:t>the Edict of Nantes</w:t>
+            <w:proofErr w:type="gramStart"/>
+            <w:r>
+              <w:t>the</w:t>
+            </w:r>
+            <w:proofErr w:type="gramEnd"/>
+            <w:r>
+              <w:t xml:space="preserve"> Edict of Nantes</w:t>
             </w:r>
           </w:p>
         </w:tc>
@@ -10002,7 +10899,15 @@
         <w:spacing w:after="80"/>
       </w:pPr>
       <w:r>
-        <w:t xml:space="preserve">Errors with context: Sample 2 answers with "2 million" (the population figure from a nearby sentence) instead of the actual refugee count ("75,000 to 100,000 people") — a plausible-sounding but factually wrong span, suggesting the model can confuse similar numeric entities appearing close together in the passage. Sample 4 produces "Cévennes" (a place name from elsewhere in the passage) rather than the correct two areas, indicating a similar entity-confusion failure mode. Sample 5 gives "the Edict of Nantes" instead of "the revocation of the Edict of </w:t>
+        <w:t>Errors with context: Sample 2 answers with "2 million" (the population figure from a nearby sentence) instead of the actual refugee count ("75,000 to 100,000 people</w:t>
+      </w:r>
+      <w:proofErr w:type="gramStart"/>
+      <w:r>
+        <w:t>") —</w:t>
+      </w:r>
+      <w:proofErr w:type="gramEnd"/>
+      <w:r>
+        <w:t xml:space="preserve"> a plausible-sounding but factually wrong span, suggesting the model can confuse similar numeric entities appearing close together in the passage. Sample 4 produces "Cévennes" (a place name from elsewhere in the passage) rather than the correct two areas, indicating a similar entity-confusion failure mode. Sample 5 gives "the Edict of Nantes" instead of "the revocation of the Edict of </w:t>
       </w:r>
       <w:r>
         <w:t>Nantes”</w:t>
@@ -10027,7 +10932,15 @@
         <w:t>memorized</w:t>
       </w:r>
       <w:r>
-        <w:t xml:space="preserve"> SQuAD facts during fine-tuning; it has learned to locate and extract spans from a supplied context, not to answer general-knowledge questions from parametric memory.</w:t>
+        <w:t xml:space="preserve"> </w:t>
+      </w:r>
+      <w:proofErr w:type="spellStart"/>
+      <w:r>
+        <w:t>SQuAD</w:t>
+      </w:r>
+      <w:proofErr w:type="spellEnd"/>
+      <w:r>
+        <w:t xml:space="preserve"> facts during fine-tuning; it has learned to locate and extract spans from a supplied context, not to answer general-knowledge questions from parametric memory.</w:t>
       </w:r>
     </w:p>
     <w:p>
@@ -10041,7 +10954,15 @@
         <w:t>knowledge but</w:t>
       </w:r>
       <w:r>
-        <w:t xml:space="preserve"> is entirely sufficient to teach it the SQuAD task format of locating an answer within a given passage.</w:t>
+        <w:t xml:space="preserve"> is entirely sufficient to teach it the </w:t>
+      </w:r>
+      <w:proofErr w:type="spellStart"/>
+      <w:r>
+        <w:t>SQuAD</w:t>
+      </w:r>
+      <w:proofErr w:type="spellEnd"/>
+      <w:r>
+        <w:t xml:space="preserve"> task format of locating an answer within a given passage.</w:t>
       </w:r>
     </w:p>
     <w:p>
@@ -10823,7 +11744,15 @@
           </w:tcPr>
           <w:p>
             <w:r>
-              <w:t>Fine-tuned t5-small (SQuAD_tiny)</w:t>
+              <w:t>Fine-tuned t5-small (</w:t>
+            </w:r>
+            <w:proofErr w:type="spellStart"/>
+            <w:r>
+              <w:t>SQuAD_tiny</w:t>
+            </w:r>
+            <w:proofErr w:type="spellEnd"/>
+            <w:r>
+              <w:t>)</w:t>
             </w:r>
           </w:p>
         </w:tc>
@@ -10953,7 +11882,23 @@
         <w:spacing w:after="150"/>
       </w:pPr>
       <w:r>
-        <w:t>Counter-intuitively, the pre-trained mrm8488/t5-base-finetuned-squadv2 model scored lower than the team's own fine-tuned t5-small on every ROUGE variant (e.g., ROUGE-1 F: 0.5323 vs. 0.5749), despite being a larger base architecture (t5-base) trained on the full SQuAD dataset (~87,000+ examples) rather than the 1,000-example SQuAD_tiny subset.</w:t>
+        <w:t xml:space="preserve">Counter-intuitively, the pre-trained mrm8488/t5-base-finetuned-squadv2 model scored lower than the team's own fine-tuned t5-small on every ROUGE variant (e.g., ROUGE-1 F: 0.5323 vs. 0.5749), despite being a larger base architecture (t5-base) trained on the full </w:t>
+      </w:r>
+      <w:proofErr w:type="spellStart"/>
+      <w:r>
+        <w:t>SQuAD</w:t>
+      </w:r>
+      <w:proofErr w:type="spellEnd"/>
+      <w:r>
+        <w:t xml:space="preserve"> dataset (~87,000+ examples) rather than the 1,000-example </w:t>
+      </w:r>
+      <w:proofErr w:type="spellStart"/>
+      <w:r>
+        <w:t>SQuAD_tiny</w:t>
+      </w:r>
+      <w:proofErr w:type="spellEnd"/>
+      <w:r>
+        <w:t xml:space="preserve"> subset.</w:t>
       </w:r>
     </w:p>
     <w:p>
@@ -10961,7 +11906,63 @@
         <w:spacing w:after="150"/>
       </w:pPr>
       <w:r>
-        <w:t xml:space="preserve">Two explanations plausibly account for this reversal. First, a domain/format match effect: the team's model was fine-tuned directly on training data drawn from the same SQuAD dataset structure and answer-length conventions as the test set (indices 3,100–3,199 of the SQuAD validation split), so its output style is closely matched to this specific evaluation set, whereas mrm8488 was shaped by the full, more heterogeneous SQuAD v1 training distribution and may produce longer or differently-phrased spans that reduce lexical overlap even when correct. Second, a SQuAD v2 vs. v1 mismatch: mrm8488 was fine-tuned on SQuAD v2, which includes unanswerable questions and trains the model to sometimes hedge or decline to answer; since every question in the SQuAD_tiny test set (drawn from SQuAD v1-style data) does have an answer, a v2-trained model's more conservative answer style may reduce its measured overlap with the always-present reference answers even when its underlying answers are semantically reasonable. This also highlights a genuine limitation of ROUGE as an evaluation metric: it measures lexical overlap only, not factual correctness, so it is possible the pre-trained model's answers remain accurate but are phrased differently enough from the references to be </w:t>
+        <w:t xml:space="preserve">Two explanations plausibly account for this reversal. First, a domain/format match effect: the team's model was fine-tuned directly on training data drawn from the same </w:t>
+      </w:r>
+      <w:proofErr w:type="spellStart"/>
+      <w:r>
+        <w:t>SQuAD</w:t>
+      </w:r>
+      <w:proofErr w:type="spellEnd"/>
+      <w:r>
+        <w:t xml:space="preserve"> dataset structure and answer-length conventions as the test set (indices 3,100–3,199 of the </w:t>
+      </w:r>
+      <w:proofErr w:type="spellStart"/>
+      <w:r>
+        <w:t>SQuAD</w:t>
+      </w:r>
+      <w:proofErr w:type="spellEnd"/>
+      <w:r>
+        <w:t xml:space="preserve"> validation split), so its output style is closely matched to this specific evaluation set, whereas mrm8488 was shaped by the full, more heterogeneous </w:t>
+      </w:r>
+      <w:proofErr w:type="spellStart"/>
+      <w:r>
+        <w:t>SQuAD</w:t>
+      </w:r>
+      <w:proofErr w:type="spellEnd"/>
+      <w:r>
+        <w:t xml:space="preserve"> v1 training distribution and may produce longer or differently-phrased spans that reduce lexical overlap even when correct. Second, a </w:t>
+      </w:r>
+      <w:proofErr w:type="spellStart"/>
+      <w:r>
+        <w:t>SQuAD</w:t>
+      </w:r>
+      <w:proofErr w:type="spellEnd"/>
+      <w:r>
+        <w:t xml:space="preserve"> v2 vs. v1 mismatch: mrm8488 was fine-tuned on </w:t>
+      </w:r>
+      <w:proofErr w:type="spellStart"/>
+      <w:r>
+        <w:t>SQuAD</w:t>
+      </w:r>
+      <w:proofErr w:type="spellEnd"/>
+      <w:r>
+        <w:t xml:space="preserve"> v2, which includes unanswerable questions and trains the model to sometimes hedge or decline to answer; since every question in the </w:t>
+      </w:r>
+      <w:proofErr w:type="spellStart"/>
+      <w:r>
+        <w:t>SQuAD_tiny</w:t>
+      </w:r>
+      <w:proofErr w:type="spellEnd"/>
+      <w:r>
+        <w:t xml:space="preserve"> test set (drawn from </w:t>
+      </w:r>
+      <w:proofErr w:type="spellStart"/>
+      <w:r>
+        <w:t>SQuAD</w:t>
+      </w:r>
+      <w:proofErr w:type="spellEnd"/>
+      <w:r>
+        <w:t xml:space="preserve"> v1-style data) does have an answer, a v2-trained model's more conservative answer style may reduce its measured overlap with the always-present reference answers even when its underlying answers are semantically reasonable. This also highlights a genuine limitation of ROUGE as an evaluation metric: it measures lexical overlap only, not factual correctness, so it is possible the pre-trained model's answers remain accurate but are phrased differently enough from the references to be </w:t>
       </w:r>
       <w:r>
         <w:t>penalized</w:t>
@@ -11520,6 +12521,119 @@
       </w:pPr>
     </w:lvl>
   </w:abstractNum>
+  <w:abstractNum w:abstractNumId="5" w15:restartNumberingAfterBreak="0">
+    <w:nsid w:val="798360E0"/>
+    <w:multiLevelType w:val="multilevel"/>
+    <w:tmpl w:val="62C21972"/>
+    <w:lvl w:ilvl="0">
+      <w:start w:val="1"/>
+      <w:numFmt w:val="decimal"/>
+      <w:lvlText w:val="%1."/>
+      <w:lvlJc w:val="left"/>
+      <w:pPr>
+        <w:tabs>
+          <w:tab w:val="num" w:pos="720"/>
+        </w:tabs>
+        <w:ind w:left="720" w:hanging="360"/>
+      </w:pPr>
+    </w:lvl>
+    <w:lvl w:ilvl="1" w:tentative="1">
+      <w:start w:val="1"/>
+      <w:numFmt w:val="decimal"/>
+      <w:lvlText w:val="%2."/>
+      <w:lvlJc w:val="left"/>
+      <w:pPr>
+        <w:tabs>
+          <w:tab w:val="num" w:pos="1440"/>
+        </w:tabs>
+        <w:ind w:left="1440" w:hanging="360"/>
+      </w:pPr>
+    </w:lvl>
+    <w:lvl w:ilvl="2" w:tentative="1">
+      <w:start w:val="1"/>
+      <w:numFmt w:val="decimal"/>
+      <w:lvlText w:val="%3."/>
+      <w:lvlJc w:val="left"/>
+      <w:pPr>
+        <w:tabs>
+          <w:tab w:val="num" w:pos="2160"/>
+        </w:tabs>
+        <w:ind w:left="2160" w:hanging="360"/>
+      </w:pPr>
+    </w:lvl>
+    <w:lvl w:ilvl="3" w:tentative="1">
+      <w:start w:val="1"/>
+      <w:numFmt w:val="decimal"/>
+      <w:lvlText w:val="%4."/>
+      <w:lvlJc w:val="left"/>
+      <w:pPr>
+        <w:tabs>
+          <w:tab w:val="num" w:pos="2880"/>
+        </w:tabs>
+        <w:ind w:left="2880" w:hanging="360"/>
+      </w:pPr>
+    </w:lvl>
+    <w:lvl w:ilvl="4" w:tentative="1">
+      <w:start w:val="1"/>
+      <w:numFmt w:val="decimal"/>
+      <w:lvlText w:val="%5."/>
+      <w:lvlJc w:val="left"/>
+      <w:pPr>
+        <w:tabs>
+          <w:tab w:val="num" w:pos="3600"/>
+        </w:tabs>
+        <w:ind w:left="3600" w:hanging="360"/>
+      </w:pPr>
+    </w:lvl>
+    <w:lvl w:ilvl="5" w:tentative="1">
+      <w:start w:val="1"/>
+      <w:numFmt w:val="decimal"/>
+      <w:lvlText w:val="%6."/>
+      <w:lvlJc w:val="left"/>
+      <w:pPr>
+        <w:tabs>
+          <w:tab w:val="num" w:pos="4320"/>
+        </w:tabs>
+        <w:ind w:left="4320" w:hanging="360"/>
+      </w:pPr>
+    </w:lvl>
+    <w:lvl w:ilvl="6" w:tentative="1">
+      <w:start w:val="1"/>
+      <w:numFmt w:val="decimal"/>
+      <w:lvlText w:val="%7."/>
+      <w:lvlJc w:val="left"/>
+      <w:pPr>
+        <w:tabs>
+          <w:tab w:val="num" w:pos="5040"/>
+        </w:tabs>
+        <w:ind w:left="5040" w:hanging="360"/>
+      </w:pPr>
+    </w:lvl>
+    <w:lvl w:ilvl="7" w:tentative="1">
+      <w:start w:val="1"/>
+      <w:numFmt w:val="decimal"/>
+      <w:lvlText w:val="%8."/>
+      <w:lvlJc w:val="left"/>
+      <w:pPr>
+        <w:tabs>
+          <w:tab w:val="num" w:pos="5760"/>
+        </w:tabs>
+        <w:ind w:left="5760" w:hanging="360"/>
+      </w:pPr>
+    </w:lvl>
+    <w:lvl w:ilvl="8" w:tentative="1">
+      <w:start w:val="1"/>
+      <w:numFmt w:val="decimal"/>
+      <w:lvlText w:val="%9."/>
+      <w:lvlJc w:val="left"/>
+      <w:pPr>
+        <w:tabs>
+          <w:tab w:val="num" w:pos="6480"/>
+        </w:tabs>
+        <w:ind w:left="6480" w:hanging="360"/>
+      </w:pPr>
+    </w:lvl>
+  </w:abstractNum>
   <w:num w:numId="1" w16cid:durableId="1710758973">
     <w:abstractNumId w:val="4"/>
     <w:lvlOverride w:ilvl="0">
@@ -11537,6 +12651,9 @@
   </w:num>
   <w:num w:numId="5" w16cid:durableId="369458761">
     <w:abstractNumId w:val="0"/>
+  </w:num>
+  <w:num w:numId="6" w16cid:durableId="1107502548">
+    <w:abstractNumId w:val="5"/>
   </w:num>
 </w:numbering>
 </file>
@@ -11965,6 +13082,7 @@
   </w:style>
   <w:style w:type="paragraph" w:styleId="Heading3">
     <w:name w:val="heading 3"/>
+    <w:link w:val="Heading3Char"/>
     <w:uiPriority w:val="9"/>
     <w:unhideWhenUsed/>
     <w:qFormat/>
@@ -12158,6 +13276,18 @@
         <w:insideV w:val="single" w:sz="4" w:space="0" w:color="auto"/>
       </w:tblBorders>
     </w:tblPr>
+  </w:style>
+  <w:style w:type="character" w:customStyle="1" w:styleId="Heading3Char">
+    <w:name w:val="Heading 3 Char"/>
+    <w:basedOn w:val="DefaultParagraphFont"/>
+    <w:link w:val="Heading3"/>
+    <w:uiPriority w:val="9"/>
+    <w:rsid w:val="00966235"/>
+    <w:rPr>
+      <w:color w:val="1F4D78"/>
+      <w:sz w:val="24"/>
+      <w:szCs w:val="24"/>
+    </w:rPr>
   </w:style>
 </w:styles>
 </file>

</xml_diff>

<commit_message>
doc: using italics for every parameter with "_"
</commit_message>
<xml_diff>
--- a/Assessment2-Report.docx
+++ b/Assessment2-Report.docx
@@ -230,7 +230,7 @@
               <w:rPr>
                 <w:rFonts w:eastAsia="SimSun" w:cs="Mangal"/>
               </w:rPr>
-              <w:t xml:space="preserve">Minchul Kim</w:t>
+              <w:t>Minchul Kim</w:t>
             </w:r>
           </w:p>
         </w:tc>
@@ -384,7 +384,7 @@
                 <w:rFonts w:eastAsia="SimSun" w:cs="Mangal"/>
                 <w:lang w:val="en-GB" w:eastAsia="en-IN" w:bidi="mr-IN"/>
               </w:rPr>
-              <w:t xml:space="preserve">Minchul Kim</w:t>
+              <w:t>Minchul Kim</w:t>
             </w:r>
           </w:p>
         </w:tc>
@@ -645,7 +645,7 @@
         <w:rPr>
           <w:lang w:val="en-GB"/>
         </w:rPr>
-        <w:t xml:space="preserve">URLs, mentions, and hashtags were stripped from the raw tweets during preprocessing (verified: 0 of the 2,500 tweets in the dataset contain a URL, @mention, or hashtag). Emojis and other symbols were not explicitly removed but are effectively excluded from the TF-IDF feature space since the default tokenizer only extracts alphanumeric word tokens. Slang terms (e.g. "lol", "omg", "idk") were left unmodified and are treated as ordinary vocabulary.</w:t>
+        <w:t>URLs, mentions, and hashtags were stripped from the raw tweets during preprocessing (verified: 0 of the 2,500 tweets in the dataset contain a URL, @mention, or hashtag). Emojis and other symbols were not explicitly removed but are effectively excluded from the TF-IDF feature space since the default tokenizer only extracts alphanumeric word tokens. Slang terms (e.g. "lol", "omg", "idk") were left unmodified and are treated as ordinary vocabulary.</w:t>
       </w:r>
     </w:p>
     <w:p>
@@ -741,7 +741,7 @@
         <w:spacing w:after="150"/>
       </w:pPr>
       <w:r>
-        <w:t xml:space="preserve">During our evaluation, we discussed the trade-off between standardization and maintaining data sparsity. While standardizing the TF-IDF matrix to zero mean and unit variance breaks its original sparse structure—increasing memory overhead—we think it is essential because PCA is scale-sensitive; without it, terms with inherently higher frequencies would disproportionately skew the principal components.</w:t>
+        <w:t>During our evaluation, we discussed the trade-off between standardization and maintaining data sparsity. While standardizing the TF-IDF matrix to zero mean and unit variance breaks its original sparse structure—increasing memory overhead—we think it is essential because PCA is scale-sensitive; without it, terms with inherently higher frequencies would disproportionately skew the principal components.</w:t>
       </w:r>
     </w:p>
     <w:p>
@@ -791,7 +791,7 @@
         <w:spacing w:after="150"/>
       </w:pPr>
       <w:r>
-        <w:t xml:space="preserve">Dimensions tested: 2, 10, 50, 100, 250, 500, 750, 1000 (using a 500-tweet subsample of the standardized TF-IDF matrix for computational efficiency). For each dimensionality, pairwise Euclidean distances between all sample pairs were computed and averaged.</w:t>
+        <w:t>Dimensions tested: 2, 10, 50, 100, 250, 500, 750, 1000 (using a 500-tweet subsample of the standardized TF-IDF matrix for computational efficiency). For each dimensionality, pairwise Euclidean distances between all sample pairs were computed and averaged.</w:t>
       </w:r>
     </w:p>
     <w:p>
@@ -809,7 +809,7 @@
         <w:spacing w:before="200" w:after="100"/>
       </w:pPr>
       <w:r>
-        <w:t xml:space="preserve">6.2.2 Visualization</w:t>
+        <w:t>6.2.2 Visualization</w:t>
       </w:r>
     </w:p>
     <w:p>
@@ -1011,7 +1011,7 @@
         <w:t>Method</w:t>
       </w:r>
       <w:r>
-        <w:t xml:space="preserve">: PCA was fit on the full standardized TF-IDF matrix (up to 1,000 components), and the cumulative explained variance curve was inspected against an 80% variance threshold — a common heuristic for retaining "most" of the information while discarding noise.</w:t>
+        <w:t>: PCA was fit on the full standardized TF-IDF matrix (up to 1,000 components), and the cumulative explained variance curve was inspected against an 80% variance threshold — a common heuristic for retaining "most" of the information while discarding noise.</w:t>
       </w:r>
     </w:p>
     <w:p>
@@ -1531,7 +1531,7 @@
         <w:spacing w:after="150"/>
       </w:pPr>
       <w:r>
-        <w:t xml:space="preserve">Before running t-SNE, the standardized TF-IDF matrix was first reduced to 50 dimensions using PCA, to suppress noise and reduce the computational cost of t-SNE (which scales poorly with the number of input features).</w:t>
+        <w:t>Before running t-SNE, the standardized TF-IDF matrix was first reduced to 50 dimensions using PCA, to suppress noise and reduce the computational cost of t-SNE (which scales poorly with the number of input features).</w:t>
       </w:r>
     </w:p>
     <w:tbl>
@@ -1751,7 +1751,7 @@
         <w:spacing w:after="150"/>
       </w:pPr>
       <w:r>
-        <w:t xml:space="preserve">KL divergence decreases consistently as the number of t-SNE output dimensions increases from 1 to 3 (3.01 → 1.93 → 1.77), indicating that 3 components preserve the original high-dimensional neighborhood structure more faithfully than 1 or 2 components.</w:t>
+        <w:t>KL divergence decreases consistently as the number of t-SNE output dimensions increases from 1 to 3 (3.01 → 1.93 → 1.77), indicating that 3 components preserve the original high-dimensional neighborhood structure more faithfully than 1 or 2 components.</w:t>
       </w:r>
     </w:p>
     <w:p>
@@ -1823,7 +1823,7 @@
         <w:spacing w:before="300" w:after="150"/>
       </w:pPr>
       <w:r>
-        <w:t xml:space="preserve">6.5 Comparative Visualization: PCA vs. t-SNE</w:t>
+        <w:t>6.5 Comparative Visualization: PCA vs. t-SNE</w:t>
       </w:r>
     </w:p>
     <w:p>
@@ -1844,7 +1844,7 @@
           <w:sz w:val="18"/>
           <w:szCs w:val="18"/>
         </w:rPr>
-        <w:t xml:space="preserve">Figure 6.4: PCA (left) vs. t-SNE (right): top 3 components, colored by relevance label (0 = Irrelevant, 1 = Relevant).</w:t>
+        <w:t>Figure 6.4: PCA (left) vs. t-SNE (right): top 3 components, colored by relevance label (0 = Irrelevant, 1 = Relevant).</w:t>
       </w:r>
     </w:p>
     <w:p>
@@ -1899,7 +1899,7 @@
         <w:spacing w:before="200" w:after="100"/>
       </w:pPr>
       <w:r>
-        <w:t xml:space="preserve">Comparison of Plots</w:t>
+        <w:t>Comparison of Plots</w:t>
       </w:r>
     </w:p>
     <w:p>
@@ -1928,7 +1928,7 @@
         <w:rPr>
           <w:lang w:val="en-GB"/>
         </w:rPr>
-        <w:t xml:space="preserve">The 3D plot shows one big, crowded cloud centered in the middle. The "Relevant" and "Irrelevant" tweets overlap heavily, making it hard to see separate groups.</w:t>
+        <w:t>The 3D plot shows one big, crowded cloud centered in the middle. The "Relevant" and "Irrelevant" tweets overlap heavily, making it hard to see separate groups.</w:t>
       </w:r>
     </w:p>
     <w:p>
@@ -2454,7 +2454,7 @@
         <w:spacing w:after="150"/>
       </w:pPr>
       <w:r>
-        <w:t xml:space="preserve">K = 3 was selected: the rate of inertia decrease slows noticeably beyond k = 3 (diminishing returns from further splitting), while the silhouette score remains reasonable at this value, giving a good balance between cluster compactness/separation and model simplicity.</w:t>
+        <w:t>K = 3 was selected: the rate of inertia decrease slows noticeably beyond k = 3 (diminishing returns from further splitting), while the silhouette score remains reasonable at this value, giving a good balance between cluster compactness/separation and model simplicity.</w:t>
       </w:r>
     </w:p>
     <w:p>
@@ -2651,7 +2651,7 @@
           </w:tcPr>
           <w:p>
             <w:r>
-              <w:t xml:space="preserve">80 941</w:t>
+              <w:t>80 941</w:t>
             </w:r>
           </w:p>
         </w:tc>
@@ -2983,7 +2983,7 @@
         <w:spacing w:before="200" w:after="100"/>
       </w:pPr>
       <w:r>
-        <w:t xml:space="preserve">7.2.4 Normalization/Standardization Discussion</w:t>
+        <w:t>7.2.4 Normalization/Standardization Discussion</w:t>
       </w:r>
     </w:p>
     <w:p>
@@ -3032,7 +3032,7 @@
         <w:spacing w:before="300" w:after="150"/>
       </w:pPr>
       <w:r>
-        <w:t xml:space="preserve">7.3.1 Visualizing and Labelling Clusters</w:t>
+        <w:t>7.3.1 Visualizing and Labelling Clusters</w:t>
       </w:r>
     </w:p>
     <w:p>
@@ -3053,7 +3053,7 @@
           <w:sz w:val="18"/>
           <w:szCs w:val="18"/>
         </w:rPr>
-        <w:t xml:space="preserve">Figure 7.2: Pairplot of VehOdo, AuctionAvgPrice, WarrantyCost by cluster (2,000-row sample).</w:t>
+        <w:t>Figure 7.2: Pairplot of VehOdo, AuctionAvgPrice, WarrantyCost by cluster (2,000-row sample).</w:t>
       </w:r>
     </w:p>
     <w:p>
@@ -3062,6 +3062,9 @@
         <w:jc w:val="center"/>
       </w:pPr>
       <w:r>
+        <w:rPr>
+          <w:noProof/>
+        </w:rPr>
         <w:drawing>
           <wp:inline distT="0" distB="0" distL="0" distR="0" wp14:anchorId="6F4984B4" wp14:editId="7274F096">
             <wp:extent cx="8077200" cy="7334250"/>
@@ -3105,6 +3108,9 @@
         <w:jc w:val="center"/>
       </w:pPr>
       <w:r>
+        <w:rPr>
+          <w:noProof/>
+        </w:rPr>
         <w:drawing>
           <wp:inline distT="0" distB="0" distL="0" distR="0" wp14:anchorId="564426C9" wp14:editId="0F90C0F1">
             <wp:extent cx="14192250" cy="3714750"/>
@@ -3168,6 +3174,9 @@
               <w:pStyle w:val="Heading3"/>
             </w:pPr>
             <w:r>
+              <w:rPr>
+                <w:noProof/>
+              </w:rPr>
               <w:drawing>
                 <wp:inline distT="0" distB="0" distL="0" distR="0" wp14:anchorId="0F1D3A5A" wp14:editId="6F543FC5">
                   <wp:extent cx="4591050" cy="3733800"/>
@@ -3215,6 +3224,9 @@
               <w:pStyle w:val="Heading3"/>
             </w:pPr>
             <w:r>
+              <w:rPr>
+                <w:noProof/>
+              </w:rPr>
               <w:drawing>
                 <wp:inline distT="0" distB="0" distL="0" distR="0" wp14:anchorId="6C840781" wp14:editId="2020CF5C">
                   <wp:extent cx="4419600" cy="3733800"/>
@@ -3265,7 +3277,7 @@
         <w:pStyle w:val="Heading3"/>
       </w:pPr>
       <w:r>
-        <w:t xml:space="preserve">7.3.2 Descriptive Cluster Labels</w:t>
+        <w:t>7.3.2 Descriptive Cluster Labels</w:t>
       </w:r>
     </w:p>
     <w:p>
@@ -4041,7 +4053,7 @@
         <w:spacing w:before="400" w:after="200"/>
       </w:pPr>
       <w:r>
-        <w:t xml:space="preserve">Task 8: Time Series Forecasting with LSTM on the AgriWebb Dataset</w:t>
+        <w:t>Task 8: Time Series Forecasting with LSTM on the AgriWebb Dataset</w:t>
       </w:r>
     </w:p>
     <w:p>
@@ -4097,7 +4109,7 @@
         <w:spacing w:after="80"/>
       </w:pPr>
       <w:r>
-        <w:t xml:space="preserve">Per-paddock StandardScaler: a separate scaler was fit on each paddock's own training portion (mean/std computed independently per paddock) rather than one global scaler. This matters because paddocks differ substantially in baseline TSDM levels and variability (per-paddock training means range from 961 to 1,697, and training standard deviations range from 280 to 969) — a single global scaler would let high-magnitude paddocks dominate the loss function, whereas per-paddock scaling lets the LSTM learn from the shape of each paddock's growth trajectory on a comparable scale.</w:t>
+        <w:t>Per-paddock StandardScaler: a separate scaler was fit on each paddock's own training portion (mean/std computed independently per paddock) rather than one global scaler. This matters because paddocks differ substantially in baseline TSDM levels and variability (per-paddock training means range from 961 to 1,697, and training standard deviations range from 280 to 969) — a single global scaler would let high-magnitude paddocks dominate the loss function, whereas per-paddock scaling lets the LSTM learn from the shape of each paddock's growth trajectory on a comparable scale.</w:t>
       </w:r>
     </w:p>
     <w:p>
@@ -4114,7 +4126,59 @@
         <w:spacing w:after="150"/>
       </w:pPr>
       <w:r>
-        <w:t xml:space="preserve">Architecture: SequenceLSTM with num_features = 1 (TSDM only), hidden_size = 32, num_layers = 2, output_size = 5 (forecast_horizon), dropout = 0.2 (PyTorch default in the model class, applied between LSTM layers and before the final linear layer).</w:t>
+        <w:t xml:space="preserve">Architecture: SequenceLSTM with </w:t>
+      </w:r>
+      <w:r>
+        <w:rPr>
+          <w:i/>
+        </w:rPr>
+        <w:t xml:space="preserve">num_features </w:t>
+      </w:r>
+      <w:r>
+        <w:t xml:space="preserve">= 1 (TSDM only), </w:t>
+      </w:r>
+      <w:r>
+        <w:rPr>
+          <w:i/>
+        </w:rPr>
+        <w:t xml:space="preserve">hidden_size </w:t>
+      </w:r>
+      <w:r>
+        <w:t xml:space="preserve">= 32, </w:t>
+      </w:r>
+      <w:r>
+        <w:rPr>
+          <w:i/>
+        </w:rPr>
+        <w:t xml:space="preserve">num_layers </w:t>
+      </w:r>
+      <w:r>
+        <w:t xml:space="preserve">= 2, </w:t>
+      </w:r>
+      <w:r>
+        <w:rPr>
+          <w:i/>
+        </w:rPr>
+        <w:t xml:space="preserve">output_size </w:t>
+      </w:r>
+      <w:r>
+        <w:t xml:space="preserve">= 5 </w:t>
+      </w:r>
+      <w:r>
+        <w:rPr>
+          <w:i/>
+        </w:rPr>
+        <w:t xml:space="preserve">(forecast_horizon), </w:t>
+      </w:r>
+      <w:r>
+        <w:rPr>
+          <w:i/>
+          <w:iCs/>
+        </w:rPr>
+        <w:t>dropout = 0.2</w:t>
+      </w:r>
+      <w:r>
+        <w:t xml:space="preserve"> (PyTorch default in the model class, applied between LSTM layers and before the final linear layer).</w:t>
       </w:r>
     </w:p>
     <w:p>
@@ -4122,7 +4186,7 @@
         <w:spacing w:after="150"/>
       </w:pPr>
       <w:r>
-        <w:t xml:space="preserve">Training: Adam optimizer, learning rate = 0.001, 250 epochs, batch size 32, MSE loss, with an 80/20 internal train/validation split used to select the best-performing model checkpoint (lowest validation loss) across training.</w:t>
+        <w:t>Training: Adam optimizer, learning rate = 0.001, 250 epochs, batch size 32, MSE loss, with an 80/20 internal train/validation split used to select the best-performing model checkpoint (lowest validation loss) across training.</w:t>
       </w:r>
     </w:p>
     <w:p>
@@ -4130,7 +4194,61 @@
         <w:spacing w:after="150"/>
       </w:pPr>
       <w:r>
-        <w:t xml:space="preserve">Hyperparameter selection: hidden_size, num_layers, and learning rate were tuned via a grid search over hidden_size in {8, 16, 32}, num_layers in {1, 2}, and learning rate in {0.001, 0.0005} — 12 candidates in total. Each candidate was trained for a short budget of 60 epochs on the same 80/20 train/validation split, and validation MSE was recorded for every combination (hidden_size, num_layers, lr → val_loss): 32, 2, 0.0010 → 0.5437; 16, 2, 0.0010 → 0.5478; 32, 1, 0.0010 → 0.5517; 32, 2, 0.0005 → 0.5547; 16, 2, 0.0005 → 0.5582; 16, 1, 0.0010 → 0.5629; 32, 1, 0.0005 → 0.5631; 8, 2, 0.0010 → 0.5664; 16, 1, 0.0005 → 0.5694; 8, 2, 0.0005 → 0.5731; 8, 1, 0.0010 → 0.5735; 8, 1, 0.0005 → 0.5831. The lowest-validation-loss configuration — hidden_size=32, num_layers=2, lr=0.001 — was selected and used for the full 250-epoch training run reported below; learning rate and epoch count otherwise follow common defaults for Adam-optimised LSTMs.</w:t>
+        <w:t xml:space="preserve">Hyperparameter selection: </w:t>
+      </w:r>
+      <w:r>
+        <w:rPr>
+          <w:i/>
+        </w:rPr>
+        <w:t xml:space="preserve">hidden_size, num_layers, </w:t>
+      </w:r>
+      <w:r>
+        <w:t xml:space="preserve">and learning rate were tuned via a grid search over </w:t>
+      </w:r>
+      <w:r>
+        <w:rPr>
+          <w:i/>
+        </w:rPr>
+        <w:t xml:space="preserve">hidden_size </w:t>
+      </w:r>
+      <w:r>
+        <w:t xml:space="preserve">in {8, 16, 32}, </w:t>
+      </w:r>
+      <w:r>
+        <w:rPr>
+          <w:i/>
+        </w:rPr>
+        <w:t xml:space="preserve">num_layers </w:t>
+      </w:r>
+      <w:r>
+        <w:t xml:space="preserve">in {1, 2}, and learning rate in {0.001, 0.0005} — 12 candidates in total. Each candidate was trained for a short budget of 60 epochs on the same 80/20 train/validation split, and validation MSE was recorded for every combination </w:t>
+      </w:r>
+      <w:r>
+        <w:rPr>
+          <w:i/>
+        </w:rPr>
+        <w:t xml:space="preserve">(hidden_size, num_layers, </w:t>
+      </w:r>
+      <w:r>
+        <w:t xml:space="preserve">lr → </w:t>
+      </w:r>
+      <w:r>
+        <w:rPr>
+          <w:i/>
+        </w:rPr>
+        <w:t xml:space="preserve">val_loss): </w:t>
+      </w:r>
+      <w:r>
+        <w:t xml:space="preserve">32, 2, 0.0010 → 0.5437; 16, 2, 0.0010 → 0.5478; 32, 1, 0.0010 → 0.5517; 32, 2, 0.0005 → 0.5547; 16, 2, 0.0005 → 0.5582; 16, 1, 0.0010 → 0.5629; 32, 1, 0.0005 → 0.5631; 8, 2, 0.0010 → 0.5664; 16, 1, 0.0005 → 0.5694; 8, 2, 0.0005 → 0.5731; 8, 1, 0.0010 → 0.5735; 8, 1, 0.0005 → 0.5831. The lowest-validation-loss configuration — </w:t>
+      </w:r>
+      <w:r>
+        <w:rPr>
+          <w:i/>
+        </w:rPr>
+        <w:t xml:space="preserve">hidden_size=32, num_layers=2, </w:t>
+      </w:r>
+      <w:r>
+        <w:t>lr=0.001 — was selected and used for the full 250-epoch training run reported below; learning rate and epoch count otherwise follow common defaults for Adam-optimised LSTMs.</w:t>
       </w:r>
     </w:p>
     <w:tbl>
@@ -4756,7 +4874,16 @@
         <w:spacing w:after="150"/>
       </w:pPr>
       <w:r>
-        <w:t xml:space="preserve">The training loss decreases fairly steadily throughout training (0.75 → 0.45), while the validation loss drops to its lowest point by epoch 50 (0.531) and then edges slightly upward through epoch 200 (0.533 → 0.535) — a mild overfitting signal within this internal validation split. Because train_lstm_model keeps the checkpoint with the lowest validation loss rather than the final-epoch weights, the model evaluated in Section 8.5 is effectively the epoch-50 snapshot. On the genuinely held-out test window this tuned Model 1 achieves Test R² = 0.30 and Test RMSE = 350.45, a result close to, but slightly behind, Model 2 (Section 8.5.1).</w:t>
+        <w:t xml:space="preserve">The training loss decreases fairly steadily throughout training (0.75 → 0.45), while the validation loss drops to its lowest point by epoch 50 (0.531) and then edges slightly upward through epoch 200 (0.533 → 0.535) — a mild overfitting signal within this internal validation split. Because </w:t>
+      </w:r>
+      <w:r>
+        <w:rPr>
+          <w:i/>
+        </w:rPr>
+        <w:t xml:space="preserve">train_lstm_model </w:t>
+      </w:r>
+      <w:r>
+        <w:t>keeps the checkpoint with the lowest validation loss rather than the final-epoch weights, the model evaluated in Section 8.5 is effectively the epoch-50 snapshot. On the genuinely held-out test window this tuned Model 1 achieves Test R² = 0.30 and Test RMSE = 350.45, a result close to, but slightly behind, Model 2 (Section 8.5.1).</w:t>
       </w:r>
     </w:p>
     <w:p>
@@ -4773,7 +4900,34 @@
         <w:spacing w:after="150"/>
       </w:pPr>
       <w:r>
-        <w:t xml:space="preserve">Architecture change: doubling the lookback from 5 to 10 timesteps doubles the amount of information the encoder must compress into its final hidden state, so hidden_size is increased to 24 to give the LSTM enough representational capacity for the longer input. num_layers=2 and the rest of the training setup (batch size, optimizer, dropout) are kept identical to Model 1 so that lookback length — not some other architectural change — is the variable being compared between the two univariate models. No other architectural change is required; pack_padded_sequence already handles the longer padded window the same way it handled the shorter one.</w:t>
+        <w:t xml:space="preserve">Architecture change: doubling the lookback from 5 to 10 timesteps doubles the amount of information the encoder must compress into its final hidden state, so </w:t>
+      </w:r>
+      <w:r>
+        <w:rPr>
+          <w:i/>
+        </w:rPr>
+        <w:t xml:space="preserve">hidden_size </w:t>
+      </w:r>
+      <w:r>
+        <w:t xml:space="preserve">is increased to 24 to give the LSTM enough representational capacity for the longer input. </w:t>
+      </w:r>
+      <w:r>
+        <w:rPr>
+          <w:i/>
+        </w:rPr>
+        <w:t xml:space="preserve">num_layers=2 </w:t>
+      </w:r>
+      <w:r>
+        <w:t xml:space="preserve">and the rest of the training setup (batch size, optimizer, dropout) are kept identical to Model 1 so that lookback length — not some other architectural change — is the variable being compared between the two univariate models. No other architectural change is required; </w:t>
+      </w:r>
+      <w:r>
+        <w:rPr>
+          <w:i/>
+        </w:rPr>
+        <w:t xml:space="preserve">pack_padded_sequence </w:t>
+      </w:r>
+      <w:r>
+        <w:t>already handles the longer padded window the same way it handled the shorter one.</w:t>
       </w:r>
     </w:p>
     <w:tbl>
@@ -5399,7 +5553,7 @@
         <w:spacing w:after="150"/>
       </w:pPr>
       <w:r>
-        <w:t xml:space="preserve">Both loss curves continue decreasing steadily through all 200 logged epochs (train: 0.80 → 0.30; val: 0.76 → 0.44) without fully plateauing, unlike Model 1. Both Train R² (0.72 vs. 0.61) and, notably, Test R² (0.33 vs. 0.30) improve over Model 1, and Test RMSE also falls slightly (342.35 vs. 350.45) — here, the longer lookback genuinely helps the model forecast the reserved test window, not just fit the training data more closely. This is unlike the pattern seen for Model 3 (Section 8.5.1), where added complexity helps training fit without helping genuine forecasting performance.</w:t>
+        <w:t>Both loss curves continue decreasing steadily through all 200 logged epochs (train: 0.80 → 0.30; val: 0.76 → 0.44) without fully plateauing, unlike Model 1. Both Train R² (0.72 vs. 0.61) and, notably, Test R² (0.33 vs. 0.30) improve over Model 1, and Test RMSE also falls slightly (342.35 vs. 350.45) — here, the longer lookback genuinely helps the model forecast the reserved test window, not just fit the training data more closely. This is unlike the pattern seen for Model 3 (Section 8.5.1), where added complexity helps training fit without helping genuine forecasting performance.</w:t>
       </w:r>
     </w:p>
     <w:p>
@@ -5416,7 +5570,61 @@
         <w:spacing w:after="150"/>
       </w:pPr>
       <w:r>
-        <w:t xml:space="preserve">Architecture modifications: num_features is increased from 1 to the number of available climate columns (TSDM plus 15-day-average rainfall, max/min temperature, relative humidity at max/min temperature, evaporation, and radiation — 8 features in total), requiring the LSTM's input_size to scale accordingly; hidden_size is further increased to 32 to give the model enough capacity to combine information across all input channels. Unlike Models 1 and 2, no fixed lookback window is used at all: at every timestep t the input is the entire history available for that paddock up to t (a growing window), padded only up to the longest training series observed across paddocks (190 timesteps) purely so PyTorch can batch samples of different real lengths — pack_padded_sequence restricts the LSTM's computation to each sample's true, un-padded length. This required a new data-preparation routine (create_sequences_flexible / prepare_tsdm_data_flexible); no change to the SequenceLSTM architecture itself was needed, since it was already length-agnostic.</w:t>
+        <w:t xml:space="preserve">Architecture modifications: </w:t>
+      </w:r>
+      <w:r>
+        <w:rPr>
+          <w:i/>
+        </w:rPr>
+        <w:t xml:space="preserve">num_features </w:t>
+      </w:r>
+      <w:r>
+        <w:t xml:space="preserve">is increased from 1 to the number of available climate columns (TSDM plus 15-day-average rainfall, max/min temperature, relative humidity at max/min temperature, evaporation, and radiation — 8 features in total), requiring the LSTM's </w:t>
+      </w:r>
+      <w:r>
+        <w:rPr>
+          <w:i/>
+        </w:rPr>
+        <w:t xml:space="preserve">input_size </w:t>
+      </w:r>
+      <w:r>
+        <w:t xml:space="preserve">to scale accordingly; </w:t>
+      </w:r>
+      <w:r>
+        <w:rPr>
+          <w:i/>
+        </w:rPr>
+        <w:t xml:space="preserve">hidden_size </w:t>
+      </w:r>
+      <w:r>
+        <w:t xml:space="preserve">is further increased to 32 to give the model enough capacity to combine information across all input channels. Unlike Models 1 and 2, no fixed lookback window is used at all: at every timestep t the input is the entire history available for that paddock up to t (a growing window), padded only up to the longest training series observed across paddocks (190 timesteps) purely so PyTorch can batch samples of different real lengths — </w:t>
+      </w:r>
+      <w:r>
+        <w:rPr>
+          <w:i/>
+        </w:rPr>
+        <w:t xml:space="preserve">pack_padded_sequence </w:t>
+      </w:r>
+      <w:r>
+        <w:t xml:space="preserve">restricts the LSTM's computation to each sample's true, un-padded length. This required a new data-preparation routine </w:t>
+      </w:r>
+      <w:r>
+        <w:rPr>
+          <w:i/>
+        </w:rPr>
+        <w:t xml:space="preserve">(create_sequences_flexible </w:t>
+      </w:r>
+      <w:r>
+        <w:t xml:space="preserve">/ </w:t>
+      </w:r>
+      <w:r>
+        <w:rPr>
+          <w:i/>
+        </w:rPr>
+        <w:t xml:space="preserve">prepare_tsdm_data_flexible); </w:t>
+      </w:r>
+      <w:r>
+        <w:t>no change to the SequenceLSTM architecture itself was needed, since it was already length-agnostic.</w:t>
       </w:r>
     </w:p>
     <w:tbl>
@@ -6445,7 +6653,7 @@
         <w:spacing w:after="150"/>
       </w:pPr>
       <w:r>
-        <w:t xml:space="preserve">Note: Train RMSE and Test RMSE are both computed on the original (inverse-transformed) TSDM scale — training predictions are inverse-transformed using each row's own paddock scaler, and test predictions using each paddock's scaler applied to its reserved test window — so all four columns (RMSE and R² for both Train and Test) are directly comparable, both within and across models.</w:t>
+        <w:t>Note: Train RMSE and Test RMSE are both computed on the original (inverse-transformed) TSDM scale — training predictions are inverse-transformed using each row's own paddock scaler, and test predictions using each paddock's scaler applied to its reserved test window — so all four columns (RMSE and R² for both Train and Test) are directly comparable, both within and across models.</w:t>
       </w:r>
     </w:p>
     <w:p>
@@ -6470,7 +6678,7 @@
         <w:spacing w:after="150"/>
       </w:pPr>
       <w:r>
-        <w:t xml:space="preserve">This matters because it means the strong internal-validation performance of Model 3 — the lowest absolute loss and highest Train R² of the three — does not, by itself, indicate the best forecasting model. That 80/20 validation split is drawn from the same time period and distribution as the training data, so it primarily measures how well the model interpolates within familiar territory, not how well it forecasts genuinely future, unseen pasture growth. The true forecasting test (the reserved last-5-timestep window per paddock) instead favours Model 2, and is the metric that actually matters for AgriWebb's stated goal of predicting future pasture availability.</w:t>
+        <w:t>This matters because it means the strong internal-validation performance of Model 3 — the lowest absolute loss and highest Train R² of the three — does not, by itself, indicate the best forecasting model. That 80/20 validation split is drawn from the same time period and distribution as the training data, so it primarily measures how well the model interpolates within familiar territory, not how well it forecasts genuinely future, unseen pasture growth. The true forecasting test (the reserved last-5-timestep window per paddock) instead favours Model 2, and is the metric that actually matters for AgriWebb's stated goal of predicting future pasture availability.</w:t>
       </w:r>
     </w:p>
     <w:p>
@@ -6534,7 +6742,7 @@
         <w:spacing w:after="150"/>
       </w:pPr>
       <w:r>
-        <w:t xml:space="preserve">In short, this isn't a bug in the code or how the error was measured. The real issue is that a single, shared model is being asked to predict the behaviour of 19 very different paddocks — some stable, some highly volatile — using only about 189 observations each. Once climate features and an unrestricted growing-window history are added, the model gains enough capacity to fit the training data closely, but there still isn't enough diverse per-paddock data for it to learn how to extrapolate the more volatile paddocks' future growth, so aggregate test error ends up dominated by those harder cases.</w:t>
+        <w:t>In short, this isn't a bug in the code or how the error was measured. The real issue is that a single, shared model is being asked to predict the behaviour of 19 very different paddocks — some stable, some highly volatile — using only about 189 observations each. Once climate features and an unrestricted growing-window history are added, the model gains enough capacity to fit the training data closely, but there still isn't enough diverse per-paddock data for it to learn how to extrapolate the more volatile paddocks' future growth, so aggregate test error ends up dominated by those harder cases.</w:t>
       </w:r>
       <w:r>
         <w:rPr>
@@ -6563,7 +6771,7 @@
         <w:spacing w:after="150"/>
       </w:pPr>
       <w:r>
-        <w:t xml:space="preserve">For AgriWebb, these results suggest the current multivariate model should not be deployed as-is for operational forecasting: a Test R² of 0.16 means it explains only a modest share of the variance in genuinely future pasture growth, and its strong training-time metrics (Train R² = 0.81) considerably overstate how well it generalises. Model 2 (univariate, Lookback=10) is the most defensible of the three for practical use here, since it shows the best genuine forecasting performance (Test R² = 0.33, Test RMSE = 342.35) without the added complexity or overfitting risk of the multivariate model — a useful reminder that model complexity should be validated against true held-out performance, not training fit, before being deployed. Practical next steps worth considering: per-paddock or per-cluster fine-tuning rather than one shared model across all 19 paddocks; gathering more historical timesteps per paddock before adding additional input features; and applying stronger regularisation (e.g., increased dropout, L2 weight decay) specifically for the multivariate model given its overfitting signature. Until such improvements are validated on genuine forecasting performance, multivariate model outputs should be treated as indicative at best, with univariate Model 2 preferred for operational use.</w:t>
+        <w:t>For AgriWebb, these results suggest the current multivariate model should not be deployed as-is for operational forecasting: a Test R² of 0.16 means it explains only a modest share of the variance in genuinely future pasture growth, and its strong training-time metrics (Train R² = 0.81) considerably overstate how well it generalises. Model 2 (univariate, Lookback=10) is the most defensible of the three for practical use here, since it shows the best genuine forecasting performance (Test R² = 0.33, Test RMSE = 342.35) without the added complexity or overfitting risk of the multivariate model — a useful reminder that model complexity should be validated against true held-out performance, not training fit, before being deployed. Practical next steps worth considering: per-paddock or per-cluster fine-tuning rather than one shared model across all 19 paddocks; gathering more historical timesteps per paddock before adding additional input features; and applying stronger regularisation (e.g., increased dropout, L2 weight decay) specifically for the multivariate model given its overfitting signature. Until such improvements are validated on genuine forecasting performance, multivariate model outputs should be treated as indicative at best, with univariate Model 2 preferred for operational use.</w:t>
       </w:r>
     </w:p>
     <w:p>
@@ -6594,7 +6802,16 @@
         <w:spacing w:after="150"/>
       </w:pPr>
       <w:r>
-        <w:t xml:space="preserve">The hydrogen_small dataset contains 1,000 tweets, with a class distribution of 547 Relevant and 453 Irrelevant (54.7% / 45.3%).</w:t>
+        <w:t xml:space="preserve">The </w:t>
+      </w:r>
+      <w:r>
+        <w:rPr>
+          <w:i/>
+        </w:rPr>
+        <w:t xml:space="preserve">hydrogen_small </w:t>
+      </w:r>
+      <w:r>
+        <w:t>dataset contains 1,000 tweets, with a class distribution of 547 Relevant and 453 Irrelevant (54.7% / 45.3%).</w:t>
       </w:r>
     </w:p>
     <w:p>
@@ -6607,7 +6824,7 @@
         <w:spacing w:after="80"/>
       </w:pPr>
       <w:r>
-        <w:t xml:space="preserve">Text cleaning: URLs, Twitter mentions (@handles), and non-ASCII characters were stripped via regular expressions, and consecutive whitespace was normalized to single spaces. Raw tweets are noisy — links, handles, and stray symbols carry no topical signal and would otherwise be tokenised as meaningless sub-word units, diluting the input the model actually needs to attend to.</w:t>
+        <w:t>Text cleaning: URLs, Twitter mentions (@handles), and non-ASCII characters were stripped via regular expressions, and consecutive whitespace was normalized to single spaces. Raw tweets are noisy — links, handles, and stray symbols carry no topical signal and would otherwise be tokenised as meaningless sub-word units, diluting the input the model actually needs to attend to.</w:t>
       </w:r>
     </w:p>
     <w:p>
@@ -6620,7 +6837,7 @@
         <w:spacing w:after="80"/>
       </w:pPr>
       <w:r>
-        <w:t xml:space="preserve">Label encoding: labels were mapped to binary integers, Relevant = 1 and Irrelevant = 0, since AutoModelForSequenceClassification and Cross-Entropy Loss require integer class targets rather than string labels.</w:t>
+        <w:t>Label encoding: labels were mapped to binary integers, Relevant = 1 and Irrelevant = 0, since AutoModelForSequenceClassification and Cross-Entropy Loss require integer class targets rather than string labels.</w:t>
       </w:r>
     </w:p>
     <w:p>
@@ -6751,7 +6968,7 @@
           </w:tcPr>
           <w:p>
             <w:r>
-              <w:t xml:space="preserve">General-domain bidirectional transformer pre-trained on Wikipedia and BookCorpus; serves as a reliable, well-understood benchmark.</w:t>
+              <w:t>General-domain bidirectional transformer pre-trained on Wikipedia and BookCorpus; serves as a reliable, well-understood benchmark.</w:t>
             </w:r>
           </w:p>
         </w:tc>
@@ -6785,7 +7002,7 @@
           </w:tcPr>
           <w:p>
             <w:r>
-              <w:t xml:space="preserve">RoBERTa-based model pre-trained on 850 million English tweets, specifically optimised for Twitter slang, syntax, and informal phrasing — matches the register of the target data.</w:t>
+              <w:t>RoBERTa-based model pre-trained on 850 million English tweets, specifically optimised for Twitter slang, syntax, and informal phrasing — matches the register of the target data.</w:t>
             </w:r>
           </w:p>
         </w:tc>
@@ -6815,7 +7032,16 @@
         <w:spacing w:after="80"/>
       </w:pPr>
       <w:r>
-        <w:t xml:space="preserve">Split: stratified 70/30 (700 train / 300 test), random_state=42 — stratification preserves the 54.7%/45.3% class balance in both subsets.</w:t>
+        <w:t xml:space="preserve">Split: stratified 70/30 (700 train / 300 test), </w:t>
+      </w:r>
+      <w:r>
+        <w:rPr>
+          <w:i/>
+        </w:rPr>
+        <w:t xml:space="preserve">random_state=42 </w:t>
+      </w:r>
+      <w:r>
+        <w:t>— stratification preserves the 54.7%/45.3% class balance in both subsets.</w:t>
       </w:r>
     </w:p>
     <w:p>
@@ -6828,7 +7054,7 @@
         <w:spacing w:after="80"/>
       </w:pPr>
       <w:r>
-        <w:t xml:space="preserve">Loss function: standard Cross-Entropy Loss via AutoModelForSequenceClassification. This is the appropriate loss for binary classification because it is derived from negative log-likelihood and heavily penalises confident, incorrect probability predictions, encouraging well-calibrated outputs.</w:t>
+        <w:t>Loss function: standard Cross-Entropy Loss via AutoModelForSequenceClassification. This is the appropriate loss for binary classification because it is derived from negative log-likelihood and heavily penalises confident, incorrect probability predictions, encouraging well-calibrated outputs.</w:t>
       </w:r>
     </w:p>
     <w:p>
@@ -6854,7 +7080,7 @@
         <w:spacing w:after="80"/>
       </w:pPr>
       <w:r>
-        <w:t xml:space="preserve">Hyperparameters: 3 epochs, batch size 16 (train) / 32 (eval), learning rate 2e-5 with the AdamW optimiser, weight decay 0.01 for L2 regularization.</w:t>
+        <w:t>Hyperparameters: 3 epochs, batch size 16 (train) / 32 (eval), learning rate 2e-5 with the AdamW optimiser, weight decay 0.01 for L2 regularization.</w:t>
       </w:r>
     </w:p>
     <w:p>
@@ -7067,7 +7293,7 @@
         <w:spacing w:after="150"/>
       </w:pPr>
       <w:r>
-        <w:t xml:space="preserve">Note that bert-base-uncased shows a larger train–test gap (97.14% → 91.67%) than bertweet-base (94.43% → 93.33%), suggesting bertweet-base generalizes slightly better to unseen tweets — consistent with its domain-matched pretraining.</w:t>
+        <w:t>Note that bert-base-uncased shows a larger train–test gap (97.14% → 91.67%) than bertweet-base (94.43% → 93.33%), suggesting bertweet-base generalizes slightly better to unseen tweets — consistent with its domain-matched pretraining.</w:t>
       </w:r>
     </w:p>
     <w:p>
@@ -7228,7 +7454,7 @@
         <w:spacing w:after="150"/>
       </w:pPr>
       <w:r>
-        <w:t xml:space="preserve">For the Relevant tweet, attention concentrates on "green", "hydrogen", "blue", and "fossil fuels” energy-related modifiers surrounding the keyword "hydrogen" that together signal the clean-energy topic. For the Irrelevant tweet, attention shifts decisively to "responsive", "html", and "template” web-design terminology that signals "hydrogen" is being used here as a software/theme name rather than referring to the energy source. This demonstrates that the model is not simply keying off the presence of the word "hydrogen" (which appears in every tweet in this dataset by construction) but is genuinely using surrounding context to disambiguate its meaning.</w:t>
+        <w:t>For the Relevant tweet, attention concentrates on "green", "hydrogen", "blue", and "fossil fuels” energy-related modifiers surrounding the keyword "hydrogen" that together signal the clean-energy topic. For the Irrelevant tweet, attention shifts decisively to "responsive", "html", and "template” web-design terminology that signals "hydrogen" is being used here as a software/theme name rather than referring to the energy source. This demonstrates that the model is not simply keying off the presence of the word "hydrogen" (which appears in every tweet in this dataset by construction) but is genuinely using surrounding context to disambiguate its meaning.</w:t>
       </w:r>
     </w:p>
     <w:p>
@@ -7349,7 +7575,7 @@
                 <w:b/>
                 <w:bCs/>
               </w:rPr>
-              <w:t xml:space="preserve">Recall (Relevant)</w:t>
+              <w:t>Recall (Relevant)</w:t>
             </w:r>
           </w:p>
         </w:tc>
@@ -7769,7 +7995,7 @@
         <w:spacing w:after="150"/>
       </w:pPr>
       <w:r>
-        <w:t xml:space="preserve">BERT outperformed the TF-IDF logistic regression baseline across every metric: test accuracy rose from 89.67% to 93.33%, and ROC-AUC from 0.963 to 0.985. This is expected because every tweet in this dataset contains the keyword "hydrogen" by construction, so the discriminative signal depends entirely on surrounding context (e.g., "green/blue hydrogen" for clean energy vs. "hydrogen responsive template" for web design). The logistic regression model treats text as an unordered bag of TF-IDF weighted words and cannot capture this context-dependent meaning, whereas BERT's self-attention mechanism explicitly models bidirectional dependencies between words. BERTweet's further improvement over bert-base-uncased is attributable to its vocabulary and pretraining being specifically matched to informal, social-media text.</w:t>
+        <w:t>BERT outperformed the TF-IDF logistic regression baseline across every metric: test accuracy rose from 89.67% to 93.33%, and ROC-AUC from 0.963 to 0.985. This is expected because every tweet in this dataset contains the keyword "hydrogen" by construction, so the discriminative signal depends entirely on surrounding context (e.g., "green/blue hydrogen" for clean energy vs. "hydrogen responsive template" for web design). The logistic regression model treats text as an unordered bag of TF-IDF weighted words and cannot capture this context-dependent meaning, whereas BERT's self-attention mechanism explicitly models bidirectional dependencies between words. BERTweet's further improvement over bert-base-uncased is attributable to its vocabulary and pretraining being specifically matched to informal, social-media text.</w:t>
       </w:r>
     </w:p>
     <w:p>
@@ -7792,7 +8018,16 @@
         <w:spacing w:before="300" w:after="150"/>
       </w:pPr>
       <w:r>
-        <w:t xml:space="preserve">10.1 Preprocessing SQuAD_tiny for T5</w:t>
+        <w:t xml:space="preserve">10.1 Preprocessing </w:t>
+      </w:r>
+      <w:r>
+        <w:rPr>
+          <w:i/>
+        </w:rPr>
+        <w:t xml:space="preserve">SQuAD_tiny </w:t>
+      </w:r>
+      <w:r>
+        <w:t>for T5</w:t>
       </w:r>
     </w:p>
     <w:p>
@@ -7818,7 +8053,7 @@
         <w:spacing w:after="80"/>
       </w:pPr>
       <w:r>
-        <w:t xml:space="preserve">Tokenization: inputs were tokenized to a maximum length of 512 tokens (long enough to hold the SQuAD context passage plus the question) and target answers to a maximum of 128 tokens, both with padding and truncation for uniform batch shapes.</w:t>
+        <w:t>Tokenization: inputs were tokenized to a maximum length of 512 tokens (long enough to hold the SQuAD context passage plus the question) and target answers to a maximum of 128 tokens, both with padding and truncation for uniform batch shapes.</w:t>
       </w:r>
     </w:p>
     <w:p>
@@ -7831,7 +8066,16 @@
         <w:spacing w:after="80"/>
       </w:pPr>
       <w:r>
-        <w:t xml:space="preserve">Dataset split: 1,000 training examples (SQuAD train indices 10,000–10,999), 100 validation examples (SQuAD validation indices 3,000–3,099), and 100 test examples (SQuAD validation indices 3,100–3,199), following the SQuAD_tiny construction specified in the assignment.</w:t>
+        <w:t xml:space="preserve">Dataset split: 1,000 training examples (SQuAD train indices 10,000–10,999), 100 validation examples (SQuAD validation indices 3,000–3,099), and 100 test examples (SQuAD validation indices 3,100–3,199), following the </w:t>
+      </w:r>
+      <w:r>
+        <w:rPr>
+          <w:i/>
+        </w:rPr>
+        <w:t xml:space="preserve">SQuAD_tiny </w:t>
+      </w:r>
+      <w:r>
+        <w:t>construction specified in the assignment.</w:t>
       </w:r>
     </w:p>
     <w:p>
@@ -7856,7 +8100,7 @@
         <w:spacing w:after="150"/>
       </w:pPr>
       <w:r>
-        <w:t xml:space="preserve">Hyperparameters: 3 epochs, per-device batch size 8 (train and eval), learning rate 3e-4, weight decay 0.01, using Hugging Face's Trainer/TrainingArguments with epoch-level evaluation and checkpointing.</w:t>
+        <w:t>Hyperparameters: 3 epochs, per-device batch size 8 (train and eval), learning rate 3e-4, weight decay 0.01, using Hugging Face's Trainer/TrainingArguments with epoch-level evaluation and checkpointing.</w:t>
       </w:r>
     </w:p>
     <w:p>
@@ -8134,7 +8378,7 @@
         <w:spacing w:after="150"/>
       </w:pPr>
       <w:r>
-        <w:t xml:space="preserve">Overfitting-prevention strategies: weight decay (0.01) was applied as L2 regularization on model weights; a comparatively short fine-tuning run (3 epochs) was used given the small 1,000-example training set, and was further supported by the observed validation loss uptick at epoch 3 above; and a held-out validation set (100 examples, drawn from a different SQuAD split range to the training set) was evaluated after every epoch so that validation loss could be monitored for divergence from training loss.</w:t>
+        <w:t>Overfitting-prevention strategies: weight decay (0.01) was applied as L2 regularization on model weights; a comparatively short fine-tuning run (3 epochs) was used given the small 1,000-example training set, and was further supported by the observed validation loss uptick at epoch 3 above; and a held-out validation set (100 examples, drawn from a different SQuAD split range to the training set) was evaluated after every epoch so that validation loss could be monitored for divergence from training loss.</w:t>
       </w:r>
     </w:p>
     <w:p>
@@ -8479,7 +8723,7 @@
         <w:spacing w:after="150"/>
       </w:pPr>
       <w:r>
-        <w:t xml:space="preserve">A ROUGE-1 F-measure of 0.57 indicates moderate word-level overlap between generated and reference answers — the model captures much of the correct content but does not reproduce reference answers exactly. The larger gap between ROUGE-1 (0.57) and ROUGE-2 (0.37) suggests that while individual key words are often correctly identified, the model does not always reproduce the exact multi-word phrasing of the reference answer (e.g., generating a shorter or differently worded span that still contains the correct information).</w:t>
+        <w:t>A ROUGE-1 F-measure of 0.57 indicates moderate word-level overlap between generated and reference answers — the model captures much of the correct content but does not reproduce reference answers exactly. The larger gap between ROUGE-1 (0.57) and ROUGE-2 (0.37) suggests that while individual key words are often correctly identified, the model does not always reproduce the exact multi-word phrasing of the reference answer (e.g., generating a shorter or differently worded span that still contains the correct information).</w:t>
       </w:r>
     </w:p>
     <w:p>
@@ -8990,7 +9234,7 @@
           </w:tcPr>
           <w:p>
             <w:r>
-              <w:t xml:space="preserve">What declaration predicated the emigration of Huguenot refugees?</w:t>
+              <w:t>What declaration predicated the emigration of Huguenot refugees?</w:t>
             </w:r>
           </w:p>
         </w:tc>
@@ -9006,7 +9250,7 @@
           </w:tcPr>
           <w:p>
             <w:r>
-              <w:t xml:space="preserve">the revocation of the Edict of Nantes</w:t>
+              <w:t>the revocation of the Edict of Nantes</w:t>
             </w:r>
           </w:p>
         </w:tc>
@@ -9022,7 +9266,7 @@
           </w:tcPr>
           <w:p>
             <w:r>
-              <w:t xml:space="preserve">the Edict of Nantes</w:t>
+              <w:t>the Edict of Nantes</w:t>
             </w:r>
           </w:p>
         </w:tc>
@@ -9088,7 +9332,7 @@
         <w:spacing w:after="80"/>
       </w:pPr>
       <w:r>
-        <w:t xml:space="preserve">Errors with context: Sample 2 answers with "2 million" (the population figure from a nearby sentence) instead of the actual refugee count ("75,000 to 100,000 people") — a plausible-sounding but factually wrong span, suggesting the model can confuse similar numeric entities appearing close together in the passage. Sample 4 produces "Cévennes" (a place name from elsewhere in the passage) rather than the correct two areas, indicating a similar entity-confusion failure mode. Sample 5 gives "the Edict of Nantes" instead of "the revocation of the Edict of Nantes” again close in content but missing the key qualifying word that changes the precise meaning of the answer.</w:t>
+        <w:t>Errors with context: Sample 2 answers with "2 million" (the population figure from a nearby sentence) instead of the actual refugee count ("75,000 to 100,000 people") — a plausible-sounding but factually wrong span, suggesting the model can confuse similar numeric entities appearing close together in the passage. Sample 4 produces "Cévennes" (a place name from elsewhere in the passage) rather than the correct two areas, indicating a similar entity-confusion failure mode. Sample 5 gives "the Edict of Nantes" instead of "the revocation of the Edict of Nantes” again close in content but missing the key qualifying word that changes the precise meaning of the answer.</w:t>
       </w:r>
     </w:p>
     <w:p>
@@ -9101,7 +9345,7 @@
         <w:spacing w:after="80"/>
       </w:pPr>
       <w:r>
-        <w:t xml:space="preserve">Without context: 4 of the 5 samples produce an empty string, and the one non-empty output (Sample 3) simply echoes back part of the question rather than answering it. This confirms the model has not memorized SQuAD facts during fine-tuning; it has learned to locate and extract spans from a supplied context, not to answer general-knowledge questions from parametric memory.</w:t>
+        <w:t>Without context: 4 of the 5 samples produce an empty string, and the one non-empty output (Sample 3) simply echoes back part of the question rather than answering it. This confirms the model has not memorized SQuAD facts during fine-tuning; it has learned to locate and extract spans from a supplied context, not to answer general-knowledge questions from parametric memory.</w:t>
       </w:r>
     </w:p>
     <w:p>
@@ -9109,7 +9353,7 @@
         <w:spacing w:after="150"/>
       </w:pPr>
       <w:r>
-        <w:t xml:space="preserve">This near-total performance collapse without context (ROUGE-1 F dropping from 0.57 to 0.0065) demonstrates that the fine-tuned model's competence is entirely context-dependent: it functions as a context-conditioned span extractor/generator rather than as a general question-answering system with independent world knowledge. This is expected given the small fine-tuning set (1,000 examples) is far too small to teach the model new factual knowledge but is entirely sufficient to teach it the SQuAD task format of locating an answer within a given passage.</w:t>
+        <w:t>This near-total performance collapse without context (ROUGE-1 F dropping from 0.57 to 0.0065) demonstrates that the fine-tuned model's competence is entirely context-dependent: it functions as a context-conditioned span extractor/generator rather than as a general question-answering system with independent world knowledge. This is expected given the small fine-tuning set (1,000 examples) is far too small to teach the model new factual knowledge but is entirely sufficient to teach it the SQuAD task format of locating an answer within a given passage.</w:t>
       </w:r>
     </w:p>
     <w:p>
@@ -9891,7 +10135,13 @@
           </w:tcPr>
           <w:p>
             <w:r>
-              <w:t>Fine-tuned t5-small (SQuAD_tiny)</w:t>
+              <w:t xml:space="preserve">Fine-tuned t5-small </w:t>
+            </w:r>
+            <w:r>
+              <w:rPr>
+                <w:i/>
+              </w:rPr>
+              <w:t>(SQuAD_tiny)</w:t>
             </w:r>
           </w:p>
         </w:tc>
@@ -10021,7 +10271,16 @@
         <w:spacing w:after="150"/>
       </w:pPr>
       <w:r>
-        <w:t xml:space="preserve">Counter-intuitively, the pre-trained mrm8488/t5-base-finetuned-squadv2 model scored lower than the team's own fine-tuned t5-small on every ROUGE variant (e.g., ROUGE-1 F: 0.5323 vs. 0.5749), despite being a larger base architecture (t5-base) trained on the full SQuAD dataset (~87,000+ examples) rather than the 1,000-example SQuAD_tiny subset.</w:t>
+        <w:t xml:space="preserve">Counter-intuitively, the pre-trained mrm8488/t5-base-finetuned-squadv2 model scored lower than the team's own fine-tuned t5-small on every ROUGE variant (e.g., ROUGE-1 F: 0.5323 vs. 0.5749), despite being a larger base architecture (t5-base) trained on the full SQuAD dataset (~87,000+ examples) rather than the 1,000-example </w:t>
+      </w:r>
+      <w:r>
+        <w:rPr>
+          <w:i/>
+        </w:rPr>
+        <w:t xml:space="preserve">SQuAD_tiny </w:t>
+      </w:r>
+      <w:r>
+        <w:t>subset.</w:t>
       </w:r>
     </w:p>
     <w:p>
@@ -10029,7 +10288,16 @@
         <w:spacing w:after="150"/>
       </w:pPr>
       <w:r>
-        <w:t xml:space="preserve">Two explanations plausibly account for this reversal. First, a domain/format match effect: the team's model was fine-tuned directly on training data drawn from the same SQuAD dataset structure and answer-length conventions as the test set (indices 3,100–3,199 of the SQuAD validation split), so its output style is closely matched to this specific evaluation set, whereas mrm8488 was shaped by the full, more heterogeneous SQuAD v1 training distribution and may produce longer or differently-phrased spans that reduce lexical overlap even when correct. Second, a SQuAD v2 vs. v1 mismatch: mrm8488 was fine-tuned on SQuAD v2, which includes unanswerable questions and trains the model to sometimes hedge or decline to answer; since every question in the SQuAD_tiny test set (drawn from SQuAD v1-style data) does have an answer, a v2-trained model's more conservative answer style may reduce its measured overlap with the always-present reference answers even when its underlying answers are semantically reasonable. This also highlights a genuine limitation of ROUGE as an evaluation metric: it measures lexical overlap only, not factual correctness, so it is possible the pre-trained model's answers remain accurate but are phrased differently enough from the references to be penalized — a fuller evaluation would benefit from manually inspecting a sample of mrm8488's generated answers alongside the fine-tuned model's, rather than relying on ROUGE scores alone.</w:t>
+        <w:t xml:space="preserve">Two explanations plausibly account for this reversal. First, a domain/format match effect: the team's model was fine-tuned directly on training data drawn from the same SQuAD dataset structure and answer-length conventions as the test set (indices 3,100–3,199 of the SQuAD validation split), so its output style is closely matched to this specific evaluation set, whereas mrm8488 was shaped by the full, more heterogeneous SQuAD v1 training distribution and may produce longer or differently-phrased spans that reduce lexical overlap even when correct. Second, a SQuAD v2 vs. v1 mismatch: mrm8488 was fine-tuned on SQuAD v2, which includes unanswerable questions and trains the model to sometimes hedge or decline to answer; since every question in the </w:t>
+      </w:r>
+      <w:r>
+        <w:rPr>
+          <w:i/>
+        </w:rPr>
+        <w:t xml:space="preserve">SQuAD_tiny </w:t>
+      </w:r>
+      <w:r>
+        <w:t>test set (drawn from SQuAD v1-style data) does have an answer, a v2-trained model's more conservative answer style may reduce its measured overlap with the always-present reference answers even when its underlying answers are semantically reasonable. This also highlights a genuine limitation of ROUGE as an evaluation metric: it measures lexical overlap only, not factual correctness, so it is possible the pre-trained model's answers remain accurate but are phrased differently enough from the references to be penalized — a fuller evaluation would benefit from manually inspecting a sample of mrm8488's generated answers alongside the fine-tuned model's, rather than relying on ROUGE scores alone.</w:t>
       </w:r>
     </w:p>
     <w:sectPr>
@@ -11199,6 +11467,7 @@
   <w:style w:type="character" w:default="1" w:styleId="DefaultParagraphFont">
     <w:name w:val="Default Paragraph Font"/>
     <w:uiPriority w:val="1"/>
+    <w:semiHidden/>
     <w:unhideWhenUsed/>
   </w:style>
   <w:style w:type="table" w:default="1" w:styleId="TableNormal">

</xml_diff>

<commit_message>
doc: slight edits to Task 8
</commit_message>
<xml_diff>
--- a/Assessment2-Report.docx
+++ b/Assessment2-Report.docx
@@ -4212,7 +4212,15 @@
         <w:t xml:space="preserve">hidden_size </w:t>
       </w:r>
       <w:r>
-        <w:t xml:space="preserve">in {8, 16, 32}, </w:t>
+        <w:t xml:space="preserve">in {8, 16, </w:t>
+      </w:r>
+      <w:proofErr w:type="gramStart"/>
+      <w:r>
+        <w:t>32},</w:t>
+      </w:r>
+      <w:proofErr w:type="gramEnd"/>
+      <w:r>
+        <w:t xml:space="preserve"> </w:t>
       </w:r>
       <w:r>
         <w:rPr>
@@ -4221,11 +4229,29 @@
         <w:t xml:space="preserve">num_layers </w:t>
       </w:r>
       <w:r>
-        <w:t xml:space="preserve">in {1, 2}, and learning rate in {0.001, 0.0005} — 12 candidates in total. Each candidate was trained for a short budget of 60 epochs on the same 80/20 train/validation split, and validation MSE was recorded for every combination </w:t>
+        <w:t xml:space="preserve">in {1, </w:t>
+      </w:r>
+      <w:proofErr w:type="gramStart"/>
+      <w:r>
+        <w:t>2},</w:t>
+      </w:r>
+      <w:proofErr w:type="gramEnd"/>
+      <w:r>
+        <w:t xml:space="preserve"> and </w:t>
       </w:r>
       <w:r>
         <w:rPr>
           <w:i/>
+          <w:iCs/>
+        </w:rPr>
+        <w:t>learning rate</w:t>
+      </w:r>
+      <w:r>
+        <w:t xml:space="preserve"> in {0.001, 0.0005} — 12 candidates in total. Each candidate was trained for a short budget of 60 epochs on the same 80/20 train/validation split, and validation MSE was recorded for every combination </w:t>
+      </w:r>
+      <w:r>
+        <w:rPr>
+          <w:i/>
         </w:rPr>
         <w:t xml:space="preserve">(hidden_size, num_layers, </w:t>
       </w:r>
@@ -4239,13 +4265,61 @@
         <w:t xml:space="preserve">val_loss): </w:t>
       </w:r>
       <w:r>
-        <w:t xml:space="preserve">32, 2, 0.0010 → 0.5437; 16, 2, 0.0010 → 0.5478; 32, 1, 0.0010 → 0.5517; 32, 2, 0.0005 → 0.5547; 16, 2, 0.0005 → 0.5582; 16, 1, 0.0010 → 0.5629; 32, 1, 0.0005 → 0.5631; 8, 2, 0.0010 → 0.5664; 16, 1, 0.0005 → 0.5694; 8, 2, 0.0005 → 0.5731; 8, 1, 0.0010 → 0.5735; 8, 1, 0.0005 → 0.5831. The lowest-validation-loss configuration — </w:t>
-      </w:r>
+        <w:t xml:space="preserve">32, 2, 0.0010 → 0.5437; 16, 2, 0.0010 → 0.5478; 32, 1, 0.0010 → 0.5517; 32, 2, 0.0005 → 0.5547; 16, 2, 0.0005 → 0.5582; 16, 1, 0.0010 → 0.5629; 32, 1, 0.0005 → 0.5631; 8, 2, 0.0010 → 0.5664; 16, 1, 0.0005 → 0.5694; 8, 2, 0.0005 → 0.5731; 8, 1, 0.0010 → 0.5735; 8, 1, 0.0005 → 0.5831. </w:t>
+      </w:r>
+    </w:p>
+    <w:p>
+      <w:pPr>
+        <w:spacing w:after="150"/>
+      </w:pPr>
+      <w:r>
+        <w:t>The lowest</w:t>
+      </w:r>
+      <w:r>
+        <w:t xml:space="preserve"> </w:t>
+      </w:r>
+      <w:r>
+        <w:t>validation</w:t>
+      </w:r>
+      <w:r>
+        <w:t xml:space="preserve"> </w:t>
+      </w:r>
+      <w:r>
+        <w:t>loss configuration</w:t>
+      </w:r>
+      <w:r>
+        <w:t>:</w:t>
+      </w:r>
+      <w:r>
+        <w:t xml:space="preserve"> </w:t>
+      </w:r>
+      <w:proofErr w:type="spellStart"/>
       <w:r>
         <w:rPr>
           <w:i/>
         </w:rPr>
-        <w:t xml:space="preserve">hidden_size=32, num_layers=2, </w:t>
+        <w:t>hidden_size</w:t>
+      </w:r>
+      <w:proofErr w:type="spellEnd"/>
+      <w:r>
+        <w:rPr>
+          <w:i/>
+        </w:rPr>
+        <w:t xml:space="preserve">=32, </w:t>
+      </w:r>
+      <w:proofErr w:type="spellStart"/>
+      <w:r>
+        <w:rPr>
+          <w:i/>
+        </w:rPr>
+        <w:t>num_layers</w:t>
+      </w:r>
+      <w:proofErr w:type="spellEnd"/>
+      <w:r>
+        <w:rPr>
+          <w:i/>
+        </w:rPr>
+        <w:t xml:space="preserve">=2, </w:t>
       </w:r>
       <w:r>
         <w:t>lr=0.001 — was selected and used for the full 250-epoch training run reported below; learning rate and epoch count otherwise follow common defaults for Adam-optimised LSTMs.</w:t>
@@ -4874,7 +4948,7 @@
         <w:spacing w:after="150"/>
       </w:pPr>
       <w:r>
-        <w:t xml:space="preserve">The training loss decreases fairly steadily throughout training (0.75 → 0.45), while the validation loss drops to its lowest point by epoch 50 (0.531) and then edges slightly upward through epoch 200 (0.533 → 0.535) — a mild overfitting signal within this internal validation split. Because </w:t>
+        <w:t xml:space="preserve">The training loss decreases steadily throughout training (0.75 → 0.45), while the validation loss drops to its lowest point by epoch 50 (0.531) and then edges slightly upward through epoch 200 (0.533 → 0.535) — a mild overfitting signal within this internal validation split. Because </w:t>
       </w:r>
       <w:r>
         <w:rPr>
@@ -6771,7 +6845,7 @@
         <w:spacing w:after="150"/>
       </w:pPr>
       <w:r>
-        <w:t>For AgriWebb, these results suggest the current multivariate model should not be deployed as-is for operational forecasting: a Test R² of 0.16 means it explains only a modest share of the variance in genuinely future pasture growth, and its strong training-time metrics (Train R² = 0.81) considerably overstate how well it generalises. Model 2 (univariate, Lookback=10) is the most defensible of the three for practical use here, since it shows the best genuine forecasting performance (Test R² = 0.33, Test RMSE = 342.35) without the added complexity or overfitting risk of the multivariate model — a useful reminder that model complexity should be validated against true held-out performance, not training fit, before being deployed. Practical next steps worth considering: per-paddock or per-cluster fine-tuning rather than one shared model across all 19 paddocks; gathering more historical timesteps per paddock before adding additional input features; and applying stronger regularisation (e.g., increased dropout, L2 weight decay) specifically for the multivariate model given its overfitting signature. Until such improvements are validated on genuine forecasting performance, multivariate model outputs should be treated as indicative at best, with univariate Model 2 preferred for operational use.</w:t>
+        <w:t>For AgriWebb, these results suggest the current multivariate model should not be deployed as-is for operational forecasting: a Test R² of 0.16 means it explains only a modest share of the variance in genuinely future pasture growth, and its strong training-time metrics (Train R² = 0.81) considerably overstate how well it generalises. Model 2 (univariate, Lookback=10) is the most defensible of the three for practical use here, since it shows the best genuine forecasting performance (Test R² = 0.33, Test RMSE = 342.35) without the added complexity or overfitting risk of the multivariate model — a useful reminder that model complexity should be validated against true performance, not training fit, before being deployed. Practical next steps worth considering: per-paddock or per-cluster fine-tuning rather than one shared model across all 19 paddocks; gathering more historical timesteps per paddock before adding additional input features; and applying stronger regularisation (e.g., increased dropout, L2 weight decay) specifically for the multivariate model given its overfitting signature. Until such improvements are validated on genuine forecasting performance, multivariate model outputs should be treated as indicative at best, with univariate Model 2 preferred for operational use.</w:t>
       </w:r>
     </w:p>
     <w:p>

</xml_diff>

<commit_message>
doc: adding attention map for irrelevant tweets figure
</commit_message>
<xml_diff>
--- a/Assessment2-Report.docx
+++ b/Assessment2-Report.docx
@@ -4212,15 +4212,7 @@
         <w:t xml:space="preserve">hidden_size </w:t>
       </w:r>
       <w:r>
-        <w:t xml:space="preserve">in {8, 16, </w:t>
-      </w:r>
-      <w:proofErr w:type="gramStart"/>
-      <w:r>
-        <w:t>32},</w:t>
-      </w:r>
-      <w:proofErr w:type="gramEnd"/>
-      <w:r>
-        <w:t xml:space="preserve"> </w:t>
+        <w:t xml:space="preserve">in {8, 16, 32}, </w:t>
       </w:r>
       <w:r>
         <w:rPr>
@@ -4229,15 +4221,7 @@
         <w:t xml:space="preserve">num_layers </w:t>
       </w:r>
       <w:r>
-        <w:t xml:space="preserve">in {1, </w:t>
-      </w:r>
-      <w:proofErr w:type="gramStart"/>
-      <w:r>
-        <w:t>2},</w:t>
-      </w:r>
-      <w:proofErr w:type="gramEnd"/>
-      <w:r>
-        <w:t xml:space="preserve"> and </w:t>
+        <w:t xml:space="preserve">in {1, 2}, and </w:t>
       </w:r>
       <w:r>
         <w:rPr>
@@ -4293,41 +4277,14 @@
       <w:r>
         <w:t xml:space="preserve"> </w:t>
       </w:r>
-      <w:proofErr w:type="spellStart"/>
       <w:r>
         <w:rPr>
           <w:i/>
         </w:rPr>
-        <w:t>hidden_size</w:t>
-      </w:r>
-      <w:proofErr w:type="spellEnd"/>
-      <w:r>
-        <w:rPr>
-          <w:i/>
-        </w:rPr>
-        <w:t xml:space="preserve">=32, </w:t>
-      </w:r>
-      <w:proofErr w:type="spellStart"/>
-      <w:r>
-        <w:rPr>
-          <w:i/>
-        </w:rPr>
-        <w:t>num_layers</w:t>
-      </w:r>
-      <w:proofErr w:type="spellEnd"/>
-      <w:r>
-        <w:rPr>
-          <w:i/>
-        </w:rPr>
-        <w:t xml:space="preserve">=2, </w:t>
-      </w:r>
-      <w:proofErr w:type="spellStart"/>
-      <w:r>
-        <w:t>lr</w:t>
-      </w:r>
-      <w:proofErr w:type="spellEnd"/>
-      <w:r>
-        <w:t>=0.001 — was selected and used for the full 250-epoch training run reported below; learning rate and epoch count otherwise follow common defaults for Adam-optimised LSTMs.</w:t>
+        <w:t xml:space="preserve">hidden_size=32, num_layers=2, </w:t>
+      </w:r>
+      <w:r>
+        <w:t>lr=0.001 — was selected and used for the full 250-epoch training run reported below; learning rate and epoch count otherwise follow common defaults for Adam-optimised LSTMs.</w:t>
       </w:r>
     </w:p>
     <w:tbl>
@@ -4879,6 +4836,23 @@
       <w:pPr>
         <w:spacing w:after="100"/>
       </w:pPr>
+    </w:p>
+    <w:p>
+      <w:pPr>
+        <w:spacing w:after="100"/>
+        <w:jc w:val="center"/>
+        <w:rPr>
+          <w:i/>
+          <w:iCs/>
+        </w:rPr>
+      </w:pPr>
+      <w:r>
+        <w:rPr>
+          <w:i/>
+          <w:iCs/>
+        </w:rPr>
+        <w:t>Figure 8.1: Model 1 Loss Convergence (Lookback=5)</w:t>
+      </w:r>
     </w:p>
     <w:p>
       <w:pPr>
@@ -5561,6 +5535,70 @@
     </w:p>
     <w:p>
       <w:pPr>
+        <w:spacing w:after="100"/>
+        <w:jc w:val="center"/>
+        <w:rPr>
+          <w:i/>
+          <w:iCs/>
+        </w:rPr>
+      </w:pPr>
+      <w:r>
+        <w:rPr>
+          <w:i/>
+          <w:iCs/>
+        </w:rPr>
+        <w:t>Figure 8.</w:t>
+      </w:r>
+      <w:r>
+        <w:rPr>
+          <w:i/>
+          <w:iCs/>
+        </w:rPr>
+        <w:t>2</w:t>
+      </w:r>
+      <w:r>
+        <w:rPr>
+          <w:i/>
+          <w:iCs/>
+        </w:rPr>
+        <w:t xml:space="preserve">: Model </w:t>
+      </w:r>
+      <w:r>
+        <w:rPr>
+          <w:i/>
+          <w:iCs/>
+        </w:rPr>
+        <w:t>2</w:t>
+      </w:r>
+      <w:r>
+        <w:rPr>
+          <w:i/>
+          <w:iCs/>
+        </w:rPr>
+        <w:t xml:space="preserve"> Loss Convergence (Lookback=</w:t>
+      </w:r>
+      <w:r>
+        <w:rPr>
+          <w:i/>
+          <w:iCs/>
+        </w:rPr>
+        <w:t>10</w:t>
+      </w:r>
+      <w:r>
+        <w:rPr>
+          <w:i/>
+          <w:iCs/>
+        </w:rPr>
+        <w:t>)</w:t>
+      </w:r>
+    </w:p>
+    <w:p>
+      <w:pPr>
+        <w:spacing w:after="100"/>
+      </w:pPr>
+    </w:p>
+    <w:p>
+      <w:pPr>
         <w:spacing w:after="300"/>
         <w:jc w:val="center"/>
       </w:pPr>
@@ -6258,6 +6296,70 @@
     </w:p>
     <w:p>
       <w:pPr>
+        <w:spacing w:after="100"/>
+        <w:jc w:val="center"/>
+        <w:rPr>
+          <w:i/>
+          <w:iCs/>
+        </w:rPr>
+      </w:pPr>
+      <w:r>
+        <w:rPr>
+          <w:i/>
+          <w:iCs/>
+        </w:rPr>
+        <w:t>Figure 8.</w:t>
+      </w:r>
+      <w:r>
+        <w:rPr>
+          <w:i/>
+          <w:iCs/>
+        </w:rPr>
+        <w:t>3</w:t>
+      </w:r>
+      <w:r>
+        <w:rPr>
+          <w:i/>
+          <w:iCs/>
+        </w:rPr>
+        <w:t xml:space="preserve">: Model </w:t>
+      </w:r>
+      <w:r>
+        <w:rPr>
+          <w:i/>
+          <w:iCs/>
+        </w:rPr>
+        <w:t>3</w:t>
+      </w:r>
+      <w:r>
+        <w:rPr>
+          <w:i/>
+          <w:iCs/>
+        </w:rPr>
+        <w:t xml:space="preserve"> Loss Convergence (</w:t>
+      </w:r>
+      <w:r>
+        <w:rPr>
+          <w:i/>
+          <w:iCs/>
+        </w:rPr>
+        <w:t>Multivariate</w:t>
+      </w:r>
+      <w:r>
+        <w:rPr>
+          <w:i/>
+          <w:iCs/>
+        </w:rPr>
+        <w:t>)</w:t>
+      </w:r>
+    </w:p>
+    <w:p>
+      <w:pPr>
+        <w:spacing w:after="100"/>
+      </w:pPr>
+    </w:p>
+    <w:p>
+      <w:pPr>
         <w:spacing w:after="300"/>
         <w:jc w:val="center"/>
       </w:pPr>
@@ -6868,11 +6970,6 @@
       </w:r>
     </w:p>
     <w:p>
-      <w:r>
-        <w:br w:type="page"/>
-      </w:r>
-    </w:p>
-    <w:p>
       <w:pPr>
         <w:pStyle w:val="Heading1"/>
         <w:spacing w:before="400" w:after="200"/>
@@ -6904,7 +7001,21 @@
         <w:t xml:space="preserve">hydrogen_small </w:t>
       </w:r>
       <w:r>
-        <w:t>dataset contains 1,000 tweets, with a class distribution of 547 Relevant and 453 Irrelevant (54.7% / 45.3%).</w:t>
+        <w:t>dataset contains 1,000 tweets, with a class distribution of 547 Relevant and 453 Irrelevant (54.7% / 45.3%)</w:t>
+      </w:r>
+      <w:r>
+        <w:t>, very close to being balanced</w:t>
+      </w:r>
+      <w:r>
+        <w:t>.</w:t>
+      </w:r>
+    </w:p>
+    <w:p>
+      <w:pPr>
+        <w:spacing w:after="150"/>
+      </w:pPr>
+      <w:r>
+        <w:t>We have done the following preprocessing:</w:t>
       </w:r>
     </w:p>
     <w:p>
@@ -6917,7 +7028,20 @@
         <w:spacing w:after="80"/>
       </w:pPr>
       <w:r>
-        <w:t>Text cleaning: URLs, Twitter mentions (@handles), and non-ASCII characters were stripped via regular expressions, and consecutive whitespace was normalized to single spaces. Raw tweets are noisy — links, handles, and stray symbols carry no topical signal and would otherwise be tokenised as meaningless sub-word units, diluting the input the model actually needs to attend to.</w:t>
+        <w:rPr>
+          <w:b/>
+          <w:bCs/>
+        </w:rPr>
+        <w:t>Text cleaning</w:t>
+      </w:r>
+      <w:r>
+        <w:t xml:space="preserve">: URLs, Twitter </w:t>
+      </w:r>
+      <w:r>
+        <w:t xml:space="preserve">mentions (“@” </w:t>
+      </w:r>
+      <w:r>
+        <w:t>handles), and non-ASCII characters were stripped via regular expressions, and consecutive whitespace was normalized to single spaces. Raw tweets are noisy — links, handles, and stray symbols carry no topical signal and would otherwise be tokenised as meaningless sub-word units, diluting the input the model actually needs to attend to.</w:t>
       </w:r>
     </w:p>
     <w:p>
@@ -6930,7 +7054,14 @@
         <w:spacing w:after="80"/>
       </w:pPr>
       <w:r>
-        <w:t>Label encoding: labels were mapped to binary integers, Relevant = 1 and Irrelevant = 0, since AutoModelForSequenceClassification and Cross-Entropy Loss require integer class targets rather than string labels.</w:t>
+        <w:rPr>
+          <w:b/>
+          <w:bCs/>
+        </w:rPr>
+        <w:t>Label encoding</w:t>
+      </w:r>
+      <w:r>
+        <w:t>: labels were mapped to binary integers, Relevant = 1 and Irrelevant = 0, since AutoModelForSequenceClassification and Cross-Entropy Loss require integer class targets rather than string labels.</w:t>
       </w:r>
     </w:p>
     <w:p>
@@ -6943,7 +7074,14 @@
         <w:spacing w:after="80"/>
       </w:pPr>
       <w:r>
-        <w:t>Tokenisation: each model's own tokenizer was used with truncation and dynamic padding up to a maximum length of 128 tokens, ensuring uniform tensor shapes for batched GPU training while keeping sequence length short enough (tweets are short by nature) to avoid unnecessary computation.</w:t>
+        <w:rPr>
+          <w:b/>
+          <w:bCs/>
+        </w:rPr>
+        <w:t>Tokenisation</w:t>
+      </w:r>
+      <w:r>
+        <w:t>: each model's own tokenizer was used with truncation and dynamic padding up to a maximum length of 128 tokens, ensuring uniform tensor shapes for batched GPU training while keeping sequence length short enough (tweets are short by nature) to avoid unnecessary computation.</w:t>
       </w:r>
     </w:p>
     <w:p>
@@ -7125,7 +7263,14 @@
         <w:spacing w:after="80"/>
       </w:pPr>
       <w:r>
-        <w:t xml:space="preserve">Split: stratified 70/30 (700 train / 300 test), </w:t>
+        <w:rPr>
+          <w:b/>
+          <w:bCs/>
+        </w:rPr>
+        <w:t>Split</w:t>
+      </w:r>
+      <w:r>
+        <w:t xml:space="preserve">: stratified 70/30 (700 train / 300 test), </w:t>
       </w:r>
       <w:r>
         <w:rPr>
@@ -7147,7 +7292,34 @@
         <w:spacing w:after="80"/>
       </w:pPr>
       <w:r>
-        <w:t>Loss function: standard Cross-Entropy Loss via AutoModelForSequenceClassification. This is the appropriate loss for binary classification because it is derived from negative log-likelihood and heavily penalises confident, incorrect probability predictions, encouraging well-calibrated outputs.</w:t>
+        <w:rPr>
+          <w:b/>
+          <w:bCs/>
+        </w:rPr>
+        <w:t>Loss function</w:t>
+      </w:r>
+      <w:r>
+        <w:t xml:space="preserve">: standard </w:t>
+      </w:r>
+      <w:r>
+        <w:rPr>
+          <w:i/>
+          <w:iCs/>
+        </w:rPr>
+        <w:t>Cross-Entropy</w:t>
+      </w:r>
+      <w:r>
+        <w:t xml:space="preserve"> Loss via </w:t>
+      </w:r>
+      <w:r>
+        <w:rPr>
+          <w:i/>
+          <w:iCs/>
+        </w:rPr>
+        <w:t>AutoModelForSequenceClassification</w:t>
+      </w:r>
+      <w:r>
+        <w:t>. This is the appropriate loss for binary classification because it is derived from negative log-likelihood and heavily penalises confident, incorrect probability predictions, encouraging well-calibrated outputs.</w:t>
       </w:r>
     </w:p>
     <w:p>
@@ -7160,7 +7332,14 @@
         <w:spacing w:after="80"/>
       </w:pPr>
       <w:r>
-        <w:t>Architecture: both models use a sequence classification head — a linear layer with dropout applied to the pooled [CLS] token representation.</w:t>
+        <w:rPr>
+          <w:b/>
+          <w:bCs/>
+        </w:rPr>
+        <w:t>Architecture</w:t>
+      </w:r>
+      <w:r>
+        <w:t>: both models use a sequence classification head — a linear layer with dropout applied to the pooled [CLS] token representation.</w:t>
       </w:r>
     </w:p>
     <w:p>
@@ -7173,7 +7352,36 @@
         <w:spacing w:after="80"/>
       </w:pPr>
       <w:r>
-        <w:t>Hyperparameters: 3 epochs, batch size 16 (train) / 32 (eval), learning rate 2e-5 with the AdamW optimiser, weight decay 0.01 for L2 regularization.</w:t>
+        <w:rPr>
+          <w:b/>
+          <w:bCs/>
+        </w:rPr>
+        <w:t>Hyperparameters</w:t>
+      </w:r>
+      <w:r>
+        <w:t xml:space="preserve">: 3 epochs, </w:t>
+      </w:r>
+      <w:r>
+        <w:t xml:space="preserve">the </w:t>
+      </w:r>
+      <w:r>
+        <w:t>batch size</w:t>
+      </w:r>
+      <w:r>
+        <w:t xml:space="preserve"> of:</w:t>
+      </w:r>
+      <w:r>
+        <w:t xml:space="preserve"> 16 (train) / 32 (eval), learning rate 2e-5 with the </w:t>
+      </w:r>
+      <w:r>
+        <w:rPr>
+          <w:i/>
+          <w:iCs/>
+        </w:rPr>
+        <w:t>AdamW</w:t>
+      </w:r>
+      <w:r>
+        <w:t xml:space="preserve"> optimiser, weight decay 0.01 for L2 regularization.</w:t>
       </w:r>
     </w:p>
     <w:p>
@@ -7304,7 +7512,19 @@
           </w:tcPr>
           <w:p>
             <w:r>
-              <w:t>97.14%</w:t>
+              <w:t>9</w:t>
+            </w:r>
+            <w:r>
+              <w:t>6</w:t>
+            </w:r>
+            <w:r>
+              <w:t>.</w:t>
+            </w:r>
+            <w:r>
+              <w:t xml:space="preserve">00 </w:t>
+            </w:r>
+            <w:r>
+              <w:t>%</w:t>
             </w:r>
           </w:p>
         </w:tc>
@@ -7320,7 +7540,19 @@
           </w:tcPr>
           <w:p>
             <w:r>
-              <w:t>91.67%</w:t>
+              <w:t>9</w:t>
+            </w:r>
+            <w:r>
+              <w:t>0</w:t>
+            </w:r>
+            <w:r>
+              <w:t>.</w:t>
+            </w:r>
+            <w:r>
+              <w:t>33</w:t>
+            </w:r>
+            <w:r>
+              <w:t>%</w:t>
             </w:r>
           </w:p>
         </w:tc>
@@ -7354,7 +7586,19 @@
           </w:tcPr>
           <w:p>
             <w:r>
-              <w:t>94.43%</w:t>
+              <w:t>9</w:t>
+            </w:r>
+            <w:r>
+              <w:t>6</w:t>
+            </w:r>
+            <w:r>
+              <w:t>.</w:t>
+            </w:r>
+            <w:r>
+              <w:t xml:space="preserve">85 </w:t>
+            </w:r>
+            <w:r>
+              <w:t>%</w:t>
             </w:r>
           </w:p>
         </w:tc>
@@ -7379,6 +7623,9 @@
     <w:p>
       <w:pPr>
         <w:spacing w:after="100"/>
+        <w:rPr>
+          <w:lang w:val="en-GB"/>
+        </w:rPr>
       </w:pPr>
     </w:p>
     <w:p>
@@ -7386,7 +7633,27 @@
         <w:spacing w:after="150"/>
       </w:pPr>
       <w:r>
-        <w:t>Note that bert-base-uncased shows a larger train–test gap (97.14% → 91.67%) than bertweet-base (94.43% → 93.33%), suggesting bertweet-base generalizes slightly better to unseen tweets — consistent with its domain-matched pretraining.</w:t>
+        <w:t xml:space="preserve">Note that </w:t>
+      </w:r>
+      <w:r>
+        <w:rPr>
+          <w:i/>
+          <w:iCs/>
+        </w:rPr>
+        <w:t>bert-base-uncased</w:t>
+      </w:r>
+      <w:r>
+        <w:t xml:space="preserve"> shows a larger train–test gap (97.14% → 91.67%) than </w:t>
+      </w:r>
+      <w:r>
+        <w:rPr>
+          <w:i/>
+          <w:iCs/>
+        </w:rPr>
+        <w:t>bertweet-base</w:t>
+      </w:r>
+      <w:r>
+        <w:t xml:space="preserve"> (94.43% → 93.33%), suggesting bertweet-base generalizes slightly better to unseen tweets — consistent with its domain-matched pretraining.</w:t>
       </w:r>
     </w:p>
     <w:p>
@@ -7403,23 +7670,75 @@
         <w:spacing w:after="150"/>
       </w:pPr>
       <w:r>
-        <w:t>Attention weights were averaged across all layers and heads of the best-performing model (vinai/bertweet-base) for one correctly classified tweet from each class.</w:t>
-      </w:r>
+        <w:t>Attention weights were averaged across all layers and heads of the best-performing model (</w:t>
+      </w:r>
+      <w:r>
+        <w:rPr>
+          <w:i/>
+          <w:iCs/>
+        </w:rPr>
+        <w:t>vinai/bertweet-base</w:t>
+      </w:r>
+      <w:r>
+        <w:t>) for one correctly classified tweet from each class.</w:t>
+      </w:r>
+    </w:p>
+    <w:p>
+      <w:pPr>
+        <w:spacing w:after="150"/>
+        <w:jc w:val="center"/>
+      </w:pPr>
     </w:p>
     <w:p>
       <w:pPr>
         <w:spacing w:after="300"/>
         <w:jc w:val="center"/>
-      </w:pPr>
-      <w:r>
-        <w:rPr>
-          <w:noProof/>
+        <w:rPr>
+          <w:i/>
+          <w:iCs/>
+        </w:rPr>
+      </w:pPr>
+      <w:r>
+        <w:rPr>
+          <w:i/>
+          <w:iCs/>
+        </w:rPr>
+        <w:t>Figure 9.</w:t>
+      </w:r>
+      <w:r>
+        <w:rPr>
+          <w:i/>
+          <w:iCs/>
+        </w:rPr>
+        <w:t>1</w:t>
+      </w:r>
+      <w:r>
+        <w:rPr>
+          <w:i/>
+          <w:iCs/>
+        </w:rPr>
+        <w:t>: Attention heatmap for a correctly classified Relevant tweet (predicted: Relevant).</w:t>
+      </w:r>
+    </w:p>
+    <w:p>
+      <w:pPr>
+        <w:spacing w:after="300"/>
+        <w:jc w:val="center"/>
+        <w:rPr>
+          <w:sz w:val="24"/>
+          <w:szCs w:val="24"/>
+        </w:rPr>
+      </w:pPr>
+      <w:r>
+        <w:rPr>
+          <w:sz w:val="24"/>
+          <w:szCs w:val="24"/>
         </w:rPr>
         <w:drawing>
-          <wp:inline distT="0" distB="0" distL="0" distR="0" wp14:anchorId="0A0597F8" wp14:editId="7B54706C">
-            <wp:extent cx="5731510" cy="4761230"/>
-            <wp:effectExtent l="0" t="0" r="2540" b="1270"/>
-            <wp:docPr id="1913794561" name="Picture 10"/>
+          <wp:inline distT="0" distB="0" distL="0" distR="0" wp14:anchorId="188AA78D" wp14:editId="1A4A88D8">
+            <wp:extent cx="8001000" cy="6572250"/>
+            <wp:effectExtent l="0" t="0" r="0" b="0"/>
+            <wp:docPr id="1823362909" name="Picture 1"/>
             <wp:cNvGraphicFramePr>
               <a:graphicFrameLocks xmlns:a="http://schemas.openxmlformats.org/drawingml/2006/main" noChangeAspect="1"/>
             </wp:cNvGraphicFramePr>
@@ -7427,36 +7746,23 @@
               <a:graphicData uri="http://schemas.openxmlformats.org/drawingml/2006/picture">
                 <pic:pic xmlns:pic="http://schemas.openxmlformats.org/drawingml/2006/picture">
                   <pic:nvPicPr>
-                    <pic:cNvPr id="0" name="Picture 19"/>
-                    <pic:cNvPicPr>
-                      <a:picLocks noChangeAspect="1" noChangeArrowheads="1"/>
-                    </pic:cNvPicPr>
+                    <pic:cNvPr id="1823362909" name=""/>
+                    <pic:cNvPicPr/>
                   </pic:nvPicPr>
                   <pic:blipFill>
-                    <a:blip r:embed="rId18">
-                      <a:extLst>
-                        <a:ext uri="{28A0092B-C50C-407E-A947-70E740481C1C}">
-                          <a14:useLocalDpi xmlns:a14="http://schemas.microsoft.com/office/drawing/2010/main" val="0"/>
-                        </a:ext>
-                      </a:extLst>
-                    </a:blip>
-                    <a:srcRect/>
+                    <a:blip r:embed="rId18"/>
                     <a:stretch>
                       <a:fillRect/>
                     </a:stretch>
                   </pic:blipFill>
-                  <pic:spPr bwMode="auto">
+                  <pic:spPr>
                     <a:xfrm>
                       <a:off x="0" y="0"/>
-                      <a:ext cx="5731510" cy="4761230"/>
+                      <a:ext cx="8001000" cy="6572250"/>
                     </a:xfrm>
                     <a:prstGeom prst="rect">
                       <a:avLst/>
                     </a:prstGeom>
-                    <a:noFill/>
-                    <a:ln>
-                      <a:noFill/>
-                    </a:ln>
                   </pic:spPr>
                 </pic:pic>
               </a:graphicData>
@@ -7464,14 +7770,45 @@
           </wp:inline>
         </w:drawing>
       </w:r>
-      <w:r>
+    </w:p>
+    <w:p>
+      <w:pPr>
+        <w:spacing w:after="300"/>
+        <w:jc w:val="center"/>
         <w:rPr>
           <w:i/>
           <w:iCs/>
-          <w:sz w:val="18"/>
-          <w:szCs w:val="18"/>
-        </w:rPr>
-        <w:t>Figure 9.1: Attention heatmap for a correctly classified Relevant tweet (predicted: Relevant).</w:t>
+        </w:rPr>
+      </w:pPr>
+      <w:r>
+        <w:rPr>
+          <w:i/>
+          <w:iCs/>
+          <w:sz w:val="24"/>
+          <w:szCs w:val="24"/>
+        </w:rPr>
+        <w:t xml:space="preserve">Figure 9.2: </w:t>
+      </w:r>
+      <w:r>
+        <w:rPr>
+          <w:i/>
+          <w:iCs/>
+        </w:rPr>
+        <w:t xml:space="preserve">Attention heatmap for a correctly classified Relevant tweet (predicted: </w:t>
+      </w:r>
+      <w:r>
+        <w:rPr>
+          <w:i/>
+          <w:iCs/>
+        </w:rPr>
+        <w:t>Irrelevant</w:t>
+      </w:r>
+      <w:r>
+        <w:rPr>
+          <w:i/>
+          <w:iCs/>
+        </w:rPr>
+        <w:t>).</w:t>
       </w:r>
     </w:p>
     <w:p>
@@ -7480,14 +7817,11 @@
         <w:jc w:val="center"/>
       </w:pPr>
       <w:r>
-        <w:rPr>
-          <w:noProof/>
-        </w:rPr>
         <w:drawing>
-          <wp:inline distT="0" distB="0" distL="0" distR="0" wp14:anchorId="0199B3A5" wp14:editId="23564388">
-            <wp:extent cx="5731510" cy="4755515"/>
-            <wp:effectExtent l="0" t="0" r="2540" b="6985"/>
-            <wp:docPr id="766145900" name="Picture 11"/>
+          <wp:inline distT="0" distB="0" distL="0" distR="0" wp14:anchorId="2347366F" wp14:editId="7E001643">
+            <wp:extent cx="8010525" cy="6572250"/>
+            <wp:effectExtent l="0" t="0" r="9525" b="0"/>
+            <wp:docPr id="766391960" name="Picture 1"/>
             <wp:cNvGraphicFramePr>
               <a:graphicFrameLocks xmlns:a="http://schemas.openxmlformats.org/drawingml/2006/main" noChangeAspect="1"/>
             </wp:cNvGraphicFramePr>
@@ -7495,36 +7829,23 @@
               <a:graphicData uri="http://schemas.openxmlformats.org/drawingml/2006/picture">
                 <pic:pic xmlns:pic="http://schemas.openxmlformats.org/drawingml/2006/picture">
                   <pic:nvPicPr>
-                    <pic:cNvPr id="0" name="Picture 21"/>
-                    <pic:cNvPicPr>
-                      <a:picLocks noChangeAspect="1" noChangeArrowheads="1"/>
-                    </pic:cNvPicPr>
+                    <pic:cNvPr id="766391960" name=""/>
+                    <pic:cNvPicPr/>
                   </pic:nvPicPr>
                   <pic:blipFill>
-                    <a:blip r:embed="rId19">
-                      <a:extLst>
-                        <a:ext uri="{28A0092B-C50C-407E-A947-70E740481C1C}">
-                          <a14:useLocalDpi xmlns:a14="http://schemas.microsoft.com/office/drawing/2010/main" val="0"/>
-                        </a:ext>
-                      </a:extLst>
-                    </a:blip>
-                    <a:srcRect/>
+                    <a:blip r:embed="rId19"/>
                     <a:stretch>
                       <a:fillRect/>
                     </a:stretch>
                   </pic:blipFill>
-                  <pic:spPr bwMode="auto">
+                  <pic:spPr>
                     <a:xfrm>
                       <a:off x="0" y="0"/>
-                      <a:ext cx="5731510" cy="4755515"/>
+                      <a:ext cx="8010525" cy="6572250"/>
                     </a:xfrm>
                     <a:prstGeom prst="rect">
                       <a:avLst/>
                     </a:prstGeom>
-                    <a:noFill/>
-                    <a:ln>
-                      <a:noFill/>
-                    </a:ln>
                   </pic:spPr>
                 </pic:pic>
               </a:graphicData>
@@ -7532,14 +7853,134 @@
           </wp:inline>
         </w:drawing>
       </w:r>
-      <w:r>
+    </w:p>
+    <w:p>
+      <w:pPr>
+        <w:spacing w:after="300"/>
+        <w:jc w:val="center"/>
         <w:rPr>
           <w:i/>
           <w:iCs/>
-          <w:sz w:val="18"/>
-          <w:szCs w:val="18"/>
-        </w:rPr>
-        <w:t>Figure 9.2: Attention heatmap for a correctly classified Irrelevant tweet (predicted: Irrelevant).</w:t>
+          <w:sz w:val="24"/>
+          <w:szCs w:val="24"/>
+        </w:rPr>
+      </w:pPr>
+    </w:p>
+    <w:p>
+      <w:pPr>
+        <w:spacing w:after="300"/>
+        <w:jc w:val="center"/>
+        <w:rPr>
+          <w:i/>
+          <w:iCs/>
+          <w:sz w:val="24"/>
+          <w:szCs w:val="24"/>
+        </w:rPr>
+      </w:pPr>
+      <w:r>
+        <w:rPr>
+          <w:i/>
+          <w:iCs/>
+          <w:sz w:val="24"/>
+          <w:szCs w:val="24"/>
+        </w:rPr>
+        <w:t>Figure 9.</w:t>
+      </w:r>
+      <w:r>
+        <w:rPr>
+          <w:i/>
+          <w:iCs/>
+          <w:sz w:val="24"/>
+          <w:szCs w:val="24"/>
+        </w:rPr>
+        <w:t>3</w:t>
+      </w:r>
+      <w:r>
+        <w:rPr>
+          <w:i/>
+          <w:iCs/>
+          <w:sz w:val="24"/>
+          <w:szCs w:val="24"/>
+        </w:rPr>
+        <w:t>: Top Words by Attention</w:t>
+      </w:r>
+      <w:r>
+        <w:rPr>
+          <w:i/>
+          <w:iCs/>
+          <w:sz w:val="24"/>
+          <w:szCs w:val="24"/>
+        </w:rPr>
+        <w:t xml:space="preserve"> -</w:t>
+      </w:r>
+      <w:r>
+        <w:rPr>
+          <w:i/>
+          <w:iCs/>
+          <w:sz w:val="24"/>
+          <w:szCs w:val="24"/>
+        </w:rPr>
+        <w:t xml:space="preserve"> Relevant Tweet</w:t>
+      </w:r>
+      <w:r>
+        <w:rPr>
+          <w:i/>
+          <w:iCs/>
+          <w:sz w:val="24"/>
+          <w:szCs w:val="24"/>
+        </w:rPr>
+        <w:t>s</w:t>
+      </w:r>
+    </w:p>
+    <w:p>
+      <w:pPr>
+        <w:spacing w:after="300"/>
+        <w:jc w:val="center"/>
+        <w:rPr>
+          <w:sz w:val="24"/>
+          <w:szCs w:val="24"/>
+        </w:rPr>
+      </w:pPr>
+      <w:r>
+        <w:rPr>
+          <w:sz w:val="24"/>
+          <w:szCs w:val="24"/>
+        </w:rPr>
+        <w:drawing>
+          <wp:inline distT="0" distB="0" distL="0" distR="0" wp14:anchorId="6F12ADC7" wp14:editId="3AA1AEB8">
+            <wp:extent cx="6572250" cy="3714750"/>
+            <wp:effectExtent l="0" t="0" r="0" b="0"/>
+            <wp:docPr id="206012878" name="Picture 1"/>
+            <wp:cNvGraphicFramePr>
+              <a:graphicFrameLocks xmlns:a="http://schemas.openxmlformats.org/drawingml/2006/main" noChangeAspect="1"/>
+            </wp:cNvGraphicFramePr>
+            <a:graphic xmlns:a="http://schemas.openxmlformats.org/drawingml/2006/main">
+              <a:graphicData uri="http://schemas.openxmlformats.org/drawingml/2006/picture">
+                <pic:pic xmlns:pic="http://schemas.openxmlformats.org/drawingml/2006/picture">
+                  <pic:nvPicPr>
+                    <pic:cNvPr id="206012878" name=""/>
+                    <pic:cNvPicPr/>
+                  </pic:nvPicPr>
+                  <pic:blipFill>
+                    <a:blip r:embed="rId20"/>
+                    <a:stretch>
+                      <a:fillRect/>
+                    </a:stretch>
+                  </pic:blipFill>
+                  <pic:spPr>
+                    <a:xfrm>
+                      <a:off x="0" y="0"/>
+                      <a:ext cx="6572250" cy="3714750"/>
+                    </a:xfrm>
+                    <a:prstGeom prst="rect">
+                      <a:avLst/>
+                    </a:prstGeom>
+                  </pic:spPr>
+                </pic:pic>
+              </a:graphicData>
+            </a:graphic>
+          </wp:inline>
+        </w:drawing>
       </w:r>
     </w:p>
     <w:p>
@@ -7577,8 +8018,8 @@
         <w:tblLook w:val="04A0" w:firstRow="1" w:lastRow="0" w:firstColumn="1" w:lastColumn="0" w:noHBand="0" w:noVBand="1"/>
       </w:tblPr>
       <w:tblGrid>
-        <w:gridCol w:w="2418"/>
-        <w:gridCol w:w="1249"/>
+        <w:gridCol w:w="2604"/>
+        <w:gridCol w:w="1063"/>
         <w:gridCol w:w="1517"/>
         <w:gridCol w:w="1353"/>
         <w:gridCol w:w="1272"/>
@@ -7590,7 +8031,7 @@
         </w:trPr>
         <w:tc>
           <w:tcPr>
-            <w:tcW w:w="2600" w:type="dxa"/>
+            <w:tcW w:w="2604" w:type="dxa"/>
             <w:shd w:val="clear" w:color="auto" w:fill="DDEBF7"/>
             <w:tcMar>
               <w:top w:w="100" w:type="dxa"/>
@@ -7611,7 +8052,7 @@
         </w:tc>
         <w:tc>
           <w:tcPr>
-            <w:tcW w:w="1300" w:type="dxa"/>
+            <w:tcW w:w="1063" w:type="dxa"/>
             <w:shd w:val="clear" w:color="auto" w:fill="DDEBF7"/>
             <w:tcMar>
               <w:top w:w="100" w:type="dxa"/>
@@ -7632,7 +8073,7 @@
         </w:tc>
         <w:tc>
           <w:tcPr>
-            <w:tcW w:w="1600" w:type="dxa"/>
+            <w:tcW w:w="1517" w:type="dxa"/>
             <w:shd w:val="clear" w:color="auto" w:fill="DDEBF7"/>
             <w:tcMar>
               <w:top w:w="100" w:type="dxa"/>
@@ -7653,7 +8094,7 @@
         </w:tc>
         <w:tc>
           <w:tcPr>
-            <w:tcW w:w="1400" w:type="dxa"/>
+            <w:tcW w:w="1353" w:type="dxa"/>
             <w:shd w:val="clear" w:color="auto" w:fill="DDEBF7"/>
             <w:tcMar>
               <w:top w:w="100" w:type="dxa"/>
@@ -7674,7 +8115,7 @@
         </w:tc>
         <w:tc>
           <w:tcPr>
-            <w:tcW w:w="1300" w:type="dxa"/>
+            <w:tcW w:w="1272" w:type="dxa"/>
             <w:shd w:val="clear" w:color="auto" w:fill="DDEBF7"/>
             <w:tcMar>
               <w:top w:w="100" w:type="dxa"/>
@@ -7695,7 +8136,7 @@
         </w:tc>
         <w:tc>
           <w:tcPr>
-            <w:tcW w:w="1300" w:type="dxa"/>
+            <w:tcW w:w="1191" w:type="dxa"/>
             <w:shd w:val="clear" w:color="auto" w:fill="DDEBF7"/>
             <w:tcMar>
               <w:top w:w="100" w:type="dxa"/>
@@ -7718,7 +8159,7 @@
       <w:tr>
         <w:tc>
           <w:tcPr>
-            <w:tcW w:w="2600" w:type="dxa"/>
+            <w:tcW w:w="2604" w:type="dxa"/>
             <w:tcMar>
               <w:top w:w="100" w:type="dxa"/>
               <w:left w:w="100" w:type="dxa"/>
@@ -7734,7 +8175,7 @@
         </w:tc>
         <w:tc>
           <w:tcPr>
-            <w:tcW w:w="1300" w:type="dxa"/>
+            <w:tcW w:w="1063" w:type="dxa"/>
             <w:tcMar>
               <w:top w:w="100" w:type="dxa"/>
               <w:left w:w="100" w:type="dxa"/>
@@ -7750,7 +8191,7 @@
         </w:tc>
         <w:tc>
           <w:tcPr>
-            <w:tcW w:w="1600" w:type="dxa"/>
+            <w:tcW w:w="1517" w:type="dxa"/>
             <w:tcMar>
               <w:top w:w="100" w:type="dxa"/>
               <w:left w:w="100" w:type="dxa"/>
@@ -7766,7 +8207,7 @@
         </w:tc>
         <w:tc>
           <w:tcPr>
-            <w:tcW w:w="1400" w:type="dxa"/>
+            <w:tcW w:w="1353" w:type="dxa"/>
             <w:tcMar>
               <w:top w:w="100" w:type="dxa"/>
               <w:left w:w="100" w:type="dxa"/>
@@ -7782,7 +8223,7 @@
         </w:tc>
         <w:tc>
           <w:tcPr>
-            <w:tcW w:w="1300" w:type="dxa"/>
+            <w:tcW w:w="1272" w:type="dxa"/>
             <w:tcMar>
               <w:top w:w="100" w:type="dxa"/>
               <w:left w:w="100" w:type="dxa"/>
@@ -7798,7 +8239,7 @@
         </w:tc>
         <w:tc>
           <w:tcPr>
-            <w:tcW w:w="1300" w:type="dxa"/>
+            <w:tcW w:w="1191" w:type="dxa"/>
             <w:tcMar>
               <w:top w:w="100" w:type="dxa"/>
               <w:left w:w="100" w:type="dxa"/>
@@ -7816,7 +8257,7 @@
       <w:tr>
         <w:tc>
           <w:tcPr>
-            <w:tcW w:w="2600" w:type="dxa"/>
+            <w:tcW w:w="2604" w:type="dxa"/>
             <w:tcMar>
               <w:top w:w="100" w:type="dxa"/>
               <w:left w:w="100" w:type="dxa"/>
@@ -7832,7 +8273,7 @@
         </w:tc>
         <w:tc>
           <w:tcPr>
-            <w:tcW w:w="1300" w:type="dxa"/>
+            <w:tcW w:w="1063" w:type="dxa"/>
             <w:tcMar>
               <w:top w:w="100" w:type="dxa"/>
               <w:left w:w="100" w:type="dxa"/>
@@ -7848,7 +8289,7 @@
         </w:tc>
         <w:tc>
           <w:tcPr>
-            <w:tcW w:w="1600" w:type="dxa"/>
+            <w:tcW w:w="1517" w:type="dxa"/>
             <w:tcMar>
               <w:top w:w="100" w:type="dxa"/>
               <w:left w:w="100" w:type="dxa"/>
@@ -7864,7 +8305,7 @@
         </w:tc>
         <w:tc>
           <w:tcPr>
-            <w:tcW w:w="1400" w:type="dxa"/>
+            <w:tcW w:w="1353" w:type="dxa"/>
             <w:tcMar>
               <w:top w:w="100" w:type="dxa"/>
               <w:left w:w="100" w:type="dxa"/>
@@ -7880,7 +8321,7 @@
         </w:tc>
         <w:tc>
           <w:tcPr>
-            <w:tcW w:w="1300" w:type="dxa"/>
+            <w:tcW w:w="1272" w:type="dxa"/>
             <w:tcMar>
               <w:top w:w="100" w:type="dxa"/>
               <w:left w:w="100" w:type="dxa"/>
@@ -7896,7 +8337,7 @@
         </w:tc>
         <w:tc>
           <w:tcPr>
-            <w:tcW w:w="1300" w:type="dxa"/>
+            <w:tcW w:w="1191" w:type="dxa"/>
             <w:tcMar>
               <w:top w:w="100" w:type="dxa"/>
               <w:left w:w="100" w:type="dxa"/>
@@ -7914,7 +8355,7 @@
       <w:tr>
         <w:tc>
           <w:tcPr>
-            <w:tcW w:w="2600" w:type="dxa"/>
+            <w:tcW w:w="2604" w:type="dxa"/>
             <w:tcMar>
               <w:top w:w="100" w:type="dxa"/>
               <w:left w:w="100" w:type="dxa"/>
@@ -7930,7 +8371,7 @@
         </w:tc>
         <w:tc>
           <w:tcPr>
-            <w:tcW w:w="1300" w:type="dxa"/>
+            <w:tcW w:w="1063" w:type="dxa"/>
             <w:tcMar>
               <w:top w:w="100" w:type="dxa"/>
               <w:left w:w="100" w:type="dxa"/>
@@ -7946,7 +8387,7 @@
         </w:tc>
         <w:tc>
           <w:tcPr>
-            <w:tcW w:w="1600" w:type="dxa"/>
+            <w:tcW w:w="1517" w:type="dxa"/>
             <w:tcMar>
               <w:top w:w="100" w:type="dxa"/>
               <w:left w:w="100" w:type="dxa"/>
@@ -7962,7 +8403,7 @@
         </w:tc>
         <w:tc>
           <w:tcPr>
-            <w:tcW w:w="1400" w:type="dxa"/>
+            <w:tcW w:w="1353" w:type="dxa"/>
             <w:tcMar>
               <w:top w:w="100" w:type="dxa"/>
               <w:left w:w="100" w:type="dxa"/>
@@ -7978,7 +8419,7 @@
         </w:tc>
         <w:tc>
           <w:tcPr>
-            <w:tcW w:w="1300" w:type="dxa"/>
+            <w:tcW w:w="1272" w:type="dxa"/>
             <w:tcMar>
               <w:top w:w="100" w:type="dxa"/>
               <w:left w:w="100" w:type="dxa"/>
@@ -7994,7 +8435,7 @@
         </w:tc>
         <w:tc>
           <w:tcPr>
-            <w:tcW w:w="1300" w:type="dxa"/>
+            <w:tcW w:w="1191" w:type="dxa"/>
             <w:tcMar>
               <w:top w:w="100" w:type="dxa"/>
               <w:left w:w="100" w:type="dxa"/>
@@ -8014,6 +8455,37 @@
       <w:pPr>
         <w:spacing w:after="100"/>
       </w:pPr>
+    </w:p>
+    <w:p>
+      <w:pPr>
+        <w:spacing w:after="100"/>
+        <w:jc w:val="center"/>
+        <w:rPr>
+          <w:i/>
+          <w:iCs/>
+        </w:rPr>
+      </w:pPr>
+      <w:r>
+        <w:rPr>
+          <w:i/>
+          <w:iCs/>
+        </w:rPr>
+        <w:t>Figure 9.</w:t>
+      </w:r>
+      <w:r>
+        <w:rPr>
+          <w:i/>
+          <w:iCs/>
+        </w:rPr>
+        <w:t>4</w:t>
+      </w:r>
+      <w:r>
+        <w:rPr>
+          <w:i/>
+          <w:iCs/>
+        </w:rPr>
+        <w:t>: ROC Curve Comparison</w:t>
+      </w:r>
     </w:p>
     <w:p>
       <w:pPr>
@@ -8042,7 +8514,7 @@
                     </pic:cNvPicPr>
                   </pic:nvPicPr>
                   <pic:blipFill>
-                    <a:blip r:embed="rId20">
+                    <a:blip r:embed="rId21">
                       <a:extLst>
                         <a:ext uri="{28A0092B-C50C-407E-A947-70E740481C1C}">
                           <a14:useLocalDpi xmlns:a14="http://schemas.microsoft.com/office/drawing/2010/main" val="0"/>
@@ -11474,6 +11946,7 @@
   <w:style w:type="paragraph" w:default="1" w:styleId="Normal">
     <w:name w:val="Normal"/>
     <w:qFormat/>
+    <w:rsid w:val="003A6AD9"/>
   </w:style>
   <w:style w:type="paragraph" w:styleId="Heading1">
     <w:name w:val="heading 1"/>
@@ -11560,7 +12033,6 @@
   <w:style w:type="character" w:default="1" w:styleId="DefaultParagraphFont">
     <w:name w:val="Default Paragraph Font"/>
     <w:uiPriority w:val="1"/>
-    <w:semiHidden/>
     <w:unhideWhenUsed/>
   </w:style>
   <w:style w:type="table" w:default="1" w:styleId="TableNormal">

</xml_diff>

<commit_message>
Task 9: correcting ROC numbers
</commit_message>
<xml_diff>
--- a/Assessment2-Report.docx
+++ b/Assessment2-Report.docx
@@ -8736,7 +8736,107 @@
         <w:spacing w:after="150"/>
       </w:pPr>
       <w:r>
-        <w:t>For the Relevant tweet, attention concentrates on "green", "hydrogen", "blue", and "fossil fuels” energy-related modifiers surrounding the keyword "hydrogen" that together signal the clean-energy topic. For the Irrelevant tweet, attention shifts decisively to "responsive", "html", and "template” web-design terminology that signals "hydrogen" is being used here as a software/theme name rather than referring to the energy source. This demonstrates that the model is not simply keying off the presence of the word "hydrogen" (which appears in every tweet in this dataset by construction) but is genuinely using surrounding context to disambiguate its meaning.</w:t>
+        <w:t>For the Relevant tweet, attention concentrates on "</w:t>
+      </w:r>
+      <w:r>
+        <w:rPr>
+          <w:i/>
+          <w:iCs/>
+        </w:rPr>
+        <w:t>green</w:t>
+      </w:r>
+      <w:r>
+        <w:t>", "</w:t>
+      </w:r>
+      <w:r>
+        <w:rPr>
+          <w:i/>
+          <w:iCs/>
+        </w:rPr>
+        <w:t>hydrogen</w:t>
+      </w:r>
+      <w:r>
+        <w:t>", "</w:t>
+      </w:r>
+      <w:r>
+        <w:rPr>
+          <w:i/>
+          <w:iCs/>
+        </w:rPr>
+        <w:t>blue</w:t>
+      </w:r>
+      <w:r>
+        <w:t>", and "</w:t>
+      </w:r>
+      <w:r>
+        <w:rPr>
+          <w:i/>
+          <w:iCs/>
+        </w:rPr>
+        <w:t>fossil fuels</w:t>
+      </w:r>
+      <w:r>
+        <w:t>” energy-related modifiers surrounding the keyword "</w:t>
+      </w:r>
+      <w:r>
+        <w:rPr>
+          <w:i/>
+          <w:iCs/>
+        </w:rPr>
+        <w:t>hydrogen</w:t>
+      </w:r>
+      <w:r>
+        <w:t>" that together signal the clean-energy topic. For the Irrelevant tweet, attention shifts decisively to "</w:t>
+      </w:r>
+      <w:r>
+        <w:rPr>
+          <w:i/>
+          <w:iCs/>
+        </w:rPr>
+        <w:t>responsive</w:t>
+      </w:r>
+      <w:r>
+        <w:t>", "</w:t>
+      </w:r>
+      <w:r>
+        <w:rPr>
+          <w:i/>
+          <w:iCs/>
+        </w:rPr>
+        <w:t>html</w:t>
+      </w:r>
+      <w:r>
+        <w:t>", and "</w:t>
+      </w:r>
+      <w:r>
+        <w:rPr>
+          <w:i/>
+          <w:iCs/>
+        </w:rPr>
+        <w:t>template</w:t>
+      </w:r>
+      <w:r>
+        <w:t>” web-design terminology that signals "</w:t>
+      </w:r>
+      <w:r>
+        <w:rPr>
+          <w:i/>
+          <w:iCs/>
+        </w:rPr>
+        <w:t>hydrogen</w:t>
+      </w:r>
+      <w:r>
+        <w:t>" is being used here as a software/theme name rather than referring to the energy source. This demonstrates that the model is not simply keying off the presence of the word "</w:t>
+      </w:r>
+      <w:r>
+        <w:rPr>
+          <w:i/>
+          <w:iCs/>
+        </w:rPr>
+        <w:t>hydrogen</w:t>
+      </w:r>
+      <w:r>
+        <w:t>" (which appears in every tweet in this dataset by construction) but is genuinely using surrounding context to disambiguate its meaning.</w:t>
       </w:r>
     </w:p>
     <w:p>
@@ -9006,7 +9106,7 @@
           </w:tcPr>
           <w:p>
             <w:r>
-              <w:t>0.963</w:t>
+              <w:t>0.970</w:t>
             </w:r>
           </w:p>
         </w:tc>
@@ -9220,7 +9320,7 @@
           </w:tcPr>
           <w:p>
             <w:r>
-              <w:t>0.985</w:t>
+              <w:t>0.981</w:t>
             </w:r>
           </w:p>
         </w:tc>
@@ -9335,21 +9435,29 @@
         <w:spacing w:after="150"/>
       </w:pPr>
       <w:r>
-        <w:t xml:space="preserve">BERT outperformed the TF-IDF logistic regression baseline across every metric: test accuracy rose from 89.67% to 93.33%, and ROC-AUC from 0.963 to 0.985. This is expected because every tweet in this dataset contains the keyword "hydrogen" by construction, so the discriminative signal depends entirely on surrounding context (e.g., "green/blue hydrogen" for clean energy vs. "hydrogen responsive template" for web design). The logistic regression model treats text as an unordered bag of TF-IDF weighted words and cannot capture this context-dependent meaning, whereas BERT's self-attention mechanism explicitly models bidirectional dependencies between words. </w:t>
-      </w:r>
-      <w:proofErr w:type="spellStart"/>
-      <w:r>
-        <w:t>BERTweet's</w:t>
-      </w:r>
-      <w:proofErr w:type="spellEnd"/>
+        <w:t xml:space="preserve">BERT outperformed the TF-IDF logistic regression baseline across every metric: test accuracy rose from 89.67% to 93.33%, and ROC-AUC from </w:t>
+      </w:r>
+      <w:r>
+        <w:t>0.970</w:t>
+      </w:r>
+      <w:r>
+        <w:t xml:space="preserve"> to </w:t>
+      </w:r>
+      <w:r>
+        <w:t>0.981</w:t>
+      </w:r>
+      <w:r>
+        <w:t xml:space="preserve">. This is expected because every tweet in this dataset contains the keyword "hydrogen" by construction, so the discriminative signal depends entirely on surrounding context (e.g., "green/blue hydrogen" for clean energy vs. "hydrogen responsive template" for web design). The logistic regression model treats text as an unordered bag of TF-IDF weighted words and cannot capture this context-dependent meaning, whereas BERT's self-attention mechanism explicitly models bidirectional dependencies between words. </w:t>
+      </w:r>
+      <w:r>
+        <w:t>BER Tweet’s</w:t>
+      </w:r>
       <w:r>
         <w:t xml:space="preserve"> further improvement over </w:t>
       </w:r>
-      <w:proofErr w:type="spellStart"/>
-      <w:r>
-        <w:t>bert</w:t>
-      </w:r>
-      <w:proofErr w:type="spellEnd"/>
+      <w:r>
+        <w:t>Bert</w:t>
+      </w:r>
       <w:r>
         <w:t>-base-uncased is attributable to its vocabulary and pretraining being specifically matched to informal, social-media text.</w:t>
       </w:r>

</xml_diff>

<commit_message>
doc: Figure 7.3: Cluster Distribution Plots
</commit_message>
<xml_diff>
--- a/Assessment2-Report.docx
+++ b/Assessment2-Report.docx
@@ -264,23 +264,13 @@
                 <w:lang w:val="en-GB"/>
               </w:rPr>
             </w:pPr>
-            <w:proofErr w:type="spellStart"/>
             <w:r>
               <w:rPr>
                 <w:rFonts w:eastAsia="SimSun" w:cs="Mangal"/>
                 <w:sz w:val="28"/>
                 <w:szCs w:val="26"/>
               </w:rPr>
-              <w:t>Minchul</w:t>
-            </w:r>
-            <w:proofErr w:type="spellEnd"/>
-            <w:r>
-              <w:rPr>
-                <w:rFonts w:eastAsia="SimSun" w:cs="Mangal"/>
-                <w:sz w:val="28"/>
-                <w:szCs w:val="26"/>
-              </w:rPr>
-              <w:t xml:space="preserve"> Kim</w:t>
+              <w:t>Minchul Kim</w:t>
             </w:r>
           </w:p>
         </w:tc>
@@ -447,7 +437,6 @@
                 <w:lang w:val="en-GB" w:eastAsia="en-IN" w:bidi="mr-IN"/>
               </w:rPr>
             </w:pPr>
-            <w:proofErr w:type="spellStart"/>
             <w:r>
               <w:rPr>
                 <w:rFonts w:eastAsia="SimSun" w:cs="Mangal"/>
@@ -455,17 +444,7 @@
                 <w:szCs w:val="28"/>
                 <w:lang w:val="en-GB" w:eastAsia="en-IN" w:bidi="mr-IN"/>
               </w:rPr>
-              <w:t>Minchul</w:t>
-            </w:r>
-            <w:proofErr w:type="spellEnd"/>
-            <w:r>
-              <w:rPr>
-                <w:rFonts w:eastAsia="SimSun" w:cs="Mangal"/>
-                <w:sz w:val="28"/>
-                <w:szCs w:val="28"/>
-                <w:lang w:val="en-GB" w:eastAsia="en-IN" w:bidi="mr-IN"/>
-              </w:rPr>
-              <w:t xml:space="preserve"> Kim</w:t>
+              <w:t>Minchul Kim</w:t>
             </w:r>
           </w:p>
         </w:tc>
@@ -762,25 +741,7 @@
           <w:szCs w:val="28"/>
           <w:lang w:val="en-GB"/>
         </w:rPr>
-        <w:t xml:space="preserve">URLs, mentions, and hashtags were stripped from the raw tweets during preprocessing (verified: 0 of the 2,500 tweets in the dataset contain a </w:t>
-      </w:r>
-      <w:proofErr w:type="gramStart"/>
-      <w:r>
-        <w:rPr>
-          <w:sz w:val="28"/>
-          <w:szCs w:val="28"/>
-          <w:lang w:val="en-GB"/>
-        </w:rPr>
-        <w:t>URL, @</w:t>
-      </w:r>
-      <w:proofErr w:type="gramEnd"/>
-      <w:r>
-        <w:rPr>
-          <w:sz w:val="28"/>
-          <w:szCs w:val="28"/>
-          <w:lang w:val="en-GB"/>
-        </w:rPr>
-        <w:t>mention, or hashtag). Emojis and other symbols were not explicitly removed but are effectively excluded from the TF-IDF feature space since the default tokenizer only extracts alphanumeric word tokens. Slang terms (e.g. "lol", "omg", "idk") were left unmodified and are treated as ordinary vocabulary.</w:t>
+        <w:t>URLs, mentions, and hashtags were stripped from the raw tweets during preprocessing (verified: 0 of the 2,500 tweets in the dataset contain a URL, @mention, or hashtag). Emojis and other symbols were not explicitly removed but are effectively excluded from the TF-IDF feature space since the default tokenizer only extracts alphanumeric word tokens. Slang terms (e.g. "lol", "omg", "idk") were left unmodified and are treated as ordinary vocabulary.</w:t>
       </w:r>
     </w:p>
     <w:p>
@@ -922,23 +883,7 @@
           <w:sz w:val="28"/>
           <w:szCs w:val="28"/>
         </w:rPr>
-        <w:t xml:space="preserve">During our evaluation, we discussed the trade-off between standardization and maintaining data sparsity. While standardizing the TF-IDF matrix to zero mean and unit variance breaks its original sparse </w:t>
-      </w:r>
-      <w:proofErr w:type="gramStart"/>
-      <w:r>
-        <w:rPr>
-          <w:sz w:val="28"/>
-          <w:szCs w:val="28"/>
-        </w:rPr>
-        <w:t>structure—</w:t>
-      </w:r>
-      <w:proofErr w:type="gramEnd"/>
-      <w:r>
-        <w:rPr>
-          <w:sz w:val="28"/>
-          <w:szCs w:val="28"/>
-        </w:rPr>
-        <w:t>increasing memory overhead—we think it is essential because PCA is scale-sensitive; without it, terms with inherently higher frequencies would disproportionately skew the principal components.</w:t>
+        <w:t>During our evaluation, we discussed the trade-off between standardization and maintaining data sparsity. While standardizing the TF-IDF matrix to zero mean and unit variance breaks its original sparse structure—increasing memory overhead—we think it is essential because PCA is scale-sensitive; without it, terms with inherently higher frequencies would disproportionately skew the principal components.</w:t>
       </w:r>
     </w:p>
     <w:p>
@@ -1028,23 +973,7 @@
           <w:sz w:val="28"/>
           <w:szCs w:val="28"/>
         </w:rPr>
-        <w:t xml:space="preserve">Dimensions tested: 2, 10, 50, 100, 250, 500, 750, 1000 (using a 500-tweet subsample of the standardized TF-IDF matrix for computational efficiency). For each dimensionality, pairwise Euclidean distances between all sample pairs were computed and </w:t>
-      </w:r>
-      <w:proofErr w:type="gramStart"/>
-      <w:r>
-        <w:rPr>
-          <w:sz w:val="28"/>
-          <w:szCs w:val="28"/>
-        </w:rPr>
-        <w:t>averaged</w:t>
-      </w:r>
-      <w:proofErr w:type="gramEnd"/>
-      <w:r>
-        <w:rPr>
-          <w:sz w:val="28"/>
-          <w:szCs w:val="28"/>
-        </w:rPr>
-        <w:t>.</w:t>
+        <w:t>Dimensions tested: 2, 10, 50, 100, 250, 500, 750, 1000 (using a 500-tweet subsample of the standardized TF-IDF matrix for computational efficiency). For each dimensionality, pairwise Euclidean distances between all sample pairs were computed and averaged.</w:t>
       </w:r>
     </w:p>
     <w:p>
@@ -2647,25 +2576,7 @@
           <w:szCs w:val="28"/>
           <w:lang w:val="en-GB"/>
         </w:rPr>
-        <w:t xml:space="preserve">The 3D plot shows one big, crowded cloud </w:t>
-      </w:r>
-      <w:proofErr w:type="spellStart"/>
-      <w:r>
-        <w:rPr>
-          <w:sz w:val="28"/>
-          <w:szCs w:val="28"/>
-          <w:lang w:val="en-GB"/>
-        </w:rPr>
-        <w:t>centered</w:t>
-      </w:r>
-      <w:proofErr w:type="spellEnd"/>
-      <w:r>
-        <w:rPr>
-          <w:sz w:val="28"/>
-          <w:szCs w:val="28"/>
-          <w:lang w:val="en-GB"/>
-        </w:rPr>
-        <w:t xml:space="preserve"> in the middle. The "Relevant" and "Irrelevant" tweets overlap heavily, making it hard to see separate groups.</w:t>
+        <w:t>The 3D plot shows one big, crowded cloud centered in the middle. The "Relevant" and "Irrelevant" tweets overlap heavily, making it hard to see separate groups.</w:t>
       </w:r>
     </w:p>
     <w:p>
@@ -2971,7 +2882,6 @@
         </w:rPr>
         <w:t xml:space="preserve">Removed rows with a </w:t>
       </w:r>
-      <w:proofErr w:type="spellStart"/>
       <w:r>
         <w:rPr>
           <w:i/>
@@ -2982,7 +2892,6 @@
         </w:rPr>
         <w:t>MMRAcquisitionAuctionAveragePrice</w:t>
       </w:r>
-      <w:proofErr w:type="spellEnd"/>
       <w:r>
         <w:rPr>
           <w:sz w:val="28"/>
@@ -3030,7 +2939,6 @@
         </w:rPr>
         <w:t xml:space="preserve">K-Means relies on Euclidean distance, so a handful of extreme readings (e.g. a ~480,000-mile odometer) can pull centroids away from the bulk of the data. Values in </w:t>
       </w:r>
-      <w:proofErr w:type="spellStart"/>
       <w:r>
         <w:rPr>
           <w:i/>
@@ -3041,7 +2949,6 @@
         </w:rPr>
         <w:t>VehOdo</w:t>
       </w:r>
-      <w:proofErr w:type="spellEnd"/>
       <w:r>
         <w:rPr>
           <w:sz w:val="28"/>
@@ -3050,7 +2957,6 @@
         </w:rPr>
         <w:t xml:space="preserve">, </w:t>
       </w:r>
-      <w:proofErr w:type="spellStart"/>
       <w:r>
         <w:rPr>
           <w:i/>
@@ -3061,7 +2967,6 @@
         </w:rPr>
         <w:t>MMRAcquisitionAuctionAveragePrice</w:t>
       </w:r>
-      <w:proofErr w:type="spellEnd"/>
       <w:r>
         <w:rPr>
           <w:sz w:val="28"/>
@@ -3070,7 +2975,6 @@
         </w:rPr>
         <w:t xml:space="preserve">, and </w:t>
       </w:r>
-      <w:proofErr w:type="spellStart"/>
       <w:r>
         <w:rPr>
           <w:i/>
@@ -3081,7 +2985,6 @@
         </w:rPr>
         <w:t>WarrantyCost</w:t>
       </w:r>
-      <w:proofErr w:type="spellEnd"/>
       <w:r>
         <w:rPr>
           <w:sz w:val="28"/>
@@ -3129,7 +3032,6 @@
         </w:rPr>
         <w:t xml:space="preserve">Clustering algorithms (like K-Means) use Euclidean distance. Variables like </w:t>
       </w:r>
-      <w:proofErr w:type="spellStart"/>
       <w:r>
         <w:rPr>
           <w:i/>
@@ -3140,7 +3042,6 @@
         </w:rPr>
         <w:t>VehOdo</w:t>
       </w:r>
-      <w:proofErr w:type="spellEnd"/>
       <w:r>
         <w:rPr>
           <w:sz w:val="28"/>
@@ -3149,7 +3050,6 @@
         </w:rPr>
         <w:t xml:space="preserve"> (tens of thousands) would completely dominate </w:t>
       </w:r>
-      <w:proofErr w:type="spellStart"/>
       <w:r>
         <w:rPr>
           <w:i/>
@@ -3160,7 +3060,6 @@
         </w:rPr>
         <w:t>WarrantyCost</w:t>
       </w:r>
-      <w:proofErr w:type="spellEnd"/>
       <w:r>
         <w:rPr>
           <w:sz w:val="28"/>
@@ -3251,7 +3150,6 @@
         </w:rPr>
         <w:t xml:space="preserve">Attributes used: </w:t>
       </w:r>
-      <w:proofErr w:type="spellStart"/>
       <w:r>
         <w:rPr>
           <w:i/>
@@ -3261,7 +3159,6 @@
         </w:rPr>
         <w:t>VehOdo</w:t>
       </w:r>
-      <w:proofErr w:type="spellEnd"/>
       <w:r>
         <w:rPr>
           <w:sz w:val="28"/>
@@ -3269,7 +3166,6 @@
         </w:rPr>
         <w:t xml:space="preserve">, </w:t>
       </w:r>
-      <w:proofErr w:type="spellStart"/>
       <w:r>
         <w:rPr>
           <w:i/>
@@ -3279,7 +3175,6 @@
         </w:rPr>
         <w:t>MMRAcquisitionAuctionAveragePrice</w:t>
       </w:r>
-      <w:proofErr w:type="spellEnd"/>
       <w:r>
         <w:rPr>
           <w:sz w:val="28"/>
@@ -3287,7 +3182,6 @@
         </w:rPr>
         <w:t xml:space="preserve">, </w:t>
       </w:r>
-      <w:proofErr w:type="spellStart"/>
       <w:r>
         <w:rPr>
           <w:i/>
@@ -3297,7 +3191,6 @@
         </w:rPr>
         <w:t>WarrantyCost</w:t>
       </w:r>
-      <w:proofErr w:type="spellEnd"/>
       <w:r>
         <w:rPr>
           <w:sz w:val="28"/>
@@ -3445,39 +3338,7 @@
           <w:sz w:val="28"/>
           <w:szCs w:val="28"/>
         </w:rPr>
-        <w:t xml:space="preserve">K = 3 was selected: the rate of inertia </w:t>
-      </w:r>
-      <w:proofErr w:type="gramStart"/>
-      <w:r>
-        <w:rPr>
-          <w:sz w:val="28"/>
-          <w:szCs w:val="28"/>
-        </w:rPr>
-        <w:t>decrease</w:t>
-      </w:r>
-      <w:proofErr w:type="gramEnd"/>
-      <w:r>
-        <w:rPr>
-          <w:sz w:val="28"/>
-          <w:szCs w:val="28"/>
-        </w:rPr>
-        <w:t xml:space="preserve"> </w:t>
-      </w:r>
-      <w:proofErr w:type="gramStart"/>
-      <w:r>
-        <w:rPr>
-          <w:sz w:val="28"/>
-          <w:szCs w:val="28"/>
-        </w:rPr>
-        <w:t>slows</w:t>
-      </w:r>
-      <w:proofErr w:type="gramEnd"/>
-      <w:r>
-        <w:rPr>
-          <w:sz w:val="28"/>
-          <w:szCs w:val="28"/>
-        </w:rPr>
-        <w:t xml:space="preserve"> noticeably beyond k = 3 (diminishing returns from further splitting), while the silhouette score remains reasonable at this value, giving a good balance between cluster compactness/separation and model simplicity.</w:t>
+        <w:t>K = 3 was selected: the rate of inertia decrease slows noticeably beyond k = 3 (diminishing returns from further splitting), while the silhouette score remains reasonable at this value, giving a good balance between cluster compactness/separation and model simplicity.</w:t>
       </w:r>
     </w:p>
     <w:p>
@@ -3573,7 +3434,6 @@
                 <w:szCs w:val="28"/>
               </w:rPr>
             </w:pPr>
-            <w:proofErr w:type="spellStart"/>
             <w:r>
               <w:rPr>
                 <w:b/>
@@ -3583,7 +3443,6 @@
               </w:rPr>
               <w:t>VehOdo</w:t>
             </w:r>
-            <w:proofErr w:type="spellEnd"/>
           </w:p>
         </w:tc>
         <w:tc>
@@ -3604,7 +3463,6 @@
                 <w:szCs w:val="28"/>
               </w:rPr>
             </w:pPr>
-            <w:proofErr w:type="spellStart"/>
             <w:r>
               <w:rPr>
                 <w:b/>
@@ -3614,7 +3472,6 @@
               </w:rPr>
               <w:t>MMRAcquisitionAuctionAveragePrice</w:t>
             </w:r>
-            <w:proofErr w:type="spellEnd"/>
           </w:p>
         </w:tc>
         <w:tc>
@@ -3635,7 +3492,6 @@
                 <w:szCs w:val="28"/>
               </w:rPr>
             </w:pPr>
-            <w:proofErr w:type="spellStart"/>
             <w:r>
               <w:rPr>
                 <w:b/>
@@ -3645,7 +3501,6 @@
               </w:rPr>
               <w:t>WarrantyCost</w:t>
             </w:r>
-            <w:proofErr w:type="spellEnd"/>
           </w:p>
         </w:tc>
         <w:tc>
@@ -4231,7 +4086,6 @@
         </w:rPr>
         <w:t xml:space="preserve"> is binary and was standardized alongside the continuous features, K-Means separates on it almost perfectly (every cluster mean above is exactly 0.0 or 1.0). This means the model is not so much "discovering" a bad-buy segment as it is splitting the data on the known label first and then finding mileage/price/warranty structure within each side. The real profiling value here comes from how </w:t>
       </w:r>
-      <w:proofErr w:type="spellStart"/>
       <w:r>
         <w:rPr>
           <w:i/>
@@ -4241,7 +4095,6 @@
         </w:rPr>
         <w:t>VehOdo</w:t>
       </w:r>
-      <w:proofErr w:type="spellEnd"/>
       <w:r>
         <w:rPr>
           <w:sz w:val="28"/>
@@ -4249,7 +4102,6 @@
         </w:rPr>
         <w:t xml:space="preserve">, </w:t>
       </w:r>
-      <w:proofErr w:type="spellStart"/>
       <w:r>
         <w:rPr>
           <w:i/>
@@ -4259,7 +4111,6 @@
         </w:rPr>
         <w:t>MMRAcquisitionAuctionAveragePrice</w:t>
       </w:r>
-      <w:proofErr w:type="spellEnd"/>
       <w:r>
         <w:rPr>
           <w:sz w:val="28"/>
@@ -4267,7 +4118,6 @@
         </w:rPr>
         <w:t xml:space="preserve">, and </w:t>
       </w:r>
-      <w:proofErr w:type="spellStart"/>
       <w:r>
         <w:rPr>
           <w:i/>
@@ -4277,7 +4127,6 @@
         </w:rPr>
         <w:t>WarrantyCost</w:t>
       </w:r>
-      <w:proofErr w:type="spellEnd"/>
       <w:r>
         <w:rPr>
           <w:sz w:val="28"/>
@@ -4318,7 +4167,6 @@
         </w:rPr>
         <w:t xml:space="preserve">Standardization was applied prior to clustering (Section 7.1). Without it, </w:t>
       </w:r>
-      <w:proofErr w:type="spellStart"/>
       <w:r>
         <w:rPr>
           <w:i/>
@@ -4328,7 +4176,6 @@
         </w:rPr>
         <w:t>VehOdo</w:t>
       </w:r>
-      <w:proofErr w:type="spellEnd"/>
       <w:r>
         <w:rPr>
           <w:sz w:val="28"/>
@@ -4336,7 +4183,6 @@
         </w:rPr>
         <w:t xml:space="preserve"> (with values in the tens of thousands) would dominate the Euclidean distance calculation relative to </w:t>
       </w:r>
-      <w:proofErr w:type="spellStart"/>
       <w:r>
         <w:rPr>
           <w:i/>
@@ -4346,7 +4192,6 @@
         </w:rPr>
         <w:t>WarrantyCost</w:t>
       </w:r>
-      <w:proofErr w:type="spellEnd"/>
       <w:r>
         <w:rPr>
           <w:sz w:val="28"/>
@@ -4406,87 +4251,7 @@
           <w:sz w:val="28"/>
           <w:szCs w:val="28"/>
         </w:rPr>
-        <w:t xml:space="preserve">Figure 7.2: </w:t>
-      </w:r>
-      <w:proofErr w:type="spellStart"/>
-      <w:r>
-        <w:rPr>
-          <w:i/>
-          <w:iCs/>
-          <w:sz w:val="28"/>
-          <w:szCs w:val="28"/>
-        </w:rPr>
-        <w:t>Pairplot</w:t>
-      </w:r>
-      <w:proofErr w:type="spellEnd"/>
-      <w:r>
-        <w:rPr>
-          <w:i/>
-          <w:iCs/>
-          <w:sz w:val="28"/>
-          <w:szCs w:val="28"/>
-        </w:rPr>
-        <w:t xml:space="preserve"> of </w:t>
-      </w:r>
-      <w:proofErr w:type="spellStart"/>
-      <w:r>
-        <w:rPr>
-          <w:i/>
-          <w:iCs/>
-          <w:sz w:val="28"/>
-          <w:szCs w:val="28"/>
-        </w:rPr>
-        <w:t>VehOdo</w:t>
-      </w:r>
-      <w:proofErr w:type="spellEnd"/>
-      <w:r>
-        <w:rPr>
-          <w:i/>
-          <w:iCs/>
-          <w:sz w:val="28"/>
-          <w:szCs w:val="28"/>
-        </w:rPr>
-        <w:t xml:space="preserve">, </w:t>
-      </w:r>
-      <w:proofErr w:type="spellStart"/>
-      <w:r>
-        <w:rPr>
-          <w:i/>
-          <w:iCs/>
-          <w:sz w:val="28"/>
-          <w:szCs w:val="28"/>
-        </w:rPr>
-        <w:t>AuctionAvgPrice</w:t>
-      </w:r>
-      <w:proofErr w:type="spellEnd"/>
-      <w:r>
-        <w:rPr>
-          <w:i/>
-          <w:iCs/>
-          <w:sz w:val="28"/>
-          <w:szCs w:val="28"/>
-        </w:rPr>
-        <w:t xml:space="preserve">, </w:t>
-      </w:r>
-      <w:proofErr w:type="spellStart"/>
-      <w:r>
-        <w:rPr>
-          <w:i/>
-          <w:iCs/>
-          <w:sz w:val="28"/>
-          <w:szCs w:val="28"/>
-        </w:rPr>
-        <w:t>WarrantyCost</w:t>
-      </w:r>
-      <w:proofErr w:type="spellEnd"/>
-      <w:r>
-        <w:rPr>
-          <w:i/>
-          <w:iCs/>
-          <w:sz w:val="28"/>
-          <w:szCs w:val="28"/>
-        </w:rPr>
-        <w:t xml:space="preserve"> by cluster (2,000-row sample).</w:t>
+        <w:t>Figure 7.2: Pairplot of VehOdo, AuctionAvgPrice, WarrantyCost by cluster (2,000-row sample).</w:t>
       </w:r>
     </w:p>
     <w:p>
@@ -4546,6 +4311,64 @@
         <w:spacing w:after="300"/>
         <w:jc w:val="center"/>
         <w:rPr>
+          <w:i/>
+          <w:iCs/>
+          <w:sz w:val="28"/>
+          <w:szCs w:val="28"/>
+        </w:rPr>
+      </w:pPr>
+      <w:r>
+        <w:rPr>
+          <w:i/>
+          <w:iCs/>
+          <w:sz w:val="28"/>
+          <w:szCs w:val="28"/>
+        </w:rPr>
+        <w:t>Figure 7.</w:t>
+      </w:r>
+      <w:r>
+        <w:rPr>
+          <w:i/>
+          <w:iCs/>
+          <w:sz w:val="28"/>
+          <w:szCs w:val="28"/>
+        </w:rPr>
+        <w:t>3</w:t>
+      </w:r>
+      <w:r>
+        <w:rPr>
+          <w:i/>
+          <w:iCs/>
+          <w:sz w:val="28"/>
+          <w:szCs w:val="28"/>
+        </w:rPr>
+        <w:t xml:space="preserve">: </w:t>
+      </w:r>
+      <w:r>
+        <w:rPr>
+          <w:i/>
+          <w:iCs/>
+          <w:sz w:val="28"/>
+          <w:szCs w:val="28"/>
+        </w:rPr>
+        <w:t>Cluster Distribution Plots</w:t>
+      </w:r>
+    </w:p>
+    <w:p>
+      <w:pPr>
+        <w:spacing w:after="300"/>
+        <w:jc w:val="center"/>
+        <w:rPr>
+          <w:sz w:val="28"/>
+          <w:szCs w:val="28"/>
+        </w:rPr>
+      </w:pPr>
+    </w:p>
+    <w:p>
+      <w:pPr>
+        <w:spacing w:after="300"/>
+        <w:jc w:val="center"/>
+        <w:rPr>
           <w:sz w:val="28"/>
           <w:szCs w:val="28"/>
         </w:rPr>
@@ -5009,7 +4832,6 @@
                 <w:szCs w:val="28"/>
               </w:rPr>
             </w:pPr>
-            <w:proofErr w:type="spellStart"/>
             <w:r>
               <w:rPr>
                 <w:b/>
@@ -5019,7 +4841,6 @@
               </w:rPr>
               <w:t>VehOdo</w:t>
             </w:r>
-            <w:proofErr w:type="spellEnd"/>
           </w:p>
         </w:tc>
         <w:tc>
@@ -5069,7 +4890,6 @@
                 <w:szCs w:val="28"/>
               </w:rPr>
             </w:pPr>
-            <w:proofErr w:type="spellStart"/>
             <w:r>
               <w:rPr>
                 <w:b/>
@@ -5079,7 +4899,6 @@
               </w:rPr>
               <w:t>WarrantyCost</w:t>
             </w:r>
-            <w:proofErr w:type="spellEnd"/>
           </w:p>
         </w:tc>
         <w:tc>
@@ -5907,23 +5726,7 @@
           <w:sz w:val="38"/>
           <w:szCs w:val="38"/>
         </w:rPr>
-        <w:t xml:space="preserve">Task 8: Time Series Forecasting with LSTM on the </w:t>
-      </w:r>
-      <w:proofErr w:type="spellStart"/>
-      <w:r>
-        <w:rPr>
-          <w:sz w:val="38"/>
-          <w:szCs w:val="38"/>
-        </w:rPr>
-        <w:t>AgriWebb</w:t>
-      </w:r>
-      <w:proofErr w:type="spellEnd"/>
-      <w:r>
-        <w:rPr>
-          <w:sz w:val="38"/>
-          <w:szCs w:val="38"/>
-        </w:rPr>
-        <w:t xml:space="preserve"> Dataset</w:t>
+        <w:t>Task 8: Time Series Forecasting with LSTM on the AgriWebb Dataset</w:t>
       </w:r>
     </w:p>
     <w:p>
@@ -6019,23 +5822,7 @@
           <w:sz w:val="28"/>
           <w:szCs w:val="28"/>
         </w:rPr>
-        <w:t xml:space="preserve">Per-paddock StandardScaler: a separate scaler </w:t>
-      </w:r>
-      <w:proofErr w:type="gramStart"/>
-      <w:r>
-        <w:rPr>
-          <w:sz w:val="28"/>
-          <w:szCs w:val="28"/>
-        </w:rPr>
-        <w:t>was fit on</w:t>
-      </w:r>
-      <w:proofErr w:type="gramEnd"/>
-      <w:r>
-        <w:rPr>
-          <w:sz w:val="28"/>
-          <w:szCs w:val="28"/>
-        </w:rPr>
-        <w:t xml:space="preserve"> each paddock's own training portion (mean/std computed independently per paddock) rather than one global scaler. This matters because paddocks differ substantially in baseline TSDM levels and variability (per-paddock training means range from 961 to 1,697, and training standard deviations range from 280 to 969) — a single global scaler would let high-magnitude paddocks dominate the loss function, whereas per-paddock scaling lets the LSTM learn from the shape of each paddock's growth trajectory on a comparable scale.</w:t>
+        <w:t>Per-paddock StandardScaler: a separate scaler was fit on each paddock's own training portion (mean/std computed independently per paddock) rather than one global scaler. This matters because paddocks differ substantially in baseline TSDM levels and variability (per-paddock training means range from 961 to 1,697, and training standard deviations range from 280 to 969) — a single global scaler would let high-magnitude paddocks dominate the loss function, whereas per-paddock scaling lets the LSTM learn from the shape of each paddock's growth trajectory on a comparable scale.</w:t>
       </w:r>
     </w:p>
     <w:p>
@@ -6068,149 +5855,75 @@
           <w:sz w:val="28"/>
           <w:szCs w:val="28"/>
         </w:rPr>
-        <w:t xml:space="preserve">Architecture: </w:t>
-      </w:r>
-      <w:proofErr w:type="spellStart"/>
-      <w:r>
-        <w:rPr>
-          <w:sz w:val="28"/>
-          <w:szCs w:val="28"/>
-        </w:rPr>
-        <w:t>SequenceLSTM</w:t>
-      </w:r>
-      <w:proofErr w:type="spellEnd"/>
-      <w:r>
-        <w:rPr>
-          <w:sz w:val="28"/>
-          <w:szCs w:val="28"/>
-        </w:rPr>
-        <w:t xml:space="preserve"> with </w:t>
-      </w:r>
-      <w:proofErr w:type="spellStart"/>
+        <w:t xml:space="preserve">Architecture: SequenceLSTM with </w:t>
+      </w:r>
       <w:r>
         <w:rPr>
           <w:i/>
           <w:sz w:val="28"/>
           <w:szCs w:val="28"/>
         </w:rPr>
-        <w:t>num_features</w:t>
-      </w:r>
-      <w:proofErr w:type="spellEnd"/>
+        <w:t xml:space="preserve">num_features </w:t>
+      </w:r>
+      <w:r>
+        <w:rPr>
+          <w:sz w:val="28"/>
+          <w:szCs w:val="28"/>
+        </w:rPr>
+        <w:t xml:space="preserve">= 1 (TSDM only), </w:t>
+      </w:r>
       <w:r>
         <w:rPr>
           <w:i/>
           <w:sz w:val="28"/>
           <w:szCs w:val="28"/>
         </w:rPr>
-        <w:t xml:space="preserve"> </w:t>
-      </w:r>
-      <w:r>
-        <w:rPr>
-          <w:sz w:val="28"/>
-          <w:szCs w:val="28"/>
-        </w:rPr>
-        <w:t xml:space="preserve">= 1 (TSDM only), </w:t>
-      </w:r>
-      <w:proofErr w:type="spellStart"/>
+        <w:t xml:space="preserve">hidden_size </w:t>
+      </w:r>
+      <w:r>
+        <w:rPr>
+          <w:sz w:val="28"/>
+          <w:szCs w:val="28"/>
+        </w:rPr>
+        <w:t xml:space="preserve">= 32, </w:t>
+      </w:r>
       <w:r>
         <w:rPr>
           <w:i/>
           <w:sz w:val="28"/>
           <w:szCs w:val="28"/>
         </w:rPr>
-        <w:t>hidden_size</w:t>
-      </w:r>
-      <w:proofErr w:type="spellEnd"/>
+        <w:t xml:space="preserve">num_layers </w:t>
+      </w:r>
+      <w:r>
+        <w:rPr>
+          <w:sz w:val="28"/>
+          <w:szCs w:val="28"/>
+        </w:rPr>
+        <w:t xml:space="preserve">= 2, </w:t>
+      </w:r>
       <w:r>
         <w:rPr>
           <w:i/>
           <w:sz w:val="28"/>
           <w:szCs w:val="28"/>
         </w:rPr>
-        <w:t xml:space="preserve"> </w:t>
-      </w:r>
-      <w:r>
-        <w:rPr>
-          <w:sz w:val="28"/>
-          <w:szCs w:val="28"/>
-        </w:rPr>
-        <w:t xml:space="preserve">= 32, </w:t>
-      </w:r>
-      <w:proofErr w:type="spellStart"/>
+        <w:t xml:space="preserve">output_size </w:t>
+      </w:r>
+      <w:r>
+        <w:rPr>
+          <w:sz w:val="28"/>
+          <w:szCs w:val="28"/>
+        </w:rPr>
+        <w:t xml:space="preserve">= 5 </w:t>
+      </w:r>
       <w:r>
         <w:rPr>
           <w:i/>
           <w:sz w:val="28"/>
           <w:szCs w:val="28"/>
         </w:rPr>
-        <w:t>num_layers</w:t>
-      </w:r>
-      <w:proofErr w:type="spellEnd"/>
-      <w:r>
-        <w:rPr>
-          <w:i/>
-          <w:sz w:val="28"/>
-          <w:szCs w:val="28"/>
-        </w:rPr>
-        <w:t xml:space="preserve"> </w:t>
-      </w:r>
-      <w:r>
-        <w:rPr>
-          <w:sz w:val="28"/>
-          <w:szCs w:val="28"/>
-        </w:rPr>
-        <w:t xml:space="preserve">= 2, </w:t>
-      </w:r>
-      <w:proofErr w:type="spellStart"/>
-      <w:r>
-        <w:rPr>
-          <w:i/>
-          <w:sz w:val="28"/>
-          <w:szCs w:val="28"/>
-        </w:rPr>
-        <w:t>output_size</w:t>
-      </w:r>
-      <w:proofErr w:type="spellEnd"/>
-      <w:r>
-        <w:rPr>
-          <w:i/>
-          <w:sz w:val="28"/>
-          <w:szCs w:val="28"/>
-        </w:rPr>
-        <w:t xml:space="preserve"> </w:t>
-      </w:r>
-      <w:r>
-        <w:rPr>
-          <w:sz w:val="28"/>
-          <w:szCs w:val="28"/>
-        </w:rPr>
-        <w:t xml:space="preserve">= 5 </w:t>
-      </w:r>
-      <w:r>
-        <w:rPr>
-          <w:i/>
-          <w:sz w:val="28"/>
-          <w:szCs w:val="28"/>
-        </w:rPr>
-        <w:t>(</w:t>
-      </w:r>
-      <w:proofErr w:type="spellStart"/>
-      <w:r>
-        <w:rPr>
-          <w:i/>
-          <w:sz w:val="28"/>
-          <w:szCs w:val="28"/>
-        </w:rPr>
-        <w:t>forecast_horizon</w:t>
-      </w:r>
-      <w:proofErr w:type="spellEnd"/>
-      <w:r>
-        <w:rPr>
-          <w:i/>
-          <w:sz w:val="28"/>
-          <w:szCs w:val="28"/>
-        </w:rPr>
-        <w:t xml:space="preserve">), </w:t>
+        <w:t xml:space="preserve">(forecast_horizon), </w:t>
       </w:r>
       <w:r>
         <w:rPr>
@@ -6226,23 +5939,7 @@
           <w:sz w:val="28"/>
           <w:szCs w:val="28"/>
         </w:rPr>
-        <w:t xml:space="preserve"> (</w:t>
-      </w:r>
-      <w:proofErr w:type="spellStart"/>
-      <w:r>
-        <w:rPr>
-          <w:sz w:val="28"/>
-          <w:szCs w:val="28"/>
-        </w:rPr>
-        <w:t>PyTorch</w:t>
-      </w:r>
-      <w:proofErr w:type="spellEnd"/>
-      <w:r>
-        <w:rPr>
-          <w:sz w:val="28"/>
-          <w:szCs w:val="28"/>
-        </w:rPr>
-        <w:t xml:space="preserve"> default in the model class, applied between LSTM layers and before the final linear layer).</w:t>
+        <w:t xml:space="preserve"> (PyTorch default in the model class, applied between LSTM layers and before the final linear layer).</w:t>
       </w:r>
     </w:p>
     <w:p>
@@ -6276,130 +5973,50 @@
         </w:rPr>
         <w:t xml:space="preserve">Hyperparameter selection: </w:t>
       </w:r>
-      <w:proofErr w:type="spellStart"/>
       <w:r>
         <w:rPr>
           <w:i/>
           <w:sz w:val="28"/>
           <w:szCs w:val="28"/>
         </w:rPr>
-        <w:t>hidden_size</w:t>
-      </w:r>
-      <w:proofErr w:type="spellEnd"/>
+        <w:t xml:space="preserve">hidden_size, num_layers, </w:t>
+      </w:r>
+      <w:r>
+        <w:rPr>
+          <w:sz w:val="28"/>
+          <w:szCs w:val="28"/>
+        </w:rPr>
+        <w:t xml:space="preserve">and learning rate were tuned via a grid search over </w:t>
+      </w:r>
       <w:r>
         <w:rPr>
           <w:i/>
           <w:sz w:val="28"/>
           <w:szCs w:val="28"/>
         </w:rPr>
-        <w:t xml:space="preserve">, </w:t>
-      </w:r>
-      <w:proofErr w:type="spellStart"/>
+        <w:t xml:space="preserve">hidden_size </w:t>
+      </w:r>
+      <w:r>
+        <w:rPr>
+          <w:sz w:val="28"/>
+          <w:szCs w:val="28"/>
+        </w:rPr>
+        <w:t xml:space="preserve">in {8, 16, 32}, </w:t>
+      </w:r>
       <w:r>
         <w:rPr>
           <w:i/>
           <w:sz w:val="28"/>
           <w:szCs w:val="28"/>
         </w:rPr>
-        <w:t>num_layers</w:t>
-      </w:r>
-      <w:proofErr w:type="spellEnd"/>
-      <w:r>
-        <w:rPr>
-          <w:i/>
-          <w:sz w:val="28"/>
-          <w:szCs w:val="28"/>
-        </w:rPr>
-        <w:t xml:space="preserve">, </w:t>
-      </w:r>
-      <w:r>
-        <w:rPr>
-          <w:sz w:val="28"/>
-          <w:szCs w:val="28"/>
-        </w:rPr>
-        <w:t xml:space="preserve">and learning rate were tuned via a grid search over </w:t>
-      </w:r>
-      <w:proofErr w:type="spellStart"/>
-      <w:r>
-        <w:rPr>
-          <w:i/>
-          <w:sz w:val="28"/>
-          <w:szCs w:val="28"/>
-        </w:rPr>
-        <w:t>hidden_size</w:t>
-      </w:r>
-      <w:proofErr w:type="spellEnd"/>
-      <w:r>
-        <w:rPr>
-          <w:i/>
-          <w:sz w:val="28"/>
-          <w:szCs w:val="28"/>
-        </w:rPr>
-        <w:t xml:space="preserve"> </w:t>
-      </w:r>
-      <w:r>
-        <w:rPr>
-          <w:sz w:val="28"/>
-          <w:szCs w:val="28"/>
-        </w:rPr>
-        <w:t xml:space="preserve">in {8, 16, </w:t>
-      </w:r>
-      <w:proofErr w:type="gramStart"/>
-      <w:r>
-        <w:rPr>
-          <w:sz w:val="28"/>
-          <w:szCs w:val="28"/>
-        </w:rPr>
-        <w:t>32},</w:t>
-      </w:r>
-      <w:proofErr w:type="gramEnd"/>
-      <w:r>
-        <w:rPr>
-          <w:sz w:val="28"/>
-          <w:szCs w:val="28"/>
-        </w:rPr>
-        <w:t xml:space="preserve"> </w:t>
-      </w:r>
-      <w:proofErr w:type="spellStart"/>
-      <w:r>
-        <w:rPr>
-          <w:i/>
-          <w:sz w:val="28"/>
-          <w:szCs w:val="28"/>
-        </w:rPr>
-        <w:t>num_layers</w:t>
-      </w:r>
-      <w:proofErr w:type="spellEnd"/>
-      <w:r>
-        <w:rPr>
-          <w:i/>
-          <w:sz w:val="28"/>
-          <w:szCs w:val="28"/>
-        </w:rPr>
-        <w:t xml:space="preserve"> </w:t>
-      </w:r>
-      <w:r>
-        <w:rPr>
-          <w:sz w:val="28"/>
-          <w:szCs w:val="28"/>
-        </w:rPr>
-        <w:t xml:space="preserve">in {1, </w:t>
-      </w:r>
-      <w:proofErr w:type="gramStart"/>
-      <w:r>
-        <w:rPr>
-          <w:sz w:val="28"/>
-          <w:szCs w:val="28"/>
-        </w:rPr>
-        <w:t>2},</w:t>
-      </w:r>
-      <w:proofErr w:type="gramEnd"/>
-      <w:r>
-        <w:rPr>
-          <w:sz w:val="28"/>
-          <w:szCs w:val="28"/>
-        </w:rPr>
-        <w:t xml:space="preserve"> and </w:t>
+        <w:t xml:space="preserve">num_layers </w:t>
+      </w:r>
+      <w:r>
+        <w:rPr>
+          <w:sz w:val="28"/>
+          <w:szCs w:val="28"/>
+        </w:rPr>
+        <w:t xml:space="preserve">in {1, 2}, and </w:t>
       </w:r>
       <w:r>
         <w:rPr>
@@ -6423,210 +6040,102 @@
           <w:sz w:val="28"/>
           <w:szCs w:val="28"/>
         </w:rPr>
-        <w:t>(</w:t>
-      </w:r>
-      <w:proofErr w:type="spellStart"/>
+        <w:t xml:space="preserve">(hidden_size, num_layers, </w:t>
+      </w:r>
+      <w:r>
+        <w:rPr>
+          <w:sz w:val="28"/>
+          <w:szCs w:val="28"/>
+        </w:rPr>
+        <w:t xml:space="preserve">lr → </w:t>
+      </w:r>
       <w:r>
         <w:rPr>
           <w:i/>
           <w:sz w:val="28"/>
           <w:szCs w:val="28"/>
         </w:rPr>
-        <w:t>hidden_size</w:t>
-      </w:r>
-      <w:proofErr w:type="spellEnd"/>
+        <w:t xml:space="preserve">val_loss): </w:t>
+      </w:r>
+      <w:r>
+        <w:rPr>
+          <w:sz w:val="28"/>
+          <w:szCs w:val="28"/>
+        </w:rPr>
+        <w:t xml:space="preserve">32, 2, 0.0010 → 0.5437; 16, 2, 0.0010 → 0.5478; 32, 1, 0.0010 → 0.5517; 32, 2, 0.0005 → 0.5547; 16, 2, 0.0005 → 0.5582; 16, 1, 0.0010 → 0.5629; 32, 1, 0.0005 → 0.5631; 8, 2, 0.0010 → 0.5664; 16, 1, 0.0005 → 0.5694; 8, 2, 0.0005 → 0.5731; 8, 1, 0.0010 → 0.5735; 8, 1, 0.0005 → 0.5831. </w:t>
+      </w:r>
+    </w:p>
+    <w:p>
+      <w:pPr>
+        <w:spacing w:after="150"/>
+        <w:rPr>
+          <w:sz w:val="28"/>
+          <w:szCs w:val="28"/>
+        </w:rPr>
+      </w:pPr>
+      <w:r>
+        <w:rPr>
+          <w:sz w:val="28"/>
+          <w:szCs w:val="28"/>
+        </w:rPr>
+        <w:t>The lowest</w:t>
+      </w:r>
+      <w:r>
+        <w:rPr>
+          <w:sz w:val="28"/>
+          <w:szCs w:val="28"/>
+        </w:rPr>
+        <w:t xml:space="preserve"> </w:t>
+      </w:r>
+      <w:r>
+        <w:rPr>
+          <w:sz w:val="28"/>
+          <w:szCs w:val="28"/>
+        </w:rPr>
+        <w:t>validation</w:t>
+      </w:r>
+      <w:r>
+        <w:rPr>
+          <w:sz w:val="28"/>
+          <w:szCs w:val="28"/>
+        </w:rPr>
+        <w:t xml:space="preserve"> </w:t>
+      </w:r>
+      <w:r>
+        <w:rPr>
+          <w:sz w:val="28"/>
+          <w:szCs w:val="28"/>
+        </w:rPr>
+        <w:t>loss configuration</w:t>
+      </w:r>
+      <w:r>
+        <w:rPr>
+          <w:sz w:val="28"/>
+          <w:szCs w:val="28"/>
+        </w:rPr>
+        <w:t>:</w:t>
+      </w:r>
+      <w:r>
+        <w:rPr>
+          <w:sz w:val="28"/>
+          <w:szCs w:val="28"/>
+        </w:rPr>
+        <w:t xml:space="preserve"> </w:t>
+      </w:r>
       <w:r>
         <w:rPr>
           <w:i/>
           <w:sz w:val="28"/>
           <w:szCs w:val="28"/>
         </w:rPr>
-        <w:t xml:space="preserve">, </w:t>
-      </w:r>
-      <w:proofErr w:type="spellStart"/>
-      <w:r>
-        <w:rPr>
-          <w:i/>
-          <w:sz w:val="28"/>
-          <w:szCs w:val="28"/>
-        </w:rPr>
-        <w:t>num_layers</w:t>
-      </w:r>
-      <w:proofErr w:type="spellEnd"/>
-      <w:r>
-        <w:rPr>
-          <w:i/>
-          <w:sz w:val="28"/>
-          <w:szCs w:val="28"/>
-        </w:rPr>
-        <w:t xml:space="preserve">, </w:t>
-      </w:r>
-      <w:proofErr w:type="spellStart"/>
-      <w:r>
-        <w:rPr>
-          <w:sz w:val="28"/>
-          <w:szCs w:val="28"/>
-        </w:rPr>
-        <w:t>lr</w:t>
-      </w:r>
-      <w:proofErr w:type="spellEnd"/>
-      <w:r>
-        <w:rPr>
-          <w:sz w:val="28"/>
-          <w:szCs w:val="28"/>
-        </w:rPr>
-        <w:t xml:space="preserve"> → </w:t>
-      </w:r>
-      <w:proofErr w:type="spellStart"/>
-      <w:r>
-        <w:rPr>
-          <w:i/>
-          <w:sz w:val="28"/>
-          <w:szCs w:val="28"/>
-        </w:rPr>
-        <w:t>val_loss</w:t>
-      </w:r>
-      <w:proofErr w:type="spellEnd"/>
-      <w:r>
-        <w:rPr>
-          <w:i/>
-          <w:sz w:val="28"/>
-          <w:szCs w:val="28"/>
-        </w:rPr>
-        <w:t xml:space="preserve">): </w:t>
-      </w:r>
-      <w:r>
-        <w:rPr>
-          <w:sz w:val="28"/>
-          <w:szCs w:val="28"/>
-        </w:rPr>
-        <w:t xml:space="preserve">32, 2, 0.0010 → 0.5437; 16, 2, 0.0010 → 0.5478; 32, 1, 0.0010 → 0.5517; 32, 2, 0.0005 → 0.5547; 16, 2, 0.0005 → 0.5582; 16, 1, 0.0010 → 0.5629; 32, 1, 0.0005 → 0.5631; 8, 2, 0.0010 → 0.5664; 16, 1, 0.0005 → 0.5694; 8, 2, 0.0005 → 0.5731; 8, 1, 0.0010 → 0.5735; 8, 1, 0.0005 → 0.5831. </w:t>
-      </w:r>
-    </w:p>
-    <w:p>
-      <w:pPr>
-        <w:spacing w:after="150"/>
-        <w:rPr>
-          <w:sz w:val="28"/>
-          <w:szCs w:val="28"/>
-        </w:rPr>
-      </w:pPr>
-      <w:r>
-        <w:rPr>
-          <w:sz w:val="28"/>
-          <w:szCs w:val="28"/>
-        </w:rPr>
-        <w:t>The lowest</w:t>
-      </w:r>
-      <w:r>
-        <w:rPr>
-          <w:sz w:val="28"/>
-          <w:szCs w:val="28"/>
-        </w:rPr>
-        <w:t xml:space="preserve"> </w:t>
-      </w:r>
-      <w:r>
-        <w:rPr>
-          <w:sz w:val="28"/>
-          <w:szCs w:val="28"/>
-        </w:rPr>
-        <w:t>validation</w:t>
-      </w:r>
-      <w:r>
-        <w:rPr>
-          <w:sz w:val="28"/>
-          <w:szCs w:val="28"/>
-        </w:rPr>
-        <w:t xml:space="preserve"> </w:t>
-      </w:r>
-      <w:r>
-        <w:rPr>
-          <w:sz w:val="28"/>
-          <w:szCs w:val="28"/>
-        </w:rPr>
-        <w:t>loss configuration</w:t>
-      </w:r>
-      <w:r>
-        <w:rPr>
-          <w:sz w:val="28"/>
-          <w:szCs w:val="28"/>
-        </w:rPr>
-        <w:t>:</w:t>
-      </w:r>
-      <w:r>
-        <w:rPr>
-          <w:sz w:val="28"/>
-          <w:szCs w:val="28"/>
-        </w:rPr>
-        <w:t xml:space="preserve"> </w:t>
-      </w:r>
-      <w:proofErr w:type="spellStart"/>
-      <w:r>
-        <w:rPr>
-          <w:i/>
-          <w:sz w:val="28"/>
-          <w:szCs w:val="28"/>
-        </w:rPr>
-        <w:t>hidden_size</w:t>
-      </w:r>
-      <w:proofErr w:type="spellEnd"/>
-      <w:r>
-        <w:rPr>
-          <w:i/>
-          <w:sz w:val="28"/>
-          <w:szCs w:val="28"/>
-        </w:rPr>
-        <w:t xml:space="preserve">=32, </w:t>
-      </w:r>
-      <w:proofErr w:type="spellStart"/>
-      <w:r>
-        <w:rPr>
-          <w:i/>
-          <w:sz w:val="28"/>
-          <w:szCs w:val="28"/>
-        </w:rPr>
-        <w:t>num_layers</w:t>
-      </w:r>
-      <w:proofErr w:type="spellEnd"/>
-      <w:r>
-        <w:rPr>
-          <w:i/>
-          <w:sz w:val="28"/>
-          <w:szCs w:val="28"/>
-        </w:rPr>
-        <w:t xml:space="preserve">=2, </w:t>
-      </w:r>
-      <w:proofErr w:type="spellStart"/>
-      <w:r>
-        <w:rPr>
-          <w:sz w:val="28"/>
-          <w:szCs w:val="28"/>
-        </w:rPr>
-        <w:t>lr</w:t>
-      </w:r>
-      <w:proofErr w:type="spellEnd"/>
-      <w:r>
-        <w:rPr>
-          <w:sz w:val="28"/>
-          <w:szCs w:val="28"/>
-        </w:rPr>
-        <w:t>=0.001 — was selected and used for the full 250-epoch training run reported below; learning rate and epoch count otherwise follow common defaults for Adam-</w:t>
-      </w:r>
-      <w:proofErr w:type="spellStart"/>
-      <w:r>
-        <w:rPr>
-          <w:sz w:val="28"/>
-          <w:szCs w:val="28"/>
-        </w:rPr>
-        <w:t>optimised</w:t>
-      </w:r>
-      <w:proofErr w:type="spellEnd"/>
-      <w:r>
-        <w:rPr>
-          <w:sz w:val="28"/>
-          <w:szCs w:val="28"/>
-        </w:rPr>
-        <w:t xml:space="preserve"> LSTMs.</w:t>
+        <w:t xml:space="preserve">hidden_size=32, num_layers=2, </w:t>
+      </w:r>
+      <w:r>
+        <w:rPr>
+          <w:sz w:val="28"/>
+          <w:szCs w:val="28"/>
+        </w:rPr>
+        <w:t>lr=0.001 — was selected and used for the full 250-epoch training run reported below; learning rate and epoch count otherwise follow common defaults for Adam-optimised LSTMs.</w:t>
       </w:r>
     </w:p>
     <w:tbl>
@@ -7563,23 +7072,13 @@
         </w:rPr>
         <w:t xml:space="preserve">The training loss decreases steadily throughout training (0.75 → 0.45), while the validation loss drops to its lowest point by epoch 50 (0.531) and then edges slightly upward through epoch 200 (0.533 → 0.535) — a mild overfitting signal within this internal validation split. Because </w:t>
       </w:r>
-      <w:proofErr w:type="spellStart"/>
       <w:r>
         <w:rPr>
           <w:i/>
           <w:sz w:val="28"/>
           <w:szCs w:val="28"/>
         </w:rPr>
-        <w:t>train_lstm_model</w:t>
-      </w:r>
-      <w:proofErr w:type="spellEnd"/>
-      <w:r>
-        <w:rPr>
-          <w:i/>
-          <w:sz w:val="28"/>
-          <w:szCs w:val="28"/>
-        </w:rPr>
-        <w:t xml:space="preserve"> </w:t>
+        <w:t xml:space="preserve">train_lstm_model </w:t>
       </w:r>
       <w:r>
         <w:rPr>
@@ -7621,73 +7120,43 @@
         </w:rPr>
         <w:t xml:space="preserve">Architecture change: doubling the lookback from 5 to 10 timesteps doubles the amount of information the encoder must compress into its final hidden state, so </w:t>
       </w:r>
-      <w:proofErr w:type="spellStart"/>
       <w:r>
         <w:rPr>
           <w:i/>
           <w:sz w:val="28"/>
           <w:szCs w:val="28"/>
         </w:rPr>
-        <w:t>hidden_size</w:t>
-      </w:r>
-      <w:proofErr w:type="spellEnd"/>
+        <w:t xml:space="preserve">hidden_size </w:t>
+      </w:r>
+      <w:r>
+        <w:rPr>
+          <w:sz w:val="28"/>
+          <w:szCs w:val="28"/>
+        </w:rPr>
+        <w:t xml:space="preserve">is increased to 24 to give the LSTM enough representational capacity for the longer input. </w:t>
+      </w:r>
       <w:r>
         <w:rPr>
           <w:i/>
           <w:sz w:val="28"/>
           <w:szCs w:val="28"/>
         </w:rPr>
-        <w:t xml:space="preserve"> </w:t>
-      </w:r>
-      <w:r>
-        <w:rPr>
-          <w:sz w:val="28"/>
-          <w:szCs w:val="28"/>
-        </w:rPr>
-        <w:t xml:space="preserve">is increased to 24 to give the LSTM enough representational capacity for the longer input. </w:t>
-      </w:r>
-      <w:proofErr w:type="spellStart"/>
+        <w:t xml:space="preserve">num_layers=2 </w:t>
+      </w:r>
+      <w:r>
+        <w:rPr>
+          <w:sz w:val="28"/>
+          <w:szCs w:val="28"/>
+        </w:rPr>
+        <w:t xml:space="preserve">and the rest of the training setup (batch size, optimizer, dropout) are kept identical to Model 1 so that lookback length — not some other architectural change — is the variable being compared between the two univariate models. No other architectural change is required; </w:t>
+      </w:r>
       <w:r>
         <w:rPr>
           <w:i/>
           <w:sz w:val="28"/>
           <w:szCs w:val="28"/>
         </w:rPr>
-        <w:t>num_layers</w:t>
-      </w:r>
-      <w:proofErr w:type="spellEnd"/>
-      <w:r>
-        <w:rPr>
-          <w:i/>
-          <w:sz w:val="28"/>
-          <w:szCs w:val="28"/>
-        </w:rPr>
-        <w:t xml:space="preserve">=2 </w:t>
-      </w:r>
-      <w:r>
-        <w:rPr>
-          <w:sz w:val="28"/>
-          <w:szCs w:val="28"/>
-        </w:rPr>
-        <w:t xml:space="preserve">and the rest of the training setup (batch size, optimizer, dropout) are kept identical to Model 1 so that lookback length — not some other architectural change — is the variable being compared between the two univariate models. No other architectural change is required; </w:t>
-      </w:r>
-      <w:proofErr w:type="spellStart"/>
-      <w:r>
-        <w:rPr>
-          <w:i/>
-          <w:sz w:val="28"/>
-          <w:szCs w:val="28"/>
-        </w:rPr>
-        <w:t>pack_padded_sequence</w:t>
-      </w:r>
-      <w:proofErr w:type="spellEnd"/>
-      <w:r>
-        <w:rPr>
-          <w:i/>
-          <w:sz w:val="28"/>
-          <w:szCs w:val="28"/>
-        </w:rPr>
-        <w:t xml:space="preserve"> </w:t>
+        <w:t xml:space="preserve">pack_padded_sequence </w:t>
       </w:r>
       <w:r>
         <w:rPr>
@@ -8638,39 +8107,7 @@
           <w:sz w:val="28"/>
           <w:szCs w:val="28"/>
         </w:rPr>
-        <w:t xml:space="preserve">Both loss curves continue decreasing steadily through all 200 logged epochs (train: 0.80 → 0.30; </w:t>
-      </w:r>
-      <w:proofErr w:type="spellStart"/>
-      <w:r>
-        <w:rPr>
-          <w:sz w:val="28"/>
-          <w:szCs w:val="28"/>
-        </w:rPr>
-        <w:t>val</w:t>
-      </w:r>
-      <w:proofErr w:type="spellEnd"/>
-      <w:r>
-        <w:rPr>
-          <w:sz w:val="28"/>
-          <w:szCs w:val="28"/>
-        </w:rPr>
-        <w:t xml:space="preserve">: 0.76 → 0.44) without fully plateauing, unlike Model 1. Both Train R² (0.72 vs. 0.61) and, notably, Test R² (0.33 vs. 0.30) improve over Model 1, and Test RMSE also falls slightly (342.35 vs. 350.45) — here, the longer lookback genuinely helps the model forecast the reserved test window, not just fit the training data more closely. This is unlike the pattern seen for Model 3 (Section 8.5.1), where added complexity helps training fit without helping genuine </w:t>
-      </w:r>
-      <w:proofErr w:type="gramStart"/>
-      <w:r>
-        <w:rPr>
-          <w:sz w:val="28"/>
-          <w:szCs w:val="28"/>
-        </w:rPr>
-        <w:t>forecasting</w:t>
-      </w:r>
-      <w:proofErr w:type="gramEnd"/>
-      <w:r>
-        <w:rPr>
-          <w:sz w:val="28"/>
-          <w:szCs w:val="28"/>
-        </w:rPr>
-        <w:t xml:space="preserve"> performance.</w:t>
+        <w:t>Both loss curves continue decreasing steadily through all 200 logged epochs (train: 0.80 → 0.30; val: 0.76 → 0.44) without fully plateauing, unlike Model 1. Both Train R² (0.72 vs. 0.61) and, notably, Test R² (0.33 vs. 0.30) improve over Model 1, and Test RMSE also falls slightly (342.35 vs. 350.45) — here, the longer lookback genuinely helps the model forecast the reserved test window, not just fit the training data more closely. This is unlike the pattern seen for Model 3 (Section 8.5.1), where added complexity helps training fit without helping genuine forecasting performance.</w:t>
       </w:r>
     </w:p>
     <w:p>
@@ -8705,195 +8142,95 @@
         </w:rPr>
         <w:t xml:space="preserve">Architecture modifications: </w:t>
       </w:r>
-      <w:proofErr w:type="spellStart"/>
       <w:r>
         <w:rPr>
           <w:i/>
           <w:sz w:val="28"/>
           <w:szCs w:val="28"/>
         </w:rPr>
-        <w:t>num_features</w:t>
-      </w:r>
-      <w:proofErr w:type="spellEnd"/>
+        <w:t xml:space="preserve">num_features </w:t>
+      </w:r>
+      <w:r>
+        <w:rPr>
+          <w:sz w:val="28"/>
+          <w:szCs w:val="28"/>
+        </w:rPr>
+        <w:t xml:space="preserve">is increased from 1 to the number of available climate columns (TSDM plus 15-day-average rainfall, max/min temperature, relative humidity at max/min temperature, evaporation, and radiation — 8 features in total), requiring the LSTM's </w:t>
+      </w:r>
       <w:r>
         <w:rPr>
           <w:i/>
           <w:sz w:val="28"/>
           <w:szCs w:val="28"/>
         </w:rPr>
-        <w:t xml:space="preserve"> </w:t>
-      </w:r>
-      <w:r>
-        <w:rPr>
-          <w:sz w:val="28"/>
-          <w:szCs w:val="28"/>
-        </w:rPr>
-        <w:t xml:space="preserve">is increased from 1 to the number of available climate columns (TSDM plus 15-day-average rainfall, max/min temperature, relative humidity at max/min temperature, evaporation, and radiation — 8 features in total), requiring the LSTM's </w:t>
-      </w:r>
-      <w:proofErr w:type="spellStart"/>
+        <w:t xml:space="preserve">input_size </w:t>
+      </w:r>
+      <w:r>
+        <w:rPr>
+          <w:sz w:val="28"/>
+          <w:szCs w:val="28"/>
+        </w:rPr>
+        <w:t xml:space="preserve">to scale accordingly; </w:t>
+      </w:r>
       <w:r>
         <w:rPr>
           <w:i/>
           <w:sz w:val="28"/>
           <w:szCs w:val="28"/>
         </w:rPr>
-        <w:t>input_size</w:t>
-      </w:r>
-      <w:proofErr w:type="spellEnd"/>
+        <w:t xml:space="preserve">hidden_size </w:t>
+      </w:r>
+      <w:r>
+        <w:rPr>
+          <w:sz w:val="28"/>
+          <w:szCs w:val="28"/>
+        </w:rPr>
+        <w:t xml:space="preserve">is further increased to 32 to give the model enough capacity to combine information across all input channels. Unlike Models 1 and 2, no fixed lookback window is used at all: at every timestep t the input is the entire history available for that paddock up to t (a growing window), padded only up to the longest training series observed across paddocks (190 timesteps) purely so PyTorch can batch samples of different real lengths — </w:t>
+      </w:r>
       <w:r>
         <w:rPr>
           <w:i/>
           <w:sz w:val="28"/>
           <w:szCs w:val="28"/>
         </w:rPr>
-        <w:t xml:space="preserve"> </w:t>
-      </w:r>
-      <w:r>
-        <w:rPr>
-          <w:sz w:val="28"/>
-          <w:szCs w:val="28"/>
-        </w:rPr>
-        <w:t xml:space="preserve">to scale accordingly; </w:t>
-      </w:r>
-      <w:proofErr w:type="spellStart"/>
+        <w:t xml:space="preserve">pack_padded_sequence </w:t>
+      </w:r>
+      <w:r>
+        <w:rPr>
+          <w:sz w:val="28"/>
+          <w:szCs w:val="28"/>
+        </w:rPr>
+        <w:t xml:space="preserve">restricts the LSTM's computation to each sample's true, un-padded length. This required a new data-preparation routine </w:t>
+      </w:r>
       <w:r>
         <w:rPr>
           <w:i/>
           <w:sz w:val="28"/>
           <w:szCs w:val="28"/>
         </w:rPr>
-        <w:t>hidden_size</w:t>
-      </w:r>
-      <w:proofErr w:type="spellEnd"/>
+        <w:t xml:space="preserve">(create_sequences_flexible </w:t>
+      </w:r>
+      <w:r>
+        <w:rPr>
+          <w:sz w:val="28"/>
+          <w:szCs w:val="28"/>
+        </w:rPr>
+        <w:t xml:space="preserve">/ </w:t>
+      </w:r>
       <w:r>
         <w:rPr>
           <w:i/>
           <w:sz w:val="28"/>
           <w:szCs w:val="28"/>
         </w:rPr>
-        <w:t xml:space="preserve"> </w:t>
-      </w:r>
-      <w:r>
-        <w:rPr>
-          <w:sz w:val="28"/>
-          <w:szCs w:val="28"/>
-        </w:rPr>
-        <w:t xml:space="preserve">is further increased to 32 to give the model enough capacity to combine information across all input channels. Unlike Models 1 and 2, no fixed lookback window is used at all: at every timestep t the input is the entire history available for that paddock up to t (a growing window), padded only up to the longest training series observed across paddocks (190 timesteps) purely so </w:t>
-      </w:r>
-      <w:proofErr w:type="spellStart"/>
-      <w:r>
-        <w:rPr>
-          <w:sz w:val="28"/>
-          <w:szCs w:val="28"/>
-        </w:rPr>
-        <w:t>PyTorch</w:t>
-      </w:r>
-      <w:proofErr w:type="spellEnd"/>
-      <w:r>
-        <w:rPr>
-          <w:sz w:val="28"/>
-          <w:szCs w:val="28"/>
-        </w:rPr>
-        <w:t xml:space="preserve"> can batch samples of different real lengths — </w:t>
-      </w:r>
-      <w:proofErr w:type="spellStart"/>
-      <w:r>
-        <w:rPr>
-          <w:i/>
-          <w:sz w:val="28"/>
-          <w:szCs w:val="28"/>
-        </w:rPr>
-        <w:t>pack_padded_sequence</w:t>
-      </w:r>
-      <w:proofErr w:type="spellEnd"/>
-      <w:r>
-        <w:rPr>
-          <w:i/>
-          <w:sz w:val="28"/>
-          <w:szCs w:val="28"/>
-        </w:rPr>
-        <w:t xml:space="preserve"> </w:t>
-      </w:r>
-      <w:r>
-        <w:rPr>
-          <w:sz w:val="28"/>
-          <w:szCs w:val="28"/>
-        </w:rPr>
-        <w:t xml:space="preserve">restricts the LSTM's computation to each sample's true, un-padded length. This required a new data-preparation routine </w:t>
-      </w:r>
-      <w:r>
-        <w:rPr>
-          <w:i/>
-          <w:sz w:val="28"/>
-          <w:szCs w:val="28"/>
-        </w:rPr>
-        <w:t>(</w:t>
-      </w:r>
-      <w:proofErr w:type="spellStart"/>
-      <w:r>
-        <w:rPr>
-          <w:i/>
-          <w:sz w:val="28"/>
-          <w:szCs w:val="28"/>
-        </w:rPr>
-        <w:t>create_sequences_flexible</w:t>
-      </w:r>
-      <w:proofErr w:type="spellEnd"/>
-      <w:r>
-        <w:rPr>
-          <w:i/>
-          <w:sz w:val="28"/>
-          <w:szCs w:val="28"/>
-        </w:rPr>
-        <w:t xml:space="preserve"> </w:t>
-      </w:r>
-      <w:r>
-        <w:rPr>
-          <w:sz w:val="28"/>
-          <w:szCs w:val="28"/>
-        </w:rPr>
-        <w:t xml:space="preserve">/ </w:t>
-      </w:r>
-      <w:proofErr w:type="spellStart"/>
-      <w:r>
-        <w:rPr>
-          <w:i/>
-          <w:sz w:val="28"/>
-          <w:szCs w:val="28"/>
-        </w:rPr>
-        <w:t>prepare_tsdm_data_flexible</w:t>
-      </w:r>
-      <w:proofErr w:type="spellEnd"/>
-      <w:r>
-        <w:rPr>
-          <w:i/>
-          <w:sz w:val="28"/>
-          <w:szCs w:val="28"/>
-        </w:rPr>
-        <w:t xml:space="preserve">); </w:t>
-      </w:r>
-      <w:r>
-        <w:rPr>
-          <w:sz w:val="28"/>
-          <w:szCs w:val="28"/>
-        </w:rPr>
-        <w:t xml:space="preserve">no change to the </w:t>
-      </w:r>
-      <w:proofErr w:type="spellStart"/>
-      <w:r>
-        <w:rPr>
-          <w:sz w:val="28"/>
-          <w:szCs w:val="28"/>
-        </w:rPr>
-        <w:t>SequenceLSTM</w:t>
-      </w:r>
-      <w:proofErr w:type="spellEnd"/>
-      <w:r>
-        <w:rPr>
-          <w:sz w:val="28"/>
-          <w:szCs w:val="28"/>
-        </w:rPr>
-        <w:t xml:space="preserve"> architecture itself was needed, since it was already length-agnostic.</w:t>
+        <w:t xml:space="preserve">prepare_tsdm_data_flexible); </w:t>
+      </w:r>
+      <w:r>
+        <w:rPr>
+          <w:sz w:val="28"/>
+          <w:szCs w:val="28"/>
+        </w:rPr>
+        <w:t>no change to the SequenceLSTM architecture itself was needed, since it was already length-agnostic.</w:t>
       </w:r>
     </w:p>
     <w:tbl>
@@ -10499,87 +9836,7 @@
           <w:sz w:val="28"/>
           <w:szCs w:val="28"/>
         </w:rPr>
-        <w:t xml:space="preserve">This matters because it means the strong internal-validation performance of Model 3 — the lowest absolute loss and highest Train R² of the three — does not, by itself, indicate the best forecasting model. That 80/20 validation split is drawn from the same </w:t>
-      </w:r>
-      <w:proofErr w:type="gramStart"/>
-      <w:r>
-        <w:rPr>
-          <w:sz w:val="28"/>
-          <w:szCs w:val="28"/>
-        </w:rPr>
-        <w:t>time period</w:t>
-      </w:r>
-      <w:proofErr w:type="gramEnd"/>
-      <w:r>
-        <w:rPr>
-          <w:sz w:val="28"/>
-          <w:szCs w:val="28"/>
-        </w:rPr>
-        <w:t xml:space="preserve"> and distribution as the training data, so it primarily measures how well the model interpolates within familiar territory, not how well it forecasts genuinely future, unseen pasture growth. The true forecasting test (the reserved last-5-timestep window per paddock) instead </w:t>
-      </w:r>
-      <w:proofErr w:type="spellStart"/>
-      <w:r>
-        <w:rPr>
-          <w:sz w:val="28"/>
-          <w:szCs w:val="28"/>
-        </w:rPr>
-        <w:t>favours</w:t>
-      </w:r>
-      <w:proofErr w:type="spellEnd"/>
-      <w:r>
-        <w:rPr>
-          <w:sz w:val="28"/>
-          <w:szCs w:val="28"/>
-        </w:rPr>
-        <w:t xml:space="preserve"> Model </w:t>
-      </w:r>
-      <w:proofErr w:type="gramStart"/>
-      <w:r>
-        <w:rPr>
-          <w:sz w:val="28"/>
-          <w:szCs w:val="28"/>
-        </w:rPr>
-        <w:t>2, and</w:t>
-      </w:r>
-      <w:proofErr w:type="gramEnd"/>
-      <w:r>
-        <w:rPr>
-          <w:sz w:val="28"/>
-          <w:szCs w:val="28"/>
-        </w:rPr>
-        <w:t xml:space="preserve"> is the metric that </w:t>
-      </w:r>
-      <w:proofErr w:type="gramStart"/>
-      <w:r>
-        <w:rPr>
-          <w:sz w:val="28"/>
-          <w:szCs w:val="28"/>
-        </w:rPr>
-        <w:t>actually matters</w:t>
-      </w:r>
-      <w:proofErr w:type="gramEnd"/>
-      <w:r>
-        <w:rPr>
-          <w:sz w:val="28"/>
-          <w:szCs w:val="28"/>
-        </w:rPr>
-        <w:t xml:space="preserve"> for </w:t>
-      </w:r>
-      <w:proofErr w:type="spellStart"/>
-      <w:r>
-        <w:rPr>
-          <w:sz w:val="28"/>
-          <w:szCs w:val="28"/>
-        </w:rPr>
-        <w:t>AgriWebb's</w:t>
-      </w:r>
-      <w:proofErr w:type="spellEnd"/>
-      <w:r>
-        <w:rPr>
-          <w:sz w:val="28"/>
-          <w:szCs w:val="28"/>
-        </w:rPr>
-        <w:t xml:space="preserve"> stated goal of predicting future pasture availability.</w:t>
+        <w:t>This matters because it means the strong internal-validation performance of Model 3 — the lowest absolute loss and highest Train R² of the three — does not, by itself, indicate the best forecasting model. That 80/20 validation split is drawn from the same time period and distribution as the training data, so it primarily measures how well the model interpolates within familiar territory, not how well it forecasts genuinely future, unseen pasture growth. The true forecasting test (the reserved last-5-timestep window per paddock) instead favours Model 2, and is the metric that actually matters for AgriWebb's stated goal of predicting future pasture availability.</w:t>
       </w:r>
     </w:p>
     <w:p>
@@ -10713,23 +9970,7 @@
           <w:sz w:val="28"/>
           <w:szCs w:val="28"/>
         </w:rPr>
-        <w:t xml:space="preserve">In short, this isn't a bug in the code or how the error was measured. The real issue is that a single, shared model is being asked to predict the </w:t>
-      </w:r>
-      <w:proofErr w:type="spellStart"/>
-      <w:r>
-        <w:rPr>
-          <w:sz w:val="28"/>
-          <w:szCs w:val="28"/>
-        </w:rPr>
-        <w:t>behaviour</w:t>
-      </w:r>
-      <w:proofErr w:type="spellEnd"/>
-      <w:r>
-        <w:rPr>
-          <w:sz w:val="28"/>
-          <w:szCs w:val="28"/>
-        </w:rPr>
-        <w:t xml:space="preserve"> of 19 very different paddocks — some stable, some highly volatile — using only about 189 observations each. Once climate features and an unrestricted growing-window history are added, the model gains enough capacity to fit the training data closely, but there still isn't enough diverse per-paddock data for it to learn how to extrapolate the more volatile paddocks' future growth, so aggregate test error ends up dominated by those harder cases.</w:t>
+        <w:t>In short, this isn't a bug in the code or how the error was measured. The real issue is that a single, shared model is being asked to predict the behaviour of 19 very different paddocks — some stable, some highly volatile — using only about 189 observations each. Once climate features and an unrestricted growing-window history are added, the model gains enough capacity to fit the training data closely, but there still isn't enough diverse per-paddock data for it to learn how to extrapolate the more volatile paddocks' future growth, so aggregate test error ends up dominated by those harder cases.</w:t>
       </w:r>
       <w:r>
         <w:rPr>
@@ -10780,71 +10021,7 @@
           <w:sz w:val="28"/>
           <w:szCs w:val="28"/>
         </w:rPr>
-        <w:t xml:space="preserve">For </w:t>
-      </w:r>
-      <w:proofErr w:type="spellStart"/>
-      <w:r>
-        <w:rPr>
-          <w:sz w:val="28"/>
-          <w:szCs w:val="28"/>
-        </w:rPr>
-        <w:t>AgriWebb</w:t>
-      </w:r>
-      <w:proofErr w:type="spellEnd"/>
-      <w:r>
-        <w:rPr>
-          <w:sz w:val="28"/>
-          <w:szCs w:val="28"/>
-        </w:rPr>
-        <w:t xml:space="preserve">, these results suggest the current multivariate model should not be deployed as-is for operational forecasting: a Test R² of 0.16 means it explains only a modest share of the variance in genuinely future pasture growth, and its strong training-time metrics (Train R² = 0.81) considerably overstate how well it </w:t>
-      </w:r>
-      <w:proofErr w:type="spellStart"/>
-      <w:r>
-        <w:rPr>
-          <w:sz w:val="28"/>
-          <w:szCs w:val="28"/>
-        </w:rPr>
-        <w:t>generalises</w:t>
-      </w:r>
-      <w:proofErr w:type="spellEnd"/>
-      <w:r>
-        <w:rPr>
-          <w:sz w:val="28"/>
-          <w:szCs w:val="28"/>
-        </w:rPr>
-        <w:t xml:space="preserve">. Model 2 (univariate, Lookback=10) is the most defensible of the three for practical use here, since it shows the best genuine forecasting performance (Test R² = 0.33, Test RMSE = 342.35) without the added complexity or overfitting risk of the multivariate model — a useful reminder that model complexity should be validated against true performance, not training fit, before being deployed. Practical next steps worth </w:t>
-      </w:r>
-      <w:proofErr w:type="gramStart"/>
-      <w:r>
-        <w:rPr>
-          <w:sz w:val="28"/>
-          <w:szCs w:val="28"/>
-        </w:rPr>
-        <w:t>considering:</w:t>
-      </w:r>
-      <w:proofErr w:type="gramEnd"/>
-      <w:r>
-        <w:rPr>
-          <w:sz w:val="28"/>
-          <w:szCs w:val="28"/>
-        </w:rPr>
-        <w:t xml:space="preserve"> per-paddock or per-cluster fine-tuning rather than one shared model across all 19 paddocks; gathering more historical timesteps per paddock before adding additional input features; and applying stronger </w:t>
-      </w:r>
-      <w:proofErr w:type="spellStart"/>
-      <w:r>
-        <w:rPr>
-          <w:sz w:val="28"/>
-          <w:szCs w:val="28"/>
-        </w:rPr>
-        <w:t>regularisation</w:t>
-      </w:r>
-      <w:proofErr w:type="spellEnd"/>
-      <w:r>
-        <w:rPr>
-          <w:sz w:val="28"/>
-          <w:szCs w:val="28"/>
-        </w:rPr>
-        <w:t xml:space="preserve"> (e.g., increased dropout, L2 weight decay) specifically for the multivariate model given its overfitting signature. Until such improvements are validated on genuine forecasting performance, multivariate model outputs should be treated as indicative at best, with univariate Model 2 preferred for operational use.</w:t>
+        <w:t>For AgriWebb, these results suggest the current multivariate model should not be deployed as-is for operational forecasting: a Test R² of 0.16 means it explains only a modest share of the variance in genuinely future pasture growth, and its strong training-time metrics (Train R² = 0.81) considerably overstate how well it generalises. Model 2 (univariate, Lookback=10) is the most defensible of the three for practical use here, since it shows the best genuine forecasting performance (Test R² = 0.33, Test RMSE = 342.35) without the added complexity or overfitting risk of the multivariate model — a useful reminder that model complexity should be validated against true performance, not training fit, before being deployed. Practical next steps worth considering: per-paddock or per-cluster fine-tuning rather than one shared model across all 19 paddocks; gathering more historical timesteps per paddock before adding additional input features; and applying stronger regularisation (e.g., increased dropout, L2 weight decay) specifically for the multivariate model given its overfitting signature. Until such improvements are validated on genuine forecasting performance, multivariate model outputs should be treated as indicative at best, with univariate Model 2 preferred for operational use.</w:t>
       </w:r>
     </w:p>
     <w:p>
@@ -10896,23 +10073,13 @@
         </w:rPr>
         <w:t xml:space="preserve">The </w:t>
       </w:r>
-      <w:proofErr w:type="spellStart"/>
       <w:r>
         <w:rPr>
           <w:i/>
           <w:sz w:val="28"/>
           <w:szCs w:val="28"/>
         </w:rPr>
-        <w:t>hydrogen_small</w:t>
-      </w:r>
-      <w:proofErr w:type="spellEnd"/>
-      <w:r>
-        <w:rPr>
-          <w:i/>
-          <w:sz w:val="28"/>
-          <w:szCs w:val="28"/>
-        </w:rPr>
-        <w:t xml:space="preserve"> </w:t>
+        <w:t xml:space="preserve">hydrogen_small </w:t>
       </w:r>
       <w:r>
         <w:rPr>
@@ -10993,39 +10160,7 @@
           <w:sz w:val="28"/>
           <w:szCs w:val="28"/>
         </w:rPr>
-        <w:t xml:space="preserve">handles), and non-ASCII characters were stripped via regular expressions, and consecutive whitespace was normalized to single spaces. Raw tweets are noisy — links, handles, and stray symbols carry no topical signal and would otherwise be </w:t>
-      </w:r>
-      <w:proofErr w:type="spellStart"/>
-      <w:r>
-        <w:rPr>
-          <w:sz w:val="28"/>
-          <w:szCs w:val="28"/>
-        </w:rPr>
-        <w:t>tokenised</w:t>
-      </w:r>
-      <w:proofErr w:type="spellEnd"/>
-      <w:r>
-        <w:rPr>
-          <w:sz w:val="28"/>
-          <w:szCs w:val="28"/>
-        </w:rPr>
-        <w:t xml:space="preserve"> as meaningless sub-word units, diluting the input the model </w:t>
-      </w:r>
-      <w:proofErr w:type="gramStart"/>
-      <w:r>
-        <w:rPr>
-          <w:sz w:val="28"/>
-          <w:szCs w:val="28"/>
-        </w:rPr>
-        <w:t>actually needs</w:t>
-      </w:r>
-      <w:proofErr w:type="gramEnd"/>
-      <w:r>
-        <w:rPr>
-          <w:sz w:val="28"/>
-          <w:szCs w:val="28"/>
-        </w:rPr>
-        <w:t xml:space="preserve"> to attend to.</w:t>
+        <w:t>handles), and non-ASCII characters were stripped via regular expressions, and consecutive whitespace was normalized to single spaces. Raw tweets are noisy — links, handles, and stray symbols carry no topical signal and would otherwise be tokenised as meaningless sub-word units, diluting the input the model actually needs to attend to.</w:t>
       </w:r>
     </w:p>
     <w:p>
@@ -11055,23 +10190,7 @@
           <w:sz w:val="28"/>
           <w:szCs w:val="28"/>
         </w:rPr>
-        <w:t xml:space="preserve">: labels were mapped to binary integers, Relevant = 1 and Irrelevant = 0, since </w:t>
-      </w:r>
-      <w:proofErr w:type="spellStart"/>
-      <w:r>
-        <w:rPr>
-          <w:sz w:val="28"/>
-          <w:szCs w:val="28"/>
-        </w:rPr>
-        <w:t>AutoModelForSequenceClassification</w:t>
-      </w:r>
-      <w:proofErr w:type="spellEnd"/>
-      <w:r>
-        <w:rPr>
-          <w:sz w:val="28"/>
-          <w:szCs w:val="28"/>
-        </w:rPr>
-        <w:t xml:space="preserve"> and Cross-Entropy Loss require integer class targets rather than string labels.</w:t>
+        <w:t>: labels were mapped to binary integers, Relevant = 1 and Irrelevant = 0, since AutoModelForSequenceClassification and Cross-Entropy Loss require integer class targets rather than string labels.</w:t>
       </w:r>
     </w:p>
     <w:p>
@@ -11087,7 +10206,6 @@
           <w:szCs w:val="28"/>
         </w:rPr>
       </w:pPr>
-      <w:proofErr w:type="spellStart"/>
       <w:r>
         <w:rPr>
           <w:b/>
@@ -11097,7 +10215,6 @@
         </w:rPr>
         <w:t>Tokenisation</w:t>
       </w:r>
-      <w:proofErr w:type="spellEnd"/>
       <w:r>
         <w:rPr>
           <w:sz w:val="28"/>
@@ -11242,21 +10359,12 @@
                 <w:szCs w:val="28"/>
               </w:rPr>
             </w:pPr>
-            <w:proofErr w:type="spellStart"/>
-            <w:r>
-              <w:rPr>
-                <w:sz w:val="28"/>
-                <w:szCs w:val="28"/>
-              </w:rPr>
-              <w:t>bert</w:t>
-            </w:r>
-            <w:proofErr w:type="spellEnd"/>
-            <w:r>
-              <w:rPr>
-                <w:sz w:val="28"/>
-                <w:szCs w:val="28"/>
-              </w:rPr>
-              <w:t>-base-uncased</w:t>
+            <w:r>
+              <w:rPr>
+                <w:sz w:val="28"/>
+                <w:szCs w:val="28"/>
+              </w:rPr>
+              <w:t>bert-base-uncased</w:t>
             </w:r>
           </w:p>
         </w:tc>
@@ -11282,23 +10390,7 @@
                 <w:sz w:val="28"/>
                 <w:szCs w:val="28"/>
               </w:rPr>
-              <w:t xml:space="preserve">General-domain bidirectional transformer pre-trained on Wikipedia and </w:t>
-            </w:r>
-            <w:proofErr w:type="spellStart"/>
-            <w:r>
-              <w:rPr>
-                <w:sz w:val="28"/>
-                <w:szCs w:val="28"/>
-              </w:rPr>
-              <w:t>BookCorpus</w:t>
-            </w:r>
-            <w:proofErr w:type="spellEnd"/>
-            <w:r>
-              <w:rPr>
-                <w:sz w:val="28"/>
-                <w:szCs w:val="28"/>
-              </w:rPr>
-              <w:t>; serves as a reliable, well-understood benchmark.</w:t>
+              <w:t>General-domain bidirectional transformer pre-trained on Wikipedia and BookCorpus; serves as a reliable, well-understood benchmark.</w:t>
             </w:r>
           </w:p>
         </w:tc>
@@ -11321,37 +10413,12 @@
                 <w:szCs w:val="28"/>
               </w:rPr>
             </w:pPr>
-            <w:proofErr w:type="spellStart"/>
-            <w:r>
-              <w:rPr>
-                <w:sz w:val="28"/>
-                <w:szCs w:val="28"/>
-              </w:rPr>
-              <w:t>vinai</w:t>
-            </w:r>
-            <w:proofErr w:type="spellEnd"/>
-            <w:r>
-              <w:rPr>
-                <w:sz w:val="28"/>
-                <w:szCs w:val="28"/>
-              </w:rPr>
-              <w:t>/</w:t>
-            </w:r>
-            <w:proofErr w:type="spellStart"/>
-            <w:r>
-              <w:rPr>
-                <w:sz w:val="28"/>
-                <w:szCs w:val="28"/>
-              </w:rPr>
-              <w:t>bertweet</w:t>
-            </w:r>
-            <w:proofErr w:type="spellEnd"/>
-            <w:r>
-              <w:rPr>
-                <w:sz w:val="28"/>
-                <w:szCs w:val="28"/>
-              </w:rPr>
-              <w:t>-base</w:t>
+            <w:r>
+              <w:rPr>
+                <w:sz w:val="28"/>
+                <w:szCs w:val="28"/>
+              </w:rPr>
+              <w:t>vinai/bertweet-base</w:t>
             </w:r>
           </w:p>
         </w:tc>
@@ -11372,37 +10439,12 @@
                 <w:szCs w:val="28"/>
               </w:rPr>
             </w:pPr>
-            <w:proofErr w:type="spellStart"/>
-            <w:r>
-              <w:rPr>
-                <w:sz w:val="28"/>
-                <w:szCs w:val="28"/>
-              </w:rPr>
-              <w:t>RoBERTa</w:t>
-            </w:r>
-            <w:proofErr w:type="spellEnd"/>
-            <w:r>
-              <w:rPr>
-                <w:sz w:val="28"/>
-                <w:szCs w:val="28"/>
-              </w:rPr>
-              <w:t xml:space="preserve">-based model pre-trained on 850 million English tweets, specifically </w:t>
-            </w:r>
-            <w:proofErr w:type="spellStart"/>
-            <w:r>
-              <w:rPr>
-                <w:sz w:val="28"/>
-                <w:szCs w:val="28"/>
-              </w:rPr>
-              <w:t>optimised</w:t>
-            </w:r>
-            <w:proofErr w:type="spellEnd"/>
-            <w:r>
-              <w:rPr>
-                <w:sz w:val="28"/>
-                <w:szCs w:val="28"/>
-              </w:rPr>
-              <w:t xml:space="preserve"> for Twitter slang, syntax, and informal phrasing — matches the register of the target data.</w:t>
+            <w:r>
+              <w:rPr>
+                <w:sz w:val="28"/>
+                <w:szCs w:val="28"/>
+              </w:rPr>
+              <w:t>RoBERTa-based model pre-trained on 850 million English tweets, specifically optimised for Twitter slang, syntax, and informal phrasing — matches the register of the target data.</w:t>
             </w:r>
           </w:p>
         </w:tc>
@@ -11463,23 +10505,13 @@
         </w:rPr>
         <w:t xml:space="preserve">: stratified 70/30 (700 train / 300 test), </w:t>
       </w:r>
-      <w:proofErr w:type="spellStart"/>
       <w:r>
         <w:rPr>
           <w:i/>
           <w:sz w:val="28"/>
           <w:szCs w:val="28"/>
         </w:rPr>
-        <w:t>random_state</w:t>
-      </w:r>
-      <w:proofErr w:type="spellEnd"/>
-      <w:r>
-        <w:rPr>
-          <w:i/>
-          <w:sz w:val="28"/>
-          <w:szCs w:val="28"/>
-        </w:rPr>
-        <w:t xml:space="preserve">=42 </w:t>
+        <w:t xml:space="preserve">random_state=42 </w:t>
       </w:r>
       <w:r>
         <w:rPr>
@@ -11534,7 +10566,6 @@
         </w:rPr>
         <w:t xml:space="preserve"> Loss via </w:t>
       </w:r>
-      <w:proofErr w:type="spellStart"/>
       <w:r>
         <w:rPr>
           <w:i/>
@@ -11544,29 +10575,12 @@
         </w:rPr>
         <w:t>AutoModelForSequenceClassification</w:t>
       </w:r>
-      <w:proofErr w:type="spellEnd"/>
-      <w:r>
-        <w:rPr>
-          <w:sz w:val="28"/>
-          <w:szCs w:val="28"/>
-        </w:rPr>
-        <w:t xml:space="preserve">. This is the appropriate loss for binary classification because it is derived from negative log-likelihood and heavily </w:t>
-      </w:r>
-      <w:proofErr w:type="spellStart"/>
-      <w:r>
-        <w:rPr>
-          <w:sz w:val="28"/>
-          <w:szCs w:val="28"/>
-        </w:rPr>
-        <w:t>penalises</w:t>
-      </w:r>
-      <w:proofErr w:type="spellEnd"/>
-      <w:r>
-        <w:rPr>
-          <w:sz w:val="28"/>
-          <w:szCs w:val="28"/>
-        </w:rPr>
-        <w:t xml:space="preserve"> confident, incorrect probability predictions, encouraging well-calibrated outputs.</w:t>
+      <w:r>
+        <w:rPr>
+          <w:sz w:val="28"/>
+          <w:szCs w:val="28"/>
+        </w:rPr>
+        <w:t>. This is the appropriate loss for binary classification because it is derived from negative log-likelihood and heavily penalises confident, incorrect probability predictions, encouraging well-calibrated outputs.</w:t>
       </w:r>
     </w:p>
     <w:p>
@@ -11656,7 +10670,6 @@
         </w:rPr>
         <w:t xml:space="preserve"> 16 (train) / 32 (eval), learning rate 2e-5 with the </w:t>
       </w:r>
-      <w:proofErr w:type="spellStart"/>
       <w:r>
         <w:rPr>
           <w:i/>
@@ -11666,29 +10679,12 @@
         </w:rPr>
         <w:t>AdamW</w:t>
       </w:r>
-      <w:proofErr w:type="spellEnd"/>
-      <w:r>
-        <w:rPr>
-          <w:sz w:val="28"/>
-          <w:szCs w:val="28"/>
-        </w:rPr>
-        <w:t xml:space="preserve"> </w:t>
-      </w:r>
-      <w:proofErr w:type="spellStart"/>
-      <w:r>
-        <w:rPr>
-          <w:sz w:val="28"/>
-          <w:szCs w:val="28"/>
-        </w:rPr>
-        <w:t>optimiser</w:t>
-      </w:r>
-      <w:proofErr w:type="spellEnd"/>
-      <w:r>
-        <w:rPr>
-          <w:sz w:val="28"/>
-          <w:szCs w:val="28"/>
-        </w:rPr>
-        <w:t>, weight decay 0.01 for L2 regularization.</w:t>
+      <w:r>
+        <w:rPr>
+          <w:sz w:val="28"/>
+          <w:szCs w:val="28"/>
+        </w:rPr>
+        <w:t xml:space="preserve"> optimiser, weight decay 0.01 for L2 regularization.</w:t>
       </w:r>
     </w:p>
     <w:p>
@@ -11840,21 +10836,12 @@
                 <w:szCs w:val="28"/>
               </w:rPr>
             </w:pPr>
-            <w:proofErr w:type="spellStart"/>
-            <w:r>
-              <w:rPr>
-                <w:sz w:val="28"/>
-                <w:szCs w:val="28"/>
-              </w:rPr>
-              <w:t>bert</w:t>
-            </w:r>
-            <w:proofErr w:type="spellEnd"/>
-            <w:r>
-              <w:rPr>
-                <w:sz w:val="28"/>
-                <w:szCs w:val="28"/>
-              </w:rPr>
-              <w:t>-base-uncased</w:t>
+            <w:r>
+              <w:rPr>
+                <w:sz w:val="28"/>
+                <w:szCs w:val="28"/>
+              </w:rPr>
+              <w:t>bert-base-uncased</w:t>
             </w:r>
           </w:p>
         </w:tc>
@@ -11985,37 +10972,12 @@
                 <w:szCs w:val="28"/>
               </w:rPr>
             </w:pPr>
-            <w:proofErr w:type="spellStart"/>
-            <w:r>
-              <w:rPr>
-                <w:sz w:val="28"/>
-                <w:szCs w:val="28"/>
-              </w:rPr>
-              <w:t>vinai</w:t>
-            </w:r>
-            <w:proofErr w:type="spellEnd"/>
-            <w:r>
-              <w:rPr>
-                <w:sz w:val="28"/>
-                <w:szCs w:val="28"/>
-              </w:rPr>
-              <w:t>/</w:t>
-            </w:r>
-            <w:proofErr w:type="spellStart"/>
-            <w:r>
-              <w:rPr>
-                <w:sz w:val="28"/>
-                <w:szCs w:val="28"/>
-              </w:rPr>
-              <w:t>bertweet</w:t>
-            </w:r>
-            <w:proofErr w:type="spellEnd"/>
-            <w:r>
-              <w:rPr>
-                <w:sz w:val="28"/>
-                <w:szCs w:val="28"/>
-              </w:rPr>
-              <w:t>-base</w:t>
+            <w:r>
+              <w:rPr>
+                <w:sz w:val="28"/>
+                <w:szCs w:val="28"/>
+              </w:rPr>
+              <w:t>vinai/bertweet-base</w:t>
             </w:r>
           </w:p>
         </w:tc>
@@ -12126,7 +11088,6 @@
         </w:rPr>
         <w:t xml:space="preserve">Note that </w:t>
       </w:r>
-      <w:proofErr w:type="spellStart"/>
       <w:r>
         <w:rPr>
           <w:i/>
@@ -12134,9 +11095,15 @@
           <w:sz w:val="28"/>
           <w:szCs w:val="28"/>
         </w:rPr>
-        <w:t>bert</w:t>
-      </w:r>
-      <w:proofErr w:type="spellEnd"/>
+        <w:t>bert-base-uncased</w:t>
+      </w:r>
+      <w:r>
+        <w:rPr>
+          <w:sz w:val="28"/>
+          <w:szCs w:val="28"/>
+        </w:rPr>
+        <w:t xml:space="preserve"> shows a larger train–test gap (97.14% → 91.67%) than </w:t>
+      </w:r>
       <w:r>
         <w:rPr>
           <w:i/>
@@ -12144,16 +11111,48 @@
           <w:sz w:val="28"/>
           <w:szCs w:val="28"/>
         </w:rPr>
-        <w:t>-base-uncased</w:t>
-      </w:r>
-      <w:r>
-        <w:rPr>
-          <w:sz w:val="28"/>
-          <w:szCs w:val="28"/>
-        </w:rPr>
-        <w:t xml:space="preserve"> shows a larger train–test gap (97.14% → 91.67%) than </w:t>
-      </w:r>
-      <w:proofErr w:type="spellStart"/>
+        <w:t>bertweet-base</w:t>
+      </w:r>
+      <w:r>
+        <w:rPr>
+          <w:sz w:val="28"/>
+          <w:szCs w:val="28"/>
+        </w:rPr>
+        <w:t xml:space="preserve"> (94.43% → 93.33%), suggesting bertweet-base generalizes slightly better to unseen tweets — consistent with its domain-matched pretraining.</w:t>
+      </w:r>
+    </w:p>
+    <w:p>
+      <w:pPr>
+        <w:pStyle w:val="Heading2"/>
+        <w:spacing w:before="300" w:after="150"/>
+        <w:rPr>
+          <w:sz w:val="32"/>
+          <w:szCs w:val="32"/>
+        </w:rPr>
+      </w:pPr>
+      <w:r>
+        <w:rPr>
+          <w:sz w:val="32"/>
+          <w:szCs w:val="32"/>
+        </w:rPr>
+        <w:t>9.3 Attention Weights Analysis</w:t>
+      </w:r>
+    </w:p>
+    <w:p>
+      <w:pPr>
+        <w:spacing w:after="150"/>
+        <w:rPr>
+          <w:sz w:val="28"/>
+          <w:szCs w:val="28"/>
+        </w:rPr>
+      </w:pPr>
+      <w:r>
+        <w:rPr>
+          <w:sz w:val="28"/>
+          <w:szCs w:val="28"/>
+        </w:rPr>
+        <w:t>Attention weights were averaged across all layers and heads of the best-performing model (</w:t>
+      </w:r>
       <w:r>
         <w:rPr>
           <w:i/>
@@ -12161,113 +11160,7 @@
           <w:sz w:val="28"/>
           <w:szCs w:val="28"/>
         </w:rPr>
-        <w:t>bertweet</w:t>
-      </w:r>
-      <w:proofErr w:type="spellEnd"/>
-      <w:r>
-        <w:rPr>
-          <w:i/>
-          <w:iCs/>
-          <w:sz w:val="28"/>
-          <w:szCs w:val="28"/>
-        </w:rPr>
-        <w:t>-base</w:t>
-      </w:r>
-      <w:r>
-        <w:rPr>
-          <w:sz w:val="28"/>
-          <w:szCs w:val="28"/>
-        </w:rPr>
-        <w:t xml:space="preserve"> (94.43% → 93.33%), suggesting </w:t>
-      </w:r>
-      <w:proofErr w:type="spellStart"/>
-      <w:r>
-        <w:rPr>
-          <w:sz w:val="28"/>
-          <w:szCs w:val="28"/>
-        </w:rPr>
-        <w:t>bertweet</w:t>
-      </w:r>
-      <w:proofErr w:type="spellEnd"/>
-      <w:r>
-        <w:rPr>
-          <w:sz w:val="28"/>
-          <w:szCs w:val="28"/>
-        </w:rPr>
-        <w:t>-base generalizes slightly better to unseen tweets — consistent with its domain-matched pretraining.</w:t>
-      </w:r>
-    </w:p>
-    <w:p>
-      <w:pPr>
-        <w:pStyle w:val="Heading2"/>
-        <w:spacing w:before="300" w:after="150"/>
-        <w:rPr>
-          <w:sz w:val="32"/>
-          <w:szCs w:val="32"/>
-        </w:rPr>
-      </w:pPr>
-      <w:r>
-        <w:rPr>
-          <w:sz w:val="32"/>
-          <w:szCs w:val="32"/>
-        </w:rPr>
-        <w:t>9.3 Attention Weights Analysis</w:t>
-      </w:r>
-    </w:p>
-    <w:p>
-      <w:pPr>
-        <w:spacing w:after="150"/>
-        <w:rPr>
-          <w:sz w:val="28"/>
-          <w:szCs w:val="28"/>
-        </w:rPr>
-      </w:pPr>
-      <w:r>
-        <w:rPr>
-          <w:sz w:val="28"/>
-          <w:szCs w:val="28"/>
-        </w:rPr>
-        <w:t>Attention weights were averaged across all layers and heads of the best-performing model (</w:t>
-      </w:r>
-      <w:proofErr w:type="spellStart"/>
-      <w:r>
-        <w:rPr>
-          <w:i/>
-          <w:iCs/>
-          <w:sz w:val="28"/>
-          <w:szCs w:val="28"/>
-        </w:rPr>
-        <w:t>vinai</w:t>
-      </w:r>
-      <w:proofErr w:type="spellEnd"/>
-      <w:r>
-        <w:rPr>
-          <w:i/>
-          <w:iCs/>
-          <w:sz w:val="28"/>
-          <w:szCs w:val="28"/>
-        </w:rPr>
-        <w:t>/</w:t>
-      </w:r>
-      <w:proofErr w:type="spellStart"/>
-      <w:r>
-        <w:rPr>
-          <w:i/>
-          <w:iCs/>
-          <w:sz w:val="28"/>
-          <w:szCs w:val="28"/>
-        </w:rPr>
-        <w:t>bertweet</w:t>
-      </w:r>
-      <w:proofErr w:type="spellEnd"/>
-      <w:r>
-        <w:rPr>
-          <w:i/>
-          <w:iCs/>
-          <w:sz w:val="28"/>
-          <w:szCs w:val="28"/>
-        </w:rPr>
-        <w:t>-base</w:t>
+        <w:t>vinai/bertweet-base</w:t>
       </w:r>
       <w:r>
         <w:rPr>
@@ -12917,7 +11810,6 @@
                 <w:szCs w:val="28"/>
               </w:rPr>
             </w:pPr>
-            <w:proofErr w:type="gramStart"/>
             <w:r>
               <w:rPr>
                 <w:b/>
@@ -12925,9 +11817,28 @@
                 <w:sz w:val="28"/>
                 <w:szCs w:val="28"/>
               </w:rPr>
-              <w:t>Recall</w:t>
-            </w:r>
-            <w:proofErr w:type="gramEnd"/>
+              <w:t>Recall (Relevant)</w:t>
+            </w:r>
+          </w:p>
+        </w:tc>
+        <w:tc>
+          <w:tcPr>
+            <w:tcW w:w="1272" w:type="dxa"/>
+            <w:shd w:val="clear" w:color="auto" w:fill="DDEBF7"/>
+            <w:tcMar>
+              <w:top w:w="100" w:type="dxa"/>
+              <w:left w:w="100" w:type="dxa"/>
+              <w:bottom w:w="100" w:type="dxa"/>
+              <w:right w:w="100" w:type="dxa"/>
+            </w:tcMar>
+          </w:tcPr>
+          <w:p>
+            <w:pPr>
+              <w:rPr>
+                <w:sz w:val="28"/>
+                <w:szCs w:val="28"/>
+              </w:rPr>
+            </w:pPr>
             <w:r>
               <w:rPr>
                 <w:b/>
@@ -12935,13 +11846,13 @@
                 <w:sz w:val="28"/>
                 <w:szCs w:val="28"/>
               </w:rPr>
-              <w:t xml:space="preserve"> (Relevant)</w:t>
-            </w:r>
-          </w:p>
-        </w:tc>
-        <w:tc>
-          <w:tcPr>
-            <w:tcW w:w="1272" w:type="dxa"/>
+              <w:t>F1 (Relevant)</w:t>
+            </w:r>
+          </w:p>
+        </w:tc>
+        <w:tc>
+          <w:tcPr>
+            <w:tcW w:w="1191" w:type="dxa"/>
             <w:shd w:val="clear" w:color="auto" w:fill="DDEBF7"/>
             <w:tcMar>
               <w:top w:w="100" w:type="dxa"/>
@@ -12964,35 +11875,6 @@
                 <w:sz w:val="28"/>
                 <w:szCs w:val="28"/>
               </w:rPr>
-              <w:t>F1 (Relevant)</w:t>
-            </w:r>
-          </w:p>
-        </w:tc>
-        <w:tc>
-          <w:tcPr>
-            <w:tcW w:w="1191" w:type="dxa"/>
-            <w:shd w:val="clear" w:color="auto" w:fill="DDEBF7"/>
-            <w:tcMar>
-              <w:top w:w="100" w:type="dxa"/>
-              <w:left w:w="100" w:type="dxa"/>
-              <w:bottom w:w="100" w:type="dxa"/>
-              <w:right w:w="100" w:type="dxa"/>
-            </w:tcMar>
-          </w:tcPr>
-          <w:p>
-            <w:pPr>
-              <w:rPr>
-                <w:sz w:val="28"/>
-                <w:szCs w:val="28"/>
-              </w:rPr>
-            </w:pPr>
-            <w:r>
-              <w:rPr>
-                <w:b/>
-                <w:bCs/>
-                <w:sz w:val="28"/>
-                <w:szCs w:val="28"/>
-              </w:rPr>
               <w:t>ROC-AUC</w:t>
             </w:r>
           </w:p>
@@ -13174,21 +12056,12 @@
                 <w:szCs w:val="28"/>
               </w:rPr>
             </w:pPr>
-            <w:proofErr w:type="spellStart"/>
-            <w:r>
-              <w:rPr>
-                <w:sz w:val="28"/>
-                <w:szCs w:val="28"/>
-              </w:rPr>
-              <w:t>bert</w:t>
-            </w:r>
-            <w:proofErr w:type="spellEnd"/>
-            <w:r>
-              <w:rPr>
-                <w:sz w:val="28"/>
-                <w:szCs w:val="28"/>
-              </w:rPr>
-              <w:t>-base-uncased</w:t>
+            <w:r>
+              <w:rPr>
+                <w:sz w:val="28"/>
+                <w:szCs w:val="28"/>
+              </w:rPr>
+              <w:t>bert-base-uncased</w:t>
             </w:r>
           </w:p>
         </w:tc>
@@ -13341,37 +12214,12 @@
                 <w:szCs w:val="28"/>
               </w:rPr>
             </w:pPr>
-            <w:proofErr w:type="spellStart"/>
-            <w:r>
-              <w:rPr>
-                <w:sz w:val="28"/>
-                <w:szCs w:val="28"/>
-              </w:rPr>
-              <w:t>vinai</w:t>
-            </w:r>
-            <w:proofErr w:type="spellEnd"/>
-            <w:r>
-              <w:rPr>
-                <w:sz w:val="28"/>
-                <w:szCs w:val="28"/>
-              </w:rPr>
-              <w:t>/</w:t>
-            </w:r>
-            <w:proofErr w:type="spellStart"/>
-            <w:r>
-              <w:rPr>
-                <w:sz w:val="28"/>
-                <w:szCs w:val="28"/>
-              </w:rPr>
-              <w:t>bertweet</w:t>
-            </w:r>
-            <w:proofErr w:type="spellEnd"/>
-            <w:r>
-              <w:rPr>
-                <w:sz w:val="28"/>
-                <w:szCs w:val="28"/>
-              </w:rPr>
-              <w:t>-base (Best)</w:t>
+            <w:r>
+              <w:rPr>
+                <w:sz w:val="28"/>
+                <w:szCs w:val="28"/>
+              </w:rPr>
+              <w:t>vinai/bertweet-base (Best)</w:t>
             </w:r>
           </w:p>
         </w:tc>
@@ -13749,23 +12597,13 @@
         </w:rPr>
         <w:t xml:space="preserve">10.1 Preprocessing </w:t>
       </w:r>
-      <w:proofErr w:type="spellStart"/>
       <w:r>
         <w:rPr>
           <w:i/>
           <w:sz w:val="32"/>
           <w:szCs w:val="32"/>
         </w:rPr>
-        <w:t>SQuAD_tiny</w:t>
-      </w:r>
-      <w:proofErr w:type="spellEnd"/>
-      <w:r>
-        <w:rPr>
-          <w:i/>
-          <w:sz w:val="32"/>
-          <w:szCs w:val="32"/>
-        </w:rPr>
-        <w:t xml:space="preserve"> </w:t>
+        <w:t xml:space="preserve">SQuAD_tiny </w:t>
       </w:r>
       <w:r>
         <w:rPr>
@@ -13793,23 +12631,7 @@
           <w:sz w:val="28"/>
           <w:szCs w:val="28"/>
         </w:rPr>
-        <w:t>Input format: each example was encoded as '</w:t>
-      </w:r>
-      <w:proofErr w:type="gramStart"/>
-      <w:r>
-        <w:rPr>
-          <w:sz w:val="28"/>
-          <w:szCs w:val="28"/>
-        </w:rPr>
-        <w:t>question: {</w:t>
-      </w:r>
-      <w:proofErr w:type="gramEnd"/>
-      <w:r>
-        <w:rPr>
-          <w:sz w:val="28"/>
-          <w:szCs w:val="28"/>
-        </w:rPr>
-        <w:t>question} context: {context}'. T5 is a text-to-text model with no task-specific architecture head, so every task must be expressed as a natural-language instruction — this explicit prefix tells the model it is being asked to perform extractive/generative question answering rather than any other text-to-text task.</w:t>
+        <w:t>Input format: each example was encoded as 'question: {question} context: {context}'. T5 is a text-to-text model with no task-specific architecture head, so every task must be expressed as a natural-language instruction — this explicit prefix tells the model it is being asked to perform extractive/generative question answering rather than any other text-to-text task.</w:t>
       </w:r>
     </w:p>
     <w:p>
@@ -13830,23 +12652,7 @@
           <w:sz w:val="28"/>
           <w:szCs w:val="28"/>
         </w:rPr>
-        <w:t xml:space="preserve">Tokenization: inputs were tokenized to a maximum length of 512 tokens (long enough to hold the </w:t>
-      </w:r>
-      <w:proofErr w:type="spellStart"/>
-      <w:r>
-        <w:rPr>
-          <w:sz w:val="28"/>
-          <w:szCs w:val="28"/>
-        </w:rPr>
-        <w:t>SQuAD</w:t>
-      </w:r>
-      <w:proofErr w:type="spellEnd"/>
-      <w:r>
-        <w:rPr>
-          <w:sz w:val="28"/>
-          <w:szCs w:val="28"/>
-        </w:rPr>
-        <w:t xml:space="preserve"> context passage plus the question) and target answers to a maximum of 128 tokens, both with padding and truncation for uniform batch shapes.</w:t>
+        <w:t>Tokenization: inputs were tokenized to a maximum length of 512 tokens (long enough to hold the SQuAD context passage plus the question) and target answers to a maximum of 128 tokens, both with padding and truncation for uniform batch shapes.</w:t>
       </w:r>
     </w:p>
     <w:p>
@@ -13867,73 +12673,15 @@
           <w:sz w:val="28"/>
           <w:szCs w:val="28"/>
         </w:rPr>
-        <w:t>Dataset split: 1,000 training examples (</w:t>
-      </w:r>
-      <w:proofErr w:type="spellStart"/>
-      <w:r>
-        <w:rPr>
-          <w:sz w:val="28"/>
-          <w:szCs w:val="28"/>
-        </w:rPr>
-        <w:t>SQuAD</w:t>
-      </w:r>
-      <w:proofErr w:type="spellEnd"/>
-      <w:r>
-        <w:rPr>
-          <w:sz w:val="28"/>
-          <w:szCs w:val="28"/>
-        </w:rPr>
-        <w:t xml:space="preserve"> train indices 10,000–10,999), 100 validation examples (</w:t>
-      </w:r>
-      <w:proofErr w:type="spellStart"/>
-      <w:r>
-        <w:rPr>
-          <w:sz w:val="28"/>
-          <w:szCs w:val="28"/>
-        </w:rPr>
-        <w:t>SQuAD</w:t>
-      </w:r>
-      <w:proofErr w:type="spellEnd"/>
-      <w:r>
-        <w:rPr>
-          <w:sz w:val="28"/>
-          <w:szCs w:val="28"/>
-        </w:rPr>
-        <w:t xml:space="preserve"> validation indices 3,000–3,099), and 100 test examples (</w:t>
-      </w:r>
-      <w:proofErr w:type="spellStart"/>
-      <w:r>
-        <w:rPr>
-          <w:sz w:val="28"/>
-          <w:szCs w:val="28"/>
-        </w:rPr>
-        <w:t>SQuAD</w:t>
-      </w:r>
-      <w:proofErr w:type="spellEnd"/>
-      <w:r>
-        <w:rPr>
-          <w:sz w:val="28"/>
-          <w:szCs w:val="28"/>
-        </w:rPr>
-        <w:t xml:space="preserve"> validation indices 3,100–3,199), following the </w:t>
-      </w:r>
-      <w:proofErr w:type="spellStart"/>
+        <w:t xml:space="preserve">Dataset split: 1,000 training examples (SQuAD train indices 10,000–10,999), 100 validation examples (SQuAD validation indices 3,000–3,099), and 100 test examples (SQuAD validation indices 3,100–3,199), following the </w:t>
+      </w:r>
       <w:r>
         <w:rPr>
           <w:i/>
           <w:sz w:val="28"/>
           <w:szCs w:val="28"/>
         </w:rPr>
-        <w:t>SQuAD_tiny</w:t>
-      </w:r>
-      <w:proofErr w:type="spellEnd"/>
-      <w:r>
-        <w:rPr>
-          <w:i/>
-          <w:sz w:val="28"/>
-          <w:szCs w:val="28"/>
-        </w:rPr>
-        <w:t xml:space="preserve"> </w:t>
+        <w:t xml:space="preserve">SQuAD_tiny </w:t>
       </w:r>
       <w:r>
         <w:rPr>
@@ -13989,39 +12737,7 @@
           <w:sz w:val="28"/>
           <w:szCs w:val="28"/>
         </w:rPr>
-        <w:t xml:space="preserve">Hyperparameters: 3 epochs, per-device batch size 8 (train and eval), learning rate </w:t>
-      </w:r>
-      <w:proofErr w:type="gramStart"/>
-      <w:r>
-        <w:rPr>
-          <w:sz w:val="28"/>
-          <w:szCs w:val="28"/>
-        </w:rPr>
-        <w:t>3e</w:t>
-      </w:r>
-      <w:proofErr w:type="gramEnd"/>
-      <w:r>
-        <w:rPr>
-          <w:sz w:val="28"/>
-          <w:szCs w:val="28"/>
-        </w:rPr>
-        <w:t>-4, weight decay 0.01, using Hugging Face's Trainer/</w:t>
-      </w:r>
-      <w:proofErr w:type="spellStart"/>
-      <w:r>
-        <w:rPr>
-          <w:sz w:val="28"/>
-          <w:szCs w:val="28"/>
-        </w:rPr>
-        <w:t>TrainingArguments</w:t>
-      </w:r>
-      <w:proofErr w:type="spellEnd"/>
-      <w:r>
-        <w:rPr>
-          <w:sz w:val="28"/>
-          <w:szCs w:val="28"/>
-        </w:rPr>
-        <w:t xml:space="preserve"> with epoch-level evaluation and checkpointing.</w:t>
+        <w:t>Hyperparameters: 3 epochs, per-device batch size 8 (train and eval), learning rate 3e-4, weight decay 0.01, using Hugging Face's Trainer/TrainingArguments with epoch-level evaluation and checkpointing.</w:t>
       </w:r>
     </w:p>
     <w:p>
@@ -14449,23 +13165,7 @@
           <w:sz w:val="28"/>
           <w:szCs w:val="28"/>
         </w:rPr>
-        <w:t xml:space="preserve">Overfitting-prevention strategies: weight decay (0.01) was applied as L2 regularization on model weights; a comparatively short fine-tuning run (3 epochs) was used given the small 1,000-example training set, and was further supported by the observed validation loss uptick at epoch 3 above; and a held-out validation set (100 examples, drawn from a different </w:t>
-      </w:r>
-      <w:proofErr w:type="spellStart"/>
-      <w:r>
-        <w:rPr>
-          <w:sz w:val="28"/>
-          <w:szCs w:val="28"/>
-        </w:rPr>
-        <w:t>SQuAD</w:t>
-      </w:r>
-      <w:proofErr w:type="spellEnd"/>
-      <w:r>
-        <w:rPr>
-          <w:sz w:val="28"/>
-          <w:szCs w:val="28"/>
-        </w:rPr>
-        <w:t xml:space="preserve"> split range to the training set) was evaluated after every epoch so that validation loss could be monitored for divergence from training loss.</w:t>
+        <w:t>Overfitting-prevention strategies: weight decay (0.01) was applied as L2 regularization on model weights; a comparatively short fine-tuning run (3 epochs) was used given the small 1,000-example training set, and was further supported by the observed validation loss uptick at epoch 3 above; and a held-out validation set (100 examples, drawn from a different SQuAD split range to the training set) was evaluated after every epoch so that validation loss could be monitored for divergence from training loss.</w:t>
       </w:r>
     </w:p>
     <w:p>
@@ -15773,23 +14473,7 @@
                 <w:sz w:val="28"/>
                 <w:szCs w:val="28"/>
               </w:rPr>
-              <w:t xml:space="preserve">What declaration </w:t>
-            </w:r>
-            <w:proofErr w:type="gramStart"/>
-            <w:r>
-              <w:rPr>
-                <w:sz w:val="28"/>
-                <w:szCs w:val="28"/>
-              </w:rPr>
-              <w:t>predicated</w:t>
-            </w:r>
-            <w:proofErr w:type="gramEnd"/>
-            <w:r>
-              <w:rPr>
-                <w:sz w:val="28"/>
-                <w:szCs w:val="28"/>
-              </w:rPr>
-              <w:t xml:space="preserve"> the emigration of Huguenot refugees?</w:t>
+              <w:t>What declaration predicated the emigration of Huguenot refugees?</w:t>
             </w:r>
           </w:p>
         </w:tc>
@@ -15810,21 +14494,12 @@
                 <w:szCs w:val="28"/>
               </w:rPr>
             </w:pPr>
-            <w:proofErr w:type="gramStart"/>
-            <w:r>
-              <w:rPr>
-                <w:sz w:val="28"/>
-                <w:szCs w:val="28"/>
-              </w:rPr>
-              <w:t>the revocation</w:t>
-            </w:r>
-            <w:proofErr w:type="gramEnd"/>
-            <w:r>
-              <w:rPr>
-                <w:sz w:val="28"/>
-                <w:szCs w:val="28"/>
-              </w:rPr>
-              <w:t xml:space="preserve"> of the Edict of Nantes</w:t>
+            <w:r>
+              <w:rPr>
+                <w:sz w:val="28"/>
+                <w:szCs w:val="28"/>
+              </w:rPr>
+              <w:t>the revocation of the Edict of Nantes</w:t>
             </w:r>
           </w:p>
         </w:tc>
@@ -15845,21 +14520,12 @@
                 <w:szCs w:val="28"/>
               </w:rPr>
             </w:pPr>
-            <w:proofErr w:type="gramStart"/>
-            <w:r>
-              <w:rPr>
-                <w:sz w:val="28"/>
-                <w:szCs w:val="28"/>
-              </w:rPr>
-              <w:t>the</w:t>
-            </w:r>
-            <w:proofErr w:type="gramEnd"/>
-            <w:r>
-              <w:rPr>
-                <w:sz w:val="28"/>
-                <w:szCs w:val="28"/>
-              </w:rPr>
-              <w:t xml:space="preserve"> Edict of Nantes</w:t>
+            <w:r>
+              <w:rPr>
+                <w:sz w:val="28"/>
+                <w:szCs w:val="28"/>
+              </w:rPr>
+              <w:t>the Edict of Nantes</w:t>
             </w:r>
           </w:p>
         </w:tc>
@@ -15971,23 +14637,7 @@
           <w:sz w:val="28"/>
           <w:szCs w:val="28"/>
         </w:rPr>
-        <w:t>Errors with context: Sample 2 answers with "2 million" (the population figure from a nearby sentence) instead of the actual refugee count ("75,000 to 100,000 people</w:t>
-      </w:r>
-      <w:proofErr w:type="gramStart"/>
-      <w:r>
-        <w:rPr>
-          <w:sz w:val="28"/>
-          <w:szCs w:val="28"/>
-        </w:rPr>
-        <w:t>") —</w:t>
-      </w:r>
-      <w:proofErr w:type="gramEnd"/>
-      <w:r>
-        <w:rPr>
-          <w:sz w:val="28"/>
-          <w:szCs w:val="28"/>
-        </w:rPr>
-        <w:t xml:space="preserve"> a plausible-sounding but factually wrong span, suggesting the model can confuse similar numeric entities appearing close together in the passage. Sample 4 produces "Cévennes" (a place name from elsewhere in the passage) rather than the correct two areas, indicating a similar entity-confusion failure mode. Sample 5 gives "the Edict of Nantes" instead of "the revocation of the Edict of Nantes” again close in content but missing the key qualifying word that changes the precise meaning of the answer.</w:t>
+        <w:t>Errors with context: Sample 2 answers with "2 million" (the population figure from a nearby sentence) instead of the actual refugee count ("75,000 to 100,000 people") — a plausible-sounding but factually wrong span, suggesting the model can confuse similar numeric entities appearing close together in the passage. Sample 4 produces "Cévennes" (a place name from elsewhere in the passage) rather than the correct two areas, indicating a similar entity-confusion failure mode. Sample 5 gives "the Edict of Nantes" instead of "the revocation of the Edict of Nantes” again close in content but missing the key qualifying word that changes the precise meaning of the answer.</w:t>
       </w:r>
     </w:p>
     <w:p>
@@ -16008,23 +14658,7 @@
           <w:sz w:val="28"/>
           <w:szCs w:val="28"/>
         </w:rPr>
-        <w:t xml:space="preserve">Without context: 4 of the 5 samples produce an empty string, and the one non-empty output (Sample 3) simply echoes back part of the question rather than answering it. This confirms the model has not memorized </w:t>
-      </w:r>
-      <w:proofErr w:type="spellStart"/>
-      <w:r>
-        <w:rPr>
-          <w:sz w:val="28"/>
-          <w:szCs w:val="28"/>
-        </w:rPr>
-        <w:t>SQuAD</w:t>
-      </w:r>
-      <w:proofErr w:type="spellEnd"/>
-      <w:r>
-        <w:rPr>
-          <w:sz w:val="28"/>
-          <w:szCs w:val="28"/>
-        </w:rPr>
-        <w:t xml:space="preserve"> facts during fine-tuning; it has learned to locate and extract spans from a supplied context, not to answer general-knowledge questions from parametric memory.</w:t>
+        <w:t>Without context: 4 of the 5 samples produce an empty string, and the one non-empty output (Sample 3) simply echoes back part of the question rather than answering it. This confirms the model has not memorized SQuAD facts during fine-tuning; it has learned to locate and extract spans from a supplied context, not to answer general-knowledge questions from parametric memory.</w:t>
       </w:r>
     </w:p>
     <w:p>
@@ -16040,23 +14674,7 @@
           <w:sz w:val="28"/>
           <w:szCs w:val="28"/>
         </w:rPr>
-        <w:t xml:space="preserve">This near-total performance collapse without context (ROUGE-1 F dropping from 0.57 to 0.0065) demonstrates that the fine-tuned model's competence is entirely context-dependent: it functions as a context-conditioned span extractor/generator rather than as a general question-answering system with independent world knowledge. This is expected given the small fine-tuning set (1,000 examples) is far too small to teach the model new factual knowledge but is entirely sufficient to teach it the </w:t>
-      </w:r>
-      <w:proofErr w:type="spellStart"/>
-      <w:r>
-        <w:rPr>
-          <w:sz w:val="28"/>
-          <w:szCs w:val="28"/>
-        </w:rPr>
-        <w:t>SQuAD</w:t>
-      </w:r>
-      <w:proofErr w:type="spellEnd"/>
-      <w:r>
-        <w:rPr>
-          <w:sz w:val="28"/>
-          <w:szCs w:val="28"/>
-        </w:rPr>
-        <w:t xml:space="preserve"> task format of locating an answer within a given passage.</w:t>
+        <w:t>This near-total performance collapse without context (ROUGE-1 F dropping from 0.57 to 0.0065) demonstrates that the fine-tuned model's competence is entirely context-dependent: it functions as a context-conditioned span extractor/generator rather than as a general question-answering system with independent world knowledge. This is expected given the small fine-tuning set (1,000 examples) is far too small to teach the model new factual knowledge but is entirely sufficient to teach it the SQuAD task format of locating an answer within a given passage.</w:t>
       </w:r>
     </w:p>
     <w:p>
@@ -17248,25 +15866,7 @@
                 <w:sz w:val="28"/>
                 <w:szCs w:val="28"/>
               </w:rPr>
-              <w:t>(</w:t>
-            </w:r>
-            <w:proofErr w:type="spellStart"/>
-            <w:r>
-              <w:rPr>
-                <w:i/>
-                <w:sz w:val="28"/>
-                <w:szCs w:val="28"/>
-              </w:rPr>
-              <w:t>SQuAD_tiny</w:t>
-            </w:r>
-            <w:proofErr w:type="spellEnd"/>
-            <w:r>
-              <w:rPr>
-                <w:i/>
-                <w:sz w:val="28"/>
-                <w:szCs w:val="28"/>
-              </w:rPr>
-              <w:t>)</w:t>
+              <w:t>(SQuAD_tiny)</w:t>
             </w:r>
           </w:p>
         </w:tc>
@@ -17478,185 +16078,53 @@
           <w:sz w:val="28"/>
           <w:szCs w:val="28"/>
         </w:rPr>
-        <w:t xml:space="preserve">Counter-intuitively, the pre-trained mrm8488/t5-base-finetuned-squadv2 model scored lower than the team's own fine-tuned t5-small on every ROUGE variant (e.g., ROUGE-1 F: 0.5323 vs. 0.5749), despite being a larger base architecture (t5-base) trained on the full </w:t>
-      </w:r>
-      <w:proofErr w:type="spellStart"/>
-      <w:r>
-        <w:rPr>
-          <w:sz w:val="28"/>
-          <w:szCs w:val="28"/>
-        </w:rPr>
-        <w:t>SQuAD</w:t>
-      </w:r>
-      <w:proofErr w:type="spellEnd"/>
-      <w:r>
-        <w:rPr>
-          <w:sz w:val="28"/>
-          <w:szCs w:val="28"/>
-        </w:rPr>
-        <w:t xml:space="preserve"> dataset (~87,000+ examples) rather than the 1,000-example </w:t>
-      </w:r>
-      <w:proofErr w:type="spellStart"/>
+        <w:t xml:space="preserve">Counter-intuitively, the pre-trained mrm8488/t5-base-finetuned-squadv2 model scored lower than the team's own fine-tuned t5-small on every ROUGE variant (e.g., ROUGE-1 F: 0.5323 vs. 0.5749), despite being a larger base architecture (t5-base) trained on the full SQuAD dataset (~87,000+ examples) rather than the 1,000-example </w:t>
+      </w:r>
       <w:r>
         <w:rPr>
           <w:i/>
           <w:sz w:val="28"/>
           <w:szCs w:val="28"/>
         </w:rPr>
-        <w:t>SQuAD_tiny</w:t>
-      </w:r>
-      <w:proofErr w:type="spellEnd"/>
+        <w:t xml:space="preserve">SQuAD_tiny </w:t>
+      </w:r>
+      <w:r>
+        <w:rPr>
+          <w:sz w:val="28"/>
+          <w:szCs w:val="28"/>
+        </w:rPr>
+        <w:t>subset.</w:t>
+      </w:r>
+    </w:p>
+    <w:p>
+      <w:pPr>
+        <w:spacing w:after="150"/>
+        <w:rPr>
+          <w:sz w:val="28"/>
+          <w:szCs w:val="28"/>
+        </w:rPr>
+      </w:pPr>
+      <w:r>
+        <w:rPr>
+          <w:sz w:val="28"/>
+          <w:szCs w:val="28"/>
+        </w:rPr>
+        <w:t xml:space="preserve">Two explanations plausibly account for this reversal. First, a domain/format match effect: the team's model was fine-tuned directly on training data drawn from the same SQuAD dataset structure and answer-length conventions as the test set (indices 3,100–3,199 of the SQuAD validation split), so its output style is closely matched to this specific evaluation set, whereas mrm8488 was shaped by the full, more heterogeneous SQuAD v1 training distribution and may produce longer or differently-phrased spans that reduce lexical overlap even when correct. Second, a SQuAD v2 vs. v1 mismatch: mrm8488 was fine-tuned on SQuAD v2, which includes unanswerable questions and trains the model to sometimes hedge or decline to answer; since every question in the </w:t>
+      </w:r>
       <w:r>
         <w:rPr>
           <w:i/>
           <w:sz w:val="28"/>
           <w:szCs w:val="28"/>
         </w:rPr>
-        <w:t xml:space="preserve"> </w:t>
-      </w:r>
-      <w:r>
-        <w:rPr>
-          <w:sz w:val="28"/>
-          <w:szCs w:val="28"/>
-        </w:rPr>
-        <w:t>subset.</w:t>
-      </w:r>
-    </w:p>
-    <w:p>
-      <w:pPr>
-        <w:spacing w:after="150"/>
-        <w:rPr>
-          <w:sz w:val="28"/>
-          <w:szCs w:val="28"/>
-        </w:rPr>
-      </w:pPr>
-      <w:r>
-        <w:rPr>
-          <w:sz w:val="28"/>
-          <w:szCs w:val="28"/>
-        </w:rPr>
-        <w:t xml:space="preserve">Two explanations plausibly account for this reversal. First, a domain/format match effect: the team's model was fine-tuned directly on training data drawn from the same </w:t>
-      </w:r>
-      <w:proofErr w:type="spellStart"/>
-      <w:r>
-        <w:rPr>
-          <w:sz w:val="28"/>
-          <w:szCs w:val="28"/>
-        </w:rPr>
-        <w:t>SQuAD</w:t>
-      </w:r>
-      <w:proofErr w:type="spellEnd"/>
-      <w:r>
-        <w:rPr>
-          <w:sz w:val="28"/>
-          <w:szCs w:val="28"/>
-        </w:rPr>
-        <w:t xml:space="preserve"> dataset structure and answer-length conventions as the test set (indices 3,100–3,199 of the </w:t>
-      </w:r>
-      <w:proofErr w:type="spellStart"/>
-      <w:r>
-        <w:rPr>
-          <w:sz w:val="28"/>
-          <w:szCs w:val="28"/>
-        </w:rPr>
-        <w:t>SQuAD</w:t>
-      </w:r>
-      <w:proofErr w:type="spellEnd"/>
-      <w:r>
-        <w:rPr>
-          <w:sz w:val="28"/>
-          <w:szCs w:val="28"/>
-        </w:rPr>
-        <w:t xml:space="preserve"> validation split), so its output style is closely matched to this specific evaluation set, whereas mrm8488 was shaped by the full, more heterogeneous </w:t>
-      </w:r>
-      <w:proofErr w:type="spellStart"/>
-      <w:r>
-        <w:rPr>
-          <w:sz w:val="28"/>
-          <w:szCs w:val="28"/>
-        </w:rPr>
-        <w:t>SQuAD</w:t>
-      </w:r>
-      <w:proofErr w:type="spellEnd"/>
-      <w:r>
-        <w:rPr>
-          <w:sz w:val="28"/>
-          <w:szCs w:val="28"/>
-        </w:rPr>
-        <w:t xml:space="preserve"> v1 training distribution and may produce longer or differently-phrased spans that reduce lexical overlap even when correct. Second, a </w:t>
-      </w:r>
-      <w:proofErr w:type="spellStart"/>
-      <w:r>
-        <w:rPr>
-          <w:sz w:val="28"/>
-          <w:szCs w:val="28"/>
-        </w:rPr>
-        <w:t>SQuAD</w:t>
-      </w:r>
-      <w:proofErr w:type="spellEnd"/>
-      <w:r>
-        <w:rPr>
-          <w:sz w:val="28"/>
-          <w:szCs w:val="28"/>
-        </w:rPr>
-        <w:t xml:space="preserve"> v2 vs. v1 mismatch: mrm8488 was fine-tuned on </w:t>
-      </w:r>
-      <w:proofErr w:type="spellStart"/>
-      <w:r>
-        <w:rPr>
-          <w:sz w:val="28"/>
-          <w:szCs w:val="28"/>
-        </w:rPr>
-        <w:t>SQuAD</w:t>
-      </w:r>
-      <w:proofErr w:type="spellEnd"/>
-      <w:r>
-        <w:rPr>
-          <w:sz w:val="28"/>
-          <w:szCs w:val="28"/>
-        </w:rPr>
-        <w:t xml:space="preserve"> v2, which includes unanswerable questions and trains the model to sometimes hedge or decline to answer; since every question in the </w:t>
-      </w:r>
-      <w:proofErr w:type="spellStart"/>
-      <w:r>
-        <w:rPr>
-          <w:i/>
-          <w:sz w:val="28"/>
-          <w:szCs w:val="28"/>
-        </w:rPr>
-        <w:t>SQuAD_tiny</w:t>
-      </w:r>
-      <w:proofErr w:type="spellEnd"/>
-      <w:r>
-        <w:rPr>
-          <w:i/>
-          <w:sz w:val="28"/>
-          <w:szCs w:val="28"/>
-        </w:rPr>
-        <w:t xml:space="preserve"> </w:t>
-      </w:r>
-      <w:r>
-        <w:rPr>
-          <w:sz w:val="28"/>
-          <w:szCs w:val="28"/>
-        </w:rPr>
-        <w:t xml:space="preserve">test set (drawn from </w:t>
-      </w:r>
-      <w:proofErr w:type="spellStart"/>
-      <w:r>
-        <w:rPr>
-          <w:sz w:val="28"/>
-          <w:szCs w:val="28"/>
-        </w:rPr>
-        <w:t>SQuAD</w:t>
-      </w:r>
-      <w:proofErr w:type="spellEnd"/>
-      <w:r>
-        <w:rPr>
-          <w:sz w:val="28"/>
-          <w:szCs w:val="28"/>
-        </w:rPr>
-        <w:t xml:space="preserve"> v1-style data) does have an answer, a v2-trained model's more conservative answer style may reduce its measured overlap with the always-present reference answers even when its underlying answers are semantically reasonable. This also highlights a genuine limitation of ROUGE as an evaluation metric: it measures lexical overlap only, not factual correctness, so it is possible the pre-trained model's answers remain accurate but are phrased differently enough from the references to be penalized — a fuller evaluation would benefit from manually inspecting a sample of mrm8488's generated answers alongside the fine-tuned model's, rather than relying on ROUGE scores alone.</w:t>
+        <w:t xml:space="preserve">SQuAD_tiny </w:t>
+      </w:r>
+      <w:r>
+        <w:rPr>
+          <w:sz w:val="28"/>
+          <w:szCs w:val="28"/>
+        </w:rPr>
+        <w:t>test set (drawn from SQuAD v1-style data) does have an answer, a v2-trained model's more conservative answer style may reduce its measured overlap with the always-present reference answers even when its underlying answers are semantically reasonable. This also highlights a genuine limitation of ROUGE as an evaluation metric: it measures lexical overlap only, not factual correctness, so it is possible the pre-trained model's answers remain accurate but are phrased differently enough from the references to be penalized — a fuller evaluation would benefit from manually inspecting a sample of mrm8488's generated answers alongside the fine-tuned model's, rather than relying on ROUGE scores alone.</w:t>
       </w:r>
     </w:p>
     <w:sectPr>

</xml_diff>

<commit_message>
doc: 45 page report
</commit_message>
<xml_diff>
--- a/Assessment2-Report.docx
+++ b/Assessment2-Report.docx
@@ -767,25 +767,7 @@
           <w:szCs w:val="28"/>
           <w:lang w:val="en-GB"/>
         </w:rPr>
-        <w:t xml:space="preserve">URLs, mentions, and hashtags were stripped from the raw tweets during preprocessing (verified: 0 of the 2,500 tweets in the dataset contain a </w:t>
-      </w:r>
-      <w:proofErr w:type="gramStart"/>
-      <w:r>
-        <w:rPr>
-          <w:sz w:val="28"/>
-          <w:szCs w:val="28"/>
-          <w:lang w:val="en-GB"/>
-        </w:rPr>
-        <w:t>URL, @</w:t>
-      </w:r>
-      <w:proofErr w:type="gramEnd"/>
-      <w:r>
-        <w:rPr>
-          <w:sz w:val="28"/>
-          <w:szCs w:val="28"/>
-          <w:lang w:val="en-GB"/>
-        </w:rPr>
-        <w:t>mention, or hashtag). Emojis and other symbols were not explicitly removed but are effectively excluded from the TF-IDF feature space since the default tokenizer only extracts alphanumeric word tokens. Slang terms (e.g. "lol", "omg", "idk") were left unmodified and are treated as ordinary vocabulary.</w:t>
+        <w:t>URLs, mentions, and hashtags were stripped from the raw tweets during preprocessing (verified: 0 of the 2,500 tweets in the dataset contain a URL, @mention, or hashtag). Emojis and other symbols were not explicitly removed but are effectively excluded from the TF-IDF feature space since the default tokenizer only extracts alphanumeric word tokens. Slang terms (e.g. "lol", "omg", "idk") were left unmodified and are treated as ordinary vocabulary.</w:t>
       </w:r>
     </w:p>
     <w:p>
@@ -927,51 +909,7 @@
           <w:sz w:val="28"/>
           <w:szCs w:val="28"/>
         </w:rPr>
-        <w:t xml:space="preserve">During our evaluation, we discussed the trade-off between standardization and maintaining data sparsity. While standardizing the TF-IDF matrix to zero </w:t>
-      </w:r>
-      <w:proofErr w:type="gramStart"/>
-      <w:r>
-        <w:rPr>
-          <w:sz w:val="28"/>
-          <w:szCs w:val="28"/>
-        </w:rPr>
-        <w:t>mean</w:t>
-      </w:r>
-      <w:proofErr w:type="gramEnd"/>
-      <w:r>
-        <w:rPr>
-          <w:sz w:val="28"/>
-          <w:szCs w:val="28"/>
-        </w:rPr>
-        <w:t xml:space="preserve"> and unit variance breaks its original sparse </w:t>
-      </w:r>
-      <w:r>
-        <w:rPr>
-          <w:sz w:val="28"/>
-          <w:szCs w:val="28"/>
-        </w:rPr>
-        <w:t xml:space="preserve">structure, </w:t>
-      </w:r>
-      <w:r>
-        <w:rPr>
-          <w:sz w:val="28"/>
-          <w:szCs w:val="28"/>
-        </w:rPr>
-        <w:t>increasing memory overhea</w:t>
-      </w:r>
-      <w:r>
-        <w:rPr>
-          <w:sz w:val="28"/>
-          <w:szCs w:val="28"/>
-        </w:rPr>
-        <w:t xml:space="preserve">d, </w:t>
-      </w:r>
-      <w:r>
-        <w:rPr>
-          <w:sz w:val="28"/>
-          <w:szCs w:val="28"/>
-        </w:rPr>
-        <w:t>we think it is essential because PCA is scale-sensitive; without it, terms with inherently higher frequencies would disproportionately skew the principal components.</w:t>
+        <w:t>During our evaluation, we discussed the trade-off between standardization and maintaining data sparsity. While standardizing the TF-IDF matrix to zero mean and unit variance breaks its original sparse structure, increasing memory overhead, we think it is essential because PCA is scale-sensitive; without it, terms with inherently higher frequencies would disproportionately skew the principal components.</w:t>
       </w:r>
     </w:p>
     <w:p>
@@ -1011,21 +949,7 @@
           <w:sz w:val="28"/>
           <w:szCs w:val="28"/>
         </w:rPr>
-        <w:t xml:space="preserve"> rather than building Boolean vectors from Module 3, since TF-IDF weighting is strictly more informative than a binary presence/absence encoding for this task</w:t>
-      </w:r>
-      <w:r>
-        <w:rPr>
-          <w:sz w:val="28"/>
-          <w:szCs w:val="28"/>
-        </w:rPr>
-        <w:t>:</w:t>
-      </w:r>
-      <w:r>
-        <w:rPr>
-          <w:sz w:val="28"/>
-          <w:szCs w:val="28"/>
-        </w:rPr>
-        <w:t xml:space="preserve"> it preserves term-frequency information within each tweet in addition to term rarity across the corpus, which the Boolean representation discards entirely.</w:t>
+        <w:t xml:space="preserve"> rather than building Boolean vectors from Module 3, since TF-IDF weighting is strictly more informative than a binary presence/absence encoding for this task: it preserves term-frequency information within each tweet in addition to term rarity across the corpus, which the Boolean representation discards entirely.</w:t>
       </w:r>
     </w:p>
     <w:p>
@@ -1092,23 +1016,7 @@
           <w:sz w:val="28"/>
           <w:szCs w:val="28"/>
         </w:rPr>
-        <w:t xml:space="preserve">Dimensions tested: 2, 10, 50, 100, 250, 500, 750, 1000 (using a 500-tweet subsample of the standardized TF-IDF matrix for computational efficiency). For each dimensionality, pairwise Euclidean distances between all sample pairs were computed and </w:t>
-      </w:r>
-      <w:proofErr w:type="gramStart"/>
-      <w:r>
-        <w:rPr>
-          <w:sz w:val="28"/>
-          <w:szCs w:val="28"/>
-        </w:rPr>
-        <w:t>averaged</w:t>
-      </w:r>
-      <w:proofErr w:type="gramEnd"/>
-      <w:r>
-        <w:rPr>
-          <w:sz w:val="28"/>
-          <w:szCs w:val="28"/>
-        </w:rPr>
-        <w:t>.</w:t>
+        <w:t>Dimensions tested: 2, 10, 50, 100, 250, 500, 750, 1000 (using a 500-tweet subsample of the standardized TF-IDF matrix for computational efficiency). For each dimensionality, pairwise Euclidean distances between all sample pairs were computed and averaged.</w:t>
       </w:r>
     </w:p>
     <w:p>
@@ -4466,39 +4374,7 @@
           <w:sz w:val="28"/>
           <w:szCs w:val="28"/>
         </w:rPr>
-        <w:t xml:space="preserve">K = 3 was selected: the rate of inertia </w:t>
-      </w:r>
-      <w:proofErr w:type="gramStart"/>
-      <w:r>
-        <w:rPr>
-          <w:sz w:val="28"/>
-          <w:szCs w:val="28"/>
-        </w:rPr>
-        <w:t>decrease</w:t>
-      </w:r>
-      <w:proofErr w:type="gramEnd"/>
-      <w:r>
-        <w:rPr>
-          <w:sz w:val="28"/>
-          <w:szCs w:val="28"/>
-        </w:rPr>
-        <w:t xml:space="preserve"> </w:t>
-      </w:r>
-      <w:proofErr w:type="gramStart"/>
-      <w:r>
-        <w:rPr>
-          <w:sz w:val="28"/>
-          <w:szCs w:val="28"/>
-        </w:rPr>
-        <w:t>slows</w:t>
-      </w:r>
-      <w:proofErr w:type="gramEnd"/>
-      <w:r>
-        <w:rPr>
-          <w:sz w:val="28"/>
-          <w:szCs w:val="28"/>
-        </w:rPr>
-        <w:t xml:space="preserve"> noticeably beyond k = 3 (diminishing returns from further splitting), while the silhouette score remains reasonable at this value, giving a good balance between cluster compactness/separation and model simplicity.</w:t>
+        <w:t>K = 3 was selected: the rate of inertia decrease slows noticeably beyond k = 3 (diminishing returns from further splitting), while the silhouette score remains reasonable at this value, giving a good balance between cluster compactness/separation and model simplicity.</w:t>
       </w:r>
     </w:p>
     <w:p>
@@ -6410,23 +6286,7 @@
           <w:sz w:val="28"/>
           <w:szCs w:val="28"/>
         </w:rPr>
-        <w:t xml:space="preserve">Per-paddock StandardScaler: a separate scaler </w:t>
-      </w:r>
-      <w:proofErr w:type="gramStart"/>
-      <w:r>
-        <w:rPr>
-          <w:sz w:val="28"/>
-          <w:szCs w:val="28"/>
-        </w:rPr>
-        <w:t>was fit on</w:t>
-      </w:r>
-      <w:proofErr w:type="gramEnd"/>
-      <w:r>
-        <w:rPr>
-          <w:sz w:val="28"/>
-          <w:szCs w:val="28"/>
-        </w:rPr>
-        <w:t xml:space="preserve"> each paddock's own training portion (mean/std computed independently per paddock) rather than one global scaler. This matters because paddocks differ substantially in baseline TSDM levels and variability (per-paddock training means range from 961 to 1,697, and training standard deviations range from 280 to 969) — a single global scaler would let high-magnitude paddocks dominate the loss function, whereas per-paddock scaling lets the LSTM learn from the shape of each paddock's growth trajectory on a comparable scale.</w:t>
+        <w:t>Per-paddock StandardScaler: a separate scaler was fit on each paddock's own training portion (mean/std computed independently per paddock) rather than one global scaler. This matters because paddocks differ substantially in baseline TSDM levels and variability (per-paddock training means range from 961 to 1,697, and training standard deviations range from 280 to 969) — a single global scaler would let high-magnitude paddocks dominate the loss function, whereas per-paddock scaling lets the LSTM learn from the shape of each paddock's growth trajectory on a comparable scale.</w:t>
       </w:r>
     </w:p>
     <w:p>
@@ -6605,23 +6465,7 @@
           <w:sz w:val="28"/>
           <w:szCs w:val="28"/>
         </w:rPr>
-        <w:t xml:space="preserve">in {8, 16, </w:t>
-      </w:r>
-      <w:proofErr w:type="gramStart"/>
-      <w:r>
-        <w:rPr>
-          <w:sz w:val="28"/>
-          <w:szCs w:val="28"/>
-        </w:rPr>
-        <w:t>32},</w:t>
-      </w:r>
-      <w:proofErr w:type="gramEnd"/>
-      <w:r>
-        <w:rPr>
-          <w:sz w:val="28"/>
-          <w:szCs w:val="28"/>
-        </w:rPr>
-        <w:t xml:space="preserve"> </w:t>
+        <w:t xml:space="preserve">in {8, 16, 32}, </w:t>
       </w:r>
       <w:r>
         <w:rPr>
@@ -6636,23 +6480,7 @@
           <w:sz w:val="28"/>
           <w:szCs w:val="28"/>
         </w:rPr>
-        <w:t xml:space="preserve">in {1, </w:t>
-      </w:r>
-      <w:proofErr w:type="gramStart"/>
-      <w:r>
-        <w:rPr>
-          <w:sz w:val="28"/>
-          <w:szCs w:val="28"/>
-        </w:rPr>
-        <w:t>2},</w:t>
-      </w:r>
-      <w:proofErr w:type="gramEnd"/>
-      <w:r>
-        <w:rPr>
-          <w:sz w:val="28"/>
-          <w:szCs w:val="28"/>
-        </w:rPr>
-        <w:t xml:space="preserve"> and </w:t>
+        <w:t xml:space="preserve">in {1, 2}, and </w:t>
       </w:r>
       <w:r>
         <w:rPr>
@@ -8728,23 +8556,7 @@
           <w:sz w:val="28"/>
           <w:szCs w:val="28"/>
         </w:rPr>
-        <w:t xml:space="preserve">Both loss curves continue decreasing steadily through all 200 logged epochs (train: 0.80 → 0.30; val: 0.76 → 0.44) without fully plateauing, unlike Model 1. Both Train R² (0.72 vs. 0.61) and, notably, Test R² (0.33 vs. 0.30) improve over Model 1, and Test RMSE also falls slightly (342.35 vs. 350.45) — here, the longer lookback genuinely helps the model forecast the reserved test window, not just fit the training data more closely. This is unlike the pattern seen for Model 3 (Section 8.5.1), where added complexity helps training fit without helping genuine </w:t>
-      </w:r>
-      <w:proofErr w:type="gramStart"/>
-      <w:r>
-        <w:rPr>
-          <w:sz w:val="28"/>
-          <w:szCs w:val="28"/>
-        </w:rPr>
-        <w:t>forecasting</w:t>
-      </w:r>
-      <w:proofErr w:type="gramEnd"/>
-      <w:r>
-        <w:rPr>
-          <w:sz w:val="28"/>
-          <w:szCs w:val="28"/>
-        </w:rPr>
-        <w:t xml:space="preserve"> performance.</w:t>
+        <w:t>Both loss curves continue decreasing steadily through all 200 logged epochs (train: 0.80 → 0.30; val: 0.76 → 0.44) without fully plateauing, unlike Model 1. Both Train R² (0.72 vs. 0.61) and, notably, Test R² (0.33 vs. 0.30) improve over Model 1, and Test RMSE also falls slightly (342.35 vs. 350.45) — here, the longer lookback genuinely helps the model forecast the reserved test window, not just fit the training data more closely. This is unlike the pattern seen for Model 3 (Section 8.5.1), where added complexity helps training fit without helping genuine forecasting performance.</w:t>
       </w:r>
     </w:p>
     <w:p>
@@ -10639,79 +10451,7 @@
           <w:sz w:val="28"/>
           <w:szCs w:val="28"/>
         </w:rPr>
-        <w:t xml:space="preserve">This matters because it means the strong internal-validation performance of Model 3 — the lowest absolute loss and highest Train R² of the three — does not, by itself, indicate the best forecasting model. That 80/20 validation split is drawn from the same </w:t>
-      </w:r>
-      <w:r>
-        <w:rPr>
-          <w:sz w:val="28"/>
-          <w:szCs w:val="28"/>
-        </w:rPr>
-        <w:t>time</w:t>
-      </w:r>
-      <w:r>
-        <w:rPr>
-          <w:sz w:val="28"/>
-          <w:szCs w:val="28"/>
-        </w:rPr>
-        <w:t xml:space="preserve"> and distribution as the training data, so it primarily measures how well the model interpolates within familiar territory, not how well it forecasts genuinely future, unseen pasture growth. The true forecasting test (the reserved last-5-timestep window per paddock) instead </w:t>
-      </w:r>
-      <w:r>
-        <w:rPr>
-          <w:sz w:val="28"/>
-          <w:szCs w:val="28"/>
-        </w:rPr>
-        <w:t>favors</w:t>
-      </w:r>
-      <w:r>
-        <w:rPr>
-          <w:sz w:val="28"/>
-          <w:szCs w:val="28"/>
-        </w:rPr>
-        <w:t xml:space="preserve"> Model </w:t>
-      </w:r>
-      <w:r>
-        <w:rPr>
-          <w:sz w:val="28"/>
-          <w:szCs w:val="28"/>
-        </w:rPr>
-        <w:t>2 and</w:t>
-      </w:r>
-      <w:r>
-        <w:rPr>
-          <w:sz w:val="28"/>
-          <w:szCs w:val="28"/>
-        </w:rPr>
-        <w:t xml:space="preserve"> is the metric that </w:t>
-      </w:r>
-      <w:r>
-        <w:rPr>
-          <w:sz w:val="28"/>
-          <w:szCs w:val="28"/>
-        </w:rPr>
-        <w:t>matters</w:t>
-      </w:r>
-      <w:r>
-        <w:rPr>
-          <w:sz w:val="28"/>
-          <w:szCs w:val="28"/>
-        </w:rPr>
-        <w:t xml:space="preserve"> for </w:t>
-      </w:r>
-      <w:proofErr w:type="spellStart"/>
-      <w:r>
-        <w:rPr>
-          <w:sz w:val="28"/>
-          <w:szCs w:val="28"/>
-        </w:rPr>
-        <w:t>AgriWebb's</w:t>
-      </w:r>
-      <w:proofErr w:type="spellEnd"/>
-      <w:r>
-        <w:rPr>
-          <w:sz w:val="28"/>
-          <w:szCs w:val="28"/>
-        </w:rPr>
-        <w:t xml:space="preserve"> stated goal of predicting future pasture availability.</w:t>
+        <w:t>This matters because it means the strong internal-validation performance of Model 3 — the lowest absolute loss and highest Train R² of the three — does not, by itself, indicate the best forecasting model. That 80/20 validation split is drawn from the same time and distribution as the training data, so it primarily measures how well the model interpolates within familiar territory, not how well it forecasts genuinely future, unseen pasture growth. The true forecasting test (the reserved last-5-timestep window per paddock) instead favors Model 2 and is the metric that matters for AgriWebb's stated goal of predicting future pasture availability.</w:t>
       </w:r>
     </w:p>
     <w:p>
@@ -10846,21 +10586,7 @@
           <w:sz w:val="28"/>
           <w:szCs w:val="28"/>
         </w:rPr>
-        <w:t xml:space="preserve">In short, this isn't a bug in </w:t>
-      </w:r>
-      <w:r>
-        <w:rPr>
-          <w:sz w:val="28"/>
-          <w:szCs w:val="28"/>
-        </w:rPr>
-        <w:t>our</w:t>
-      </w:r>
-      <w:r>
-        <w:rPr>
-          <w:sz w:val="28"/>
-          <w:szCs w:val="28"/>
-        </w:rPr>
-        <w:t xml:space="preserve"> code or how the error was measured. The real issue is that a single, shared model is being asked to predict the behaviour of 19 very different paddocks — some stable, some highly volatile — using only about 189 observations each. Once climate features and an unrestricted growing-window history are added, the model gains enough capacity to fit the training data closely, but there still isn't enough diverse per-paddock data for it to learn how to extrapolate the more volatile paddocks' future growth, so aggregate test error ends up dominated by those harder cases.</w:t>
+        <w:t>In short, this isn't a bug in our code or how the error was measured. The real issue is that a single, shared model is being asked to predict the behaviour of 19 very different paddocks — some stable, some highly volatile — using only about 189 observations each. Once climate features and an unrestricted growing-window history are added, the model gains enough capacity to fit the training data closely, but there still isn't enough diverse per-paddock data for it to learn how to extrapolate the more volatile paddocks' future growth, so aggregate test error ends up dominated by those harder cases.</w:t>
       </w:r>
       <w:r>
         <w:rPr>
@@ -10911,30 +10637,7 @@
           <w:sz w:val="28"/>
           <w:szCs w:val="28"/>
         </w:rPr>
-        <w:t xml:space="preserve">For AgriWebb, these results suggest the current multivariate model should not be deployed as-is for operational forecasting: a Test R² of 0.16 means it explains only a modest share of the variance in genuinely future pasture growth, and its strong training-time metrics (Train R² = 0.81) considerably overstate how well it generalises. Model 2 (univariate, Lookback=10) is the most defensible of the three for practical use here, since it shows the best genuine forecasting performance (Test R² = 0.33, Test RMSE = 342.35) without the added complexity or overfitting risk of the multivariate model — a useful reminder that model complexity should be validated against true performance, not training fit, before being deployed. </w:t>
-      </w:r>
-      <w:proofErr w:type="gramStart"/>
-      <w:r>
-        <w:rPr>
-          <w:sz w:val="28"/>
-          <w:szCs w:val="28"/>
-        </w:rPr>
-        <w:t>Practical next</w:t>
-      </w:r>
-      <w:proofErr w:type="gramEnd"/>
-      <w:r>
-        <w:rPr>
-          <w:sz w:val="28"/>
-          <w:szCs w:val="28"/>
-        </w:rPr>
-        <w:t xml:space="preserve"> steps worth </w:t>
-      </w:r>
-      <w:r>
-        <w:rPr>
-          <w:sz w:val="28"/>
-          <w:szCs w:val="28"/>
-        </w:rPr>
-        <w:t xml:space="preserve">considering </w:t>
+        <w:t xml:space="preserve">For AgriWebb, these results suggest the current multivariate model should not be deployed as-is for operational forecasting: a Test R² of 0.16 means it explains only a modest share of the variance in genuinely future pasture growth, and its strong training-time metrics (Train R² = 0.81) considerably overstate how well it generalises. Model 2 (univariate, Lookback=10) is the most defensible of the three for practical use here, since it shows the best genuine forecasting performance (Test R² = 0.33, Test RMSE = 342.35) without the added complexity or overfitting risk of the multivariate model — a useful reminder that model complexity should be validated against true performance, not training fit, before being deployed. Practical next steps worth considering </w:t>
       </w:r>
       <w:r>
         <w:rPr>
@@ -10942,14 +10645,7 @@
           <w:szCs w:val="28"/>
         </w:rPr>
         <w:lastRenderedPageBreak/>
-        <w:t>are</w:t>
-      </w:r>
-      <w:r>
-        <w:rPr>
-          <w:sz w:val="28"/>
-          <w:szCs w:val="28"/>
-        </w:rPr>
-        <w:t xml:space="preserve"> per-paddock or per-cluster fine-tuning rather than one shared model across all 19 paddocks; gathering more historical timesteps per paddock before adding additional input features; and applying stronger regularisation (e.g., increased dropout, L2 weight decay) specifically for the multivariate model given its overfitting signature. Until such improvements are validated on genuine forecasting performance, multivariate model outputs should be treated as indicative at best, with univariate Model 2 preferred for operational use.</w:t>
+        <w:t>are per-paddock or per-cluster fine-tuning rather than one shared model across all 19 paddocks; gathering more historical timesteps per paddock before adding additional input features; and applying stronger regularisation (e.g., increased dropout, L2 weight decay) specifically for the multivariate model given its overfitting signature. Until such improvements are validated on genuine forecasting performance, multivariate model outputs should be treated as indicative at best, with univariate Model 2 preferred for operational use.</w:t>
       </w:r>
     </w:p>
     <w:p>
@@ -11077,21 +10773,7 @@
           <w:sz w:val="28"/>
           <w:szCs w:val="28"/>
         </w:rPr>
-        <w:t xml:space="preserve">: URLs, Twitter mentions (“@” handles), and non-ASCII characters were stripped via regular expressions, and consecutive whitespace was normalized to single spaces. Raw tweets are noisy — links, handles, and stray symbols carry no topical signal and would otherwise be tokenised as meaningless sub-word units, diluting the input the model </w:t>
-      </w:r>
-      <w:r>
-        <w:rPr>
-          <w:sz w:val="28"/>
-          <w:szCs w:val="28"/>
-        </w:rPr>
-        <w:t>needs</w:t>
-      </w:r>
-      <w:r>
-        <w:rPr>
-          <w:sz w:val="28"/>
-          <w:szCs w:val="28"/>
-        </w:rPr>
-        <w:t xml:space="preserve"> to attend to.</w:t>
+        <w:t>: URLs, Twitter mentions (“@” handles), and non-ASCII characters were stripped via regular expressions, and consecutive whitespace was normalized to single spaces. Raw tweets are noisy — links, handles, and stray symbols carry no topical signal and would otherwise be tokenised as meaningless sub-word units, diluting the input the model needs to attend to.</w:t>
       </w:r>
     </w:p>
     <w:p>
@@ -12517,7 +12199,7 @@
           <w:sz w:val="28"/>
           <w:szCs w:val="28"/>
         </w:rPr>
-        <w:t>" is being used here as a software/theme name rather than referring to the energy source. This demonstrates that the model is not simply keying off the presence of the word "</w:t>
+        <w:t>" is being used here as a software/theme name rather than referring to the energy source. This demonstrates that the model is not simply relying on the presence of the word "</w:t>
       </w:r>
       <w:r>
         <w:rPr>
@@ -12533,7 +12215,7 @@
           <w:sz w:val="28"/>
           <w:szCs w:val="28"/>
         </w:rPr>
-        <w:t>" (which appears in every tweet in this dataset by construction) but is genuinely using surrounding context to disambiguate its meaning.</w:t>
+        <w:t>" (which appears in every tweet in this dataset by construction) but is genuinely using surrounding context to predict its meaning.</w:t>
       </w:r>
     </w:p>
     <w:p>
@@ -12545,11 +12227,152 @@
           <w:szCs w:val="32"/>
         </w:rPr>
       </w:pPr>
-      <w:r>
+    </w:p>
+    <w:p>
+      <w:pPr>
+        <w:pStyle w:val="Heading2"/>
+        <w:spacing w:before="300" w:after="150"/>
         <w:rPr>
           <w:sz w:val="32"/>
           <w:szCs w:val="32"/>
         </w:rPr>
+      </w:pPr>
+    </w:p>
+    <w:p>
+      <w:pPr>
+        <w:pStyle w:val="Heading2"/>
+        <w:spacing w:before="300" w:after="150"/>
+        <w:rPr>
+          <w:sz w:val="32"/>
+          <w:szCs w:val="32"/>
+        </w:rPr>
+      </w:pPr>
+    </w:p>
+    <w:p>
+      <w:pPr>
+        <w:pStyle w:val="Heading2"/>
+        <w:spacing w:before="300" w:after="150"/>
+        <w:rPr>
+          <w:sz w:val="32"/>
+          <w:szCs w:val="32"/>
+        </w:rPr>
+      </w:pPr>
+    </w:p>
+    <w:p>
+      <w:pPr>
+        <w:pStyle w:val="Heading2"/>
+        <w:spacing w:before="300" w:after="150"/>
+        <w:rPr>
+          <w:sz w:val="32"/>
+          <w:szCs w:val="32"/>
+        </w:rPr>
+      </w:pPr>
+    </w:p>
+    <w:p>
+      <w:pPr>
+        <w:pStyle w:val="Heading2"/>
+        <w:spacing w:before="300" w:after="150"/>
+        <w:rPr>
+          <w:sz w:val="32"/>
+          <w:szCs w:val="32"/>
+        </w:rPr>
+      </w:pPr>
+    </w:p>
+    <w:p>
+      <w:pPr>
+        <w:pStyle w:val="Heading2"/>
+        <w:spacing w:before="300" w:after="150"/>
+        <w:rPr>
+          <w:sz w:val="32"/>
+          <w:szCs w:val="32"/>
+        </w:rPr>
+      </w:pPr>
+    </w:p>
+    <w:p>
+      <w:pPr>
+        <w:pStyle w:val="Heading2"/>
+        <w:spacing w:before="300" w:after="150"/>
+        <w:rPr>
+          <w:sz w:val="32"/>
+          <w:szCs w:val="32"/>
+        </w:rPr>
+      </w:pPr>
+    </w:p>
+    <w:p>
+      <w:pPr>
+        <w:pStyle w:val="Heading2"/>
+        <w:spacing w:before="300" w:after="150"/>
+        <w:rPr>
+          <w:sz w:val="32"/>
+          <w:szCs w:val="32"/>
+        </w:rPr>
+      </w:pPr>
+    </w:p>
+    <w:p>
+      <w:pPr>
+        <w:pStyle w:val="Heading2"/>
+        <w:spacing w:before="300" w:after="150"/>
+        <w:rPr>
+          <w:sz w:val="32"/>
+          <w:szCs w:val="32"/>
+        </w:rPr>
+      </w:pPr>
+    </w:p>
+    <w:p>
+      <w:pPr>
+        <w:pStyle w:val="Heading2"/>
+        <w:spacing w:before="300" w:after="150"/>
+        <w:rPr>
+          <w:sz w:val="32"/>
+          <w:szCs w:val="32"/>
+        </w:rPr>
+      </w:pPr>
+    </w:p>
+    <w:p>
+      <w:pPr>
+        <w:pStyle w:val="Heading2"/>
+        <w:spacing w:before="300" w:after="150"/>
+        <w:rPr>
+          <w:sz w:val="32"/>
+          <w:szCs w:val="32"/>
+        </w:rPr>
+      </w:pPr>
+    </w:p>
+    <w:p>
+      <w:pPr>
+        <w:pStyle w:val="Heading2"/>
+        <w:spacing w:before="300" w:after="150"/>
+        <w:rPr>
+          <w:sz w:val="32"/>
+          <w:szCs w:val="32"/>
+        </w:rPr>
+      </w:pPr>
+    </w:p>
+    <w:p>
+      <w:pPr>
+        <w:pStyle w:val="Heading2"/>
+        <w:spacing w:before="300" w:after="150"/>
+        <w:rPr>
+          <w:sz w:val="32"/>
+          <w:szCs w:val="32"/>
+        </w:rPr>
+      </w:pPr>
+    </w:p>
+    <w:p>
+      <w:pPr>
+        <w:pStyle w:val="Heading2"/>
+        <w:spacing w:before="300" w:after="150"/>
+        <w:rPr>
+          <w:sz w:val="32"/>
+          <w:szCs w:val="32"/>
+        </w:rPr>
+      </w:pPr>
+      <w:r>
+        <w:rPr>
+          <w:sz w:val="32"/>
+          <w:szCs w:val="32"/>
+        </w:rPr>
+        <w:lastRenderedPageBreak/>
         <w:t>9.4 Comparison with Logistic Regression Baseline</w:t>
       </w:r>
     </w:p>
@@ -12687,7 +12510,6 @@
                 <w:szCs w:val="28"/>
               </w:rPr>
             </w:pPr>
-            <w:proofErr w:type="gramStart"/>
             <w:r>
               <w:rPr>
                 <w:b/>
@@ -12695,9 +12517,28 @@
                 <w:sz w:val="28"/>
                 <w:szCs w:val="28"/>
               </w:rPr>
-              <w:t>Recall</w:t>
-            </w:r>
-            <w:proofErr w:type="gramEnd"/>
+              <w:t>Recall (Relevant)</w:t>
+            </w:r>
+          </w:p>
+        </w:tc>
+        <w:tc>
+          <w:tcPr>
+            <w:tcW w:w="1272" w:type="dxa"/>
+            <w:shd w:val="clear" w:color="auto" w:fill="DDEBF7"/>
+            <w:tcMar>
+              <w:top w:w="100" w:type="dxa"/>
+              <w:left w:w="100" w:type="dxa"/>
+              <w:bottom w:w="100" w:type="dxa"/>
+              <w:right w:w="100" w:type="dxa"/>
+            </w:tcMar>
+          </w:tcPr>
+          <w:p>
+            <w:pPr>
+              <w:rPr>
+                <w:sz w:val="28"/>
+                <w:szCs w:val="28"/>
+              </w:rPr>
+            </w:pPr>
             <w:r>
               <w:rPr>
                 <w:b/>
@@ -12705,13 +12546,13 @@
                 <w:sz w:val="28"/>
                 <w:szCs w:val="28"/>
               </w:rPr>
-              <w:t xml:space="preserve"> (Relevant)</w:t>
-            </w:r>
-          </w:p>
-        </w:tc>
-        <w:tc>
-          <w:tcPr>
-            <w:tcW w:w="1272" w:type="dxa"/>
+              <w:t>F1 (Relevant)</w:t>
+            </w:r>
+          </w:p>
+        </w:tc>
+        <w:tc>
+          <w:tcPr>
+            <w:tcW w:w="1191" w:type="dxa"/>
             <w:shd w:val="clear" w:color="auto" w:fill="DDEBF7"/>
             <w:tcMar>
               <w:top w:w="100" w:type="dxa"/>
@@ -12734,35 +12575,6 @@
                 <w:sz w:val="28"/>
                 <w:szCs w:val="28"/>
               </w:rPr>
-              <w:t>F1 (Relevant)</w:t>
-            </w:r>
-          </w:p>
-        </w:tc>
-        <w:tc>
-          <w:tcPr>
-            <w:tcW w:w="1191" w:type="dxa"/>
-            <w:shd w:val="clear" w:color="auto" w:fill="DDEBF7"/>
-            <w:tcMar>
-              <w:top w:w="100" w:type="dxa"/>
-              <w:left w:w="100" w:type="dxa"/>
-              <w:bottom w:w="100" w:type="dxa"/>
-              <w:right w:w="100" w:type="dxa"/>
-            </w:tcMar>
-          </w:tcPr>
-          <w:p>
-            <w:pPr>
-              <w:rPr>
-                <w:sz w:val="28"/>
-                <w:szCs w:val="28"/>
-              </w:rPr>
-            </w:pPr>
-            <w:r>
-              <w:rPr>
-                <w:b/>
-                <w:bCs/>
-                <w:sz w:val="28"/>
-                <w:szCs w:val="28"/>
-              </w:rPr>
               <w:t>ROC-AUC</w:t>
             </w:r>
           </w:p>
@@ -13275,158 +13087,13 @@
           <w:szCs w:val="28"/>
         </w:rPr>
       </w:pPr>
-    </w:p>
-    <w:p>
-      <w:pPr>
-        <w:spacing w:after="100"/>
-        <w:jc w:val="center"/>
+      <w:r>
         <w:rPr>
           <w:i/>
           <w:iCs/>
           <w:sz w:val="28"/>
           <w:szCs w:val="28"/>
         </w:rPr>
-      </w:pPr>
-    </w:p>
-    <w:p>
-      <w:pPr>
-        <w:spacing w:after="100"/>
-        <w:jc w:val="center"/>
-        <w:rPr>
-          <w:i/>
-          <w:iCs/>
-          <w:sz w:val="28"/>
-          <w:szCs w:val="28"/>
-        </w:rPr>
-      </w:pPr>
-    </w:p>
-    <w:p>
-      <w:pPr>
-        <w:spacing w:after="100"/>
-        <w:jc w:val="center"/>
-        <w:rPr>
-          <w:i/>
-          <w:iCs/>
-          <w:sz w:val="28"/>
-          <w:szCs w:val="28"/>
-        </w:rPr>
-      </w:pPr>
-    </w:p>
-    <w:p>
-      <w:pPr>
-        <w:spacing w:after="100"/>
-        <w:jc w:val="center"/>
-        <w:rPr>
-          <w:i/>
-          <w:iCs/>
-          <w:sz w:val="28"/>
-          <w:szCs w:val="28"/>
-        </w:rPr>
-      </w:pPr>
-    </w:p>
-    <w:p>
-      <w:pPr>
-        <w:spacing w:after="100"/>
-        <w:jc w:val="center"/>
-        <w:rPr>
-          <w:i/>
-          <w:iCs/>
-          <w:sz w:val="28"/>
-          <w:szCs w:val="28"/>
-        </w:rPr>
-      </w:pPr>
-    </w:p>
-    <w:p>
-      <w:pPr>
-        <w:spacing w:after="100"/>
-        <w:jc w:val="center"/>
-        <w:rPr>
-          <w:i/>
-          <w:iCs/>
-          <w:sz w:val="28"/>
-          <w:szCs w:val="28"/>
-        </w:rPr>
-      </w:pPr>
-    </w:p>
-    <w:p>
-      <w:pPr>
-        <w:spacing w:after="100"/>
-        <w:jc w:val="center"/>
-        <w:rPr>
-          <w:i/>
-          <w:iCs/>
-          <w:sz w:val="28"/>
-          <w:szCs w:val="28"/>
-        </w:rPr>
-      </w:pPr>
-    </w:p>
-    <w:p>
-      <w:pPr>
-        <w:spacing w:after="100"/>
-        <w:jc w:val="center"/>
-        <w:rPr>
-          <w:i/>
-          <w:iCs/>
-          <w:sz w:val="28"/>
-          <w:szCs w:val="28"/>
-        </w:rPr>
-      </w:pPr>
-    </w:p>
-    <w:p>
-      <w:pPr>
-        <w:spacing w:after="100"/>
-        <w:jc w:val="center"/>
-        <w:rPr>
-          <w:i/>
-          <w:iCs/>
-          <w:sz w:val="28"/>
-          <w:szCs w:val="28"/>
-        </w:rPr>
-      </w:pPr>
-    </w:p>
-    <w:p>
-      <w:pPr>
-        <w:spacing w:after="100"/>
-        <w:jc w:val="center"/>
-        <w:rPr>
-          <w:i/>
-          <w:iCs/>
-          <w:sz w:val="28"/>
-          <w:szCs w:val="28"/>
-        </w:rPr>
-      </w:pPr>
-    </w:p>
-    <w:p>
-      <w:pPr>
-        <w:spacing w:after="100"/>
-        <w:jc w:val="center"/>
-        <w:rPr>
-          <w:i/>
-          <w:iCs/>
-          <w:sz w:val="28"/>
-          <w:szCs w:val="28"/>
-        </w:rPr>
-      </w:pPr>
-    </w:p>
-    <w:p>
-      <w:pPr>
-        <w:spacing w:after="100"/>
-        <w:jc w:val="center"/>
-        <w:rPr>
-          <w:i/>
-          <w:iCs/>
-          <w:sz w:val="28"/>
-          <w:szCs w:val="28"/>
-        </w:rPr>
-      </w:pPr>
-      <w:r>
-        <w:rPr>
-          <w:i/>
-          <w:iCs/>
-          <w:sz w:val="28"/>
-          <w:szCs w:val="28"/>
-        </w:rPr>
-        <w:lastRenderedPageBreak/>
         <w:t>Figure 9.4: ROC Curve Comparison</w:t>
       </w:r>
     </w:p>
@@ -13508,7 +13175,24 @@
           <w:sz w:val="28"/>
           <w:szCs w:val="28"/>
         </w:rPr>
-        <w:t>BERT outperformed the TF-IDF logistic regression baseline across every metric: test accuracy rose from 89.67% to 93.33%, and ROC-AUC from 0.970 to 0.981. This is expected because every tweet in this dataset contains the keyword "hydrogen" by construction, so the discriminative signal depends entirely on surrounding context (e.g., "green/blue hydrogen" for clean energy vs. "hydrogen responsive template" for web design). The logistic regression model treats text as an unordered bag of TF-IDF weighted words and cannot capture this context-dependent meaning, whereas BERT's self-attention mechanism explicitly models bidirectional dependencies between words. BER Tweet’s further improvement over Bert-base-uncased is attributable to its vocabulary and pretraining being specifically matched to informal, social-media text.</w:t>
+        <w:t xml:space="preserve">BERT outperformed the TF-IDF logistic regression baseline across every metric: test accuracy rose from 89.67% to 93.33%, and ROC-AUC from 0.970 to 0.981. </w:t>
+      </w:r>
+    </w:p>
+    <w:p>
+      <w:pPr>
+        <w:spacing w:after="150"/>
+        <w:rPr>
+          <w:sz w:val="28"/>
+          <w:szCs w:val="28"/>
+        </w:rPr>
+      </w:pPr>
+      <w:r>
+        <w:rPr>
+          <w:sz w:val="28"/>
+          <w:szCs w:val="28"/>
+        </w:rPr>
+        <w:lastRenderedPageBreak/>
+        <w:t>This is expected because every tweet in this dataset contains the keyword "hydrogen" by construction, so the discriminative signal depends entirely on surrounding context (e.g., "green/blue hydrogen" for clean energy vs. "hydrogen responsive template" for web design). The logistic regression model treats text as an unordered bag of TF-IDF weighted words and cannot capture this context-dependent meaning, whereas BERT's self-attention mechanism explicitly models bidirectional dependencies between words. BER Tweet’s further improvement over Bert-base-uncased is attributable to its vocabulary and pretraining being specifically matched to informal, social-media text.</w:t>
       </w:r>
     </w:p>
     <w:p>
@@ -13603,25 +13287,7 @@
           <w:sz w:val="28"/>
           <w:szCs w:val="28"/>
         </w:rPr>
-        <w:t>as '</w:t>
-      </w:r>
-      <w:r>
-        <w:rPr>
-          <w:i/>
-          <w:iCs/>
-          <w:sz w:val="28"/>
-          <w:szCs w:val="28"/>
-        </w:rPr>
-        <w:t xml:space="preserve">question: </w:t>
-      </w:r>
-      <w:r>
-        <w:rPr>
-          <w:i/>
-          <w:iCs/>
-          <w:sz w:val="28"/>
-          <w:szCs w:val="28"/>
-        </w:rPr>
-        <w:t>question} context: {context}'</w:t>
+        <w:t>as 'question: {question} context: {context}'</w:t>
       </w:r>
       <w:r>
         <w:rPr>
@@ -13690,6 +13356,37 @@
     </w:p>
     <w:p>
       <w:pPr>
+        <w:rPr>
+          <w:sz w:val="28"/>
+          <w:szCs w:val="28"/>
+        </w:rPr>
+      </w:pPr>
+      <w:r>
+        <w:rPr>
+          <w:sz w:val="28"/>
+          <w:szCs w:val="28"/>
+        </w:rPr>
+        <w:t xml:space="preserve">Label padding with Hugging Face's -100 convention: after tokenizing each answer, positions corresponding to the tokenizer's pad token are replaced with -100 in the labels array. PyTorch's CrossEntropyLoss, which T5ForConditionalGeneration uses internally to compute the training loss, treats -100 as its </w:t>
+      </w:r>
+      <w:r>
+        <w:rPr>
+          <w:i/>
+          <w:iCs/>
+          <w:sz w:val="28"/>
+          <w:szCs w:val="28"/>
+        </w:rPr>
+        <w:t>ignore_index</w:t>
+      </w:r>
+      <w:r>
+        <w:rPr>
+          <w:sz w:val="28"/>
+          <w:szCs w:val="28"/>
+        </w:rPr>
+        <w:t>, so the loss is only computed over the model's real answer tokens and never over trailing padding. Without this explicit step, the model would be needlessly trained to predict a fixed pad token across the majority of each label sequence (most SQuAD answers are only a few tokens long), diluting the loss with trivially-easy predictions and making it a less meaningful measure of how well the model is actually learning to answer questions.</w:t>
+      </w:r>
+    </w:p>
+    <w:p>
+      <w:pPr>
         <w:pStyle w:val="Heading2"/>
         <w:spacing w:before="300" w:after="150"/>
         <w:rPr>
@@ -13697,11 +13394,62 @@
           <w:szCs w:val="32"/>
         </w:rPr>
       </w:pPr>
-      <w:r>
+    </w:p>
+    <w:p>
+      <w:pPr>
+        <w:pStyle w:val="Heading2"/>
+        <w:spacing w:before="300" w:after="150"/>
         <w:rPr>
           <w:sz w:val="32"/>
           <w:szCs w:val="32"/>
         </w:rPr>
+      </w:pPr>
+    </w:p>
+    <w:p>
+      <w:pPr>
+        <w:pStyle w:val="Heading2"/>
+        <w:spacing w:before="300" w:after="150"/>
+        <w:rPr>
+          <w:sz w:val="32"/>
+          <w:szCs w:val="32"/>
+        </w:rPr>
+      </w:pPr>
+    </w:p>
+    <w:p>
+      <w:pPr>
+        <w:pStyle w:val="Heading2"/>
+        <w:spacing w:before="300" w:after="150"/>
+        <w:rPr>
+          <w:sz w:val="32"/>
+          <w:szCs w:val="32"/>
+        </w:rPr>
+      </w:pPr>
+    </w:p>
+    <w:p>
+      <w:pPr>
+        <w:pStyle w:val="Heading2"/>
+        <w:spacing w:before="300" w:after="150"/>
+        <w:rPr>
+          <w:sz w:val="32"/>
+          <w:szCs w:val="32"/>
+        </w:rPr>
+      </w:pPr>
+    </w:p>
+    <w:p>
+      <w:pPr>
+        <w:pStyle w:val="Heading2"/>
+        <w:spacing w:before="300" w:after="150"/>
+        <w:rPr>
+          <w:sz w:val="32"/>
+          <w:szCs w:val="32"/>
+        </w:rPr>
+      </w:pPr>
+      <w:r>
+        <w:rPr>
+          <w:sz w:val="32"/>
+          <w:szCs w:val="32"/>
+        </w:rPr>
+        <w:lastRenderedPageBreak/>
         <w:t>10.2 Fine-Tuning the T5 Model</w:t>
       </w:r>
     </w:p>
@@ -13734,24 +13482,17 @@
           <w:sz w:val="28"/>
           <w:szCs w:val="28"/>
         </w:rPr>
-        <w:t xml:space="preserve">Hyperparameters: 3 epochs, per-device batch size 8 (train and eval), learning rate </w:t>
-      </w:r>
-      <w:proofErr w:type="gramStart"/>
-      <w:r>
-        <w:rPr>
-          <w:sz w:val="28"/>
-          <w:szCs w:val="28"/>
-        </w:rPr>
-        <w:t>3e</w:t>
-      </w:r>
-      <w:proofErr w:type="gramEnd"/>
-      <w:r>
-        <w:rPr>
-          <w:sz w:val="28"/>
-          <w:szCs w:val="28"/>
-        </w:rPr>
-        <w:t>-4, weight decay 0.01, using Hugging Face's Trainer/TrainingArguments with epoch-level evaluation and checkpointing.</w:t>
-      </w:r>
+        <w:t>Hyperparameters: 3 epochs, per-device batch size 8 (train and eval), learning rate 3e-4, weight decay 0.01, using Hugging Face's Trainer/TrainingArguments with epoch-level evaluation and checkpointing.</w:t>
+      </w:r>
+    </w:p>
+    <w:p>
+      <w:pPr>
+        <w:spacing w:after="150"/>
+        <w:rPr>
+          <w:sz w:val="28"/>
+          <w:szCs w:val="28"/>
+        </w:rPr>
+      </w:pPr>
     </w:p>
     <w:p>
       <w:pPr>
@@ -13932,7 +13673,7 @@
                 <w:sz w:val="28"/>
                 <w:szCs w:val="28"/>
               </w:rPr>
-              <w:t>0.010848</w:t>
+              <w:t>0.107733</w:t>
             </w:r>
           </w:p>
         </w:tc>
@@ -13958,7 +13699,7 @@
                 <w:sz w:val="28"/>
                 <w:szCs w:val="28"/>
               </w:rPr>
-              <w:t>0.022110</w:t>
+              <w:t>0.863248</w:t>
             </w:r>
           </w:p>
         </w:tc>
@@ -14012,7 +13753,7 @@
                 <w:sz w:val="28"/>
                 <w:szCs w:val="28"/>
               </w:rPr>
-              <w:t>0.011445</w:t>
+              <w:t>0.087467</w:t>
             </w:r>
           </w:p>
         </w:tc>
@@ -14038,7 +13779,7 @@
                 <w:sz w:val="28"/>
                 <w:szCs w:val="28"/>
               </w:rPr>
-              <w:t>0.021969</w:t>
+              <w:t>0.763703</w:t>
             </w:r>
           </w:p>
         </w:tc>
@@ -14092,7 +13833,7 @@
                 <w:sz w:val="28"/>
                 <w:szCs w:val="28"/>
               </w:rPr>
-              <w:t>0.010092</w:t>
+              <w:t>0.218257</w:t>
             </w:r>
           </w:p>
         </w:tc>
@@ -14118,7 +13859,7 @@
                 <w:sz w:val="28"/>
                 <w:szCs w:val="28"/>
               </w:rPr>
-              <w:t>0.022641</w:t>
+              <w:t>0.784597</w:t>
             </w:r>
           </w:p>
         </w:tc>
@@ -14146,7 +13887,7 @@
           <w:sz w:val="28"/>
           <w:szCs w:val="28"/>
         </w:rPr>
-        <w:t>Final training loss after 3 epochs (375 total steps): 0.0102 (overall average training loss reported by the Trainer, distinct from the per-epoch values above, which reflect loss at the end of each epoch specifically).</w:t>
+        <w:t>Final training loss after 3 epochs (375 total steps): 0.0846 (overall average training loss reported by the Trainer, distinct from the per-epoch values above, which reflect loss at the end of each epoch specifically).</w:t>
       </w:r>
     </w:p>
     <w:p>
@@ -14162,7 +13903,79 @@
           <w:sz w:val="28"/>
           <w:szCs w:val="28"/>
         </w:rPr>
-        <w:t xml:space="preserve">Training loss is already very low by epoch 1 and stays flat with minor noise across the 3 epochs (0.0108 → 0.0114 → 0.0101), rather than decreasing </w:t>
+        <w:t xml:space="preserve">With label positions properly masked (see Section 10.1), </w:t>
+      </w:r>
+      <w:r>
+        <w:rPr>
+          <w:sz w:val="28"/>
+          <w:szCs w:val="28"/>
+        </w:rPr>
+        <w:t xml:space="preserve">the </w:t>
+      </w:r>
+      <w:r>
+        <w:rPr>
+          <w:sz w:val="28"/>
+          <w:szCs w:val="28"/>
+        </w:rPr>
+        <w:t>training loss reflects the genuine difficulty of generating the correct answer tokens: it falls from 0.108 at epoch 1 to 0.087 at epoch 2, then rises sharply to 0.218 at epoch 3</w:t>
+      </w:r>
+      <w:r>
+        <w:rPr>
+          <w:sz w:val="28"/>
+          <w:szCs w:val="28"/>
+        </w:rPr>
+        <w:t>:</w:t>
+      </w:r>
+      <w:r>
+        <w:rPr>
+          <w:sz w:val="28"/>
+          <w:szCs w:val="28"/>
+        </w:rPr>
+        <w:t xml:space="preserve"> a single volatile epoch rather than a clear trend, </w:t>
+      </w:r>
+      <w:r>
+        <w:rPr>
+          <w:sz w:val="28"/>
+          <w:szCs w:val="28"/>
+        </w:rPr>
+        <w:t>likely</w:t>
+      </w:r>
+      <w:r>
+        <w:rPr>
+          <w:sz w:val="28"/>
+          <w:szCs w:val="28"/>
+        </w:rPr>
+        <w:t xml:space="preserve"> because the small training set (1,000 examples, only 125 optimizer steps per epoch) makes the per-epoch loss estimate noisy. Validation loss is substantially higher than training loss throughout (0.863 → 0.764 → 0.785), improving from epoch 1 to epoch 2 before ticking back up slightly at epoch 3. Some of this training/validation gap reflects </w:t>
+      </w:r>
+      <w:r>
+        <w:rPr>
+          <w:sz w:val="28"/>
+          <w:szCs w:val="28"/>
+        </w:rPr>
+        <w:t>true</w:t>
+      </w:r>
+      <w:r>
+        <w:rPr>
+          <w:sz w:val="28"/>
+          <w:szCs w:val="28"/>
+        </w:rPr>
+        <w:t xml:space="preserve"> generalization difficulty, and some reflects the validation estimate being noisier since it is computed over only 100 held-out examples. The dip-then-uptick pattern in validation loss between epochs 2 and 3, alongside the training-loss spike at epoch 3, is a mild overfitting/instability signal consistent with the rationale for stopping fine-tuning after only 3 epochs rather than training for longer.</w:t>
+      </w:r>
+    </w:p>
+    <w:p>
+      <w:pPr>
+        <w:spacing w:after="150"/>
+        <w:rPr>
+          <w:sz w:val="28"/>
+          <w:szCs w:val="28"/>
+        </w:rPr>
+      </w:pPr>
+      <w:r>
+        <w:rPr>
+          <w:sz w:val="28"/>
+          <w:szCs w:val="28"/>
+        </w:rPr>
+        <w:t xml:space="preserve">Overfitting-prevention strategies: weight decay (0.01) was applied as L2 regularization on model weights; a comparatively short fine-tuning run (3 epochs) was used given the small 1,000-example training set, and was further supported by the observed validation loss uptick at epoch 3 above; and a held-out validation set (100 examples, drawn from a different SQuAD split range to </w:t>
       </w:r>
       <w:r>
         <w:rPr>
@@ -14170,23 +13983,7 @@
           <w:szCs w:val="28"/>
         </w:rPr>
         <w:lastRenderedPageBreak/>
-        <w:t>monotonically — indicating the model converges within the first epoch on this small 1,000-example training set. Validation loss follows a similarly flat pattern, dipping slightly at epoch 2 before rising slightly again at epoch 3 (0.0221 → 0.0220 → 0.0226). This small uptick in validation loss at the final epoch, while training loss stays essentially flat, is a mild overfitting signal — consistent with the rationale for stopping fine-tuning after only 3 epochs rather than training for longer.</w:t>
-      </w:r>
-    </w:p>
-    <w:p>
-      <w:pPr>
-        <w:spacing w:after="150"/>
-        <w:rPr>
-          <w:sz w:val="28"/>
-          <w:szCs w:val="28"/>
-        </w:rPr>
-      </w:pPr>
-      <w:r>
-        <w:rPr>
-          <w:sz w:val="28"/>
-          <w:szCs w:val="28"/>
-        </w:rPr>
-        <w:t>Overfitting-prevention strategies: weight decay (0.01) was applied as L2 regularization on model weights; a comparatively short fine-tuning run (3 epochs) was used given the small 1,000-example training set, and was further supported by the observed validation loss uptick at epoch 3 above; and a held-out validation set (100 examples, drawn from a different SQuAD split range to the training set) was evaluated after every epoch so that validation loss could be monitored for divergence from training loss.</w:t>
+        <w:t>the training set) was evaluated after every epoch so that validation loss could be monitored for divergence from training loss.</w:t>
       </w:r>
     </w:p>
     <w:p>
@@ -14416,7 +14213,7 @@
                 <w:sz w:val="28"/>
                 <w:szCs w:val="28"/>
               </w:rPr>
-              <w:t>0.7876</w:t>
+              <w:t>0.7549</w:t>
             </w:r>
           </w:p>
         </w:tc>
@@ -14442,7 +14239,7 @@
                 <w:sz w:val="28"/>
                 <w:szCs w:val="28"/>
               </w:rPr>
-              <w:t>0.7834</w:t>
+              <w:t>0.7364</w:t>
             </w:r>
           </w:p>
         </w:tc>
@@ -14468,7 +14265,7 @@
                 <w:sz w:val="28"/>
                 <w:szCs w:val="28"/>
               </w:rPr>
-              <w:t>0.7665</w:t>
+              <w:t>0.7323</w:t>
             </w:r>
           </w:p>
         </w:tc>
@@ -14522,7 +14319,7 @@
                 <w:sz w:val="28"/>
                 <w:szCs w:val="28"/>
               </w:rPr>
-              <w:t>0.5399</w:t>
+              <w:t>0.4967</w:t>
             </w:r>
           </w:p>
         </w:tc>
@@ -14548,7 +14345,7 @@
                 <w:sz w:val="28"/>
                 <w:szCs w:val="28"/>
               </w:rPr>
-              <w:t>0.5319</w:t>
+              <w:t>0.4655</w:t>
             </w:r>
           </w:p>
         </w:tc>
@@ -14574,7 +14371,7 @@
                 <w:sz w:val="28"/>
                 <w:szCs w:val="28"/>
               </w:rPr>
-              <w:t>0.5162</w:t>
+              <w:t>0.4706</w:t>
             </w:r>
           </w:p>
         </w:tc>
@@ -14628,7 +14425,7 @@
                 <w:sz w:val="28"/>
                 <w:szCs w:val="28"/>
               </w:rPr>
-              <w:t>0.7867</w:t>
+              <w:t>0.7538</w:t>
             </w:r>
           </w:p>
         </w:tc>
@@ -14654,7 +14451,7 @@
                 <w:sz w:val="28"/>
                 <w:szCs w:val="28"/>
               </w:rPr>
-              <w:t>0.7823</w:t>
+              <w:t>0.7351</w:t>
             </w:r>
           </w:p>
         </w:tc>
@@ -14680,7 +14477,7 @@
                 <w:sz w:val="28"/>
                 <w:szCs w:val="28"/>
               </w:rPr>
-              <w:t>0.7655</w:t>
+              <w:t>0.7312</w:t>
             </w:r>
           </w:p>
         </w:tc>
@@ -14708,7 +14505,7 @@
           <w:sz w:val="28"/>
           <w:szCs w:val="28"/>
         </w:rPr>
-        <w:t>A ROUGE-1 F-measure of 0.77 indicates strong word-level overlap between generated and reference answers — the model captures most of the correct content and frequently reproduces the reference answer almost exactly. The remaining gap between ROUGE-1 (0.77) and ROUGE-2 (0.52) suggests that while individual key words are correctly identified in the large majority of cases, the model does not always reproduce the exact multi-word phrasing of the reference answer (e.g., omitting a leading qualifier such as “the” or “ca.” that still leaves the core answer content correct).</w:t>
+        <w:t>A ROUGE-1 F-measure of 0.73 indicates strong word-level overlap between generated and reference answers — the model captures most of the correct content and frequently reproduces the reference answer almost exactly. The remaining gap between ROUGE-1 (0.73) and ROUGE-2 (0.47) suggests that while individual key words are correctly identified in the large majority of cases, the model does not always reproduce the exact multi-word phrasing of the reference answer (e.g., omitting a leading qualifier such as “the” or “ca.” that still leaves the core answer content correct).</w:t>
       </w:r>
     </w:p>
     <w:p>
@@ -14724,7 +14521,7 @@
           <w:sz w:val="28"/>
           <w:szCs w:val="28"/>
         </w:rPr>
-        <w:t>Beyond raw lexical overlap, the generated answers in Section 10.4 are also fluent and well-formed as standalone text — for example, "Dutch Republic", "75,000 to 100,000" and "Amsterdam and the area of West Frisia" (Samples 1, 2 and 4) are grammatically well-formed short-answer spans that match, or nearly match, the reference exactly, rather than garbled or incomplete text. This suggests the model has learned both the general answer-formatting conventions of the QA task and the specific factual content well, even in the remaining cases (Samples 3 and 5) where it correctly extracts the core answer but omits a qualifying word ("ca." or "the revocation of") present in the reference.</w:t>
+        <w:t>Beyond raw lexical overlap, the generated answers in Section 10.4 are also fluent and well-formed as standalone text — for example, "the Dutch Republic", "75,000 to 100,000" and "Amsterdam and the area of West Frisia" (Samples 1, 2 and 4) are exact matches to the reference, rather than garbled or incomplete text. This suggests the model has learned both the general answer-formatting conventions of the QA task and the specific factual content well, even in the remaining cases (Samples 3 and 5) where it correctly extracts the core answer but omits a qualifying word ("ca." or "the revocation of") present in the reference.</w:t>
       </w:r>
     </w:p>
     <w:p>
@@ -15080,7 +14877,7 @@
                 <w:sz w:val="28"/>
                 <w:szCs w:val="28"/>
               </w:rPr>
-              <w:t>Dutch Republic</w:t>
+              <w:t>the Dutch Republic</w:t>
             </w:r>
           </w:p>
         </w:tc>
@@ -15106,7 +14903,7 @@
                 <w:sz w:val="28"/>
                 <w:szCs w:val="28"/>
               </w:rPr>
-              <w:t>Quel pays a prim prim prim origine accueilli le plus grand nombre de Huguenot refugees?</w:t>
+              <w:t>Quel pays a initialement reçu le plus grand nombre de Huguenot refugees?</w:t>
             </w:r>
           </w:p>
         </w:tc>
@@ -15370,7 +15167,7 @@
                 <w:sz w:val="28"/>
                 <w:szCs w:val="28"/>
               </w:rPr>
-              <w:t>Quelle était la population de la Nouvelle-Écosse avant cette émigration?</w:t>
+              <w:t>Quelle était la population de la République néerlandaise avant cette émigration?</w:t>
             </w:r>
           </w:p>
         </w:tc>
@@ -15502,7 +15299,7 @@
                 <w:sz w:val="28"/>
                 <w:szCs w:val="28"/>
               </w:rPr>
-              <w:t>Welchen zwei Gebieten in der Republik standen in den ersten zwei Bereichen, in denen die Huguenots Rechte eingeräumt wurden?</w:t>
+              <w:t>Quels deux domaines dans la République étaient les premiers à accorder des droits aux Huguenots?</w:t>
             </w:r>
           </w:p>
         </w:tc>
@@ -15530,7 +15327,6 @@
                 <w:sz w:val="28"/>
                 <w:szCs w:val="28"/>
               </w:rPr>
-              <w:lastRenderedPageBreak/>
               <w:t>5</w:t>
             </w:r>
           </w:p>
@@ -15557,23 +15353,7 @@
                 <w:sz w:val="28"/>
                 <w:szCs w:val="28"/>
               </w:rPr>
-              <w:t xml:space="preserve">What declaration </w:t>
-            </w:r>
-            <w:proofErr w:type="gramStart"/>
-            <w:r>
-              <w:rPr>
-                <w:sz w:val="28"/>
-                <w:szCs w:val="28"/>
-              </w:rPr>
-              <w:t>predicated</w:t>
-            </w:r>
-            <w:proofErr w:type="gramEnd"/>
-            <w:r>
-              <w:rPr>
-                <w:sz w:val="28"/>
-                <w:szCs w:val="28"/>
-              </w:rPr>
-              <w:t xml:space="preserve"> the emigration of Huguenot refugees?</w:t>
+              <w:t>What declaration predicated the emigration of Huguenot refugees?</w:t>
             </w:r>
           </w:p>
         </w:tc>
@@ -15599,14 +15379,7 @@
                 <w:sz w:val="28"/>
                 <w:szCs w:val="28"/>
               </w:rPr>
-              <w:t>The Revocation</w:t>
-            </w:r>
-            <w:r>
-              <w:rPr>
-                <w:sz w:val="28"/>
-                <w:szCs w:val="28"/>
-              </w:rPr>
-              <w:t xml:space="preserve"> of the Edict of Nantes</w:t>
+              <w:t>the revocation of the Edict of Nantes</w:t>
             </w:r>
           </w:p>
         </w:tc>
@@ -15658,7 +15431,7 @@
                 <w:sz w:val="28"/>
                 <w:szCs w:val="28"/>
               </w:rPr>
-              <w:t>Quelle déclaration predait l'émigration des Huguenot refugees?</w:t>
+              <w:t>Quelle déclaration prédigte l'émigration des Huguenot refugees?</w:t>
             </w:r>
           </w:p>
         </w:tc>
@@ -15686,7 +15459,7 @@
           <w:sz w:val="28"/>
           <w:szCs w:val="28"/>
         </w:rPr>
-        <w:t>ROUGE without context (whole test set): Precision 0.0125 / Recall 0.0368 / F-measure 0.0177 (ROUGE-1); all ROUGE-2 metrics are exactly 0. Performance collapses almost completely without the context passage.</w:t>
+        <w:t>ROUGE without context (whole test set): Precision 0.017 / Recall 0.0449 / F-measure 0.023 (ROUGE-1); all ROUGE-2 metrics are exactly 0. Performance collapses almost completely without the context passage.</w:t>
       </w:r>
     </w:p>
     <w:p>
@@ -15723,7 +15496,21 @@
           <w:sz w:val="28"/>
           <w:szCs w:val="28"/>
         </w:rPr>
-        <w:t>Correct/near-correct answers with context: Sample 1 ("Dutch Republic" vs. reference "the Dutch Republic" — correct content, missing article), Sample 2 ("75,000 to 100,000", matching the numeric core of the reference), Sample 3 ("2 million" vs. reference "ca. 2 million" — correct content, missing the qualifier "ca."), and Sample 4 ("Amsterdam and the area of West Frisia", an exact match) show the model reliably extracts the correct short factual span when the answer is stated plainly in the context.</w:t>
+        <w:t xml:space="preserve">Correct/near-correct answers with context: Samples 1, 2 and 4 ("the Dutch Republic", "75,000 to 100,000", and "Amsterdam and the area of West Frisia") are all exact matches to the reference, and Sample 3 ("2 million" vs. reference "ca. 2 million") is correct in content but missing the qualifier "ca." — together showing the model reliably extracts the correct short factual </w:t>
+      </w:r>
+      <w:r>
+        <w:rPr>
+          <w:sz w:val="28"/>
+          <w:szCs w:val="28"/>
+        </w:rPr>
+        <w:t xml:space="preserve">text </w:t>
+      </w:r>
+      <w:r>
+        <w:rPr>
+          <w:sz w:val="28"/>
+          <w:szCs w:val="28"/>
+        </w:rPr>
+        <w:t>span when the answer is stated plainly in the context.</w:t>
       </w:r>
     </w:p>
     <w:p>
@@ -15744,7 +15531,7 @@
           <w:sz w:val="28"/>
           <w:szCs w:val="28"/>
         </w:rPr>
-        <w:t>Remaining errors with context are minor omissions rather than wrong entities: Sample 5 gives "Edict of Nantes" instead of "the revocation of the Edict of Nantes" — close in content but missing the key qualifying phrase that changes the precise meaning of the answer, similar to the missing "ca." in Sample 3. Notably, the entity-confusion errors observed in an earlier run of this notebook (e.g., answering "2 million" for the refugee count, or "Cévennes" for the two granted areas) disappeared once a bug that duplicated the question text in every training input was fixed and the model was re-fine-tuned on the corrected data — suggesting those earlier errors were partly an artifact of degraded training input quality rather than an inherent model limitation.</w:t>
+        <w:t>Remaining errors with context are minor omissions rather than made up entities: Sample 5 gives "Edict of Nantes" instead of "the revocation of the Edict of Nantes", close in content but missing the key qualifying phrase that changes the precise meaning of the answer, similar to the missing "ca." in Sample 3. Notably, the entity-confusion errors observed in an earlier run of this notebook (e.g., answering "2 million" for the refugee count, or "Cévennes" for the two granted areas) disappeared once a bug that duplicated the question text in every training input was fixed and the model was fine-tuned on the corrected data, suggesting those earlier errors were partly an artifact of degraded training input quality rather than an inherent model limitation.</w:t>
       </w:r>
     </w:p>
     <w:p>
@@ -15765,7 +15552,23 @@
           <w:sz w:val="28"/>
           <w:szCs w:val="28"/>
         </w:rPr>
-        <w:t xml:space="preserve">Without context: all 5 samples produce fluent but entirely wrong output — instead of empty strings, the model generates French or German translations (or translation attempts) of the input question itself (e.g., “Wie viele Flüchtlinge emigrierten in die Niederlande?” for Sample 2, or </w:t>
+        <w:t>Without context: all 5 samples produce fluent but entirely wrong output — instead of attempting an answer, the model translates the input question itself into French or German (e.g., “Wie viele Flüchtlinge emigrierten in die Niederlande?” for Sample 2, or “Quels deux domaines dans la République étaient les premiers à accorder des droits aux Huguenots?” for Sample 4 — both accurate translations of the English question). This is consistent with t5-small's original multi-task pretraining, which included translation: without the “question: ... context: ...” prefix cue, the model appears to fall back on a different pretrained task rather than attempting to answer from memory. Either way, it confirms the model has not memorized SQuAD facts during fine-tuning; it has learned to locate and extract text from a supplied context, not to answer general-knowledge questions independently.</w:t>
+      </w:r>
+    </w:p>
+    <w:p>
+      <w:pPr>
+        <w:spacing w:after="150"/>
+        <w:rPr>
+          <w:sz w:val="28"/>
+          <w:szCs w:val="28"/>
+        </w:rPr>
+      </w:pPr>
+      <w:r>
+        <w:rPr>
+          <w:sz w:val="28"/>
+          <w:szCs w:val="28"/>
+        </w:rPr>
+        <w:t xml:space="preserve">This near-total performance collapse without context (ROUGE-1 F dropping from 0.73 to 0.023) demonstrates that the fine-tuned model's competence is </w:t>
       </w:r>
       <w:r>
         <w:rPr>
@@ -15773,23 +15576,7 @@
           <w:szCs w:val="28"/>
         </w:rPr>
         <w:lastRenderedPageBreak/>
-        <w:t>a garbled French rendering of Sample 3 that substitutes “Nouvelle-Écosse” for the Dutch Republic). This is consistent with t5-small's original multi-task pretraining, which included translation: without the “question: ... context: ...” prefix cue, the model appears to fall back on a different pretrained task rather than attempting to answer from parametric memory. Either way, it confirms the model has not memorized SQuAD facts during fine-tuning; it has learned to locate and extract spans from a supplied context, not to answer general-knowledge questions independently.</w:t>
-      </w:r>
-    </w:p>
-    <w:p>
-      <w:pPr>
-        <w:spacing w:after="150"/>
-        <w:rPr>
-          <w:sz w:val="28"/>
-          <w:szCs w:val="28"/>
-        </w:rPr>
-      </w:pPr>
-      <w:r>
-        <w:rPr>
-          <w:sz w:val="28"/>
-          <w:szCs w:val="28"/>
-        </w:rPr>
-        <w:t>This near-total performance collapse without context (ROUGE-1 F dropping from 0.77 to 0.0177) demonstrates that the fine-tuned model's competence is entirely context-dependent: it functions as a context-conditioned span extractor/generator rather than as a general question-answering system with independent world knowledge. This is expected given the small fine-tuning set (1,000 examples) is far too small to teach the model new factual knowledge but is entirely sufficient to teach it the SQuAD task format of locating an answer within a given passage.</w:t>
+        <w:t>entirely context-dependent: it functions as a context-conditioned span extractor/generator rather than as a general question-answering system with independent world knowledge. This is expected given the small fine-tuning set (1,000 examples) is far too small to teach the model new factual knowledge but is entirely sufficient to teach it the SQuAD task format of locating an answer within a given passage.</w:t>
       </w:r>
     </w:p>
     <w:p>
@@ -16091,7 +15878,7 @@
                 <w:sz w:val="28"/>
                 <w:szCs w:val="28"/>
               </w:rPr>
-              <w:t>0.7876</w:t>
+              <w:t>0.7549</w:t>
             </w:r>
           </w:p>
         </w:tc>
@@ -16117,7 +15904,7 @@
                 <w:sz w:val="28"/>
                 <w:szCs w:val="28"/>
               </w:rPr>
-              <w:t>0.7834</w:t>
+              <w:t>0.7364</w:t>
             </w:r>
           </w:p>
         </w:tc>
@@ -16143,7 +15930,7 @@
                 <w:sz w:val="28"/>
                 <w:szCs w:val="28"/>
               </w:rPr>
-              <w:t>0.7665</w:t>
+              <w:t>0.7323</w:t>
             </w:r>
           </w:p>
         </w:tc>
@@ -16216,7 +16003,7 @@
                 <w:sz w:val="28"/>
                 <w:szCs w:val="28"/>
               </w:rPr>
-              <w:t>0.5399</w:t>
+              <w:t>0.4967</w:t>
             </w:r>
           </w:p>
         </w:tc>
@@ -16242,7 +16029,7 @@
                 <w:sz w:val="28"/>
                 <w:szCs w:val="28"/>
               </w:rPr>
-              <w:t>0.5319</w:t>
+              <w:t>0.4655</w:t>
             </w:r>
           </w:p>
         </w:tc>
@@ -16268,7 +16055,7 @@
                 <w:sz w:val="28"/>
                 <w:szCs w:val="28"/>
               </w:rPr>
-              <w:t>0.5162</w:t>
+              <w:t>0.4706</w:t>
             </w:r>
           </w:p>
         </w:tc>
@@ -16341,7 +16128,7 @@
                 <w:sz w:val="28"/>
                 <w:szCs w:val="28"/>
               </w:rPr>
-              <w:t>0.7867</w:t>
+              <w:t>0.7538</w:t>
             </w:r>
           </w:p>
         </w:tc>
@@ -16367,7 +16154,7 @@
                 <w:sz w:val="28"/>
                 <w:szCs w:val="28"/>
               </w:rPr>
-              <w:t>0.7823</w:t>
+              <w:t>0.7351</w:t>
             </w:r>
           </w:p>
         </w:tc>
@@ -16393,7 +16180,7 @@
                 <w:sz w:val="28"/>
                 <w:szCs w:val="28"/>
               </w:rPr>
-              <w:t>0.7655</w:t>
+              <w:t>0.7312</w:t>
             </w:r>
           </w:p>
         </w:tc>
@@ -16473,7 +16260,7 @@
                 <w:sz w:val="28"/>
                 <w:szCs w:val="28"/>
               </w:rPr>
-              <w:t>0.6592</w:t>
+              <w:t>0.6570</w:t>
             </w:r>
           </w:p>
         </w:tc>
@@ -16499,7 +16286,7 @@
                 <w:sz w:val="28"/>
                 <w:szCs w:val="28"/>
               </w:rPr>
-              <w:t>0.6767</w:t>
+              <w:t>0.6757</w:t>
             </w:r>
           </w:p>
         </w:tc>
@@ -16525,7 +16312,7 @@
                 <w:sz w:val="28"/>
                 <w:szCs w:val="28"/>
               </w:rPr>
-              <w:t>0.6368</w:t>
+              <w:t>0.6423</w:t>
             </w:r>
           </w:p>
         </w:tc>
@@ -16598,7 +16385,7 @@
                 <w:sz w:val="28"/>
                 <w:szCs w:val="28"/>
               </w:rPr>
-              <w:t>0.4213</w:t>
+              <w:t>0.4426</w:t>
             </w:r>
           </w:p>
         </w:tc>
@@ -16624,7 +16411,7 @@
                 <w:sz w:val="28"/>
                 <w:szCs w:val="28"/>
               </w:rPr>
-              <w:t>0.4427</w:t>
+              <w:t>0.4627</w:t>
             </w:r>
           </w:p>
         </w:tc>
@@ -16650,7 +16437,7 @@
                 <w:sz w:val="28"/>
                 <w:szCs w:val="28"/>
               </w:rPr>
-              <w:t>0.4113</w:t>
+              <w:t>0.4332</w:t>
             </w:r>
           </w:p>
         </w:tc>
@@ -16723,7 +16510,7 @@
                 <w:sz w:val="28"/>
                 <w:szCs w:val="28"/>
               </w:rPr>
-              <w:t>0.6592</w:t>
+              <w:t>0.6570</w:t>
             </w:r>
           </w:p>
         </w:tc>
@@ -16749,7 +16536,7 @@
                 <w:sz w:val="28"/>
                 <w:szCs w:val="28"/>
               </w:rPr>
-              <w:t>0.6767</w:t>
+              <w:t>0.6757</w:t>
             </w:r>
           </w:p>
         </w:tc>
@@ -16775,7 +16562,7 @@
                 <w:sz w:val="28"/>
                 <w:szCs w:val="28"/>
               </w:rPr>
-              <w:t>0.6368</w:t>
+              <w:t>0.6423</w:t>
             </w:r>
           </w:p>
         </w:tc>
@@ -16819,12 +16606,85 @@
           <w:sz w:val="28"/>
           <w:szCs w:val="28"/>
         </w:rPr>
-        <w:t>ROUGE without context (whole test set), pre-trained model: Precision 0.0060 / Recall 0.0071 / F-measure 0.0053 (ROUGE-1); all ROUGE-2 metrics are exactly 0 — comparable in magnitude to the fine-tuned model's own without-context collapse (F-measure 0.0177), confirming that mrm8488 is likewise entirely reliant on the supplied context passage rather than parametric knowledge.</w:t>
-      </w:r>
+        <w:t>ROUGE without context (whole test set), pre-trained model: Precision 0.0076 / Recall 0.0114 / F-measure 0.0079 (ROUGE-1); all ROUGE-2 metrics are exactly 0 — comparable in magnitude to the fine-tuned model's own without-context collapse (F-measure 0.023), confirming that mrm8488 is likewise entirely reliant on the supplied context passage rather than parametric knowledge.</w:t>
+      </w:r>
+    </w:p>
+    <w:p>
+      <w:pPr>
+        <w:rPr>
+          <w:sz w:val="28"/>
+          <w:szCs w:val="28"/>
+        </w:rPr>
+      </w:pPr>
+    </w:p>
+    <w:p>
+      <w:pPr>
+        <w:rPr>
+          <w:sz w:val="28"/>
+          <w:szCs w:val="28"/>
+        </w:rPr>
+      </w:pPr>
+    </w:p>
+    <w:p>
+      <w:pPr>
+        <w:rPr>
+          <w:sz w:val="28"/>
+          <w:szCs w:val="28"/>
+        </w:rPr>
+      </w:pPr>
+    </w:p>
+    <w:p>
+      <w:pPr>
+        <w:rPr>
+          <w:sz w:val="28"/>
+          <w:szCs w:val="28"/>
+        </w:rPr>
+      </w:pPr>
+    </w:p>
+    <w:p>
+      <w:pPr>
+        <w:rPr>
+          <w:sz w:val="28"/>
+          <w:szCs w:val="28"/>
+        </w:rPr>
+      </w:pPr>
+    </w:p>
+    <w:p>
+      <w:pPr>
+        <w:rPr>
+          <w:sz w:val="28"/>
+          <w:szCs w:val="28"/>
+        </w:rPr>
+      </w:pPr>
+    </w:p>
+    <w:p>
+      <w:pPr>
+        <w:rPr>
+          <w:sz w:val="28"/>
+          <w:szCs w:val="28"/>
+        </w:rPr>
+      </w:pPr>
+    </w:p>
+    <w:p>
+      <w:pPr>
+        <w:rPr>
+          <w:sz w:val="28"/>
+          <w:szCs w:val="28"/>
+        </w:rPr>
+      </w:pPr>
+    </w:p>
+    <w:p>
+      <w:pPr>
+        <w:rPr>
+          <w:sz w:val="28"/>
+          <w:szCs w:val="28"/>
+        </w:rPr>
+      </w:pPr>
     </w:p>
     <w:tbl>
       <w:tblPr>
-        <w:tblW w:w="9000" w:type="dxa"/>
+        <w:tblpPr w:leftFromText="180" w:rightFromText="180" w:horzAnchor="page" w:tblpX="865" w:tblpY="-1440"/>
+        <w:tblW w:w="9016" w:type="dxa"/>
         <w:tblBorders>
           <w:top w:val="single" w:sz="4" w:space="0" w:color="auto"/>
           <w:left w:val="single" w:sz="4" w:space="0" w:color="auto"/>
@@ -16833,6 +16693,7 @@
           <w:insideH w:val="single" w:sz="4" w:space="0" w:color="auto"/>
           <w:insideV w:val="single" w:sz="4" w:space="0" w:color="auto"/>
         </w:tblBorders>
+        <w:tblLayout w:type="fixed"/>
         <w:tblCellMar>
           <w:left w:w="10" w:type="dxa"/>
           <w:right w:w="10" w:type="dxa"/>
@@ -16840,11 +16701,11 @@
         <w:tblLook w:val="04A0" w:firstRow="1" w:lastRow="0" w:firstColumn="1" w:lastColumn="0" w:noHBand="0" w:noVBand="1"/>
       </w:tblPr>
       <w:tblGrid>
-        <w:gridCol w:w="265"/>
-        <w:gridCol w:w="825"/>
-        <w:gridCol w:w="805"/>
-        <w:gridCol w:w="2650"/>
-        <w:gridCol w:w="4471"/>
+        <w:gridCol w:w="264"/>
+        <w:gridCol w:w="1711"/>
+        <w:gridCol w:w="2160"/>
+        <w:gridCol w:w="2538"/>
+        <w:gridCol w:w="2343"/>
       </w:tblGrid>
       <w:tr>
         <w:trPr>
@@ -16852,7 +16713,7 @@
         </w:trPr>
         <w:tc>
           <w:tcPr>
-            <w:tcW w:w="400" w:type="dxa"/>
+            <w:tcW w:w="264" w:type="dxa"/>
             <w:shd w:val="clear" w:color="auto" w:fill="DDEBF7"/>
             <w:tcMar>
               <w:top w:w="100" w:type="dxa"/>
@@ -16875,13 +16736,14 @@
                 <w:sz w:val="28"/>
                 <w:szCs w:val="28"/>
               </w:rPr>
+              <w:lastRenderedPageBreak/>
               <w:t>#</w:t>
             </w:r>
           </w:p>
         </w:tc>
         <w:tc>
           <w:tcPr>
-            <w:tcW w:w="2600" w:type="dxa"/>
+            <w:tcW w:w="1711" w:type="dxa"/>
             <w:shd w:val="clear" w:color="auto" w:fill="DDEBF7"/>
             <w:tcMar>
               <w:top w:w="100" w:type="dxa"/>
@@ -16910,7 +16772,7 @@
         </w:tc>
         <w:tc>
           <w:tcPr>
-            <w:tcW w:w="1900" w:type="dxa"/>
+            <w:tcW w:w="2160" w:type="dxa"/>
             <w:shd w:val="clear" w:color="auto" w:fill="DDEBF7"/>
             <w:tcMar>
               <w:top w:w="100" w:type="dxa"/>
@@ -16939,7 +16801,7 @@
         </w:tc>
         <w:tc>
           <w:tcPr>
-            <w:tcW w:w="1700" w:type="dxa"/>
+            <w:tcW w:w="2538" w:type="dxa"/>
             <w:shd w:val="clear" w:color="auto" w:fill="DDEBF7"/>
             <w:tcMar>
               <w:top w:w="100" w:type="dxa"/>
@@ -16968,7 +16830,7 @@
         </w:tc>
         <w:tc>
           <w:tcPr>
-            <w:tcW w:w="1400" w:type="dxa"/>
+            <w:tcW w:w="2343" w:type="dxa"/>
             <w:shd w:val="clear" w:color="auto" w:fill="DDEBF7"/>
             <w:tcMar>
               <w:top w:w="100" w:type="dxa"/>
@@ -16999,7 +16861,7 @@
       <w:tr>
         <w:tc>
           <w:tcPr>
-            <w:tcW w:w="400" w:type="dxa"/>
+            <w:tcW w:w="264" w:type="dxa"/>
             <w:tcMar>
               <w:top w:w="100" w:type="dxa"/>
               <w:left w:w="100" w:type="dxa"/>
@@ -17025,68 +16887,59 @@
         </w:tc>
         <w:tc>
           <w:tcPr>
-            <w:tcW w:w="2600" w:type="dxa"/>
-            <w:tcMar>
-              <w:top w:w="100" w:type="dxa"/>
-              <w:left w:w="100" w:type="dxa"/>
-              <w:bottom w:w="100" w:type="dxa"/>
-              <w:right w:w="100" w:type="dxa"/>
-            </w:tcMar>
-          </w:tcPr>
-          <w:p>
-            <w:pPr>
-              <w:rPr>
-                <w:sz w:val="28"/>
-                <w:szCs w:val="28"/>
-              </w:rPr>
-            </w:pPr>
-            <w:r>
-              <w:rPr>
-                <w:sz w:val="28"/>
-                <w:szCs w:val="28"/>
-              </w:rPr>
-              <w:t>What country initially received the large</w:t>
-            </w:r>
-            <w:r>
-              <w:rPr>
-                <w:sz w:val="28"/>
-                <w:szCs w:val="28"/>
-              </w:rPr>
-              <w:lastRenderedPageBreak/>
-              <w:t>st number of Huguenot refugees?</w:t>
-            </w:r>
-          </w:p>
-        </w:tc>
-        <w:tc>
-          <w:tcPr>
-            <w:tcW w:w="1900" w:type="dxa"/>
-            <w:tcMar>
-              <w:top w:w="100" w:type="dxa"/>
-              <w:left w:w="100" w:type="dxa"/>
-              <w:bottom w:w="100" w:type="dxa"/>
-              <w:right w:w="100" w:type="dxa"/>
-            </w:tcMar>
-          </w:tcPr>
-          <w:p>
-            <w:pPr>
-              <w:rPr>
-                <w:sz w:val="28"/>
-                <w:szCs w:val="28"/>
-              </w:rPr>
-            </w:pPr>
-            <w:r>
-              <w:rPr>
-                <w:sz w:val="28"/>
-                <w:szCs w:val="28"/>
-              </w:rPr>
-              <w:lastRenderedPageBreak/>
+            <w:tcW w:w="1711" w:type="dxa"/>
+            <w:tcMar>
+              <w:top w:w="100" w:type="dxa"/>
+              <w:left w:w="100" w:type="dxa"/>
+              <w:bottom w:w="100" w:type="dxa"/>
+              <w:right w:w="100" w:type="dxa"/>
+            </w:tcMar>
+          </w:tcPr>
+          <w:p>
+            <w:pPr>
+              <w:rPr>
+                <w:sz w:val="28"/>
+                <w:szCs w:val="28"/>
+              </w:rPr>
+            </w:pPr>
+            <w:r>
+              <w:rPr>
+                <w:sz w:val="28"/>
+                <w:szCs w:val="28"/>
+              </w:rPr>
+              <w:t>What country initially received the largest number of Huguenot refugees?</w:t>
+            </w:r>
+          </w:p>
+        </w:tc>
+        <w:tc>
+          <w:tcPr>
+            <w:tcW w:w="2160" w:type="dxa"/>
+            <w:tcMar>
+              <w:top w:w="100" w:type="dxa"/>
+              <w:left w:w="100" w:type="dxa"/>
+              <w:bottom w:w="100" w:type="dxa"/>
+              <w:right w:w="100" w:type="dxa"/>
+            </w:tcMar>
+          </w:tcPr>
+          <w:p>
+            <w:pPr>
+              <w:rPr>
+                <w:sz w:val="28"/>
+                <w:szCs w:val="28"/>
+              </w:rPr>
+            </w:pPr>
+            <w:r>
+              <w:rPr>
+                <w:sz w:val="28"/>
+                <w:szCs w:val="28"/>
+              </w:rPr>
               <w:t>the Dutch Republic</w:t>
             </w:r>
           </w:p>
         </w:tc>
         <w:tc>
           <w:tcPr>
-            <w:tcW w:w="1700" w:type="dxa"/>
+            <w:tcW w:w="2538" w:type="dxa"/>
             <w:tcMar>
               <w:top w:w="100" w:type="dxa"/>
               <w:left w:w="100" w:type="dxa"/>
@@ -17112,44 +16965,35 @@
         </w:tc>
         <w:tc>
           <w:tcPr>
-            <w:tcW w:w="1400" w:type="dxa"/>
-            <w:tcMar>
-              <w:top w:w="100" w:type="dxa"/>
-              <w:left w:w="100" w:type="dxa"/>
-              <w:bottom w:w="100" w:type="dxa"/>
-              <w:right w:w="100" w:type="dxa"/>
-            </w:tcMar>
-          </w:tcPr>
-          <w:p>
-            <w:pPr>
-              <w:rPr>
-                <w:sz w:val="28"/>
-                <w:szCs w:val="28"/>
-              </w:rPr>
-            </w:pPr>
-            <w:r>
-              <w:rPr>
-                <w:sz w:val="28"/>
-                <w:szCs w:val="28"/>
-              </w:rPr>
-              <w:t>Lieu initial de réfugié(n</w:t>
-            </w:r>
-            <w:proofErr w:type="gramStart"/>
-            <w:r>
-              <w:rPr>
-                <w:sz w:val="28"/>
-                <w:szCs w:val="28"/>
-              </w:rPr>
-              <w:t>0,n1)|</w:t>
-            </w:r>
-            <w:proofErr w:type="gramEnd"/>
+            <w:tcW w:w="2343" w:type="dxa"/>
+            <w:tcMar>
+              <w:top w:w="100" w:type="dxa"/>
+              <w:left w:w="100" w:type="dxa"/>
+              <w:bottom w:w="100" w:type="dxa"/>
+              <w:right w:w="100" w:type="dxa"/>
+            </w:tcMar>
+          </w:tcPr>
+          <w:p>
+            <w:pPr>
+              <w:rPr>
+                <w:sz w:val="28"/>
+                <w:szCs w:val="28"/>
+              </w:rPr>
+            </w:pPr>
+            <w:r>
+              <w:rPr>
+                <w:sz w:val="28"/>
+                <w:szCs w:val="28"/>
+              </w:rPr>
+              <w:t>divide(n0,const_100)|divide(#0,const_2)|</w:t>
+            </w:r>
           </w:p>
         </w:tc>
       </w:tr>
       <w:tr>
         <w:tc>
           <w:tcPr>
-            <w:tcW w:w="400" w:type="dxa"/>
+            <w:tcW w:w="264" w:type="dxa"/>
             <w:tcMar>
               <w:top w:w="100" w:type="dxa"/>
               <w:left w:w="100" w:type="dxa"/>
@@ -17175,7 +17019,7 @@
         </w:tc>
         <w:tc>
           <w:tcPr>
-            <w:tcW w:w="2600" w:type="dxa"/>
+            <w:tcW w:w="1711" w:type="dxa"/>
             <w:tcMar>
               <w:top w:w="100" w:type="dxa"/>
               <w:left w:w="100" w:type="dxa"/>
@@ -17201,7 +17045,7 @@
         </w:tc>
         <w:tc>
           <w:tcPr>
-            <w:tcW w:w="1900" w:type="dxa"/>
+            <w:tcW w:w="2160" w:type="dxa"/>
             <w:tcMar>
               <w:top w:w="100" w:type="dxa"/>
               <w:left w:w="100" w:type="dxa"/>
@@ -17227,143 +17071,61 @@
         </w:tc>
         <w:tc>
           <w:tcPr>
-            <w:tcW w:w="1700" w:type="dxa"/>
-            <w:tcMar>
-              <w:top w:w="100" w:type="dxa"/>
-              <w:left w:w="100" w:type="dxa"/>
-              <w:bottom w:w="100" w:type="dxa"/>
-              <w:right w:w="100" w:type="dxa"/>
-            </w:tcMar>
-          </w:tcPr>
-          <w:p>
-            <w:pPr>
-              <w:rPr>
-                <w:sz w:val="28"/>
-                <w:szCs w:val="28"/>
-              </w:rPr>
-            </w:pPr>
-            <w:r>
-              <w:rPr>
-                <w:sz w:val="28"/>
-                <w:szCs w:val="28"/>
-              </w:rPr>
-              <w:t>multiply(n</w:t>
-            </w:r>
-            <w:proofErr w:type="gramStart"/>
-            <w:r>
-              <w:rPr>
-                <w:sz w:val="28"/>
-                <w:szCs w:val="28"/>
-              </w:rPr>
-              <w:t>2,const</w:t>
-            </w:r>
-            <w:proofErr w:type="gramEnd"/>
-            <w:r>
-              <w:rPr>
-                <w:sz w:val="28"/>
-                <w:szCs w:val="28"/>
-              </w:rPr>
-              <w:t>_</w:t>
-            </w:r>
-            <w:proofErr w:type="gramStart"/>
-            <w:r>
-              <w:rPr>
-                <w:sz w:val="28"/>
-                <w:szCs w:val="28"/>
-              </w:rPr>
-              <w:t>10)|</w:t>
-            </w:r>
-            <w:proofErr w:type="gramEnd"/>
-          </w:p>
-        </w:tc>
-        <w:tc>
-          <w:tcPr>
-            <w:tcW w:w="1400" w:type="dxa"/>
-            <w:tcMar>
-              <w:top w:w="100" w:type="dxa"/>
-              <w:left w:w="100" w:type="dxa"/>
-              <w:bottom w:w="100" w:type="dxa"/>
-              <w:right w:w="100" w:type="dxa"/>
-            </w:tcMar>
-          </w:tcPr>
-          <w:p>
-            <w:pPr>
-              <w:rPr>
-                <w:sz w:val="28"/>
-                <w:szCs w:val="28"/>
-              </w:rPr>
-            </w:pPr>
-            <w:r>
-              <w:rPr>
-                <w:sz w:val="28"/>
-                <w:szCs w:val="28"/>
-              </w:rPr>
-              <w:t>divide(n</w:t>
-            </w:r>
-            <w:proofErr w:type="gramStart"/>
-            <w:r>
-              <w:rPr>
-                <w:sz w:val="28"/>
-                <w:szCs w:val="28"/>
-              </w:rPr>
-              <w:t>0,const</w:t>
-            </w:r>
-            <w:proofErr w:type="gramEnd"/>
-            <w:r>
-              <w:rPr>
-                <w:sz w:val="28"/>
-                <w:szCs w:val="28"/>
-              </w:rPr>
-              <w:t>_</w:t>
-            </w:r>
-            <w:proofErr w:type="gramStart"/>
-            <w:r>
-              <w:rPr>
-                <w:sz w:val="28"/>
-                <w:szCs w:val="28"/>
-              </w:rPr>
-              <w:t>100)|</w:t>
-            </w:r>
-            <w:proofErr w:type="gramEnd"/>
-            <w:r>
-              <w:rPr>
-                <w:sz w:val="28"/>
-                <w:szCs w:val="28"/>
-              </w:rPr>
-              <w:t>divide(#</w:t>
-            </w:r>
-            <w:proofErr w:type="gramStart"/>
-            <w:r>
-              <w:rPr>
-                <w:sz w:val="28"/>
-                <w:szCs w:val="28"/>
-              </w:rPr>
-              <w:t>0,const</w:t>
-            </w:r>
-            <w:proofErr w:type="gramEnd"/>
-            <w:r>
-              <w:rPr>
-                <w:sz w:val="28"/>
-                <w:szCs w:val="28"/>
-              </w:rPr>
-              <w:t>_</w:t>
-            </w:r>
-            <w:proofErr w:type="gramStart"/>
-            <w:r>
-              <w:rPr>
-                <w:sz w:val="28"/>
-                <w:szCs w:val="28"/>
-              </w:rPr>
-              <w:t>2)|</w:t>
-            </w:r>
-            <w:proofErr w:type="gramEnd"/>
+            <w:tcW w:w="2538" w:type="dxa"/>
+            <w:tcMar>
+              <w:top w:w="100" w:type="dxa"/>
+              <w:left w:w="100" w:type="dxa"/>
+              <w:bottom w:w="100" w:type="dxa"/>
+              <w:right w:w="100" w:type="dxa"/>
+            </w:tcMar>
+          </w:tcPr>
+          <w:p>
+            <w:pPr>
+              <w:rPr>
+                <w:sz w:val="28"/>
+                <w:szCs w:val="28"/>
+              </w:rPr>
+            </w:pPr>
+            <w:r>
+              <w:rPr>
+                <w:sz w:val="28"/>
+                <w:szCs w:val="28"/>
+              </w:rPr>
+              <w:t>add(const_3,const_4)|</w:t>
+            </w:r>
+          </w:p>
+        </w:tc>
+        <w:tc>
+          <w:tcPr>
+            <w:tcW w:w="2343" w:type="dxa"/>
+            <w:tcMar>
+              <w:top w:w="100" w:type="dxa"/>
+              <w:left w:w="100" w:type="dxa"/>
+              <w:bottom w:w="100" w:type="dxa"/>
+              <w:right w:w="100" w:type="dxa"/>
+            </w:tcMar>
+          </w:tcPr>
+          <w:p>
+            <w:pPr>
+              <w:rPr>
+                <w:sz w:val="28"/>
+                <w:szCs w:val="28"/>
+              </w:rPr>
+            </w:pPr>
+            <w:r>
+              <w:rPr>
+                <w:sz w:val="28"/>
+                <w:szCs w:val="28"/>
+              </w:rPr>
+              <w:t>divide(n0,n1)|</w:t>
+            </w:r>
           </w:p>
         </w:tc>
       </w:tr>
       <w:tr>
         <w:tc>
           <w:tcPr>
-            <w:tcW w:w="400" w:type="dxa"/>
+            <w:tcW w:w="264" w:type="dxa"/>
             <w:tcMar>
               <w:top w:w="100" w:type="dxa"/>
               <w:left w:w="100" w:type="dxa"/>
@@ -17389,236 +17151,113 @@
         </w:tc>
         <w:tc>
           <w:tcPr>
-            <w:tcW w:w="2600" w:type="dxa"/>
-            <w:tcMar>
-              <w:top w:w="100" w:type="dxa"/>
-              <w:left w:w="100" w:type="dxa"/>
-              <w:bottom w:w="100" w:type="dxa"/>
-              <w:right w:w="100" w:type="dxa"/>
-            </w:tcMar>
-          </w:tcPr>
-          <w:p>
-            <w:pPr>
-              <w:rPr>
-                <w:sz w:val="28"/>
-                <w:szCs w:val="28"/>
-              </w:rPr>
-            </w:pPr>
-            <w:r>
-              <w:rPr>
-                <w:sz w:val="28"/>
-                <w:szCs w:val="28"/>
-              </w:rPr>
-              <w:t>What was the population of the Dutch Republic befor</w:t>
-            </w:r>
-            <w:r>
-              <w:rPr>
-                <w:sz w:val="28"/>
-                <w:szCs w:val="28"/>
-              </w:rPr>
-              <w:lastRenderedPageBreak/>
-              <w:t>e this emigration?</w:t>
-            </w:r>
-          </w:p>
-        </w:tc>
-        <w:tc>
-          <w:tcPr>
-            <w:tcW w:w="1900" w:type="dxa"/>
-            <w:tcMar>
-              <w:top w:w="100" w:type="dxa"/>
-              <w:left w:w="100" w:type="dxa"/>
-              <w:bottom w:w="100" w:type="dxa"/>
-              <w:right w:w="100" w:type="dxa"/>
-            </w:tcMar>
-          </w:tcPr>
-          <w:p>
-            <w:pPr>
-              <w:rPr>
-                <w:sz w:val="28"/>
-                <w:szCs w:val="28"/>
-              </w:rPr>
-            </w:pPr>
-            <w:r>
-              <w:rPr>
-                <w:sz w:val="28"/>
-                <w:szCs w:val="28"/>
-              </w:rPr>
-              <w:lastRenderedPageBreak/>
+            <w:tcW w:w="1711" w:type="dxa"/>
+            <w:tcMar>
+              <w:top w:w="100" w:type="dxa"/>
+              <w:left w:w="100" w:type="dxa"/>
+              <w:bottom w:w="100" w:type="dxa"/>
+              <w:right w:w="100" w:type="dxa"/>
+            </w:tcMar>
+          </w:tcPr>
+          <w:p>
+            <w:pPr>
+              <w:rPr>
+                <w:sz w:val="28"/>
+                <w:szCs w:val="28"/>
+              </w:rPr>
+            </w:pPr>
+            <w:r>
+              <w:rPr>
+                <w:sz w:val="28"/>
+                <w:szCs w:val="28"/>
+              </w:rPr>
+              <w:t>What was the population of the Dutch Republic before this emigration?</w:t>
+            </w:r>
+          </w:p>
+        </w:tc>
+        <w:tc>
+          <w:tcPr>
+            <w:tcW w:w="2160" w:type="dxa"/>
+            <w:tcMar>
+              <w:top w:w="100" w:type="dxa"/>
+              <w:left w:w="100" w:type="dxa"/>
+              <w:bottom w:w="100" w:type="dxa"/>
+              <w:right w:w="100" w:type="dxa"/>
+            </w:tcMar>
+          </w:tcPr>
+          <w:p>
+            <w:pPr>
+              <w:rPr>
+                <w:sz w:val="28"/>
+                <w:szCs w:val="28"/>
+              </w:rPr>
+            </w:pPr>
+            <w:r>
+              <w:rPr>
+                <w:sz w:val="28"/>
+                <w:szCs w:val="28"/>
+              </w:rPr>
               <w:t>ca. 2 million</w:t>
             </w:r>
           </w:p>
         </w:tc>
         <w:tc>
           <w:tcPr>
-            <w:tcW w:w="1700" w:type="dxa"/>
-            <w:tcMar>
-              <w:top w:w="100" w:type="dxa"/>
-              <w:left w:w="100" w:type="dxa"/>
-              <w:bottom w:w="100" w:type="dxa"/>
-              <w:right w:w="100" w:type="dxa"/>
-            </w:tcMar>
-          </w:tcPr>
-          <w:p>
-            <w:pPr>
-              <w:rPr>
-                <w:sz w:val="28"/>
-                <w:szCs w:val="28"/>
-              </w:rPr>
-            </w:pPr>
-            <w:r>
-              <w:rPr>
-                <w:sz w:val="28"/>
-                <w:szCs w:val="28"/>
-              </w:rPr>
-              <w:t>multiply(n</w:t>
-            </w:r>
-            <w:proofErr w:type="gramStart"/>
-            <w:r>
-              <w:rPr>
-                <w:sz w:val="28"/>
-                <w:szCs w:val="28"/>
-              </w:rPr>
-              <w:t>0,n1)|</w:t>
-            </w:r>
-            <w:proofErr w:type="gramEnd"/>
-            <w:r>
-              <w:rPr>
-                <w:sz w:val="28"/>
-                <w:szCs w:val="28"/>
-              </w:rPr>
-              <w:t>subtract(n</w:t>
-            </w:r>
-            <w:proofErr w:type="gramStart"/>
-            <w:r>
-              <w:rPr>
-                <w:sz w:val="28"/>
-                <w:szCs w:val="28"/>
-              </w:rPr>
-              <w:t>2,n1)|divide(</w:t>
-            </w:r>
-            <w:proofErr w:type="gramEnd"/>
-            <w:r>
-              <w:rPr>
-                <w:sz w:val="28"/>
-                <w:szCs w:val="28"/>
-              </w:rPr>
-              <w:t>#</w:t>
-            </w:r>
-            <w:proofErr w:type="gramStart"/>
-            <w:r>
-              <w:rPr>
-                <w:sz w:val="28"/>
-                <w:szCs w:val="28"/>
-              </w:rPr>
-              <w:t>0,#1)|</w:t>
-            </w:r>
-            <w:proofErr w:type="gramEnd"/>
-          </w:p>
-        </w:tc>
-        <w:tc>
-          <w:tcPr>
-            <w:tcW w:w="1400" w:type="dxa"/>
-            <w:tcMar>
-              <w:top w:w="100" w:type="dxa"/>
-              <w:left w:w="100" w:type="dxa"/>
-              <w:bottom w:w="100" w:type="dxa"/>
-              <w:right w:w="100" w:type="dxa"/>
-            </w:tcMar>
-          </w:tcPr>
-          <w:p>
-            <w:pPr>
-              <w:rPr>
-                <w:sz w:val="28"/>
-                <w:szCs w:val="28"/>
-              </w:rPr>
-            </w:pPr>
-            <w:r>
-              <w:rPr>
-                <w:sz w:val="28"/>
-                <w:szCs w:val="28"/>
-              </w:rPr>
-              <w:t>add(const_</w:t>
-            </w:r>
-            <w:proofErr w:type="gramStart"/>
-            <w:r>
-              <w:rPr>
-                <w:sz w:val="28"/>
-                <w:szCs w:val="28"/>
-              </w:rPr>
-              <w:t>1,const</w:t>
-            </w:r>
-            <w:proofErr w:type="gramEnd"/>
-            <w:r>
-              <w:rPr>
-                <w:sz w:val="28"/>
-                <w:szCs w:val="28"/>
-              </w:rPr>
-              <w:t>_</w:t>
-            </w:r>
-            <w:proofErr w:type="gramStart"/>
-            <w:r>
-              <w:rPr>
-                <w:sz w:val="28"/>
-                <w:szCs w:val="28"/>
-              </w:rPr>
-              <w:t>4)|</w:t>
-            </w:r>
-            <w:proofErr w:type="gramEnd"/>
-            <w:r>
-              <w:rPr>
-                <w:sz w:val="28"/>
-                <w:szCs w:val="28"/>
-              </w:rPr>
-              <w:t>population_year(n</w:t>
-            </w:r>
-            <w:proofErr w:type="gramStart"/>
-            <w:r>
-              <w:rPr>
-                <w:sz w:val="28"/>
-                <w:szCs w:val="28"/>
-              </w:rPr>
-              <w:t>0)|</w:t>
-            </w:r>
-            <w:proofErr w:type="gramEnd"/>
-            <w:r>
-              <w:rPr>
-                <w:sz w:val="28"/>
-                <w:szCs w:val="28"/>
-              </w:rPr>
-              <w:t>population_year(#</w:t>
-            </w:r>
-            <w:proofErr w:type="gramStart"/>
-            <w:r>
-              <w:rPr>
-                <w:sz w:val="28"/>
-                <w:szCs w:val="28"/>
-              </w:rPr>
-              <w:t>0)|subtract(</w:t>
-            </w:r>
-            <w:proofErr w:type="gramEnd"/>
-            <w:r>
-              <w:rPr>
-                <w:sz w:val="28"/>
-                <w:szCs w:val="28"/>
-              </w:rPr>
-              <w:t>#</w:t>
-            </w:r>
-            <w:proofErr w:type="gramStart"/>
-            <w:r>
-              <w:rPr>
-                <w:sz w:val="28"/>
-                <w:szCs w:val="28"/>
-              </w:rPr>
-              <w:t>1,#2)|</w:t>
-            </w:r>
-            <w:proofErr w:type="gramEnd"/>
+            <w:tcW w:w="2538" w:type="dxa"/>
+            <w:tcMar>
+              <w:top w:w="100" w:type="dxa"/>
+              <w:left w:w="100" w:type="dxa"/>
+              <w:bottom w:w="100" w:type="dxa"/>
+              <w:right w:w="100" w:type="dxa"/>
+            </w:tcMar>
+          </w:tcPr>
+          <w:p>
+            <w:pPr>
+              <w:rPr>
+                <w:sz w:val="28"/>
+                <w:szCs w:val="28"/>
+              </w:rPr>
+            </w:pPr>
+            <w:r>
+              <w:rPr>
+                <w:sz w:val="28"/>
+                <w:szCs w:val="28"/>
+              </w:rPr>
+              <w:t>divide(n2,const_100)|multiply(n0,n1)|add(#0,const_1)|add(#1,const_1)|subtract(#2,#1)|</w:t>
+            </w:r>
+          </w:p>
+        </w:tc>
+        <w:tc>
+          <w:tcPr>
+            <w:tcW w:w="2343" w:type="dxa"/>
+            <w:tcMar>
+              <w:top w:w="100" w:type="dxa"/>
+              <w:left w:w="100" w:type="dxa"/>
+              <w:bottom w:w="100" w:type="dxa"/>
+              <w:right w:w="100" w:type="dxa"/>
+            </w:tcMar>
+          </w:tcPr>
+          <w:p>
+            <w:pPr>
+              <w:rPr>
+                <w:sz w:val="28"/>
+                <w:szCs w:val="28"/>
+              </w:rPr>
+            </w:pPr>
+            <w:r>
+              <w:rPr>
+                <w:sz w:val="28"/>
+                <w:szCs w:val="28"/>
+              </w:rPr>
+              <w:t>add(const_1,const_4)|population(n0,#0)|</w:t>
+            </w:r>
           </w:p>
         </w:tc>
       </w:tr>
       <w:tr>
         <w:tc>
           <w:tcPr>
-            <w:tcW w:w="400" w:type="dxa"/>
+            <w:tcW w:w="264" w:type="dxa"/>
             <w:tcMar>
               <w:top w:w="100" w:type="dxa"/>
               <w:left w:w="100" w:type="dxa"/>
@@ -17644,7 +17283,7 @@
         </w:tc>
         <w:tc>
           <w:tcPr>
-            <w:tcW w:w="2600" w:type="dxa"/>
+            <w:tcW w:w="1711" w:type="dxa"/>
             <w:tcMar>
               <w:top w:w="100" w:type="dxa"/>
               <w:left w:w="100" w:type="dxa"/>
@@ -17670,7 +17309,7 @@
         </w:tc>
         <w:tc>
           <w:tcPr>
-            <w:tcW w:w="1900" w:type="dxa"/>
+            <w:tcW w:w="2160" w:type="dxa"/>
             <w:tcMar>
               <w:top w:w="100" w:type="dxa"/>
               <w:left w:w="100" w:type="dxa"/>
@@ -17696,7 +17335,7 @@
         </w:tc>
         <w:tc>
           <w:tcPr>
-            <w:tcW w:w="1700" w:type="dxa"/>
+            <w:tcW w:w="2538" w:type="dxa"/>
             <w:tcMar>
               <w:top w:w="100" w:type="dxa"/>
               <w:left w:w="100" w:type="dxa"/>
@@ -17722,27 +17361,27 @@
         </w:tc>
         <w:tc>
           <w:tcPr>
-            <w:tcW w:w="1400" w:type="dxa"/>
-            <w:tcMar>
-              <w:top w:w="100" w:type="dxa"/>
-              <w:left w:w="100" w:type="dxa"/>
-              <w:bottom w:w="100" w:type="dxa"/>
-              <w:right w:w="100" w:type="dxa"/>
-            </w:tcMar>
-          </w:tcPr>
-          <w:p>
-            <w:pPr>
-              <w:rPr>
-                <w:sz w:val="28"/>
-                <w:szCs w:val="28"/>
-              </w:rPr>
-            </w:pPr>
-            <w:r>
-              <w:rPr>
-                <w:sz w:val="28"/>
-                <w:szCs w:val="28"/>
-              </w:rPr>
-              <w:t>(empty)</w:t>
+            <w:tcW w:w="2343" w:type="dxa"/>
+            <w:tcMar>
+              <w:top w:w="100" w:type="dxa"/>
+              <w:left w:w="100" w:type="dxa"/>
+              <w:bottom w:w="100" w:type="dxa"/>
+              <w:right w:w="100" w:type="dxa"/>
+            </w:tcMar>
+          </w:tcPr>
+          <w:p>
+            <w:pPr>
+              <w:rPr>
+                <w:sz w:val="28"/>
+                <w:szCs w:val="28"/>
+              </w:rPr>
+            </w:pPr>
+            <w:r>
+              <w:rPr>
+                <w:sz w:val="28"/>
+                <w:szCs w:val="28"/>
+              </w:rPr>
+              <w:t>Lieu(n0)|</w:t>
             </w:r>
           </w:p>
         </w:tc>
@@ -17750,7 +17389,7 @@
       <w:tr>
         <w:tc>
           <w:tcPr>
-            <w:tcW w:w="400" w:type="dxa"/>
+            <w:tcW w:w="264" w:type="dxa"/>
             <w:tcMar>
               <w:top w:w="100" w:type="dxa"/>
               <w:left w:w="100" w:type="dxa"/>
@@ -17776,93 +17415,59 @@
         </w:tc>
         <w:tc>
           <w:tcPr>
-            <w:tcW w:w="2600" w:type="dxa"/>
-            <w:tcMar>
-              <w:top w:w="100" w:type="dxa"/>
-              <w:left w:w="100" w:type="dxa"/>
-              <w:bottom w:w="100" w:type="dxa"/>
-              <w:right w:w="100" w:type="dxa"/>
-            </w:tcMar>
-          </w:tcPr>
-          <w:p>
-            <w:pPr>
-              <w:rPr>
-                <w:sz w:val="28"/>
-                <w:szCs w:val="28"/>
-              </w:rPr>
-            </w:pPr>
-            <w:r>
-              <w:rPr>
-                <w:sz w:val="28"/>
-                <w:szCs w:val="28"/>
-              </w:rPr>
-              <w:t xml:space="preserve">What declaration </w:t>
-            </w:r>
-            <w:proofErr w:type="gramStart"/>
-            <w:r>
-              <w:rPr>
-                <w:sz w:val="28"/>
-                <w:szCs w:val="28"/>
-              </w:rPr>
-              <w:t>predicated</w:t>
-            </w:r>
-            <w:proofErr w:type="gramEnd"/>
-            <w:r>
-              <w:rPr>
-                <w:sz w:val="28"/>
-                <w:szCs w:val="28"/>
-              </w:rPr>
-              <w:t xml:space="preserve"> the emigration of Huguenot </w:t>
-            </w:r>
-            <w:r>
-              <w:rPr>
-                <w:sz w:val="28"/>
-                <w:szCs w:val="28"/>
-              </w:rPr>
-              <w:lastRenderedPageBreak/>
-              <w:t>refugees?</w:t>
-            </w:r>
-          </w:p>
-        </w:tc>
-        <w:tc>
-          <w:tcPr>
-            <w:tcW w:w="1900" w:type="dxa"/>
-            <w:tcMar>
-              <w:top w:w="100" w:type="dxa"/>
-              <w:left w:w="100" w:type="dxa"/>
-              <w:bottom w:w="100" w:type="dxa"/>
-              <w:right w:w="100" w:type="dxa"/>
-            </w:tcMar>
-          </w:tcPr>
-          <w:p>
-            <w:pPr>
-              <w:rPr>
-                <w:sz w:val="28"/>
-                <w:szCs w:val="28"/>
-              </w:rPr>
-            </w:pPr>
-            <w:proofErr w:type="gramStart"/>
-            <w:r>
-              <w:rPr>
-                <w:sz w:val="28"/>
-                <w:szCs w:val="28"/>
-              </w:rPr>
-              <w:lastRenderedPageBreak/>
-              <w:t>the revocation</w:t>
-            </w:r>
-            <w:proofErr w:type="gramEnd"/>
-            <w:r>
-              <w:rPr>
-                <w:sz w:val="28"/>
-                <w:szCs w:val="28"/>
-              </w:rPr>
-              <w:t xml:space="preserve"> of the Edict of Nantes</w:t>
-            </w:r>
-          </w:p>
-        </w:tc>
-        <w:tc>
-          <w:tcPr>
-            <w:tcW w:w="1700" w:type="dxa"/>
+            <w:tcW w:w="1711" w:type="dxa"/>
+            <w:tcMar>
+              <w:top w:w="100" w:type="dxa"/>
+              <w:left w:w="100" w:type="dxa"/>
+              <w:bottom w:w="100" w:type="dxa"/>
+              <w:right w:w="100" w:type="dxa"/>
+            </w:tcMar>
+          </w:tcPr>
+          <w:p>
+            <w:pPr>
+              <w:rPr>
+                <w:sz w:val="28"/>
+                <w:szCs w:val="28"/>
+              </w:rPr>
+            </w:pPr>
+            <w:r>
+              <w:rPr>
+                <w:sz w:val="28"/>
+                <w:szCs w:val="28"/>
+              </w:rPr>
+              <w:t>What declaration predicated the emigration of Huguenot refugees?</w:t>
+            </w:r>
+          </w:p>
+        </w:tc>
+        <w:tc>
+          <w:tcPr>
+            <w:tcW w:w="2160" w:type="dxa"/>
+            <w:tcMar>
+              <w:top w:w="100" w:type="dxa"/>
+              <w:left w:w="100" w:type="dxa"/>
+              <w:bottom w:w="100" w:type="dxa"/>
+              <w:right w:w="100" w:type="dxa"/>
+            </w:tcMar>
+          </w:tcPr>
+          <w:p>
+            <w:pPr>
+              <w:rPr>
+                <w:sz w:val="28"/>
+                <w:szCs w:val="28"/>
+              </w:rPr>
+            </w:pPr>
+            <w:r>
+              <w:rPr>
+                <w:sz w:val="28"/>
+                <w:szCs w:val="28"/>
+              </w:rPr>
+              <w:t>the revocation of the Edict of Nantes</w:t>
+            </w:r>
+          </w:p>
+        </w:tc>
+        <w:tc>
+          <w:tcPr>
+            <w:tcW w:w="2538" w:type="dxa"/>
             <w:tcMar>
               <w:top w:w="100" w:type="dxa"/>
               <w:left w:w="100" w:type="dxa"/>
@@ -17888,27 +17493,27 @@
         </w:tc>
         <w:tc>
           <w:tcPr>
-            <w:tcW w:w="1400" w:type="dxa"/>
-            <w:tcMar>
-              <w:top w:w="100" w:type="dxa"/>
-              <w:left w:w="100" w:type="dxa"/>
-              <w:bottom w:w="100" w:type="dxa"/>
-              <w:right w:w="100" w:type="dxa"/>
-            </w:tcMar>
-          </w:tcPr>
-          <w:p>
-            <w:pPr>
-              <w:rPr>
-                <w:sz w:val="28"/>
-                <w:szCs w:val="28"/>
-              </w:rPr>
-            </w:pPr>
-            <w:r>
-              <w:rPr>
-                <w:sz w:val="28"/>
-                <w:szCs w:val="28"/>
-              </w:rPr>
-              <w:t>(empty)</w:t>
+            <w:tcW w:w="2343" w:type="dxa"/>
+            <w:tcMar>
+              <w:top w:w="100" w:type="dxa"/>
+              <w:left w:w="100" w:type="dxa"/>
+              <w:bottom w:w="100" w:type="dxa"/>
+              <w:right w:w="100" w:type="dxa"/>
+            </w:tcMar>
+          </w:tcPr>
+          <w:p>
+            <w:pPr>
+              <w:rPr>
+                <w:sz w:val="28"/>
+                <w:szCs w:val="28"/>
+              </w:rPr>
+            </w:pPr>
+            <w:r>
+              <w:rPr>
+                <w:sz w:val="28"/>
+                <w:szCs w:val="28"/>
+              </w:rPr>
+              <w:t>divide(n0,const_2)|subtract(n1,#0)|</w:t>
             </w:r>
           </w:p>
         </w:tc>
@@ -17930,44 +17535,76 @@
           <w:szCs w:val="28"/>
         </w:rPr>
       </w:pPr>
-      <w:r>
-        <w:rPr>
-          <w:sz w:val="28"/>
-          <w:szCs w:val="28"/>
-        </w:rPr>
-        <w:t>The pre-trained model matches the fine-tuned model on the two non-numeric questions (Samples 1 and 4, both exact matches with context) but fails distinctively on the two numeric questions (Samples 2 and 3), producing arithmetic-operator-chain strings such as “multiply(n</w:t>
-      </w:r>
-      <w:proofErr w:type="gramStart"/>
-      <w:r>
-        <w:rPr>
-          <w:sz w:val="28"/>
-          <w:szCs w:val="28"/>
-        </w:rPr>
-        <w:t>2,const</w:t>
-      </w:r>
-      <w:proofErr w:type="gramEnd"/>
-      <w:r>
-        <w:rPr>
-          <w:sz w:val="28"/>
-          <w:szCs w:val="28"/>
-        </w:rPr>
-        <w:t>_</w:t>
-      </w:r>
-      <w:proofErr w:type="gramStart"/>
-      <w:r>
-        <w:rPr>
-          <w:sz w:val="28"/>
-          <w:szCs w:val="28"/>
-        </w:rPr>
-        <w:t>10)|</w:t>
-      </w:r>
-      <w:proofErr w:type="gramEnd"/>
-      <w:r>
-        <w:rPr>
-          <w:sz w:val="28"/>
-          <w:szCs w:val="28"/>
-        </w:rPr>
-        <w:t>” instead of a natural-language answer, both with and without context. This is the concrete evidence underlying the third explanation in the discussion below.</w:t>
+    </w:p>
+    <w:p>
+      <w:pPr>
+        <w:rPr>
+          <w:sz w:val="28"/>
+          <w:szCs w:val="28"/>
+        </w:rPr>
+      </w:pPr>
+    </w:p>
+    <w:p>
+      <w:pPr>
+        <w:rPr>
+          <w:sz w:val="28"/>
+          <w:szCs w:val="28"/>
+        </w:rPr>
+      </w:pPr>
+    </w:p>
+    <w:p>
+      <w:pPr>
+        <w:rPr>
+          <w:sz w:val="28"/>
+          <w:szCs w:val="28"/>
+        </w:rPr>
+      </w:pPr>
+      <w:r>
+        <w:rPr>
+          <w:sz w:val="28"/>
+          <w:szCs w:val="28"/>
+        </w:rPr>
+        <w:t>The pre-trained model still answers the two non-numeric questions correctly with context (Samples 1 and 4, both exact matches) but fails on the two numeric questions (Samples 2 and 3), producing arithmetic-operator-chain strings such as “</w:t>
+      </w:r>
+      <w:r>
+        <w:rPr>
+          <w:i/>
+          <w:iCs/>
+          <w:sz w:val="28"/>
+          <w:szCs w:val="28"/>
+        </w:rPr>
+        <w:t>add(const_3,const_4)|</w:t>
+      </w:r>
+      <w:r>
+        <w:rPr>
+          <w:sz w:val="28"/>
+          <w:szCs w:val="28"/>
+        </w:rPr>
+        <w:t xml:space="preserve">” instead of a natural-language answer. Without context, the anomaly is even more pronounced: all 5 samples — </w:t>
+      </w:r>
+      <w:r>
+        <w:rPr>
+          <w:sz w:val="28"/>
+          <w:szCs w:val="28"/>
+        </w:rPr>
+        <w:lastRenderedPageBreak/>
+        <w:t>including the two that were answered correctly with context — produce this same operator-chain notation (e.g., “</w:t>
+      </w:r>
+      <w:r>
+        <w:rPr>
+          <w:i/>
+          <w:iCs/>
+          <w:sz w:val="28"/>
+          <w:szCs w:val="28"/>
+        </w:rPr>
+        <w:t>divide(n0,const_100)|divide(#0,const_2)|</w:t>
+      </w:r>
+      <w:r>
+        <w:rPr>
+          <w:sz w:val="28"/>
+          <w:szCs w:val="28"/>
+        </w:rPr>
+        <w:t>” for Sample 1). This anomaly is discussed further below; its root cause could not be confirmed from the model's public documentation.</w:t>
       </w:r>
     </w:p>
     <w:p>
@@ -18188,7 +17825,7 @@
                 <w:sz w:val="28"/>
                 <w:szCs w:val="28"/>
               </w:rPr>
-              <w:t>0.7665</w:t>
+              <w:t>0.7323</w:t>
             </w:r>
           </w:p>
         </w:tc>
@@ -18214,7 +17851,7 @@
                 <w:sz w:val="28"/>
                 <w:szCs w:val="28"/>
               </w:rPr>
-              <w:t>0.5162</w:t>
+              <w:t>0.4706</w:t>
             </w:r>
           </w:p>
         </w:tc>
@@ -18240,7 +17877,7 @@
                 <w:sz w:val="28"/>
                 <w:szCs w:val="28"/>
               </w:rPr>
-              <w:t>0.7655</w:t>
+              <w:t>0.7312</w:t>
             </w:r>
           </w:p>
         </w:tc>
@@ -18294,7 +17931,7 @@
                 <w:sz w:val="28"/>
                 <w:szCs w:val="28"/>
               </w:rPr>
-              <w:t>0.6368</w:t>
+              <w:t>0.6423</w:t>
             </w:r>
           </w:p>
         </w:tc>
@@ -18320,7 +17957,7 @@
                 <w:sz w:val="28"/>
                 <w:szCs w:val="28"/>
               </w:rPr>
-              <w:t>0.4113</w:t>
+              <w:t>0.4332</w:t>
             </w:r>
           </w:p>
         </w:tc>
@@ -18346,7 +17983,7 @@
                 <w:sz w:val="28"/>
                 <w:szCs w:val="28"/>
               </w:rPr>
-              <w:t>0.6368</w:t>
+              <w:t>0.6423</w:t>
             </w:r>
           </w:p>
         </w:tc>
@@ -18374,11 +18011,27 @@
           <w:sz w:val="28"/>
           <w:szCs w:val="28"/>
         </w:rPr>
-        <w:t xml:space="preserve">Counter-intuitively, the pre-trained mrm8488/t5-base-finetuned-squadv2 model again scored lower than the team's own fine-tuned t5-small on every ROUGE variant (e.g., ROUGE-1 F: 0.6368 vs. 0.7665), despite being a larger base architecture (t5-base) trained on the full SQuAD dataset (~87,000+ examples) rather than the 1,000-example </w:t>
+        <w:t xml:space="preserve">Counter-intuitively, the pre-trained mrm8488/t5-base-finetuned-squadv2 model again scored lower than the team's own fine-tuned t5-small on every ROUGE variant (e.g., ROUGE-1 F: 0.6423 vs. 0.7323), despite being a larger base architecture (t5-base) trained on the </w:t>
       </w:r>
       <w:r>
         <w:rPr>
           <w:i/>
+          <w:iCs/>
+          <w:sz w:val="28"/>
+          <w:szCs w:val="28"/>
+        </w:rPr>
+        <w:t>full SQuAD</w:t>
+      </w:r>
+      <w:r>
+        <w:rPr>
+          <w:sz w:val="28"/>
+          <w:szCs w:val="28"/>
+        </w:rPr>
+        <w:t xml:space="preserve"> dataset (~87,000+ examples) rather than the 1,000-example </w:t>
+      </w:r>
+      <w:r>
+        <w:rPr>
+          <w:i/>
           <w:sz w:val="28"/>
           <w:szCs w:val="28"/>
         </w:rPr>
@@ -18405,30 +18058,255 @@
           <w:sz w:val="28"/>
           <w:szCs w:val="28"/>
         </w:rPr>
-        <w:t xml:space="preserve">Two explanations plausibly account for this reversal. First, a domain/format match effect: the team's model was fine-tuned directly on training data drawn from the same SQuAD dataset structure and answer-length conventions as the test set (indices 3,100–3,199 of the SQuAD validation split), so its output style is closely matched to this specific evaluation set, whereas mrm8488 was shaped by the full, more heterogeneous SQuAD v1 training distribution and may produce longer or differently-phrased spans that reduce lexical overlap </w:t>
-      </w:r>
+        <w:t xml:space="preserve">Two explanations </w:t>
+      </w:r>
+      <w:r>
+        <w:rPr>
+          <w:sz w:val="28"/>
+          <w:szCs w:val="28"/>
+        </w:rPr>
+        <w:t>could</w:t>
+      </w:r>
+      <w:r>
+        <w:rPr>
+          <w:sz w:val="28"/>
+          <w:szCs w:val="28"/>
+        </w:rPr>
+        <w:t xml:space="preserve"> account for part of this reversal, with a further unexplained anomaly discussed below. </w:t>
+      </w:r>
+    </w:p>
+    <w:p>
+      <w:pPr>
+        <w:spacing w:after="150"/>
+        <w:rPr>
+          <w:sz w:val="28"/>
+          <w:szCs w:val="28"/>
+        </w:rPr>
+      </w:pPr>
+      <w:r>
+        <w:rPr>
+          <w:sz w:val="28"/>
+          <w:szCs w:val="28"/>
+        </w:rPr>
+        <w:t xml:space="preserve">First, a domain/format match effect: the team's model was fine-tuned directly on training data drawn from the same </w:t>
+      </w:r>
+      <w:r>
+        <w:rPr>
+          <w:i/>
+          <w:iCs/>
+          <w:sz w:val="28"/>
+          <w:szCs w:val="28"/>
+        </w:rPr>
+        <w:t>SQuAD</w:t>
+      </w:r>
+      <w:r>
+        <w:rPr>
+          <w:sz w:val="28"/>
+          <w:szCs w:val="28"/>
+        </w:rPr>
+        <w:t xml:space="preserve"> dataset structure and answer-length conventions as the test set (indices 3,100–3,199 of the SQuAD validation split), so its output style is closely matched to this specific evaluation set, whereas mrm8488 was shaped by the full, more heterogeneous </w:t>
+      </w:r>
+      <w:r>
+        <w:rPr>
+          <w:i/>
+          <w:iCs/>
+          <w:sz w:val="28"/>
+          <w:szCs w:val="28"/>
+        </w:rPr>
+        <w:t>SQuAD v1</w:t>
+      </w:r>
+      <w:r>
+        <w:rPr>
+          <w:sz w:val="28"/>
+          <w:szCs w:val="28"/>
+        </w:rPr>
+        <w:t xml:space="preserve"> training distribution and may produce longer or differently-phrased spans that reduce lexical overlap even when correct. </w:t>
+      </w:r>
+    </w:p>
+    <w:p>
+      <w:pPr>
+        <w:spacing w:after="150"/>
+        <w:rPr>
+          <w:sz w:val="28"/>
+          <w:szCs w:val="28"/>
+        </w:rPr>
+      </w:pPr>
+      <w:r>
+        <w:rPr>
+          <w:sz w:val="28"/>
+          <w:szCs w:val="28"/>
+        </w:rPr>
+        <w:t xml:space="preserve">Second, a </w:t>
+      </w:r>
+      <w:r>
+        <w:rPr>
+          <w:i/>
+          <w:iCs/>
+          <w:sz w:val="28"/>
+          <w:szCs w:val="28"/>
+        </w:rPr>
+        <w:t>SQuAD v2</w:t>
+      </w:r>
+      <w:r>
+        <w:rPr>
+          <w:sz w:val="28"/>
+          <w:szCs w:val="28"/>
+        </w:rPr>
+        <w:t xml:space="preserve"> vs. </w:t>
+      </w:r>
+      <w:r>
+        <w:rPr>
+          <w:i/>
+          <w:iCs/>
+          <w:sz w:val="28"/>
+          <w:szCs w:val="28"/>
+        </w:rPr>
+        <w:t>v1</w:t>
+      </w:r>
+      <w:r>
+        <w:rPr>
+          <w:sz w:val="28"/>
+          <w:szCs w:val="28"/>
+        </w:rPr>
+        <w:t xml:space="preserve"> mismatch: mrm8488 was fine-tuned on </w:t>
+      </w:r>
+      <w:r>
+        <w:rPr>
+          <w:i/>
+          <w:iCs/>
+          <w:sz w:val="28"/>
+          <w:szCs w:val="28"/>
+        </w:rPr>
+        <w:t>SQuAD v2</w:t>
+      </w:r>
+      <w:r>
+        <w:rPr>
+          <w:sz w:val="28"/>
+          <w:szCs w:val="28"/>
+        </w:rPr>
+        <w:t xml:space="preserve">, which includes unanswerable questions and trains the model to sometimes hedge or decline to answer; since every question in the </w:t>
+      </w:r>
+      <w:r>
+        <w:rPr>
+          <w:i/>
+          <w:sz w:val="28"/>
+          <w:szCs w:val="28"/>
+        </w:rPr>
+        <w:t xml:space="preserve">SQuAD_tiny </w:t>
+      </w:r>
+      <w:r>
+        <w:rPr>
+          <w:sz w:val="28"/>
+          <w:szCs w:val="28"/>
+        </w:rPr>
+        <w:t xml:space="preserve">test set (drawn from </w:t>
+      </w:r>
+      <w:r>
+        <w:rPr>
+          <w:i/>
+          <w:iCs/>
+          <w:sz w:val="28"/>
+          <w:szCs w:val="28"/>
+        </w:rPr>
+        <w:t>SQuAD v1</w:t>
+      </w:r>
+      <w:r>
+        <w:rPr>
+          <w:sz w:val="28"/>
+          <w:szCs w:val="28"/>
+        </w:rPr>
+        <w:t xml:space="preserve">-style data) does have an answer, a v2-trained model's more conservative answer style may reduce its measured overlap with the always-present reference answers even when its underlying answers are semantically reasonable. </w:t>
+      </w:r>
+    </w:p>
+    <w:p>
+      <w:pPr>
+        <w:spacing w:after="150"/>
+        <w:rPr>
+          <w:sz w:val="28"/>
+          <w:szCs w:val="28"/>
+        </w:rPr>
+      </w:pPr>
       <w:r>
         <w:rPr>
           <w:sz w:val="28"/>
           <w:szCs w:val="28"/>
         </w:rPr>
         <w:lastRenderedPageBreak/>
-        <w:t xml:space="preserve">even when correct. Second, a SQuAD v2 vs. v1 mismatch: mrm8488 was fine-tuned on SQuAD v2, which includes unanswerable questions and trains the model to sometimes hedge or decline to answer; since every question in the </w:t>
+        <w:t>A third, unexplained anomaly emerges directly from the without-context generative analysis added below (replicating Section 10.4's methodology for the pretrained model): with context, mrm8488 fails only on the two numeric questions (Samples 2 and 3), producing operator-chain strings such as "</w:t>
       </w:r>
       <w:r>
         <w:rPr>
           <w:i/>
-          <w:sz w:val="28"/>
-          <w:szCs w:val="28"/>
-        </w:rPr>
-        <w:t xml:space="preserve">SQuAD_tiny </w:t>
-      </w:r>
-      <w:r>
-        <w:rPr>
-          <w:sz w:val="28"/>
-          <w:szCs w:val="28"/>
-        </w:rPr>
-        <w:t>test set (drawn from SQuAD v1-style data) does have an answer, a v2-trained model's more conservative answer style may reduce its measured overlap with the always-present reference answers even when its underlying answers are semantically reasonable. A third, more concrete explanation emerges directly from the without-context generative analysis added below (replicating Section 10.4's methodology for the pretrained model): on the two test questions requiring numeric answers (Samples 2 and 3), mrm8488 does not attempt a natural-language answer at all — with context it outputs strings such as "multiply(n2,const_10)|" and "multiply(n0,n1)|subtract(n2,n1)|divide(#0,#1)|", and without context similar operator-chain strings such as "divide(n0,const_100)|divide(#0,const_2)|". These resemble the intermediate reasoning-program notation used in math-word-problem datasets (e.g., MathQA/DROP-style arithmetic programs) rather than any SQuAD answer format, suggesting mrm8488 was further tuned or evaluated on such data and has partially lost its ability to produce plain-text SQuAD-style answers for numeric questions specifically — directly depressing its ROUGE score given that 2 of the 5 sampled test questions are numeric. This is a more concrete and falsifiable explanation than a general domain-mismatch argument, since it is visible directly in the generated text rather than inferred from the score alone. This also highlights a genuine limitation of ROUGE as an evaluation metric: it measures lexical overlap only, not factual correctness, so it is possible the pre-trained model's answers remain accurate but are phrased differently enough from the references to be penalized — a fuller evaluation would benefit from manually inspecting a sample of mrm8488's generated answers alongside the fine-tuned model's, rather than relying on ROUGE scores alone.</w:t>
+          <w:iCs/>
+          <w:sz w:val="28"/>
+          <w:szCs w:val="28"/>
+        </w:rPr>
+        <w:t>add(const_3,const_4)|</w:t>
+      </w:r>
+      <w:r>
+        <w:rPr>
+          <w:sz w:val="28"/>
+          <w:szCs w:val="28"/>
+        </w:rPr>
+        <w:t>"</w:t>
+      </w:r>
+      <w:r>
+        <w:rPr>
+          <w:sz w:val="28"/>
+          <w:szCs w:val="28"/>
+        </w:rPr>
+        <w:t xml:space="preserve"> </w:t>
+      </w:r>
+      <w:r>
+        <w:rPr>
+          <w:sz w:val="28"/>
+          <w:szCs w:val="28"/>
+        </w:rPr>
+        <w:t>instead of a natural-language answer. Without context, this failure mode takes over completely: all 5 samples — including Samples 1 and 4, which it had just answered correctly with context — produce the same kind of operator-chain notation (e.g., "</w:t>
+      </w:r>
+      <w:r>
+        <w:rPr>
+          <w:i/>
+          <w:iCs/>
+          <w:sz w:val="28"/>
+          <w:szCs w:val="28"/>
+        </w:rPr>
+        <w:t>divide(n0,const_100)|divide(#0,const_2)|</w:t>
+      </w:r>
+      <w:r>
+        <w:rPr>
+          <w:sz w:val="28"/>
+          <w:szCs w:val="28"/>
+        </w:rPr>
+        <w:t xml:space="preserve">" for Sample 1 A pipeline bug is unlikely, since the same tokenizer and model call correctly answers two of the five questions with context. The precise cause of mrm8488's specific fallback </w:t>
+      </w:r>
+      <w:r>
+        <w:rPr>
+          <w:sz w:val="28"/>
+          <w:szCs w:val="28"/>
+        </w:rPr>
+        <w:t>is not clear</w:t>
+      </w:r>
+      <w:r>
+        <w:rPr>
+          <w:sz w:val="28"/>
+          <w:szCs w:val="28"/>
+        </w:rPr>
+        <w:t xml:space="preserve">, but its effect on the score is: it directly </w:t>
+      </w:r>
+      <w:r>
+        <w:rPr>
+          <w:sz w:val="28"/>
+          <w:szCs w:val="28"/>
+        </w:rPr>
+        <w:t xml:space="preserve">reduces </w:t>
+      </w:r>
+      <w:r>
+        <w:rPr>
+          <w:sz w:val="28"/>
+          <w:szCs w:val="28"/>
+        </w:rPr>
+        <w:t>mrm8488's ROUGE result. This also highlights a genuine limitation of ROUGE as an evaluation metric: it measures lexical overlap only, not factual correctness, so it is possible the pre-trained model's answers remain accurate but are phrased differently enough from the references to be penalized — a fuller evaluation would benefit from manually inspecting a sample of mrm8488's generated answers alongside the fine-tuned model's, rather than relying on ROUGE scores alone.</w:t>
       </w:r>
     </w:p>
     <w:sectPr>

</xml_diff>